<commit_message>
Construire un prompt à partir de ses différentes composantes pour résoudre un problème
</commit_message>
<xml_diff>
--- a/Atelier Prompt.docx
+++ b/Atelier Prompt.docx
@@ -2,15 +2,1035 @@
 <file path=word/document.xml><?xml version="1.0" encoding="utf-8"?>
 <w:document xmlns:wpc="http://schemas.microsoft.com/office/word/2010/wordprocessingCanvas" xmlns:cx="http://schemas.microsoft.com/office/drawing/2014/chartex" xmlns:cx1="http://schemas.microsoft.com/office/drawing/2015/9/8/chartex" xmlns:cx2="http://schemas.microsoft.com/office/drawing/2015/10/21/chartex" xmlns:cx3="http://schemas.microsoft.com/office/drawing/2016/5/9/chartex" xmlns:cx4="http://schemas.microsoft.com/office/drawing/2016/5/10/chartex" xmlns:cx5="http://schemas.microsoft.com/office/drawing/2016/5/11/chartex" xmlns:cx6="http://schemas.microsoft.com/office/drawing/2016/5/12/chartex" xmlns:cx7="http://schemas.microsoft.com/office/drawing/2016/5/13/chartex" xmlns:cx8="http://schemas.microsoft.com/office/drawing/2016/5/14/chartex" xmlns:mc="http://schemas.openxmlformats.org/markup-compatibility/2006" xmlns:aink="http://schemas.microsoft.com/office/drawing/2016/ink" xmlns:am3d="http://schemas.microsoft.com/office/drawing/2017/model3d" xmlns:o="urn:schemas-microsoft-com:office:office" xmlns:r="http://schemas.openxmlformats.org/officeDocument/2006/relationships" xmlns:m="http://schemas.openxmlformats.org/officeDocument/2006/math" xmlns:v="urn:schemas-microsoft-com:vml" xmlns:wp14="http://schemas.microsoft.com/office/word/2010/wordprocessingDrawing" xmlns:wp="http://schemas.openxmlformats.org/drawingml/2006/wordprocessingDrawing" xmlns:w10="urn:schemas-microsoft-com:office:word" xmlns:w="http://schemas.openxmlformats.org/wordprocessingml/2006/main" xmlns:w14="http://schemas.microsoft.com/office/word/2010/wordml" xmlns:w15="http://schemas.microsoft.com/office/word/2012/wordml" xmlns:w16cex="http://schemas.microsoft.com/office/word/2018/wordml/cex" xmlns:w16cid="http://schemas.microsoft.com/office/word/2016/wordml/cid" xmlns:w16="http://schemas.microsoft.com/office/word/2018/wordml" xmlns:w16sdtdh="http://schemas.microsoft.com/office/word/2020/wordml/sdtdatahash" xmlns:w16se="http://schemas.microsoft.com/office/word/2015/wordml/symex" xmlns:wpg="http://schemas.microsoft.com/office/word/2010/wordprocessingGroup" xmlns:wpi="http://schemas.microsoft.com/office/word/2010/wordprocessingInk" xmlns:wne="http://schemas.microsoft.com/office/word/2006/wordml" xmlns:wps="http://schemas.microsoft.com/office/word/2010/wordprocessingShape" mc:Ignorable="w14 w15 w16se w16cid w16 w16cex w16sdtdh wp14">
   <w:body>
-    <w:p/>
+    <w:p>
+      <w:pPr>
+        <w:ind w:left="2832" w:firstLine="708"/>
+        <w:rPr>
+          <w:rFonts w:ascii="CIDFont+F2" w:hAnsi="CIDFont+F2" w:cs="CIDFont+F2"/>
+          <w:b/>
+          <w:bCs/>
+          <w:color w:val="D0CECE" w:themeColor="background2" w:themeShade="E6"/>
+          <w:kern w:val="0"/>
+          <w:sz w:val="36"/>
+          <w:szCs w:val="36"/>
+        </w:rPr>
+      </w:pPr>
+      <w:r>
+        <w:rPr>
+          <w:rFonts w:ascii="CIDFont+F2" w:hAnsi="CIDFont+F2" w:cs="CIDFont+F2"/>
+          <w:b/>
+          <w:bCs/>
+          <w:color w:val="D0CECE" w:themeColor="background2" w:themeShade="E6"/>
+          <w:kern w:val="0"/>
+          <w:sz w:val="36"/>
+          <w:szCs w:val="36"/>
+        </w:rPr>
+        <w:t>Aminatou Binetou Wahab NDIAYE</w:t>
+      </w:r>
+    </w:p>
+    <w:p>
+      <w:pPr>
+        <w:pBdr>
+          <w:top w:val="single" w:sz="24" w:space="1" w:color="323E4F" w:themeColor="text2" w:themeShade="BF"/>
+          <w:left w:val="single" w:sz="24" w:space="4" w:color="323E4F" w:themeColor="text2" w:themeShade="BF"/>
+          <w:bottom w:val="single" w:sz="24" w:space="1" w:color="323E4F" w:themeColor="text2" w:themeShade="BF"/>
+          <w:right w:val="single" w:sz="24" w:space="4" w:color="323E4F" w:themeColor="text2" w:themeShade="BF"/>
+          <w:between w:val="single" w:sz="24" w:space="1" w:color="323E4F" w:themeColor="text2" w:themeShade="BF"/>
+          <w:bar w:val="single" w:sz="24" w:color="323E4F" w:themeColor="text2" w:themeShade="BF"/>
+        </w:pBdr>
+        <w:jc w:val="center"/>
+        <w:rPr>
+          <w:rFonts w:ascii="CIDFont+F2" w:hAnsi="CIDFont+F2" w:cs="CIDFont+F2"/>
+          <w:b/>
+          <w:bCs/>
+          <w:color w:val="323E4F" w:themeColor="text2" w:themeShade="BF"/>
+          <w:kern w:val="0"/>
+          <w:sz w:val="56"/>
+          <w:szCs w:val="56"/>
+          <w:u w:val="single"/>
+        </w:rPr>
+      </w:pPr>
+      <w:r>
+        <w:rPr>
+          <w:rFonts w:ascii="CIDFont+F2" w:hAnsi="CIDFont+F2" w:cs="CIDFont+F2"/>
+          <w:b/>
+          <w:bCs/>
+          <w:color w:val="323E4F" w:themeColor="text2" w:themeShade="BF"/>
+          <w:kern w:val="0"/>
+          <w:sz w:val="56"/>
+          <w:szCs w:val="56"/>
+          <w:u w:val="single"/>
+        </w:rPr>
+        <w:t>Atelier Prompt Engineering :</w:t>
+      </w:r>
+    </w:p>
+    <w:p>
+      <w:pPr>
+        <w:jc w:val="center"/>
+        <w:rPr>
+          <w:rFonts w:ascii="CIDFont+F2" w:hAnsi="CIDFont+F2" w:cs="CIDFont+F2"/>
+          <w:b/>
+          <w:bCs/>
+          <w:color w:val="323E4F" w:themeColor="text2" w:themeShade="BF"/>
+          <w:kern w:val="0"/>
+          <w:sz w:val="56"/>
+          <w:szCs w:val="56"/>
+          <w:u w:val="single"/>
+        </w:rPr>
+      </w:pPr>
+    </w:p>
+    <w:p>
+      <w:pPr>
+        <w:pBdr>
+          <w:left w:val="single" w:sz="24" w:space="4" w:color="323E4F" w:themeColor="text2" w:themeShade="BF"/>
+        </w:pBdr>
+        <w:autoSpaceDE w:val="0"/>
+        <w:autoSpaceDN w:val="0"/>
+        <w:adjustRightInd w:val="0"/>
+        <w:spacing w:after="0" w:line="240" w:lineRule="auto"/>
+        <w:rPr>
+          <w:rFonts w:ascii="Times New Roman" w:hAnsi="Times New Roman" w:cs="Times New Roman"/>
+          <w:b/>
+          <w:bCs/>
+          <w:color w:val="323E4F" w:themeColor="text2" w:themeShade="BF"/>
+          <w:kern w:val="0"/>
+          <w:sz w:val="32"/>
+          <w:szCs w:val="32"/>
+        </w:rPr>
+      </w:pPr>
+      <w:r>
+        <w:rPr>
+          <w:rFonts w:ascii="Times New Roman" w:hAnsi="Times New Roman" w:cs="Times New Roman"/>
+          <w:b/>
+          <w:bCs/>
+          <w:color w:val="323E4F" w:themeColor="text2" w:themeShade="BF"/>
+          <w:kern w:val="0"/>
+          <w:sz w:val="32"/>
+          <w:szCs w:val="32"/>
+        </w:rPr>
+        <w:t>Contexte</w:t>
+      </w:r>
+      <w:r>
+        <w:rPr>
+          <w:rFonts w:ascii="Times New Roman" w:hAnsi="Times New Roman" w:cs="Times New Roman"/>
+          <w:b/>
+          <w:bCs/>
+          <w:color w:val="323E4F" w:themeColor="text2" w:themeShade="BF"/>
+          <w:kern w:val="0"/>
+          <w:sz w:val="32"/>
+          <w:szCs w:val="32"/>
+        </w:rPr>
+        <w:t> :</w:t>
+      </w:r>
+    </w:p>
+    <w:p>
+      <w:pPr>
+        <w:autoSpaceDE w:val="0"/>
+        <w:autoSpaceDN w:val="0"/>
+        <w:adjustRightInd w:val="0"/>
+        <w:spacing w:after="0" w:line="240" w:lineRule="auto"/>
+        <w:jc w:val="both"/>
+        <w:rPr>
+          <w:rFonts w:ascii="Times New Roman" w:hAnsi="Times New Roman" w:cs="Times New Roman"/>
+          <w:color w:val="000000"/>
+          <w:kern w:val="0"/>
+          <w:sz w:val="24"/>
+          <w:szCs w:val="24"/>
+        </w:rPr>
+      </w:pPr>
+      <w:r>
+        <w:rPr>
+          <w:rFonts w:ascii="Times New Roman" w:hAnsi="Times New Roman" w:cs="Times New Roman"/>
+          <w:color w:val="000000"/>
+          <w:kern w:val="0"/>
+          <w:sz w:val="24"/>
+          <w:szCs w:val="24"/>
+        </w:rPr>
+        <w:t>Une entreprise souhaite mettre en place « AI Business Assistant », un assistant IA polyvalent capable</w:t>
+      </w:r>
+    </w:p>
+    <w:p>
+      <w:pPr>
+        <w:autoSpaceDE w:val="0"/>
+        <w:autoSpaceDN w:val="0"/>
+        <w:adjustRightInd w:val="0"/>
+        <w:spacing w:after="0" w:line="240" w:lineRule="auto"/>
+        <w:jc w:val="both"/>
+        <w:rPr>
+          <w:rFonts w:ascii="Times New Roman" w:hAnsi="Times New Roman" w:cs="Times New Roman"/>
+          <w:color w:val="000000"/>
+          <w:kern w:val="0"/>
+          <w:sz w:val="24"/>
+          <w:szCs w:val="24"/>
+        </w:rPr>
+      </w:pPr>
+      <w:r>
+        <w:rPr>
+          <w:rFonts w:ascii="Times New Roman" w:hAnsi="Times New Roman" w:cs="Times New Roman"/>
+          <w:color w:val="000000"/>
+          <w:kern w:val="0"/>
+          <w:sz w:val="24"/>
+          <w:szCs w:val="24"/>
+        </w:rPr>
+        <w:t>d'aider ses collaborateurs à exploiter des documents, analyser des données, faire du machine</w:t>
+      </w:r>
+    </w:p>
+    <w:p>
+      <w:pPr>
+        <w:jc w:val="both"/>
+        <w:rPr>
+          <w:rFonts w:ascii="Times New Roman" w:hAnsi="Times New Roman" w:cs="Times New Roman"/>
+          <w:color w:val="000000"/>
+          <w:kern w:val="0"/>
+          <w:sz w:val="24"/>
+          <w:szCs w:val="24"/>
+        </w:rPr>
+      </w:pPr>
+      <w:r>
+        <w:rPr>
+          <w:rFonts w:ascii="Times New Roman" w:hAnsi="Times New Roman" w:cs="Times New Roman"/>
+          <w:color w:val="000000"/>
+          <w:kern w:val="0"/>
+          <w:sz w:val="24"/>
+          <w:szCs w:val="24"/>
+        </w:rPr>
+        <w:t>learning et produire des résultats structurés.</w:t>
+      </w:r>
+    </w:p>
+    <w:p>
+      <w:pPr>
+        <w:jc w:val="both"/>
+        <w:rPr>
+          <w:rFonts w:ascii="Times New Roman" w:hAnsi="Times New Roman" w:cs="Times New Roman"/>
+          <w:color w:val="000000"/>
+          <w:kern w:val="0"/>
+          <w:sz w:val="24"/>
+          <w:szCs w:val="24"/>
+        </w:rPr>
+      </w:pPr>
+    </w:p>
+    <w:p>
+      <w:pPr>
+        <w:pBdr>
+          <w:left w:val="single" w:sz="24" w:space="4" w:color="323E4F" w:themeColor="text2" w:themeShade="BF"/>
+        </w:pBdr>
+        <w:rPr>
+          <w:rFonts w:ascii="Times New Roman" w:hAnsi="Times New Roman" w:cs="Times New Roman"/>
+          <w:b/>
+          <w:bCs/>
+          <w:color w:val="323E4F" w:themeColor="text2" w:themeShade="BF"/>
+          <w:kern w:val="0"/>
+          <w:sz w:val="32"/>
+          <w:szCs w:val="32"/>
+        </w:rPr>
+      </w:pPr>
+      <w:r>
+        <w:rPr>
+          <w:rFonts w:ascii="Times New Roman" w:hAnsi="Times New Roman" w:cs="Times New Roman"/>
+          <w:b/>
+          <w:bCs/>
+          <w:color w:val="323E4F" w:themeColor="text2" w:themeShade="BF"/>
+          <w:kern w:val="0"/>
+          <w:sz w:val="32"/>
+          <w:szCs w:val="32"/>
+        </w:rPr>
+        <w:t>Présentation de l'assistant</w:t>
+      </w:r>
+      <w:r>
+        <w:rPr>
+          <w:rFonts w:ascii="Times New Roman" w:hAnsi="Times New Roman" w:cs="Times New Roman"/>
+          <w:b/>
+          <w:bCs/>
+          <w:color w:val="323E4F" w:themeColor="text2" w:themeShade="BF"/>
+          <w:kern w:val="0"/>
+          <w:sz w:val="32"/>
+          <w:szCs w:val="32"/>
+        </w:rPr>
+        <w:t> :</w:t>
+      </w:r>
+    </w:p>
+    <w:p>
+      <w:pPr>
+        <w:jc w:val="center"/>
+        <w:rPr>
+          <w:rFonts w:ascii="Times New Roman" w:hAnsi="Times New Roman" w:cs="Times New Roman"/>
+          <w:b/>
+          <w:bCs/>
+          <w:color w:val="323E4F" w:themeColor="text2" w:themeShade="BF"/>
+          <w:sz w:val="32"/>
+          <w:szCs w:val="32"/>
+          <w:u w:val="single"/>
+        </w:rPr>
+      </w:pPr>
+      <w:r>
+        <w:rPr>
+          <w:rFonts w:ascii="Times New Roman" w:hAnsi="Times New Roman" w:cs="Times New Roman"/>
+          <w:b/>
+          <w:bCs/>
+          <w:noProof/>
+          <w:color w:val="323E4F" w:themeColor="text2" w:themeShade="BF"/>
+          <w:sz w:val="32"/>
+          <w:szCs w:val="32"/>
+          <w:u w:val="single"/>
+        </w:rPr>
+        <w:drawing>
+          <wp:inline distT="0" distB="0" distL="0" distR="0" wp14:anchorId="5ED7307C" wp14:editId="47AF5716">
+            <wp:extent cx="4610100" cy="2206625"/>
+            <wp:effectExtent l="0" t="0" r="0" b="3175"/>
+            <wp:docPr id="1" name="Image 1"/>
+            <wp:cNvGraphicFramePr>
+              <a:graphicFrameLocks xmlns:a="http://schemas.openxmlformats.org/drawingml/2006/main" noChangeAspect="1"/>
+            </wp:cNvGraphicFramePr>
+            <a:graphic xmlns:a="http://schemas.openxmlformats.org/drawingml/2006/main">
+              <a:graphicData uri="http://schemas.openxmlformats.org/drawingml/2006/picture">
+                <pic:pic xmlns:pic="http://schemas.openxmlformats.org/drawingml/2006/picture">
+                  <pic:nvPicPr>
+                    <pic:cNvPr id="1" name=""/>
+                    <pic:cNvPicPr/>
+                  </pic:nvPicPr>
+                  <pic:blipFill>
+                    <a:blip r:embed="rId7"/>
+                    <a:stretch>
+                      <a:fillRect/>
+                    </a:stretch>
+                  </pic:blipFill>
+                  <pic:spPr>
+                    <a:xfrm>
+                      <a:off x="0" y="0"/>
+                      <a:ext cx="4659666" cy="2230350"/>
+                    </a:xfrm>
+                    <a:prstGeom prst="rect">
+                      <a:avLst/>
+                    </a:prstGeom>
+                  </pic:spPr>
+                </pic:pic>
+              </a:graphicData>
+            </a:graphic>
+          </wp:inline>
+        </w:drawing>
+      </w:r>
+    </w:p>
+    <w:p>
+      <w:pPr>
+        <w:jc w:val="center"/>
+        <w:rPr>
+          <w:rFonts w:ascii="Times New Roman" w:hAnsi="Times New Roman" w:cs="Times New Roman"/>
+          <w:b/>
+          <w:bCs/>
+          <w:color w:val="323E4F" w:themeColor="text2" w:themeShade="BF"/>
+          <w:sz w:val="32"/>
+          <w:szCs w:val="32"/>
+          <w:u w:val="single"/>
+        </w:rPr>
+      </w:pPr>
+    </w:p>
+    <w:p>
+      <w:pPr>
+        <w:pBdr>
+          <w:left w:val="single" w:sz="24" w:space="4" w:color="323E4F" w:themeColor="text2" w:themeShade="BF"/>
+        </w:pBdr>
+        <w:autoSpaceDE w:val="0"/>
+        <w:autoSpaceDN w:val="0"/>
+        <w:adjustRightInd w:val="0"/>
+        <w:spacing w:after="0" w:line="240" w:lineRule="auto"/>
+        <w:rPr>
+          <w:rFonts w:ascii="Times New Roman" w:hAnsi="Times New Roman" w:cs="Times New Roman"/>
+          <w:b/>
+          <w:bCs/>
+          <w:color w:val="323E4F" w:themeColor="text2" w:themeShade="BF"/>
+          <w:kern w:val="0"/>
+          <w:sz w:val="32"/>
+          <w:szCs w:val="32"/>
+        </w:rPr>
+      </w:pPr>
+      <w:r>
+        <w:rPr>
+          <w:rFonts w:ascii="Times New Roman" w:hAnsi="Times New Roman" w:cs="Times New Roman"/>
+          <w:b/>
+          <w:bCs/>
+          <w:color w:val="323E4F" w:themeColor="text2" w:themeShade="BF"/>
+          <w:kern w:val="0"/>
+          <w:sz w:val="32"/>
+          <w:szCs w:val="32"/>
+        </w:rPr>
+        <w:t>Partie 1 – Anatomie d'un prompt</w:t>
+      </w:r>
+      <w:r>
+        <w:rPr>
+          <w:rFonts w:ascii="Times New Roman" w:hAnsi="Times New Roman" w:cs="Times New Roman"/>
+          <w:b/>
+          <w:bCs/>
+          <w:color w:val="323E4F" w:themeColor="text2" w:themeShade="BF"/>
+          <w:kern w:val="0"/>
+          <w:sz w:val="32"/>
+          <w:szCs w:val="32"/>
+        </w:rPr>
+        <w:t> :</w:t>
+      </w:r>
+    </w:p>
+    <w:p>
+      <w:pPr>
+        <w:autoSpaceDE w:val="0"/>
+        <w:autoSpaceDN w:val="0"/>
+        <w:adjustRightInd w:val="0"/>
+        <w:spacing w:after="0" w:line="240" w:lineRule="auto"/>
+        <w:jc w:val="both"/>
+        <w:rPr>
+          <w:rFonts w:ascii="Times New Roman" w:hAnsi="Times New Roman" w:cs="Times New Roman"/>
+          <w:color w:val="000000"/>
+          <w:kern w:val="0"/>
+          <w:sz w:val="24"/>
+          <w:szCs w:val="24"/>
+        </w:rPr>
+      </w:pPr>
+      <w:r>
+        <w:rPr>
+          <w:rFonts w:ascii="Times New Roman" w:hAnsi="Times New Roman" w:cs="Times New Roman"/>
+          <w:color w:val="000000"/>
+          <w:kern w:val="0"/>
+          <w:sz w:val="24"/>
+          <w:szCs w:val="24"/>
+        </w:rPr>
+        <w:t>Construire un prompt, à partir de ses différentes composantes, pour résoudre un problème comme</w:t>
+      </w:r>
+    </w:p>
+    <w:p>
+      <w:pPr>
+        <w:jc w:val="both"/>
+        <w:rPr>
+          <w:rFonts w:ascii="Times New Roman" w:hAnsi="Times New Roman" w:cs="Times New Roman"/>
+          <w:color w:val="000000"/>
+          <w:kern w:val="0"/>
+          <w:sz w:val="24"/>
+          <w:szCs w:val="24"/>
+        </w:rPr>
+      </w:pPr>
+      <w:r>
+        <w:rPr>
+          <w:rFonts w:ascii="Times New Roman" w:hAnsi="Times New Roman" w:cs="Times New Roman"/>
+          <w:color w:val="000000"/>
+          <w:kern w:val="0"/>
+          <w:sz w:val="24"/>
+          <w:szCs w:val="24"/>
+        </w:rPr>
+        <w:t>« Je souhaite analyser les retours de clients d'une entreprise. »</w:t>
+      </w:r>
+    </w:p>
+    <w:p>
+      <w:pPr>
+        <w:jc w:val="both"/>
+        <w:rPr>
+          <w:rFonts w:ascii="Times New Roman" w:hAnsi="Times New Roman" w:cs="Times New Roman"/>
+          <w:color w:val="000000"/>
+          <w:kern w:val="0"/>
+          <w:sz w:val="24"/>
+          <w:szCs w:val="24"/>
+        </w:rPr>
+      </w:pPr>
+    </w:p>
+    <w:p>
+      <w:pPr>
+        <w:pStyle w:val="NormalWeb"/>
+        <w:spacing w:before="0" w:beforeAutospacing="0" w:after="0" w:afterAutospacing="0"/>
+        <w:ind w:left="708"/>
+        <w:rPr>
+          <w:color w:val="1F4E79" w:themeColor="accent5" w:themeShade="80"/>
+        </w:rPr>
+      </w:pPr>
+      <w:r>
+        <w:rPr>
+          <w:color w:val="1F4E79" w:themeColor="accent5" w:themeShade="80"/>
+        </w:rPr>
+        <w:t>tu es un expert en analyse de retours des clients. une entreprise souhaite analyser le retour de ses clients pour connaitre a quel point les clients sont satisfaites .</w:t>
+      </w:r>
+    </w:p>
+    <w:p>
+      <w:pPr>
+        <w:pStyle w:val="NormalWeb"/>
+        <w:spacing w:before="0" w:beforeAutospacing="0" w:after="0" w:afterAutospacing="0"/>
+        <w:ind w:left="708"/>
+        <w:rPr>
+          <w:color w:val="1F4E79" w:themeColor="accent5" w:themeShade="80"/>
+        </w:rPr>
+      </w:pPr>
+      <w:r>
+        <w:rPr>
+          <w:color w:val="1F4E79" w:themeColor="accent5" w:themeShade="80"/>
+        </w:rPr>
+        <w:t>analyse le retours des clients identifie les points positifs, les problèmes récurrents et proposes des ameliorations</w:t>
+      </w:r>
+    </w:p>
+    <w:p>
+      <w:pPr>
+        <w:pStyle w:val="NormalWeb"/>
+        <w:spacing w:before="0" w:beforeAutospacing="0" w:after="0" w:afterAutospacing="0"/>
+        <w:ind w:left="708"/>
+        <w:rPr>
+          <w:color w:val="1F4E79" w:themeColor="accent5" w:themeShade="80"/>
+        </w:rPr>
+      </w:pPr>
+      <w:r>
+        <w:rPr>
+          <w:color w:val="1F4E79" w:themeColor="accent5" w:themeShade="80"/>
+        </w:rPr>
+        <w:t xml:space="preserve">Voici les retours des clients à analyser : </w:t>
+      </w:r>
+      <w:r>
+        <w:rPr>
+          <w:color w:val="1F4E79" w:themeColor="accent5" w:themeShade="80"/>
+        </w:rPr>
+        <w:t>"</w:t>
+      </w:r>
+      <w:r>
+        <w:rPr>
+          <w:color w:val="1F4E79" w:themeColor="accent5" w:themeShade="80"/>
+        </w:rPr>
+        <w:t xml:space="preserve"> Le produit est de très bonne qualité et je suis satisfait de mon achat </w:t>
+      </w:r>
+      <w:r>
+        <w:rPr>
+          <w:color w:val="1F4E79" w:themeColor="accent5" w:themeShade="80"/>
+        </w:rPr>
+        <w:t>"</w:t>
+      </w:r>
+      <w:r>
+        <w:rPr>
+          <w:color w:val="1F4E79" w:themeColor="accent5" w:themeShade="80"/>
+        </w:rPr>
+        <w:t xml:space="preserve"> </w:t>
+      </w:r>
+      <w:r>
+        <w:rPr>
+          <w:color w:val="1F4E79" w:themeColor="accent5" w:themeShade="80"/>
+        </w:rPr>
+        <w:t>"</w:t>
+      </w:r>
+      <w:r>
+        <w:rPr>
+          <w:color w:val="1F4E79" w:themeColor="accent5" w:themeShade="80"/>
+        </w:rPr>
+        <w:t xml:space="preserve"> La livraison a pris beaucoup trop de temps</w:t>
+      </w:r>
+      <w:r>
+        <w:rPr>
+          <w:color w:val="1F4E79" w:themeColor="accent5" w:themeShade="80"/>
+        </w:rPr>
+        <w:t>"</w:t>
+      </w:r>
+      <w:r>
+        <w:rPr>
+          <w:color w:val="1F4E79" w:themeColor="accent5" w:themeShade="80"/>
+        </w:rPr>
+        <w:t xml:space="preserve">  "je vous le </w:t>
+      </w:r>
+      <w:r>
+        <w:rPr>
+          <w:color w:val="1F4E79" w:themeColor="accent5" w:themeShade="80"/>
+        </w:rPr>
+        <w:lastRenderedPageBreak/>
+        <w:t>recommande" Base ton analyse uniquement sur les informations fournies. Ne fais pas d'hypothèses et donne une réponse claire et concise.</w:t>
+      </w:r>
+    </w:p>
+    <w:p>
+      <w:pPr>
+        <w:pStyle w:val="NormalWeb"/>
+        <w:spacing w:before="0" w:beforeAutospacing="0" w:after="0" w:afterAutospacing="0"/>
+        <w:ind w:left="708"/>
+        <w:rPr>
+          <w:color w:val="1F4E79" w:themeColor="accent5" w:themeShade="80"/>
+        </w:rPr>
+      </w:pPr>
+      <w:r>
+        <w:rPr>
+          <w:color w:val="1F4E79" w:themeColor="accent5" w:themeShade="80"/>
+        </w:rPr>
+        <w:t xml:space="preserve">Présente les résultats sous forme de tableau avec les colonnes suivantes : </w:t>
+      </w:r>
+      <w:r>
+        <w:rPr>
+          <w:color w:val="1F4E79" w:themeColor="accent5" w:themeShade="80"/>
+        </w:rPr>
+        <w:t>c</w:t>
+      </w:r>
+      <w:r>
+        <w:rPr>
+          <w:color w:val="1F4E79" w:themeColor="accent5" w:themeShade="80"/>
+        </w:rPr>
+        <w:t xml:space="preserve">ategorie, Points positifs, </w:t>
+      </w:r>
+      <w:r>
+        <w:rPr>
+          <w:color w:val="1F4E79" w:themeColor="accent5" w:themeShade="80"/>
+        </w:rPr>
+        <w:t>p</w:t>
+      </w:r>
+      <w:r>
+        <w:rPr>
+          <w:color w:val="1F4E79" w:themeColor="accent5" w:themeShade="80"/>
+        </w:rPr>
+        <w:t xml:space="preserve">roblèmes, </w:t>
+      </w:r>
+      <w:r>
+        <w:rPr>
+          <w:color w:val="1F4E79" w:themeColor="accent5" w:themeShade="80"/>
+        </w:rPr>
+        <w:t>r</w:t>
+      </w:r>
+      <w:r>
+        <w:rPr>
+          <w:color w:val="1F4E79" w:themeColor="accent5" w:themeShade="80"/>
+        </w:rPr>
+        <w:t xml:space="preserve">ecommandations .  </w:t>
+      </w:r>
+    </w:p>
+    <w:p>
+      <w:pPr>
+        <w:pStyle w:val="NormalWeb"/>
+        <w:spacing w:before="0" w:beforeAutospacing="0" w:after="0" w:afterAutospacing="0"/>
+        <w:rPr>
+          <w:color w:val="1F4E79" w:themeColor="accent5" w:themeShade="80"/>
+        </w:rPr>
+      </w:pPr>
+    </w:p>
+    <w:p>
+      <w:pPr>
+        <w:pStyle w:val="NormalWeb"/>
+        <w:spacing w:before="0" w:beforeAutospacing="0" w:after="0" w:afterAutospacing="0"/>
+        <w:rPr>
+          <w:color w:val="1F4E79" w:themeColor="accent5" w:themeShade="80"/>
+        </w:rPr>
+      </w:pPr>
+      <w:r>
+        <w:rPr>
+          <w:color w:val="1F4E79" w:themeColor="accent5" w:themeShade="80"/>
+        </w:rPr>
+        <w:drawing>
+          <wp:inline distT="0" distB="0" distL="0" distR="0" wp14:anchorId="3A35B894" wp14:editId="1DCD9604">
+            <wp:extent cx="5760720" cy="2236470"/>
+            <wp:effectExtent l="0" t="0" r="0" b="0"/>
+            <wp:docPr id="2" name="Image 2"/>
+            <wp:cNvGraphicFramePr>
+              <a:graphicFrameLocks xmlns:a="http://schemas.openxmlformats.org/drawingml/2006/main" noChangeAspect="1"/>
+            </wp:cNvGraphicFramePr>
+            <a:graphic xmlns:a="http://schemas.openxmlformats.org/drawingml/2006/main">
+              <a:graphicData uri="http://schemas.openxmlformats.org/drawingml/2006/picture">
+                <pic:pic xmlns:pic="http://schemas.openxmlformats.org/drawingml/2006/picture">
+                  <pic:nvPicPr>
+                    <pic:cNvPr id="1" name=""/>
+                    <pic:cNvPicPr/>
+                  </pic:nvPicPr>
+                  <pic:blipFill>
+                    <a:blip r:embed="rId8"/>
+                    <a:stretch>
+                      <a:fillRect/>
+                    </a:stretch>
+                  </pic:blipFill>
+                  <pic:spPr>
+                    <a:xfrm>
+                      <a:off x="0" y="0"/>
+                      <a:ext cx="5760720" cy="2236470"/>
+                    </a:xfrm>
+                    <a:prstGeom prst="rect">
+                      <a:avLst/>
+                    </a:prstGeom>
+                  </pic:spPr>
+                </pic:pic>
+              </a:graphicData>
+            </a:graphic>
+          </wp:inline>
+        </w:drawing>
+      </w:r>
+    </w:p>
+    <w:p>
+      <w:pPr>
+        <w:pStyle w:val="NormalWeb"/>
+        <w:spacing w:before="0" w:beforeAutospacing="0" w:after="0" w:afterAutospacing="0"/>
+        <w:rPr>
+          <w:color w:val="1F4E79" w:themeColor="accent5" w:themeShade="80"/>
+        </w:rPr>
+      </w:pPr>
+    </w:p>
+    <w:p>
+      <w:pPr>
+        <w:pStyle w:val="NormalWeb"/>
+        <w:spacing w:before="0" w:beforeAutospacing="0" w:after="0" w:afterAutospacing="0"/>
+        <w:rPr>
+          <w:color w:val="1F4E79" w:themeColor="accent5" w:themeShade="80"/>
+        </w:rPr>
+      </w:pPr>
+    </w:p>
+    <w:p>
+      <w:pPr>
+        <w:pStyle w:val="NormalWeb"/>
+        <w:spacing w:before="0" w:beforeAutospacing="0" w:after="0" w:afterAutospacing="0"/>
+        <w:rPr>
+          <w:color w:val="1F4E79" w:themeColor="accent5" w:themeShade="80"/>
+        </w:rPr>
+      </w:pPr>
+    </w:p>
+    <w:p>
+      <w:pPr>
+        <w:spacing w:after="0" w:line="240" w:lineRule="auto"/>
+        <w:jc w:val="both"/>
+        <w:rPr>
+          <w:rFonts w:ascii="Times New Roman" w:hAnsi="Times New Roman" w:cs="Times New Roman"/>
+          <w:color w:val="1F4E79" w:themeColor="accent5" w:themeShade="80"/>
+          <w:sz w:val="24"/>
+          <w:szCs w:val="24"/>
+        </w:rPr>
+      </w:pPr>
+      <w:r>
+        <w:rPr>
+          <w:rFonts w:ascii="Times New Roman" w:hAnsi="Times New Roman" w:cs="Times New Roman"/>
+          <w:color w:val="1F4E79" w:themeColor="accent5" w:themeShade="80"/>
+          <w:sz w:val="24"/>
+          <w:szCs w:val="24"/>
+        </w:rPr>
+        <w:t xml:space="preserve"> </w:t>
+      </w:r>
+    </w:p>
     <w:sectPr>
+      <w:headerReference w:type="default" r:id="rId9"/>
+      <w:footerReference w:type="default" r:id="rId10"/>
       <w:pgSz w:w="11906" w:h="16838"/>
       <w:pgMar w:top="1417" w:right="1417" w:bottom="1417" w:left="1417" w:header="708" w:footer="708" w:gutter="0"/>
+      <w:pgBorders w:offsetFrom="page">
+        <w:top w:val="tornPaperBlack" w:sz="31" w:space="24" w:color="323E4F" w:themeColor="text2" w:themeShade="BF"/>
+        <w:left w:val="tornPaperBlack" w:sz="31" w:space="24" w:color="323E4F" w:themeColor="text2" w:themeShade="BF"/>
+        <w:bottom w:val="tornPaperBlack" w:sz="31" w:space="24" w:color="323E4F" w:themeColor="text2" w:themeShade="BF"/>
+        <w:right w:val="tornPaperBlack" w:sz="31" w:space="24" w:color="323E4F" w:themeColor="text2" w:themeShade="BF"/>
+      </w:pgBorders>
       <w:cols w:space="708"/>
       <w:docGrid w:linePitch="360"/>
     </w:sectPr>
   </w:body>
 </w:document>
+</file>
+
+<file path=word/endnotes.xml><?xml version="1.0" encoding="utf-8"?>
+<w:endnotes xmlns:wpc="http://schemas.microsoft.com/office/word/2010/wordprocessingCanvas" xmlns:cx="http://schemas.microsoft.com/office/drawing/2014/chartex" xmlns:cx1="http://schemas.microsoft.com/office/drawing/2015/9/8/chartex" xmlns:cx2="http://schemas.microsoft.com/office/drawing/2015/10/21/chartex" xmlns:cx3="http://schemas.microsoft.com/office/drawing/2016/5/9/chartex" xmlns:cx4="http://schemas.microsoft.com/office/drawing/2016/5/10/chartex" xmlns:cx5="http://schemas.microsoft.com/office/drawing/2016/5/11/chartex" xmlns:cx6="http://schemas.microsoft.com/office/drawing/2016/5/12/chartex" xmlns:cx7="http://schemas.microsoft.com/office/drawing/2016/5/13/chartex" xmlns:cx8="http://schemas.microsoft.com/office/drawing/2016/5/14/chartex" xmlns:mc="http://schemas.openxmlformats.org/markup-compatibility/2006" xmlns:aink="http://schemas.microsoft.com/office/drawing/2016/ink" xmlns:am3d="http://schemas.microsoft.com/office/drawing/2017/model3d" xmlns:o="urn:schemas-microsoft-com:office:office" xmlns:r="http://schemas.openxmlformats.org/officeDocument/2006/relationships" xmlns:m="http://schemas.openxmlformats.org/officeDocument/2006/math" xmlns:v="urn:schemas-microsoft-com:vml" xmlns:wp14="http://schemas.microsoft.com/office/word/2010/wordprocessingDrawing" xmlns:wp="http://schemas.openxmlformats.org/drawingml/2006/wordprocessingDrawing" xmlns:w10="urn:schemas-microsoft-com:office:word" xmlns:w="http://schemas.openxmlformats.org/wordprocessingml/2006/main" xmlns:w14="http://schemas.microsoft.com/office/word/2010/wordml" xmlns:w15="http://schemas.microsoft.com/office/word/2012/wordml" xmlns:w16cex="http://schemas.microsoft.com/office/word/2018/wordml/cex" xmlns:w16cid="http://schemas.microsoft.com/office/word/2016/wordml/cid" xmlns:w16="http://schemas.microsoft.com/office/word/2018/wordml" xmlns:w16sdtdh="http://schemas.microsoft.com/office/word/2020/wordml/sdtdatahash" xmlns:w16se="http://schemas.microsoft.com/office/word/2015/wordml/symex" xmlns:wpg="http://schemas.microsoft.com/office/word/2010/wordprocessingGroup" xmlns:wpi="http://schemas.microsoft.com/office/word/2010/wordprocessingInk" xmlns:wne="http://schemas.microsoft.com/office/word/2006/wordml" xmlns:wps="http://schemas.microsoft.com/office/word/2010/wordprocessingShape" mc:Ignorable="w14 w15 w16se w16cid w16 w16cex w16sdtdh wp14">
+  <w:endnote w:type="separator" w:id="-1">
+    <w:p>
+      <w:pPr>
+        <w:spacing w:after="0" w:line="240" w:lineRule="auto"/>
+      </w:pPr>
+      <w:r>
+        <w:separator/>
+      </w:r>
+    </w:p>
+  </w:endnote>
+  <w:endnote w:type="continuationSeparator" w:id="0">
+    <w:p>
+      <w:pPr>
+        <w:spacing w:after="0" w:line="240" w:lineRule="auto"/>
+      </w:pPr>
+      <w:r>
+        <w:continuationSeparator/>
+      </w:r>
+    </w:p>
+  </w:endnote>
+</w:endnotes>
+</file>
+
+<file path=word/footer1.xml><?xml version="1.0" encoding="utf-8"?>
+<w:ftr xmlns:wpc="http://schemas.microsoft.com/office/word/2010/wordprocessingCanvas" xmlns:cx="http://schemas.microsoft.com/office/drawing/2014/chartex" xmlns:cx1="http://schemas.microsoft.com/office/drawing/2015/9/8/chartex" xmlns:cx2="http://schemas.microsoft.com/office/drawing/2015/10/21/chartex" xmlns:cx3="http://schemas.microsoft.com/office/drawing/2016/5/9/chartex" xmlns:cx4="http://schemas.microsoft.com/office/drawing/2016/5/10/chartex" xmlns:cx5="http://schemas.microsoft.com/office/drawing/2016/5/11/chartex" xmlns:cx6="http://schemas.microsoft.com/office/drawing/2016/5/12/chartex" xmlns:cx7="http://schemas.microsoft.com/office/drawing/2016/5/13/chartex" xmlns:cx8="http://schemas.microsoft.com/office/drawing/2016/5/14/chartex" xmlns:mc="http://schemas.openxmlformats.org/markup-compatibility/2006" xmlns:aink="http://schemas.microsoft.com/office/drawing/2016/ink" xmlns:am3d="http://schemas.microsoft.com/office/drawing/2017/model3d" xmlns:o="urn:schemas-microsoft-com:office:office" xmlns:r="http://schemas.openxmlformats.org/officeDocument/2006/relationships" xmlns:m="http://schemas.openxmlformats.org/officeDocument/2006/math" xmlns:v="urn:schemas-microsoft-com:vml" xmlns:wp14="http://schemas.microsoft.com/office/word/2010/wordprocessingDrawing" xmlns:wp="http://schemas.openxmlformats.org/drawingml/2006/wordprocessingDrawing" xmlns:w10="urn:schemas-microsoft-com:office:word" xmlns:w="http://schemas.openxmlformats.org/wordprocessingml/2006/main" xmlns:w14="http://schemas.microsoft.com/office/word/2010/wordml" xmlns:w15="http://schemas.microsoft.com/office/word/2012/wordml" xmlns:w16cex="http://schemas.microsoft.com/office/word/2018/wordml/cex" xmlns:w16cid="http://schemas.microsoft.com/office/word/2016/wordml/cid" xmlns:w16="http://schemas.microsoft.com/office/word/2018/wordml" xmlns:w16sdtdh="http://schemas.microsoft.com/office/word/2020/wordml/sdtdatahash" xmlns:w16se="http://schemas.microsoft.com/office/word/2015/wordml/symex" xmlns:wpg="http://schemas.microsoft.com/office/word/2010/wordprocessingGroup" xmlns:wpi="http://schemas.microsoft.com/office/word/2010/wordprocessingInk" xmlns:wne="http://schemas.microsoft.com/office/word/2006/wordml" xmlns:wps="http://schemas.microsoft.com/office/word/2010/wordprocessingShape" mc:Ignorable="w14 w15 w16se w16cid w16 w16cex w16sdtdh wp14">
+  <w:sdt>
+    <w:sdtPr>
+      <w:id w:val="1050726183"/>
+      <w:docPartObj>
+        <w:docPartGallery w:val="Page Numbers (Bottom of Page)"/>
+        <w:docPartUnique/>
+      </w:docPartObj>
+    </w:sdtPr>
+    <w:sdtEndPr/>
+    <w:sdtContent>
+      <w:p>
+        <w:pPr>
+          <w:pStyle w:val="Pieddepage"/>
+        </w:pPr>
+        <w:r>
+          <w:rPr>
+            <w:noProof/>
+          </w:rPr>
+          <mc:AlternateContent>
+            <mc:Choice Requires="wps">
+              <w:drawing>
+                <wp:anchor distT="0" distB="0" distL="114300" distR="114300" simplePos="0" relativeHeight="251659264" behindDoc="0" locked="0" layoutInCell="0" allowOverlap="1" wp14:anchorId="6C443F84" wp14:editId="13F565A4">
+                  <wp:simplePos x="0" y="0"/>
+                  <wp:positionH relativeFrom="rightMargin">
+                    <wp:align>left</wp:align>
+                  </wp:positionH>
+                  <mc:AlternateContent>
+                    <mc:Choice Requires="wp14">
+                      <wp:positionV relativeFrom="bottomMargin">
+                        <wp14:pctPosVOffset>7000</wp14:pctPosVOffset>
+                      </wp:positionV>
+                    </mc:Choice>
+                    <mc:Fallback>
+                      <wp:positionV relativeFrom="page">
+                        <wp:posOffset>9855200</wp:posOffset>
+                      </wp:positionV>
+                    </mc:Fallback>
+                  </mc:AlternateContent>
+                  <wp:extent cx="368300" cy="274320"/>
+                  <wp:effectExtent l="9525" t="9525" r="12700" b="11430"/>
+                  <wp:wrapNone/>
+                  <wp:docPr id="9" name="Rectangle : carré corné 9"/>
+                  <wp:cNvGraphicFramePr>
+                    <a:graphicFrameLocks xmlns:a="http://schemas.openxmlformats.org/drawingml/2006/main"/>
+                  </wp:cNvGraphicFramePr>
+                  <a:graphic xmlns:a="http://schemas.openxmlformats.org/drawingml/2006/main">
+                    <a:graphicData uri="http://schemas.microsoft.com/office/word/2010/wordprocessingShape">
+                      <wps:wsp>
+                        <wps:cNvSpPr>
+                          <a:spLocks noChangeArrowheads="1"/>
+                        </wps:cNvSpPr>
+                        <wps:spPr bwMode="auto">
+                          <a:xfrm>
+                            <a:off x="0" y="0"/>
+                            <a:ext cx="368300" cy="274320"/>
+                          </a:xfrm>
+                          <a:prstGeom prst="foldedCorner">
+                            <a:avLst>
+                              <a:gd name="adj" fmla="val 34560"/>
+                            </a:avLst>
+                          </a:prstGeom>
+                          <a:solidFill>
+                            <a:srgbClr val="FFFFFF"/>
+                          </a:solidFill>
+                          <a:ln w="3175">
+                            <a:solidFill>
+                              <a:srgbClr val="808080"/>
+                            </a:solidFill>
+                            <a:round/>
+                            <a:headEnd/>
+                            <a:tailEnd/>
+                          </a:ln>
+                        </wps:spPr>
+                        <wps:txbx>
+                          <w:txbxContent>
+                            <w:p>
+                              <w:pPr>
+                                <w:jc w:val="center"/>
+                              </w:pPr>
+                              <w:r>
+                                <w:fldChar w:fldCharType="begin"/>
+                              </w:r>
+                              <w:r>
+                                <w:instrText>PAGE    \* MERGEFORMAT</w:instrText>
+                              </w:r>
+                              <w:r>
+                                <w:fldChar w:fldCharType="separate"/>
+                              </w:r>
+                              <w:r>
+                                <w:rPr>
+                                  <w:sz w:val="16"/>
+                                  <w:szCs w:val="16"/>
+                                </w:rPr>
+                                <w:t>2</w:t>
+                              </w:r>
+                              <w:r>
+                                <w:rPr>
+                                  <w:sz w:val="16"/>
+                                  <w:szCs w:val="16"/>
+                                </w:rPr>
+                                <w:fldChar w:fldCharType="end"/>
+                              </w:r>
+                            </w:p>
+                          </w:txbxContent>
+                        </wps:txbx>
+                        <wps:bodyPr rot="0" vert="horz" wrap="square" lIns="91440" tIns="45720" rIns="91440" bIns="45720" anchor="t" anchorCtr="0" upright="1">
+                          <a:noAutofit/>
+                        </wps:bodyPr>
+                      </wps:wsp>
+                    </a:graphicData>
+                  </a:graphic>
+                  <wp14:sizeRelH relativeFrom="page">
+                    <wp14:pctWidth>0</wp14:pctWidth>
+                  </wp14:sizeRelH>
+                  <wp14:sizeRelV relativeFrom="page">
+                    <wp14:pctHeight>0</wp14:pctHeight>
+                  </wp14:sizeRelV>
+                </wp:anchor>
+              </w:drawing>
+            </mc:Choice>
+            <mc:Fallback>
+              <w:pict>
+                <v:shapetype w14:anchorId="6C443F84" id="_x0000_t65" coordsize="21600,21600" o:spt="65" adj="18900" path="m,l,21600@0,21600,21600@0,21600,xem@0,21600nfl@3@5c@7@9@11@13,21600@0e">
+                  <v:formulas>
+                    <v:f eqn="val #0"/>
+                    <v:f eqn="sum 21600 0 @0"/>
+                    <v:f eqn="prod @1 8481 32768"/>
+                    <v:f eqn="sum @2 @0 0"/>
+                    <v:f eqn="prod @1 1117 32768"/>
+                    <v:f eqn="sum @4 @0 0"/>
+                    <v:f eqn="prod @1 11764 32768"/>
+                    <v:f eqn="sum @6 @0 0"/>
+                    <v:f eqn="prod @1 6144 32768"/>
+                    <v:f eqn="sum @8 @0 0"/>
+                    <v:f eqn="prod @1 20480 32768"/>
+                    <v:f eqn="sum @10 @0 0"/>
+                    <v:f eqn="prod @1 6144 32768"/>
+                    <v:f eqn="sum @12 @0 0"/>
+                  </v:formulas>
+                  <v:path o:extrusionok="f" gradientshapeok="t" o:connecttype="rect" textboxrect="0,0,21600,@13"/>
+                  <v:handles>
+                    <v:h position="#0,bottomRight" xrange="10800,21600"/>
+                  </v:handles>
+                  <o:complex v:ext="view"/>
+                </v:shapetype>
+                <v:shape id="Rectangle : carré corné 9" o:spid="_x0000_s1026" type="#_x0000_t65" style="position:absolute;margin-left:0;margin-top:0;width:29pt;height:21.6pt;z-index:251659264;visibility:visible;mso-wrap-style:square;mso-width-percent:0;mso-height-percent:0;mso-top-percent:70;mso-wrap-distance-left:9pt;mso-wrap-distance-top:0;mso-wrap-distance-right:9pt;mso-wrap-distance-bottom:0;mso-position-horizontal:left;mso-position-horizontal-relative:right-margin-area;mso-position-vertical-relative:bottom-margin-area;mso-width-percent:0;mso-height-percent:0;mso-top-percent:70;mso-width-relative:page;mso-height-relative:page;v-text-anchor:top" o:gfxdata="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" o:allowincell="f" adj="14135" strokecolor="gray" strokeweight=".25pt">
+                  <v:textbox>
+                    <w:txbxContent>
+                      <w:p>
+                        <w:pPr>
+                          <w:jc w:val="center"/>
+                        </w:pPr>
+                        <w:r>
+                          <w:fldChar w:fldCharType="begin"/>
+                        </w:r>
+                        <w:r>
+                          <w:instrText>PAGE    \* MERGEFORMAT</w:instrText>
+                        </w:r>
+                        <w:r>
+                          <w:fldChar w:fldCharType="separate"/>
+                        </w:r>
+                        <w:r>
+                          <w:rPr>
+                            <w:sz w:val="16"/>
+                            <w:szCs w:val="16"/>
+                          </w:rPr>
+                          <w:t>2</w:t>
+                        </w:r>
+                        <w:r>
+                          <w:rPr>
+                            <w:sz w:val="16"/>
+                            <w:szCs w:val="16"/>
+                          </w:rPr>
+                          <w:fldChar w:fldCharType="end"/>
+                        </w:r>
+                      </w:p>
+                    </w:txbxContent>
+                  </v:textbox>
+                  <w10:wrap anchorx="margin" anchory="margin"/>
+                </v:shape>
+              </w:pict>
+            </mc:Fallback>
+          </mc:AlternateContent>
+        </w:r>
+      </w:p>
+    </w:sdtContent>
+  </w:sdt>
+</w:ftr>
+</file>
+
+<file path=word/footnotes.xml><?xml version="1.0" encoding="utf-8"?>
+<w:footnotes xmlns:wpc="http://schemas.microsoft.com/office/word/2010/wordprocessingCanvas" xmlns:cx="http://schemas.microsoft.com/office/drawing/2014/chartex" xmlns:cx1="http://schemas.microsoft.com/office/drawing/2015/9/8/chartex" xmlns:cx2="http://schemas.microsoft.com/office/drawing/2015/10/21/chartex" xmlns:cx3="http://schemas.microsoft.com/office/drawing/2016/5/9/chartex" xmlns:cx4="http://schemas.microsoft.com/office/drawing/2016/5/10/chartex" xmlns:cx5="http://schemas.microsoft.com/office/drawing/2016/5/11/chartex" xmlns:cx6="http://schemas.microsoft.com/office/drawing/2016/5/12/chartex" xmlns:cx7="http://schemas.microsoft.com/office/drawing/2016/5/13/chartex" xmlns:cx8="http://schemas.microsoft.com/office/drawing/2016/5/14/chartex" xmlns:mc="http://schemas.openxmlformats.org/markup-compatibility/2006" xmlns:aink="http://schemas.microsoft.com/office/drawing/2016/ink" xmlns:am3d="http://schemas.microsoft.com/office/drawing/2017/model3d" xmlns:o="urn:schemas-microsoft-com:office:office" xmlns:r="http://schemas.openxmlformats.org/officeDocument/2006/relationships" xmlns:m="http://schemas.openxmlformats.org/officeDocument/2006/math" xmlns:v="urn:schemas-microsoft-com:vml" xmlns:wp14="http://schemas.microsoft.com/office/word/2010/wordprocessingDrawing" xmlns:wp="http://schemas.openxmlformats.org/drawingml/2006/wordprocessingDrawing" xmlns:w10="urn:schemas-microsoft-com:office:word" xmlns:w="http://schemas.openxmlformats.org/wordprocessingml/2006/main" xmlns:w14="http://schemas.microsoft.com/office/word/2010/wordml" xmlns:w15="http://schemas.microsoft.com/office/word/2012/wordml" xmlns:w16cex="http://schemas.microsoft.com/office/word/2018/wordml/cex" xmlns:w16cid="http://schemas.microsoft.com/office/word/2016/wordml/cid" xmlns:w16="http://schemas.microsoft.com/office/word/2018/wordml" xmlns:w16sdtdh="http://schemas.microsoft.com/office/word/2020/wordml/sdtdatahash" xmlns:w16se="http://schemas.microsoft.com/office/word/2015/wordml/symex" xmlns:wpg="http://schemas.microsoft.com/office/word/2010/wordprocessingGroup" xmlns:wpi="http://schemas.microsoft.com/office/word/2010/wordprocessingInk" xmlns:wne="http://schemas.microsoft.com/office/word/2006/wordml" xmlns:wps="http://schemas.microsoft.com/office/word/2010/wordprocessingShape" mc:Ignorable="w14 w15 w16se w16cid w16 w16cex w16sdtdh wp14">
+  <w:footnote w:type="separator" w:id="-1">
+    <w:p>
+      <w:pPr>
+        <w:spacing w:after="0" w:line="240" w:lineRule="auto"/>
+      </w:pPr>
+      <w:r>
+        <w:separator/>
+      </w:r>
+    </w:p>
+  </w:footnote>
+  <w:footnote w:type="continuationSeparator" w:id="0">
+    <w:p>
+      <w:pPr>
+        <w:spacing w:after="0" w:line="240" w:lineRule="auto"/>
+      </w:pPr>
+      <w:r>
+        <w:continuationSeparator/>
+      </w:r>
+    </w:p>
+  </w:footnote>
+</w:footnotes>
+</file>
+
+<file path=word/header1.xml><?xml version="1.0" encoding="utf-8"?>
+<w:hdr xmlns:wpc="http://schemas.microsoft.com/office/word/2010/wordprocessingCanvas" xmlns:cx="http://schemas.microsoft.com/office/drawing/2014/chartex" xmlns:cx1="http://schemas.microsoft.com/office/drawing/2015/9/8/chartex" xmlns:cx2="http://schemas.microsoft.com/office/drawing/2015/10/21/chartex" xmlns:cx3="http://schemas.microsoft.com/office/drawing/2016/5/9/chartex" xmlns:cx4="http://schemas.microsoft.com/office/drawing/2016/5/10/chartex" xmlns:cx5="http://schemas.microsoft.com/office/drawing/2016/5/11/chartex" xmlns:cx6="http://schemas.microsoft.com/office/drawing/2016/5/12/chartex" xmlns:cx7="http://schemas.microsoft.com/office/drawing/2016/5/13/chartex" xmlns:cx8="http://schemas.microsoft.com/office/drawing/2016/5/14/chartex" xmlns:mc="http://schemas.openxmlformats.org/markup-compatibility/2006" xmlns:aink="http://schemas.microsoft.com/office/drawing/2016/ink" xmlns:am3d="http://schemas.microsoft.com/office/drawing/2017/model3d" xmlns:o="urn:schemas-microsoft-com:office:office" xmlns:r="http://schemas.openxmlformats.org/officeDocument/2006/relationships" xmlns:m="http://schemas.openxmlformats.org/officeDocument/2006/math" xmlns:v="urn:schemas-microsoft-com:vml" xmlns:wp14="http://schemas.microsoft.com/office/word/2010/wordprocessingDrawing" xmlns:wp="http://schemas.openxmlformats.org/drawingml/2006/wordprocessingDrawing" xmlns:w10="urn:schemas-microsoft-com:office:word" xmlns:w="http://schemas.openxmlformats.org/wordprocessingml/2006/main" xmlns:w14="http://schemas.microsoft.com/office/word/2010/wordml" xmlns:w15="http://schemas.microsoft.com/office/word/2012/wordml" xmlns:w16cex="http://schemas.microsoft.com/office/word/2018/wordml/cex" xmlns:w16cid="http://schemas.microsoft.com/office/word/2016/wordml/cid" xmlns:w16="http://schemas.microsoft.com/office/word/2018/wordml" xmlns:w16sdtdh="http://schemas.microsoft.com/office/word/2020/wordml/sdtdatahash" xmlns:w16se="http://schemas.microsoft.com/office/word/2015/wordml/symex" xmlns:wpg="http://schemas.microsoft.com/office/word/2010/wordprocessingGroup" xmlns:wpi="http://schemas.microsoft.com/office/word/2010/wordprocessingInk" xmlns:wne="http://schemas.microsoft.com/office/word/2006/wordml" xmlns:wps="http://schemas.microsoft.com/office/word/2010/wordprocessingShape" mc:Ignorable="w14 w15 w16se w16cid w16 w16cex w16sdtdh wp14">
+  <w:p>
+    <w:pPr>
+      <w:pStyle w:val="En-tte"/>
+      <w:rPr>
+        <w:b/>
+        <w:bCs/>
+        <w:sz w:val="28"/>
+        <w:szCs w:val="28"/>
+      </w:rPr>
+    </w:pPr>
+    <w:r>
+      <w:rPr>
+        <w:noProof/>
+      </w:rPr>
+      <w:drawing>
+        <wp:inline distT="0" distB="0" distL="0" distR="0" wp14:anchorId="5C946220" wp14:editId="57395904">
+          <wp:extent cx="2079448" cy="711200"/>
+          <wp:effectExtent l="0" t="0" r="0" b="0"/>
+          <wp:docPr id="8" name="Image 8" descr="Orange Digital Center Sénégal"/>
+          <wp:cNvGraphicFramePr>
+            <a:graphicFrameLocks xmlns:a="http://schemas.openxmlformats.org/drawingml/2006/main" noChangeAspect="1"/>
+          </wp:cNvGraphicFramePr>
+          <a:graphic xmlns:a="http://schemas.openxmlformats.org/drawingml/2006/main">
+            <a:graphicData uri="http://schemas.openxmlformats.org/drawingml/2006/picture">
+              <pic:pic xmlns:pic="http://schemas.openxmlformats.org/drawingml/2006/picture">
+                <pic:nvPicPr>
+                  <pic:cNvPr id="0" name="Picture 1" descr="Orange Digital Center Sénégal"/>
+                  <pic:cNvPicPr>
+                    <a:picLocks noChangeAspect="1" noChangeArrowheads="1"/>
+                  </pic:cNvPicPr>
+                </pic:nvPicPr>
+                <pic:blipFill>
+                  <a:blip r:embed="rId1">
+                    <a:extLst>
+                      <a:ext uri="{28A0092B-C50C-407E-A947-70E740481C1C}">
+                        <a14:useLocalDpi xmlns:a14="http://schemas.microsoft.com/office/drawing/2010/main" val="0"/>
+                      </a:ext>
+                    </a:extLst>
+                  </a:blip>
+                  <a:srcRect/>
+                  <a:stretch>
+                    <a:fillRect/>
+                  </a:stretch>
+                </pic:blipFill>
+                <pic:spPr bwMode="auto">
+                  <a:xfrm>
+                    <a:off x="0" y="0"/>
+                    <a:ext cx="2083856" cy="712708"/>
+                  </a:xfrm>
+                  <a:prstGeom prst="rect">
+                    <a:avLst/>
+                  </a:prstGeom>
+                  <a:noFill/>
+                  <a:ln>
+                    <a:noFill/>
+                  </a:ln>
+                </pic:spPr>
+              </pic:pic>
+            </a:graphicData>
+          </a:graphic>
+        </wp:inline>
+      </w:drawing>
+    </w:r>
+    <w:r>
+      <w:tab/>
+    </w:r>
+    <w:r>
+      <w:tab/>
+    </w:r>
+    <w:r>
+      <w:rPr>
+        <w:b/>
+        <w:bCs/>
+        <w:sz w:val="28"/>
+        <w:szCs w:val="28"/>
+      </w:rPr>
+      <w:t>Intelligence Artificielle</w:t>
+    </w:r>
+  </w:p>
+</w:hdr>
 </file>
 
 <file path=word/styles.xml><?xml version="1.0" encoding="utf-8"?>
@@ -441,6 +1461,77 @@
     <w:semiHidden/>
     <w:unhideWhenUsed/>
   </w:style>
+  <w:style w:type="paragraph" w:styleId="En-tte">
+    <w:name w:val="header"/>
+    <w:basedOn w:val="Normal"/>
+    <w:link w:val="En-tteCar"/>
+    <w:uiPriority w:val="99"/>
+    <w:unhideWhenUsed/>
+    <w:rsid w:val="00D723EE"/>
+    <w:pPr>
+      <w:tabs>
+        <w:tab w:val="center" w:pos="4536"/>
+        <w:tab w:val="right" w:pos="9072"/>
+      </w:tabs>
+      <w:spacing w:after="0" w:line="240" w:lineRule="auto"/>
+    </w:pPr>
+  </w:style>
+  <w:style w:type="character" w:customStyle="1" w:styleId="En-tteCar">
+    <w:name w:val="En-tête Car"/>
+    <w:basedOn w:val="Policepardfaut"/>
+    <w:link w:val="En-tte"/>
+    <w:uiPriority w:val="99"/>
+    <w:rsid w:val="00D723EE"/>
+  </w:style>
+  <w:style w:type="paragraph" w:styleId="Pieddepage">
+    <w:name w:val="footer"/>
+    <w:basedOn w:val="Normal"/>
+    <w:link w:val="PieddepageCar"/>
+    <w:uiPriority w:val="99"/>
+    <w:unhideWhenUsed/>
+    <w:rsid w:val="00D723EE"/>
+    <w:pPr>
+      <w:tabs>
+        <w:tab w:val="center" w:pos="4536"/>
+        <w:tab w:val="right" w:pos="9072"/>
+      </w:tabs>
+      <w:spacing w:after="0" w:line="240" w:lineRule="auto"/>
+    </w:pPr>
+  </w:style>
+  <w:style w:type="character" w:customStyle="1" w:styleId="PieddepageCar">
+    <w:name w:val="Pied de page Car"/>
+    <w:basedOn w:val="Policepardfaut"/>
+    <w:link w:val="Pieddepage"/>
+    <w:uiPriority w:val="99"/>
+    <w:rsid w:val="00D723EE"/>
+  </w:style>
+  <w:style w:type="character" w:styleId="Numrodeligne">
+    <w:name w:val="line number"/>
+    <w:basedOn w:val="Policepardfaut"/>
+    <w:uiPriority w:val="99"/>
+    <w:semiHidden/>
+    <w:unhideWhenUsed/>
+    <w:rsid w:val="00D56F7C"/>
+  </w:style>
+  <w:style w:type="paragraph" w:styleId="NormalWeb">
+    <w:name w:val="Normal (Web)"/>
+    <w:basedOn w:val="Normal"/>
+    <w:uiPriority w:val="99"/>
+    <w:semiHidden/>
+    <w:unhideWhenUsed/>
+    <w:rsid w:val="00D21DB8"/>
+    <w:pPr>
+      <w:spacing w:before="100" w:beforeAutospacing="1" w:after="100" w:afterAutospacing="1" w:line="240" w:lineRule="auto"/>
+    </w:pPr>
+    <w:rPr>
+      <w:rFonts w:ascii="Times New Roman" w:eastAsia="Times New Roman" w:hAnsi="Times New Roman" w:cs="Times New Roman"/>
+      <w:kern w:val="0"/>
+      <w:sz w:val="24"/>
+      <w:szCs w:val="24"/>
+      <w:lang w:eastAsia="fr-FR"/>
+      <w14:ligatures w14:val="none"/>
+    </w:rPr>
+  </w:style>
 </w:styles>
 </file>
 
@@ -737,4 +1828,16 @@
     </a:ext>
   </a:extLst>
 </a:theme>
+</file>
+
+<file path=customXml/item1.xml><?xml version="1.0" encoding="utf-8"?>
+<b:Sources xmlns:b="http://schemas.openxmlformats.org/officeDocument/2006/bibliography" xmlns="http://schemas.openxmlformats.org/officeDocument/2006/bibliography" SelectedStyle="\APASixthEditionOfficeOnline.xsl" StyleName="APA" Version="6"/>
+</file>
+
+<file path=customXml/itemProps1.xml><?xml version="1.0" encoding="utf-8"?>
+<ds:datastoreItem xmlns:ds="http://schemas.openxmlformats.org/officeDocument/2006/customXml" ds:itemID="{686F595E-9124-4DC1-8938-90CC85B2052D}">
+  <ds:schemaRefs>
+    <ds:schemaRef ds:uri="http://schemas.openxmlformats.org/officeDocument/2006/bibliography"/>
+  </ds:schemaRefs>
+</ds:datastoreItem>
 </file>
</xml_diff>

<commit_message>
Proposer au modèle un texte à analyser avec des contraintes puis utiliser un second prompt lui demandant de vérifier sa réponse précédente et de contrôler les informations non justifiées, les contradictions, les informations absentes, les éventuelles hallucinations et le respect des contraintes
</commit_message>
<xml_diff>
--- a/Atelier Prompt.docx
+++ b/Atelier Prompt.docx
@@ -3029,17 +3029,1228 @@
     </w:p>
     <w:p>
       <w:pPr>
-        <w:jc w:val="center"/>
-        <w:rPr>
-          <w:rFonts w:ascii="Times New Roman" w:hAnsi="Times New Roman" w:cs="Times New Roman"/>
-          <w:sz w:val="24"/>
-          <w:szCs w:val="24"/>
-        </w:rPr>
-      </w:pPr>
+        <w:autoSpaceDE w:val="0"/>
+        <w:autoSpaceDN w:val="0"/>
+        <w:adjustRightInd w:val="0"/>
+        <w:spacing w:after="0" w:line="240" w:lineRule="auto"/>
+        <w:rPr>
+          <w:rFonts w:ascii="Times New Roman" w:hAnsi="Times New Roman" w:cs="Times New Roman"/>
+          <w:color w:val="000000"/>
+          <w:kern w:val="0"/>
+          <w:sz w:val="24"/>
+          <w:szCs w:val="24"/>
+        </w:rPr>
+      </w:pPr>
+      <w:r>
+        <w:rPr>
+          <w:rFonts w:ascii="Times New Roman" w:hAnsi="Times New Roman" w:cs="Times New Roman"/>
+          <w:color w:val="000000"/>
+          <w:kern w:val="0"/>
+          <w:sz w:val="24"/>
+          <w:szCs w:val="24"/>
+        </w:rPr>
+        <w:t>2) Proposer au modèle un texte à analyser avec des contraintes puis utiliser un second prompt</w:t>
+      </w:r>
+    </w:p>
+    <w:p>
+      <w:pPr>
+        <w:autoSpaceDE w:val="0"/>
+        <w:autoSpaceDN w:val="0"/>
+        <w:adjustRightInd w:val="0"/>
+        <w:spacing w:after="0" w:line="240" w:lineRule="auto"/>
+        <w:rPr>
+          <w:rFonts w:ascii="Times New Roman" w:hAnsi="Times New Roman" w:cs="Times New Roman"/>
+          <w:color w:val="000000"/>
+          <w:kern w:val="0"/>
+          <w:sz w:val="24"/>
+          <w:szCs w:val="24"/>
+        </w:rPr>
+      </w:pPr>
+      <w:r>
+        <w:rPr>
+          <w:rFonts w:ascii="Times New Roman" w:hAnsi="Times New Roman" w:cs="Times New Roman"/>
+          <w:color w:val="000000"/>
+          <w:kern w:val="0"/>
+          <w:sz w:val="24"/>
+          <w:szCs w:val="24"/>
+        </w:rPr>
+        <w:t>lui demandant de vérifier sa réponse précédente et de contrôler les informations non</w:t>
+      </w:r>
+    </w:p>
+    <w:p>
+      <w:pPr>
+        <w:autoSpaceDE w:val="0"/>
+        <w:autoSpaceDN w:val="0"/>
+        <w:adjustRightInd w:val="0"/>
+        <w:spacing w:after="0" w:line="240" w:lineRule="auto"/>
+        <w:rPr>
+          <w:rFonts w:ascii="Times New Roman" w:hAnsi="Times New Roman" w:cs="Times New Roman"/>
+          <w:color w:val="000000"/>
+          <w:kern w:val="0"/>
+          <w:sz w:val="24"/>
+          <w:szCs w:val="24"/>
+        </w:rPr>
+      </w:pPr>
+      <w:r>
+        <w:rPr>
+          <w:rFonts w:ascii="Times New Roman" w:hAnsi="Times New Roman" w:cs="Times New Roman"/>
+          <w:color w:val="000000"/>
+          <w:kern w:val="0"/>
+          <w:sz w:val="24"/>
+          <w:szCs w:val="24"/>
+        </w:rPr>
+        <w:t>justifiées, les contradictions, les informations absentes, les éventuelles hallucinations et le</w:t>
+      </w:r>
+    </w:p>
+    <w:p>
+      <w:pPr>
+        <w:rPr>
+          <w:rFonts w:ascii="Times New Roman" w:hAnsi="Times New Roman" w:cs="Times New Roman"/>
+          <w:b/>
+          <w:bCs/>
+          <w:color w:val="1F4E79" w:themeColor="accent5" w:themeShade="80"/>
+          <w:sz w:val="24"/>
+          <w:szCs w:val="24"/>
+        </w:rPr>
+      </w:pPr>
+      <w:r>
+        <w:rPr>
+          <w:rFonts w:ascii="Times New Roman" w:hAnsi="Times New Roman" w:cs="Times New Roman"/>
+          <w:color w:val="000000"/>
+          <w:kern w:val="0"/>
+          <w:sz w:val="24"/>
+          <w:szCs w:val="24"/>
+        </w:rPr>
+        <w:t>respect des contraintes.</w:t>
+      </w:r>
+    </w:p>
+    <w:p>
+      <w:pPr>
+        <w:spacing w:after="0" w:line="240" w:lineRule="auto"/>
+        <w:ind w:left="708"/>
+        <w:rPr>
+          <w:rFonts w:ascii="Times New Roman" w:eastAsia="Times New Roman" w:hAnsi="Times New Roman" w:cs="Times New Roman"/>
+          <w:color w:val="2F5496" w:themeColor="accent1" w:themeShade="BF"/>
+          <w:kern w:val="0"/>
+          <w:sz w:val="24"/>
+          <w:szCs w:val="24"/>
+          <w:lang w:eastAsia="fr-FR"/>
+          <w14:ligatures w14:val="none"/>
+        </w:rPr>
+      </w:pPr>
+      <w:r>
+        <w:rPr>
+          <w:rFonts w:ascii="Times New Roman" w:eastAsia="Times New Roman" w:hAnsi="Times New Roman" w:cs="Times New Roman"/>
+          <w:color w:val="2F5496" w:themeColor="accent1" w:themeShade="BF"/>
+          <w:kern w:val="0"/>
+          <w:sz w:val="24"/>
+          <w:szCs w:val="24"/>
+          <w:lang w:eastAsia="fr-FR"/>
+          <w14:ligatures w14:val="none"/>
+        </w:rPr>
+        <w:t>Tu es un expert en analyse de retours clients.</w:t>
+      </w:r>
+    </w:p>
+    <w:p>
+      <w:pPr>
+        <w:spacing w:after="0" w:line="240" w:lineRule="auto"/>
+        <w:ind w:left="708"/>
+        <w:rPr>
+          <w:rFonts w:ascii="Times New Roman" w:eastAsia="Times New Roman" w:hAnsi="Times New Roman" w:cs="Times New Roman"/>
+          <w:color w:val="2F5496" w:themeColor="accent1" w:themeShade="BF"/>
+          <w:kern w:val="0"/>
+          <w:sz w:val="24"/>
+          <w:szCs w:val="24"/>
+          <w:lang w:eastAsia="fr-FR"/>
+          <w14:ligatures w14:val="none"/>
+        </w:rPr>
+      </w:pPr>
+      <w:r>
+        <w:rPr>
+          <w:rFonts w:ascii="Times New Roman" w:eastAsia="Times New Roman" w:hAnsi="Times New Roman" w:cs="Times New Roman"/>
+          <w:color w:val="2F5496" w:themeColor="accent1" w:themeShade="BF"/>
+          <w:kern w:val="0"/>
+          <w:sz w:val="24"/>
+          <w:szCs w:val="24"/>
+          <w:lang w:eastAsia="fr-FR"/>
+          <w14:ligatures w14:val="none"/>
+        </w:rPr>
+        <w:t>Analyse le texte suivant afin d'identifier les points positifs, les problèmes rencontrés et les recommandations d'amélioration.</w:t>
+      </w:r>
+    </w:p>
+    <w:p>
+      <w:pPr>
+        <w:spacing w:after="0" w:line="240" w:lineRule="auto"/>
+        <w:ind w:left="708"/>
+        <w:rPr>
+          <w:rFonts w:ascii="Times New Roman" w:eastAsia="Times New Roman" w:hAnsi="Times New Roman" w:cs="Times New Roman"/>
+          <w:color w:val="2F5496" w:themeColor="accent1" w:themeShade="BF"/>
+          <w:kern w:val="0"/>
+          <w:sz w:val="24"/>
+          <w:szCs w:val="24"/>
+          <w:lang w:eastAsia="fr-FR"/>
+          <w14:ligatures w14:val="none"/>
+        </w:rPr>
+      </w:pPr>
+      <w:r>
+        <w:rPr>
+          <w:rFonts w:ascii="Times New Roman" w:eastAsia="Times New Roman" w:hAnsi="Times New Roman" w:cs="Times New Roman"/>
+          <w:color w:val="2F5496" w:themeColor="accent1" w:themeShade="BF"/>
+          <w:kern w:val="0"/>
+          <w:sz w:val="24"/>
+          <w:szCs w:val="24"/>
+          <w:lang w:eastAsia="fr-FR"/>
+          <w14:ligatures w14:val="none"/>
+        </w:rPr>
+        <w:t>"</w:t>
+      </w:r>
+      <w:r>
+        <w:rPr>
+          <w:rFonts w:ascii="Times New Roman" w:eastAsia="Times New Roman" w:hAnsi="Times New Roman" w:cs="Times New Roman"/>
+          <w:color w:val="2F5496" w:themeColor="accent1" w:themeShade="BF"/>
+          <w:kern w:val="0"/>
+          <w:sz w:val="24"/>
+          <w:szCs w:val="24"/>
+          <w:lang w:eastAsia="fr-FR"/>
+          <w14:ligatures w14:val="none"/>
+        </w:rPr>
+        <w:t xml:space="preserve"> Les clients apprécient la rapidité du service et la facilité d'utilisation de l'application. Cependant, plusieurs clients signalent que l'application plante régulièrement lors du paiement. Certains indiquent également que le service client met parfois plus de 48 heures à répondre. Un client affirme que l'entreprise a perdu 30 % de ses clients à cause de ces problèmes.</w:t>
+      </w:r>
+      <w:r>
+        <w:rPr>
+          <w:rFonts w:ascii="Times New Roman" w:eastAsia="Times New Roman" w:hAnsi="Times New Roman" w:cs="Times New Roman"/>
+          <w:color w:val="2F5496" w:themeColor="accent1" w:themeShade="BF"/>
+          <w:kern w:val="0"/>
+          <w:sz w:val="24"/>
+          <w:szCs w:val="24"/>
+          <w:lang w:eastAsia="fr-FR"/>
+          <w14:ligatures w14:val="none"/>
+        </w:rPr>
+        <w:t>"</w:t>
+      </w:r>
+    </w:p>
+    <w:p>
+      <w:pPr>
+        <w:spacing w:after="0" w:line="240" w:lineRule="auto"/>
+        <w:ind w:left="708"/>
+        <w:rPr>
+          <w:rFonts w:ascii="Times New Roman" w:eastAsia="Times New Roman" w:hAnsi="Times New Roman" w:cs="Times New Roman"/>
+          <w:color w:val="2F5496" w:themeColor="accent1" w:themeShade="BF"/>
+          <w:kern w:val="0"/>
+          <w:sz w:val="24"/>
+          <w:szCs w:val="24"/>
+          <w:lang w:eastAsia="fr-FR"/>
+          <w14:ligatures w14:val="none"/>
+        </w:rPr>
+      </w:pPr>
+      <w:r>
+        <w:rPr>
+          <w:rFonts w:ascii="Times New Roman" w:eastAsia="Times New Roman" w:hAnsi="Times New Roman" w:cs="Times New Roman"/>
+          <w:color w:val="2F5496" w:themeColor="accent1" w:themeShade="BF"/>
+          <w:kern w:val="0"/>
+          <w:sz w:val="24"/>
+          <w:szCs w:val="24"/>
+          <w:lang w:eastAsia="fr-FR"/>
+          <w14:ligatures w14:val="none"/>
+        </w:rPr>
+        <w:t>Base-toi uniquement sur les informations présentes dans le texte.</w:t>
+      </w:r>
+    </w:p>
+    <w:p>
+      <w:pPr>
+        <w:numPr>
+          <w:ilvl w:val="0"/>
+          <w:numId w:val="6"/>
+        </w:numPr>
+        <w:tabs>
+          <w:tab w:val="clear" w:pos="720"/>
+          <w:tab w:val="num" w:pos="1428"/>
+        </w:tabs>
+        <w:spacing w:after="0" w:line="240" w:lineRule="auto"/>
+        <w:ind w:left="1428"/>
+        <w:rPr>
+          <w:rFonts w:ascii="Times New Roman" w:eastAsia="Times New Roman" w:hAnsi="Times New Roman" w:cs="Times New Roman"/>
+          <w:color w:val="2F5496" w:themeColor="accent1" w:themeShade="BF"/>
+          <w:kern w:val="0"/>
+          <w:sz w:val="24"/>
+          <w:szCs w:val="24"/>
+          <w:lang w:eastAsia="fr-FR"/>
+          <w14:ligatures w14:val="none"/>
+        </w:rPr>
+      </w:pPr>
+      <w:r>
+        <w:rPr>
+          <w:rFonts w:ascii="Times New Roman" w:eastAsia="Times New Roman" w:hAnsi="Times New Roman" w:cs="Times New Roman"/>
+          <w:color w:val="2F5496" w:themeColor="accent1" w:themeShade="BF"/>
+          <w:kern w:val="0"/>
+          <w:sz w:val="24"/>
+          <w:szCs w:val="24"/>
+          <w:lang w:eastAsia="fr-FR"/>
+          <w14:ligatures w14:val="none"/>
+        </w:rPr>
+        <w:t>Ne crée aucune information qui n'est pas mentionnée.</w:t>
+      </w:r>
+    </w:p>
+    <w:p>
+      <w:pPr>
+        <w:numPr>
+          <w:ilvl w:val="0"/>
+          <w:numId w:val="6"/>
+        </w:numPr>
+        <w:tabs>
+          <w:tab w:val="clear" w:pos="720"/>
+          <w:tab w:val="num" w:pos="1428"/>
+        </w:tabs>
+        <w:spacing w:after="0" w:line="240" w:lineRule="auto"/>
+        <w:ind w:left="1428"/>
+        <w:rPr>
+          <w:rFonts w:ascii="Times New Roman" w:eastAsia="Times New Roman" w:hAnsi="Times New Roman" w:cs="Times New Roman"/>
+          <w:color w:val="2F5496" w:themeColor="accent1" w:themeShade="BF"/>
+          <w:kern w:val="0"/>
+          <w:sz w:val="24"/>
+          <w:szCs w:val="24"/>
+          <w:lang w:eastAsia="fr-FR"/>
+          <w14:ligatures w14:val="none"/>
+        </w:rPr>
+      </w:pPr>
+      <w:r>
+        <w:rPr>
+          <w:rFonts w:ascii="Times New Roman" w:eastAsia="Times New Roman" w:hAnsi="Times New Roman" w:cs="Times New Roman"/>
+          <w:color w:val="2F5496" w:themeColor="accent1" w:themeShade="BF"/>
+          <w:kern w:val="0"/>
+          <w:sz w:val="24"/>
+          <w:szCs w:val="24"/>
+          <w:lang w:eastAsia="fr-FR"/>
+          <w14:ligatures w14:val="none"/>
+        </w:rPr>
+        <w:t>Distingue clairement les faits des affirmations non vérifiables.</w:t>
+      </w:r>
+    </w:p>
+    <w:p>
+      <w:pPr>
+        <w:numPr>
+          <w:ilvl w:val="0"/>
+          <w:numId w:val="6"/>
+        </w:numPr>
+        <w:tabs>
+          <w:tab w:val="clear" w:pos="720"/>
+          <w:tab w:val="num" w:pos="1428"/>
+        </w:tabs>
+        <w:spacing w:after="0" w:line="240" w:lineRule="auto"/>
+        <w:ind w:left="1428"/>
+        <w:rPr>
+          <w:rFonts w:ascii="Times New Roman" w:eastAsia="Times New Roman" w:hAnsi="Times New Roman" w:cs="Times New Roman"/>
+          <w:color w:val="2F5496" w:themeColor="accent1" w:themeShade="BF"/>
+          <w:kern w:val="0"/>
+          <w:sz w:val="24"/>
+          <w:szCs w:val="24"/>
+          <w:lang w:eastAsia="fr-FR"/>
+          <w14:ligatures w14:val="none"/>
+        </w:rPr>
+      </w:pPr>
+      <w:r>
+        <w:rPr>
+          <w:rFonts w:ascii="Times New Roman" w:eastAsia="Times New Roman" w:hAnsi="Times New Roman" w:cs="Times New Roman"/>
+          <w:color w:val="2F5496" w:themeColor="accent1" w:themeShade="BF"/>
+          <w:kern w:val="0"/>
+          <w:sz w:val="24"/>
+          <w:szCs w:val="24"/>
+          <w:lang w:eastAsia="fr-FR"/>
+          <w14:ligatures w14:val="none"/>
+        </w:rPr>
+        <w:t>Identifie les problèmes récurrents lorsqu'ils sont explicitement mentionnés.</w:t>
+      </w:r>
+    </w:p>
+    <w:p>
+      <w:pPr>
+        <w:numPr>
+          <w:ilvl w:val="0"/>
+          <w:numId w:val="6"/>
+        </w:numPr>
+        <w:tabs>
+          <w:tab w:val="clear" w:pos="720"/>
+          <w:tab w:val="num" w:pos="1428"/>
+        </w:tabs>
+        <w:spacing w:after="0" w:line="240" w:lineRule="auto"/>
+        <w:ind w:left="1428"/>
+        <w:rPr>
+          <w:rFonts w:ascii="Times New Roman" w:eastAsia="Times New Roman" w:hAnsi="Times New Roman" w:cs="Times New Roman"/>
+          <w:color w:val="2F5496" w:themeColor="accent1" w:themeShade="BF"/>
+          <w:kern w:val="0"/>
+          <w:sz w:val="24"/>
+          <w:szCs w:val="24"/>
+          <w:lang w:eastAsia="fr-FR"/>
+          <w14:ligatures w14:val="none"/>
+        </w:rPr>
+      </w:pPr>
+      <w:r>
+        <w:rPr>
+          <w:rFonts w:ascii="Times New Roman" w:eastAsia="Times New Roman" w:hAnsi="Times New Roman" w:cs="Times New Roman"/>
+          <w:color w:val="2F5496" w:themeColor="accent1" w:themeShade="BF"/>
+          <w:kern w:val="0"/>
+          <w:sz w:val="24"/>
+          <w:szCs w:val="24"/>
+          <w:lang w:eastAsia="fr-FR"/>
+          <w14:ligatures w14:val="none"/>
+        </w:rPr>
+        <w:t>Propose uniquement des recommandations directement liées aux problèmes identifiés.</w:t>
+      </w:r>
+    </w:p>
+    <w:p>
+      <w:pPr>
+        <w:numPr>
+          <w:ilvl w:val="0"/>
+          <w:numId w:val="6"/>
+        </w:numPr>
+        <w:tabs>
+          <w:tab w:val="clear" w:pos="720"/>
+          <w:tab w:val="num" w:pos="1428"/>
+        </w:tabs>
+        <w:spacing w:after="0" w:line="240" w:lineRule="auto"/>
+        <w:ind w:left="1428"/>
+        <w:rPr>
+          <w:rFonts w:ascii="Times New Roman" w:eastAsia="Times New Roman" w:hAnsi="Times New Roman" w:cs="Times New Roman"/>
+          <w:color w:val="2F5496" w:themeColor="accent1" w:themeShade="BF"/>
+          <w:kern w:val="0"/>
+          <w:sz w:val="24"/>
+          <w:szCs w:val="24"/>
+          <w:lang w:eastAsia="fr-FR"/>
+          <w14:ligatures w14:val="none"/>
+        </w:rPr>
+      </w:pPr>
+      <w:r>
+        <w:rPr>
+          <w:rFonts w:ascii="Times New Roman" w:eastAsia="Times New Roman" w:hAnsi="Times New Roman" w:cs="Times New Roman"/>
+          <w:color w:val="2F5496" w:themeColor="accent1" w:themeShade="BF"/>
+          <w:kern w:val="0"/>
+          <w:sz w:val="24"/>
+          <w:szCs w:val="24"/>
+          <w:lang w:eastAsia="fr-FR"/>
+          <w14:ligatures w14:val="none"/>
+        </w:rPr>
+        <w:t>Présente la réponse sous forme de trois parties : points positifs, problèmes et recommandations.</w:t>
+      </w:r>
+    </w:p>
+    <w:p>
+      <w:pPr>
+        <w:spacing w:after="0" w:line="240" w:lineRule="auto"/>
+        <w:rPr>
+          <w:rFonts w:ascii="Times New Roman" w:eastAsia="Times New Roman" w:hAnsi="Times New Roman" w:cs="Times New Roman"/>
+          <w:color w:val="2F5496" w:themeColor="accent1" w:themeShade="BF"/>
+          <w:kern w:val="0"/>
+          <w:sz w:val="24"/>
+          <w:szCs w:val="24"/>
+          <w:lang w:eastAsia="fr-FR"/>
+          <w14:ligatures w14:val="none"/>
+        </w:rPr>
+      </w:pPr>
+    </w:p>
+    <w:p>
+      <w:pPr>
+        <w:spacing w:after="0" w:line="240" w:lineRule="auto"/>
+        <w:rPr>
+          <w:rFonts w:ascii="Times New Roman" w:eastAsia="Times New Roman" w:hAnsi="Times New Roman" w:cs="Times New Roman"/>
+          <w:color w:val="2F5496" w:themeColor="accent1" w:themeShade="BF"/>
+          <w:kern w:val="0"/>
+          <w:sz w:val="24"/>
+          <w:szCs w:val="24"/>
+          <w:lang w:eastAsia="fr-FR"/>
+          <w14:ligatures w14:val="none"/>
+        </w:rPr>
+      </w:pPr>
+    </w:p>
+    <w:p>
+      <w:pPr>
+        <w:spacing w:after="0" w:line="240" w:lineRule="auto"/>
+        <w:rPr>
+          <w:rFonts w:ascii="Times New Roman" w:eastAsia="Times New Roman" w:hAnsi="Times New Roman" w:cs="Times New Roman"/>
+          <w:color w:val="2F5496" w:themeColor="accent1" w:themeShade="BF"/>
+          <w:kern w:val="0"/>
+          <w:sz w:val="24"/>
+          <w:szCs w:val="24"/>
+          <w:lang w:eastAsia="fr-FR"/>
+          <w14:ligatures w14:val="none"/>
+        </w:rPr>
+      </w:pPr>
+    </w:p>
+    <w:p>
+      <w:pPr>
+        <w:spacing w:after="0" w:line="240" w:lineRule="auto"/>
+        <w:rPr>
+          <w:rFonts w:ascii="Times New Roman" w:eastAsia="Times New Roman" w:hAnsi="Times New Roman" w:cs="Times New Roman"/>
+          <w:color w:val="2F5496" w:themeColor="accent1" w:themeShade="BF"/>
+          <w:kern w:val="0"/>
+          <w:sz w:val="24"/>
+          <w:szCs w:val="24"/>
+          <w:lang w:eastAsia="fr-FR"/>
+          <w14:ligatures w14:val="none"/>
+        </w:rPr>
+      </w:pPr>
+    </w:p>
+    <w:p>
+      <w:pPr>
+        <w:spacing w:after="0" w:line="240" w:lineRule="auto"/>
+        <w:rPr>
+          <w:rFonts w:ascii="Times New Roman" w:eastAsia="Times New Roman" w:hAnsi="Times New Roman" w:cs="Times New Roman"/>
+          <w:color w:val="2F5496" w:themeColor="accent1" w:themeShade="BF"/>
+          <w:kern w:val="0"/>
+          <w:sz w:val="24"/>
+          <w:szCs w:val="24"/>
+          <w:lang w:eastAsia="fr-FR"/>
+          <w14:ligatures w14:val="none"/>
+        </w:rPr>
+      </w:pPr>
+    </w:p>
+    <w:p>
+      <w:pPr>
+        <w:spacing w:after="0" w:line="240" w:lineRule="auto"/>
+        <w:rPr>
+          <w:rFonts w:ascii="Times New Roman" w:eastAsia="Times New Roman" w:hAnsi="Times New Roman" w:cs="Times New Roman"/>
+          <w:color w:val="2F5496" w:themeColor="accent1" w:themeShade="BF"/>
+          <w:kern w:val="0"/>
+          <w:sz w:val="24"/>
+          <w:szCs w:val="24"/>
+          <w:lang w:eastAsia="fr-FR"/>
+          <w14:ligatures w14:val="none"/>
+        </w:rPr>
+      </w:pPr>
+    </w:p>
+    <w:p>
+      <w:pPr>
+        <w:spacing w:after="0" w:line="240" w:lineRule="auto"/>
+        <w:rPr>
+          <w:rFonts w:ascii="Times New Roman" w:eastAsia="Times New Roman" w:hAnsi="Times New Roman" w:cs="Times New Roman"/>
+          <w:color w:val="2F5496" w:themeColor="accent1" w:themeShade="BF"/>
+          <w:kern w:val="0"/>
+          <w:sz w:val="24"/>
+          <w:szCs w:val="24"/>
+          <w:lang w:eastAsia="fr-FR"/>
+          <w14:ligatures w14:val="none"/>
+        </w:rPr>
+      </w:pPr>
+    </w:p>
+    <w:p>
+      <w:pPr>
+        <w:spacing w:after="0" w:line="240" w:lineRule="auto"/>
+        <w:rPr>
+          <w:rFonts w:ascii="Times New Roman" w:eastAsia="Times New Roman" w:hAnsi="Times New Roman" w:cs="Times New Roman"/>
+          <w:color w:val="2F5496" w:themeColor="accent1" w:themeShade="BF"/>
+          <w:kern w:val="0"/>
+          <w:sz w:val="24"/>
+          <w:szCs w:val="24"/>
+          <w:lang w:eastAsia="fr-FR"/>
+          <w14:ligatures w14:val="none"/>
+        </w:rPr>
+      </w:pPr>
+    </w:p>
+    <w:p>
+      <w:pPr>
+        <w:spacing w:after="0" w:line="240" w:lineRule="auto"/>
+        <w:rPr>
+          <w:rFonts w:ascii="Times New Roman" w:eastAsia="Times New Roman" w:hAnsi="Times New Roman" w:cs="Times New Roman"/>
+          <w:color w:val="2F5496" w:themeColor="accent1" w:themeShade="BF"/>
+          <w:kern w:val="0"/>
+          <w:sz w:val="24"/>
+          <w:szCs w:val="24"/>
+          <w:lang w:eastAsia="fr-FR"/>
+          <w14:ligatures w14:val="none"/>
+        </w:rPr>
+      </w:pPr>
+    </w:p>
+    <w:p>
+      <w:pPr>
+        <w:spacing w:after="0" w:line="240" w:lineRule="auto"/>
+        <w:rPr>
+          <w:rFonts w:ascii="Times New Roman" w:eastAsia="Times New Roman" w:hAnsi="Times New Roman" w:cs="Times New Roman"/>
+          <w:color w:val="2F5496" w:themeColor="accent1" w:themeShade="BF"/>
+          <w:kern w:val="0"/>
+          <w:sz w:val="24"/>
+          <w:szCs w:val="24"/>
+          <w:lang w:eastAsia="fr-FR"/>
+          <w14:ligatures w14:val="none"/>
+        </w:rPr>
+      </w:pPr>
+    </w:p>
+    <w:p>
+      <w:pPr>
+        <w:spacing w:after="0" w:line="240" w:lineRule="auto"/>
+        <w:rPr>
+          <w:rFonts w:ascii="Times New Roman" w:eastAsia="Times New Roman" w:hAnsi="Times New Roman" w:cs="Times New Roman"/>
+          <w:color w:val="2F5496" w:themeColor="accent1" w:themeShade="BF"/>
+          <w:kern w:val="0"/>
+          <w:sz w:val="24"/>
+          <w:szCs w:val="24"/>
+          <w:lang w:eastAsia="fr-FR"/>
+          <w14:ligatures w14:val="none"/>
+        </w:rPr>
+      </w:pPr>
+    </w:p>
+    <w:p>
+      <w:pPr>
+        <w:spacing w:after="0" w:line="240" w:lineRule="auto"/>
+        <w:rPr>
+          <w:rFonts w:ascii="Times New Roman" w:eastAsia="Times New Roman" w:hAnsi="Times New Roman" w:cs="Times New Roman"/>
+          <w:color w:val="2F5496" w:themeColor="accent1" w:themeShade="BF"/>
+          <w:kern w:val="0"/>
+          <w:sz w:val="24"/>
+          <w:szCs w:val="24"/>
+          <w:lang w:eastAsia="fr-FR"/>
+          <w14:ligatures w14:val="none"/>
+        </w:rPr>
+      </w:pPr>
+    </w:p>
+    <w:p>
+      <w:pPr>
+        <w:rPr>
+          <w:rFonts w:ascii="Times New Roman" w:hAnsi="Times New Roman" w:cs="Times New Roman"/>
+          <w:sz w:val="24"/>
+          <w:szCs w:val="24"/>
+        </w:rPr>
+      </w:pPr>
+      <w:r>
+        <w:rPr>
+          <w:rFonts w:ascii="Times New Roman" w:hAnsi="Times New Roman" w:cs="Times New Roman"/>
+          <w:sz w:val="24"/>
+          <w:szCs w:val="24"/>
+        </w:rPr>
+        <w:drawing>
+          <wp:inline distT="0" distB="0" distL="0" distR="0" wp14:anchorId="4A8025DC" wp14:editId="6A9DFD05">
+            <wp:extent cx="5760720" cy="3321685"/>
+            <wp:effectExtent l="0" t="0" r="0" b="0"/>
+            <wp:docPr id="13" name="Image 13"/>
+            <wp:cNvGraphicFramePr>
+              <a:graphicFrameLocks xmlns:a="http://schemas.openxmlformats.org/drawingml/2006/main" noChangeAspect="1"/>
+            </wp:cNvGraphicFramePr>
+            <a:graphic xmlns:a="http://schemas.openxmlformats.org/drawingml/2006/main">
+              <a:graphicData uri="http://schemas.openxmlformats.org/drawingml/2006/picture">
+                <pic:pic xmlns:pic="http://schemas.openxmlformats.org/drawingml/2006/picture">
+                  <pic:nvPicPr>
+                    <pic:cNvPr id="1" name=""/>
+                    <pic:cNvPicPr/>
+                  </pic:nvPicPr>
+                  <pic:blipFill>
+                    <a:blip r:embed="rId16"/>
+                    <a:stretch>
+                      <a:fillRect/>
+                    </a:stretch>
+                  </pic:blipFill>
+                  <pic:spPr>
+                    <a:xfrm>
+                      <a:off x="0" y="0"/>
+                      <a:ext cx="5760720" cy="3321685"/>
+                    </a:xfrm>
+                    <a:prstGeom prst="rect">
+                      <a:avLst/>
+                    </a:prstGeom>
+                  </pic:spPr>
+                </pic:pic>
+              </a:graphicData>
+            </a:graphic>
+          </wp:inline>
+        </w:drawing>
+      </w:r>
+    </w:p>
+    <w:p>
+      <w:pPr>
+        <w:spacing w:after="0" w:line="240" w:lineRule="auto"/>
+        <w:ind w:left="708"/>
+        <w:rPr>
+          <w:rFonts w:ascii="Times New Roman" w:eastAsia="Times New Roman" w:hAnsi="Times New Roman" w:cs="Times New Roman"/>
+          <w:color w:val="2F5496" w:themeColor="accent1" w:themeShade="BF"/>
+          <w:kern w:val="0"/>
+          <w:sz w:val="24"/>
+          <w:szCs w:val="24"/>
+          <w:lang w:eastAsia="fr-FR"/>
+          <w14:ligatures w14:val="none"/>
+        </w:rPr>
+      </w:pPr>
+      <w:r>
+        <w:rPr>
+          <w:rFonts w:ascii="Times New Roman" w:eastAsia="Times New Roman" w:hAnsi="Times New Roman" w:cs="Times New Roman"/>
+          <w:color w:val="2F5496" w:themeColor="accent1" w:themeShade="BF"/>
+          <w:kern w:val="0"/>
+          <w:sz w:val="24"/>
+          <w:szCs w:val="24"/>
+          <w:lang w:eastAsia="fr-FR"/>
+          <w14:ligatures w14:val="none"/>
+        </w:rPr>
+        <w:t>Vérifie maintenant ta réponse précédente.</w:t>
+      </w:r>
+    </w:p>
+    <w:p>
+      <w:pPr>
+        <w:spacing w:after="0" w:line="240" w:lineRule="auto"/>
+        <w:ind w:left="708"/>
+        <w:rPr>
+          <w:rFonts w:ascii="Times New Roman" w:eastAsia="Times New Roman" w:hAnsi="Times New Roman" w:cs="Times New Roman"/>
+          <w:color w:val="2F5496" w:themeColor="accent1" w:themeShade="BF"/>
+          <w:kern w:val="0"/>
+          <w:sz w:val="24"/>
+          <w:szCs w:val="24"/>
+          <w:lang w:eastAsia="fr-FR"/>
+          <w14:ligatures w14:val="none"/>
+        </w:rPr>
+      </w:pPr>
+      <w:r>
+        <w:rPr>
+          <w:rFonts w:ascii="Times New Roman" w:eastAsia="Times New Roman" w:hAnsi="Times New Roman" w:cs="Times New Roman"/>
+          <w:color w:val="2F5496" w:themeColor="accent1" w:themeShade="BF"/>
+          <w:kern w:val="0"/>
+          <w:sz w:val="24"/>
+          <w:szCs w:val="24"/>
+          <w:lang w:eastAsia="fr-FR"/>
+          <w14:ligatures w14:val="none"/>
+        </w:rPr>
+        <w:t>Effectue un contrôle critique de ton analyse en vérifiant les éléments suivants :</w:t>
+      </w:r>
+    </w:p>
+    <w:p>
+      <w:pPr>
+        <w:numPr>
+          <w:ilvl w:val="0"/>
+          <w:numId w:val="7"/>
+        </w:numPr>
+        <w:tabs>
+          <w:tab w:val="clear" w:pos="720"/>
+          <w:tab w:val="num" w:pos="1428"/>
+        </w:tabs>
+        <w:spacing w:after="0" w:line="240" w:lineRule="auto"/>
+        <w:ind w:left="1428"/>
+        <w:rPr>
+          <w:rFonts w:ascii="Times New Roman" w:eastAsia="Times New Roman" w:hAnsi="Times New Roman" w:cs="Times New Roman"/>
+          <w:color w:val="2F5496" w:themeColor="accent1" w:themeShade="BF"/>
+          <w:kern w:val="0"/>
+          <w:sz w:val="24"/>
+          <w:szCs w:val="24"/>
+          <w:lang w:eastAsia="fr-FR"/>
+          <w14:ligatures w14:val="none"/>
+        </w:rPr>
+      </w:pPr>
+      <w:r>
+        <w:rPr>
+          <w:rFonts w:ascii="Times New Roman" w:eastAsia="Times New Roman" w:hAnsi="Times New Roman" w:cs="Times New Roman"/>
+          <w:color w:val="2F5496" w:themeColor="accent1" w:themeShade="BF"/>
+          <w:kern w:val="0"/>
+          <w:sz w:val="24"/>
+          <w:szCs w:val="24"/>
+          <w:lang w:eastAsia="fr-FR"/>
+          <w14:ligatures w14:val="none"/>
+        </w:rPr>
+        <w:t>Informations non justifiées : repère les informations présentes dans ta réponse qui ne sont pas directement justifiées par le texte fourni.</w:t>
+      </w:r>
+    </w:p>
+    <w:p>
+      <w:pPr>
+        <w:numPr>
+          <w:ilvl w:val="0"/>
+          <w:numId w:val="7"/>
+        </w:numPr>
+        <w:tabs>
+          <w:tab w:val="clear" w:pos="720"/>
+          <w:tab w:val="num" w:pos="1428"/>
+        </w:tabs>
+        <w:spacing w:after="0" w:line="240" w:lineRule="auto"/>
+        <w:ind w:left="1428"/>
+        <w:rPr>
+          <w:rFonts w:ascii="Times New Roman" w:eastAsia="Times New Roman" w:hAnsi="Times New Roman" w:cs="Times New Roman"/>
+          <w:color w:val="2F5496" w:themeColor="accent1" w:themeShade="BF"/>
+          <w:kern w:val="0"/>
+          <w:sz w:val="24"/>
+          <w:szCs w:val="24"/>
+          <w:lang w:eastAsia="fr-FR"/>
+          <w14:ligatures w14:val="none"/>
+        </w:rPr>
+      </w:pPr>
+      <w:r>
+        <w:rPr>
+          <w:rFonts w:ascii="Times New Roman" w:eastAsia="Times New Roman" w:hAnsi="Times New Roman" w:cs="Times New Roman"/>
+          <w:color w:val="2F5496" w:themeColor="accent1" w:themeShade="BF"/>
+          <w:kern w:val="0"/>
+          <w:sz w:val="24"/>
+          <w:szCs w:val="24"/>
+          <w:lang w:eastAsia="fr-FR"/>
+          <w14:ligatures w14:val="none"/>
+        </w:rPr>
+        <w:t>Contradictions : vérifie s'il existe des contradictions entre ta réponse et le texte source.</w:t>
+      </w:r>
+    </w:p>
+    <w:p>
+      <w:pPr>
+        <w:numPr>
+          <w:ilvl w:val="0"/>
+          <w:numId w:val="7"/>
+        </w:numPr>
+        <w:tabs>
+          <w:tab w:val="clear" w:pos="720"/>
+          <w:tab w:val="num" w:pos="1428"/>
+        </w:tabs>
+        <w:spacing w:after="0" w:line="240" w:lineRule="auto"/>
+        <w:ind w:left="1428"/>
+        <w:rPr>
+          <w:rFonts w:ascii="Times New Roman" w:eastAsia="Times New Roman" w:hAnsi="Times New Roman" w:cs="Times New Roman"/>
+          <w:color w:val="2F5496" w:themeColor="accent1" w:themeShade="BF"/>
+          <w:kern w:val="0"/>
+          <w:sz w:val="24"/>
+          <w:szCs w:val="24"/>
+          <w:lang w:eastAsia="fr-FR"/>
+          <w14:ligatures w14:val="none"/>
+        </w:rPr>
+      </w:pPr>
+      <w:r>
+        <w:rPr>
+          <w:rFonts w:ascii="Times New Roman" w:eastAsia="Times New Roman" w:hAnsi="Times New Roman" w:cs="Times New Roman"/>
+          <w:color w:val="2F5496" w:themeColor="accent1" w:themeShade="BF"/>
+          <w:kern w:val="0"/>
+          <w:sz w:val="24"/>
+          <w:szCs w:val="24"/>
+          <w:lang w:eastAsia="fr-FR"/>
+          <w14:ligatures w14:val="none"/>
+        </w:rPr>
+        <w:t>Informations absentes : identifie les informations importantes du texte que tu aurais oubliées.</w:t>
+      </w:r>
+    </w:p>
+    <w:p>
+      <w:pPr>
+        <w:numPr>
+          <w:ilvl w:val="0"/>
+          <w:numId w:val="7"/>
+        </w:numPr>
+        <w:tabs>
+          <w:tab w:val="clear" w:pos="720"/>
+          <w:tab w:val="num" w:pos="1428"/>
+        </w:tabs>
+        <w:spacing w:after="0" w:line="240" w:lineRule="auto"/>
+        <w:ind w:left="1428"/>
+        <w:rPr>
+          <w:rFonts w:ascii="Times New Roman" w:eastAsia="Times New Roman" w:hAnsi="Times New Roman" w:cs="Times New Roman"/>
+          <w:color w:val="2F5496" w:themeColor="accent1" w:themeShade="BF"/>
+          <w:kern w:val="0"/>
+          <w:sz w:val="24"/>
+          <w:szCs w:val="24"/>
+          <w:lang w:eastAsia="fr-FR"/>
+          <w14:ligatures w14:val="none"/>
+        </w:rPr>
+      </w:pPr>
+      <w:r>
+        <w:rPr>
+          <w:rFonts w:ascii="Times New Roman" w:eastAsia="Times New Roman" w:hAnsi="Times New Roman" w:cs="Times New Roman"/>
+          <w:color w:val="2F5496" w:themeColor="accent1" w:themeShade="BF"/>
+          <w:kern w:val="0"/>
+          <w:sz w:val="24"/>
+          <w:szCs w:val="24"/>
+          <w:lang w:eastAsia="fr-FR"/>
+          <w14:ligatures w14:val="none"/>
+        </w:rPr>
+        <w:t>Hallucinations : vérifie que tu n'as ajouté aucun fait, chiffre ou information qui n'apparaît pas dans le texte.</w:t>
+      </w:r>
+    </w:p>
+    <w:p>
+      <w:pPr>
+        <w:numPr>
+          <w:ilvl w:val="0"/>
+          <w:numId w:val="7"/>
+        </w:numPr>
+        <w:tabs>
+          <w:tab w:val="clear" w:pos="720"/>
+          <w:tab w:val="num" w:pos="1428"/>
+        </w:tabs>
+        <w:spacing w:after="0" w:line="240" w:lineRule="auto"/>
+        <w:ind w:left="1428"/>
+        <w:rPr>
+          <w:rFonts w:ascii="Times New Roman" w:eastAsia="Times New Roman" w:hAnsi="Times New Roman" w:cs="Times New Roman"/>
+          <w:color w:val="2F5496" w:themeColor="accent1" w:themeShade="BF"/>
+          <w:kern w:val="0"/>
+          <w:sz w:val="24"/>
+          <w:szCs w:val="24"/>
+          <w:lang w:eastAsia="fr-FR"/>
+          <w14:ligatures w14:val="none"/>
+        </w:rPr>
+      </w:pPr>
+      <w:r>
+        <w:rPr>
+          <w:rFonts w:ascii="Times New Roman" w:eastAsia="Times New Roman" w:hAnsi="Times New Roman" w:cs="Times New Roman"/>
+          <w:color w:val="2F5496" w:themeColor="accent1" w:themeShade="BF"/>
+          <w:kern w:val="0"/>
+          <w:sz w:val="24"/>
+          <w:szCs w:val="24"/>
+          <w:lang w:eastAsia="fr-FR"/>
+          <w14:ligatures w14:val="none"/>
+        </w:rPr>
+        <w:t>Respect des contraintes : vérifie que toutes les contraintes du premier prompt ont été respectées.</w:t>
+      </w:r>
+    </w:p>
+    <w:p>
+      <w:pPr>
+        <w:spacing w:after="0" w:line="240" w:lineRule="auto"/>
+        <w:ind w:left="708"/>
+        <w:rPr>
+          <w:rFonts w:ascii="Times New Roman" w:eastAsia="Times New Roman" w:hAnsi="Times New Roman" w:cs="Times New Roman"/>
+          <w:color w:val="2F5496" w:themeColor="accent1" w:themeShade="BF"/>
+          <w:kern w:val="0"/>
+          <w:sz w:val="24"/>
+          <w:szCs w:val="24"/>
+          <w:lang w:eastAsia="fr-FR"/>
+          <w14:ligatures w14:val="none"/>
+        </w:rPr>
+      </w:pPr>
+      <w:r>
+        <w:rPr>
+          <w:rFonts w:ascii="Times New Roman" w:eastAsia="Times New Roman" w:hAnsi="Times New Roman" w:cs="Times New Roman"/>
+          <w:color w:val="2F5496" w:themeColor="accent1" w:themeShade="BF"/>
+          <w:kern w:val="0"/>
+          <w:sz w:val="24"/>
+          <w:szCs w:val="24"/>
+          <w:lang w:eastAsia="fr-FR"/>
+          <w14:ligatures w14:val="none"/>
+        </w:rPr>
+        <w:t>Pour chaque problème trouvé, indique :</w:t>
+      </w:r>
+      <w:r>
+        <w:rPr>
+          <w:rFonts w:ascii="Times New Roman" w:eastAsia="Times New Roman" w:hAnsi="Times New Roman" w:cs="Times New Roman"/>
+          <w:color w:val="2F5496" w:themeColor="accent1" w:themeShade="BF"/>
+          <w:kern w:val="0"/>
+          <w:sz w:val="24"/>
+          <w:szCs w:val="24"/>
+          <w:lang w:eastAsia="fr-FR"/>
+          <w14:ligatures w14:val="none"/>
+        </w:rPr>
+        <w:t xml:space="preserve"> </w:t>
+      </w:r>
+      <w:r>
+        <w:rPr>
+          <w:rFonts w:ascii="Times New Roman" w:eastAsia="Times New Roman" w:hAnsi="Times New Roman" w:cs="Times New Roman"/>
+          <w:color w:val="2F5496" w:themeColor="accent1" w:themeShade="BF"/>
+          <w:kern w:val="0"/>
+          <w:sz w:val="24"/>
+          <w:szCs w:val="24"/>
+          <w:lang w:eastAsia="fr-FR"/>
+          <w14:ligatures w14:val="none"/>
+        </w:rPr>
+        <w:t>l'élément concerné</w:t>
+      </w:r>
+      <w:r>
+        <w:rPr>
+          <w:rFonts w:ascii="Times New Roman" w:eastAsia="Times New Roman" w:hAnsi="Times New Roman" w:cs="Times New Roman"/>
+          <w:color w:val="2F5496" w:themeColor="accent1" w:themeShade="BF"/>
+          <w:kern w:val="0"/>
+          <w:sz w:val="24"/>
+          <w:szCs w:val="24"/>
+          <w:lang w:eastAsia="fr-FR"/>
+          <w14:ligatures w14:val="none"/>
+        </w:rPr>
+        <w:t>,</w:t>
+      </w:r>
+      <w:r>
+        <w:rPr>
+          <w:rFonts w:ascii="Times New Roman" w:eastAsia="Times New Roman" w:hAnsi="Times New Roman" w:cs="Times New Roman"/>
+          <w:color w:val="2F5496" w:themeColor="accent1" w:themeShade="BF"/>
+          <w:kern w:val="0"/>
+          <w:sz w:val="24"/>
+          <w:szCs w:val="24"/>
+          <w:lang w:eastAsia="fr-FR"/>
+          <w14:ligatures w14:val="none"/>
+        </w:rPr>
+        <w:t xml:space="preserve"> pourquoi il pose problème </w:t>
+      </w:r>
+    </w:p>
+    <w:p>
+      <w:pPr>
+        <w:spacing w:after="0" w:line="240" w:lineRule="auto"/>
+        <w:ind w:firstLine="708"/>
+        <w:rPr>
+          <w:rFonts w:ascii="Times New Roman" w:eastAsia="Times New Roman" w:hAnsi="Times New Roman" w:cs="Times New Roman"/>
+          <w:color w:val="2F5496" w:themeColor="accent1" w:themeShade="BF"/>
+          <w:kern w:val="0"/>
+          <w:sz w:val="24"/>
+          <w:szCs w:val="24"/>
+          <w:lang w:eastAsia="fr-FR"/>
+          <w14:ligatures w14:val="none"/>
+        </w:rPr>
+      </w:pPr>
+      <w:r>
+        <w:rPr>
+          <w:rFonts w:ascii="Times New Roman" w:eastAsia="Times New Roman" w:hAnsi="Times New Roman" w:cs="Times New Roman"/>
+          <w:color w:val="2F5496" w:themeColor="accent1" w:themeShade="BF"/>
+          <w:kern w:val="0"/>
+          <w:sz w:val="24"/>
+          <w:szCs w:val="24"/>
+          <w:lang w:eastAsia="fr-FR"/>
+          <w14:ligatures w14:val="none"/>
+        </w:rPr>
+        <w:t xml:space="preserve">Et </w:t>
+      </w:r>
+      <w:r>
+        <w:rPr>
+          <w:rFonts w:ascii="Times New Roman" w:eastAsia="Times New Roman" w:hAnsi="Times New Roman" w:cs="Times New Roman"/>
+          <w:color w:val="2F5496" w:themeColor="accent1" w:themeShade="BF"/>
+          <w:kern w:val="0"/>
+          <w:sz w:val="24"/>
+          <w:szCs w:val="24"/>
+          <w:lang w:eastAsia="fr-FR"/>
+          <w14:ligatures w14:val="none"/>
+        </w:rPr>
+        <w:t>la correction à apporter.</w:t>
+      </w:r>
+    </w:p>
+    <w:p>
+      <w:pPr>
+        <w:spacing w:after="0" w:line="240" w:lineRule="auto"/>
+        <w:ind w:left="708"/>
+        <w:rPr>
+          <w:rFonts w:ascii="Times New Roman" w:eastAsia="Times New Roman" w:hAnsi="Times New Roman" w:cs="Times New Roman"/>
+          <w:color w:val="2F5496" w:themeColor="accent1" w:themeShade="BF"/>
+          <w:kern w:val="0"/>
+          <w:sz w:val="24"/>
+          <w:szCs w:val="24"/>
+          <w:lang w:eastAsia="fr-FR"/>
+          <w14:ligatures w14:val="none"/>
+        </w:rPr>
+      </w:pPr>
+      <w:r>
+        <w:rPr>
+          <w:rFonts w:ascii="Times New Roman" w:eastAsia="Times New Roman" w:hAnsi="Times New Roman" w:cs="Times New Roman"/>
+          <w:color w:val="2F5496" w:themeColor="accent1" w:themeShade="BF"/>
+          <w:kern w:val="0"/>
+          <w:sz w:val="24"/>
+          <w:szCs w:val="24"/>
+          <w:lang w:eastAsia="fr-FR"/>
+          <w14:ligatures w14:val="none"/>
+        </w:rPr>
+        <w:t xml:space="preserve">Si aucun problème n'est trouvé dans une catégorie, indique clairement </w:t>
+      </w:r>
+      <w:r>
+        <w:rPr>
+          <w:rFonts w:ascii="Times New Roman" w:eastAsia="Times New Roman" w:hAnsi="Times New Roman" w:cs="Times New Roman"/>
+          <w:color w:val="2F5496" w:themeColor="accent1" w:themeShade="BF"/>
+          <w:kern w:val="0"/>
+          <w:sz w:val="24"/>
+          <w:szCs w:val="24"/>
+          <w:lang w:eastAsia="fr-FR"/>
+          <w14:ligatures w14:val="none"/>
+        </w:rPr>
+        <w:t>"a</w:t>
+      </w:r>
+      <w:r>
+        <w:rPr>
+          <w:rFonts w:ascii="Times New Roman" w:eastAsia="Times New Roman" w:hAnsi="Times New Roman" w:cs="Times New Roman"/>
+          <w:color w:val="2F5496" w:themeColor="accent1" w:themeShade="BF"/>
+          <w:kern w:val="0"/>
+          <w:sz w:val="24"/>
+          <w:szCs w:val="24"/>
+          <w:lang w:eastAsia="fr-FR"/>
+          <w14:ligatures w14:val="none"/>
+        </w:rPr>
+        <w:t xml:space="preserve">ucun problème détecté </w:t>
+      </w:r>
+      <w:r>
+        <w:rPr>
+          <w:rFonts w:ascii="Times New Roman" w:eastAsia="Times New Roman" w:hAnsi="Times New Roman" w:cs="Times New Roman"/>
+          <w:color w:val="2F5496" w:themeColor="accent1" w:themeShade="BF"/>
+          <w:kern w:val="0"/>
+          <w:sz w:val="24"/>
+          <w:szCs w:val="24"/>
+          <w:lang w:eastAsia="fr-FR"/>
+          <w14:ligatures w14:val="none"/>
+        </w:rPr>
+        <w:t>"</w:t>
+      </w:r>
+    </w:p>
+    <w:p>
+      <w:pPr>
+        <w:spacing w:after="0" w:line="240" w:lineRule="auto"/>
+        <w:ind w:left="708"/>
+        <w:rPr>
+          <w:rFonts w:ascii="Times New Roman" w:eastAsia="Times New Roman" w:hAnsi="Times New Roman" w:cs="Times New Roman"/>
+          <w:color w:val="2F5496" w:themeColor="accent1" w:themeShade="BF"/>
+          <w:kern w:val="0"/>
+          <w:sz w:val="24"/>
+          <w:szCs w:val="24"/>
+          <w:lang w:eastAsia="fr-FR"/>
+          <w14:ligatures w14:val="none"/>
+        </w:rPr>
+      </w:pPr>
+      <w:r>
+        <w:rPr>
+          <w:rFonts w:ascii="Times New Roman" w:eastAsia="Times New Roman" w:hAnsi="Times New Roman" w:cs="Times New Roman"/>
+          <w:color w:val="2F5496" w:themeColor="accent1" w:themeShade="BF"/>
+          <w:kern w:val="0"/>
+          <w:sz w:val="24"/>
+          <w:szCs w:val="24"/>
+          <w:lang w:eastAsia="fr-FR"/>
+          <w14:ligatures w14:val="none"/>
+        </w:rPr>
+        <w:t>Termine par une version corrigée de ta réponse précédente si des erreurs ont été identifiées.</w:t>
+      </w:r>
+    </w:p>
+    <w:p>
+      <w:pPr>
+        <w:rPr>
+          <w:rFonts w:ascii="Times New Roman" w:hAnsi="Times New Roman" w:cs="Times New Roman"/>
+          <w:sz w:val="24"/>
+          <w:szCs w:val="24"/>
+        </w:rPr>
+      </w:pPr>
+    </w:p>
+    <w:p>
+      <w:pPr>
+        <w:rPr>
+          <w:rFonts w:ascii="Times New Roman" w:hAnsi="Times New Roman" w:cs="Times New Roman"/>
+          <w:sz w:val="24"/>
+          <w:szCs w:val="24"/>
+        </w:rPr>
+      </w:pPr>
+    </w:p>
+    <w:p>
+      <w:pPr>
+        <w:rPr>
+          <w:rFonts w:ascii="Times New Roman" w:hAnsi="Times New Roman" w:cs="Times New Roman"/>
+          <w:sz w:val="24"/>
+          <w:szCs w:val="24"/>
+        </w:rPr>
+      </w:pPr>
+    </w:p>
+    <w:p>
+      <w:pPr>
+        <w:rPr>
+          <w:rFonts w:ascii="Times New Roman" w:hAnsi="Times New Roman" w:cs="Times New Roman"/>
+          <w:sz w:val="24"/>
+          <w:szCs w:val="24"/>
+        </w:rPr>
+      </w:pPr>
+    </w:p>
+    <w:p>
+      <w:pPr>
+        <w:rPr>
+          <w:rFonts w:ascii="Times New Roman" w:hAnsi="Times New Roman" w:cs="Times New Roman"/>
+          <w:sz w:val="24"/>
+          <w:szCs w:val="24"/>
+        </w:rPr>
+      </w:pPr>
+    </w:p>
+    <w:p>
+      <w:pPr>
+        <w:rPr>
+          <w:rFonts w:ascii="Times New Roman" w:hAnsi="Times New Roman" w:cs="Times New Roman"/>
+          <w:sz w:val="24"/>
+          <w:szCs w:val="24"/>
+        </w:rPr>
+      </w:pPr>
+    </w:p>
+    <w:p>
+      <w:pPr>
+        <w:rPr>
+          <w:rFonts w:ascii="Times New Roman" w:hAnsi="Times New Roman" w:cs="Times New Roman"/>
+          <w:sz w:val="24"/>
+          <w:szCs w:val="24"/>
+        </w:rPr>
+      </w:pPr>
+    </w:p>
+    <w:p>
+      <w:pPr>
+        <w:rPr>
+          <w:rFonts w:ascii="Times New Roman" w:hAnsi="Times New Roman" w:cs="Times New Roman"/>
+          <w:sz w:val="24"/>
+          <w:szCs w:val="24"/>
+        </w:rPr>
+      </w:pPr>
+      <w:r>
+        <w:rPr>
+          <w:rFonts w:ascii="Times New Roman" w:hAnsi="Times New Roman" w:cs="Times New Roman"/>
+          <w:sz w:val="24"/>
+          <w:szCs w:val="24"/>
+        </w:rPr>
+        <w:drawing>
+          <wp:inline distT="0" distB="0" distL="0" distR="0" wp14:anchorId="62FC178B" wp14:editId="368B646C">
+            <wp:extent cx="5760720" cy="3768725"/>
+            <wp:effectExtent l="0" t="0" r="0" b="3175"/>
+            <wp:docPr id="14" name="Image 14"/>
+            <wp:cNvGraphicFramePr>
+              <a:graphicFrameLocks xmlns:a="http://schemas.openxmlformats.org/drawingml/2006/main" noChangeAspect="1"/>
+            </wp:cNvGraphicFramePr>
+            <a:graphic xmlns:a="http://schemas.openxmlformats.org/drawingml/2006/main">
+              <a:graphicData uri="http://schemas.openxmlformats.org/drawingml/2006/picture">
+                <pic:pic xmlns:pic="http://schemas.openxmlformats.org/drawingml/2006/picture">
+                  <pic:nvPicPr>
+                    <pic:cNvPr id="1" name=""/>
+                    <pic:cNvPicPr/>
+                  </pic:nvPicPr>
+                  <pic:blipFill>
+                    <a:blip r:embed="rId17"/>
+                    <a:stretch>
+                      <a:fillRect/>
+                    </a:stretch>
+                  </pic:blipFill>
+                  <pic:spPr>
+                    <a:xfrm>
+                      <a:off x="0" y="0"/>
+                      <a:ext cx="5760720" cy="3768725"/>
+                    </a:xfrm>
+                    <a:prstGeom prst="rect">
+                      <a:avLst/>
+                    </a:prstGeom>
+                  </pic:spPr>
+                </pic:pic>
+              </a:graphicData>
+            </a:graphic>
+          </wp:inline>
+        </w:drawing>
+      </w:r>
+    </w:p>
+    <w:p>
+      <w:pPr>
+        <w:rPr>
+          <w:rFonts w:ascii="Times New Roman" w:hAnsi="Times New Roman" w:cs="Times New Roman"/>
+          <w:sz w:val="24"/>
+          <w:szCs w:val="24"/>
+        </w:rPr>
+      </w:pPr>
+      <w:r>
+        <w:rPr>
+          <w:rFonts w:ascii="Times New Roman" w:hAnsi="Times New Roman" w:cs="Times New Roman"/>
+          <w:sz w:val="24"/>
+          <w:szCs w:val="24"/>
+        </w:rPr>
+        <w:drawing>
+          <wp:inline distT="0" distB="0" distL="0" distR="0" wp14:anchorId="19FF3F0A" wp14:editId="0267CF46">
+            <wp:extent cx="5760720" cy="3501390"/>
+            <wp:effectExtent l="0" t="0" r="0" b="3810"/>
+            <wp:docPr id="15" name="Image 15"/>
+            <wp:cNvGraphicFramePr>
+              <a:graphicFrameLocks xmlns:a="http://schemas.openxmlformats.org/drawingml/2006/main" noChangeAspect="1"/>
+            </wp:cNvGraphicFramePr>
+            <a:graphic xmlns:a="http://schemas.openxmlformats.org/drawingml/2006/main">
+              <a:graphicData uri="http://schemas.openxmlformats.org/drawingml/2006/picture">
+                <pic:pic xmlns:pic="http://schemas.openxmlformats.org/drawingml/2006/picture">
+                  <pic:nvPicPr>
+                    <pic:cNvPr id="1" name=""/>
+                    <pic:cNvPicPr/>
+                  </pic:nvPicPr>
+                  <pic:blipFill>
+                    <a:blip r:embed="rId18"/>
+                    <a:stretch>
+                      <a:fillRect/>
+                    </a:stretch>
+                  </pic:blipFill>
+                  <pic:spPr>
+                    <a:xfrm>
+                      <a:off x="0" y="0"/>
+                      <a:ext cx="5760720" cy="3501390"/>
+                    </a:xfrm>
+                    <a:prstGeom prst="rect">
+                      <a:avLst/>
+                    </a:prstGeom>
+                  </pic:spPr>
+                </pic:pic>
+              </a:graphicData>
+            </a:graphic>
+          </wp:inline>
+        </w:drawing>
+      </w:r>
     </w:p>
     <w:sectPr>
-      <w:headerReference w:type="default" r:id="rId16"/>
-      <w:footerReference w:type="default" r:id="rId17"/>
+      <w:headerReference w:type="default" r:id="rId19"/>
+      <w:footerReference w:type="default" r:id="rId20"/>
       <w:pgSz w:w="11906" w:h="16838"/>
       <w:pgMar w:top="1417" w:right="1417" w:bottom="1417" w:left="1417" w:header="708" w:footer="708" w:gutter="0"/>
       <w:pgBorders w:offsetFrom="page">
@@ -3384,6 +4595,119 @@
 <file path=word/numbering.xml><?xml version="1.0" encoding="utf-8"?>
 <w:numbering xmlns:wpc="http://schemas.microsoft.com/office/word/2010/wordprocessingCanvas" xmlns:cx="http://schemas.microsoft.com/office/drawing/2014/chartex" xmlns:cx1="http://schemas.microsoft.com/office/drawing/2015/9/8/chartex" xmlns:cx2="http://schemas.microsoft.com/office/drawing/2015/10/21/chartex" xmlns:cx3="http://schemas.microsoft.com/office/drawing/2016/5/9/chartex" xmlns:cx4="http://schemas.microsoft.com/office/drawing/2016/5/10/chartex" xmlns:cx5="http://schemas.microsoft.com/office/drawing/2016/5/11/chartex" xmlns:cx6="http://schemas.microsoft.com/office/drawing/2016/5/12/chartex" xmlns:cx7="http://schemas.microsoft.com/office/drawing/2016/5/13/chartex" xmlns:cx8="http://schemas.microsoft.com/office/drawing/2016/5/14/chartex" xmlns:mc="http://schemas.openxmlformats.org/markup-compatibility/2006" xmlns:aink="http://schemas.microsoft.com/office/drawing/2016/ink" xmlns:am3d="http://schemas.microsoft.com/office/drawing/2017/model3d" xmlns:o="urn:schemas-microsoft-com:office:office" xmlns:r="http://schemas.openxmlformats.org/officeDocument/2006/relationships" xmlns:m="http://schemas.openxmlformats.org/officeDocument/2006/math" xmlns:v="urn:schemas-microsoft-com:vml" xmlns:wp14="http://schemas.microsoft.com/office/word/2010/wordprocessingDrawing" xmlns:wp="http://schemas.openxmlformats.org/drawingml/2006/wordprocessingDrawing" xmlns:w10="urn:schemas-microsoft-com:office:word" xmlns:w="http://schemas.openxmlformats.org/wordprocessingml/2006/main" xmlns:w14="http://schemas.microsoft.com/office/word/2010/wordml" xmlns:w15="http://schemas.microsoft.com/office/word/2012/wordml" xmlns:w16cex="http://schemas.microsoft.com/office/word/2018/wordml/cex" xmlns:w16cid="http://schemas.microsoft.com/office/word/2016/wordml/cid" xmlns:w16="http://schemas.microsoft.com/office/word/2018/wordml" xmlns:w16sdtdh="http://schemas.microsoft.com/office/word/2020/wordml/sdtdatahash" xmlns:w16se="http://schemas.microsoft.com/office/word/2015/wordml/symex" xmlns:wpg="http://schemas.microsoft.com/office/word/2010/wordprocessingGroup" xmlns:wpi="http://schemas.microsoft.com/office/word/2010/wordprocessingInk" xmlns:wne="http://schemas.microsoft.com/office/word/2006/wordml" xmlns:wps="http://schemas.microsoft.com/office/word/2010/wordprocessingShape" mc:Ignorable="w14 w15 w16se w16cid w16 w16cex w16sdtdh wp14">
   <w:abstractNum w:abstractNumId="0" w15:restartNumberingAfterBreak="0">
+    <w:nsid w:val="23FA75D2"/>
+    <w:multiLevelType w:val="multilevel"/>
+    <w:tmpl w:val="7B086CF2"/>
+    <w:lvl w:ilvl="0">
+      <w:start w:val="1"/>
+      <w:numFmt w:val="decimal"/>
+      <w:lvlText w:val="%1."/>
+      <w:lvlJc w:val="left"/>
+      <w:pPr>
+        <w:tabs>
+          <w:tab w:val="num" w:pos="720"/>
+        </w:tabs>
+        <w:ind w:left="720" w:hanging="360"/>
+      </w:pPr>
+    </w:lvl>
+    <w:lvl w:ilvl="1" w:tentative="1">
+      <w:start w:val="1"/>
+      <w:numFmt w:val="decimal"/>
+      <w:lvlText w:val="%2."/>
+      <w:lvlJc w:val="left"/>
+      <w:pPr>
+        <w:tabs>
+          <w:tab w:val="num" w:pos="1440"/>
+        </w:tabs>
+        <w:ind w:left="1440" w:hanging="360"/>
+      </w:pPr>
+    </w:lvl>
+    <w:lvl w:ilvl="2" w:tentative="1">
+      <w:start w:val="1"/>
+      <w:numFmt w:val="decimal"/>
+      <w:lvlText w:val="%3."/>
+      <w:lvlJc w:val="left"/>
+      <w:pPr>
+        <w:tabs>
+          <w:tab w:val="num" w:pos="2160"/>
+        </w:tabs>
+        <w:ind w:left="2160" w:hanging="360"/>
+      </w:pPr>
+    </w:lvl>
+    <w:lvl w:ilvl="3" w:tentative="1">
+      <w:start w:val="1"/>
+      <w:numFmt w:val="decimal"/>
+      <w:lvlText w:val="%4."/>
+      <w:lvlJc w:val="left"/>
+      <w:pPr>
+        <w:tabs>
+          <w:tab w:val="num" w:pos="2880"/>
+        </w:tabs>
+        <w:ind w:left="2880" w:hanging="360"/>
+      </w:pPr>
+    </w:lvl>
+    <w:lvl w:ilvl="4" w:tentative="1">
+      <w:start w:val="1"/>
+      <w:numFmt w:val="decimal"/>
+      <w:lvlText w:val="%5."/>
+      <w:lvlJc w:val="left"/>
+      <w:pPr>
+        <w:tabs>
+          <w:tab w:val="num" w:pos="3600"/>
+        </w:tabs>
+        <w:ind w:left="3600" w:hanging="360"/>
+      </w:pPr>
+    </w:lvl>
+    <w:lvl w:ilvl="5" w:tentative="1">
+      <w:start w:val="1"/>
+      <w:numFmt w:val="decimal"/>
+      <w:lvlText w:val="%6."/>
+      <w:lvlJc w:val="left"/>
+      <w:pPr>
+        <w:tabs>
+          <w:tab w:val="num" w:pos="4320"/>
+        </w:tabs>
+        <w:ind w:left="4320" w:hanging="360"/>
+      </w:pPr>
+    </w:lvl>
+    <w:lvl w:ilvl="6" w:tentative="1">
+      <w:start w:val="1"/>
+      <w:numFmt w:val="decimal"/>
+      <w:lvlText w:val="%7."/>
+      <w:lvlJc w:val="left"/>
+      <w:pPr>
+        <w:tabs>
+          <w:tab w:val="num" w:pos="5040"/>
+        </w:tabs>
+        <w:ind w:left="5040" w:hanging="360"/>
+      </w:pPr>
+    </w:lvl>
+    <w:lvl w:ilvl="7" w:tentative="1">
+      <w:start w:val="1"/>
+      <w:numFmt w:val="decimal"/>
+      <w:lvlText w:val="%8."/>
+      <w:lvlJc w:val="left"/>
+      <w:pPr>
+        <w:tabs>
+          <w:tab w:val="num" w:pos="5760"/>
+        </w:tabs>
+        <w:ind w:left="5760" w:hanging="360"/>
+      </w:pPr>
+    </w:lvl>
+    <w:lvl w:ilvl="8" w:tentative="1">
+      <w:start w:val="1"/>
+      <w:numFmt w:val="decimal"/>
+      <w:lvlText w:val="%9."/>
+      <w:lvlJc w:val="left"/>
+      <w:pPr>
+        <w:tabs>
+          <w:tab w:val="num" w:pos="6480"/>
+        </w:tabs>
+        <w:ind w:left="6480" w:hanging="360"/>
+      </w:pPr>
+    </w:lvl>
+  </w:abstractNum>
+  <w:abstractNum w:abstractNumId="1" w15:restartNumberingAfterBreak="0">
     <w:nsid w:val="30817C99"/>
     <w:multiLevelType w:val="hybridMultilevel"/>
     <w:tmpl w:val="B28054F4"/>
@@ -3469,7 +4793,7 @@
       </w:pPr>
     </w:lvl>
   </w:abstractNum>
-  <w:abstractNum w:abstractNumId="1" w15:restartNumberingAfterBreak="0">
+  <w:abstractNum w:abstractNumId="2" w15:restartNumberingAfterBreak="0">
     <w:nsid w:val="32024712"/>
     <w:multiLevelType w:val="multilevel"/>
     <w:tmpl w:val="7716EFCE"/>
@@ -3618,7 +4942,7 @@
       </w:rPr>
     </w:lvl>
   </w:abstractNum>
-  <w:abstractNum w:abstractNumId="2" w15:restartNumberingAfterBreak="0">
+  <w:abstractNum w:abstractNumId="3" w15:restartNumberingAfterBreak="0">
     <w:nsid w:val="3CA24848"/>
     <w:multiLevelType w:val="hybridMultilevel"/>
     <w:tmpl w:val="76B802A4"/>
@@ -3731,7 +5055,7 @@
       </w:rPr>
     </w:lvl>
   </w:abstractNum>
-  <w:abstractNum w:abstractNumId="3" w15:restartNumberingAfterBreak="0">
+  <w:abstractNum w:abstractNumId="4" w15:restartNumberingAfterBreak="0">
     <w:nsid w:val="56D568C8"/>
     <w:multiLevelType w:val="multilevel"/>
     <w:tmpl w:val="3392CAD2"/>
@@ -3880,7 +5204,305 @@
       </w:rPr>
     </w:lvl>
   </w:abstractNum>
-  <w:abstractNum w:abstractNumId="4" w15:restartNumberingAfterBreak="0">
+  <w:abstractNum w:abstractNumId="5" w15:restartNumberingAfterBreak="0">
+    <w:nsid w:val="61053792"/>
+    <w:multiLevelType w:val="multilevel"/>
+    <w:tmpl w:val="49E43BFC"/>
+    <w:lvl w:ilvl="0">
+      <w:start w:val="1"/>
+      <w:numFmt w:val="bullet"/>
+      <w:lvlText w:val=""/>
+      <w:lvlJc w:val="left"/>
+      <w:pPr>
+        <w:tabs>
+          <w:tab w:val="num" w:pos="720"/>
+        </w:tabs>
+        <w:ind w:left="720" w:hanging="360"/>
+      </w:pPr>
+      <w:rPr>
+        <w:rFonts w:ascii="Symbol" w:hAnsi="Symbol" w:hint="default"/>
+        <w:sz w:val="20"/>
+      </w:rPr>
+    </w:lvl>
+    <w:lvl w:ilvl="1" w:tentative="1">
+      <w:start w:val="1"/>
+      <w:numFmt w:val="bullet"/>
+      <w:lvlText w:val="o"/>
+      <w:lvlJc w:val="left"/>
+      <w:pPr>
+        <w:tabs>
+          <w:tab w:val="num" w:pos="1440"/>
+        </w:tabs>
+        <w:ind w:left="1440" w:hanging="360"/>
+      </w:pPr>
+      <w:rPr>
+        <w:rFonts w:ascii="Courier New" w:hAnsi="Courier New" w:hint="default"/>
+        <w:sz w:val="20"/>
+      </w:rPr>
+    </w:lvl>
+    <w:lvl w:ilvl="2" w:tentative="1">
+      <w:start w:val="1"/>
+      <w:numFmt w:val="bullet"/>
+      <w:lvlText w:val=""/>
+      <w:lvlJc w:val="left"/>
+      <w:pPr>
+        <w:tabs>
+          <w:tab w:val="num" w:pos="2160"/>
+        </w:tabs>
+        <w:ind w:left="2160" w:hanging="360"/>
+      </w:pPr>
+      <w:rPr>
+        <w:rFonts w:ascii="Wingdings" w:hAnsi="Wingdings" w:hint="default"/>
+        <w:sz w:val="20"/>
+      </w:rPr>
+    </w:lvl>
+    <w:lvl w:ilvl="3" w:tentative="1">
+      <w:start w:val="1"/>
+      <w:numFmt w:val="bullet"/>
+      <w:lvlText w:val=""/>
+      <w:lvlJc w:val="left"/>
+      <w:pPr>
+        <w:tabs>
+          <w:tab w:val="num" w:pos="2880"/>
+        </w:tabs>
+        <w:ind w:left="2880" w:hanging="360"/>
+      </w:pPr>
+      <w:rPr>
+        <w:rFonts w:ascii="Wingdings" w:hAnsi="Wingdings" w:hint="default"/>
+        <w:sz w:val="20"/>
+      </w:rPr>
+    </w:lvl>
+    <w:lvl w:ilvl="4" w:tentative="1">
+      <w:start w:val="1"/>
+      <w:numFmt w:val="bullet"/>
+      <w:lvlText w:val=""/>
+      <w:lvlJc w:val="left"/>
+      <w:pPr>
+        <w:tabs>
+          <w:tab w:val="num" w:pos="3600"/>
+        </w:tabs>
+        <w:ind w:left="3600" w:hanging="360"/>
+      </w:pPr>
+      <w:rPr>
+        <w:rFonts w:ascii="Wingdings" w:hAnsi="Wingdings" w:hint="default"/>
+        <w:sz w:val="20"/>
+      </w:rPr>
+    </w:lvl>
+    <w:lvl w:ilvl="5" w:tentative="1">
+      <w:start w:val="1"/>
+      <w:numFmt w:val="bullet"/>
+      <w:lvlText w:val=""/>
+      <w:lvlJc w:val="left"/>
+      <w:pPr>
+        <w:tabs>
+          <w:tab w:val="num" w:pos="4320"/>
+        </w:tabs>
+        <w:ind w:left="4320" w:hanging="360"/>
+      </w:pPr>
+      <w:rPr>
+        <w:rFonts w:ascii="Wingdings" w:hAnsi="Wingdings" w:hint="default"/>
+        <w:sz w:val="20"/>
+      </w:rPr>
+    </w:lvl>
+    <w:lvl w:ilvl="6" w:tentative="1">
+      <w:start w:val="1"/>
+      <w:numFmt w:val="bullet"/>
+      <w:lvlText w:val=""/>
+      <w:lvlJc w:val="left"/>
+      <w:pPr>
+        <w:tabs>
+          <w:tab w:val="num" w:pos="5040"/>
+        </w:tabs>
+        <w:ind w:left="5040" w:hanging="360"/>
+      </w:pPr>
+      <w:rPr>
+        <w:rFonts w:ascii="Wingdings" w:hAnsi="Wingdings" w:hint="default"/>
+        <w:sz w:val="20"/>
+      </w:rPr>
+    </w:lvl>
+    <w:lvl w:ilvl="7" w:tentative="1">
+      <w:start w:val="1"/>
+      <w:numFmt w:val="bullet"/>
+      <w:lvlText w:val=""/>
+      <w:lvlJc w:val="left"/>
+      <w:pPr>
+        <w:tabs>
+          <w:tab w:val="num" w:pos="5760"/>
+        </w:tabs>
+        <w:ind w:left="5760" w:hanging="360"/>
+      </w:pPr>
+      <w:rPr>
+        <w:rFonts w:ascii="Wingdings" w:hAnsi="Wingdings" w:hint="default"/>
+        <w:sz w:val="20"/>
+      </w:rPr>
+    </w:lvl>
+    <w:lvl w:ilvl="8" w:tentative="1">
+      <w:start w:val="1"/>
+      <w:numFmt w:val="bullet"/>
+      <w:lvlText w:val=""/>
+      <w:lvlJc w:val="left"/>
+      <w:pPr>
+        <w:tabs>
+          <w:tab w:val="num" w:pos="6480"/>
+        </w:tabs>
+        <w:ind w:left="6480" w:hanging="360"/>
+      </w:pPr>
+      <w:rPr>
+        <w:rFonts w:ascii="Wingdings" w:hAnsi="Wingdings" w:hint="default"/>
+        <w:sz w:val="20"/>
+      </w:rPr>
+    </w:lvl>
+  </w:abstractNum>
+  <w:abstractNum w:abstractNumId="6" w15:restartNumberingAfterBreak="0">
+    <w:nsid w:val="6DA36487"/>
+    <w:multiLevelType w:val="multilevel"/>
+    <w:tmpl w:val="9C4C8532"/>
+    <w:lvl w:ilvl="0">
+      <w:start w:val="1"/>
+      <w:numFmt w:val="bullet"/>
+      <w:lvlText w:val=""/>
+      <w:lvlJc w:val="left"/>
+      <w:pPr>
+        <w:tabs>
+          <w:tab w:val="num" w:pos="720"/>
+        </w:tabs>
+        <w:ind w:left="720" w:hanging="360"/>
+      </w:pPr>
+      <w:rPr>
+        <w:rFonts w:ascii="Symbol" w:hAnsi="Symbol" w:hint="default"/>
+        <w:sz w:val="20"/>
+      </w:rPr>
+    </w:lvl>
+    <w:lvl w:ilvl="1" w:tentative="1">
+      <w:start w:val="1"/>
+      <w:numFmt w:val="bullet"/>
+      <w:lvlText w:val="o"/>
+      <w:lvlJc w:val="left"/>
+      <w:pPr>
+        <w:tabs>
+          <w:tab w:val="num" w:pos="1440"/>
+        </w:tabs>
+        <w:ind w:left="1440" w:hanging="360"/>
+      </w:pPr>
+      <w:rPr>
+        <w:rFonts w:ascii="Courier New" w:hAnsi="Courier New" w:hint="default"/>
+        <w:sz w:val="20"/>
+      </w:rPr>
+    </w:lvl>
+    <w:lvl w:ilvl="2" w:tentative="1">
+      <w:start w:val="1"/>
+      <w:numFmt w:val="bullet"/>
+      <w:lvlText w:val=""/>
+      <w:lvlJc w:val="left"/>
+      <w:pPr>
+        <w:tabs>
+          <w:tab w:val="num" w:pos="2160"/>
+        </w:tabs>
+        <w:ind w:left="2160" w:hanging="360"/>
+      </w:pPr>
+      <w:rPr>
+        <w:rFonts w:ascii="Wingdings" w:hAnsi="Wingdings" w:hint="default"/>
+        <w:sz w:val="20"/>
+      </w:rPr>
+    </w:lvl>
+    <w:lvl w:ilvl="3" w:tentative="1">
+      <w:start w:val="1"/>
+      <w:numFmt w:val="bullet"/>
+      <w:lvlText w:val=""/>
+      <w:lvlJc w:val="left"/>
+      <w:pPr>
+        <w:tabs>
+          <w:tab w:val="num" w:pos="2880"/>
+        </w:tabs>
+        <w:ind w:left="2880" w:hanging="360"/>
+      </w:pPr>
+      <w:rPr>
+        <w:rFonts w:ascii="Wingdings" w:hAnsi="Wingdings" w:hint="default"/>
+        <w:sz w:val="20"/>
+      </w:rPr>
+    </w:lvl>
+    <w:lvl w:ilvl="4" w:tentative="1">
+      <w:start w:val="1"/>
+      <w:numFmt w:val="bullet"/>
+      <w:lvlText w:val=""/>
+      <w:lvlJc w:val="left"/>
+      <w:pPr>
+        <w:tabs>
+          <w:tab w:val="num" w:pos="3600"/>
+        </w:tabs>
+        <w:ind w:left="3600" w:hanging="360"/>
+      </w:pPr>
+      <w:rPr>
+        <w:rFonts w:ascii="Wingdings" w:hAnsi="Wingdings" w:hint="default"/>
+        <w:sz w:val="20"/>
+      </w:rPr>
+    </w:lvl>
+    <w:lvl w:ilvl="5" w:tentative="1">
+      <w:start w:val="1"/>
+      <w:numFmt w:val="bullet"/>
+      <w:lvlText w:val=""/>
+      <w:lvlJc w:val="left"/>
+      <w:pPr>
+        <w:tabs>
+          <w:tab w:val="num" w:pos="4320"/>
+        </w:tabs>
+        <w:ind w:left="4320" w:hanging="360"/>
+      </w:pPr>
+      <w:rPr>
+        <w:rFonts w:ascii="Wingdings" w:hAnsi="Wingdings" w:hint="default"/>
+        <w:sz w:val="20"/>
+      </w:rPr>
+    </w:lvl>
+    <w:lvl w:ilvl="6" w:tentative="1">
+      <w:start w:val="1"/>
+      <w:numFmt w:val="bullet"/>
+      <w:lvlText w:val=""/>
+      <w:lvlJc w:val="left"/>
+      <w:pPr>
+        <w:tabs>
+          <w:tab w:val="num" w:pos="5040"/>
+        </w:tabs>
+        <w:ind w:left="5040" w:hanging="360"/>
+      </w:pPr>
+      <w:rPr>
+        <w:rFonts w:ascii="Wingdings" w:hAnsi="Wingdings" w:hint="default"/>
+        <w:sz w:val="20"/>
+      </w:rPr>
+    </w:lvl>
+    <w:lvl w:ilvl="7" w:tentative="1">
+      <w:start w:val="1"/>
+      <w:numFmt w:val="bullet"/>
+      <w:lvlText w:val=""/>
+      <w:lvlJc w:val="left"/>
+      <w:pPr>
+        <w:tabs>
+          <w:tab w:val="num" w:pos="5760"/>
+        </w:tabs>
+        <w:ind w:left="5760" w:hanging="360"/>
+      </w:pPr>
+      <w:rPr>
+        <w:rFonts w:ascii="Wingdings" w:hAnsi="Wingdings" w:hint="default"/>
+        <w:sz w:val="20"/>
+      </w:rPr>
+    </w:lvl>
+    <w:lvl w:ilvl="8" w:tentative="1">
+      <w:start w:val="1"/>
+      <w:numFmt w:val="bullet"/>
+      <w:lvlText w:val=""/>
+      <w:lvlJc w:val="left"/>
+      <w:pPr>
+        <w:tabs>
+          <w:tab w:val="num" w:pos="6480"/>
+        </w:tabs>
+        <w:ind w:left="6480" w:hanging="360"/>
+      </w:pPr>
+      <w:rPr>
+        <w:rFonts w:ascii="Wingdings" w:hAnsi="Wingdings" w:hint="default"/>
+        <w:sz w:val="20"/>
+      </w:rPr>
+    </w:lvl>
+  </w:abstractNum>
+  <w:abstractNum w:abstractNumId="7" w15:restartNumberingAfterBreak="0">
     <w:nsid w:val="6EB85EAA"/>
     <w:multiLevelType w:val="hybridMultilevel"/>
     <w:tmpl w:val="DB76C824"/>
@@ -3994,19 +5616,28 @@
     </w:lvl>
   </w:abstractNum>
   <w:num w:numId="1">
+    <w:abstractNumId w:val="7"/>
+  </w:num>
+  <w:num w:numId="2">
+    <w:abstractNumId w:val="3"/>
+  </w:num>
+  <w:num w:numId="3">
     <w:abstractNumId w:val="4"/>
   </w:num>
-  <w:num w:numId="2">
+  <w:num w:numId="4">
     <w:abstractNumId w:val="2"/>
   </w:num>
-  <w:num w:numId="3">
-    <w:abstractNumId w:val="3"/>
-  </w:num>
-  <w:num w:numId="4">
+  <w:num w:numId="5">
     <w:abstractNumId w:val="1"/>
   </w:num>
-  <w:num w:numId="5">
+  <w:num w:numId="6">
+    <w:abstractNumId w:val="5"/>
+  </w:num>
+  <w:num w:numId="7">
     <w:abstractNumId w:val="0"/>
+  </w:num>
+  <w:num w:numId="8">
+    <w:abstractNumId w:val="6"/>
   </w:num>
 </w:numbering>
 </file>

</xml_diff>

<commit_message>
creer un prompt demandant du json
</commit_message>
<xml_diff>
--- a/Atelier Prompt.docx
+++ b/Atelier Prompt.docx
@@ -4248,9 +4248,860 @@
         </w:drawing>
       </w:r>
     </w:p>
+    <w:p>
+      <w:pPr>
+        <w:rPr>
+          <w:rFonts w:ascii="Times New Roman" w:hAnsi="Times New Roman" w:cs="Times New Roman"/>
+          <w:sz w:val="24"/>
+          <w:szCs w:val="24"/>
+        </w:rPr>
+      </w:pPr>
+    </w:p>
+    <w:p>
+      <w:pPr>
+        <w:rPr>
+          <w:rFonts w:ascii="Times New Roman" w:hAnsi="Times New Roman" w:cs="Times New Roman"/>
+          <w:sz w:val="24"/>
+          <w:szCs w:val="24"/>
+        </w:rPr>
+      </w:pPr>
+    </w:p>
+    <w:p>
+      <w:pPr>
+        <w:rPr>
+          <w:rFonts w:ascii="Times New Roman" w:hAnsi="Times New Roman" w:cs="Times New Roman"/>
+          <w:sz w:val="24"/>
+          <w:szCs w:val="24"/>
+        </w:rPr>
+      </w:pPr>
+    </w:p>
+    <w:p>
+      <w:pPr>
+        <w:rPr>
+          <w:rFonts w:ascii="Times New Roman" w:hAnsi="Times New Roman" w:cs="Times New Roman"/>
+          <w:sz w:val="24"/>
+          <w:szCs w:val="24"/>
+        </w:rPr>
+      </w:pPr>
+    </w:p>
+    <w:p>
+      <w:pPr>
+        <w:pBdr>
+          <w:left w:val="single" w:sz="24" w:space="4" w:color="323E4F" w:themeColor="text2" w:themeShade="BF"/>
+        </w:pBdr>
+        <w:autoSpaceDE w:val="0"/>
+        <w:autoSpaceDN w:val="0"/>
+        <w:adjustRightInd w:val="0"/>
+        <w:spacing w:after="0" w:line="240" w:lineRule="auto"/>
+        <w:rPr>
+          <w:rFonts w:ascii="Times New Roman" w:hAnsi="Times New Roman" w:cs="Times New Roman"/>
+          <w:b/>
+          <w:bCs/>
+          <w:color w:val="323E4F" w:themeColor="text2" w:themeShade="BF"/>
+          <w:kern w:val="0"/>
+          <w:sz w:val="32"/>
+          <w:szCs w:val="32"/>
+        </w:rPr>
+      </w:pPr>
+      <w:r>
+        <w:rPr>
+          <w:rFonts w:ascii="Times New Roman" w:hAnsi="Times New Roman" w:cs="Times New Roman"/>
+          <w:b/>
+          <w:bCs/>
+          <w:color w:val="323E4F" w:themeColor="text2" w:themeShade="BF"/>
+          <w:kern w:val="0"/>
+          <w:sz w:val="32"/>
+          <w:szCs w:val="32"/>
+        </w:rPr>
+        <w:t xml:space="preserve">Partie </w:t>
+      </w:r>
+      <w:r>
+        <w:rPr>
+          <w:rFonts w:ascii="Times New Roman" w:hAnsi="Times New Roman" w:cs="Times New Roman"/>
+          <w:b/>
+          <w:bCs/>
+          <w:color w:val="323E4F" w:themeColor="text2" w:themeShade="BF"/>
+          <w:kern w:val="0"/>
+          <w:sz w:val="32"/>
+          <w:szCs w:val="32"/>
+        </w:rPr>
+        <w:t>4</w:t>
+      </w:r>
+      <w:r>
+        <w:rPr>
+          <w:rFonts w:ascii="Times New Roman" w:hAnsi="Times New Roman" w:cs="Times New Roman"/>
+          <w:b/>
+          <w:bCs/>
+          <w:color w:val="323E4F" w:themeColor="text2" w:themeShade="BF"/>
+          <w:kern w:val="0"/>
+          <w:sz w:val="32"/>
+          <w:szCs w:val="32"/>
+        </w:rPr>
+        <w:t xml:space="preserve"> – </w:t>
+      </w:r>
+      <w:r>
+        <w:rPr>
+          <w:rFonts w:ascii="Times New Roman" w:hAnsi="Times New Roman" w:cs="Times New Roman"/>
+          <w:b/>
+          <w:bCs/>
+          <w:color w:val="323E4F" w:themeColor="text2" w:themeShade="BF"/>
+          <w:kern w:val="0"/>
+          <w:sz w:val="32"/>
+          <w:szCs w:val="32"/>
+        </w:rPr>
+        <w:t>Sorties Structurées :</w:t>
+      </w:r>
+    </w:p>
+    <w:p>
+      <w:pPr>
+        <w:autoSpaceDE w:val="0"/>
+        <w:autoSpaceDN w:val="0"/>
+        <w:adjustRightInd w:val="0"/>
+        <w:spacing w:after="0" w:line="240" w:lineRule="auto"/>
+        <w:rPr>
+          <w:rFonts w:ascii="Times New Roman" w:hAnsi="Times New Roman" w:cs="Times New Roman"/>
+          <w:color w:val="000000"/>
+          <w:kern w:val="0"/>
+          <w:sz w:val="24"/>
+          <w:szCs w:val="24"/>
+        </w:rPr>
+      </w:pPr>
+      <w:r>
+        <w:rPr>
+          <w:rFonts w:ascii="Times New Roman" w:hAnsi="Times New Roman" w:cs="Times New Roman"/>
+          <w:color w:val="000000"/>
+          <w:kern w:val="0"/>
+          <w:sz w:val="24"/>
+          <w:szCs w:val="24"/>
+        </w:rPr>
+        <w:t>Le LLM retourne :</w:t>
+      </w:r>
+    </w:p>
+    <w:p>
+      <w:pPr>
+        <w:autoSpaceDE w:val="0"/>
+        <w:autoSpaceDN w:val="0"/>
+        <w:adjustRightInd w:val="0"/>
+        <w:spacing w:after="0" w:line="240" w:lineRule="auto"/>
+        <w:rPr>
+          <w:rFonts w:ascii="Times New Roman" w:hAnsi="Times New Roman" w:cs="Times New Roman"/>
+          <w:color w:val="000000"/>
+          <w:kern w:val="0"/>
+          <w:sz w:val="24"/>
+          <w:szCs w:val="24"/>
+        </w:rPr>
+      </w:pPr>
+      <w:r>
+        <w:rPr>
+          <w:rFonts w:ascii="Times New Roman" w:hAnsi="Times New Roman" w:cs="Times New Roman"/>
+          <w:color w:val="000000"/>
+          <w:kern w:val="0"/>
+          <w:sz w:val="24"/>
+          <w:szCs w:val="24"/>
+        </w:rPr>
+        <w:t>« Le commentaire semble plutôt négatif. Le client est mécontent du délai de livraison... »</w:t>
+      </w:r>
+    </w:p>
+    <w:p>
+      <w:pPr>
+        <w:autoSpaceDE w:val="0"/>
+        <w:autoSpaceDN w:val="0"/>
+        <w:adjustRightInd w:val="0"/>
+        <w:spacing w:after="0" w:line="240" w:lineRule="auto"/>
+        <w:rPr>
+          <w:rFonts w:ascii="Times New Roman" w:hAnsi="Times New Roman" w:cs="Times New Roman"/>
+          <w:color w:val="000000"/>
+          <w:kern w:val="0"/>
+          <w:sz w:val="24"/>
+          <w:szCs w:val="24"/>
+        </w:rPr>
+      </w:pPr>
+      <w:r>
+        <w:rPr>
+          <w:rFonts w:ascii="Times New Roman" w:hAnsi="Times New Roman" w:cs="Times New Roman"/>
+          <w:color w:val="000000"/>
+          <w:kern w:val="0"/>
+          <w:sz w:val="24"/>
+          <w:szCs w:val="24"/>
+        </w:rPr>
+        <w:t>1) Pour rendre cette réponse plus facile à exploiter par une application, créer un prompt</w:t>
+      </w:r>
+    </w:p>
+    <w:p>
+      <w:pPr>
+        <w:autoSpaceDE w:val="0"/>
+        <w:autoSpaceDN w:val="0"/>
+        <w:adjustRightInd w:val="0"/>
+        <w:spacing w:after="0" w:line="240" w:lineRule="auto"/>
+        <w:rPr>
+          <w:rFonts w:ascii="Times New Roman" w:hAnsi="Times New Roman" w:cs="Times New Roman"/>
+          <w:color w:val="000000"/>
+          <w:kern w:val="0"/>
+          <w:sz w:val="24"/>
+          <w:szCs w:val="24"/>
+        </w:rPr>
+      </w:pPr>
+      <w:r>
+        <w:rPr>
+          <w:rFonts w:ascii="Times New Roman" w:hAnsi="Times New Roman" w:cs="Times New Roman"/>
+          <w:color w:val="000000"/>
+          <w:kern w:val="0"/>
+          <w:sz w:val="24"/>
+          <w:szCs w:val="24"/>
+        </w:rPr>
+        <w:t>demandant du JSON avec les champs sentiment, categorie, urgence, probleme, confiance.</w:t>
+      </w:r>
+    </w:p>
+    <w:p>
+      <w:pPr>
+        <w:autoSpaceDE w:val="0"/>
+        <w:autoSpaceDN w:val="0"/>
+        <w:adjustRightInd w:val="0"/>
+        <w:spacing w:after="0" w:line="240" w:lineRule="auto"/>
+        <w:rPr>
+          <w:rFonts w:ascii="Times New Roman" w:hAnsi="Times New Roman" w:cs="Times New Roman"/>
+          <w:color w:val="000000"/>
+          <w:kern w:val="0"/>
+          <w:sz w:val="24"/>
+          <w:szCs w:val="24"/>
+        </w:rPr>
+      </w:pPr>
+      <w:r>
+        <w:rPr>
+          <w:rFonts w:ascii="Times New Roman" w:hAnsi="Times New Roman" w:cs="Times New Roman"/>
+          <w:color w:val="000000"/>
+          <w:kern w:val="0"/>
+          <w:sz w:val="24"/>
+          <w:szCs w:val="24"/>
+        </w:rPr>
+        <w:t>Préciser les types des valeurs et les valeurs autorisées</w:t>
+      </w:r>
+    </w:p>
+    <w:p>
+      <w:pPr>
+        <w:autoSpaceDE w:val="0"/>
+        <w:autoSpaceDN w:val="0"/>
+        <w:adjustRightInd w:val="0"/>
+        <w:spacing w:after="0" w:line="240" w:lineRule="auto"/>
+        <w:rPr>
+          <w:rFonts w:ascii="Times New Roman" w:hAnsi="Times New Roman" w:cs="Times New Roman"/>
+          <w:color w:val="000000"/>
+          <w:kern w:val="0"/>
+          <w:sz w:val="24"/>
+          <w:szCs w:val="24"/>
+        </w:rPr>
+      </w:pPr>
+      <w:r>
+        <w:rPr>
+          <w:rFonts w:ascii="Times New Roman" w:hAnsi="Times New Roman" w:cs="Times New Roman"/>
+          <w:color w:val="000000"/>
+          <w:kern w:val="0"/>
+          <w:sz w:val="24"/>
+          <w:szCs w:val="24"/>
+        </w:rPr>
+        <w:t>Exemple de résultat</w:t>
+      </w:r>
+    </w:p>
+    <w:p>
+      <w:pPr>
+        <w:autoSpaceDE w:val="0"/>
+        <w:autoSpaceDN w:val="0"/>
+        <w:adjustRightInd w:val="0"/>
+        <w:spacing w:after="0" w:line="240" w:lineRule="auto"/>
+        <w:rPr>
+          <w:rFonts w:ascii="Times New Roman" w:hAnsi="Times New Roman" w:cs="Times New Roman"/>
+          <w:color w:val="000000"/>
+          <w:kern w:val="0"/>
+          <w:sz w:val="24"/>
+          <w:szCs w:val="24"/>
+        </w:rPr>
+      </w:pPr>
+      <w:r>
+        <w:rPr>
+          <w:rFonts w:ascii="Times New Roman" w:hAnsi="Times New Roman" w:cs="Times New Roman"/>
+          <w:color w:val="000000"/>
+          <w:kern w:val="0"/>
+          <w:sz w:val="24"/>
+          <w:szCs w:val="24"/>
+        </w:rPr>
+        <w:t>{</w:t>
+      </w:r>
+    </w:p>
+    <w:p>
+      <w:pPr>
+        <w:autoSpaceDE w:val="0"/>
+        <w:autoSpaceDN w:val="0"/>
+        <w:adjustRightInd w:val="0"/>
+        <w:spacing w:after="0" w:line="240" w:lineRule="auto"/>
+        <w:rPr>
+          <w:rFonts w:ascii="Times New Roman" w:hAnsi="Times New Roman" w:cs="Times New Roman"/>
+          <w:color w:val="000000"/>
+          <w:kern w:val="0"/>
+          <w:sz w:val="24"/>
+          <w:szCs w:val="24"/>
+        </w:rPr>
+      </w:pPr>
+      <w:r>
+        <w:rPr>
+          <w:rFonts w:ascii="Times New Roman" w:hAnsi="Times New Roman" w:cs="Times New Roman"/>
+          <w:color w:val="000000"/>
+          <w:kern w:val="0"/>
+          <w:sz w:val="24"/>
+          <w:szCs w:val="24"/>
+        </w:rPr>
+        <w:t>"sentiment": "negatif",</w:t>
+      </w:r>
+    </w:p>
+    <w:p>
+      <w:pPr>
+        <w:autoSpaceDE w:val="0"/>
+        <w:autoSpaceDN w:val="0"/>
+        <w:adjustRightInd w:val="0"/>
+        <w:spacing w:after="0" w:line="240" w:lineRule="auto"/>
+        <w:rPr>
+          <w:rFonts w:ascii="Times New Roman" w:hAnsi="Times New Roman" w:cs="Times New Roman"/>
+          <w:color w:val="000000"/>
+          <w:kern w:val="0"/>
+          <w:sz w:val="24"/>
+          <w:szCs w:val="24"/>
+        </w:rPr>
+      </w:pPr>
+      <w:r>
+        <w:rPr>
+          <w:rFonts w:ascii="Times New Roman" w:hAnsi="Times New Roman" w:cs="Times New Roman"/>
+          <w:color w:val="000000"/>
+          <w:kern w:val="0"/>
+          <w:sz w:val="24"/>
+          <w:szCs w:val="24"/>
+        </w:rPr>
+        <w:t>"categorie": "livraison",</w:t>
+      </w:r>
+    </w:p>
+    <w:p>
+      <w:pPr>
+        <w:autoSpaceDE w:val="0"/>
+        <w:autoSpaceDN w:val="0"/>
+        <w:adjustRightInd w:val="0"/>
+        <w:spacing w:after="0" w:line="240" w:lineRule="auto"/>
+        <w:rPr>
+          <w:rFonts w:ascii="Times New Roman" w:hAnsi="Times New Roman" w:cs="Times New Roman"/>
+          <w:color w:val="000000"/>
+          <w:kern w:val="0"/>
+          <w:sz w:val="24"/>
+          <w:szCs w:val="24"/>
+        </w:rPr>
+      </w:pPr>
+      <w:r>
+        <w:rPr>
+          <w:rFonts w:ascii="Times New Roman" w:hAnsi="Times New Roman" w:cs="Times New Roman"/>
+          <w:color w:val="000000"/>
+          <w:kern w:val="0"/>
+          <w:sz w:val="24"/>
+          <w:szCs w:val="24"/>
+        </w:rPr>
+        <w:t>"urgence": "moyenne",</w:t>
+      </w:r>
+    </w:p>
+    <w:p>
+      <w:pPr>
+        <w:autoSpaceDE w:val="0"/>
+        <w:autoSpaceDN w:val="0"/>
+        <w:adjustRightInd w:val="0"/>
+        <w:spacing w:after="0" w:line="240" w:lineRule="auto"/>
+        <w:rPr>
+          <w:rFonts w:ascii="Times New Roman" w:hAnsi="Times New Roman" w:cs="Times New Roman"/>
+          <w:color w:val="000000"/>
+          <w:kern w:val="0"/>
+          <w:sz w:val="24"/>
+          <w:szCs w:val="24"/>
+        </w:rPr>
+      </w:pPr>
+      <w:r>
+        <w:rPr>
+          <w:rFonts w:ascii="Times New Roman" w:hAnsi="Times New Roman" w:cs="Times New Roman"/>
+          <w:color w:val="000000"/>
+          <w:kern w:val="0"/>
+          <w:sz w:val="24"/>
+          <w:szCs w:val="24"/>
+        </w:rPr>
+        <w:t>"probleme": "Retard de livraison",</w:t>
+      </w:r>
+    </w:p>
+    <w:p>
+      <w:pPr>
+        <w:autoSpaceDE w:val="0"/>
+        <w:autoSpaceDN w:val="0"/>
+        <w:adjustRightInd w:val="0"/>
+        <w:spacing w:after="0" w:line="240" w:lineRule="auto"/>
+        <w:rPr>
+          <w:rFonts w:ascii="Times New Roman" w:hAnsi="Times New Roman" w:cs="Times New Roman"/>
+          <w:color w:val="000000"/>
+          <w:kern w:val="0"/>
+          <w:sz w:val="24"/>
+          <w:szCs w:val="24"/>
+        </w:rPr>
+      </w:pPr>
+      <w:r>
+        <w:rPr>
+          <w:rFonts w:ascii="Times New Roman" w:hAnsi="Times New Roman" w:cs="Times New Roman"/>
+          <w:color w:val="000000"/>
+          <w:kern w:val="0"/>
+          <w:sz w:val="24"/>
+          <w:szCs w:val="24"/>
+        </w:rPr>
+        <w:t>"confiance": 0.91</w:t>
+      </w:r>
+    </w:p>
+    <w:p>
+      <w:pPr>
+        <w:rPr>
+          <w:rFonts w:ascii="Times New Roman" w:hAnsi="Times New Roman" w:cs="Times New Roman"/>
+          <w:sz w:val="24"/>
+          <w:szCs w:val="24"/>
+        </w:rPr>
+      </w:pPr>
+      <w:r>
+        <w:rPr>
+          <w:rFonts w:ascii="Times New Roman" w:hAnsi="Times New Roman" w:cs="Times New Roman"/>
+          <w:color w:val="000000"/>
+          <w:kern w:val="0"/>
+          <w:sz w:val="24"/>
+          <w:szCs w:val="24"/>
+        </w:rPr>
+        <w:t>}</w:t>
+      </w:r>
+    </w:p>
+    <w:p>
+      <w:pPr>
+        <w:pStyle w:val="NormalWeb"/>
+        <w:spacing w:before="0" w:beforeAutospacing="0" w:after="0" w:afterAutospacing="0"/>
+        <w:ind w:left="708"/>
+        <w:jc w:val="both"/>
+        <w:rPr>
+          <w:color w:val="2F5496" w:themeColor="accent1" w:themeShade="BF"/>
+        </w:rPr>
+      </w:pPr>
+      <w:r>
+        <w:rPr>
+          <w:color w:val="2F5496" w:themeColor="accent1" w:themeShade="BF"/>
+        </w:rPr>
+        <w:t>Tu es un expert en analyse de commentaires clients.</w:t>
+      </w:r>
+    </w:p>
+    <w:p>
+      <w:pPr>
+        <w:pStyle w:val="NormalWeb"/>
+        <w:spacing w:before="0" w:beforeAutospacing="0" w:after="0" w:afterAutospacing="0"/>
+        <w:ind w:left="708"/>
+        <w:jc w:val="both"/>
+        <w:rPr>
+          <w:color w:val="2F5496" w:themeColor="accent1" w:themeShade="BF"/>
+        </w:rPr>
+      </w:pPr>
+      <w:r>
+        <w:rPr>
+          <w:color w:val="2F5496" w:themeColor="accent1" w:themeShade="BF"/>
+        </w:rPr>
+        <w:t>Analyse le commentaire suivant :</w:t>
+      </w:r>
+    </w:p>
+    <w:p>
+      <w:pPr>
+        <w:pStyle w:val="NormalWeb"/>
+        <w:spacing w:before="0" w:beforeAutospacing="0" w:after="0" w:afterAutospacing="0"/>
+        <w:ind w:left="708"/>
+        <w:jc w:val="both"/>
+        <w:rPr>
+          <w:color w:val="2F5496" w:themeColor="accent1" w:themeShade="BF"/>
+        </w:rPr>
+      </w:pPr>
+      <w:r>
+        <w:rPr>
+          <w:color w:val="2F5496" w:themeColor="accent1" w:themeShade="BF"/>
+        </w:rPr>
+        <w:t>"</w:t>
+      </w:r>
+      <w:r>
+        <w:rPr>
+          <w:color w:val="2F5496" w:themeColor="accent1" w:themeShade="BF"/>
+        </w:rPr>
+        <w:t xml:space="preserve"> Le client est mécontent du délai de livraison</w:t>
+      </w:r>
+      <w:r>
+        <w:rPr>
+          <w:color w:val="2F5496" w:themeColor="accent1" w:themeShade="BF"/>
+        </w:rPr>
+        <w:t>"</w:t>
+      </w:r>
+    </w:p>
+    <w:p>
+      <w:pPr>
+        <w:pStyle w:val="NormalWeb"/>
+        <w:spacing w:before="0" w:beforeAutospacing="0" w:after="0" w:afterAutospacing="0"/>
+        <w:ind w:left="708"/>
+        <w:jc w:val="both"/>
+        <w:rPr>
+          <w:color w:val="2F5496" w:themeColor="accent1" w:themeShade="BF"/>
+        </w:rPr>
+      </w:pPr>
+      <w:r>
+        <w:rPr>
+          <w:color w:val="2F5496" w:themeColor="accent1" w:themeShade="BF"/>
+        </w:rPr>
+        <w:t xml:space="preserve">Retourne uniquement un objet JSON valide contenant exactement les cinq champs suivants : </w:t>
+      </w:r>
+    </w:p>
+    <w:p>
+      <w:pPr>
+        <w:numPr>
+          <w:ilvl w:val="0"/>
+          <w:numId w:val="9"/>
+        </w:numPr>
+        <w:spacing w:after="0" w:line="240" w:lineRule="auto"/>
+        <w:rPr>
+          <w:rFonts w:ascii="Times New Roman" w:eastAsia="Times New Roman" w:hAnsi="Times New Roman" w:cs="Times New Roman"/>
+          <w:color w:val="2F5496" w:themeColor="accent1" w:themeShade="BF"/>
+          <w:kern w:val="0"/>
+          <w:sz w:val="24"/>
+          <w:szCs w:val="24"/>
+          <w:lang w:eastAsia="fr-FR"/>
+          <w14:ligatures w14:val="none"/>
+        </w:rPr>
+      </w:pPr>
+      <w:r>
+        <w:rPr>
+          <w:rFonts w:ascii="Times New Roman" w:eastAsia="Times New Roman" w:hAnsi="Times New Roman" w:cs="Times New Roman"/>
+          <w:color w:val="2F5496" w:themeColor="accent1" w:themeShade="BF"/>
+          <w:kern w:val="0"/>
+          <w:sz w:val="24"/>
+          <w:szCs w:val="24"/>
+          <w:lang w:eastAsia="fr-FR"/>
+          <w14:ligatures w14:val="none"/>
+        </w:rPr>
+        <w:t>sentiment : chaîne de caractères. Valeurs autorisées : positif, negatif, neutre.</w:t>
+      </w:r>
+    </w:p>
+    <w:p>
+      <w:pPr>
+        <w:numPr>
+          <w:ilvl w:val="0"/>
+          <w:numId w:val="9"/>
+        </w:numPr>
+        <w:spacing w:after="0" w:line="240" w:lineRule="auto"/>
+        <w:rPr>
+          <w:rFonts w:ascii="Times New Roman" w:eastAsia="Times New Roman" w:hAnsi="Times New Roman" w:cs="Times New Roman"/>
+          <w:color w:val="2F5496" w:themeColor="accent1" w:themeShade="BF"/>
+          <w:kern w:val="0"/>
+          <w:sz w:val="24"/>
+          <w:szCs w:val="24"/>
+          <w:lang w:eastAsia="fr-FR"/>
+          <w14:ligatures w14:val="none"/>
+        </w:rPr>
+      </w:pPr>
+      <w:r>
+        <w:rPr>
+          <w:rFonts w:ascii="Times New Roman" w:eastAsia="Times New Roman" w:hAnsi="Times New Roman" w:cs="Times New Roman"/>
+          <w:color w:val="2F5496" w:themeColor="accent1" w:themeShade="BF"/>
+          <w:kern w:val="0"/>
+          <w:sz w:val="24"/>
+          <w:szCs w:val="24"/>
+          <w:lang w:eastAsia="fr-FR"/>
+          <w14:ligatures w14:val="none"/>
+        </w:rPr>
+        <w:t>categorie : chaîne de caractères. Pour ce commentaire, indique la catégorie correspondant au problème identifié.</w:t>
+      </w:r>
+    </w:p>
+    <w:p>
+      <w:pPr>
+        <w:numPr>
+          <w:ilvl w:val="0"/>
+          <w:numId w:val="9"/>
+        </w:numPr>
+        <w:spacing w:after="0" w:line="240" w:lineRule="auto"/>
+        <w:rPr>
+          <w:rFonts w:ascii="Times New Roman" w:eastAsia="Times New Roman" w:hAnsi="Times New Roman" w:cs="Times New Roman"/>
+          <w:color w:val="2F5496" w:themeColor="accent1" w:themeShade="BF"/>
+          <w:kern w:val="0"/>
+          <w:sz w:val="24"/>
+          <w:szCs w:val="24"/>
+          <w:lang w:eastAsia="fr-FR"/>
+          <w14:ligatures w14:val="none"/>
+        </w:rPr>
+      </w:pPr>
+      <w:r>
+        <w:rPr>
+          <w:rFonts w:ascii="Times New Roman" w:eastAsia="Times New Roman" w:hAnsi="Times New Roman" w:cs="Times New Roman"/>
+          <w:color w:val="2F5496" w:themeColor="accent1" w:themeShade="BF"/>
+          <w:kern w:val="0"/>
+          <w:sz w:val="24"/>
+          <w:szCs w:val="24"/>
+          <w:lang w:eastAsia="fr-FR"/>
+          <w14:ligatures w14:val="none"/>
+        </w:rPr>
+        <w:t>urgence : chaîne de caractères. Valeurs autorisées : faible, moyenne, élevée.</w:t>
+      </w:r>
+    </w:p>
+    <w:p>
+      <w:pPr>
+        <w:numPr>
+          <w:ilvl w:val="0"/>
+          <w:numId w:val="9"/>
+        </w:numPr>
+        <w:spacing w:after="0" w:line="240" w:lineRule="auto"/>
+        <w:rPr>
+          <w:rFonts w:ascii="Times New Roman" w:eastAsia="Times New Roman" w:hAnsi="Times New Roman" w:cs="Times New Roman"/>
+          <w:color w:val="2F5496" w:themeColor="accent1" w:themeShade="BF"/>
+          <w:kern w:val="0"/>
+          <w:sz w:val="24"/>
+          <w:szCs w:val="24"/>
+          <w:lang w:eastAsia="fr-FR"/>
+          <w14:ligatures w14:val="none"/>
+        </w:rPr>
+      </w:pPr>
+      <w:r>
+        <w:rPr>
+          <w:rFonts w:ascii="Times New Roman" w:eastAsia="Times New Roman" w:hAnsi="Times New Roman" w:cs="Times New Roman"/>
+          <w:color w:val="2F5496" w:themeColor="accent1" w:themeShade="BF"/>
+          <w:kern w:val="0"/>
+          <w:sz w:val="24"/>
+          <w:szCs w:val="24"/>
+          <w:lang w:eastAsia="fr-FR"/>
+          <w14:ligatures w14:val="none"/>
+        </w:rPr>
+        <w:t>probleme : chaîne de caractères décrivant le problème identifié.</w:t>
+      </w:r>
+    </w:p>
+    <w:p>
+      <w:pPr>
+        <w:numPr>
+          <w:ilvl w:val="0"/>
+          <w:numId w:val="9"/>
+        </w:numPr>
+        <w:spacing w:after="0" w:line="240" w:lineRule="auto"/>
+        <w:rPr>
+          <w:rFonts w:ascii="Times New Roman" w:eastAsia="Times New Roman" w:hAnsi="Times New Roman" w:cs="Times New Roman"/>
+          <w:kern w:val="0"/>
+          <w:sz w:val="24"/>
+          <w:szCs w:val="24"/>
+          <w:lang w:eastAsia="fr-FR"/>
+          <w14:ligatures w14:val="none"/>
+        </w:rPr>
+      </w:pPr>
+      <w:r>
+        <w:rPr>
+          <w:rFonts w:ascii="Times New Roman" w:eastAsia="Times New Roman" w:hAnsi="Times New Roman" w:cs="Times New Roman"/>
+          <w:color w:val="2F5496" w:themeColor="accent1" w:themeShade="BF"/>
+          <w:kern w:val="0"/>
+          <w:sz w:val="24"/>
+          <w:szCs w:val="24"/>
+          <w:lang w:eastAsia="fr-FR"/>
+          <w14:ligatures w14:val="none"/>
+        </w:rPr>
+        <w:t>confiance : nombre décimal compris entre 0 et 1 indiquant le niveau de confiance de l'analyse.</w:t>
+      </w:r>
+    </w:p>
+    <w:p>
+      <w:pPr>
+        <w:spacing w:after="0" w:line="240" w:lineRule="auto"/>
+        <w:ind w:left="708"/>
+        <w:rPr>
+          <w:rFonts w:ascii="Times New Roman" w:eastAsia="Times New Roman" w:hAnsi="Times New Roman" w:cs="Times New Roman"/>
+          <w:color w:val="2F5496" w:themeColor="accent1" w:themeShade="BF"/>
+          <w:kern w:val="0"/>
+          <w:sz w:val="24"/>
+          <w:szCs w:val="24"/>
+          <w:lang w:eastAsia="fr-FR"/>
+          <w14:ligatures w14:val="none"/>
+        </w:rPr>
+      </w:pPr>
+      <w:r>
+        <w:rPr>
+          <w:rFonts w:ascii="Times New Roman" w:eastAsia="Times New Roman" w:hAnsi="Times New Roman" w:cs="Times New Roman"/>
+          <w:color w:val="2F5496" w:themeColor="accent1" w:themeShade="BF"/>
+          <w:kern w:val="0"/>
+          <w:sz w:val="24"/>
+          <w:szCs w:val="24"/>
+          <w:lang w:eastAsia="fr-FR"/>
+          <w14:ligatures w14:val="none"/>
+        </w:rPr>
+        <w:t>Exemple de format attendu :</w:t>
+      </w:r>
+    </w:p>
+    <w:p>
+      <w:pPr>
+        <w:spacing w:after="0" w:line="240" w:lineRule="auto"/>
+        <w:ind w:left="708"/>
+        <w:rPr>
+          <w:rFonts w:ascii="Times New Roman" w:eastAsia="Times New Roman" w:hAnsi="Times New Roman" w:cs="Times New Roman"/>
+          <w:color w:val="2F5496" w:themeColor="accent1" w:themeShade="BF"/>
+          <w:kern w:val="0"/>
+          <w:sz w:val="24"/>
+          <w:szCs w:val="24"/>
+          <w:lang w:eastAsia="fr-FR"/>
+          <w14:ligatures w14:val="none"/>
+        </w:rPr>
+      </w:pPr>
+      <w:r>
+        <w:rPr>
+          <w:rFonts w:ascii="Times New Roman" w:eastAsia="Times New Roman" w:hAnsi="Times New Roman" w:cs="Times New Roman"/>
+          <w:color w:val="2F5496" w:themeColor="accent1" w:themeShade="BF"/>
+          <w:kern w:val="0"/>
+          <w:sz w:val="24"/>
+          <w:szCs w:val="24"/>
+          <w:lang w:eastAsia="fr-FR"/>
+          <w14:ligatures w14:val="none"/>
+        </w:rPr>
+        <w:t>{</w:t>
+      </w:r>
+      <w:r>
+        <w:rPr>
+          <w:rFonts w:ascii="Times New Roman" w:eastAsia="Times New Roman" w:hAnsi="Times New Roman" w:cs="Times New Roman"/>
+          <w:color w:val="2F5496" w:themeColor="accent1" w:themeShade="BF"/>
+          <w:kern w:val="0"/>
+          <w:sz w:val="24"/>
+          <w:szCs w:val="24"/>
+          <w:lang w:eastAsia="fr-FR"/>
+          <w14:ligatures w14:val="none"/>
+        </w:rPr>
+        <w:br/>
+        <w:t>"sentiment": "negatif",</w:t>
+      </w:r>
+      <w:r>
+        <w:rPr>
+          <w:rFonts w:ascii="Times New Roman" w:eastAsia="Times New Roman" w:hAnsi="Times New Roman" w:cs="Times New Roman"/>
+          <w:color w:val="2F5496" w:themeColor="accent1" w:themeShade="BF"/>
+          <w:kern w:val="0"/>
+          <w:sz w:val="24"/>
+          <w:szCs w:val="24"/>
+          <w:lang w:eastAsia="fr-FR"/>
+          <w14:ligatures w14:val="none"/>
+        </w:rPr>
+        <w:br/>
+        <w:t>"categorie": "livraison",</w:t>
+      </w:r>
+      <w:r>
+        <w:rPr>
+          <w:rFonts w:ascii="Times New Roman" w:eastAsia="Times New Roman" w:hAnsi="Times New Roman" w:cs="Times New Roman"/>
+          <w:color w:val="2F5496" w:themeColor="accent1" w:themeShade="BF"/>
+          <w:kern w:val="0"/>
+          <w:sz w:val="24"/>
+          <w:szCs w:val="24"/>
+          <w:lang w:eastAsia="fr-FR"/>
+          <w14:ligatures w14:val="none"/>
+        </w:rPr>
+        <w:br/>
+        <w:t>"urgence": "moyenne",</w:t>
+      </w:r>
+      <w:r>
+        <w:rPr>
+          <w:rFonts w:ascii="Times New Roman" w:eastAsia="Times New Roman" w:hAnsi="Times New Roman" w:cs="Times New Roman"/>
+          <w:color w:val="2F5496" w:themeColor="accent1" w:themeShade="BF"/>
+          <w:kern w:val="0"/>
+          <w:sz w:val="24"/>
+          <w:szCs w:val="24"/>
+          <w:lang w:eastAsia="fr-FR"/>
+          <w14:ligatures w14:val="none"/>
+        </w:rPr>
+        <w:br/>
+        <w:t>"probleme": "Retard de livraison",</w:t>
+      </w:r>
+      <w:r>
+        <w:rPr>
+          <w:rFonts w:ascii="Times New Roman" w:eastAsia="Times New Roman" w:hAnsi="Times New Roman" w:cs="Times New Roman"/>
+          <w:color w:val="2F5496" w:themeColor="accent1" w:themeShade="BF"/>
+          <w:kern w:val="0"/>
+          <w:sz w:val="24"/>
+          <w:szCs w:val="24"/>
+          <w:lang w:eastAsia="fr-FR"/>
+          <w14:ligatures w14:val="none"/>
+        </w:rPr>
+        <w:br/>
+        <w:t>"confiance": 0.91</w:t>
+      </w:r>
+      <w:r>
+        <w:rPr>
+          <w:rFonts w:ascii="Times New Roman" w:eastAsia="Times New Roman" w:hAnsi="Times New Roman" w:cs="Times New Roman"/>
+          <w:color w:val="2F5496" w:themeColor="accent1" w:themeShade="BF"/>
+          <w:kern w:val="0"/>
+          <w:sz w:val="24"/>
+          <w:szCs w:val="24"/>
+          <w:lang w:eastAsia="fr-FR"/>
+          <w14:ligatures w14:val="none"/>
+        </w:rPr>
+        <w:br/>
+        <w:t>}</w:t>
+      </w:r>
+    </w:p>
+    <w:p>
+      <w:pPr>
+        <w:spacing w:after="0" w:line="240" w:lineRule="auto"/>
+        <w:ind w:left="708"/>
+        <w:rPr>
+          <w:rFonts w:ascii="Times New Roman" w:eastAsia="Times New Roman" w:hAnsi="Times New Roman" w:cs="Times New Roman"/>
+          <w:color w:val="2F5496" w:themeColor="accent1" w:themeShade="BF"/>
+          <w:kern w:val="0"/>
+          <w:sz w:val="24"/>
+          <w:szCs w:val="24"/>
+          <w:lang w:eastAsia="fr-FR"/>
+          <w14:ligatures w14:val="none"/>
+        </w:rPr>
+      </w:pPr>
+    </w:p>
+    <w:p>
+      <w:pPr>
+        <w:jc w:val="center"/>
+        <w:rPr>
+          <w:rFonts w:ascii="Times New Roman" w:hAnsi="Times New Roman" w:cs="Times New Roman"/>
+          <w:sz w:val="24"/>
+          <w:szCs w:val="24"/>
+        </w:rPr>
+      </w:pPr>
+      <w:r>
+        <w:rPr>
+          <w:rFonts w:ascii="Times New Roman" w:hAnsi="Times New Roman" w:cs="Times New Roman"/>
+          <w:sz w:val="24"/>
+          <w:szCs w:val="24"/>
+        </w:rPr>
+        <w:drawing>
+          <wp:inline distT="0" distB="0" distL="0" distR="0" wp14:anchorId="38333029" wp14:editId="78CA3D45">
+            <wp:extent cx="5760720" cy="1758315"/>
+            <wp:effectExtent l="0" t="0" r="0" b="0"/>
+            <wp:docPr id="16" name="Image 16"/>
+            <wp:cNvGraphicFramePr>
+              <a:graphicFrameLocks xmlns:a="http://schemas.openxmlformats.org/drawingml/2006/main" noChangeAspect="1"/>
+            </wp:cNvGraphicFramePr>
+            <a:graphic xmlns:a="http://schemas.openxmlformats.org/drawingml/2006/main">
+              <a:graphicData uri="http://schemas.openxmlformats.org/drawingml/2006/picture">
+                <pic:pic xmlns:pic="http://schemas.openxmlformats.org/drawingml/2006/picture">
+                  <pic:nvPicPr>
+                    <pic:cNvPr id="1" name=""/>
+                    <pic:cNvPicPr/>
+                  </pic:nvPicPr>
+                  <pic:blipFill>
+                    <a:blip r:embed="rId19"/>
+                    <a:stretch>
+                      <a:fillRect/>
+                    </a:stretch>
+                  </pic:blipFill>
+                  <pic:spPr>
+                    <a:xfrm>
+                      <a:off x="0" y="0"/>
+                      <a:ext cx="5760720" cy="1758315"/>
+                    </a:xfrm>
+                    <a:prstGeom prst="rect">
+                      <a:avLst/>
+                    </a:prstGeom>
+                  </pic:spPr>
+                </pic:pic>
+              </a:graphicData>
+            </a:graphic>
+          </wp:inline>
+        </w:drawing>
+      </w:r>
+    </w:p>
     <w:sectPr>
-      <w:headerReference w:type="default" r:id="rId19"/>
-      <w:footerReference w:type="default" r:id="rId20"/>
+      <w:headerReference w:type="default" r:id="rId20"/>
+      <w:footerReference w:type="default" r:id="rId21"/>
       <w:pgSz w:w="11906" w:h="16838"/>
       <w:pgMar w:top="1417" w:right="1417" w:bottom="1417" w:left="1417" w:header="708" w:footer="708" w:gutter="0"/>
       <w:pgBorders w:offsetFrom="page">
@@ -4595,6 +5446,155 @@
 <file path=word/numbering.xml><?xml version="1.0" encoding="utf-8"?>
 <w:numbering xmlns:wpc="http://schemas.microsoft.com/office/word/2010/wordprocessingCanvas" xmlns:cx="http://schemas.microsoft.com/office/drawing/2014/chartex" xmlns:cx1="http://schemas.microsoft.com/office/drawing/2015/9/8/chartex" xmlns:cx2="http://schemas.microsoft.com/office/drawing/2015/10/21/chartex" xmlns:cx3="http://schemas.microsoft.com/office/drawing/2016/5/9/chartex" xmlns:cx4="http://schemas.microsoft.com/office/drawing/2016/5/10/chartex" xmlns:cx5="http://schemas.microsoft.com/office/drawing/2016/5/11/chartex" xmlns:cx6="http://schemas.microsoft.com/office/drawing/2016/5/12/chartex" xmlns:cx7="http://schemas.microsoft.com/office/drawing/2016/5/13/chartex" xmlns:cx8="http://schemas.microsoft.com/office/drawing/2016/5/14/chartex" xmlns:mc="http://schemas.openxmlformats.org/markup-compatibility/2006" xmlns:aink="http://schemas.microsoft.com/office/drawing/2016/ink" xmlns:am3d="http://schemas.microsoft.com/office/drawing/2017/model3d" xmlns:o="urn:schemas-microsoft-com:office:office" xmlns:r="http://schemas.openxmlformats.org/officeDocument/2006/relationships" xmlns:m="http://schemas.openxmlformats.org/officeDocument/2006/math" xmlns:v="urn:schemas-microsoft-com:vml" xmlns:wp14="http://schemas.microsoft.com/office/word/2010/wordprocessingDrawing" xmlns:wp="http://schemas.openxmlformats.org/drawingml/2006/wordprocessingDrawing" xmlns:w10="urn:schemas-microsoft-com:office:word" xmlns:w="http://schemas.openxmlformats.org/wordprocessingml/2006/main" xmlns:w14="http://schemas.microsoft.com/office/word/2010/wordml" xmlns:w15="http://schemas.microsoft.com/office/word/2012/wordml" xmlns:w16cex="http://schemas.microsoft.com/office/word/2018/wordml/cex" xmlns:w16cid="http://schemas.microsoft.com/office/word/2016/wordml/cid" xmlns:w16="http://schemas.microsoft.com/office/word/2018/wordml" xmlns:w16sdtdh="http://schemas.microsoft.com/office/word/2020/wordml/sdtdatahash" xmlns:w16se="http://schemas.microsoft.com/office/word/2015/wordml/symex" xmlns:wpg="http://schemas.microsoft.com/office/word/2010/wordprocessingGroup" xmlns:wpi="http://schemas.microsoft.com/office/word/2010/wordprocessingInk" xmlns:wne="http://schemas.microsoft.com/office/word/2006/wordml" xmlns:wps="http://schemas.microsoft.com/office/word/2010/wordprocessingShape" mc:Ignorable="w14 w15 w16se w16cid w16 w16cex w16sdtdh wp14">
   <w:abstractNum w:abstractNumId="0" w15:restartNumberingAfterBreak="0">
+    <w:nsid w:val="16B42315"/>
+    <w:multiLevelType w:val="multilevel"/>
+    <w:tmpl w:val="3CF28954"/>
+    <w:lvl w:ilvl="0">
+      <w:start w:val="1"/>
+      <w:numFmt w:val="bullet"/>
+      <w:lvlText w:val=""/>
+      <w:lvlJc w:val="left"/>
+      <w:pPr>
+        <w:tabs>
+          <w:tab w:val="num" w:pos="1068"/>
+        </w:tabs>
+        <w:ind w:left="1068" w:hanging="360"/>
+      </w:pPr>
+      <w:rPr>
+        <w:rFonts w:ascii="Symbol" w:hAnsi="Symbol" w:hint="default"/>
+        <w:sz w:val="20"/>
+      </w:rPr>
+    </w:lvl>
+    <w:lvl w:ilvl="1" w:tentative="1">
+      <w:start w:val="1"/>
+      <w:numFmt w:val="bullet"/>
+      <w:lvlText w:val="o"/>
+      <w:lvlJc w:val="left"/>
+      <w:pPr>
+        <w:tabs>
+          <w:tab w:val="num" w:pos="1788"/>
+        </w:tabs>
+        <w:ind w:left="1788" w:hanging="360"/>
+      </w:pPr>
+      <w:rPr>
+        <w:rFonts w:ascii="Courier New" w:hAnsi="Courier New" w:hint="default"/>
+        <w:sz w:val="20"/>
+      </w:rPr>
+    </w:lvl>
+    <w:lvl w:ilvl="2" w:tentative="1">
+      <w:start w:val="1"/>
+      <w:numFmt w:val="bullet"/>
+      <w:lvlText w:val=""/>
+      <w:lvlJc w:val="left"/>
+      <w:pPr>
+        <w:tabs>
+          <w:tab w:val="num" w:pos="2508"/>
+        </w:tabs>
+        <w:ind w:left="2508" w:hanging="360"/>
+      </w:pPr>
+      <w:rPr>
+        <w:rFonts w:ascii="Wingdings" w:hAnsi="Wingdings" w:hint="default"/>
+        <w:sz w:val="20"/>
+      </w:rPr>
+    </w:lvl>
+    <w:lvl w:ilvl="3" w:tentative="1">
+      <w:start w:val="1"/>
+      <w:numFmt w:val="bullet"/>
+      <w:lvlText w:val=""/>
+      <w:lvlJc w:val="left"/>
+      <w:pPr>
+        <w:tabs>
+          <w:tab w:val="num" w:pos="3228"/>
+        </w:tabs>
+        <w:ind w:left="3228" w:hanging="360"/>
+      </w:pPr>
+      <w:rPr>
+        <w:rFonts w:ascii="Wingdings" w:hAnsi="Wingdings" w:hint="default"/>
+        <w:sz w:val="20"/>
+      </w:rPr>
+    </w:lvl>
+    <w:lvl w:ilvl="4" w:tentative="1">
+      <w:start w:val="1"/>
+      <w:numFmt w:val="bullet"/>
+      <w:lvlText w:val=""/>
+      <w:lvlJc w:val="left"/>
+      <w:pPr>
+        <w:tabs>
+          <w:tab w:val="num" w:pos="3948"/>
+        </w:tabs>
+        <w:ind w:left="3948" w:hanging="360"/>
+      </w:pPr>
+      <w:rPr>
+        <w:rFonts w:ascii="Wingdings" w:hAnsi="Wingdings" w:hint="default"/>
+        <w:sz w:val="20"/>
+      </w:rPr>
+    </w:lvl>
+    <w:lvl w:ilvl="5" w:tentative="1">
+      <w:start w:val="1"/>
+      <w:numFmt w:val="bullet"/>
+      <w:lvlText w:val=""/>
+      <w:lvlJc w:val="left"/>
+      <w:pPr>
+        <w:tabs>
+          <w:tab w:val="num" w:pos="4668"/>
+        </w:tabs>
+        <w:ind w:left="4668" w:hanging="360"/>
+      </w:pPr>
+      <w:rPr>
+        <w:rFonts w:ascii="Wingdings" w:hAnsi="Wingdings" w:hint="default"/>
+        <w:sz w:val="20"/>
+      </w:rPr>
+    </w:lvl>
+    <w:lvl w:ilvl="6" w:tentative="1">
+      <w:start w:val="1"/>
+      <w:numFmt w:val="bullet"/>
+      <w:lvlText w:val=""/>
+      <w:lvlJc w:val="left"/>
+      <w:pPr>
+        <w:tabs>
+          <w:tab w:val="num" w:pos="5388"/>
+        </w:tabs>
+        <w:ind w:left="5388" w:hanging="360"/>
+      </w:pPr>
+      <w:rPr>
+        <w:rFonts w:ascii="Wingdings" w:hAnsi="Wingdings" w:hint="default"/>
+        <w:sz w:val="20"/>
+      </w:rPr>
+    </w:lvl>
+    <w:lvl w:ilvl="7" w:tentative="1">
+      <w:start w:val="1"/>
+      <w:numFmt w:val="bullet"/>
+      <w:lvlText w:val=""/>
+      <w:lvlJc w:val="left"/>
+      <w:pPr>
+        <w:tabs>
+          <w:tab w:val="num" w:pos="6108"/>
+        </w:tabs>
+        <w:ind w:left="6108" w:hanging="360"/>
+      </w:pPr>
+      <w:rPr>
+        <w:rFonts w:ascii="Wingdings" w:hAnsi="Wingdings" w:hint="default"/>
+        <w:sz w:val="20"/>
+      </w:rPr>
+    </w:lvl>
+    <w:lvl w:ilvl="8" w:tentative="1">
+      <w:start w:val="1"/>
+      <w:numFmt w:val="bullet"/>
+      <w:lvlText w:val=""/>
+      <w:lvlJc w:val="left"/>
+      <w:pPr>
+        <w:tabs>
+          <w:tab w:val="num" w:pos="6828"/>
+        </w:tabs>
+        <w:ind w:left="6828" w:hanging="360"/>
+      </w:pPr>
+      <w:rPr>
+        <w:rFonts w:ascii="Wingdings" w:hAnsi="Wingdings" w:hint="default"/>
+        <w:sz w:val="20"/>
+      </w:rPr>
+    </w:lvl>
+  </w:abstractNum>
+  <w:abstractNum w:abstractNumId="1" w15:restartNumberingAfterBreak="0">
     <w:nsid w:val="23FA75D2"/>
     <w:multiLevelType w:val="multilevel"/>
     <w:tmpl w:val="7B086CF2"/>
@@ -4707,7 +5707,7 @@
       </w:pPr>
     </w:lvl>
   </w:abstractNum>
-  <w:abstractNum w:abstractNumId="1" w15:restartNumberingAfterBreak="0">
+  <w:abstractNum w:abstractNumId="2" w15:restartNumberingAfterBreak="0">
     <w:nsid w:val="30817C99"/>
     <w:multiLevelType w:val="hybridMultilevel"/>
     <w:tmpl w:val="B28054F4"/>
@@ -4793,7 +5793,7 @@
       </w:pPr>
     </w:lvl>
   </w:abstractNum>
-  <w:abstractNum w:abstractNumId="2" w15:restartNumberingAfterBreak="0">
+  <w:abstractNum w:abstractNumId="3" w15:restartNumberingAfterBreak="0">
     <w:nsid w:val="32024712"/>
     <w:multiLevelType w:val="multilevel"/>
     <w:tmpl w:val="7716EFCE"/>
@@ -4942,7 +5942,7 @@
       </w:rPr>
     </w:lvl>
   </w:abstractNum>
-  <w:abstractNum w:abstractNumId="3" w15:restartNumberingAfterBreak="0">
+  <w:abstractNum w:abstractNumId="4" w15:restartNumberingAfterBreak="0">
     <w:nsid w:val="3CA24848"/>
     <w:multiLevelType w:val="hybridMultilevel"/>
     <w:tmpl w:val="76B802A4"/>
@@ -5055,7 +6055,7 @@
       </w:rPr>
     </w:lvl>
   </w:abstractNum>
-  <w:abstractNum w:abstractNumId="4" w15:restartNumberingAfterBreak="0">
+  <w:abstractNum w:abstractNumId="5" w15:restartNumberingAfterBreak="0">
     <w:nsid w:val="56D568C8"/>
     <w:multiLevelType w:val="multilevel"/>
     <w:tmpl w:val="3392CAD2"/>
@@ -5204,7 +6204,7 @@
       </w:rPr>
     </w:lvl>
   </w:abstractNum>
-  <w:abstractNum w:abstractNumId="5" w15:restartNumberingAfterBreak="0">
+  <w:abstractNum w:abstractNumId="6" w15:restartNumberingAfterBreak="0">
     <w:nsid w:val="61053792"/>
     <w:multiLevelType w:val="multilevel"/>
     <w:tmpl w:val="49E43BFC"/>
@@ -5353,7 +6353,7 @@
       </w:rPr>
     </w:lvl>
   </w:abstractNum>
-  <w:abstractNum w:abstractNumId="6" w15:restartNumberingAfterBreak="0">
+  <w:abstractNum w:abstractNumId="7" w15:restartNumberingAfterBreak="0">
     <w:nsid w:val="6DA36487"/>
     <w:multiLevelType w:val="multilevel"/>
     <w:tmpl w:val="9C4C8532"/>
@@ -5502,7 +6502,7 @@
       </w:rPr>
     </w:lvl>
   </w:abstractNum>
-  <w:abstractNum w:abstractNumId="7" w15:restartNumberingAfterBreak="0">
+  <w:abstractNum w:abstractNumId="8" w15:restartNumberingAfterBreak="0">
     <w:nsid w:val="6EB85EAA"/>
     <w:multiLevelType w:val="hybridMultilevel"/>
     <w:tmpl w:val="DB76C824"/>
@@ -5616,28 +6616,31 @@
     </w:lvl>
   </w:abstractNum>
   <w:num w:numId="1">
+    <w:abstractNumId w:val="8"/>
+  </w:num>
+  <w:num w:numId="2">
+    <w:abstractNumId w:val="4"/>
+  </w:num>
+  <w:num w:numId="3">
+    <w:abstractNumId w:val="5"/>
+  </w:num>
+  <w:num w:numId="4">
+    <w:abstractNumId w:val="3"/>
+  </w:num>
+  <w:num w:numId="5">
+    <w:abstractNumId w:val="2"/>
+  </w:num>
+  <w:num w:numId="6">
+    <w:abstractNumId w:val="6"/>
+  </w:num>
+  <w:num w:numId="7">
+    <w:abstractNumId w:val="1"/>
+  </w:num>
+  <w:num w:numId="8">
     <w:abstractNumId w:val="7"/>
   </w:num>
-  <w:num w:numId="2">
-    <w:abstractNumId w:val="3"/>
-  </w:num>
-  <w:num w:numId="3">
-    <w:abstractNumId w:val="4"/>
-  </w:num>
-  <w:num w:numId="4">
-    <w:abstractNumId w:val="2"/>
-  </w:num>
-  <w:num w:numId="5">
-    <w:abstractNumId w:val="1"/>
-  </w:num>
-  <w:num w:numId="6">
-    <w:abstractNumId w:val="5"/>
-  </w:num>
-  <w:num w:numId="7">
+  <w:num w:numId="9">
     <w:abstractNumId w:val="0"/>
-  </w:num>
-  <w:num w:numId="8">
-    <w:abstractNumId w:val="6"/>
   </w:num>
 </w:numbering>
 </file>
@@ -6126,7 +7129,6 @@
     <w:name w:val="Normal (Web)"/>
     <w:basedOn w:val="Normal"/>
     <w:uiPriority w:val="99"/>
-    <w:semiHidden/>
     <w:unhideWhenUsed/>
     <w:rsid w:val="00D21DB8"/>
     <w:pPr>
@@ -6183,6 +7185,19 @@
     <w:name w:val="text-token-text-primary"/>
     <w:basedOn w:val="Policepardfaut"/>
     <w:rsid w:val="00485279"/>
+  </w:style>
+  <w:style w:type="character" w:styleId="CodeHTML">
+    <w:name w:val="HTML Code"/>
+    <w:basedOn w:val="Policepardfaut"/>
+    <w:uiPriority w:val="99"/>
+    <w:semiHidden/>
+    <w:unhideWhenUsed/>
+    <w:rsid w:val="00FF6971"/>
+    <w:rPr>
+      <w:rFonts w:ascii="Courier New" w:eastAsia="Times New Roman" w:hAnsi="Courier New" w:cs="Courier New"/>
+      <w:sz w:val="20"/>
+      <w:szCs w:val="20"/>
+    </w:rPr>
   </w:style>
 </w:styles>
 </file>

</xml_diff>

<commit_message>
Ajouter une validation en définissant les règles de sortie
</commit_message>
<xml_diff>
--- a/Atelier Prompt.docx
+++ b/Atelier Prompt.docx
@@ -5099,9 +5099,639 @@
         </w:drawing>
       </w:r>
     </w:p>
+    <w:p>
+      <w:pPr>
+        <w:rPr>
+          <w:rFonts w:ascii="Times New Roman" w:hAnsi="Times New Roman" w:cs="Times New Roman"/>
+          <w:sz w:val="24"/>
+          <w:szCs w:val="24"/>
+        </w:rPr>
+      </w:pPr>
+    </w:p>
+    <w:p>
+      <w:pPr>
+        <w:autoSpaceDE w:val="0"/>
+        <w:autoSpaceDN w:val="0"/>
+        <w:adjustRightInd w:val="0"/>
+        <w:spacing w:after="0" w:line="240" w:lineRule="auto"/>
+        <w:jc w:val="both"/>
+        <w:rPr>
+          <w:rFonts w:ascii="Times New Roman" w:hAnsi="Times New Roman" w:cs="Times New Roman"/>
+          <w:kern w:val="0"/>
+          <w:sz w:val="24"/>
+          <w:szCs w:val="24"/>
+        </w:rPr>
+      </w:pPr>
+      <w:r>
+        <w:rPr>
+          <w:rFonts w:ascii="Times New Roman" w:hAnsi="Times New Roman" w:cs="Times New Roman"/>
+          <w:kern w:val="0"/>
+          <w:sz w:val="24"/>
+          <w:szCs w:val="24"/>
+        </w:rPr>
+        <w:t>2) Ajouter une validation en définissant les règles de sortie suivantes : format JSON valide ;</w:t>
+      </w:r>
+    </w:p>
+    <w:p>
+      <w:pPr>
+        <w:autoSpaceDE w:val="0"/>
+        <w:autoSpaceDN w:val="0"/>
+        <w:adjustRightInd w:val="0"/>
+        <w:spacing w:after="0" w:line="240" w:lineRule="auto"/>
+        <w:jc w:val="both"/>
+        <w:rPr>
+          <w:rFonts w:ascii="Times New Roman" w:hAnsi="Times New Roman" w:cs="Times New Roman"/>
+          <w:kern w:val="0"/>
+          <w:sz w:val="24"/>
+          <w:szCs w:val="24"/>
+        </w:rPr>
+      </w:pPr>
+      <w:r>
+        <w:rPr>
+          <w:rFonts w:ascii="Times New Roman" w:hAnsi="Times New Roman" w:cs="Times New Roman"/>
+          <w:kern w:val="0"/>
+          <w:sz w:val="24"/>
+          <w:szCs w:val="24"/>
+        </w:rPr>
+        <w:t>aucune propriété supplémentaire ; sentiment vaut positif, negatif ou neutre ; confiance est</w:t>
+      </w:r>
+    </w:p>
+    <w:p>
+      <w:pPr>
+        <w:spacing w:after="0" w:line="240" w:lineRule="auto"/>
+        <w:jc w:val="both"/>
+        <w:rPr>
+          <w:rFonts w:ascii="Times New Roman" w:eastAsia="Times New Roman" w:hAnsi="Times New Roman" w:cs="Times New Roman"/>
+          <w:color w:val="2F5496" w:themeColor="accent1" w:themeShade="BF"/>
+          <w:kern w:val="0"/>
+          <w:sz w:val="24"/>
+          <w:szCs w:val="24"/>
+          <w:lang w:eastAsia="fr-FR"/>
+          <w14:ligatures w14:val="none"/>
+        </w:rPr>
+      </w:pPr>
+      <w:r>
+        <w:rPr>
+          <w:rFonts w:ascii="Times New Roman" w:hAnsi="Times New Roman" w:cs="Times New Roman"/>
+          <w:kern w:val="0"/>
+          <w:sz w:val="24"/>
+          <w:szCs w:val="24"/>
+        </w:rPr>
+        <w:t>compris entre 0 et 1 ; urgence vaut faible, moyenne ou élevée.</w:t>
+      </w:r>
+    </w:p>
+    <w:p>
+      <w:pPr>
+        <w:spacing w:after="0" w:line="240" w:lineRule="auto"/>
+        <w:ind w:left="708"/>
+        <w:rPr>
+          <w:rFonts w:ascii="Times New Roman" w:eastAsia="Times New Roman" w:hAnsi="Times New Roman" w:cs="Times New Roman"/>
+          <w:color w:val="2F5496" w:themeColor="accent1" w:themeShade="BF"/>
+          <w:kern w:val="0"/>
+          <w:sz w:val="24"/>
+          <w:szCs w:val="24"/>
+          <w:lang w:eastAsia="fr-FR"/>
+          <w14:ligatures w14:val="none"/>
+        </w:rPr>
+      </w:pPr>
+    </w:p>
+    <w:p>
+      <w:pPr>
+        <w:spacing w:after="0" w:line="240" w:lineRule="auto"/>
+        <w:ind w:left="708"/>
+        <w:rPr>
+          <w:rFonts w:ascii="Times New Roman" w:eastAsia="Times New Roman" w:hAnsi="Times New Roman" w:cs="Times New Roman"/>
+          <w:color w:val="2F5496" w:themeColor="accent1" w:themeShade="BF"/>
+          <w:kern w:val="0"/>
+          <w:sz w:val="24"/>
+          <w:szCs w:val="24"/>
+          <w:lang w:eastAsia="fr-FR"/>
+          <w14:ligatures w14:val="none"/>
+        </w:rPr>
+      </w:pPr>
+      <w:r>
+        <w:rPr>
+          <w:rFonts w:ascii="Times New Roman" w:eastAsia="Times New Roman" w:hAnsi="Times New Roman" w:cs="Times New Roman"/>
+          <w:color w:val="2F5496" w:themeColor="accent1" w:themeShade="BF"/>
+          <w:kern w:val="0"/>
+          <w:sz w:val="24"/>
+          <w:szCs w:val="24"/>
+          <w:lang w:eastAsia="fr-FR"/>
+          <w14:ligatures w14:val="none"/>
+        </w:rPr>
+        <w:t>Vérifie que la réponse JSON produite respecte toutes les règles de sortie suivantes :</w:t>
+      </w:r>
+    </w:p>
+    <w:p>
+      <w:pPr>
+        <w:numPr>
+          <w:ilvl w:val="0"/>
+          <w:numId w:val="10"/>
+        </w:numPr>
+        <w:tabs>
+          <w:tab w:val="clear" w:pos="720"/>
+          <w:tab w:val="num" w:pos="1428"/>
+        </w:tabs>
+        <w:spacing w:after="0" w:line="240" w:lineRule="auto"/>
+        <w:ind w:left="1428"/>
+        <w:rPr>
+          <w:rFonts w:ascii="Times New Roman" w:eastAsia="Times New Roman" w:hAnsi="Times New Roman" w:cs="Times New Roman"/>
+          <w:color w:val="2F5496" w:themeColor="accent1" w:themeShade="BF"/>
+          <w:kern w:val="0"/>
+          <w:sz w:val="24"/>
+          <w:szCs w:val="24"/>
+          <w:lang w:eastAsia="fr-FR"/>
+          <w14:ligatures w14:val="none"/>
+        </w:rPr>
+      </w:pPr>
+      <w:r>
+        <w:rPr>
+          <w:rFonts w:ascii="Times New Roman" w:eastAsia="Times New Roman" w:hAnsi="Times New Roman" w:cs="Times New Roman"/>
+          <w:color w:val="2F5496" w:themeColor="accent1" w:themeShade="BF"/>
+          <w:kern w:val="0"/>
+          <w:sz w:val="24"/>
+          <w:szCs w:val="24"/>
+          <w:lang w:eastAsia="fr-FR"/>
+          <w14:ligatures w14:val="none"/>
+        </w:rPr>
+        <w:t>La réponse doit être au format JSON valide.</w:t>
+      </w:r>
+    </w:p>
+    <w:p>
+      <w:pPr>
+        <w:numPr>
+          <w:ilvl w:val="0"/>
+          <w:numId w:val="10"/>
+        </w:numPr>
+        <w:tabs>
+          <w:tab w:val="clear" w:pos="720"/>
+          <w:tab w:val="num" w:pos="1428"/>
+        </w:tabs>
+        <w:spacing w:after="0" w:line="240" w:lineRule="auto"/>
+        <w:ind w:left="1428"/>
+        <w:rPr>
+          <w:rFonts w:ascii="Times New Roman" w:eastAsia="Times New Roman" w:hAnsi="Times New Roman" w:cs="Times New Roman"/>
+          <w:color w:val="2F5496" w:themeColor="accent1" w:themeShade="BF"/>
+          <w:kern w:val="0"/>
+          <w:sz w:val="24"/>
+          <w:szCs w:val="24"/>
+          <w:lang w:eastAsia="fr-FR"/>
+          <w14:ligatures w14:val="none"/>
+        </w:rPr>
+      </w:pPr>
+      <w:r>
+        <w:rPr>
+          <w:rFonts w:ascii="Times New Roman" w:eastAsia="Times New Roman" w:hAnsi="Times New Roman" w:cs="Times New Roman"/>
+          <w:color w:val="2F5496" w:themeColor="accent1" w:themeShade="BF"/>
+          <w:kern w:val="0"/>
+          <w:sz w:val="24"/>
+          <w:szCs w:val="24"/>
+          <w:lang w:eastAsia="fr-FR"/>
+          <w14:ligatures w14:val="none"/>
+        </w:rPr>
+        <w:t>Le JSON doit contenir uniquement les cinq propriétés suivantes :sentiment</w:t>
+      </w:r>
+      <w:r>
+        <w:rPr>
+          <w:rFonts w:ascii="Times New Roman" w:eastAsia="Times New Roman" w:hAnsi="Times New Roman" w:cs="Times New Roman"/>
+          <w:color w:val="2F5496" w:themeColor="accent1" w:themeShade="BF"/>
+          <w:kern w:val="0"/>
+          <w:sz w:val="24"/>
+          <w:szCs w:val="24"/>
+          <w:lang w:eastAsia="fr-FR"/>
+          <w14:ligatures w14:val="none"/>
+        </w:rPr>
+        <w:t xml:space="preserve">, </w:t>
+      </w:r>
+      <w:r>
+        <w:rPr>
+          <w:rFonts w:ascii="Times New Roman" w:eastAsia="Times New Roman" w:hAnsi="Times New Roman" w:cs="Times New Roman"/>
+          <w:color w:val="2F5496" w:themeColor="accent1" w:themeShade="BF"/>
+          <w:kern w:val="0"/>
+          <w:sz w:val="24"/>
+          <w:szCs w:val="24"/>
+          <w:lang w:eastAsia="fr-FR"/>
+          <w14:ligatures w14:val="none"/>
+        </w:rPr>
+        <w:t>categorie</w:t>
+      </w:r>
+      <w:r>
+        <w:rPr>
+          <w:rFonts w:ascii="Times New Roman" w:eastAsia="Times New Roman" w:hAnsi="Times New Roman" w:cs="Times New Roman"/>
+          <w:color w:val="2F5496" w:themeColor="accent1" w:themeShade="BF"/>
+          <w:kern w:val="0"/>
+          <w:sz w:val="24"/>
+          <w:szCs w:val="24"/>
+          <w:lang w:eastAsia="fr-FR"/>
+          <w14:ligatures w14:val="none"/>
+        </w:rPr>
+        <w:t xml:space="preserve">, </w:t>
+      </w:r>
+      <w:r>
+        <w:rPr>
+          <w:rFonts w:ascii="Times New Roman" w:eastAsia="Times New Roman" w:hAnsi="Times New Roman" w:cs="Times New Roman"/>
+          <w:color w:val="2F5496" w:themeColor="accent1" w:themeShade="BF"/>
+          <w:kern w:val="0"/>
+          <w:sz w:val="24"/>
+          <w:szCs w:val="24"/>
+          <w:lang w:eastAsia="fr-FR"/>
+          <w14:ligatures w14:val="none"/>
+        </w:rPr>
+        <w:t>urgence</w:t>
+      </w:r>
+      <w:r>
+        <w:rPr>
+          <w:rFonts w:ascii="Times New Roman" w:eastAsia="Times New Roman" w:hAnsi="Times New Roman" w:cs="Times New Roman"/>
+          <w:color w:val="2F5496" w:themeColor="accent1" w:themeShade="BF"/>
+          <w:kern w:val="0"/>
+          <w:sz w:val="24"/>
+          <w:szCs w:val="24"/>
+          <w:lang w:eastAsia="fr-FR"/>
+          <w14:ligatures w14:val="none"/>
+        </w:rPr>
+        <w:t xml:space="preserve">, </w:t>
+      </w:r>
+      <w:r>
+        <w:rPr>
+          <w:rFonts w:ascii="Times New Roman" w:eastAsia="Times New Roman" w:hAnsi="Times New Roman" w:cs="Times New Roman"/>
+          <w:color w:val="2F5496" w:themeColor="accent1" w:themeShade="BF"/>
+          <w:kern w:val="0"/>
+          <w:sz w:val="24"/>
+          <w:szCs w:val="24"/>
+          <w:lang w:eastAsia="fr-FR"/>
+          <w14:ligatures w14:val="none"/>
+        </w:rPr>
+        <w:t>probleme</w:t>
+      </w:r>
+      <w:r>
+        <w:rPr>
+          <w:rFonts w:ascii="Times New Roman" w:eastAsia="Times New Roman" w:hAnsi="Times New Roman" w:cs="Times New Roman"/>
+          <w:color w:val="2F5496" w:themeColor="accent1" w:themeShade="BF"/>
+          <w:kern w:val="0"/>
+          <w:sz w:val="24"/>
+          <w:szCs w:val="24"/>
+          <w:lang w:eastAsia="fr-FR"/>
+          <w14:ligatures w14:val="none"/>
+        </w:rPr>
+        <w:t xml:space="preserve"> et </w:t>
+      </w:r>
+      <w:r>
+        <w:rPr>
+          <w:rFonts w:ascii="Times New Roman" w:eastAsia="Times New Roman" w:hAnsi="Times New Roman" w:cs="Times New Roman"/>
+          <w:color w:val="2F5496" w:themeColor="accent1" w:themeShade="BF"/>
+          <w:kern w:val="0"/>
+          <w:sz w:val="24"/>
+          <w:szCs w:val="24"/>
+          <w:lang w:eastAsia="fr-FR"/>
+          <w14:ligatures w14:val="none"/>
+        </w:rPr>
+        <w:t>confiance</w:t>
+      </w:r>
+    </w:p>
+    <w:p>
+      <w:pPr>
+        <w:numPr>
+          <w:ilvl w:val="0"/>
+          <w:numId w:val="10"/>
+        </w:numPr>
+        <w:tabs>
+          <w:tab w:val="clear" w:pos="720"/>
+          <w:tab w:val="num" w:pos="1428"/>
+        </w:tabs>
+        <w:spacing w:after="0" w:line="240" w:lineRule="auto"/>
+        <w:ind w:left="1428"/>
+        <w:rPr>
+          <w:rFonts w:ascii="Times New Roman" w:eastAsia="Times New Roman" w:hAnsi="Times New Roman" w:cs="Times New Roman"/>
+          <w:color w:val="2F5496" w:themeColor="accent1" w:themeShade="BF"/>
+          <w:kern w:val="0"/>
+          <w:sz w:val="24"/>
+          <w:szCs w:val="24"/>
+          <w:lang w:eastAsia="fr-FR"/>
+          <w14:ligatures w14:val="none"/>
+        </w:rPr>
+      </w:pPr>
+      <w:r>
+        <w:rPr>
+          <w:rFonts w:ascii="Times New Roman" w:eastAsia="Times New Roman" w:hAnsi="Times New Roman" w:cs="Times New Roman"/>
+          <w:color w:val="2F5496" w:themeColor="accent1" w:themeShade="BF"/>
+          <w:kern w:val="0"/>
+          <w:sz w:val="24"/>
+          <w:szCs w:val="24"/>
+          <w:lang w:eastAsia="fr-FR"/>
+          <w14:ligatures w14:val="none"/>
+        </w:rPr>
+        <w:t>Aucune propriété supplémentaire ne doit être ajoutée.</w:t>
+      </w:r>
+    </w:p>
+    <w:p>
+      <w:pPr>
+        <w:numPr>
+          <w:ilvl w:val="0"/>
+          <w:numId w:val="10"/>
+        </w:numPr>
+        <w:tabs>
+          <w:tab w:val="clear" w:pos="720"/>
+          <w:tab w:val="num" w:pos="1428"/>
+        </w:tabs>
+        <w:spacing w:after="0" w:line="240" w:lineRule="auto"/>
+        <w:ind w:left="1428"/>
+        <w:rPr>
+          <w:rFonts w:ascii="Times New Roman" w:eastAsia="Times New Roman" w:hAnsi="Times New Roman" w:cs="Times New Roman"/>
+          <w:color w:val="2F5496" w:themeColor="accent1" w:themeShade="BF"/>
+          <w:kern w:val="0"/>
+          <w:sz w:val="24"/>
+          <w:szCs w:val="24"/>
+          <w:lang w:eastAsia="fr-FR"/>
+          <w14:ligatures w14:val="none"/>
+        </w:rPr>
+      </w:pPr>
+      <w:r>
+        <w:rPr>
+          <w:rFonts w:ascii="Times New Roman" w:eastAsia="Times New Roman" w:hAnsi="Times New Roman" w:cs="Times New Roman"/>
+          <w:color w:val="2F5496" w:themeColor="accent1" w:themeShade="BF"/>
+          <w:kern w:val="0"/>
+          <w:sz w:val="24"/>
+          <w:szCs w:val="24"/>
+          <w:lang w:eastAsia="fr-FR"/>
+          <w14:ligatures w14:val="none"/>
+        </w:rPr>
+        <w:t>La valeur de sentiment doit être exactement l'une des suivantes : positif, negatif ou neutre.</w:t>
+      </w:r>
+    </w:p>
+    <w:p>
+      <w:pPr>
+        <w:numPr>
+          <w:ilvl w:val="0"/>
+          <w:numId w:val="10"/>
+        </w:numPr>
+        <w:tabs>
+          <w:tab w:val="clear" w:pos="720"/>
+          <w:tab w:val="num" w:pos="1428"/>
+        </w:tabs>
+        <w:spacing w:after="0" w:line="240" w:lineRule="auto"/>
+        <w:ind w:left="1428"/>
+        <w:rPr>
+          <w:rFonts w:ascii="Times New Roman" w:eastAsia="Times New Roman" w:hAnsi="Times New Roman" w:cs="Times New Roman"/>
+          <w:color w:val="2F5496" w:themeColor="accent1" w:themeShade="BF"/>
+          <w:kern w:val="0"/>
+          <w:sz w:val="24"/>
+          <w:szCs w:val="24"/>
+          <w:lang w:eastAsia="fr-FR"/>
+          <w14:ligatures w14:val="none"/>
+        </w:rPr>
+      </w:pPr>
+      <w:r>
+        <w:rPr>
+          <w:rFonts w:ascii="Times New Roman" w:eastAsia="Times New Roman" w:hAnsi="Times New Roman" w:cs="Times New Roman"/>
+          <w:color w:val="2F5496" w:themeColor="accent1" w:themeShade="BF"/>
+          <w:kern w:val="0"/>
+          <w:sz w:val="24"/>
+          <w:szCs w:val="24"/>
+          <w:lang w:eastAsia="fr-FR"/>
+          <w14:ligatures w14:val="none"/>
+        </w:rPr>
+        <w:t>La valeur de urgence doit être exactement l'une des suivantes : faible, moyenne ou élevée.</w:t>
+      </w:r>
+    </w:p>
+    <w:p>
+      <w:pPr>
+        <w:numPr>
+          <w:ilvl w:val="0"/>
+          <w:numId w:val="10"/>
+        </w:numPr>
+        <w:tabs>
+          <w:tab w:val="clear" w:pos="720"/>
+          <w:tab w:val="num" w:pos="1428"/>
+        </w:tabs>
+        <w:spacing w:after="0" w:line="240" w:lineRule="auto"/>
+        <w:ind w:left="1428"/>
+        <w:rPr>
+          <w:rFonts w:ascii="Times New Roman" w:eastAsia="Times New Roman" w:hAnsi="Times New Roman" w:cs="Times New Roman"/>
+          <w:color w:val="2F5496" w:themeColor="accent1" w:themeShade="BF"/>
+          <w:kern w:val="0"/>
+          <w:sz w:val="24"/>
+          <w:szCs w:val="24"/>
+          <w:lang w:eastAsia="fr-FR"/>
+          <w14:ligatures w14:val="none"/>
+        </w:rPr>
+      </w:pPr>
+      <w:r>
+        <w:rPr>
+          <w:rFonts w:ascii="Times New Roman" w:eastAsia="Times New Roman" w:hAnsi="Times New Roman" w:cs="Times New Roman"/>
+          <w:color w:val="2F5496" w:themeColor="accent1" w:themeShade="BF"/>
+          <w:kern w:val="0"/>
+          <w:sz w:val="24"/>
+          <w:szCs w:val="24"/>
+          <w:lang w:eastAsia="fr-FR"/>
+          <w14:ligatures w14:val="none"/>
+        </w:rPr>
+        <w:t>La valeur de confiance doit être un nombre compris entre 0 et 1 inclus.</w:t>
+      </w:r>
+    </w:p>
+    <w:p>
+      <w:pPr>
+        <w:numPr>
+          <w:ilvl w:val="0"/>
+          <w:numId w:val="10"/>
+        </w:numPr>
+        <w:tabs>
+          <w:tab w:val="clear" w:pos="720"/>
+          <w:tab w:val="num" w:pos="1428"/>
+        </w:tabs>
+        <w:spacing w:after="0" w:line="240" w:lineRule="auto"/>
+        <w:ind w:left="1428"/>
+        <w:rPr>
+          <w:rFonts w:ascii="Times New Roman" w:eastAsia="Times New Roman" w:hAnsi="Times New Roman" w:cs="Times New Roman"/>
+          <w:color w:val="2F5496" w:themeColor="accent1" w:themeShade="BF"/>
+          <w:kern w:val="0"/>
+          <w:sz w:val="24"/>
+          <w:szCs w:val="24"/>
+          <w:lang w:eastAsia="fr-FR"/>
+          <w14:ligatures w14:val="none"/>
+        </w:rPr>
+      </w:pPr>
+      <w:r>
+        <w:rPr>
+          <w:rFonts w:ascii="Times New Roman" w:eastAsia="Times New Roman" w:hAnsi="Times New Roman" w:cs="Times New Roman"/>
+          <w:color w:val="2F5496" w:themeColor="accent1" w:themeShade="BF"/>
+          <w:kern w:val="0"/>
+          <w:sz w:val="24"/>
+          <w:szCs w:val="24"/>
+          <w:lang w:eastAsia="fr-FR"/>
+          <w14:ligatures w14:val="none"/>
+        </w:rPr>
+        <w:t>categorie et probleme doivent être des chaînes de caractères.</w:t>
+      </w:r>
+    </w:p>
+    <w:p>
+      <w:pPr>
+        <w:spacing w:after="0" w:line="240" w:lineRule="auto"/>
+        <w:ind w:left="708"/>
+        <w:rPr>
+          <w:rFonts w:ascii="Times New Roman" w:eastAsia="Times New Roman" w:hAnsi="Times New Roman" w:cs="Times New Roman"/>
+          <w:color w:val="2F5496" w:themeColor="accent1" w:themeShade="BF"/>
+          <w:kern w:val="0"/>
+          <w:sz w:val="24"/>
+          <w:szCs w:val="24"/>
+          <w:lang w:eastAsia="fr-FR"/>
+          <w14:ligatures w14:val="none"/>
+        </w:rPr>
+      </w:pPr>
+      <w:r>
+        <w:rPr>
+          <w:rFonts w:ascii="Times New Roman" w:eastAsia="Times New Roman" w:hAnsi="Times New Roman" w:cs="Times New Roman"/>
+          <w:color w:val="2F5496" w:themeColor="accent1" w:themeShade="BF"/>
+          <w:kern w:val="0"/>
+          <w:sz w:val="24"/>
+          <w:szCs w:val="24"/>
+          <w:lang w:eastAsia="fr-FR"/>
+          <w14:ligatures w14:val="none"/>
+        </w:rPr>
+        <w:t>Si toutes les règles sont respectées, indique que le JSON est valide.</w:t>
+      </w:r>
+    </w:p>
+    <w:p>
+      <w:pPr>
+        <w:spacing w:after="0" w:line="240" w:lineRule="auto"/>
+        <w:ind w:left="708"/>
+        <w:rPr>
+          <w:rFonts w:ascii="Times New Roman" w:eastAsia="Times New Roman" w:hAnsi="Times New Roman" w:cs="Times New Roman"/>
+          <w:color w:val="2F5496" w:themeColor="accent1" w:themeShade="BF"/>
+          <w:kern w:val="0"/>
+          <w:sz w:val="24"/>
+          <w:szCs w:val="24"/>
+          <w:lang w:eastAsia="fr-FR"/>
+          <w14:ligatures w14:val="none"/>
+        </w:rPr>
+      </w:pPr>
+      <w:r>
+        <w:rPr>
+          <w:rFonts w:ascii="Times New Roman" w:eastAsia="Times New Roman" w:hAnsi="Times New Roman" w:cs="Times New Roman"/>
+          <w:color w:val="2F5496" w:themeColor="accent1" w:themeShade="BF"/>
+          <w:kern w:val="0"/>
+          <w:sz w:val="24"/>
+          <w:szCs w:val="24"/>
+          <w:lang w:eastAsia="fr-FR"/>
+          <w14:ligatures w14:val="none"/>
+        </w:rPr>
+        <w:t>Si une règle n'est pas respectée, indique précisément l'erreur détectée et propose une version corrigée du JSON.</w:t>
+      </w:r>
+    </w:p>
+    <w:p>
+      <w:pPr>
+        <w:spacing w:after="0" w:line="240" w:lineRule="auto"/>
+        <w:ind w:left="708"/>
+        <w:rPr>
+          <w:rFonts w:ascii="Times New Roman" w:eastAsia="Times New Roman" w:hAnsi="Times New Roman" w:cs="Times New Roman"/>
+          <w:color w:val="2F5496" w:themeColor="accent1" w:themeShade="BF"/>
+          <w:kern w:val="0"/>
+          <w:sz w:val="24"/>
+          <w:szCs w:val="24"/>
+          <w:lang w:eastAsia="fr-FR"/>
+          <w14:ligatures w14:val="none"/>
+        </w:rPr>
+      </w:pPr>
+      <w:r>
+        <w:rPr>
+          <w:rFonts w:ascii="Times New Roman" w:eastAsia="Times New Roman" w:hAnsi="Times New Roman" w:cs="Times New Roman"/>
+          <w:color w:val="2F5496" w:themeColor="accent1" w:themeShade="BF"/>
+          <w:kern w:val="0"/>
+          <w:sz w:val="24"/>
+          <w:szCs w:val="24"/>
+          <w:lang w:eastAsia="fr-FR"/>
+          <w14:ligatures w14:val="none"/>
+        </w:rPr>
+        <w:t>Ne modifie pas les informations correctes déjà présentes.</w:t>
+      </w:r>
+    </w:p>
+    <w:p>
+      <w:pPr>
+        <w:spacing w:after="0" w:line="240" w:lineRule="auto"/>
+        <w:ind w:left="708"/>
+        <w:rPr>
+          <w:rFonts w:ascii="Times New Roman" w:eastAsia="Times New Roman" w:hAnsi="Times New Roman" w:cs="Times New Roman"/>
+          <w:color w:val="2F5496" w:themeColor="accent1" w:themeShade="BF"/>
+          <w:kern w:val="0"/>
+          <w:sz w:val="24"/>
+          <w:szCs w:val="24"/>
+          <w:lang w:eastAsia="fr-FR"/>
+          <w14:ligatures w14:val="none"/>
+        </w:rPr>
+      </w:pPr>
+    </w:p>
+    <w:p>
+      <w:pPr>
+        <w:spacing w:after="0" w:line="240" w:lineRule="auto"/>
+        <w:ind w:left="708"/>
+        <w:rPr>
+          <w:rFonts w:ascii="Times New Roman" w:eastAsia="Times New Roman" w:hAnsi="Times New Roman" w:cs="Times New Roman"/>
+          <w:color w:val="2F5496" w:themeColor="accent1" w:themeShade="BF"/>
+          <w:kern w:val="0"/>
+          <w:sz w:val="24"/>
+          <w:szCs w:val="24"/>
+          <w:lang w:eastAsia="fr-FR"/>
+          <w14:ligatures w14:val="none"/>
+        </w:rPr>
+      </w:pPr>
+      <w:r>
+        <w:rPr>
+          <w:rFonts w:ascii="Times New Roman" w:eastAsia="Times New Roman" w:hAnsi="Times New Roman" w:cs="Times New Roman"/>
+          <w:color w:val="2F5496" w:themeColor="accent1" w:themeShade="BF"/>
+          <w:kern w:val="0"/>
+          <w:sz w:val="24"/>
+          <w:szCs w:val="24"/>
+          <w:lang w:eastAsia="fr-FR"/>
+          <w14:ligatures w14:val="none"/>
+        </w:rPr>
+        <w:drawing>
+          <wp:inline distT="0" distB="0" distL="0" distR="0" wp14:anchorId="213957DC" wp14:editId="5C25291A">
+            <wp:extent cx="5238750" cy="2317115"/>
+            <wp:effectExtent l="0" t="0" r="0" b="6985"/>
+            <wp:docPr id="17" name="Image 17"/>
+            <wp:cNvGraphicFramePr>
+              <a:graphicFrameLocks xmlns:a="http://schemas.openxmlformats.org/drawingml/2006/main" noChangeAspect="1"/>
+            </wp:cNvGraphicFramePr>
+            <a:graphic xmlns:a="http://schemas.openxmlformats.org/drawingml/2006/main">
+              <a:graphicData uri="http://schemas.openxmlformats.org/drawingml/2006/picture">
+                <pic:pic xmlns:pic="http://schemas.openxmlformats.org/drawingml/2006/picture">
+                  <pic:nvPicPr>
+                    <pic:cNvPr id="1" name=""/>
+                    <pic:cNvPicPr/>
+                  </pic:nvPicPr>
+                  <pic:blipFill>
+                    <a:blip r:embed="rId20"/>
+                    <a:stretch>
+                      <a:fillRect/>
+                    </a:stretch>
+                  </pic:blipFill>
+                  <pic:spPr>
+                    <a:xfrm>
+                      <a:off x="0" y="0"/>
+                      <a:ext cx="5238750" cy="2317115"/>
+                    </a:xfrm>
+                    <a:prstGeom prst="rect">
+                      <a:avLst/>
+                    </a:prstGeom>
+                  </pic:spPr>
+                </pic:pic>
+              </a:graphicData>
+            </a:graphic>
+          </wp:inline>
+        </w:drawing>
+      </w:r>
+    </w:p>
+    <w:p>
+      <w:pPr>
+        <w:rPr>
+          <w:rFonts w:ascii="Times New Roman" w:hAnsi="Times New Roman" w:cs="Times New Roman"/>
+          <w:sz w:val="24"/>
+          <w:szCs w:val="24"/>
+        </w:rPr>
+      </w:pPr>
+    </w:p>
     <w:sectPr>
-      <w:headerReference w:type="default" r:id="rId20"/>
-      <w:footerReference w:type="default" r:id="rId21"/>
+      <w:headerReference w:type="default" r:id="rId21"/>
+      <w:footerReference w:type="default" r:id="rId22"/>
       <w:pgSz w:w="11906" w:h="16838"/>
       <w:pgMar w:top="1417" w:right="1417" w:bottom="1417" w:left="1417" w:header="708" w:footer="708" w:gutter="0"/>
       <w:pgBorders w:offsetFrom="page">
@@ -6056,6 +6686,123 @@
     </w:lvl>
   </w:abstractNum>
   <w:abstractNum w:abstractNumId="5" w15:restartNumberingAfterBreak="0">
+    <w:nsid w:val="4996411C"/>
+    <w:multiLevelType w:val="multilevel"/>
+    <w:tmpl w:val="218091C0"/>
+    <w:lvl w:ilvl="0">
+      <w:start w:val="1"/>
+      <w:numFmt w:val="decimal"/>
+      <w:lvlText w:val="%1."/>
+      <w:lvlJc w:val="left"/>
+      <w:pPr>
+        <w:tabs>
+          <w:tab w:val="num" w:pos="720"/>
+        </w:tabs>
+        <w:ind w:left="720" w:hanging="360"/>
+      </w:pPr>
+    </w:lvl>
+    <w:lvl w:ilvl="1">
+      <w:start w:val="1"/>
+      <w:numFmt w:val="bullet"/>
+      <w:lvlText w:val="o"/>
+      <w:lvlJc w:val="left"/>
+      <w:pPr>
+        <w:tabs>
+          <w:tab w:val="num" w:pos="1440"/>
+        </w:tabs>
+        <w:ind w:left="1440" w:hanging="360"/>
+      </w:pPr>
+      <w:rPr>
+        <w:rFonts w:ascii="Courier New" w:hAnsi="Courier New" w:hint="default"/>
+        <w:sz w:val="20"/>
+      </w:rPr>
+    </w:lvl>
+    <w:lvl w:ilvl="2" w:tentative="1">
+      <w:start w:val="1"/>
+      <w:numFmt w:val="decimal"/>
+      <w:lvlText w:val="%3."/>
+      <w:lvlJc w:val="left"/>
+      <w:pPr>
+        <w:tabs>
+          <w:tab w:val="num" w:pos="2160"/>
+        </w:tabs>
+        <w:ind w:left="2160" w:hanging="360"/>
+      </w:pPr>
+    </w:lvl>
+    <w:lvl w:ilvl="3" w:tentative="1">
+      <w:start w:val="1"/>
+      <w:numFmt w:val="decimal"/>
+      <w:lvlText w:val="%4."/>
+      <w:lvlJc w:val="left"/>
+      <w:pPr>
+        <w:tabs>
+          <w:tab w:val="num" w:pos="2880"/>
+        </w:tabs>
+        <w:ind w:left="2880" w:hanging="360"/>
+      </w:pPr>
+    </w:lvl>
+    <w:lvl w:ilvl="4" w:tentative="1">
+      <w:start w:val="1"/>
+      <w:numFmt w:val="decimal"/>
+      <w:lvlText w:val="%5."/>
+      <w:lvlJc w:val="left"/>
+      <w:pPr>
+        <w:tabs>
+          <w:tab w:val="num" w:pos="3600"/>
+        </w:tabs>
+        <w:ind w:left="3600" w:hanging="360"/>
+      </w:pPr>
+    </w:lvl>
+    <w:lvl w:ilvl="5" w:tentative="1">
+      <w:start w:val="1"/>
+      <w:numFmt w:val="decimal"/>
+      <w:lvlText w:val="%6."/>
+      <w:lvlJc w:val="left"/>
+      <w:pPr>
+        <w:tabs>
+          <w:tab w:val="num" w:pos="4320"/>
+        </w:tabs>
+        <w:ind w:left="4320" w:hanging="360"/>
+      </w:pPr>
+    </w:lvl>
+    <w:lvl w:ilvl="6" w:tentative="1">
+      <w:start w:val="1"/>
+      <w:numFmt w:val="decimal"/>
+      <w:lvlText w:val="%7."/>
+      <w:lvlJc w:val="left"/>
+      <w:pPr>
+        <w:tabs>
+          <w:tab w:val="num" w:pos="5040"/>
+        </w:tabs>
+        <w:ind w:left="5040" w:hanging="360"/>
+      </w:pPr>
+    </w:lvl>
+    <w:lvl w:ilvl="7" w:tentative="1">
+      <w:start w:val="1"/>
+      <w:numFmt w:val="decimal"/>
+      <w:lvlText w:val="%8."/>
+      <w:lvlJc w:val="left"/>
+      <w:pPr>
+        <w:tabs>
+          <w:tab w:val="num" w:pos="5760"/>
+        </w:tabs>
+        <w:ind w:left="5760" w:hanging="360"/>
+      </w:pPr>
+    </w:lvl>
+    <w:lvl w:ilvl="8" w:tentative="1">
+      <w:start w:val="1"/>
+      <w:numFmt w:val="decimal"/>
+      <w:lvlText w:val="%9."/>
+      <w:lvlJc w:val="left"/>
+      <w:pPr>
+        <w:tabs>
+          <w:tab w:val="num" w:pos="6480"/>
+        </w:tabs>
+        <w:ind w:left="6480" w:hanging="360"/>
+      </w:pPr>
+    </w:lvl>
+  </w:abstractNum>
+  <w:abstractNum w:abstractNumId="6" w15:restartNumberingAfterBreak="0">
     <w:nsid w:val="56D568C8"/>
     <w:multiLevelType w:val="multilevel"/>
     <w:tmpl w:val="3392CAD2"/>
@@ -6204,7 +6951,7 @@
       </w:rPr>
     </w:lvl>
   </w:abstractNum>
-  <w:abstractNum w:abstractNumId="6" w15:restartNumberingAfterBreak="0">
+  <w:abstractNum w:abstractNumId="7" w15:restartNumberingAfterBreak="0">
     <w:nsid w:val="61053792"/>
     <w:multiLevelType w:val="multilevel"/>
     <w:tmpl w:val="49E43BFC"/>
@@ -6353,7 +7100,7 @@
       </w:rPr>
     </w:lvl>
   </w:abstractNum>
-  <w:abstractNum w:abstractNumId="7" w15:restartNumberingAfterBreak="0">
+  <w:abstractNum w:abstractNumId="8" w15:restartNumberingAfterBreak="0">
     <w:nsid w:val="6DA36487"/>
     <w:multiLevelType w:val="multilevel"/>
     <w:tmpl w:val="9C4C8532"/>
@@ -6502,7 +7249,7 @@
       </w:rPr>
     </w:lvl>
   </w:abstractNum>
-  <w:abstractNum w:abstractNumId="8" w15:restartNumberingAfterBreak="0">
+  <w:abstractNum w:abstractNumId="9" w15:restartNumberingAfterBreak="0">
     <w:nsid w:val="6EB85EAA"/>
     <w:multiLevelType w:val="hybridMultilevel"/>
     <w:tmpl w:val="DB76C824"/>
@@ -6616,13 +7363,13 @@
     </w:lvl>
   </w:abstractNum>
   <w:num w:numId="1">
-    <w:abstractNumId w:val="8"/>
+    <w:abstractNumId w:val="9"/>
   </w:num>
   <w:num w:numId="2">
     <w:abstractNumId w:val="4"/>
   </w:num>
   <w:num w:numId="3">
-    <w:abstractNumId w:val="5"/>
+    <w:abstractNumId w:val="6"/>
   </w:num>
   <w:num w:numId="4">
     <w:abstractNumId w:val="3"/>
@@ -6631,16 +7378,19 @@
     <w:abstractNumId w:val="2"/>
   </w:num>
   <w:num w:numId="6">
-    <w:abstractNumId w:val="6"/>
+    <w:abstractNumId w:val="7"/>
   </w:num>
   <w:num w:numId="7">
     <w:abstractNumId w:val="1"/>
   </w:num>
   <w:num w:numId="8">
-    <w:abstractNumId w:val="7"/>
+    <w:abstractNumId w:val="8"/>
   </w:num>
   <w:num w:numId="9">
     <w:abstractNumId w:val="0"/>
+  </w:num>
+  <w:num w:numId="10">
+    <w:abstractNumId w:val="5"/>
   </w:num>
 </w:numbering>
 </file>

</xml_diff>

<commit_message>
Créer un prompt permettant de résumer un document avec les contraintes
</commit_message>
<xml_diff>
--- a/Atelier Prompt.docx
+++ b/Atelier Prompt.docx
@@ -5729,9 +5729,528 @@
         </w:rPr>
       </w:pPr>
     </w:p>
+    <w:p>
+      <w:pPr>
+        <w:pBdr>
+          <w:left w:val="single" w:sz="24" w:space="4" w:color="323E4F" w:themeColor="text2" w:themeShade="BF"/>
+        </w:pBdr>
+        <w:autoSpaceDE w:val="0"/>
+        <w:autoSpaceDN w:val="0"/>
+        <w:adjustRightInd w:val="0"/>
+        <w:spacing w:after="0" w:line="240" w:lineRule="auto"/>
+        <w:rPr>
+          <w:rFonts w:ascii="Times New Roman" w:hAnsi="Times New Roman" w:cs="Times New Roman"/>
+          <w:b/>
+          <w:bCs/>
+          <w:color w:val="323E4F" w:themeColor="text2" w:themeShade="BF"/>
+          <w:kern w:val="0"/>
+          <w:sz w:val="32"/>
+          <w:szCs w:val="32"/>
+        </w:rPr>
+      </w:pPr>
+      <w:r>
+        <w:rPr>
+          <w:rFonts w:ascii="Times New Roman" w:hAnsi="Times New Roman" w:cs="Times New Roman"/>
+          <w:b/>
+          <w:bCs/>
+          <w:color w:val="323E4F" w:themeColor="text2" w:themeShade="BF"/>
+          <w:kern w:val="0"/>
+          <w:sz w:val="32"/>
+          <w:szCs w:val="32"/>
+        </w:rPr>
+        <w:t xml:space="preserve">Partie </w:t>
+      </w:r>
+      <w:r>
+        <w:rPr>
+          <w:rFonts w:ascii="Times New Roman" w:hAnsi="Times New Roman" w:cs="Times New Roman"/>
+          <w:b/>
+          <w:bCs/>
+          <w:color w:val="323E4F" w:themeColor="text2" w:themeShade="BF"/>
+          <w:kern w:val="0"/>
+          <w:sz w:val="32"/>
+          <w:szCs w:val="32"/>
+        </w:rPr>
+        <w:t>5</w:t>
+      </w:r>
+      <w:r>
+        <w:rPr>
+          <w:rFonts w:ascii="Times New Roman" w:hAnsi="Times New Roman" w:cs="Times New Roman"/>
+          <w:b/>
+          <w:bCs/>
+          <w:color w:val="323E4F" w:themeColor="text2" w:themeShade="BF"/>
+          <w:kern w:val="0"/>
+          <w:sz w:val="32"/>
+          <w:szCs w:val="32"/>
+        </w:rPr>
+        <w:t xml:space="preserve"> – </w:t>
+      </w:r>
+      <w:r>
+        <w:rPr>
+          <w:rFonts w:ascii="Times New Roman" w:hAnsi="Times New Roman" w:cs="Times New Roman"/>
+          <w:b/>
+          <w:bCs/>
+          <w:color w:val="323E4F" w:themeColor="text2" w:themeShade="BF"/>
+          <w:kern w:val="0"/>
+          <w:sz w:val="32"/>
+          <w:szCs w:val="32"/>
+        </w:rPr>
+        <w:t>Prompts pour les applications métier</w:t>
+      </w:r>
+    </w:p>
+    <w:p>
+      <w:pPr>
+        <w:autoSpaceDE w:val="0"/>
+        <w:autoSpaceDN w:val="0"/>
+        <w:adjustRightInd w:val="0"/>
+        <w:spacing w:after="0" w:line="240" w:lineRule="auto"/>
+        <w:rPr>
+          <w:rFonts w:ascii="CIDFont+F1" w:hAnsi="CIDFont+F1" w:cs="CIDFont+F1"/>
+          <w:color w:val="000000"/>
+          <w:kern w:val="0"/>
+          <w:sz w:val="21"/>
+          <w:szCs w:val="21"/>
+        </w:rPr>
+      </w:pPr>
+      <w:r>
+        <w:rPr>
+          <w:rFonts w:ascii="CIDFont+F1" w:hAnsi="CIDFont+F1" w:cs="CIDFont+F1"/>
+          <w:color w:val="000000"/>
+          <w:kern w:val="0"/>
+          <w:sz w:val="21"/>
+          <w:szCs w:val="21"/>
+        </w:rPr>
+        <w:t>1) Créer un prompt permettant de résumer un document avec les contraintes : maximum 250</w:t>
+      </w:r>
+    </w:p>
+    <w:p>
+      <w:pPr>
+        <w:autoSpaceDE w:val="0"/>
+        <w:autoSpaceDN w:val="0"/>
+        <w:adjustRightInd w:val="0"/>
+        <w:spacing w:after="0" w:line="240" w:lineRule="auto"/>
+        <w:rPr>
+          <w:rFonts w:ascii="CIDFont+F1" w:hAnsi="CIDFont+F1" w:cs="CIDFont+F1"/>
+          <w:color w:val="000000"/>
+          <w:kern w:val="0"/>
+          <w:sz w:val="21"/>
+          <w:szCs w:val="21"/>
+        </w:rPr>
+      </w:pPr>
+      <w:r>
+        <w:rPr>
+          <w:rFonts w:ascii="CIDFont+F1" w:hAnsi="CIDFont+F1" w:cs="CIDFont+F1"/>
+          <w:color w:val="000000"/>
+          <w:kern w:val="0"/>
+          <w:sz w:val="21"/>
+          <w:szCs w:val="21"/>
+        </w:rPr>
+        <w:t>mots ; conserver les informations factuelles ; identifier les objectifs ; identifier les résultats ;</w:t>
+      </w:r>
+    </w:p>
+    <w:p>
+      <w:pPr>
+        <w:rPr>
+          <w:rFonts w:ascii="CIDFont+F1" w:hAnsi="CIDFont+F1" w:cs="CIDFont+F1"/>
+          <w:color w:val="000000"/>
+          <w:kern w:val="0"/>
+          <w:sz w:val="21"/>
+          <w:szCs w:val="21"/>
+        </w:rPr>
+      </w:pPr>
+      <w:r>
+        <w:rPr>
+          <w:rFonts w:ascii="CIDFont+F1" w:hAnsi="CIDFont+F1" w:cs="CIDFont+F1"/>
+          <w:color w:val="000000"/>
+          <w:kern w:val="0"/>
+          <w:sz w:val="21"/>
+          <w:szCs w:val="21"/>
+        </w:rPr>
+        <w:t>identifier les recommandations ; n'inventer aucune information.</w:t>
+      </w:r>
+    </w:p>
+    <w:p>
+      <w:pPr>
+        <w:rPr>
+          <w:rFonts w:ascii="CIDFont+F1" w:hAnsi="CIDFont+F1" w:cs="CIDFont+F1"/>
+          <w:color w:val="000000"/>
+          <w:kern w:val="0"/>
+          <w:sz w:val="21"/>
+          <w:szCs w:val="21"/>
+        </w:rPr>
+      </w:pPr>
+    </w:p>
+    <w:p>
+      <w:pPr>
+        <w:spacing w:after="0" w:line="240" w:lineRule="auto"/>
+        <w:ind w:left="708"/>
+        <w:jc w:val="both"/>
+        <w:rPr>
+          <w:rFonts w:ascii="Times New Roman" w:eastAsia="Times New Roman" w:hAnsi="Times New Roman" w:cs="Times New Roman"/>
+          <w:color w:val="2F5496" w:themeColor="accent1" w:themeShade="BF"/>
+          <w:kern w:val="0"/>
+          <w:sz w:val="24"/>
+          <w:szCs w:val="24"/>
+          <w:lang w:eastAsia="fr-FR"/>
+          <w14:ligatures w14:val="none"/>
+        </w:rPr>
+      </w:pPr>
+      <w:r>
+        <w:rPr>
+          <w:rFonts w:ascii="Times New Roman" w:eastAsia="Times New Roman" w:hAnsi="Times New Roman" w:cs="Times New Roman"/>
+          <w:color w:val="2F5496" w:themeColor="accent1" w:themeShade="BF"/>
+          <w:kern w:val="0"/>
+          <w:sz w:val="24"/>
+          <w:szCs w:val="24"/>
+          <w:lang w:eastAsia="fr-FR"/>
+          <w14:ligatures w14:val="none"/>
+        </w:rPr>
+        <w:t>Tu es un expert en synthèse et en analyse de documents professionnels.</w:t>
+      </w:r>
+    </w:p>
+    <w:p>
+      <w:pPr>
+        <w:spacing w:after="0" w:line="240" w:lineRule="auto"/>
+        <w:ind w:left="708"/>
+        <w:jc w:val="both"/>
+        <w:rPr>
+          <w:rFonts w:ascii="Times New Roman" w:eastAsia="Times New Roman" w:hAnsi="Times New Roman" w:cs="Times New Roman"/>
+          <w:color w:val="2F5496" w:themeColor="accent1" w:themeShade="BF"/>
+          <w:kern w:val="0"/>
+          <w:sz w:val="24"/>
+          <w:szCs w:val="24"/>
+          <w:lang w:eastAsia="fr-FR"/>
+          <w14:ligatures w14:val="none"/>
+        </w:rPr>
+      </w:pPr>
+      <w:r>
+        <w:rPr>
+          <w:rFonts w:ascii="Times New Roman" w:eastAsia="Times New Roman" w:hAnsi="Times New Roman" w:cs="Times New Roman"/>
+          <w:color w:val="2F5496" w:themeColor="accent1" w:themeShade="BF"/>
+          <w:kern w:val="0"/>
+          <w:sz w:val="24"/>
+          <w:szCs w:val="24"/>
+          <w:lang w:eastAsia="fr-FR"/>
+          <w14:ligatures w14:val="none"/>
+        </w:rPr>
+        <w:t>Résume le document fourni en respectant strictement les consignes suivantes :</w:t>
+      </w:r>
+    </w:p>
+    <w:p>
+      <w:pPr>
+        <w:numPr>
+          <w:ilvl w:val="0"/>
+          <w:numId w:val="11"/>
+        </w:numPr>
+        <w:tabs>
+          <w:tab w:val="clear" w:pos="720"/>
+          <w:tab w:val="num" w:pos="1428"/>
+        </w:tabs>
+        <w:spacing w:after="0" w:line="240" w:lineRule="auto"/>
+        <w:ind w:left="1428"/>
+        <w:jc w:val="both"/>
+        <w:rPr>
+          <w:rFonts w:ascii="Times New Roman" w:eastAsia="Times New Roman" w:hAnsi="Times New Roman" w:cs="Times New Roman"/>
+          <w:color w:val="2F5496" w:themeColor="accent1" w:themeShade="BF"/>
+          <w:kern w:val="0"/>
+          <w:sz w:val="24"/>
+          <w:szCs w:val="24"/>
+          <w:lang w:eastAsia="fr-FR"/>
+          <w14:ligatures w14:val="none"/>
+        </w:rPr>
+      </w:pPr>
+      <w:r>
+        <w:rPr>
+          <w:rFonts w:ascii="Times New Roman" w:eastAsia="Times New Roman" w:hAnsi="Times New Roman" w:cs="Times New Roman"/>
+          <w:color w:val="2F5496" w:themeColor="accent1" w:themeShade="BF"/>
+          <w:kern w:val="0"/>
+          <w:sz w:val="24"/>
+          <w:szCs w:val="24"/>
+          <w:lang w:eastAsia="fr-FR"/>
+          <w14:ligatures w14:val="none"/>
+        </w:rPr>
+        <w:t>Le résumé doit contenir 250 mots maximum.</w:t>
+      </w:r>
+    </w:p>
+    <w:p>
+      <w:pPr>
+        <w:numPr>
+          <w:ilvl w:val="0"/>
+          <w:numId w:val="11"/>
+        </w:numPr>
+        <w:tabs>
+          <w:tab w:val="clear" w:pos="720"/>
+          <w:tab w:val="num" w:pos="1428"/>
+        </w:tabs>
+        <w:spacing w:after="0" w:line="240" w:lineRule="auto"/>
+        <w:ind w:left="1428"/>
+        <w:jc w:val="both"/>
+        <w:rPr>
+          <w:rFonts w:ascii="Times New Roman" w:eastAsia="Times New Roman" w:hAnsi="Times New Roman" w:cs="Times New Roman"/>
+          <w:color w:val="2F5496" w:themeColor="accent1" w:themeShade="BF"/>
+          <w:kern w:val="0"/>
+          <w:sz w:val="24"/>
+          <w:szCs w:val="24"/>
+          <w:lang w:eastAsia="fr-FR"/>
+          <w14:ligatures w14:val="none"/>
+        </w:rPr>
+      </w:pPr>
+      <w:r>
+        <w:rPr>
+          <w:rFonts w:ascii="Times New Roman" w:eastAsia="Times New Roman" w:hAnsi="Times New Roman" w:cs="Times New Roman"/>
+          <w:color w:val="2F5496" w:themeColor="accent1" w:themeShade="BF"/>
+          <w:kern w:val="0"/>
+          <w:sz w:val="24"/>
+          <w:szCs w:val="24"/>
+          <w:lang w:eastAsia="fr-FR"/>
+          <w14:ligatures w14:val="none"/>
+        </w:rPr>
+        <w:t>Conserve uniquement les informations factuelles présentes dans le document.</w:t>
+      </w:r>
+    </w:p>
+    <w:p>
+      <w:pPr>
+        <w:numPr>
+          <w:ilvl w:val="0"/>
+          <w:numId w:val="11"/>
+        </w:numPr>
+        <w:tabs>
+          <w:tab w:val="clear" w:pos="720"/>
+          <w:tab w:val="num" w:pos="1428"/>
+        </w:tabs>
+        <w:spacing w:after="0" w:line="240" w:lineRule="auto"/>
+        <w:ind w:left="1428"/>
+        <w:jc w:val="both"/>
+        <w:rPr>
+          <w:rFonts w:ascii="Times New Roman" w:eastAsia="Times New Roman" w:hAnsi="Times New Roman" w:cs="Times New Roman"/>
+          <w:color w:val="2F5496" w:themeColor="accent1" w:themeShade="BF"/>
+          <w:kern w:val="0"/>
+          <w:sz w:val="24"/>
+          <w:szCs w:val="24"/>
+          <w:lang w:eastAsia="fr-FR"/>
+          <w14:ligatures w14:val="none"/>
+        </w:rPr>
+      </w:pPr>
+      <w:r>
+        <w:rPr>
+          <w:rFonts w:ascii="Times New Roman" w:eastAsia="Times New Roman" w:hAnsi="Times New Roman" w:cs="Times New Roman"/>
+          <w:color w:val="2F5496" w:themeColor="accent1" w:themeShade="BF"/>
+          <w:kern w:val="0"/>
+          <w:sz w:val="24"/>
+          <w:szCs w:val="24"/>
+          <w:lang w:eastAsia="fr-FR"/>
+          <w14:ligatures w14:val="none"/>
+        </w:rPr>
+        <w:t>Identifie clairement les objectifs présentés dans le document.</w:t>
+      </w:r>
+    </w:p>
+    <w:p>
+      <w:pPr>
+        <w:numPr>
+          <w:ilvl w:val="0"/>
+          <w:numId w:val="11"/>
+        </w:numPr>
+        <w:tabs>
+          <w:tab w:val="clear" w:pos="720"/>
+          <w:tab w:val="num" w:pos="1428"/>
+        </w:tabs>
+        <w:spacing w:after="0" w:line="240" w:lineRule="auto"/>
+        <w:ind w:left="1428"/>
+        <w:jc w:val="both"/>
+        <w:rPr>
+          <w:rFonts w:ascii="Times New Roman" w:eastAsia="Times New Roman" w:hAnsi="Times New Roman" w:cs="Times New Roman"/>
+          <w:color w:val="2F5496" w:themeColor="accent1" w:themeShade="BF"/>
+          <w:kern w:val="0"/>
+          <w:sz w:val="24"/>
+          <w:szCs w:val="24"/>
+          <w:lang w:eastAsia="fr-FR"/>
+          <w14:ligatures w14:val="none"/>
+        </w:rPr>
+      </w:pPr>
+      <w:r>
+        <w:rPr>
+          <w:rFonts w:ascii="Times New Roman" w:eastAsia="Times New Roman" w:hAnsi="Times New Roman" w:cs="Times New Roman"/>
+          <w:color w:val="2F5496" w:themeColor="accent1" w:themeShade="BF"/>
+          <w:kern w:val="0"/>
+          <w:sz w:val="24"/>
+          <w:szCs w:val="24"/>
+          <w:lang w:eastAsia="fr-FR"/>
+          <w14:ligatures w14:val="none"/>
+        </w:rPr>
+        <w:t>Identifie les résultats obtenus ou présentés.</w:t>
+      </w:r>
+    </w:p>
+    <w:p>
+      <w:pPr>
+        <w:numPr>
+          <w:ilvl w:val="0"/>
+          <w:numId w:val="11"/>
+        </w:numPr>
+        <w:tabs>
+          <w:tab w:val="clear" w:pos="720"/>
+          <w:tab w:val="num" w:pos="1428"/>
+        </w:tabs>
+        <w:spacing w:after="0" w:line="240" w:lineRule="auto"/>
+        <w:ind w:left="1428"/>
+        <w:jc w:val="both"/>
+        <w:rPr>
+          <w:rFonts w:ascii="Times New Roman" w:eastAsia="Times New Roman" w:hAnsi="Times New Roman" w:cs="Times New Roman"/>
+          <w:color w:val="2F5496" w:themeColor="accent1" w:themeShade="BF"/>
+          <w:kern w:val="0"/>
+          <w:sz w:val="24"/>
+          <w:szCs w:val="24"/>
+          <w:lang w:eastAsia="fr-FR"/>
+          <w14:ligatures w14:val="none"/>
+        </w:rPr>
+      </w:pPr>
+      <w:r>
+        <w:rPr>
+          <w:rFonts w:ascii="Times New Roman" w:eastAsia="Times New Roman" w:hAnsi="Times New Roman" w:cs="Times New Roman"/>
+          <w:color w:val="2F5496" w:themeColor="accent1" w:themeShade="BF"/>
+          <w:kern w:val="0"/>
+          <w:sz w:val="24"/>
+          <w:szCs w:val="24"/>
+          <w:lang w:eastAsia="fr-FR"/>
+          <w14:ligatures w14:val="none"/>
+        </w:rPr>
+        <w:lastRenderedPageBreak/>
+        <w:t>Identifie les recommandations formulées dans le document.</w:t>
+      </w:r>
+    </w:p>
+    <w:p>
+      <w:pPr>
+        <w:numPr>
+          <w:ilvl w:val="0"/>
+          <w:numId w:val="11"/>
+        </w:numPr>
+        <w:tabs>
+          <w:tab w:val="clear" w:pos="720"/>
+          <w:tab w:val="num" w:pos="1428"/>
+        </w:tabs>
+        <w:spacing w:after="0" w:line="240" w:lineRule="auto"/>
+        <w:ind w:left="1428"/>
+        <w:jc w:val="both"/>
+        <w:rPr>
+          <w:rFonts w:ascii="Times New Roman" w:eastAsia="Times New Roman" w:hAnsi="Times New Roman" w:cs="Times New Roman"/>
+          <w:color w:val="2F5496" w:themeColor="accent1" w:themeShade="BF"/>
+          <w:kern w:val="0"/>
+          <w:sz w:val="24"/>
+          <w:szCs w:val="24"/>
+          <w:lang w:eastAsia="fr-FR"/>
+          <w14:ligatures w14:val="none"/>
+        </w:rPr>
+      </w:pPr>
+      <w:r>
+        <w:rPr>
+          <w:rFonts w:ascii="Times New Roman" w:eastAsia="Times New Roman" w:hAnsi="Times New Roman" w:cs="Times New Roman"/>
+          <w:color w:val="2F5496" w:themeColor="accent1" w:themeShade="BF"/>
+          <w:kern w:val="0"/>
+          <w:sz w:val="24"/>
+          <w:szCs w:val="24"/>
+          <w:lang w:eastAsia="fr-FR"/>
+          <w14:ligatures w14:val="none"/>
+        </w:rPr>
+        <w:t>N'invente aucune information et ne complète pas les informations absentes du document.</w:t>
+      </w:r>
+    </w:p>
+    <w:p>
+      <w:pPr>
+        <w:numPr>
+          <w:ilvl w:val="0"/>
+          <w:numId w:val="11"/>
+        </w:numPr>
+        <w:tabs>
+          <w:tab w:val="clear" w:pos="720"/>
+          <w:tab w:val="num" w:pos="1428"/>
+        </w:tabs>
+        <w:spacing w:after="0" w:line="240" w:lineRule="auto"/>
+        <w:ind w:left="1428"/>
+        <w:jc w:val="both"/>
+        <w:rPr>
+          <w:rFonts w:ascii="Times New Roman" w:eastAsia="Times New Roman" w:hAnsi="Times New Roman" w:cs="Times New Roman"/>
+          <w:color w:val="2F5496" w:themeColor="accent1" w:themeShade="BF"/>
+          <w:kern w:val="0"/>
+          <w:sz w:val="24"/>
+          <w:szCs w:val="24"/>
+          <w:lang w:eastAsia="fr-FR"/>
+          <w14:ligatures w14:val="none"/>
+        </w:rPr>
+      </w:pPr>
+      <w:r>
+        <w:rPr>
+          <w:rFonts w:ascii="Times New Roman" w:eastAsia="Times New Roman" w:hAnsi="Times New Roman" w:cs="Times New Roman"/>
+          <w:color w:val="2F5496" w:themeColor="accent1" w:themeShade="BF"/>
+          <w:kern w:val="0"/>
+          <w:sz w:val="24"/>
+          <w:szCs w:val="24"/>
+          <w:lang w:eastAsia="fr-FR"/>
+          <w14:ligatures w14:val="none"/>
+        </w:rPr>
+        <w:t>Ne modifie pas le sens des informations importantes.</w:t>
+      </w:r>
+    </w:p>
+    <w:p>
+      <w:pPr>
+        <w:rPr>
+          <w:rFonts w:ascii="Times New Roman" w:hAnsi="Times New Roman" w:cs="Times New Roman"/>
+          <w:sz w:val="24"/>
+          <w:szCs w:val="24"/>
+        </w:rPr>
+      </w:pPr>
+    </w:p>
+    <w:p>
+      <w:pPr>
+        <w:rPr>
+          <w:rFonts w:ascii="Times New Roman" w:hAnsi="Times New Roman" w:cs="Times New Roman"/>
+          <w:sz w:val="24"/>
+          <w:szCs w:val="24"/>
+        </w:rPr>
+      </w:pPr>
+      <w:r>
+        <w:rPr>
+          <w:rFonts w:ascii="Times New Roman" w:hAnsi="Times New Roman" w:cs="Times New Roman"/>
+          <w:sz w:val="24"/>
+          <w:szCs w:val="24"/>
+        </w:rPr>
+        <w:drawing>
+          <wp:inline distT="0" distB="0" distL="0" distR="0" wp14:anchorId="6D981EC2" wp14:editId="70C3E2DE">
+            <wp:extent cx="5760720" cy="4020185"/>
+            <wp:effectExtent l="0" t="0" r="0" b="0"/>
+            <wp:docPr id="18" name="Image 18"/>
+            <wp:cNvGraphicFramePr>
+              <a:graphicFrameLocks xmlns:a="http://schemas.openxmlformats.org/drawingml/2006/main" noChangeAspect="1"/>
+            </wp:cNvGraphicFramePr>
+            <a:graphic xmlns:a="http://schemas.openxmlformats.org/drawingml/2006/main">
+              <a:graphicData uri="http://schemas.openxmlformats.org/drawingml/2006/picture">
+                <pic:pic xmlns:pic="http://schemas.openxmlformats.org/drawingml/2006/picture">
+                  <pic:nvPicPr>
+                    <pic:cNvPr id="1" name=""/>
+                    <pic:cNvPicPr/>
+                  </pic:nvPicPr>
+                  <pic:blipFill>
+                    <a:blip r:embed="rId21"/>
+                    <a:stretch>
+                      <a:fillRect/>
+                    </a:stretch>
+                  </pic:blipFill>
+                  <pic:spPr>
+                    <a:xfrm>
+                      <a:off x="0" y="0"/>
+                      <a:ext cx="5760720" cy="4020185"/>
+                    </a:xfrm>
+                    <a:prstGeom prst="rect">
+                      <a:avLst/>
+                    </a:prstGeom>
+                  </pic:spPr>
+                </pic:pic>
+              </a:graphicData>
+            </a:graphic>
+          </wp:inline>
+        </w:drawing>
+      </w:r>
+    </w:p>
     <w:sectPr>
-      <w:headerReference w:type="default" r:id="rId21"/>
-      <w:footerReference w:type="default" r:id="rId22"/>
+      <w:headerReference w:type="default" r:id="rId22"/>
+      <w:footerReference w:type="default" r:id="rId23"/>
       <w:pgSz w:w="11906" w:h="16838"/>
       <w:pgMar w:top="1417" w:right="1417" w:bottom="1417" w:left="1417" w:header="708" w:footer="708" w:gutter="0"/>
       <w:pgBorders w:offsetFrom="page">
@@ -6225,6 +6744,155 @@
     </w:lvl>
   </w:abstractNum>
   <w:abstractNum w:abstractNumId="1" w15:restartNumberingAfterBreak="0">
+    <w:nsid w:val="1A8F2050"/>
+    <w:multiLevelType w:val="multilevel"/>
+    <w:tmpl w:val="CCB8542C"/>
+    <w:lvl w:ilvl="0">
+      <w:start w:val="1"/>
+      <w:numFmt w:val="bullet"/>
+      <w:lvlText w:val=""/>
+      <w:lvlJc w:val="left"/>
+      <w:pPr>
+        <w:tabs>
+          <w:tab w:val="num" w:pos="720"/>
+        </w:tabs>
+        <w:ind w:left="720" w:hanging="360"/>
+      </w:pPr>
+      <w:rPr>
+        <w:rFonts w:ascii="Symbol" w:hAnsi="Symbol" w:hint="default"/>
+        <w:sz w:val="20"/>
+      </w:rPr>
+    </w:lvl>
+    <w:lvl w:ilvl="1" w:tentative="1">
+      <w:start w:val="1"/>
+      <w:numFmt w:val="bullet"/>
+      <w:lvlText w:val="o"/>
+      <w:lvlJc w:val="left"/>
+      <w:pPr>
+        <w:tabs>
+          <w:tab w:val="num" w:pos="1440"/>
+        </w:tabs>
+        <w:ind w:left="1440" w:hanging="360"/>
+      </w:pPr>
+      <w:rPr>
+        <w:rFonts w:ascii="Courier New" w:hAnsi="Courier New" w:hint="default"/>
+        <w:sz w:val="20"/>
+      </w:rPr>
+    </w:lvl>
+    <w:lvl w:ilvl="2" w:tentative="1">
+      <w:start w:val="1"/>
+      <w:numFmt w:val="bullet"/>
+      <w:lvlText w:val=""/>
+      <w:lvlJc w:val="left"/>
+      <w:pPr>
+        <w:tabs>
+          <w:tab w:val="num" w:pos="2160"/>
+        </w:tabs>
+        <w:ind w:left="2160" w:hanging="360"/>
+      </w:pPr>
+      <w:rPr>
+        <w:rFonts w:ascii="Wingdings" w:hAnsi="Wingdings" w:hint="default"/>
+        <w:sz w:val="20"/>
+      </w:rPr>
+    </w:lvl>
+    <w:lvl w:ilvl="3" w:tentative="1">
+      <w:start w:val="1"/>
+      <w:numFmt w:val="bullet"/>
+      <w:lvlText w:val=""/>
+      <w:lvlJc w:val="left"/>
+      <w:pPr>
+        <w:tabs>
+          <w:tab w:val="num" w:pos="2880"/>
+        </w:tabs>
+        <w:ind w:left="2880" w:hanging="360"/>
+      </w:pPr>
+      <w:rPr>
+        <w:rFonts w:ascii="Wingdings" w:hAnsi="Wingdings" w:hint="default"/>
+        <w:sz w:val="20"/>
+      </w:rPr>
+    </w:lvl>
+    <w:lvl w:ilvl="4" w:tentative="1">
+      <w:start w:val="1"/>
+      <w:numFmt w:val="bullet"/>
+      <w:lvlText w:val=""/>
+      <w:lvlJc w:val="left"/>
+      <w:pPr>
+        <w:tabs>
+          <w:tab w:val="num" w:pos="3600"/>
+        </w:tabs>
+        <w:ind w:left="3600" w:hanging="360"/>
+      </w:pPr>
+      <w:rPr>
+        <w:rFonts w:ascii="Wingdings" w:hAnsi="Wingdings" w:hint="default"/>
+        <w:sz w:val="20"/>
+      </w:rPr>
+    </w:lvl>
+    <w:lvl w:ilvl="5" w:tentative="1">
+      <w:start w:val="1"/>
+      <w:numFmt w:val="bullet"/>
+      <w:lvlText w:val=""/>
+      <w:lvlJc w:val="left"/>
+      <w:pPr>
+        <w:tabs>
+          <w:tab w:val="num" w:pos="4320"/>
+        </w:tabs>
+        <w:ind w:left="4320" w:hanging="360"/>
+      </w:pPr>
+      <w:rPr>
+        <w:rFonts w:ascii="Wingdings" w:hAnsi="Wingdings" w:hint="default"/>
+        <w:sz w:val="20"/>
+      </w:rPr>
+    </w:lvl>
+    <w:lvl w:ilvl="6" w:tentative="1">
+      <w:start w:val="1"/>
+      <w:numFmt w:val="bullet"/>
+      <w:lvlText w:val=""/>
+      <w:lvlJc w:val="left"/>
+      <w:pPr>
+        <w:tabs>
+          <w:tab w:val="num" w:pos="5040"/>
+        </w:tabs>
+        <w:ind w:left="5040" w:hanging="360"/>
+      </w:pPr>
+      <w:rPr>
+        <w:rFonts w:ascii="Wingdings" w:hAnsi="Wingdings" w:hint="default"/>
+        <w:sz w:val="20"/>
+      </w:rPr>
+    </w:lvl>
+    <w:lvl w:ilvl="7" w:tentative="1">
+      <w:start w:val="1"/>
+      <w:numFmt w:val="bullet"/>
+      <w:lvlText w:val=""/>
+      <w:lvlJc w:val="left"/>
+      <w:pPr>
+        <w:tabs>
+          <w:tab w:val="num" w:pos="5760"/>
+        </w:tabs>
+        <w:ind w:left="5760" w:hanging="360"/>
+      </w:pPr>
+      <w:rPr>
+        <w:rFonts w:ascii="Wingdings" w:hAnsi="Wingdings" w:hint="default"/>
+        <w:sz w:val="20"/>
+      </w:rPr>
+    </w:lvl>
+    <w:lvl w:ilvl="8" w:tentative="1">
+      <w:start w:val="1"/>
+      <w:numFmt w:val="bullet"/>
+      <w:lvlText w:val=""/>
+      <w:lvlJc w:val="left"/>
+      <w:pPr>
+        <w:tabs>
+          <w:tab w:val="num" w:pos="6480"/>
+        </w:tabs>
+        <w:ind w:left="6480" w:hanging="360"/>
+      </w:pPr>
+      <w:rPr>
+        <w:rFonts w:ascii="Wingdings" w:hAnsi="Wingdings" w:hint="default"/>
+        <w:sz w:val="20"/>
+      </w:rPr>
+    </w:lvl>
+  </w:abstractNum>
+  <w:abstractNum w:abstractNumId="2" w15:restartNumberingAfterBreak="0">
     <w:nsid w:val="23FA75D2"/>
     <w:multiLevelType w:val="multilevel"/>
     <w:tmpl w:val="7B086CF2"/>
@@ -6337,7 +7005,7 @@
       </w:pPr>
     </w:lvl>
   </w:abstractNum>
-  <w:abstractNum w:abstractNumId="2" w15:restartNumberingAfterBreak="0">
+  <w:abstractNum w:abstractNumId="3" w15:restartNumberingAfterBreak="0">
     <w:nsid w:val="30817C99"/>
     <w:multiLevelType w:val="hybridMultilevel"/>
     <w:tmpl w:val="B28054F4"/>
@@ -6423,7 +7091,7 @@
       </w:pPr>
     </w:lvl>
   </w:abstractNum>
-  <w:abstractNum w:abstractNumId="3" w15:restartNumberingAfterBreak="0">
+  <w:abstractNum w:abstractNumId="4" w15:restartNumberingAfterBreak="0">
     <w:nsid w:val="32024712"/>
     <w:multiLevelType w:val="multilevel"/>
     <w:tmpl w:val="7716EFCE"/>
@@ -6572,7 +7240,7 @@
       </w:rPr>
     </w:lvl>
   </w:abstractNum>
-  <w:abstractNum w:abstractNumId="4" w15:restartNumberingAfterBreak="0">
+  <w:abstractNum w:abstractNumId="5" w15:restartNumberingAfterBreak="0">
     <w:nsid w:val="3CA24848"/>
     <w:multiLevelType w:val="hybridMultilevel"/>
     <w:tmpl w:val="76B802A4"/>
@@ -6685,7 +7353,7 @@
       </w:rPr>
     </w:lvl>
   </w:abstractNum>
-  <w:abstractNum w:abstractNumId="5" w15:restartNumberingAfterBreak="0">
+  <w:abstractNum w:abstractNumId="6" w15:restartNumberingAfterBreak="0">
     <w:nsid w:val="4996411C"/>
     <w:multiLevelType w:val="multilevel"/>
     <w:tmpl w:val="218091C0"/>
@@ -6802,7 +7470,7 @@
       </w:pPr>
     </w:lvl>
   </w:abstractNum>
-  <w:abstractNum w:abstractNumId="6" w15:restartNumberingAfterBreak="0">
+  <w:abstractNum w:abstractNumId="7" w15:restartNumberingAfterBreak="0">
     <w:nsid w:val="56D568C8"/>
     <w:multiLevelType w:val="multilevel"/>
     <w:tmpl w:val="3392CAD2"/>
@@ -6951,7 +7619,7 @@
       </w:rPr>
     </w:lvl>
   </w:abstractNum>
-  <w:abstractNum w:abstractNumId="7" w15:restartNumberingAfterBreak="0">
+  <w:abstractNum w:abstractNumId="8" w15:restartNumberingAfterBreak="0">
     <w:nsid w:val="61053792"/>
     <w:multiLevelType w:val="multilevel"/>
     <w:tmpl w:val="49E43BFC"/>
@@ -7100,7 +7768,7 @@
       </w:rPr>
     </w:lvl>
   </w:abstractNum>
-  <w:abstractNum w:abstractNumId="8" w15:restartNumberingAfterBreak="0">
+  <w:abstractNum w:abstractNumId="9" w15:restartNumberingAfterBreak="0">
     <w:nsid w:val="6DA36487"/>
     <w:multiLevelType w:val="multilevel"/>
     <w:tmpl w:val="9C4C8532"/>
@@ -7249,7 +7917,7 @@
       </w:rPr>
     </w:lvl>
   </w:abstractNum>
-  <w:abstractNum w:abstractNumId="9" w15:restartNumberingAfterBreak="0">
+  <w:abstractNum w:abstractNumId="10" w15:restartNumberingAfterBreak="0">
     <w:nsid w:val="6EB85EAA"/>
     <w:multiLevelType w:val="hybridMultilevel"/>
     <w:tmpl w:val="DB76C824"/>
@@ -7363,34 +8031,37 @@
     </w:lvl>
   </w:abstractNum>
   <w:num w:numId="1">
-    <w:abstractNumId w:val="9"/>
+    <w:abstractNumId w:val="10"/>
   </w:num>
   <w:num w:numId="2">
+    <w:abstractNumId w:val="5"/>
+  </w:num>
+  <w:num w:numId="3">
+    <w:abstractNumId w:val="7"/>
+  </w:num>
+  <w:num w:numId="4">
     <w:abstractNumId w:val="4"/>
   </w:num>
-  <w:num w:numId="3">
-    <w:abstractNumId w:val="6"/>
-  </w:num>
-  <w:num w:numId="4">
+  <w:num w:numId="5">
     <w:abstractNumId w:val="3"/>
   </w:num>
-  <w:num w:numId="5">
+  <w:num w:numId="6">
+    <w:abstractNumId w:val="8"/>
+  </w:num>
+  <w:num w:numId="7">
     <w:abstractNumId w:val="2"/>
   </w:num>
-  <w:num w:numId="6">
-    <w:abstractNumId w:val="7"/>
-  </w:num>
-  <w:num w:numId="7">
-    <w:abstractNumId w:val="1"/>
-  </w:num>
   <w:num w:numId="8">
-    <w:abstractNumId w:val="8"/>
+    <w:abstractNumId w:val="9"/>
   </w:num>
   <w:num w:numId="9">
     <w:abstractNumId w:val="0"/>
   </w:num>
   <w:num w:numId="10">
-    <w:abstractNumId w:val="5"/>
+    <w:abstractNumId w:val="6"/>
+  </w:num>
+  <w:num w:numId="11">
+    <w:abstractNumId w:val="1"/>
   </w:num>
 </w:numbering>
 </file>

</xml_diff>

<commit_message>
ajouter document pour  traduire francais en anglais
</commit_message>
<xml_diff>
--- a/Atelier Prompt.docx
+++ b/Atelier Prompt.docx
@@ -6247,6 +6247,477 @@
           </wp:inline>
         </w:drawing>
       </w:r>
+    </w:p>
+    <w:p>
+      <w:pPr>
+        <w:rPr>
+          <w:rFonts w:ascii="Times New Roman" w:hAnsi="Times New Roman" w:cs="Times New Roman"/>
+          <w:sz w:val="24"/>
+          <w:szCs w:val="24"/>
+        </w:rPr>
+      </w:pPr>
+    </w:p>
+    <w:p>
+      <w:pPr>
+        <w:autoSpaceDE w:val="0"/>
+        <w:autoSpaceDN w:val="0"/>
+        <w:adjustRightInd w:val="0"/>
+        <w:spacing w:after="0" w:line="240" w:lineRule="auto"/>
+        <w:rPr>
+          <w:rFonts w:ascii="CIDFont+F1" w:hAnsi="CIDFont+F1" w:cs="CIDFont+F1"/>
+          <w:kern w:val="0"/>
+          <w:sz w:val="21"/>
+          <w:szCs w:val="21"/>
+        </w:rPr>
+      </w:pPr>
+      <w:r>
+        <w:rPr>
+          <w:rFonts w:ascii="CIDFont+F1" w:hAnsi="CIDFont+F1" w:cs="CIDFont+F1"/>
+          <w:kern w:val="0"/>
+          <w:sz w:val="21"/>
+          <w:szCs w:val="21"/>
+        </w:rPr>
+        <w:t>2) Créer un prompt permettant de traduire un document français en anglais avec les</w:t>
+      </w:r>
+    </w:p>
+    <w:p>
+      <w:pPr>
+        <w:autoSpaceDE w:val="0"/>
+        <w:autoSpaceDN w:val="0"/>
+        <w:adjustRightInd w:val="0"/>
+        <w:spacing w:after="0" w:line="240" w:lineRule="auto"/>
+        <w:rPr>
+          <w:rFonts w:ascii="CIDFont+F1" w:hAnsi="CIDFont+F1" w:cs="CIDFont+F1"/>
+          <w:kern w:val="0"/>
+          <w:sz w:val="21"/>
+          <w:szCs w:val="21"/>
+        </w:rPr>
+      </w:pPr>
+      <w:r>
+        <w:rPr>
+          <w:rFonts w:ascii="CIDFont+F1" w:hAnsi="CIDFont+F1" w:cs="CIDFont+F1"/>
+          <w:kern w:val="0"/>
+          <w:sz w:val="21"/>
+          <w:szCs w:val="21"/>
+        </w:rPr>
+        <w:t>contraintes : conserver le sens ; conserver la structure ; conserver les termes techniques ; ne</w:t>
+      </w:r>
+    </w:p>
+    <w:p>
+      <w:pPr>
+        <w:rPr>
+          <w:rFonts w:ascii="Times New Roman" w:hAnsi="Times New Roman" w:cs="Times New Roman"/>
+          <w:sz w:val="24"/>
+          <w:szCs w:val="24"/>
+        </w:rPr>
+      </w:pPr>
+      <w:r>
+        <w:rPr>
+          <w:rFonts w:ascii="CIDFont+F1" w:hAnsi="CIDFont+F1" w:cs="CIDFont+F1"/>
+          <w:kern w:val="0"/>
+          <w:sz w:val="21"/>
+          <w:szCs w:val="21"/>
+        </w:rPr>
+        <w:t>pas résumer ; ne rajoute aucune information</w:t>
+      </w:r>
+    </w:p>
+    <w:p>
+      <w:pPr>
+        <w:spacing w:after="0" w:line="240" w:lineRule="auto"/>
+        <w:ind w:left="708"/>
+        <w:rPr>
+          <w:rFonts w:ascii="Times New Roman" w:eastAsia="Times New Roman" w:hAnsi="Times New Roman" w:cs="Times New Roman"/>
+          <w:color w:val="2F5496" w:themeColor="accent1" w:themeShade="BF"/>
+          <w:kern w:val="0"/>
+          <w:sz w:val="24"/>
+          <w:szCs w:val="24"/>
+          <w:lang w:eastAsia="fr-FR"/>
+          <w14:ligatures w14:val="none"/>
+        </w:rPr>
+      </w:pPr>
+      <w:r>
+        <w:rPr>
+          <w:rFonts w:ascii="Times New Roman" w:eastAsia="Times New Roman" w:hAnsi="Times New Roman" w:cs="Times New Roman"/>
+          <w:color w:val="2F5496" w:themeColor="accent1" w:themeShade="BF"/>
+          <w:kern w:val="0"/>
+          <w:sz w:val="24"/>
+          <w:szCs w:val="24"/>
+          <w:lang w:eastAsia="fr-FR"/>
+          <w14:ligatures w14:val="none"/>
+        </w:rPr>
+        <w:t>Tu es un traducteur professionnel spécialisé dans la traduction de documents du français vers l'anglais.</w:t>
+      </w:r>
+    </w:p>
+    <w:p>
+      <w:pPr>
+        <w:spacing w:after="0" w:line="240" w:lineRule="auto"/>
+        <w:ind w:left="708"/>
+        <w:rPr>
+          <w:rFonts w:ascii="Times New Roman" w:eastAsia="Times New Roman" w:hAnsi="Times New Roman" w:cs="Times New Roman"/>
+          <w:color w:val="2F5496" w:themeColor="accent1" w:themeShade="BF"/>
+          <w:kern w:val="0"/>
+          <w:sz w:val="24"/>
+          <w:szCs w:val="24"/>
+          <w:lang w:eastAsia="fr-FR"/>
+          <w14:ligatures w14:val="none"/>
+        </w:rPr>
+      </w:pPr>
+      <w:r>
+        <w:rPr>
+          <w:rFonts w:ascii="Times New Roman" w:eastAsia="Times New Roman" w:hAnsi="Times New Roman" w:cs="Times New Roman"/>
+          <w:color w:val="2F5496" w:themeColor="accent1" w:themeShade="BF"/>
+          <w:kern w:val="0"/>
+          <w:sz w:val="24"/>
+          <w:szCs w:val="24"/>
+          <w:lang w:eastAsia="fr-FR"/>
+          <w14:ligatures w14:val="none"/>
+        </w:rPr>
+        <w:t>Traduis intégralement le document français suivant en anglais.</w:t>
+      </w:r>
+    </w:p>
+    <w:p>
+      <w:pPr>
+        <w:spacing w:after="0" w:line="240" w:lineRule="auto"/>
+        <w:ind w:left="708"/>
+        <w:rPr>
+          <w:rFonts w:ascii="Times New Roman" w:eastAsia="Times New Roman" w:hAnsi="Times New Roman" w:cs="Times New Roman"/>
+          <w:color w:val="2F5496" w:themeColor="accent1" w:themeShade="BF"/>
+          <w:kern w:val="0"/>
+          <w:sz w:val="24"/>
+          <w:szCs w:val="24"/>
+          <w:lang w:eastAsia="fr-FR"/>
+          <w14:ligatures w14:val="none"/>
+        </w:rPr>
+      </w:pPr>
+      <w:r>
+        <w:rPr>
+          <w:rFonts w:ascii="Times New Roman" w:eastAsia="Times New Roman" w:hAnsi="Times New Roman" w:cs="Times New Roman"/>
+          <w:color w:val="2F5496" w:themeColor="accent1" w:themeShade="BF"/>
+          <w:kern w:val="0"/>
+          <w:sz w:val="24"/>
+          <w:szCs w:val="24"/>
+          <w:lang w:eastAsia="fr-FR"/>
+          <w14:ligatures w14:val="none"/>
+        </w:rPr>
+        <w:t>Respecte strictement les contraintes suivantes :</w:t>
+      </w:r>
+    </w:p>
+    <w:p>
+      <w:pPr>
+        <w:numPr>
+          <w:ilvl w:val="0"/>
+          <w:numId w:val="12"/>
+        </w:numPr>
+        <w:tabs>
+          <w:tab w:val="clear" w:pos="720"/>
+          <w:tab w:val="num" w:pos="1428"/>
+        </w:tabs>
+        <w:spacing w:after="0" w:line="240" w:lineRule="auto"/>
+        <w:ind w:left="1428"/>
+        <w:rPr>
+          <w:rFonts w:ascii="Times New Roman" w:eastAsia="Times New Roman" w:hAnsi="Times New Roman" w:cs="Times New Roman"/>
+          <w:color w:val="2F5496" w:themeColor="accent1" w:themeShade="BF"/>
+          <w:kern w:val="0"/>
+          <w:sz w:val="24"/>
+          <w:szCs w:val="24"/>
+          <w:lang w:eastAsia="fr-FR"/>
+          <w14:ligatures w14:val="none"/>
+        </w:rPr>
+      </w:pPr>
+      <w:r>
+        <w:rPr>
+          <w:rFonts w:ascii="Times New Roman" w:eastAsia="Times New Roman" w:hAnsi="Times New Roman" w:cs="Times New Roman"/>
+          <w:color w:val="2F5496" w:themeColor="accent1" w:themeShade="BF"/>
+          <w:kern w:val="0"/>
+          <w:sz w:val="24"/>
+          <w:szCs w:val="24"/>
+          <w:lang w:eastAsia="fr-FR"/>
+          <w14:ligatures w14:val="none"/>
+        </w:rPr>
+        <w:t>Conserve exactement le sens du document original.</w:t>
+      </w:r>
+    </w:p>
+    <w:p>
+      <w:pPr>
+        <w:numPr>
+          <w:ilvl w:val="0"/>
+          <w:numId w:val="12"/>
+        </w:numPr>
+        <w:tabs>
+          <w:tab w:val="clear" w:pos="720"/>
+          <w:tab w:val="num" w:pos="1428"/>
+        </w:tabs>
+        <w:spacing w:after="0" w:line="240" w:lineRule="auto"/>
+        <w:ind w:left="1428"/>
+        <w:rPr>
+          <w:rFonts w:ascii="Times New Roman" w:eastAsia="Times New Roman" w:hAnsi="Times New Roman" w:cs="Times New Roman"/>
+          <w:color w:val="2F5496" w:themeColor="accent1" w:themeShade="BF"/>
+          <w:kern w:val="0"/>
+          <w:sz w:val="24"/>
+          <w:szCs w:val="24"/>
+          <w:lang w:eastAsia="fr-FR"/>
+          <w14:ligatures w14:val="none"/>
+        </w:rPr>
+      </w:pPr>
+      <w:r>
+        <w:rPr>
+          <w:rFonts w:ascii="Times New Roman" w:eastAsia="Times New Roman" w:hAnsi="Times New Roman" w:cs="Times New Roman"/>
+          <w:color w:val="2F5496" w:themeColor="accent1" w:themeShade="BF"/>
+          <w:kern w:val="0"/>
+          <w:sz w:val="24"/>
+          <w:szCs w:val="24"/>
+          <w:lang w:eastAsia="fr-FR"/>
+          <w14:ligatures w14:val="none"/>
+        </w:rPr>
+        <w:t>Conserve la structure du document : titres, sous-titres, paragraphes, listes et ordre des informations.</w:t>
+      </w:r>
+    </w:p>
+    <w:p>
+      <w:pPr>
+        <w:numPr>
+          <w:ilvl w:val="0"/>
+          <w:numId w:val="12"/>
+        </w:numPr>
+        <w:tabs>
+          <w:tab w:val="clear" w:pos="720"/>
+          <w:tab w:val="num" w:pos="1428"/>
+        </w:tabs>
+        <w:spacing w:after="0" w:line="240" w:lineRule="auto"/>
+        <w:ind w:left="1428"/>
+        <w:rPr>
+          <w:rFonts w:ascii="Times New Roman" w:eastAsia="Times New Roman" w:hAnsi="Times New Roman" w:cs="Times New Roman"/>
+          <w:color w:val="2F5496" w:themeColor="accent1" w:themeShade="BF"/>
+          <w:kern w:val="0"/>
+          <w:sz w:val="24"/>
+          <w:szCs w:val="24"/>
+          <w:lang w:eastAsia="fr-FR"/>
+          <w14:ligatures w14:val="none"/>
+        </w:rPr>
+      </w:pPr>
+      <w:r>
+        <w:rPr>
+          <w:rFonts w:ascii="Times New Roman" w:eastAsia="Times New Roman" w:hAnsi="Times New Roman" w:cs="Times New Roman"/>
+          <w:color w:val="2F5496" w:themeColor="accent1" w:themeShade="BF"/>
+          <w:kern w:val="0"/>
+          <w:sz w:val="24"/>
+          <w:szCs w:val="24"/>
+          <w:lang w:eastAsia="fr-FR"/>
+          <w14:ligatures w14:val="none"/>
+        </w:rPr>
+        <w:t>Conserve les termes techniques et utilise leur traduction anglaise appropriée lorsqu'une traduction existe.</w:t>
+      </w:r>
+    </w:p>
+    <w:p>
+      <w:pPr>
+        <w:numPr>
+          <w:ilvl w:val="0"/>
+          <w:numId w:val="12"/>
+        </w:numPr>
+        <w:tabs>
+          <w:tab w:val="clear" w:pos="720"/>
+          <w:tab w:val="num" w:pos="1428"/>
+        </w:tabs>
+        <w:spacing w:after="0" w:line="240" w:lineRule="auto"/>
+        <w:ind w:left="1428"/>
+        <w:rPr>
+          <w:rFonts w:ascii="Times New Roman" w:eastAsia="Times New Roman" w:hAnsi="Times New Roman" w:cs="Times New Roman"/>
+          <w:color w:val="2F5496" w:themeColor="accent1" w:themeShade="BF"/>
+          <w:kern w:val="0"/>
+          <w:sz w:val="24"/>
+          <w:szCs w:val="24"/>
+          <w:lang w:eastAsia="fr-FR"/>
+          <w14:ligatures w14:val="none"/>
+        </w:rPr>
+      </w:pPr>
+      <w:r>
+        <w:rPr>
+          <w:rFonts w:ascii="Times New Roman" w:eastAsia="Times New Roman" w:hAnsi="Times New Roman" w:cs="Times New Roman"/>
+          <w:color w:val="2F5496" w:themeColor="accent1" w:themeShade="BF"/>
+          <w:kern w:val="0"/>
+          <w:sz w:val="24"/>
+          <w:szCs w:val="24"/>
+          <w:lang w:eastAsia="fr-FR"/>
+          <w14:ligatures w14:val="none"/>
+        </w:rPr>
+        <w:t>Ne résume aucune partie du document.</w:t>
+      </w:r>
+    </w:p>
+    <w:p>
+      <w:pPr>
+        <w:numPr>
+          <w:ilvl w:val="0"/>
+          <w:numId w:val="12"/>
+        </w:numPr>
+        <w:tabs>
+          <w:tab w:val="clear" w:pos="720"/>
+          <w:tab w:val="num" w:pos="1428"/>
+        </w:tabs>
+        <w:spacing w:after="0" w:line="240" w:lineRule="auto"/>
+        <w:ind w:left="1428"/>
+        <w:rPr>
+          <w:rFonts w:ascii="Times New Roman" w:eastAsia="Times New Roman" w:hAnsi="Times New Roman" w:cs="Times New Roman"/>
+          <w:color w:val="2F5496" w:themeColor="accent1" w:themeShade="BF"/>
+          <w:kern w:val="0"/>
+          <w:sz w:val="24"/>
+          <w:szCs w:val="24"/>
+          <w:lang w:eastAsia="fr-FR"/>
+          <w14:ligatures w14:val="none"/>
+        </w:rPr>
+      </w:pPr>
+      <w:r>
+        <w:rPr>
+          <w:rFonts w:ascii="Times New Roman" w:eastAsia="Times New Roman" w:hAnsi="Times New Roman" w:cs="Times New Roman"/>
+          <w:color w:val="2F5496" w:themeColor="accent1" w:themeShade="BF"/>
+          <w:kern w:val="0"/>
+          <w:sz w:val="24"/>
+          <w:szCs w:val="24"/>
+          <w:lang w:eastAsia="fr-FR"/>
+          <w14:ligatures w14:val="none"/>
+        </w:rPr>
+        <w:t>Ne supprime aucune information présente dans le document.</w:t>
+      </w:r>
+    </w:p>
+    <w:p>
+      <w:pPr>
+        <w:numPr>
+          <w:ilvl w:val="0"/>
+          <w:numId w:val="12"/>
+        </w:numPr>
+        <w:tabs>
+          <w:tab w:val="clear" w:pos="720"/>
+          <w:tab w:val="num" w:pos="1428"/>
+        </w:tabs>
+        <w:spacing w:after="0" w:line="240" w:lineRule="auto"/>
+        <w:ind w:left="1428"/>
+        <w:rPr>
+          <w:rFonts w:ascii="Times New Roman" w:eastAsia="Times New Roman" w:hAnsi="Times New Roman" w:cs="Times New Roman"/>
+          <w:color w:val="2F5496" w:themeColor="accent1" w:themeShade="BF"/>
+          <w:kern w:val="0"/>
+          <w:sz w:val="24"/>
+          <w:szCs w:val="24"/>
+          <w:lang w:eastAsia="fr-FR"/>
+          <w14:ligatures w14:val="none"/>
+        </w:rPr>
+      </w:pPr>
+      <w:r>
+        <w:rPr>
+          <w:rFonts w:ascii="Times New Roman" w:eastAsia="Times New Roman" w:hAnsi="Times New Roman" w:cs="Times New Roman"/>
+          <w:color w:val="2F5496" w:themeColor="accent1" w:themeShade="BF"/>
+          <w:kern w:val="0"/>
+          <w:sz w:val="24"/>
+          <w:szCs w:val="24"/>
+          <w:lang w:eastAsia="fr-FR"/>
+          <w14:ligatures w14:val="none"/>
+        </w:rPr>
+        <w:t>N'ajoute aucune information, explication, exemple ou commentaire qui n'est pas présent dans le document original.</w:t>
+      </w:r>
+    </w:p>
+    <w:p>
+      <w:pPr>
+        <w:spacing w:after="0" w:line="240" w:lineRule="auto"/>
+        <w:rPr>
+          <w:rFonts w:ascii="Times New Roman" w:eastAsia="Times New Roman" w:hAnsi="Times New Roman" w:cs="Times New Roman"/>
+          <w:color w:val="2F5496" w:themeColor="accent1" w:themeShade="BF"/>
+          <w:kern w:val="0"/>
+          <w:sz w:val="24"/>
+          <w:szCs w:val="24"/>
+          <w:lang w:eastAsia="fr-FR"/>
+          <w14:ligatures w14:val="none"/>
+        </w:rPr>
+      </w:pPr>
+    </w:p>
+    <w:p>
+      <w:pPr>
+        <w:spacing w:after="0" w:line="240" w:lineRule="auto"/>
+        <w:rPr>
+          <w:rFonts w:ascii="Times New Roman" w:eastAsia="Times New Roman" w:hAnsi="Times New Roman" w:cs="Times New Roman"/>
+          <w:color w:val="2F5496" w:themeColor="accent1" w:themeShade="BF"/>
+          <w:kern w:val="0"/>
+          <w:sz w:val="24"/>
+          <w:szCs w:val="24"/>
+          <w:lang w:eastAsia="fr-FR"/>
+          <w14:ligatures w14:val="none"/>
+        </w:rPr>
+      </w:pPr>
+    </w:p>
+    <w:p>
+      <w:pPr>
+        <w:numPr>
+          <w:ilvl w:val="0"/>
+          <w:numId w:val="12"/>
+        </w:numPr>
+        <w:tabs>
+          <w:tab w:val="clear" w:pos="720"/>
+          <w:tab w:val="num" w:pos="1428"/>
+        </w:tabs>
+        <w:spacing w:after="0" w:line="240" w:lineRule="auto"/>
+        <w:ind w:left="1428"/>
+        <w:rPr>
+          <w:rFonts w:ascii="Times New Roman" w:eastAsia="Times New Roman" w:hAnsi="Times New Roman" w:cs="Times New Roman"/>
+          <w:color w:val="2F5496" w:themeColor="accent1" w:themeShade="BF"/>
+          <w:kern w:val="0"/>
+          <w:sz w:val="24"/>
+          <w:szCs w:val="24"/>
+          <w:lang w:eastAsia="fr-FR"/>
+          <w14:ligatures w14:val="none"/>
+        </w:rPr>
+      </w:pPr>
+      <w:r>
+        <w:rPr>
+          <w:rFonts w:ascii="Times New Roman" w:eastAsia="Times New Roman" w:hAnsi="Times New Roman" w:cs="Times New Roman"/>
+          <w:color w:val="2F5496" w:themeColor="accent1" w:themeShade="BF"/>
+          <w:kern w:val="0"/>
+          <w:sz w:val="24"/>
+          <w:szCs w:val="24"/>
+          <w:lang w:eastAsia="fr-FR"/>
+          <w14:ligatures w14:val="none"/>
+        </w:rPr>
+        <w:t>Ne modifie pas les chiffres, dates, noms propres, références ou données techniques.</w:t>
+      </w:r>
+    </w:p>
+    <w:p>
+      <w:pPr>
+        <w:numPr>
+          <w:ilvl w:val="0"/>
+          <w:numId w:val="12"/>
+        </w:numPr>
+        <w:tabs>
+          <w:tab w:val="clear" w:pos="720"/>
+          <w:tab w:val="num" w:pos="1428"/>
+        </w:tabs>
+        <w:spacing w:after="0" w:line="240" w:lineRule="auto"/>
+        <w:ind w:left="1428"/>
+        <w:rPr>
+          <w:rFonts w:ascii="Times New Roman" w:eastAsia="Times New Roman" w:hAnsi="Times New Roman" w:cs="Times New Roman"/>
+          <w:color w:val="2F5496" w:themeColor="accent1" w:themeShade="BF"/>
+          <w:kern w:val="0"/>
+          <w:sz w:val="24"/>
+          <w:szCs w:val="24"/>
+          <w:lang w:eastAsia="fr-FR"/>
+          <w14:ligatures w14:val="none"/>
+        </w:rPr>
+      </w:pPr>
+      <w:r>
+        <w:rPr>
+          <w:rFonts w:ascii="Times New Roman" w:eastAsia="Times New Roman" w:hAnsi="Times New Roman" w:cs="Times New Roman"/>
+          <w:color w:val="2F5496" w:themeColor="accent1" w:themeShade="BF"/>
+          <w:kern w:val="0"/>
+          <w:sz w:val="24"/>
+          <w:szCs w:val="24"/>
+          <w:lang w:eastAsia="fr-FR"/>
+          <w14:ligatures w14:val="none"/>
+        </w:rPr>
+        <w:t>Retourne uniquement la traduction en anglais.</w:t>
+      </w:r>
+    </w:p>
+    <w:p>
+      <w:pPr>
+        <w:rPr>
+          <w:rFonts w:ascii="Times New Roman" w:hAnsi="Times New Roman" w:cs="Times New Roman"/>
+          <w:sz w:val="24"/>
+          <w:szCs w:val="24"/>
+        </w:rPr>
+      </w:pPr>
     </w:p>
     <w:sectPr>
       <w:headerReference w:type="default" r:id="rId22"/>
@@ -6595,6 +7066,155 @@
 <file path=word/numbering.xml><?xml version="1.0" encoding="utf-8"?>
 <w:numbering xmlns:wpc="http://schemas.microsoft.com/office/word/2010/wordprocessingCanvas" xmlns:cx="http://schemas.microsoft.com/office/drawing/2014/chartex" xmlns:cx1="http://schemas.microsoft.com/office/drawing/2015/9/8/chartex" xmlns:cx2="http://schemas.microsoft.com/office/drawing/2015/10/21/chartex" xmlns:cx3="http://schemas.microsoft.com/office/drawing/2016/5/9/chartex" xmlns:cx4="http://schemas.microsoft.com/office/drawing/2016/5/10/chartex" xmlns:cx5="http://schemas.microsoft.com/office/drawing/2016/5/11/chartex" xmlns:cx6="http://schemas.microsoft.com/office/drawing/2016/5/12/chartex" xmlns:cx7="http://schemas.microsoft.com/office/drawing/2016/5/13/chartex" xmlns:cx8="http://schemas.microsoft.com/office/drawing/2016/5/14/chartex" xmlns:mc="http://schemas.openxmlformats.org/markup-compatibility/2006" xmlns:aink="http://schemas.microsoft.com/office/drawing/2016/ink" xmlns:am3d="http://schemas.microsoft.com/office/drawing/2017/model3d" xmlns:o="urn:schemas-microsoft-com:office:office" xmlns:r="http://schemas.openxmlformats.org/officeDocument/2006/relationships" xmlns:m="http://schemas.openxmlformats.org/officeDocument/2006/math" xmlns:v="urn:schemas-microsoft-com:vml" xmlns:wp14="http://schemas.microsoft.com/office/word/2010/wordprocessingDrawing" xmlns:wp="http://schemas.openxmlformats.org/drawingml/2006/wordprocessingDrawing" xmlns:w10="urn:schemas-microsoft-com:office:word" xmlns:w="http://schemas.openxmlformats.org/wordprocessingml/2006/main" xmlns:w14="http://schemas.microsoft.com/office/word/2010/wordml" xmlns:w15="http://schemas.microsoft.com/office/word/2012/wordml" xmlns:w16cex="http://schemas.microsoft.com/office/word/2018/wordml/cex" xmlns:w16cid="http://schemas.microsoft.com/office/word/2016/wordml/cid" xmlns:w16="http://schemas.microsoft.com/office/word/2018/wordml" xmlns:w16sdtdh="http://schemas.microsoft.com/office/word/2020/wordml/sdtdatahash" xmlns:w16se="http://schemas.microsoft.com/office/word/2015/wordml/symex" xmlns:wpg="http://schemas.microsoft.com/office/word/2010/wordprocessingGroup" xmlns:wpi="http://schemas.microsoft.com/office/word/2010/wordprocessingInk" xmlns:wne="http://schemas.microsoft.com/office/word/2006/wordml" xmlns:wps="http://schemas.microsoft.com/office/word/2010/wordprocessingShape" mc:Ignorable="w14 w15 w16se w16cid w16 w16cex w16sdtdh wp14">
   <w:abstractNum w:abstractNumId="0" w15:restartNumberingAfterBreak="0">
+    <w:nsid w:val="05525156"/>
+    <w:multiLevelType w:val="multilevel"/>
+    <w:tmpl w:val="33209BE8"/>
+    <w:lvl w:ilvl="0">
+      <w:start w:val="1"/>
+      <w:numFmt w:val="bullet"/>
+      <w:lvlText w:val=""/>
+      <w:lvlJc w:val="left"/>
+      <w:pPr>
+        <w:tabs>
+          <w:tab w:val="num" w:pos="720"/>
+        </w:tabs>
+        <w:ind w:left="720" w:hanging="360"/>
+      </w:pPr>
+      <w:rPr>
+        <w:rFonts w:ascii="Symbol" w:hAnsi="Symbol" w:hint="default"/>
+        <w:sz w:val="20"/>
+      </w:rPr>
+    </w:lvl>
+    <w:lvl w:ilvl="1" w:tentative="1">
+      <w:start w:val="1"/>
+      <w:numFmt w:val="bullet"/>
+      <w:lvlText w:val="o"/>
+      <w:lvlJc w:val="left"/>
+      <w:pPr>
+        <w:tabs>
+          <w:tab w:val="num" w:pos="1440"/>
+        </w:tabs>
+        <w:ind w:left="1440" w:hanging="360"/>
+      </w:pPr>
+      <w:rPr>
+        <w:rFonts w:ascii="Courier New" w:hAnsi="Courier New" w:hint="default"/>
+        <w:sz w:val="20"/>
+      </w:rPr>
+    </w:lvl>
+    <w:lvl w:ilvl="2" w:tentative="1">
+      <w:start w:val="1"/>
+      <w:numFmt w:val="bullet"/>
+      <w:lvlText w:val=""/>
+      <w:lvlJc w:val="left"/>
+      <w:pPr>
+        <w:tabs>
+          <w:tab w:val="num" w:pos="2160"/>
+        </w:tabs>
+        <w:ind w:left="2160" w:hanging="360"/>
+      </w:pPr>
+      <w:rPr>
+        <w:rFonts w:ascii="Wingdings" w:hAnsi="Wingdings" w:hint="default"/>
+        <w:sz w:val="20"/>
+      </w:rPr>
+    </w:lvl>
+    <w:lvl w:ilvl="3" w:tentative="1">
+      <w:start w:val="1"/>
+      <w:numFmt w:val="bullet"/>
+      <w:lvlText w:val=""/>
+      <w:lvlJc w:val="left"/>
+      <w:pPr>
+        <w:tabs>
+          <w:tab w:val="num" w:pos="2880"/>
+        </w:tabs>
+        <w:ind w:left="2880" w:hanging="360"/>
+      </w:pPr>
+      <w:rPr>
+        <w:rFonts w:ascii="Wingdings" w:hAnsi="Wingdings" w:hint="default"/>
+        <w:sz w:val="20"/>
+      </w:rPr>
+    </w:lvl>
+    <w:lvl w:ilvl="4" w:tentative="1">
+      <w:start w:val="1"/>
+      <w:numFmt w:val="bullet"/>
+      <w:lvlText w:val=""/>
+      <w:lvlJc w:val="left"/>
+      <w:pPr>
+        <w:tabs>
+          <w:tab w:val="num" w:pos="3600"/>
+        </w:tabs>
+        <w:ind w:left="3600" w:hanging="360"/>
+      </w:pPr>
+      <w:rPr>
+        <w:rFonts w:ascii="Wingdings" w:hAnsi="Wingdings" w:hint="default"/>
+        <w:sz w:val="20"/>
+      </w:rPr>
+    </w:lvl>
+    <w:lvl w:ilvl="5" w:tentative="1">
+      <w:start w:val="1"/>
+      <w:numFmt w:val="bullet"/>
+      <w:lvlText w:val=""/>
+      <w:lvlJc w:val="left"/>
+      <w:pPr>
+        <w:tabs>
+          <w:tab w:val="num" w:pos="4320"/>
+        </w:tabs>
+        <w:ind w:left="4320" w:hanging="360"/>
+      </w:pPr>
+      <w:rPr>
+        <w:rFonts w:ascii="Wingdings" w:hAnsi="Wingdings" w:hint="default"/>
+        <w:sz w:val="20"/>
+      </w:rPr>
+    </w:lvl>
+    <w:lvl w:ilvl="6" w:tentative="1">
+      <w:start w:val="1"/>
+      <w:numFmt w:val="bullet"/>
+      <w:lvlText w:val=""/>
+      <w:lvlJc w:val="left"/>
+      <w:pPr>
+        <w:tabs>
+          <w:tab w:val="num" w:pos="5040"/>
+        </w:tabs>
+        <w:ind w:left="5040" w:hanging="360"/>
+      </w:pPr>
+      <w:rPr>
+        <w:rFonts w:ascii="Wingdings" w:hAnsi="Wingdings" w:hint="default"/>
+        <w:sz w:val="20"/>
+      </w:rPr>
+    </w:lvl>
+    <w:lvl w:ilvl="7" w:tentative="1">
+      <w:start w:val="1"/>
+      <w:numFmt w:val="bullet"/>
+      <w:lvlText w:val=""/>
+      <w:lvlJc w:val="left"/>
+      <w:pPr>
+        <w:tabs>
+          <w:tab w:val="num" w:pos="5760"/>
+        </w:tabs>
+        <w:ind w:left="5760" w:hanging="360"/>
+      </w:pPr>
+      <w:rPr>
+        <w:rFonts w:ascii="Wingdings" w:hAnsi="Wingdings" w:hint="default"/>
+        <w:sz w:val="20"/>
+      </w:rPr>
+    </w:lvl>
+    <w:lvl w:ilvl="8" w:tentative="1">
+      <w:start w:val="1"/>
+      <w:numFmt w:val="bullet"/>
+      <w:lvlText w:val=""/>
+      <w:lvlJc w:val="left"/>
+      <w:pPr>
+        <w:tabs>
+          <w:tab w:val="num" w:pos="6480"/>
+        </w:tabs>
+        <w:ind w:left="6480" w:hanging="360"/>
+      </w:pPr>
+      <w:rPr>
+        <w:rFonts w:ascii="Wingdings" w:hAnsi="Wingdings" w:hint="default"/>
+        <w:sz w:val="20"/>
+      </w:rPr>
+    </w:lvl>
+  </w:abstractNum>
+  <w:abstractNum w:abstractNumId="1" w15:restartNumberingAfterBreak="0">
     <w:nsid w:val="16B42315"/>
     <w:multiLevelType w:val="multilevel"/>
     <w:tmpl w:val="3CF28954"/>
@@ -6743,7 +7363,7 @@
       </w:rPr>
     </w:lvl>
   </w:abstractNum>
-  <w:abstractNum w:abstractNumId="1" w15:restartNumberingAfterBreak="0">
+  <w:abstractNum w:abstractNumId="2" w15:restartNumberingAfterBreak="0">
     <w:nsid w:val="1A8F2050"/>
     <w:multiLevelType w:val="multilevel"/>
     <w:tmpl w:val="CCB8542C"/>
@@ -6892,7 +7512,7 @@
       </w:rPr>
     </w:lvl>
   </w:abstractNum>
-  <w:abstractNum w:abstractNumId="2" w15:restartNumberingAfterBreak="0">
+  <w:abstractNum w:abstractNumId="3" w15:restartNumberingAfterBreak="0">
     <w:nsid w:val="23FA75D2"/>
     <w:multiLevelType w:val="multilevel"/>
     <w:tmpl w:val="7B086CF2"/>
@@ -7005,7 +7625,7 @@
       </w:pPr>
     </w:lvl>
   </w:abstractNum>
-  <w:abstractNum w:abstractNumId="3" w15:restartNumberingAfterBreak="0">
+  <w:abstractNum w:abstractNumId="4" w15:restartNumberingAfterBreak="0">
     <w:nsid w:val="30817C99"/>
     <w:multiLevelType w:val="hybridMultilevel"/>
     <w:tmpl w:val="B28054F4"/>
@@ -7091,7 +7711,7 @@
       </w:pPr>
     </w:lvl>
   </w:abstractNum>
-  <w:abstractNum w:abstractNumId="4" w15:restartNumberingAfterBreak="0">
+  <w:abstractNum w:abstractNumId="5" w15:restartNumberingAfterBreak="0">
     <w:nsid w:val="32024712"/>
     <w:multiLevelType w:val="multilevel"/>
     <w:tmpl w:val="7716EFCE"/>
@@ -7240,7 +7860,7 @@
       </w:rPr>
     </w:lvl>
   </w:abstractNum>
-  <w:abstractNum w:abstractNumId="5" w15:restartNumberingAfterBreak="0">
+  <w:abstractNum w:abstractNumId="6" w15:restartNumberingAfterBreak="0">
     <w:nsid w:val="3CA24848"/>
     <w:multiLevelType w:val="hybridMultilevel"/>
     <w:tmpl w:val="76B802A4"/>
@@ -7353,7 +7973,7 @@
       </w:rPr>
     </w:lvl>
   </w:abstractNum>
-  <w:abstractNum w:abstractNumId="6" w15:restartNumberingAfterBreak="0">
+  <w:abstractNum w:abstractNumId="7" w15:restartNumberingAfterBreak="0">
     <w:nsid w:val="4996411C"/>
     <w:multiLevelType w:val="multilevel"/>
     <w:tmpl w:val="218091C0"/>
@@ -7470,7 +8090,7 @@
       </w:pPr>
     </w:lvl>
   </w:abstractNum>
-  <w:abstractNum w:abstractNumId="7" w15:restartNumberingAfterBreak="0">
+  <w:abstractNum w:abstractNumId="8" w15:restartNumberingAfterBreak="0">
     <w:nsid w:val="56D568C8"/>
     <w:multiLevelType w:val="multilevel"/>
     <w:tmpl w:val="3392CAD2"/>
@@ -7619,7 +8239,7 @@
       </w:rPr>
     </w:lvl>
   </w:abstractNum>
-  <w:abstractNum w:abstractNumId="8" w15:restartNumberingAfterBreak="0">
+  <w:abstractNum w:abstractNumId="9" w15:restartNumberingAfterBreak="0">
     <w:nsid w:val="61053792"/>
     <w:multiLevelType w:val="multilevel"/>
     <w:tmpl w:val="49E43BFC"/>
@@ -7768,7 +8388,7 @@
       </w:rPr>
     </w:lvl>
   </w:abstractNum>
-  <w:abstractNum w:abstractNumId="9" w15:restartNumberingAfterBreak="0">
+  <w:abstractNum w:abstractNumId="10" w15:restartNumberingAfterBreak="0">
     <w:nsid w:val="6DA36487"/>
     <w:multiLevelType w:val="multilevel"/>
     <w:tmpl w:val="9C4C8532"/>
@@ -7917,7 +8537,7 @@
       </w:rPr>
     </w:lvl>
   </w:abstractNum>
-  <w:abstractNum w:abstractNumId="10" w15:restartNumberingAfterBreak="0">
+  <w:abstractNum w:abstractNumId="11" w15:restartNumberingAfterBreak="0">
     <w:nsid w:val="6EB85EAA"/>
     <w:multiLevelType w:val="hybridMultilevel"/>
     <w:tmpl w:val="DB76C824"/>
@@ -8031,37 +8651,40 @@
     </w:lvl>
   </w:abstractNum>
   <w:num w:numId="1">
+    <w:abstractNumId w:val="11"/>
+  </w:num>
+  <w:num w:numId="2">
+    <w:abstractNumId w:val="6"/>
+  </w:num>
+  <w:num w:numId="3">
+    <w:abstractNumId w:val="8"/>
+  </w:num>
+  <w:num w:numId="4">
+    <w:abstractNumId w:val="5"/>
+  </w:num>
+  <w:num w:numId="5">
+    <w:abstractNumId w:val="4"/>
+  </w:num>
+  <w:num w:numId="6">
+    <w:abstractNumId w:val="9"/>
+  </w:num>
+  <w:num w:numId="7">
+    <w:abstractNumId w:val="3"/>
+  </w:num>
+  <w:num w:numId="8">
     <w:abstractNumId w:val="10"/>
   </w:num>
-  <w:num w:numId="2">
-    <w:abstractNumId w:val="5"/>
+  <w:num w:numId="9">
+    <w:abstractNumId w:val="1"/>
   </w:num>
-  <w:num w:numId="3">
+  <w:num w:numId="10">
     <w:abstractNumId w:val="7"/>
   </w:num>
-  <w:num w:numId="4">
-    <w:abstractNumId w:val="4"/>
-  </w:num>
-  <w:num w:numId="5">
-    <w:abstractNumId w:val="3"/>
-  </w:num>
-  <w:num w:numId="6">
-    <w:abstractNumId w:val="8"/>
-  </w:num>
-  <w:num w:numId="7">
+  <w:num w:numId="11">
     <w:abstractNumId w:val="2"/>
   </w:num>
-  <w:num w:numId="8">
-    <w:abstractNumId w:val="9"/>
-  </w:num>
-  <w:num w:numId="9">
+  <w:num w:numId="12">
     <w:abstractNumId w:val="0"/>
-  </w:num>
-  <w:num w:numId="10">
-    <w:abstractNumId w:val="6"/>
-  </w:num>
-  <w:num w:numId="11">
-    <w:abstractNumId w:val="1"/>
   </w:num>
 </w:numbering>
 </file>

</xml_diff>

<commit_message>
Créer un prompt permettant de classer un ticket informatique dans une catégorie
</commit_message>
<xml_diff>
--- a/Atelier Prompt.docx
+++ b/Atelier Prompt.docx
@@ -473,55 +473,7 @@
         <w:rPr>
           <w:color w:val="1F4E79" w:themeColor="accent5" w:themeShade="80"/>
         </w:rPr>
-        <w:t xml:space="preserve">Voici les retours des clients à analyser : </w:t>
-      </w:r>
-      <w:r>
-        <w:rPr>
-          <w:color w:val="1F4E79" w:themeColor="accent5" w:themeShade="80"/>
-        </w:rPr>
-        <w:t>"</w:t>
-      </w:r>
-      <w:r>
-        <w:rPr>
-          <w:color w:val="1F4E79" w:themeColor="accent5" w:themeShade="80"/>
-        </w:rPr>
-        <w:t xml:space="preserve"> Le produit est de très bonne qualité et je suis satisfait de mon achat </w:t>
-      </w:r>
-      <w:r>
-        <w:rPr>
-          <w:color w:val="1F4E79" w:themeColor="accent5" w:themeShade="80"/>
-        </w:rPr>
-        <w:t>"</w:t>
-      </w:r>
-      <w:r>
-        <w:rPr>
-          <w:color w:val="1F4E79" w:themeColor="accent5" w:themeShade="80"/>
-        </w:rPr>
-        <w:t xml:space="preserve"> </w:t>
-      </w:r>
-      <w:r>
-        <w:rPr>
-          <w:color w:val="1F4E79" w:themeColor="accent5" w:themeShade="80"/>
-        </w:rPr>
-        <w:t>"</w:t>
-      </w:r>
-      <w:r>
-        <w:rPr>
-          <w:color w:val="1F4E79" w:themeColor="accent5" w:themeShade="80"/>
-        </w:rPr>
-        <w:t xml:space="preserve"> La livraison a pris beaucoup trop de temps</w:t>
-      </w:r>
-      <w:r>
-        <w:rPr>
-          <w:color w:val="1F4E79" w:themeColor="accent5" w:themeShade="80"/>
-        </w:rPr>
-        <w:t>"</w:t>
-      </w:r>
-      <w:r>
-        <w:rPr>
-          <w:color w:val="1F4E79" w:themeColor="accent5" w:themeShade="80"/>
-        </w:rPr>
-        <w:t xml:space="preserve">  "je vous le </w:t>
+        <w:t xml:space="preserve">Voici les retours des clients à analyser : " Le produit est de très bonne qualité et je suis satisfait de mon achat " " La livraison a pris beaucoup trop de temps"  "je vous le </w:t>
       </w:r>
       <w:r>
         <w:rPr>
@@ -544,43 +496,7 @@
         <w:rPr>
           <w:color w:val="1F4E79" w:themeColor="accent5" w:themeShade="80"/>
         </w:rPr>
-        <w:t xml:space="preserve">Présente les résultats sous forme de tableau avec les colonnes suivantes : </w:t>
-      </w:r>
-      <w:r>
-        <w:rPr>
-          <w:color w:val="1F4E79" w:themeColor="accent5" w:themeShade="80"/>
-        </w:rPr>
-        <w:t>c</w:t>
-      </w:r>
-      <w:r>
-        <w:rPr>
-          <w:color w:val="1F4E79" w:themeColor="accent5" w:themeShade="80"/>
-        </w:rPr>
-        <w:t xml:space="preserve">ategorie, Points positifs, </w:t>
-      </w:r>
-      <w:r>
-        <w:rPr>
-          <w:color w:val="1F4E79" w:themeColor="accent5" w:themeShade="80"/>
-        </w:rPr>
-        <w:t>p</w:t>
-      </w:r>
-      <w:r>
-        <w:rPr>
-          <w:color w:val="1F4E79" w:themeColor="accent5" w:themeShade="80"/>
-        </w:rPr>
-        <w:t xml:space="preserve">roblèmes, </w:t>
-      </w:r>
-      <w:r>
-        <w:rPr>
-          <w:color w:val="1F4E79" w:themeColor="accent5" w:themeShade="80"/>
-        </w:rPr>
-        <w:t>r</w:t>
-      </w:r>
-      <w:r>
-        <w:rPr>
-          <w:color w:val="1F4E79" w:themeColor="accent5" w:themeShade="80"/>
-        </w:rPr>
-        <w:t xml:space="preserve">ecommandations .  </w:t>
+        <w:t xml:space="preserve">Présente les résultats sous forme de tableau avec les colonnes suivantes : categorie, Points positifs, problèmes, recommandations .  </w:t>
       </w:r>
     </w:p>
     <w:p>
@@ -602,6 +518,7 @@
       </w:pPr>
       <w:r>
         <w:rPr>
+          <w:noProof/>
           <w:color w:val="1F4E79" w:themeColor="accent5" w:themeShade="80"/>
         </w:rPr>
         <w:drawing>
@@ -724,19 +641,7 @@
           <w:sz w:val="32"/>
           <w:szCs w:val="32"/>
         </w:rPr>
-        <w:t xml:space="preserve">Comparer les techniques de prompting </w:t>
-      </w:r>
-      <w:r>
-        <w:rPr>
-          <w:rFonts w:ascii="Times New Roman" w:hAnsi="Times New Roman" w:cs="Times New Roman"/>
-          <w:b/>
-          <w:bCs/>
-          <w:color w:val="323E4F" w:themeColor="text2" w:themeShade="BF"/>
-          <w:kern w:val="0"/>
-          <w:sz w:val="32"/>
-          <w:szCs w:val="32"/>
-        </w:rPr>
-        <w:t>:</w:t>
+        <w:t>Comparer les techniques de prompting :</w:t>
       </w:r>
     </w:p>
     <w:p>
@@ -943,19 +848,7 @@
         <w:rPr>
           <w:color w:val="2F5496" w:themeColor="accent1" w:themeShade="BF"/>
         </w:rPr>
-        <w:t>Classer le commentaire suivant parmi les classes "positif" , " négatif " ou "neutre "</w:t>
-      </w:r>
-      <w:r>
-        <w:rPr>
-          <w:color w:val="2F5496" w:themeColor="accent1" w:themeShade="BF"/>
-        </w:rPr>
-        <w:t xml:space="preserve"> </w:t>
-      </w:r>
-      <w:r>
-        <w:rPr>
-          <w:color w:val="2F5496" w:themeColor="accent1" w:themeShade="BF"/>
-        </w:rPr>
-        <w:t>Commentaire :</w:t>
+        <w:t>Classer le commentaire suivant parmi les classes "positif" , " négatif " ou "neutre " Commentaire :</w:t>
       </w:r>
       <w:r>
         <w:rPr>
@@ -979,6 +872,7 @@
       <w:r>
         <w:rPr>
           <w:rFonts w:ascii="Times New Roman" w:hAnsi="Times New Roman" w:cs="Times New Roman"/>
+          <w:noProof/>
           <w:color w:val="1F4E79" w:themeColor="accent5" w:themeShade="80"/>
           <w:sz w:val="24"/>
           <w:szCs w:val="24"/>
@@ -1331,6 +1225,7 @@
       <w:r>
         <w:rPr>
           <w:rFonts w:ascii="Times New Roman" w:hAnsi="Times New Roman" w:cs="Times New Roman"/>
+          <w:noProof/>
           <w:color w:val="1F4E79" w:themeColor="accent5" w:themeShade="80"/>
           <w:sz w:val="24"/>
           <w:szCs w:val="24"/>
@@ -1790,6 +1685,7 @@
       <w:r>
         <w:rPr>
           <w:rFonts w:ascii="Times New Roman" w:hAnsi="Times New Roman" w:cs="Times New Roman"/>
+          <w:noProof/>
           <w:color w:val="1F4E79" w:themeColor="accent5" w:themeShade="80"/>
           <w:sz w:val="24"/>
           <w:szCs w:val="24"/>
@@ -1987,42 +1883,7 @@
           <w14:ligatures w14:val="none"/>
         </w:rPr>
         <w:br/>
-      </w:r>
-      <w:r>
-        <w:rPr>
-          <w:rFonts w:ascii="Times New Roman" w:eastAsia="Times New Roman" w:hAnsi="Times New Roman" w:cs="Times New Roman"/>
-          <w:color w:val="2F5496" w:themeColor="accent1" w:themeShade="BF"/>
-          <w:kern w:val="0"/>
-          <w:sz w:val="24"/>
-          <w:szCs w:val="24"/>
-          <w:lang w:eastAsia="fr-FR"/>
-          <w14:ligatures w14:val="none"/>
-        </w:rPr>
-        <w:t>"</w:t>
-      </w:r>
-      <w:r>
-        <w:rPr>
-          <w:rFonts w:ascii="Times New Roman" w:eastAsia="Times New Roman" w:hAnsi="Times New Roman" w:cs="Times New Roman"/>
-          <w:color w:val="2F5496" w:themeColor="accent1" w:themeShade="BF"/>
-          <w:kern w:val="0"/>
-          <w:sz w:val="24"/>
-          <w:szCs w:val="24"/>
-          <w:lang w:eastAsia="fr-FR"/>
-          <w14:ligatures w14:val="none"/>
-        </w:rPr>
-        <w:t xml:space="preserve">Le service est rapide mais l'application plante régulièrement. </w:t>
-      </w:r>
-      <w:r>
-        <w:rPr>
-          <w:rFonts w:ascii="Times New Roman" w:eastAsia="Times New Roman" w:hAnsi="Times New Roman" w:cs="Times New Roman"/>
-          <w:color w:val="2F5496" w:themeColor="accent1" w:themeShade="BF"/>
-          <w:kern w:val="0"/>
-          <w:sz w:val="24"/>
-          <w:szCs w:val="24"/>
-          <w:lang w:eastAsia="fr-FR"/>
-          <w14:ligatures w14:val="none"/>
-        </w:rPr>
-        <w:t>"</w:t>
+        <w:t>"Le service est rapide mais l'application plante régulièrement. "</w:t>
       </w:r>
     </w:p>
     <w:p>
@@ -2306,6 +2167,7 @@
           <w:rFonts w:ascii="Times New Roman" w:hAnsi="Times New Roman" w:cs="Times New Roman"/>
           <w:b/>
           <w:bCs/>
+          <w:noProof/>
           <w:color w:val="1F4E79" w:themeColor="accent5" w:themeShade="80"/>
           <w:sz w:val="24"/>
           <w:szCs w:val="24"/>
@@ -2421,19 +2283,7 @@
           <w:sz w:val="32"/>
           <w:szCs w:val="32"/>
         </w:rPr>
-        <w:t>Prompt Engineering et raisonnement</w:t>
-      </w:r>
-      <w:r>
-        <w:rPr>
-          <w:rFonts w:ascii="Times New Roman" w:hAnsi="Times New Roman" w:cs="Times New Roman"/>
-          <w:b/>
-          <w:bCs/>
-          <w:color w:val="323E4F" w:themeColor="text2" w:themeShade="BF"/>
-          <w:kern w:val="0"/>
-          <w:sz w:val="32"/>
-          <w:szCs w:val="32"/>
-        </w:rPr>
-        <w:t xml:space="preserve"> :</w:t>
+        <w:t>Prompt Engineering et raisonnement :</w:t>
       </w:r>
     </w:p>
     <w:p>
@@ -2747,6 +2597,7 @@
       <w:r>
         <w:rPr>
           <w:rFonts w:ascii="Times New Roman" w:hAnsi="Times New Roman" w:cs="Times New Roman"/>
+          <w:noProof/>
           <w:color w:val="2F5496" w:themeColor="accent1" w:themeShade="BF"/>
           <w:kern w:val="0"/>
           <w:sz w:val="24"/>
@@ -2821,6 +2672,7 @@
       <w:r>
         <w:rPr>
           <w:rFonts w:ascii="Times New Roman" w:hAnsi="Times New Roman" w:cs="Times New Roman"/>
+          <w:noProof/>
           <w:color w:val="000000"/>
           <w:kern w:val="0"/>
           <w:sz w:val="24"/>
@@ -2955,6 +2807,7 @@
       <w:r>
         <w:rPr>
           <w:rFonts w:ascii="Times New Roman" w:hAnsi="Times New Roman" w:cs="Times New Roman"/>
+          <w:noProof/>
           <w:color w:val="000000"/>
           <w:kern w:val="0"/>
           <w:sz w:val="24"/>
@@ -3610,6 +3463,7 @@
       <w:r>
         <w:rPr>
           <w:rFonts w:ascii="Times New Roman" w:hAnsi="Times New Roman" w:cs="Times New Roman"/>
+          <w:noProof/>
           <w:sz w:val="24"/>
           <w:szCs w:val="24"/>
         </w:rPr>
@@ -4157,6 +4011,7 @@
       <w:r>
         <w:rPr>
           <w:rFonts w:ascii="Times New Roman" w:hAnsi="Times New Roman" w:cs="Times New Roman"/>
+          <w:noProof/>
           <w:sz w:val="24"/>
           <w:szCs w:val="24"/>
         </w:rPr>
@@ -4208,6 +4063,7 @@
       <w:r>
         <w:rPr>
           <w:rFonts w:ascii="Times New Roman" w:hAnsi="Times New Roman" w:cs="Times New Roman"/>
+          <w:noProof/>
           <w:sz w:val="24"/>
           <w:szCs w:val="24"/>
         </w:rPr>
@@ -5059,6 +4915,7 @@
       <w:r>
         <w:rPr>
           <w:rFonts w:ascii="Times New Roman" w:hAnsi="Times New Roman" w:cs="Times New Roman"/>
+          <w:noProof/>
           <w:sz w:val="24"/>
           <w:szCs w:val="24"/>
         </w:rPr>
@@ -5289,103 +5146,7 @@
           <w:lang w:eastAsia="fr-FR"/>
           <w14:ligatures w14:val="none"/>
         </w:rPr>
-        <w:t>Le JSON doit contenir uniquement les cinq propriétés suivantes :sentiment</w:t>
-      </w:r>
-      <w:r>
-        <w:rPr>
-          <w:rFonts w:ascii="Times New Roman" w:eastAsia="Times New Roman" w:hAnsi="Times New Roman" w:cs="Times New Roman"/>
-          <w:color w:val="2F5496" w:themeColor="accent1" w:themeShade="BF"/>
-          <w:kern w:val="0"/>
-          <w:sz w:val="24"/>
-          <w:szCs w:val="24"/>
-          <w:lang w:eastAsia="fr-FR"/>
-          <w14:ligatures w14:val="none"/>
-        </w:rPr>
-        <w:t xml:space="preserve">, </w:t>
-      </w:r>
-      <w:r>
-        <w:rPr>
-          <w:rFonts w:ascii="Times New Roman" w:eastAsia="Times New Roman" w:hAnsi="Times New Roman" w:cs="Times New Roman"/>
-          <w:color w:val="2F5496" w:themeColor="accent1" w:themeShade="BF"/>
-          <w:kern w:val="0"/>
-          <w:sz w:val="24"/>
-          <w:szCs w:val="24"/>
-          <w:lang w:eastAsia="fr-FR"/>
-          <w14:ligatures w14:val="none"/>
-        </w:rPr>
-        <w:t>categorie</w:t>
-      </w:r>
-      <w:r>
-        <w:rPr>
-          <w:rFonts w:ascii="Times New Roman" w:eastAsia="Times New Roman" w:hAnsi="Times New Roman" w:cs="Times New Roman"/>
-          <w:color w:val="2F5496" w:themeColor="accent1" w:themeShade="BF"/>
-          <w:kern w:val="0"/>
-          <w:sz w:val="24"/>
-          <w:szCs w:val="24"/>
-          <w:lang w:eastAsia="fr-FR"/>
-          <w14:ligatures w14:val="none"/>
-        </w:rPr>
-        <w:t xml:space="preserve">, </w:t>
-      </w:r>
-      <w:r>
-        <w:rPr>
-          <w:rFonts w:ascii="Times New Roman" w:eastAsia="Times New Roman" w:hAnsi="Times New Roman" w:cs="Times New Roman"/>
-          <w:color w:val="2F5496" w:themeColor="accent1" w:themeShade="BF"/>
-          <w:kern w:val="0"/>
-          <w:sz w:val="24"/>
-          <w:szCs w:val="24"/>
-          <w:lang w:eastAsia="fr-FR"/>
-          <w14:ligatures w14:val="none"/>
-        </w:rPr>
-        <w:t>urgence</w:t>
-      </w:r>
-      <w:r>
-        <w:rPr>
-          <w:rFonts w:ascii="Times New Roman" w:eastAsia="Times New Roman" w:hAnsi="Times New Roman" w:cs="Times New Roman"/>
-          <w:color w:val="2F5496" w:themeColor="accent1" w:themeShade="BF"/>
-          <w:kern w:val="0"/>
-          <w:sz w:val="24"/>
-          <w:szCs w:val="24"/>
-          <w:lang w:eastAsia="fr-FR"/>
-          <w14:ligatures w14:val="none"/>
-        </w:rPr>
-        <w:t xml:space="preserve">, </w:t>
-      </w:r>
-      <w:r>
-        <w:rPr>
-          <w:rFonts w:ascii="Times New Roman" w:eastAsia="Times New Roman" w:hAnsi="Times New Roman" w:cs="Times New Roman"/>
-          <w:color w:val="2F5496" w:themeColor="accent1" w:themeShade="BF"/>
-          <w:kern w:val="0"/>
-          <w:sz w:val="24"/>
-          <w:szCs w:val="24"/>
-          <w:lang w:eastAsia="fr-FR"/>
-          <w14:ligatures w14:val="none"/>
-        </w:rPr>
-        <w:t>probleme</w:t>
-      </w:r>
-      <w:r>
-        <w:rPr>
-          <w:rFonts w:ascii="Times New Roman" w:eastAsia="Times New Roman" w:hAnsi="Times New Roman" w:cs="Times New Roman"/>
-          <w:color w:val="2F5496" w:themeColor="accent1" w:themeShade="BF"/>
-          <w:kern w:val="0"/>
-          <w:sz w:val="24"/>
-          <w:szCs w:val="24"/>
-          <w:lang w:eastAsia="fr-FR"/>
-          <w14:ligatures w14:val="none"/>
-        </w:rPr>
-        <w:t xml:space="preserve"> et </w:t>
-      </w:r>
-      <w:r>
-        <w:rPr>
-          <w:rFonts w:ascii="Times New Roman" w:eastAsia="Times New Roman" w:hAnsi="Times New Roman" w:cs="Times New Roman"/>
-          <w:color w:val="2F5496" w:themeColor="accent1" w:themeShade="BF"/>
-          <w:kern w:val="0"/>
-          <w:sz w:val="24"/>
-          <w:szCs w:val="24"/>
-          <w:lang w:eastAsia="fr-FR"/>
-          <w14:ligatures w14:val="none"/>
-        </w:rPr>
-        <w:t>confiance</w:t>
+        <w:t>Le JSON doit contenir uniquement les cinq propriétés suivantes :sentiment, categorie, urgence, probleme et confiance</w:t>
       </w:r>
     </w:p>
     <w:p>
@@ -5676,6 +5437,7 @@
       <w:r>
         <w:rPr>
           <w:rFonts w:ascii="Times New Roman" w:eastAsia="Times New Roman" w:hAnsi="Times New Roman" w:cs="Times New Roman"/>
+          <w:noProof/>
           <w:color w:val="2F5496" w:themeColor="accent1" w:themeShade="BF"/>
           <w:kern w:val="0"/>
           <w:sz w:val="24"/>
@@ -6208,6 +5970,7 @@
       <w:r>
         <w:rPr>
           <w:rFonts w:ascii="Times New Roman" w:hAnsi="Times New Roman" w:cs="Times New Roman"/>
+          <w:noProof/>
           <w:sz w:val="24"/>
           <w:szCs w:val="24"/>
         </w:rPr>
@@ -6719,9 +6482,471 @@
         </w:rPr>
       </w:pPr>
     </w:p>
+    <w:p>
+      <w:pPr>
+        <w:rPr>
+          <w:rFonts w:ascii="Times New Roman" w:hAnsi="Times New Roman" w:cs="Times New Roman"/>
+          <w:sz w:val="24"/>
+          <w:szCs w:val="24"/>
+        </w:rPr>
+      </w:pPr>
+      <w:r>
+        <w:rPr>
+          <w:rFonts w:ascii="Times New Roman" w:hAnsi="Times New Roman" w:cs="Times New Roman"/>
+          <w:sz w:val="24"/>
+          <w:szCs w:val="24"/>
+        </w:rPr>
+        <w:drawing>
+          <wp:inline distT="0" distB="0" distL="0" distR="0" wp14:anchorId="235487FB" wp14:editId="3A0D6352">
+            <wp:extent cx="5760720" cy="4020820"/>
+            <wp:effectExtent l="0" t="0" r="0" b="0"/>
+            <wp:docPr id="7" name="Image 7"/>
+            <wp:cNvGraphicFramePr>
+              <a:graphicFrameLocks xmlns:a="http://schemas.openxmlformats.org/drawingml/2006/main" noChangeAspect="1"/>
+            </wp:cNvGraphicFramePr>
+            <a:graphic xmlns:a="http://schemas.openxmlformats.org/drawingml/2006/main">
+              <a:graphicData uri="http://schemas.openxmlformats.org/drawingml/2006/picture">
+                <pic:pic xmlns:pic="http://schemas.openxmlformats.org/drawingml/2006/picture">
+                  <pic:nvPicPr>
+                    <pic:cNvPr id="1" name=""/>
+                    <pic:cNvPicPr/>
+                  </pic:nvPicPr>
+                  <pic:blipFill>
+                    <a:blip r:embed="rId22"/>
+                    <a:stretch>
+                      <a:fillRect/>
+                    </a:stretch>
+                  </pic:blipFill>
+                  <pic:spPr>
+                    <a:xfrm>
+                      <a:off x="0" y="0"/>
+                      <a:ext cx="5760720" cy="4020820"/>
+                    </a:xfrm>
+                    <a:prstGeom prst="rect">
+                      <a:avLst/>
+                    </a:prstGeom>
+                  </pic:spPr>
+                </pic:pic>
+              </a:graphicData>
+            </a:graphic>
+          </wp:inline>
+        </w:drawing>
+      </w:r>
+    </w:p>
+    <w:p>
+      <w:pPr>
+        <w:rPr>
+          <w:rFonts w:ascii="Times New Roman" w:hAnsi="Times New Roman" w:cs="Times New Roman"/>
+          <w:sz w:val="24"/>
+          <w:szCs w:val="24"/>
+        </w:rPr>
+      </w:pPr>
+      <w:r>
+        <w:rPr>
+          <w:rFonts w:ascii="Times New Roman" w:hAnsi="Times New Roman" w:cs="Times New Roman"/>
+          <w:sz w:val="24"/>
+          <w:szCs w:val="24"/>
+        </w:rPr>
+        <w:lastRenderedPageBreak/>
+        <w:drawing>
+          <wp:inline distT="0" distB="0" distL="0" distR="0" wp14:anchorId="5E04C4FC" wp14:editId="505E55F1">
+            <wp:extent cx="5760720" cy="4084955"/>
+            <wp:effectExtent l="0" t="0" r="0" b="0"/>
+            <wp:docPr id="19" name="Image 19"/>
+            <wp:cNvGraphicFramePr>
+              <a:graphicFrameLocks xmlns:a="http://schemas.openxmlformats.org/drawingml/2006/main" noChangeAspect="1"/>
+            </wp:cNvGraphicFramePr>
+            <a:graphic xmlns:a="http://schemas.openxmlformats.org/drawingml/2006/main">
+              <a:graphicData uri="http://schemas.openxmlformats.org/drawingml/2006/picture">
+                <pic:pic xmlns:pic="http://schemas.openxmlformats.org/drawingml/2006/picture">
+                  <pic:nvPicPr>
+                    <pic:cNvPr id="1" name=""/>
+                    <pic:cNvPicPr/>
+                  </pic:nvPicPr>
+                  <pic:blipFill>
+                    <a:blip r:embed="rId23"/>
+                    <a:stretch>
+                      <a:fillRect/>
+                    </a:stretch>
+                  </pic:blipFill>
+                  <pic:spPr>
+                    <a:xfrm>
+                      <a:off x="0" y="0"/>
+                      <a:ext cx="5760720" cy="4084955"/>
+                    </a:xfrm>
+                    <a:prstGeom prst="rect">
+                      <a:avLst/>
+                    </a:prstGeom>
+                  </pic:spPr>
+                </pic:pic>
+              </a:graphicData>
+            </a:graphic>
+          </wp:inline>
+        </w:drawing>
+      </w:r>
+    </w:p>
+    <w:p>
+      <w:pPr>
+        <w:rPr>
+          <w:rFonts w:ascii="Times New Roman" w:hAnsi="Times New Roman" w:cs="Times New Roman"/>
+          <w:sz w:val="24"/>
+          <w:szCs w:val="24"/>
+        </w:rPr>
+      </w:pPr>
+      <w:r>
+        <w:rPr>
+          <w:rFonts w:ascii="Times New Roman" w:hAnsi="Times New Roman" w:cs="Times New Roman"/>
+          <w:sz w:val="24"/>
+          <w:szCs w:val="24"/>
+        </w:rPr>
+        <w:drawing>
+          <wp:inline distT="0" distB="0" distL="0" distR="0" wp14:anchorId="73BA6DA7" wp14:editId="3712CC68">
+            <wp:extent cx="5760720" cy="4196080"/>
+            <wp:effectExtent l="0" t="0" r="0" b="0"/>
+            <wp:docPr id="20" name="Image 20"/>
+            <wp:cNvGraphicFramePr>
+              <a:graphicFrameLocks xmlns:a="http://schemas.openxmlformats.org/drawingml/2006/main" noChangeAspect="1"/>
+            </wp:cNvGraphicFramePr>
+            <a:graphic xmlns:a="http://schemas.openxmlformats.org/drawingml/2006/main">
+              <a:graphicData uri="http://schemas.openxmlformats.org/drawingml/2006/picture">
+                <pic:pic xmlns:pic="http://schemas.openxmlformats.org/drawingml/2006/picture">
+                  <pic:nvPicPr>
+                    <pic:cNvPr id="1" name=""/>
+                    <pic:cNvPicPr/>
+                  </pic:nvPicPr>
+                  <pic:blipFill>
+                    <a:blip r:embed="rId24"/>
+                    <a:stretch>
+                      <a:fillRect/>
+                    </a:stretch>
+                  </pic:blipFill>
+                  <pic:spPr>
+                    <a:xfrm>
+                      <a:off x="0" y="0"/>
+                      <a:ext cx="5760720" cy="4196080"/>
+                    </a:xfrm>
+                    <a:prstGeom prst="rect">
+                      <a:avLst/>
+                    </a:prstGeom>
+                  </pic:spPr>
+                </pic:pic>
+              </a:graphicData>
+            </a:graphic>
+          </wp:inline>
+        </w:drawing>
+      </w:r>
+    </w:p>
+    <w:p>
+      <w:pPr>
+        <w:rPr>
+          <w:rFonts w:ascii="Times New Roman" w:hAnsi="Times New Roman" w:cs="Times New Roman"/>
+          <w:sz w:val="24"/>
+          <w:szCs w:val="24"/>
+        </w:rPr>
+      </w:pPr>
+    </w:p>
+    <w:p>
+      <w:pPr>
+        <w:autoSpaceDE w:val="0"/>
+        <w:autoSpaceDN w:val="0"/>
+        <w:adjustRightInd w:val="0"/>
+        <w:spacing w:after="0" w:line="240" w:lineRule="auto"/>
+        <w:rPr>
+          <w:rFonts w:ascii="CIDFont+F1" w:hAnsi="CIDFont+F1" w:cs="CIDFont+F1"/>
+          <w:kern w:val="0"/>
+          <w:sz w:val="21"/>
+          <w:szCs w:val="21"/>
+        </w:rPr>
+      </w:pPr>
+      <w:r>
+        <w:rPr>
+          <w:rFonts w:ascii="CIDFont+F1" w:hAnsi="CIDFont+F1" w:cs="CIDFont+F1"/>
+          <w:kern w:val="0"/>
+          <w:sz w:val="21"/>
+          <w:szCs w:val="21"/>
+        </w:rPr>
+        <w:t>3) Créer un prompt permettant de classer un ticket informatique dans une catégorie (réseau,</w:t>
+      </w:r>
+    </w:p>
+    <w:p>
+      <w:pPr>
+        <w:autoSpaceDE w:val="0"/>
+        <w:autoSpaceDN w:val="0"/>
+        <w:adjustRightInd w:val="0"/>
+        <w:spacing w:after="0" w:line="240" w:lineRule="auto"/>
+        <w:rPr>
+          <w:rFonts w:ascii="CIDFont+F1" w:hAnsi="CIDFont+F1" w:cs="CIDFont+F1"/>
+          <w:kern w:val="0"/>
+          <w:sz w:val="21"/>
+          <w:szCs w:val="21"/>
+        </w:rPr>
+      </w:pPr>
+      <w:r>
+        <w:rPr>
+          <w:rFonts w:ascii="CIDFont+F1" w:hAnsi="CIDFont+F1" w:cs="CIDFont+F1"/>
+          <w:kern w:val="0"/>
+          <w:sz w:val="21"/>
+          <w:szCs w:val="21"/>
+        </w:rPr>
+        <w:t>logiciel, matériel, sécurité, accès, autre). La réponse est au format JSON avec les champs</w:t>
+      </w:r>
+    </w:p>
+    <w:p>
+      <w:pPr>
+        <w:rPr>
+          <w:rFonts w:ascii="Times New Roman" w:hAnsi="Times New Roman" w:cs="Times New Roman"/>
+          <w:sz w:val="24"/>
+          <w:szCs w:val="24"/>
+        </w:rPr>
+      </w:pPr>
+      <w:r>
+        <w:rPr>
+          <w:rFonts w:ascii="CIDFont+F7" w:hAnsi="CIDFont+F7" w:cs="CIDFont+F7"/>
+          <w:kern w:val="0"/>
+          <w:sz w:val="17"/>
+          <w:szCs w:val="17"/>
+        </w:rPr>
+        <w:t xml:space="preserve">categorie </w:t>
+      </w:r>
+      <w:r>
+        <w:rPr>
+          <w:rFonts w:ascii="CIDFont+F1" w:hAnsi="CIDFont+F1" w:cs="CIDFont+F1"/>
+          <w:kern w:val="0"/>
+          <w:sz w:val="21"/>
+          <w:szCs w:val="21"/>
+        </w:rPr>
+        <w:t xml:space="preserve">et </w:t>
+      </w:r>
+      <w:r>
+        <w:rPr>
+          <w:rFonts w:ascii="CIDFont+F7" w:hAnsi="CIDFont+F7" w:cs="CIDFont+F7"/>
+          <w:kern w:val="0"/>
+          <w:sz w:val="17"/>
+          <w:szCs w:val="17"/>
+        </w:rPr>
+        <w:t>justification</w:t>
+      </w:r>
+    </w:p>
+    <w:p>
+      <w:pPr>
+        <w:spacing w:after="0" w:line="240" w:lineRule="auto"/>
+        <w:ind w:left="708"/>
+        <w:jc w:val="both"/>
+        <w:rPr>
+          <w:rFonts w:ascii="Times New Roman" w:eastAsia="Times New Roman" w:hAnsi="Times New Roman" w:cs="Times New Roman"/>
+          <w:color w:val="2F5496" w:themeColor="accent1" w:themeShade="BF"/>
+          <w:kern w:val="0"/>
+          <w:sz w:val="24"/>
+          <w:szCs w:val="24"/>
+          <w:lang w:eastAsia="fr-FR"/>
+          <w14:ligatures w14:val="none"/>
+        </w:rPr>
+      </w:pPr>
+      <w:r>
+        <w:rPr>
+          <w:rFonts w:ascii="Times New Roman" w:eastAsia="Times New Roman" w:hAnsi="Times New Roman" w:cs="Times New Roman"/>
+          <w:color w:val="2F5496" w:themeColor="accent1" w:themeShade="BF"/>
+          <w:kern w:val="0"/>
+          <w:sz w:val="24"/>
+          <w:szCs w:val="24"/>
+          <w:lang w:eastAsia="fr-FR"/>
+          <w14:ligatures w14:val="none"/>
+        </w:rPr>
+        <w:t>Tu es un expert en support informatique.</w:t>
+      </w:r>
+    </w:p>
+    <w:p>
+      <w:pPr>
+        <w:spacing w:after="0" w:line="240" w:lineRule="auto"/>
+        <w:ind w:left="708"/>
+        <w:jc w:val="both"/>
+        <w:rPr>
+          <w:rFonts w:ascii="Times New Roman" w:eastAsia="Times New Roman" w:hAnsi="Times New Roman" w:cs="Times New Roman"/>
+          <w:color w:val="2F5496" w:themeColor="accent1" w:themeShade="BF"/>
+          <w:kern w:val="0"/>
+          <w:sz w:val="24"/>
+          <w:szCs w:val="24"/>
+          <w:lang w:eastAsia="fr-FR"/>
+          <w14:ligatures w14:val="none"/>
+        </w:rPr>
+      </w:pPr>
+      <w:r>
+        <w:rPr>
+          <w:rFonts w:ascii="Times New Roman" w:eastAsia="Times New Roman" w:hAnsi="Times New Roman" w:cs="Times New Roman"/>
+          <w:color w:val="2F5496" w:themeColor="accent1" w:themeShade="BF"/>
+          <w:kern w:val="0"/>
+          <w:sz w:val="24"/>
+          <w:szCs w:val="24"/>
+          <w:lang w:eastAsia="fr-FR"/>
+          <w14:ligatures w14:val="none"/>
+        </w:rPr>
+        <w:t>Classe le ticket informatique suivant dans une seule des catégories suivantes : réseau, logiciel, matériel, sécurité, accès ou autre.</w:t>
+      </w:r>
+    </w:p>
+    <w:p>
+      <w:pPr>
+        <w:spacing w:after="0" w:line="240" w:lineRule="auto"/>
+        <w:ind w:left="708"/>
+        <w:jc w:val="both"/>
+        <w:rPr>
+          <w:rFonts w:ascii="Times New Roman" w:eastAsia="Times New Roman" w:hAnsi="Times New Roman" w:cs="Times New Roman"/>
+          <w:color w:val="2F5496" w:themeColor="accent1" w:themeShade="BF"/>
+          <w:kern w:val="0"/>
+          <w:sz w:val="24"/>
+          <w:szCs w:val="24"/>
+          <w:lang w:eastAsia="fr-FR"/>
+          <w14:ligatures w14:val="none"/>
+        </w:rPr>
+      </w:pPr>
+      <w:r>
+        <w:rPr>
+          <w:rFonts w:ascii="Times New Roman" w:eastAsia="Times New Roman" w:hAnsi="Times New Roman" w:cs="Times New Roman"/>
+          <w:color w:val="2F5496" w:themeColor="accent1" w:themeShade="BF"/>
+          <w:kern w:val="0"/>
+          <w:sz w:val="24"/>
+          <w:szCs w:val="24"/>
+          <w:lang w:eastAsia="fr-FR"/>
+          <w14:ligatures w14:val="none"/>
+        </w:rPr>
+        <w:t>Retourne uniquement un JSON avec les champs categorie et justification.</w:t>
+      </w:r>
+    </w:p>
+    <w:p>
+      <w:pPr>
+        <w:spacing w:after="0" w:line="240" w:lineRule="auto"/>
+        <w:ind w:left="708"/>
+        <w:jc w:val="both"/>
+        <w:rPr>
+          <w:rFonts w:ascii="Times New Roman" w:eastAsia="Times New Roman" w:hAnsi="Times New Roman" w:cs="Times New Roman"/>
+          <w:kern w:val="0"/>
+          <w:sz w:val="24"/>
+          <w:szCs w:val="24"/>
+          <w:lang w:eastAsia="fr-FR"/>
+          <w14:ligatures w14:val="none"/>
+        </w:rPr>
+      </w:pPr>
+      <w:r>
+        <w:rPr>
+          <w:rFonts w:ascii="Times New Roman" w:eastAsia="Times New Roman" w:hAnsi="Times New Roman" w:cs="Times New Roman"/>
+          <w:color w:val="2F5496" w:themeColor="accent1" w:themeShade="BF"/>
+          <w:kern w:val="0"/>
+          <w:sz w:val="24"/>
+          <w:szCs w:val="24"/>
+          <w:lang w:eastAsia="fr-FR"/>
+          <w14:ligatures w14:val="none"/>
+        </w:rPr>
+        <w:t>La catégorie doit obligatoirement être l'une des six catégories indiquées</w:t>
+      </w:r>
+      <w:r>
+        <w:rPr>
+          <w:rFonts w:ascii="Times New Roman" w:eastAsia="Times New Roman" w:hAnsi="Times New Roman" w:cs="Times New Roman"/>
+          <w:kern w:val="0"/>
+          <w:sz w:val="24"/>
+          <w:szCs w:val="24"/>
+          <w:lang w:eastAsia="fr-FR"/>
+          <w14:ligatures w14:val="none"/>
+        </w:rPr>
+        <w:t>.</w:t>
+      </w:r>
+    </w:p>
+    <w:p>
+      <w:pPr>
+        <w:spacing w:after="0" w:line="240" w:lineRule="auto"/>
+        <w:jc w:val="both"/>
+        <w:rPr>
+          <w:rFonts w:ascii="Times New Roman" w:eastAsia="Times New Roman" w:hAnsi="Times New Roman" w:cs="Times New Roman"/>
+          <w:kern w:val="0"/>
+          <w:sz w:val="24"/>
+          <w:szCs w:val="24"/>
+          <w:lang w:eastAsia="fr-FR"/>
+          <w14:ligatures w14:val="none"/>
+        </w:rPr>
+      </w:pPr>
+    </w:p>
+    <w:p>
+      <w:pPr>
+        <w:spacing w:after="0" w:line="240" w:lineRule="auto"/>
+        <w:jc w:val="both"/>
+        <w:rPr>
+          <w:rFonts w:ascii="Times New Roman" w:eastAsia="Times New Roman" w:hAnsi="Times New Roman" w:cs="Times New Roman"/>
+          <w:kern w:val="0"/>
+          <w:sz w:val="24"/>
+          <w:szCs w:val="24"/>
+          <w:lang w:eastAsia="fr-FR"/>
+          <w14:ligatures w14:val="none"/>
+        </w:rPr>
+      </w:pPr>
+      <w:r>
+        <w:rPr>
+          <w:rFonts w:ascii="Times New Roman" w:eastAsia="Times New Roman" w:hAnsi="Times New Roman" w:cs="Times New Roman"/>
+          <w:kern w:val="0"/>
+          <w:sz w:val="24"/>
+          <w:szCs w:val="24"/>
+          <w:lang w:eastAsia="fr-FR"/>
+          <w14:ligatures w14:val="none"/>
+        </w:rPr>
+        <w:drawing>
+          <wp:inline distT="0" distB="0" distL="0" distR="0" wp14:anchorId="39EA851A" wp14:editId="059670D4">
+            <wp:extent cx="5760720" cy="1151890"/>
+            <wp:effectExtent l="0" t="0" r="0" b="0"/>
+            <wp:docPr id="21" name="Image 21"/>
+            <wp:cNvGraphicFramePr>
+              <a:graphicFrameLocks xmlns:a="http://schemas.openxmlformats.org/drawingml/2006/main" noChangeAspect="1"/>
+            </wp:cNvGraphicFramePr>
+            <a:graphic xmlns:a="http://schemas.openxmlformats.org/drawingml/2006/main">
+              <a:graphicData uri="http://schemas.openxmlformats.org/drawingml/2006/picture">
+                <pic:pic xmlns:pic="http://schemas.openxmlformats.org/drawingml/2006/picture">
+                  <pic:nvPicPr>
+                    <pic:cNvPr id="1" name=""/>
+                    <pic:cNvPicPr/>
+                  </pic:nvPicPr>
+                  <pic:blipFill>
+                    <a:blip r:embed="rId25"/>
+                    <a:stretch>
+                      <a:fillRect/>
+                    </a:stretch>
+                  </pic:blipFill>
+                  <pic:spPr>
+                    <a:xfrm>
+                      <a:off x="0" y="0"/>
+                      <a:ext cx="5760720" cy="1151890"/>
+                    </a:xfrm>
+                    <a:prstGeom prst="rect">
+                      <a:avLst/>
+                    </a:prstGeom>
+                  </pic:spPr>
+                </pic:pic>
+              </a:graphicData>
+            </a:graphic>
+          </wp:inline>
+        </w:drawing>
+      </w:r>
+    </w:p>
+    <w:p>
+      <w:pPr>
+        <w:spacing w:after="0" w:line="240" w:lineRule="auto"/>
+        <w:rPr>
+          <w:rFonts w:ascii="Times New Roman" w:eastAsia="Times New Roman" w:hAnsi="Times New Roman" w:cs="Times New Roman"/>
+          <w:kern w:val="0"/>
+          <w:sz w:val="24"/>
+          <w:szCs w:val="24"/>
+          <w:lang w:eastAsia="fr-FR"/>
+          <w14:ligatures w14:val="none"/>
+        </w:rPr>
+      </w:pPr>
+    </w:p>
+    <w:p>
+      <w:pPr>
+        <w:rPr>
+          <w:rFonts w:ascii="Times New Roman" w:hAnsi="Times New Roman" w:cs="Times New Roman"/>
+          <w:sz w:val="24"/>
+          <w:szCs w:val="24"/>
+        </w:rPr>
+      </w:pPr>
+    </w:p>
     <w:sectPr>
-      <w:headerReference w:type="default" r:id="rId22"/>
-      <w:footerReference w:type="default" r:id="rId23"/>
+      <w:headerReference w:type="default" r:id="rId26"/>
+      <w:footerReference w:type="default" r:id="rId27"/>
       <w:pgSz w:w="11906" w:h="16838"/>
       <w:pgMar w:top="1417" w:right="1417" w:bottom="1417" w:left="1417" w:header="708" w:footer="708" w:gutter="0"/>
       <w:pgBorders w:offsetFrom="page">

</xml_diff>

<commit_message>
Créer un prompt permettant d’extraire, à partir d’une facture, des infos
</commit_message>
<xml_diff>
--- a/Atelier Prompt.docx
+++ b/Atelier Prompt.docx
@@ -6493,6 +6493,7 @@
       <w:r>
         <w:rPr>
           <w:rFonts w:ascii="Times New Roman" w:hAnsi="Times New Roman" w:cs="Times New Roman"/>
+          <w:noProof/>
           <w:sz w:val="24"/>
           <w:szCs w:val="24"/>
         </w:rPr>
@@ -6544,6 +6545,7 @@
       <w:r>
         <w:rPr>
           <w:rFonts w:ascii="Times New Roman" w:hAnsi="Times New Roman" w:cs="Times New Roman"/>
+          <w:noProof/>
           <w:sz w:val="24"/>
           <w:szCs w:val="24"/>
         </w:rPr>
@@ -6596,6 +6598,7 @@
       <w:r>
         <w:rPr>
           <w:rFonts w:ascii="Times New Roman" w:hAnsi="Times New Roman" w:cs="Times New Roman"/>
+          <w:noProof/>
           <w:sz w:val="24"/>
           <w:szCs w:val="24"/>
         </w:rPr>
@@ -6879,6 +6882,7 @@
       <w:r>
         <w:rPr>
           <w:rFonts w:ascii="Times New Roman" w:eastAsia="Times New Roman" w:hAnsi="Times New Roman" w:cs="Times New Roman"/>
+          <w:noProof/>
           <w:kern w:val="0"/>
           <w:sz w:val="24"/>
           <w:szCs w:val="24"/>
@@ -6924,16 +6928,1131 @@
     </w:p>
     <w:p>
       <w:pPr>
-        <w:spacing w:after="0" w:line="240" w:lineRule="auto"/>
-        <w:rPr>
-          <w:rFonts w:ascii="Times New Roman" w:eastAsia="Times New Roman" w:hAnsi="Times New Roman" w:cs="Times New Roman"/>
-          <w:kern w:val="0"/>
-          <w:sz w:val="24"/>
-          <w:szCs w:val="24"/>
-          <w:lang w:eastAsia="fr-FR"/>
-          <w14:ligatures w14:val="none"/>
-        </w:rPr>
-      </w:pPr>
+        <w:rPr>
+          <w:rFonts w:ascii="Times New Roman" w:hAnsi="Times New Roman" w:cs="Times New Roman"/>
+          <w:sz w:val="24"/>
+          <w:szCs w:val="24"/>
+        </w:rPr>
+      </w:pPr>
+    </w:p>
+    <w:p>
+      <w:pPr>
+        <w:autoSpaceDE w:val="0"/>
+        <w:autoSpaceDN w:val="0"/>
+        <w:adjustRightInd w:val="0"/>
+        <w:spacing w:after="0" w:line="240" w:lineRule="auto"/>
+        <w:rPr>
+          <w:rFonts w:ascii="CIDFont+F1" w:hAnsi="CIDFont+F1" w:cs="CIDFont+F1"/>
+          <w:kern w:val="0"/>
+          <w:sz w:val="21"/>
+          <w:szCs w:val="21"/>
+        </w:rPr>
+      </w:pPr>
+      <w:r>
+        <w:rPr>
+          <w:rFonts w:ascii="CIDFont+F1" w:hAnsi="CIDFont+F1" w:cs="CIDFont+F1"/>
+          <w:kern w:val="0"/>
+          <w:sz w:val="21"/>
+          <w:szCs w:val="21"/>
+        </w:rPr>
+        <w:t>4) Créer un prompt permettant d’extraire, à partir d’une facture, les infos (numéro_facture,</w:t>
+      </w:r>
+    </w:p>
+    <w:p>
+      <w:pPr>
+        <w:autoSpaceDE w:val="0"/>
+        <w:autoSpaceDN w:val="0"/>
+        <w:adjustRightInd w:val="0"/>
+        <w:spacing w:after="0" w:line="240" w:lineRule="auto"/>
+        <w:rPr>
+          <w:rFonts w:ascii="CIDFont+F7" w:hAnsi="CIDFont+F7" w:cs="CIDFont+F7"/>
+          <w:kern w:val="0"/>
+          <w:sz w:val="17"/>
+          <w:szCs w:val="17"/>
+        </w:rPr>
+      </w:pPr>
+      <w:r>
+        <w:rPr>
+          <w:rFonts w:ascii="CIDFont+F1" w:hAnsi="CIDFont+F1" w:cs="CIDFont+F1"/>
+          <w:kern w:val="0"/>
+          <w:sz w:val="21"/>
+          <w:szCs w:val="21"/>
+        </w:rPr>
+        <w:t xml:space="preserve">date, client, montant_ht, tva, montant_ttc). Retourner uniquement un JSON valide avec </w:t>
+      </w:r>
+      <w:r>
+        <w:rPr>
+          <w:rFonts w:ascii="CIDFont+F7" w:hAnsi="CIDFont+F7" w:cs="CIDFont+F7"/>
+          <w:kern w:val="0"/>
+          <w:sz w:val="17"/>
+          <w:szCs w:val="17"/>
+        </w:rPr>
+        <w:t>null</w:t>
+      </w:r>
+    </w:p>
+    <w:p>
+      <w:pPr>
+        <w:rPr>
+          <w:rFonts w:ascii="CIDFont+F1" w:hAnsi="CIDFont+F1" w:cs="CIDFont+F1"/>
+          <w:kern w:val="0"/>
+          <w:sz w:val="21"/>
+          <w:szCs w:val="21"/>
+        </w:rPr>
+      </w:pPr>
+      <w:r>
+        <w:rPr>
+          <w:rFonts w:ascii="CIDFont+F1" w:hAnsi="CIDFont+F1" w:cs="CIDFont+F1"/>
+          <w:kern w:val="0"/>
+          <w:sz w:val="21"/>
+          <w:szCs w:val="21"/>
+        </w:rPr>
+        <w:t>si une info est absente</w:t>
+      </w:r>
+    </w:p>
+    <w:p>
+      <w:pPr>
+        <w:spacing w:before="100" w:beforeAutospacing="1" w:after="100" w:afterAutospacing="1" w:line="240" w:lineRule="auto"/>
+        <w:rPr>
+          <w:rFonts w:ascii="Times New Roman" w:eastAsia="Times New Roman" w:hAnsi="Times New Roman" w:cs="Times New Roman"/>
+          <w:kern w:val="0"/>
+          <w:sz w:val="24"/>
+          <w:szCs w:val="24"/>
+          <w:lang w:eastAsia="fr-FR"/>
+          <w14:ligatures w14:val="none"/>
+        </w:rPr>
+      </w:pPr>
+      <w:r>
+        <w:rPr>
+          <w:rFonts w:ascii="Times New Roman" w:eastAsia="Times New Roman" w:hAnsi="Times New Roman" w:cs="Times New Roman"/>
+          <w:kern w:val="0"/>
+          <w:sz w:val="24"/>
+          <w:szCs w:val="24"/>
+          <w:lang w:eastAsia="fr-FR"/>
+          <w14:ligatures w14:val="none"/>
+        </w:rPr>
+        <w:t>Tu es un expert en traitement de documents.</w:t>
+      </w:r>
+    </w:p>
+    <w:p>
+      <w:pPr>
+        <w:spacing w:before="100" w:beforeAutospacing="1" w:after="100" w:afterAutospacing="1" w:line="240" w:lineRule="auto"/>
+        <w:rPr>
+          <w:rFonts w:ascii="Times New Roman" w:eastAsia="Times New Roman" w:hAnsi="Times New Roman" w:cs="Times New Roman"/>
+          <w:kern w:val="0"/>
+          <w:sz w:val="24"/>
+          <w:szCs w:val="24"/>
+          <w:lang w:eastAsia="fr-FR"/>
+          <w14:ligatures w14:val="none"/>
+        </w:rPr>
+      </w:pPr>
+      <w:r>
+        <w:rPr>
+          <w:rFonts w:ascii="Times New Roman" w:eastAsia="Times New Roman" w:hAnsi="Times New Roman" w:cs="Times New Roman"/>
+          <w:kern w:val="0"/>
+          <w:sz w:val="24"/>
+          <w:szCs w:val="24"/>
+          <w:lang w:eastAsia="fr-FR"/>
+          <w14:ligatures w14:val="none"/>
+        </w:rPr>
+        <w:t>À partir de la facture suivante, extrais les informations suivantes :</w:t>
+      </w:r>
+    </w:p>
+    <w:p>
+      <w:pPr>
+        <w:numPr>
+          <w:ilvl w:val="0"/>
+          <w:numId w:val="13"/>
+        </w:numPr>
+        <w:spacing w:before="100" w:beforeAutospacing="1" w:after="100" w:afterAutospacing="1" w:line="240" w:lineRule="auto"/>
+        <w:rPr>
+          <w:rFonts w:ascii="Times New Roman" w:eastAsia="Times New Roman" w:hAnsi="Times New Roman" w:cs="Times New Roman"/>
+          <w:kern w:val="0"/>
+          <w:sz w:val="24"/>
+          <w:szCs w:val="24"/>
+          <w:lang w:eastAsia="fr-FR"/>
+          <w14:ligatures w14:val="none"/>
+        </w:rPr>
+      </w:pPr>
+      <w:r>
+        <w:rPr>
+          <w:rFonts w:ascii="Courier New" w:eastAsia="Times New Roman" w:hAnsi="Courier New" w:cs="Courier New"/>
+          <w:kern w:val="0"/>
+          <w:sz w:val="20"/>
+          <w:szCs w:val="20"/>
+          <w:lang w:eastAsia="fr-FR"/>
+          <w14:ligatures w14:val="none"/>
+        </w:rPr>
+        <w:t>numero_facture</w:t>
+      </w:r>
+    </w:p>
+    <w:p>
+      <w:pPr>
+        <w:numPr>
+          <w:ilvl w:val="0"/>
+          <w:numId w:val="13"/>
+        </w:numPr>
+        <w:spacing w:before="100" w:beforeAutospacing="1" w:after="100" w:afterAutospacing="1" w:line="240" w:lineRule="auto"/>
+        <w:rPr>
+          <w:rFonts w:ascii="Times New Roman" w:eastAsia="Times New Roman" w:hAnsi="Times New Roman" w:cs="Times New Roman"/>
+          <w:kern w:val="0"/>
+          <w:sz w:val="24"/>
+          <w:szCs w:val="24"/>
+          <w:lang w:eastAsia="fr-FR"/>
+          <w14:ligatures w14:val="none"/>
+        </w:rPr>
+      </w:pPr>
+      <w:r>
+        <w:rPr>
+          <w:rFonts w:ascii="Courier New" w:eastAsia="Times New Roman" w:hAnsi="Courier New" w:cs="Courier New"/>
+          <w:kern w:val="0"/>
+          <w:sz w:val="20"/>
+          <w:szCs w:val="20"/>
+          <w:lang w:eastAsia="fr-FR"/>
+          <w14:ligatures w14:val="none"/>
+        </w:rPr>
+        <w:t>date</w:t>
+      </w:r>
+    </w:p>
+    <w:p>
+      <w:pPr>
+        <w:numPr>
+          <w:ilvl w:val="0"/>
+          <w:numId w:val="13"/>
+        </w:numPr>
+        <w:spacing w:before="100" w:beforeAutospacing="1" w:after="100" w:afterAutospacing="1" w:line="240" w:lineRule="auto"/>
+        <w:rPr>
+          <w:rFonts w:ascii="Times New Roman" w:eastAsia="Times New Roman" w:hAnsi="Times New Roman" w:cs="Times New Roman"/>
+          <w:kern w:val="0"/>
+          <w:sz w:val="24"/>
+          <w:szCs w:val="24"/>
+          <w:lang w:eastAsia="fr-FR"/>
+          <w14:ligatures w14:val="none"/>
+        </w:rPr>
+      </w:pPr>
+      <w:r>
+        <w:rPr>
+          <w:rFonts w:ascii="Courier New" w:eastAsia="Times New Roman" w:hAnsi="Courier New" w:cs="Courier New"/>
+          <w:kern w:val="0"/>
+          <w:sz w:val="20"/>
+          <w:szCs w:val="20"/>
+          <w:lang w:eastAsia="fr-FR"/>
+          <w14:ligatures w14:val="none"/>
+        </w:rPr>
+        <w:t>client</w:t>
+      </w:r>
+    </w:p>
+    <w:p>
+      <w:pPr>
+        <w:numPr>
+          <w:ilvl w:val="0"/>
+          <w:numId w:val="13"/>
+        </w:numPr>
+        <w:spacing w:before="100" w:beforeAutospacing="1" w:after="100" w:afterAutospacing="1" w:line="240" w:lineRule="auto"/>
+        <w:rPr>
+          <w:rFonts w:ascii="Times New Roman" w:eastAsia="Times New Roman" w:hAnsi="Times New Roman" w:cs="Times New Roman"/>
+          <w:kern w:val="0"/>
+          <w:sz w:val="24"/>
+          <w:szCs w:val="24"/>
+          <w:lang w:eastAsia="fr-FR"/>
+          <w14:ligatures w14:val="none"/>
+        </w:rPr>
+      </w:pPr>
+      <w:r>
+        <w:rPr>
+          <w:rFonts w:ascii="Courier New" w:eastAsia="Times New Roman" w:hAnsi="Courier New" w:cs="Courier New"/>
+          <w:kern w:val="0"/>
+          <w:sz w:val="20"/>
+          <w:szCs w:val="20"/>
+          <w:lang w:eastAsia="fr-FR"/>
+          <w14:ligatures w14:val="none"/>
+        </w:rPr>
+        <w:t>montant_ht</w:t>
+      </w:r>
+    </w:p>
+    <w:p>
+      <w:pPr>
+        <w:numPr>
+          <w:ilvl w:val="0"/>
+          <w:numId w:val="13"/>
+        </w:numPr>
+        <w:spacing w:before="100" w:beforeAutospacing="1" w:after="100" w:afterAutospacing="1" w:line="240" w:lineRule="auto"/>
+        <w:rPr>
+          <w:rFonts w:ascii="Times New Roman" w:eastAsia="Times New Roman" w:hAnsi="Times New Roman" w:cs="Times New Roman"/>
+          <w:kern w:val="0"/>
+          <w:sz w:val="24"/>
+          <w:szCs w:val="24"/>
+          <w:lang w:eastAsia="fr-FR"/>
+          <w14:ligatures w14:val="none"/>
+        </w:rPr>
+      </w:pPr>
+      <w:r>
+        <w:rPr>
+          <w:rFonts w:ascii="Courier New" w:eastAsia="Times New Roman" w:hAnsi="Courier New" w:cs="Courier New"/>
+          <w:kern w:val="0"/>
+          <w:sz w:val="20"/>
+          <w:szCs w:val="20"/>
+          <w:lang w:eastAsia="fr-FR"/>
+          <w14:ligatures w14:val="none"/>
+        </w:rPr>
+        <w:t>tva</w:t>
+      </w:r>
+    </w:p>
+    <w:p>
+      <w:pPr>
+        <w:numPr>
+          <w:ilvl w:val="0"/>
+          <w:numId w:val="13"/>
+        </w:numPr>
+        <w:spacing w:before="100" w:beforeAutospacing="1" w:after="100" w:afterAutospacing="1" w:line="240" w:lineRule="auto"/>
+        <w:rPr>
+          <w:rFonts w:ascii="Times New Roman" w:eastAsia="Times New Roman" w:hAnsi="Times New Roman" w:cs="Times New Roman"/>
+          <w:kern w:val="0"/>
+          <w:sz w:val="24"/>
+          <w:szCs w:val="24"/>
+          <w:lang w:eastAsia="fr-FR"/>
+          <w14:ligatures w14:val="none"/>
+        </w:rPr>
+      </w:pPr>
+      <w:r>
+        <w:rPr>
+          <w:rFonts w:ascii="Courier New" w:eastAsia="Times New Roman" w:hAnsi="Courier New" w:cs="Courier New"/>
+          <w:kern w:val="0"/>
+          <w:sz w:val="20"/>
+          <w:szCs w:val="20"/>
+          <w:lang w:eastAsia="fr-FR"/>
+          <w14:ligatures w14:val="none"/>
+        </w:rPr>
+        <w:t>montant_ttc</w:t>
+      </w:r>
+    </w:p>
+    <w:p>
+      <w:pPr>
+        <w:spacing w:before="100" w:beforeAutospacing="1" w:after="100" w:afterAutospacing="1" w:line="240" w:lineRule="auto"/>
+        <w:rPr>
+          <w:rFonts w:ascii="Times New Roman" w:eastAsia="Times New Roman" w:hAnsi="Times New Roman" w:cs="Times New Roman"/>
+          <w:kern w:val="0"/>
+          <w:sz w:val="24"/>
+          <w:szCs w:val="24"/>
+          <w:lang w:eastAsia="fr-FR"/>
+          <w14:ligatures w14:val="none"/>
+        </w:rPr>
+      </w:pPr>
+      <w:r>
+        <w:rPr>
+          <w:rFonts w:ascii="Times New Roman" w:eastAsia="Times New Roman" w:hAnsi="Times New Roman" w:cs="Times New Roman"/>
+          <w:kern w:val="0"/>
+          <w:sz w:val="24"/>
+          <w:szCs w:val="24"/>
+          <w:lang w:eastAsia="fr-FR"/>
+          <w14:ligatures w14:val="none"/>
+        </w:rPr>
+        <w:t>Retourne uniquement un JSON valide avec ces six champs.</w:t>
+      </w:r>
+    </w:p>
+    <w:p>
+      <w:pPr>
+        <w:spacing w:before="100" w:beforeAutospacing="1" w:after="100" w:afterAutospacing="1" w:line="240" w:lineRule="auto"/>
+        <w:rPr>
+          <w:rFonts w:ascii="Times New Roman" w:eastAsia="Times New Roman" w:hAnsi="Times New Roman" w:cs="Times New Roman"/>
+          <w:kern w:val="0"/>
+          <w:sz w:val="24"/>
+          <w:szCs w:val="24"/>
+          <w:lang w:eastAsia="fr-FR"/>
+          <w14:ligatures w14:val="none"/>
+        </w:rPr>
+      </w:pPr>
+      <w:r>
+        <w:rPr>
+          <w:rFonts w:ascii="Times New Roman" w:eastAsia="Times New Roman" w:hAnsi="Times New Roman" w:cs="Times New Roman"/>
+          <w:kern w:val="0"/>
+          <w:sz w:val="24"/>
+          <w:szCs w:val="24"/>
+          <w:lang w:eastAsia="fr-FR"/>
+          <w14:ligatures w14:val="none"/>
+        </w:rPr>
+        <w:t xml:space="preserve">Si une information est absente de la facture, utilise </w:t>
+      </w:r>
+      <w:r>
+        <w:rPr>
+          <w:rFonts w:ascii="Courier New" w:eastAsia="Times New Roman" w:hAnsi="Courier New" w:cs="Courier New"/>
+          <w:kern w:val="0"/>
+          <w:sz w:val="20"/>
+          <w:szCs w:val="20"/>
+          <w:lang w:eastAsia="fr-FR"/>
+          <w14:ligatures w14:val="none"/>
+        </w:rPr>
+        <w:t>null</w:t>
+      </w:r>
+      <w:r>
+        <w:rPr>
+          <w:rFonts w:ascii="Times New Roman" w:eastAsia="Times New Roman" w:hAnsi="Times New Roman" w:cs="Times New Roman"/>
+          <w:kern w:val="0"/>
+          <w:sz w:val="24"/>
+          <w:szCs w:val="24"/>
+          <w:lang w:eastAsia="fr-FR"/>
+          <w14:ligatures w14:val="none"/>
+        </w:rPr>
+        <w:t>.</w:t>
+      </w:r>
+    </w:p>
+    <w:p>
+      <w:pPr>
+        <w:spacing w:before="100" w:beforeAutospacing="1" w:after="100" w:afterAutospacing="1" w:line="240" w:lineRule="auto"/>
+        <w:rPr>
+          <w:rFonts w:ascii="Times New Roman" w:eastAsia="Times New Roman" w:hAnsi="Times New Roman" w:cs="Times New Roman"/>
+          <w:kern w:val="0"/>
+          <w:sz w:val="24"/>
+          <w:szCs w:val="24"/>
+          <w:lang w:eastAsia="fr-FR"/>
+          <w14:ligatures w14:val="none"/>
+        </w:rPr>
+      </w:pPr>
+      <w:r>
+        <w:rPr>
+          <w:rFonts w:ascii="Times New Roman" w:eastAsia="Times New Roman" w:hAnsi="Times New Roman" w:cs="Times New Roman"/>
+          <w:kern w:val="0"/>
+          <w:sz w:val="24"/>
+          <w:szCs w:val="24"/>
+          <w:lang w:eastAsia="fr-FR"/>
+          <w14:ligatures w14:val="none"/>
+        </w:rPr>
+        <w:t>N'invente aucune information.</w:t>
+      </w:r>
+    </w:p>
+    <w:p>
+      <w:pPr>
+        <w:spacing w:after="0" w:line="240" w:lineRule="auto"/>
+        <w:ind w:left="708"/>
+        <w:outlineLvl w:val="2"/>
+        <w:rPr>
+          <w:rFonts w:ascii="Times New Roman" w:eastAsia="Times New Roman" w:hAnsi="Times New Roman" w:cs="Times New Roman"/>
+          <w:b/>
+          <w:bCs/>
+          <w:color w:val="2F5496" w:themeColor="accent1" w:themeShade="BF"/>
+          <w:kern w:val="0"/>
+          <w:sz w:val="27"/>
+          <w:szCs w:val="27"/>
+          <w:lang w:eastAsia="fr-FR"/>
+          <w14:ligatures w14:val="none"/>
+        </w:rPr>
+      </w:pPr>
+      <w:r>
+        <w:rPr>
+          <w:rFonts w:ascii="Times New Roman" w:eastAsia="Times New Roman" w:hAnsi="Times New Roman" w:cs="Times New Roman"/>
+          <w:b/>
+          <w:bCs/>
+          <w:color w:val="2F5496" w:themeColor="accent1" w:themeShade="BF"/>
+          <w:kern w:val="0"/>
+          <w:sz w:val="27"/>
+          <w:szCs w:val="27"/>
+          <w:lang w:eastAsia="fr-FR"/>
+          <w14:ligatures w14:val="none"/>
+        </w:rPr>
+        <w:t>Facture</w:t>
+      </w:r>
+    </w:p>
+    <w:p>
+      <w:pPr>
+        <w:spacing w:after="0" w:line="240" w:lineRule="auto"/>
+        <w:ind w:left="708"/>
+        <w:rPr>
+          <w:rFonts w:ascii="Times New Roman" w:eastAsia="Times New Roman" w:hAnsi="Times New Roman" w:cs="Times New Roman"/>
+          <w:color w:val="2F5496" w:themeColor="accent1" w:themeShade="BF"/>
+          <w:kern w:val="0"/>
+          <w:sz w:val="24"/>
+          <w:szCs w:val="24"/>
+          <w:lang w:eastAsia="fr-FR"/>
+          <w14:ligatures w14:val="none"/>
+        </w:rPr>
+      </w:pPr>
+      <w:r>
+        <w:rPr>
+          <w:rFonts w:ascii="Times New Roman" w:eastAsia="Times New Roman" w:hAnsi="Times New Roman" w:cs="Times New Roman"/>
+          <w:b/>
+          <w:bCs/>
+          <w:color w:val="2F5496" w:themeColor="accent1" w:themeShade="BF"/>
+          <w:kern w:val="0"/>
+          <w:sz w:val="24"/>
+          <w:szCs w:val="24"/>
+          <w:lang w:eastAsia="fr-FR"/>
+          <w14:ligatures w14:val="none"/>
+        </w:rPr>
+        <w:t>FACTURE</w:t>
+      </w:r>
+    </w:p>
+    <w:p>
+      <w:pPr>
+        <w:spacing w:after="0" w:line="240" w:lineRule="auto"/>
+        <w:ind w:left="708"/>
+        <w:rPr>
+          <w:rFonts w:ascii="Times New Roman" w:eastAsia="Times New Roman" w:hAnsi="Times New Roman" w:cs="Times New Roman"/>
+          <w:color w:val="2F5496" w:themeColor="accent1" w:themeShade="BF"/>
+          <w:kern w:val="0"/>
+          <w:sz w:val="24"/>
+          <w:szCs w:val="24"/>
+          <w:lang w:eastAsia="fr-FR"/>
+          <w14:ligatures w14:val="none"/>
+        </w:rPr>
+      </w:pPr>
+      <w:r>
+        <w:rPr>
+          <w:rFonts w:ascii="Times New Roman" w:eastAsia="Times New Roman" w:hAnsi="Times New Roman" w:cs="Times New Roman"/>
+          <w:b/>
+          <w:bCs/>
+          <w:color w:val="2F5496" w:themeColor="accent1" w:themeShade="BF"/>
+          <w:kern w:val="0"/>
+          <w:sz w:val="24"/>
+          <w:szCs w:val="24"/>
+          <w:lang w:eastAsia="fr-FR"/>
+          <w14:ligatures w14:val="none"/>
+        </w:rPr>
+        <w:t>Numéro de facture :</w:t>
+      </w:r>
+      <w:r>
+        <w:rPr>
+          <w:rFonts w:ascii="Times New Roman" w:eastAsia="Times New Roman" w:hAnsi="Times New Roman" w:cs="Times New Roman"/>
+          <w:color w:val="2F5496" w:themeColor="accent1" w:themeShade="BF"/>
+          <w:kern w:val="0"/>
+          <w:sz w:val="24"/>
+          <w:szCs w:val="24"/>
+          <w:lang w:eastAsia="fr-FR"/>
+          <w14:ligatures w14:val="none"/>
+        </w:rPr>
+        <w:t xml:space="preserve"> FAC-2026-0047</w:t>
+      </w:r>
+    </w:p>
+    <w:p>
+      <w:pPr>
+        <w:spacing w:after="0" w:line="240" w:lineRule="auto"/>
+        <w:ind w:left="708"/>
+        <w:rPr>
+          <w:rFonts w:ascii="Times New Roman" w:eastAsia="Times New Roman" w:hAnsi="Times New Roman" w:cs="Times New Roman"/>
+          <w:color w:val="2F5496" w:themeColor="accent1" w:themeShade="BF"/>
+          <w:kern w:val="0"/>
+          <w:sz w:val="24"/>
+          <w:szCs w:val="24"/>
+          <w:lang w:eastAsia="fr-FR"/>
+          <w14:ligatures w14:val="none"/>
+        </w:rPr>
+      </w:pPr>
+      <w:r>
+        <w:rPr>
+          <w:rFonts w:ascii="Times New Roman" w:eastAsia="Times New Roman" w:hAnsi="Times New Roman" w:cs="Times New Roman"/>
+          <w:b/>
+          <w:bCs/>
+          <w:color w:val="2F5496" w:themeColor="accent1" w:themeShade="BF"/>
+          <w:kern w:val="0"/>
+          <w:sz w:val="24"/>
+          <w:szCs w:val="24"/>
+          <w:lang w:eastAsia="fr-FR"/>
+          <w14:ligatures w14:val="none"/>
+        </w:rPr>
+        <w:t>Date :</w:t>
+      </w:r>
+      <w:r>
+        <w:rPr>
+          <w:rFonts w:ascii="Times New Roman" w:eastAsia="Times New Roman" w:hAnsi="Times New Roman" w:cs="Times New Roman"/>
+          <w:color w:val="2F5496" w:themeColor="accent1" w:themeShade="BF"/>
+          <w:kern w:val="0"/>
+          <w:sz w:val="24"/>
+          <w:szCs w:val="24"/>
+          <w:lang w:eastAsia="fr-FR"/>
+          <w14:ligatures w14:val="none"/>
+        </w:rPr>
+        <w:t xml:space="preserve"> 11/09/2026</w:t>
+      </w:r>
+    </w:p>
+    <w:p>
+      <w:pPr>
+        <w:spacing w:after="0" w:line="240" w:lineRule="auto"/>
+        <w:ind w:left="708"/>
+        <w:rPr>
+          <w:rFonts w:ascii="Times New Roman" w:eastAsia="Times New Roman" w:hAnsi="Times New Roman" w:cs="Times New Roman"/>
+          <w:color w:val="2F5496" w:themeColor="accent1" w:themeShade="BF"/>
+          <w:kern w:val="0"/>
+          <w:sz w:val="24"/>
+          <w:szCs w:val="24"/>
+          <w:lang w:eastAsia="fr-FR"/>
+          <w14:ligatures w14:val="none"/>
+        </w:rPr>
+      </w:pPr>
+      <w:r>
+        <w:rPr>
+          <w:rFonts w:ascii="Times New Roman" w:eastAsia="Times New Roman" w:hAnsi="Times New Roman" w:cs="Times New Roman"/>
+          <w:b/>
+          <w:bCs/>
+          <w:color w:val="2F5496" w:themeColor="accent1" w:themeShade="BF"/>
+          <w:kern w:val="0"/>
+          <w:sz w:val="24"/>
+          <w:szCs w:val="24"/>
+          <w:lang w:eastAsia="fr-FR"/>
+          <w14:ligatures w14:val="none"/>
+        </w:rPr>
+        <w:t>Client :</w:t>
+      </w:r>
+    </w:p>
+    <w:p>
+      <w:pPr>
+        <w:spacing w:after="0" w:line="240" w:lineRule="auto"/>
+        <w:ind w:left="708"/>
+        <w:rPr>
+          <w:rFonts w:ascii="Times New Roman" w:eastAsia="Times New Roman" w:hAnsi="Times New Roman" w:cs="Times New Roman"/>
+          <w:color w:val="2F5496" w:themeColor="accent1" w:themeShade="BF"/>
+          <w:kern w:val="0"/>
+          <w:sz w:val="24"/>
+          <w:szCs w:val="24"/>
+          <w:lang w:eastAsia="fr-FR"/>
+          <w14:ligatures w14:val="none"/>
+        </w:rPr>
+      </w:pPr>
+      <w:r>
+        <w:rPr>
+          <w:rFonts w:ascii="Times New Roman" w:eastAsia="Times New Roman" w:hAnsi="Times New Roman" w:cs="Times New Roman"/>
+          <w:color w:val="2F5496" w:themeColor="accent1" w:themeShade="BF"/>
+          <w:kern w:val="0"/>
+          <w:sz w:val="24"/>
+          <w:szCs w:val="24"/>
+          <w:lang w:eastAsia="fr-FR"/>
+          <w14:ligatures w14:val="none"/>
+        </w:rPr>
+        <w:t>Sénégal Digital Services</w:t>
+      </w:r>
+    </w:p>
+    <w:p>
+      <w:pPr>
+        <w:spacing w:after="0" w:line="240" w:lineRule="auto"/>
+        <w:ind w:left="708"/>
+        <w:rPr>
+          <w:rFonts w:ascii="Times New Roman" w:eastAsia="Times New Roman" w:hAnsi="Times New Roman" w:cs="Times New Roman"/>
+          <w:color w:val="2F5496" w:themeColor="accent1" w:themeShade="BF"/>
+          <w:kern w:val="0"/>
+          <w:sz w:val="24"/>
+          <w:szCs w:val="24"/>
+          <w:lang w:eastAsia="fr-FR"/>
+          <w14:ligatures w14:val="none"/>
+        </w:rPr>
+      </w:pPr>
+      <w:r>
+        <w:rPr>
+          <w:rFonts w:ascii="Times New Roman" w:eastAsia="Times New Roman" w:hAnsi="Times New Roman" w:cs="Times New Roman"/>
+          <w:color w:val="2F5496" w:themeColor="accent1" w:themeShade="BF"/>
+          <w:kern w:val="0"/>
+          <w:sz w:val="24"/>
+          <w:szCs w:val="24"/>
+          <w:lang w:eastAsia="fr-FR"/>
+          <w14:ligatures w14:val="none"/>
+        </w:rPr>
+        <w:t>Dakar, Sénégal</w:t>
+      </w:r>
+    </w:p>
+    <w:tbl>
+      <w:tblPr>
+        <w:tblStyle w:val="Grilledutableau"/>
+        <w:tblW w:w="0" w:type="auto"/>
+        <w:tblLook w:val="04A0" w:firstRow="1" w:lastRow="0" w:firstColumn="1" w:lastColumn="0" w:noHBand="0" w:noVBand="1"/>
+      </w:tblPr>
+      <w:tblGrid>
+        <w:gridCol w:w="3892"/>
+        <w:gridCol w:w="1123"/>
+        <w:gridCol w:w="1657"/>
+      </w:tblGrid>
+      <w:tr>
+        <w:tc>
+          <w:tcPr>
+            <w:tcW w:w="0" w:type="auto"/>
+            <w:hideMark/>
+          </w:tcPr>
+          <w:p>
+            <w:pPr>
+              <w:jc w:val="center"/>
+              <w:rPr>
+                <w:rFonts w:ascii="Times New Roman" w:eastAsia="Times New Roman" w:hAnsi="Times New Roman" w:cs="Times New Roman"/>
+                <w:b/>
+                <w:bCs/>
+                <w:color w:val="2F5496" w:themeColor="accent1" w:themeShade="BF"/>
+                <w:kern w:val="0"/>
+                <w:sz w:val="24"/>
+                <w:szCs w:val="24"/>
+                <w:lang w:eastAsia="fr-FR"/>
+                <w14:ligatures w14:val="none"/>
+              </w:rPr>
+            </w:pPr>
+            <w:r>
+              <w:rPr>
+                <w:rFonts w:ascii="Times New Roman" w:eastAsia="Times New Roman" w:hAnsi="Times New Roman" w:cs="Times New Roman"/>
+                <w:b/>
+                <w:bCs/>
+                <w:color w:val="2F5496" w:themeColor="accent1" w:themeShade="BF"/>
+                <w:kern w:val="0"/>
+                <w:sz w:val="24"/>
+                <w:szCs w:val="24"/>
+                <w:lang w:eastAsia="fr-FR"/>
+                <w14:ligatures w14:val="none"/>
+              </w:rPr>
+              <w:t>Désignation</w:t>
+            </w:r>
+          </w:p>
+        </w:tc>
+        <w:tc>
+          <w:tcPr>
+            <w:tcW w:w="0" w:type="auto"/>
+            <w:hideMark/>
+          </w:tcPr>
+          <w:p>
+            <w:pPr>
+              <w:rPr>
+                <w:rFonts w:ascii="Times New Roman" w:eastAsia="Times New Roman" w:hAnsi="Times New Roman" w:cs="Times New Roman"/>
+                <w:b/>
+                <w:bCs/>
+                <w:color w:val="2F5496" w:themeColor="accent1" w:themeShade="BF"/>
+                <w:kern w:val="0"/>
+                <w:sz w:val="24"/>
+                <w:szCs w:val="24"/>
+                <w:lang w:eastAsia="fr-FR"/>
+                <w14:ligatures w14:val="none"/>
+              </w:rPr>
+            </w:pPr>
+            <w:r>
+              <w:rPr>
+                <w:rFonts w:ascii="Times New Roman" w:eastAsia="Times New Roman" w:hAnsi="Times New Roman" w:cs="Times New Roman"/>
+                <w:b/>
+                <w:bCs/>
+                <w:color w:val="2F5496" w:themeColor="accent1" w:themeShade="BF"/>
+                <w:kern w:val="0"/>
+                <w:sz w:val="24"/>
+                <w:szCs w:val="24"/>
+                <w:lang w:eastAsia="fr-FR"/>
+                <w14:ligatures w14:val="none"/>
+              </w:rPr>
+              <w:t>Quantité</w:t>
+            </w:r>
+          </w:p>
+        </w:tc>
+        <w:tc>
+          <w:tcPr>
+            <w:tcW w:w="0" w:type="auto"/>
+            <w:hideMark/>
+          </w:tcPr>
+          <w:p>
+            <w:pPr>
+              <w:jc w:val="center"/>
+              <w:rPr>
+                <w:rFonts w:ascii="Times New Roman" w:eastAsia="Times New Roman" w:hAnsi="Times New Roman" w:cs="Times New Roman"/>
+                <w:color w:val="2F5496" w:themeColor="accent1" w:themeShade="BF"/>
+                <w:kern w:val="0"/>
+                <w:sz w:val="20"/>
+                <w:szCs w:val="20"/>
+                <w:lang w:eastAsia="fr-FR"/>
+                <w14:ligatures w14:val="none"/>
+              </w:rPr>
+            </w:pPr>
+            <w:r>
+              <w:rPr>
+                <w:rFonts w:ascii="Times New Roman" w:eastAsia="Times New Roman" w:hAnsi="Times New Roman" w:cs="Times New Roman"/>
+                <w:b/>
+                <w:bCs/>
+                <w:color w:val="2F5496" w:themeColor="accent1" w:themeShade="BF"/>
+                <w:kern w:val="0"/>
+                <w:sz w:val="24"/>
+                <w:szCs w:val="24"/>
+                <w:lang w:eastAsia="fr-FR"/>
+                <w14:ligatures w14:val="none"/>
+              </w:rPr>
+              <w:t>Prix</w:t>
+            </w:r>
+          </w:p>
+        </w:tc>
+      </w:tr>
+      <w:tr>
+        <w:tc>
+          <w:tcPr>
+            <w:tcW w:w="0" w:type="auto"/>
+            <w:hideMark/>
+          </w:tcPr>
+          <w:p>
+            <w:pPr>
+              <w:rPr>
+                <w:rFonts w:ascii="Times New Roman" w:eastAsia="Times New Roman" w:hAnsi="Times New Roman" w:cs="Times New Roman"/>
+                <w:color w:val="2F5496" w:themeColor="accent1" w:themeShade="BF"/>
+                <w:kern w:val="0"/>
+                <w:sz w:val="24"/>
+                <w:szCs w:val="24"/>
+                <w:lang w:eastAsia="fr-FR"/>
+                <w14:ligatures w14:val="none"/>
+              </w:rPr>
+            </w:pPr>
+            <w:r>
+              <w:rPr>
+                <w:rFonts w:ascii="Times New Roman" w:eastAsia="Times New Roman" w:hAnsi="Times New Roman" w:cs="Times New Roman"/>
+                <w:color w:val="2F5496" w:themeColor="accent1" w:themeShade="BF"/>
+                <w:kern w:val="0"/>
+                <w:sz w:val="24"/>
+                <w:szCs w:val="24"/>
+                <w:lang w:eastAsia="fr-FR"/>
+                <w14:ligatures w14:val="none"/>
+              </w:rPr>
+              <w:lastRenderedPageBreak/>
+              <w:t>Développement d'une application web</w:t>
+            </w:r>
+          </w:p>
+        </w:tc>
+        <w:tc>
+          <w:tcPr>
+            <w:tcW w:w="0" w:type="auto"/>
+            <w:hideMark/>
+          </w:tcPr>
+          <w:p>
+            <w:pPr>
+              <w:rPr>
+                <w:rFonts w:ascii="Times New Roman" w:eastAsia="Times New Roman" w:hAnsi="Times New Roman" w:cs="Times New Roman"/>
+                <w:color w:val="2F5496" w:themeColor="accent1" w:themeShade="BF"/>
+                <w:kern w:val="0"/>
+                <w:sz w:val="24"/>
+                <w:szCs w:val="24"/>
+                <w:lang w:eastAsia="fr-FR"/>
+                <w14:ligatures w14:val="none"/>
+              </w:rPr>
+            </w:pPr>
+            <w:r>
+              <w:rPr>
+                <w:rFonts w:ascii="Times New Roman" w:eastAsia="Times New Roman" w:hAnsi="Times New Roman" w:cs="Times New Roman"/>
+                <w:color w:val="2F5496" w:themeColor="accent1" w:themeShade="BF"/>
+                <w:kern w:val="0"/>
+                <w:sz w:val="24"/>
+                <w:szCs w:val="24"/>
+                <w:lang w:eastAsia="fr-FR"/>
+                <w14:ligatures w14:val="none"/>
+              </w:rPr>
+              <w:t>1</w:t>
+            </w:r>
+          </w:p>
+        </w:tc>
+        <w:tc>
+          <w:tcPr>
+            <w:tcW w:w="0" w:type="auto"/>
+            <w:hideMark/>
+          </w:tcPr>
+          <w:p>
+            <w:pPr>
+              <w:rPr>
+                <w:rFonts w:ascii="Times New Roman" w:eastAsia="Times New Roman" w:hAnsi="Times New Roman" w:cs="Times New Roman"/>
+                <w:color w:val="2F5496" w:themeColor="accent1" w:themeShade="BF"/>
+                <w:kern w:val="0"/>
+                <w:sz w:val="24"/>
+                <w:szCs w:val="24"/>
+                <w:lang w:eastAsia="fr-FR"/>
+                <w14:ligatures w14:val="none"/>
+              </w:rPr>
+            </w:pPr>
+            <w:r>
+              <w:rPr>
+                <w:rFonts w:ascii="Times New Roman" w:eastAsia="Times New Roman" w:hAnsi="Times New Roman" w:cs="Times New Roman"/>
+                <w:color w:val="2F5496" w:themeColor="accent1" w:themeShade="BF"/>
+                <w:kern w:val="0"/>
+                <w:sz w:val="24"/>
+                <w:szCs w:val="24"/>
+                <w:lang w:eastAsia="fr-FR"/>
+                <w14:ligatures w14:val="none"/>
+              </w:rPr>
+              <w:t>250 000 FCFA</w:t>
+            </w:r>
+          </w:p>
+        </w:tc>
+      </w:tr>
+      <w:tr>
+        <w:tc>
+          <w:tcPr>
+            <w:tcW w:w="0" w:type="auto"/>
+            <w:hideMark/>
+          </w:tcPr>
+          <w:p>
+            <w:pPr>
+              <w:rPr>
+                <w:rFonts w:ascii="Times New Roman" w:eastAsia="Times New Roman" w:hAnsi="Times New Roman" w:cs="Times New Roman"/>
+                <w:color w:val="2F5496" w:themeColor="accent1" w:themeShade="BF"/>
+                <w:kern w:val="0"/>
+                <w:sz w:val="24"/>
+                <w:szCs w:val="24"/>
+                <w:lang w:eastAsia="fr-FR"/>
+                <w14:ligatures w14:val="none"/>
+              </w:rPr>
+            </w:pPr>
+            <w:r>
+              <w:rPr>
+                <w:rFonts w:ascii="Times New Roman" w:eastAsia="Times New Roman" w:hAnsi="Times New Roman" w:cs="Times New Roman"/>
+                <w:color w:val="2F5496" w:themeColor="accent1" w:themeShade="BF"/>
+                <w:kern w:val="0"/>
+                <w:sz w:val="24"/>
+                <w:szCs w:val="24"/>
+                <w:lang w:eastAsia="fr-FR"/>
+                <w14:ligatures w14:val="none"/>
+              </w:rPr>
+              <w:t>Maintenance technique</w:t>
+            </w:r>
+          </w:p>
+        </w:tc>
+        <w:tc>
+          <w:tcPr>
+            <w:tcW w:w="0" w:type="auto"/>
+            <w:hideMark/>
+          </w:tcPr>
+          <w:p>
+            <w:pPr>
+              <w:rPr>
+                <w:rFonts w:ascii="Times New Roman" w:eastAsia="Times New Roman" w:hAnsi="Times New Roman" w:cs="Times New Roman"/>
+                <w:color w:val="2F5496" w:themeColor="accent1" w:themeShade="BF"/>
+                <w:kern w:val="0"/>
+                <w:sz w:val="24"/>
+                <w:szCs w:val="24"/>
+                <w:lang w:eastAsia="fr-FR"/>
+                <w14:ligatures w14:val="none"/>
+              </w:rPr>
+            </w:pPr>
+            <w:r>
+              <w:rPr>
+                <w:rFonts w:ascii="Times New Roman" w:eastAsia="Times New Roman" w:hAnsi="Times New Roman" w:cs="Times New Roman"/>
+                <w:color w:val="2F5496" w:themeColor="accent1" w:themeShade="BF"/>
+                <w:kern w:val="0"/>
+                <w:sz w:val="24"/>
+                <w:szCs w:val="24"/>
+                <w:lang w:eastAsia="fr-FR"/>
+                <w14:ligatures w14:val="none"/>
+              </w:rPr>
+              <w:t>1</w:t>
+            </w:r>
+          </w:p>
+        </w:tc>
+        <w:tc>
+          <w:tcPr>
+            <w:tcW w:w="0" w:type="auto"/>
+            <w:hideMark/>
+          </w:tcPr>
+          <w:p>
+            <w:pPr>
+              <w:rPr>
+                <w:rFonts w:ascii="Times New Roman" w:eastAsia="Times New Roman" w:hAnsi="Times New Roman" w:cs="Times New Roman"/>
+                <w:color w:val="2F5496" w:themeColor="accent1" w:themeShade="BF"/>
+                <w:kern w:val="0"/>
+                <w:sz w:val="24"/>
+                <w:szCs w:val="24"/>
+                <w:lang w:eastAsia="fr-FR"/>
+                <w14:ligatures w14:val="none"/>
+              </w:rPr>
+            </w:pPr>
+            <w:r>
+              <w:rPr>
+                <w:rFonts w:ascii="Times New Roman" w:eastAsia="Times New Roman" w:hAnsi="Times New Roman" w:cs="Times New Roman"/>
+                <w:color w:val="2F5496" w:themeColor="accent1" w:themeShade="BF"/>
+                <w:kern w:val="0"/>
+                <w:sz w:val="24"/>
+                <w:szCs w:val="24"/>
+                <w:lang w:eastAsia="fr-FR"/>
+                <w14:ligatures w14:val="none"/>
+              </w:rPr>
+              <w:t>50 000 FCFA</w:t>
+            </w:r>
+          </w:p>
+        </w:tc>
+      </w:tr>
+    </w:tbl>
+    <w:p>
+      <w:pPr>
+        <w:spacing w:after="0" w:line="240" w:lineRule="auto"/>
+        <w:ind w:left="708"/>
+        <w:rPr>
+          <w:rFonts w:ascii="Times New Roman" w:eastAsia="Times New Roman" w:hAnsi="Times New Roman" w:cs="Times New Roman"/>
+          <w:color w:val="2F5496" w:themeColor="accent1" w:themeShade="BF"/>
+          <w:kern w:val="0"/>
+          <w:sz w:val="24"/>
+          <w:szCs w:val="24"/>
+          <w:lang w:eastAsia="fr-FR"/>
+          <w14:ligatures w14:val="none"/>
+        </w:rPr>
+      </w:pPr>
+      <w:r>
+        <w:rPr>
+          <w:rFonts w:ascii="Times New Roman" w:eastAsia="Times New Roman" w:hAnsi="Times New Roman" w:cs="Times New Roman"/>
+          <w:b/>
+          <w:bCs/>
+          <w:color w:val="2F5496" w:themeColor="accent1" w:themeShade="BF"/>
+          <w:kern w:val="0"/>
+          <w:sz w:val="24"/>
+          <w:szCs w:val="24"/>
+          <w:lang w:eastAsia="fr-FR"/>
+          <w14:ligatures w14:val="none"/>
+        </w:rPr>
+        <w:t>Montant HT :</w:t>
+      </w:r>
+      <w:r>
+        <w:rPr>
+          <w:rFonts w:ascii="Times New Roman" w:eastAsia="Times New Roman" w:hAnsi="Times New Roman" w:cs="Times New Roman"/>
+          <w:color w:val="2F5496" w:themeColor="accent1" w:themeShade="BF"/>
+          <w:kern w:val="0"/>
+          <w:sz w:val="24"/>
+          <w:szCs w:val="24"/>
+          <w:lang w:eastAsia="fr-FR"/>
+          <w14:ligatures w14:val="none"/>
+        </w:rPr>
+        <w:t xml:space="preserve"> 300 000 FCFA</w:t>
+      </w:r>
+    </w:p>
+    <w:p>
+      <w:pPr>
+        <w:spacing w:after="0" w:line="240" w:lineRule="auto"/>
+        <w:ind w:left="708"/>
+        <w:rPr>
+          <w:rFonts w:ascii="Times New Roman" w:eastAsia="Times New Roman" w:hAnsi="Times New Roman" w:cs="Times New Roman"/>
+          <w:color w:val="2F5496" w:themeColor="accent1" w:themeShade="BF"/>
+          <w:kern w:val="0"/>
+          <w:sz w:val="24"/>
+          <w:szCs w:val="24"/>
+          <w:lang w:eastAsia="fr-FR"/>
+          <w14:ligatures w14:val="none"/>
+        </w:rPr>
+      </w:pPr>
+      <w:r>
+        <w:rPr>
+          <w:rFonts w:ascii="Times New Roman" w:eastAsia="Times New Roman" w:hAnsi="Times New Roman" w:cs="Times New Roman"/>
+          <w:b/>
+          <w:bCs/>
+          <w:color w:val="2F5496" w:themeColor="accent1" w:themeShade="BF"/>
+          <w:kern w:val="0"/>
+          <w:sz w:val="24"/>
+          <w:szCs w:val="24"/>
+          <w:lang w:eastAsia="fr-FR"/>
+          <w14:ligatures w14:val="none"/>
+        </w:rPr>
+        <w:t>TVA (18 %) :</w:t>
+      </w:r>
+      <w:r>
+        <w:rPr>
+          <w:rFonts w:ascii="Times New Roman" w:eastAsia="Times New Roman" w:hAnsi="Times New Roman" w:cs="Times New Roman"/>
+          <w:color w:val="2F5496" w:themeColor="accent1" w:themeShade="BF"/>
+          <w:kern w:val="0"/>
+          <w:sz w:val="24"/>
+          <w:szCs w:val="24"/>
+          <w:lang w:eastAsia="fr-FR"/>
+          <w14:ligatures w14:val="none"/>
+        </w:rPr>
+        <w:t xml:space="preserve"> 54 000 FCFA</w:t>
+      </w:r>
+    </w:p>
+    <w:p>
+      <w:pPr>
+        <w:spacing w:after="0" w:line="240" w:lineRule="auto"/>
+        <w:ind w:left="708"/>
+        <w:rPr>
+          <w:rFonts w:ascii="Times New Roman" w:eastAsia="Times New Roman" w:hAnsi="Times New Roman" w:cs="Times New Roman"/>
+          <w:color w:val="2F5496" w:themeColor="accent1" w:themeShade="BF"/>
+          <w:kern w:val="0"/>
+          <w:sz w:val="24"/>
+          <w:szCs w:val="24"/>
+          <w:lang w:eastAsia="fr-FR"/>
+          <w14:ligatures w14:val="none"/>
+        </w:rPr>
+      </w:pPr>
+      <w:r>
+        <w:rPr>
+          <w:rFonts w:ascii="Times New Roman" w:eastAsia="Times New Roman" w:hAnsi="Times New Roman" w:cs="Times New Roman"/>
+          <w:b/>
+          <w:bCs/>
+          <w:color w:val="2F5496" w:themeColor="accent1" w:themeShade="BF"/>
+          <w:kern w:val="0"/>
+          <w:sz w:val="24"/>
+          <w:szCs w:val="24"/>
+          <w:lang w:eastAsia="fr-FR"/>
+          <w14:ligatures w14:val="none"/>
+        </w:rPr>
+        <w:t>Montant TTC :</w:t>
+      </w:r>
+      <w:r>
+        <w:rPr>
+          <w:rFonts w:ascii="Times New Roman" w:eastAsia="Times New Roman" w:hAnsi="Times New Roman" w:cs="Times New Roman"/>
+          <w:color w:val="2F5496" w:themeColor="accent1" w:themeShade="BF"/>
+          <w:kern w:val="0"/>
+          <w:sz w:val="24"/>
+          <w:szCs w:val="24"/>
+          <w:lang w:eastAsia="fr-FR"/>
+          <w14:ligatures w14:val="none"/>
+        </w:rPr>
+        <w:t xml:space="preserve"> 354 000 FCFA</w:t>
+      </w:r>
+    </w:p>
+    <w:p>
+      <w:pPr>
+        <w:spacing w:after="0" w:line="240" w:lineRule="auto"/>
+        <w:ind w:left="708"/>
+        <w:rPr>
+          <w:rFonts w:ascii="Times New Roman" w:eastAsia="Times New Roman" w:hAnsi="Times New Roman" w:cs="Times New Roman"/>
+          <w:color w:val="2F5496" w:themeColor="accent1" w:themeShade="BF"/>
+          <w:kern w:val="0"/>
+          <w:sz w:val="24"/>
+          <w:szCs w:val="24"/>
+          <w:lang w:eastAsia="fr-FR"/>
+          <w14:ligatures w14:val="none"/>
+        </w:rPr>
+      </w:pPr>
+    </w:p>
+    <w:p>
+      <w:pPr>
+        <w:spacing w:after="0" w:line="240" w:lineRule="auto"/>
+        <w:ind w:left="708"/>
+        <w:rPr>
+          <w:rFonts w:ascii="Times New Roman" w:eastAsia="Times New Roman" w:hAnsi="Times New Roman" w:cs="Times New Roman"/>
+          <w:color w:val="2F5496" w:themeColor="accent1" w:themeShade="BF"/>
+          <w:kern w:val="0"/>
+          <w:sz w:val="24"/>
+          <w:szCs w:val="24"/>
+          <w:lang w:eastAsia="fr-FR"/>
+          <w14:ligatures w14:val="none"/>
+        </w:rPr>
+      </w:pPr>
+      <w:r>
+        <w:rPr>
+          <w:rFonts w:ascii="Times New Roman" w:eastAsia="Times New Roman" w:hAnsi="Times New Roman" w:cs="Times New Roman"/>
+          <w:color w:val="2F5496" w:themeColor="accent1" w:themeShade="BF"/>
+          <w:kern w:val="0"/>
+          <w:sz w:val="24"/>
+          <w:szCs w:val="24"/>
+          <w:lang w:eastAsia="fr-FR"/>
+          <w14:ligatures w14:val="none"/>
+        </w:rPr>
+        <w:drawing>
+          <wp:inline distT="0" distB="0" distL="0" distR="0" wp14:anchorId="0D52ABB8" wp14:editId="79068BD7">
+            <wp:extent cx="5760720" cy="1988820"/>
+            <wp:effectExtent l="0" t="0" r="0" b="0"/>
+            <wp:docPr id="22" name="Image 22"/>
+            <wp:cNvGraphicFramePr>
+              <a:graphicFrameLocks xmlns:a="http://schemas.openxmlformats.org/drawingml/2006/main" noChangeAspect="1"/>
+            </wp:cNvGraphicFramePr>
+            <a:graphic xmlns:a="http://schemas.openxmlformats.org/drawingml/2006/main">
+              <a:graphicData uri="http://schemas.openxmlformats.org/drawingml/2006/picture">
+                <pic:pic xmlns:pic="http://schemas.openxmlformats.org/drawingml/2006/picture">
+                  <pic:nvPicPr>
+                    <pic:cNvPr id="1" name=""/>
+                    <pic:cNvPicPr/>
+                  </pic:nvPicPr>
+                  <pic:blipFill>
+                    <a:blip r:embed="rId26"/>
+                    <a:stretch>
+                      <a:fillRect/>
+                    </a:stretch>
+                  </pic:blipFill>
+                  <pic:spPr>
+                    <a:xfrm>
+                      <a:off x="0" y="0"/>
+                      <a:ext cx="5760720" cy="1988820"/>
+                    </a:xfrm>
+                    <a:prstGeom prst="rect">
+                      <a:avLst/>
+                    </a:prstGeom>
+                  </pic:spPr>
+                </pic:pic>
+              </a:graphicData>
+            </a:graphic>
+          </wp:inline>
+        </w:drawing>
+      </w:r>
     </w:p>
     <w:p>
       <w:pPr>
@@ -6945,8 +8064,8 @@
       </w:pPr>
     </w:p>
     <w:sectPr>
-      <w:headerReference w:type="default" r:id="rId26"/>
-      <w:footerReference w:type="default" r:id="rId27"/>
+      <w:headerReference w:type="default" r:id="rId27"/>
+      <w:footerReference w:type="default" r:id="rId28"/>
       <w:pgSz w:w="11906" w:h="16838"/>
       <w:pgMar w:top="1417" w:right="1417" w:bottom="1417" w:left="1417" w:header="708" w:footer="708" w:gutter="0"/>
       <w:pgBorders w:offsetFrom="page">
@@ -8316,6 +9435,155 @@
     </w:lvl>
   </w:abstractNum>
   <w:abstractNum w:abstractNumId="8" w15:restartNumberingAfterBreak="0">
+    <w:nsid w:val="4F9D0AB4"/>
+    <w:multiLevelType w:val="multilevel"/>
+    <w:tmpl w:val="839C6E34"/>
+    <w:lvl w:ilvl="0">
+      <w:start w:val="1"/>
+      <w:numFmt w:val="bullet"/>
+      <w:lvlText w:val=""/>
+      <w:lvlJc w:val="left"/>
+      <w:pPr>
+        <w:tabs>
+          <w:tab w:val="num" w:pos="720"/>
+        </w:tabs>
+        <w:ind w:left="720" w:hanging="360"/>
+      </w:pPr>
+      <w:rPr>
+        <w:rFonts w:ascii="Symbol" w:hAnsi="Symbol" w:hint="default"/>
+        <w:sz w:val="20"/>
+      </w:rPr>
+    </w:lvl>
+    <w:lvl w:ilvl="1" w:tentative="1">
+      <w:start w:val="1"/>
+      <w:numFmt w:val="bullet"/>
+      <w:lvlText w:val="o"/>
+      <w:lvlJc w:val="left"/>
+      <w:pPr>
+        <w:tabs>
+          <w:tab w:val="num" w:pos="1440"/>
+        </w:tabs>
+        <w:ind w:left="1440" w:hanging="360"/>
+      </w:pPr>
+      <w:rPr>
+        <w:rFonts w:ascii="Courier New" w:hAnsi="Courier New" w:hint="default"/>
+        <w:sz w:val="20"/>
+      </w:rPr>
+    </w:lvl>
+    <w:lvl w:ilvl="2" w:tentative="1">
+      <w:start w:val="1"/>
+      <w:numFmt w:val="bullet"/>
+      <w:lvlText w:val=""/>
+      <w:lvlJc w:val="left"/>
+      <w:pPr>
+        <w:tabs>
+          <w:tab w:val="num" w:pos="2160"/>
+        </w:tabs>
+        <w:ind w:left="2160" w:hanging="360"/>
+      </w:pPr>
+      <w:rPr>
+        <w:rFonts w:ascii="Wingdings" w:hAnsi="Wingdings" w:hint="default"/>
+        <w:sz w:val="20"/>
+      </w:rPr>
+    </w:lvl>
+    <w:lvl w:ilvl="3" w:tentative="1">
+      <w:start w:val="1"/>
+      <w:numFmt w:val="bullet"/>
+      <w:lvlText w:val=""/>
+      <w:lvlJc w:val="left"/>
+      <w:pPr>
+        <w:tabs>
+          <w:tab w:val="num" w:pos="2880"/>
+        </w:tabs>
+        <w:ind w:left="2880" w:hanging="360"/>
+      </w:pPr>
+      <w:rPr>
+        <w:rFonts w:ascii="Wingdings" w:hAnsi="Wingdings" w:hint="default"/>
+        <w:sz w:val="20"/>
+      </w:rPr>
+    </w:lvl>
+    <w:lvl w:ilvl="4" w:tentative="1">
+      <w:start w:val="1"/>
+      <w:numFmt w:val="bullet"/>
+      <w:lvlText w:val=""/>
+      <w:lvlJc w:val="left"/>
+      <w:pPr>
+        <w:tabs>
+          <w:tab w:val="num" w:pos="3600"/>
+        </w:tabs>
+        <w:ind w:left="3600" w:hanging="360"/>
+      </w:pPr>
+      <w:rPr>
+        <w:rFonts w:ascii="Wingdings" w:hAnsi="Wingdings" w:hint="default"/>
+        <w:sz w:val="20"/>
+      </w:rPr>
+    </w:lvl>
+    <w:lvl w:ilvl="5" w:tentative="1">
+      <w:start w:val="1"/>
+      <w:numFmt w:val="bullet"/>
+      <w:lvlText w:val=""/>
+      <w:lvlJc w:val="left"/>
+      <w:pPr>
+        <w:tabs>
+          <w:tab w:val="num" w:pos="4320"/>
+        </w:tabs>
+        <w:ind w:left="4320" w:hanging="360"/>
+      </w:pPr>
+      <w:rPr>
+        <w:rFonts w:ascii="Wingdings" w:hAnsi="Wingdings" w:hint="default"/>
+        <w:sz w:val="20"/>
+      </w:rPr>
+    </w:lvl>
+    <w:lvl w:ilvl="6" w:tentative="1">
+      <w:start w:val="1"/>
+      <w:numFmt w:val="bullet"/>
+      <w:lvlText w:val=""/>
+      <w:lvlJc w:val="left"/>
+      <w:pPr>
+        <w:tabs>
+          <w:tab w:val="num" w:pos="5040"/>
+        </w:tabs>
+        <w:ind w:left="5040" w:hanging="360"/>
+      </w:pPr>
+      <w:rPr>
+        <w:rFonts w:ascii="Wingdings" w:hAnsi="Wingdings" w:hint="default"/>
+        <w:sz w:val="20"/>
+      </w:rPr>
+    </w:lvl>
+    <w:lvl w:ilvl="7" w:tentative="1">
+      <w:start w:val="1"/>
+      <w:numFmt w:val="bullet"/>
+      <w:lvlText w:val=""/>
+      <w:lvlJc w:val="left"/>
+      <w:pPr>
+        <w:tabs>
+          <w:tab w:val="num" w:pos="5760"/>
+        </w:tabs>
+        <w:ind w:left="5760" w:hanging="360"/>
+      </w:pPr>
+      <w:rPr>
+        <w:rFonts w:ascii="Wingdings" w:hAnsi="Wingdings" w:hint="default"/>
+        <w:sz w:val="20"/>
+      </w:rPr>
+    </w:lvl>
+    <w:lvl w:ilvl="8" w:tentative="1">
+      <w:start w:val="1"/>
+      <w:numFmt w:val="bullet"/>
+      <w:lvlText w:val=""/>
+      <w:lvlJc w:val="left"/>
+      <w:pPr>
+        <w:tabs>
+          <w:tab w:val="num" w:pos="6480"/>
+        </w:tabs>
+        <w:ind w:left="6480" w:hanging="360"/>
+      </w:pPr>
+      <w:rPr>
+        <w:rFonts w:ascii="Wingdings" w:hAnsi="Wingdings" w:hint="default"/>
+        <w:sz w:val="20"/>
+      </w:rPr>
+    </w:lvl>
+  </w:abstractNum>
+  <w:abstractNum w:abstractNumId="9" w15:restartNumberingAfterBreak="0">
     <w:nsid w:val="56D568C8"/>
     <w:multiLevelType w:val="multilevel"/>
     <w:tmpl w:val="3392CAD2"/>
@@ -8464,7 +9732,7 @@
       </w:rPr>
     </w:lvl>
   </w:abstractNum>
-  <w:abstractNum w:abstractNumId="9" w15:restartNumberingAfterBreak="0">
+  <w:abstractNum w:abstractNumId="10" w15:restartNumberingAfterBreak="0">
     <w:nsid w:val="61053792"/>
     <w:multiLevelType w:val="multilevel"/>
     <w:tmpl w:val="49E43BFC"/>
@@ -8613,7 +9881,7 @@
       </w:rPr>
     </w:lvl>
   </w:abstractNum>
-  <w:abstractNum w:abstractNumId="10" w15:restartNumberingAfterBreak="0">
+  <w:abstractNum w:abstractNumId="11" w15:restartNumberingAfterBreak="0">
     <w:nsid w:val="6DA36487"/>
     <w:multiLevelType w:val="multilevel"/>
     <w:tmpl w:val="9C4C8532"/>
@@ -8762,7 +10030,7 @@
       </w:rPr>
     </w:lvl>
   </w:abstractNum>
-  <w:abstractNum w:abstractNumId="11" w15:restartNumberingAfterBreak="0">
+  <w:abstractNum w:abstractNumId="12" w15:restartNumberingAfterBreak="0">
     <w:nsid w:val="6EB85EAA"/>
     <w:multiLevelType w:val="hybridMultilevel"/>
     <w:tmpl w:val="DB76C824"/>
@@ -8876,13 +10144,13 @@
     </w:lvl>
   </w:abstractNum>
   <w:num w:numId="1">
-    <w:abstractNumId w:val="11"/>
+    <w:abstractNumId w:val="12"/>
   </w:num>
   <w:num w:numId="2">
     <w:abstractNumId w:val="6"/>
   </w:num>
   <w:num w:numId="3">
-    <w:abstractNumId w:val="8"/>
+    <w:abstractNumId w:val="9"/>
   </w:num>
   <w:num w:numId="4">
     <w:abstractNumId w:val="5"/>
@@ -8891,13 +10159,13 @@
     <w:abstractNumId w:val="4"/>
   </w:num>
   <w:num w:numId="6">
-    <w:abstractNumId w:val="9"/>
+    <w:abstractNumId w:val="10"/>
   </w:num>
   <w:num w:numId="7">
     <w:abstractNumId w:val="3"/>
   </w:num>
   <w:num w:numId="8">
-    <w:abstractNumId w:val="10"/>
+    <w:abstractNumId w:val="11"/>
   </w:num>
   <w:num w:numId="9">
     <w:abstractNumId w:val="1"/>
@@ -8910,6 +10178,9 @@
   </w:num>
   <w:num w:numId="12">
     <w:abstractNumId w:val="0"/>
+  </w:num>
+  <w:num w:numId="13">
+    <w:abstractNumId w:val="8"/>
   </w:num>
 </w:numbering>
 </file>
@@ -9315,6 +10586,28 @@
     <w:name w:val="Normal"/>
     <w:qFormat/>
   </w:style>
+  <w:style w:type="paragraph" w:styleId="Titre3">
+    <w:name w:val="heading 3"/>
+    <w:basedOn w:val="Normal"/>
+    <w:link w:val="Titre3Car"/>
+    <w:uiPriority w:val="9"/>
+    <w:qFormat/>
+    <w:rsid w:val="00F6032A"/>
+    <w:pPr>
+      <w:spacing w:before="100" w:beforeAutospacing="1" w:after="100" w:afterAutospacing="1" w:line="240" w:lineRule="auto"/>
+      <w:outlineLvl w:val="2"/>
+    </w:pPr>
+    <w:rPr>
+      <w:rFonts w:ascii="Times New Roman" w:eastAsia="Times New Roman" w:hAnsi="Times New Roman" w:cs="Times New Roman"/>
+      <w:b/>
+      <w:bCs/>
+      <w:kern w:val="0"/>
+      <w:sz w:val="27"/>
+      <w:szCs w:val="27"/>
+      <w:lang w:eastAsia="fr-FR"/>
+      <w14:ligatures w14:val="none"/>
+    </w:rPr>
+  </w:style>
   <w:style w:type="character" w:default="1" w:styleId="Policepardfaut">
     <w:name w:val="Default Paragraph Font"/>
     <w:uiPriority w:val="1"/>
@@ -9467,6 +10760,42 @@
       <w:sz w:val="20"/>
       <w:szCs w:val="20"/>
     </w:rPr>
+  </w:style>
+  <w:style w:type="character" w:customStyle="1" w:styleId="Titre3Car">
+    <w:name w:val="Titre 3 Car"/>
+    <w:basedOn w:val="Policepardfaut"/>
+    <w:link w:val="Titre3"/>
+    <w:uiPriority w:val="9"/>
+    <w:rsid w:val="00F6032A"/>
+    <w:rPr>
+      <w:rFonts w:ascii="Times New Roman" w:eastAsia="Times New Roman" w:hAnsi="Times New Roman" w:cs="Times New Roman"/>
+      <w:b/>
+      <w:bCs/>
+      <w:kern w:val="0"/>
+      <w:sz w:val="27"/>
+      <w:szCs w:val="27"/>
+      <w:lang w:eastAsia="fr-FR"/>
+      <w14:ligatures w14:val="none"/>
+    </w:rPr>
+  </w:style>
+  <w:style w:type="table" w:styleId="Grilledutableau">
+    <w:name w:val="Table Grid"/>
+    <w:basedOn w:val="TableauNormal"/>
+    <w:uiPriority w:val="39"/>
+    <w:rsid w:val="00F6032A"/>
+    <w:pPr>
+      <w:spacing w:after="0" w:line="240" w:lineRule="auto"/>
+    </w:pPr>
+    <w:tblPr>
+      <w:tblBorders>
+        <w:top w:val="single" w:sz="4" w:space="0" w:color="auto"/>
+        <w:left w:val="single" w:sz="4" w:space="0" w:color="auto"/>
+        <w:bottom w:val="single" w:sz="4" w:space="0" w:color="auto"/>
+        <w:right w:val="single" w:sz="4" w:space="0" w:color="auto"/>
+        <w:insideH w:val="single" w:sz="4" w:space="0" w:color="auto"/>
+        <w:insideV w:val="single" w:sz="4" w:space="0" w:color="auto"/>
+      </w:tblBorders>
+    </w:tblPr>
   </w:style>
 </w:styles>
 </file>

</xml_diff>

<commit_message>
Créer un prompt permettant de rédiger un email destiné à un client dont la livraison a pris du retard avec les objectifs
</commit_message>
<xml_diff>
--- a/Atelier Prompt.docx
+++ b/Atelier Prompt.docx
@@ -7011,19 +7011,22 @@
     </w:p>
     <w:p>
       <w:pPr>
-        <w:spacing w:before="100" w:beforeAutospacing="1" w:after="100" w:afterAutospacing="1" w:line="240" w:lineRule="auto"/>
-        <w:rPr>
-          <w:rFonts w:ascii="Times New Roman" w:eastAsia="Times New Roman" w:hAnsi="Times New Roman" w:cs="Times New Roman"/>
-          <w:kern w:val="0"/>
-          <w:sz w:val="24"/>
-          <w:szCs w:val="24"/>
-          <w:lang w:eastAsia="fr-FR"/>
-          <w14:ligatures w14:val="none"/>
-        </w:rPr>
-      </w:pPr>
-      <w:r>
-        <w:rPr>
-          <w:rFonts w:ascii="Times New Roman" w:eastAsia="Times New Roman" w:hAnsi="Times New Roman" w:cs="Times New Roman"/>
+        <w:spacing w:after="0" w:line="240" w:lineRule="auto"/>
+        <w:ind w:left="708"/>
+        <w:rPr>
+          <w:rFonts w:ascii="Times New Roman" w:eastAsia="Times New Roman" w:hAnsi="Times New Roman" w:cs="Times New Roman"/>
+          <w:color w:val="2F5496" w:themeColor="accent1" w:themeShade="BF"/>
+          <w:kern w:val="0"/>
+          <w:sz w:val="24"/>
+          <w:szCs w:val="24"/>
+          <w:lang w:eastAsia="fr-FR"/>
+          <w14:ligatures w14:val="none"/>
+        </w:rPr>
+      </w:pPr>
+      <w:r>
+        <w:rPr>
+          <w:rFonts w:ascii="Times New Roman" w:eastAsia="Times New Roman" w:hAnsi="Times New Roman" w:cs="Times New Roman"/>
+          <w:color w:val="2F5496" w:themeColor="accent1" w:themeShade="BF"/>
           <w:kern w:val="0"/>
           <w:sz w:val="24"/>
           <w:szCs w:val="24"/>
@@ -7035,19 +7038,22 @@
     </w:p>
     <w:p>
       <w:pPr>
-        <w:spacing w:before="100" w:beforeAutospacing="1" w:after="100" w:afterAutospacing="1" w:line="240" w:lineRule="auto"/>
-        <w:rPr>
-          <w:rFonts w:ascii="Times New Roman" w:eastAsia="Times New Roman" w:hAnsi="Times New Roman" w:cs="Times New Roman"/>
-          <w:kern w:val="0"/>
-          <w:sz w:val="24"/>
-          <w:szCs w:val="24"/>
-          <w:lang w:eastAsia="fr-FR"/>
-          <w14:ligatures w14:val="none"/>
-        </w:rPr>
-      </w:pPr>
-      <w:r>
-        <w:rPr>
-          <w:rFonts w:ascii="Times New Roman" w:eastAsia="Times New Roman" w:hAnsi="Times New Roman" w:cs="Times New Roman"/>
+        <w:spacing w:after="0" w:line="240" w:lineRule="auto"/>
+        <w:ind w:left="708"/>
+        <w:rPr>
+          <w:rFonts w:ascii="Times New Roman" w:eastAsia="Times New Roman" w:hAnsi="Times New Roman" w:cs="Times New Roman"/>
+          <w:color w:val="2F5496" w:themeColor="accent1" w:themeShade="BF"/>
+          <w:kern w:val="0"/>
+          <w:sz w:val="24"/>
+          <w:szCs w:val="24"/>
+          <w:lang w:eastAsia="fr-FR"/>
+          <w14:ligatures w14:val="none"/>
+        </w:rPr>
+      </w:pPr>
+      <w:r>
+        <w:rPr>
+          <w:rFonts w:ascii="Times New Roman" w:eastAsia="Times New Roman" w:hAnsi="Times New Roman" w:cs="Times New Roman"/>
+          <w:color w:val="2F5496" w:themeColor="accent1" w:themeShade="BF"/>
           <w:kern w:val="0"/>
           <w:sz w:val="24"/>
           <w:szCs w:val="24"/>
@@ -7063,22 +7069,29 @@
           <w:ilvl w:val="0"/>
           <w:numId w:val="13"/>
         </w:numPr>
-        <w:spacing w:before="100" w:beforeAutospacing="1" w:after="100" w:afterAutospacing="1" w:line="240" w:lineRule="auto"/>
-        <w:rPr>
-          <w:rFonts w:ascii="Times New Roman" w:eastAsia="Times New Roman" w:hAnsi="Times New Roman" w:cs="Times New Roman"/>
-          <w:kern w:val="0"/>
-          <w:sz w:val="24"/>
-          <w:szCs w:val="24"/>
-          <w:lang w:eastAsia="fr-FR"/>
-          <w14:ligatures w14:val="none"/>
-        </w:rPr>
-      </w:pPr>
-      <w:r>
-        <w:rPr>
-          <w:rFonts w:ascii="Courier New" w:eastAsia="Times New Roman" w:hAnsi="Courier New" w:cs="Courier New"/>
-          <w:kern w:val="0"/>
-          <w:sz w:val="20"/>
-          <w:szCs w:val="20"/>
+        <w:tabs>
+          <w:tab w:val="clear" w:pos="720"/>
+          <w:tab w:val="num" w:pos="1428"/>
+        </w:tabs>
+        <w:spacing w:after="0" w:line="240" w:lineRule="auto"/>
+        <w:ind w:left="1428"/>
+        <w:rPr>
+          <w:rFonts w:ascii="Times New Roman" w:eastAsia="Times New Roman" w:hAnsi="Times New Roman" w:cs="Times New Roman"/>
+          <w:color w:val="2F5496" w:themeColor="accent1" w:themeShade="BF"/>
+          <w:kern w:val="0"/>
+          <w:sz w:val="24"/>
+          <w:szCs w:val="24"/>
+          <w:lang w:eastAsia="fr-FR"/>
+          <w14:ligatures w14:val="none"/>
+        </w:rPr>
+      </w:pPr>
+      <w:r>
+        <w:rPr>
+          <w:rFonts w:ascii="Times New Roman" w:eastAsia="Times New Roman" w:hAnsi="Times New Roman" w:cs="Times New Roman"/>
+          <w:color w:val="2F5496" w:themeColor="accent1" w:themeShade="BF"/>
+          <w:kern w:val="0"/>
+          <w:sz w:val="24"/>
+          <w:szCs w:val="24"/>
           <w:lang w:eastAsia="fr-FR"/>
           <w14:ligatures w14:val="none"/>
         </w:rPr>
@@ -7091,22 +7104,29 @@
           <w:ilvl w:val="0"/>
           <w:numId w:val="13"/>
         </w:numPr>
-        <w:spacing w:before="100" w:beforeAutospacing="1" w:after="100" w:afterAutospacing="1" w:line="240" w:lineRule="auto"/>
-        <w:rPr>
-          <w:rFonts w:ascii="Times New Roman" w:eastAsia="Times New Roman" w:hAnsi="Times New Roman" w:cs="Times New Roman"/>
-          <w:kern w:val="0"/>
-          <w:sz w:val="24"/>
-          <w:szCs w:val="24"/>
-          <w:lang w:eastAsia="fr-FR"/>
-          <w14:ligatures w14:val="none"/>
-        </w:rPr>
-      </w:pPr>
-      <w:r>
-        <w:rPr>
-          <w:rFonts w:ascii="Courier New" w:eastAsia="Times New Roman" w:hAnsi="Courier New" w:cs="Courier New"/>
-          <w:kern w:val="0"/>
-          <w:sz w:val="20"/>
-          <w:szCs w:val="20"/>
+        <w:tabs>
+          <w:tab w:val="clear" w:pos="720"/>
+          <w:tab w:val="num" w:pos="1428"/>
+        </w:tabs>
+        <w:spacing w:after="0" w:line="240" w:lineRule="auto"/>
+        <w:ind w:left="1428"/>
+        <w:rPr>
+          <w:rFonts w:ascii="Times New Roman" w:eastAsia="Times New Roman" w:hAnsi="Times New Roman" w:cs="Times New Roman"/>
+          <w:color w:val="2F5496" w:themeColor="accent1" w:themeShade="BF"/>
+          <w:kern w:val="0"/>
+          <w:sz w:val="24"/>
+          <w:szCs w:val="24"/>
+          <w:lang w:eastAsia="fr-FR"/>
+          <w14:ligatures w14:val="none"/>
+        </w:rPr>
+      </w:pPr>
+      <w:r>
+        <w:rPr>
+          <w:rFonts w:ascii="Times New Roman" w:eastAsia="Times New Roman" w:hAnsi="Times New Roman" w:cs="Times New Roman"/>
+          <w:color w:val="2F5496" w:themeColor="accent1" w:themeShade="BF"/>
+          <w:kern w:val="0"/>
+          <w:sz w:val="24"/>
+          <w:szCs w:val="24"/>
           <w:lang w:eastAsia="fr-FR"/>
           <w14:ligatures w14:val="none"/>
         </w:rPr>
@@ -7119,22 +7139,29 @@
           <w:ilvl w:val="0"/>
           <w:numId w:val="13"/>
         </w:numPr>
-        <w:spacing w:before="100" w:beforeAutospacing="1" w:after="100" w:afterAutospacing="1" w:line="240" w:lineRule="auto"/>
-        <w:rPr>
-          <w:rFonts w:ascii="Times New Roman" w:eastAsia="Times New Roman" w:hAnsi="Times New Roman" w:cs="Times New Roman"/>
-          <w:kern w:val="0"/>
-          <w:sz w:val="24"/>
-          <w:szCs w:val="24"/>
-          <w:lang w:eastAsia="fr-FR"/>
-          <w14:ligatures w14:val="none"/>
-        </w:rPr>
-      </w:pPr>
-      <w:r>
-        <w:rPr>
-          <w:rFonts w:ascii="Courier New" w:eastAsia="Times New Roman" w:hAnsi="Courier New" w:cs="Courier New"/>
-          <w:kern w:val="0"/>
-          <w:sz w:val="20"/>
-          <w:szCs w:val="20"/>
+        <w:tabs>
+          <w:tab w:val="clear" w:pos="720"/>
+          <w:tab w:val="num" w:pos="1428"/>
+        </w:tabs>
+        <w:spacing w:after="0" w:line="240" w:lineRule="auto"/>
+        <w:ind w:left="1428"/>
+        <w:rPr>
+          <w:rFonts w:ascii="Times New Roman" w:eastAsia="Times New Roman" w:hAnsi="Times New Roman" w:cs="Times New Roman"/>
+          <w:color w:val="2F5496" w:themeColor="accent1" w:themeShade="BF"/>
+          <w:kern w:val="0"/>
+          <w:sz w:val="24"/>
+          <w:szCs w:val="24"/>
+          <w:lang w:eastAsia="fr-FR"/>
+          <w14:ligatures w14:val="none"/>
+        </w:rPr>
+      </w:pPr>
+      <w:r>
+        <w:rPr>
+          <w:rFonts w:ascii="Times New Roman" w:eastAsia="Times New Roman" w:hAnsi="Times New Roman" w:cs="Times New Roman"/>
+          <w:color w:val="2F5496" w:themeColor="accent1" w:themeShade="BF"/>
+          <w:kern w:val="0"/>
+          <w:sz w:val="24"/>
+          <w:szCs w:val="24"/>
           <w:lang w:eastAsia="fr-FR"/>
           <w14:ligatures w14:val="none"/>
         </w:rPr>
@@ -7147,22 +7174,29 @@
           <w:ilvl w:val="0"/>
           <w:numId w:val="13"/>
         </w:numPr>
-        <w:spacing w:before="100" w:beforeAutospacing="1" w:after="100" w:afterAutospacing="1" w:line="240" w:lineRule="auto"/>
-        <w:rPr>
-          <w:rFonts w:ascii="Times New Roman" w:eastAsia="Times New Roman" w:hAnsi="Times New Roman" w:cs="Times New Roman"/>
-          <w:kern w:val="0"/>
-          <w:sz w:val="24"/>
-          <w:szCs w:val="24"/>
-          <w:lang w:eastAsia="fr-FR"/>
-          <w14:ligatures w14:val="none"/>
-        </w:rPr>
-      </w:pPr>
-      <w:r>
-        <w:rPr>
-          <w:rFonts w:ascii="Courier New" w:eastAsia="Times New Roman" w:hAnsi="Courier New" w:cs="Courier New"/>
-          <w:kern w:val="0"/>
-          <w:sz w:val="20"/>
-          <w:szCs w:val="20"/>
+        <w:tabs>
+          <w:tab w:val="clear" w:pos="720"/>
+          <w:tab w:val="num" w:pos="1428"/>
+        </w:tabs>
+        <w:spacing w:after="0" w:line="240" w:lineRule="auto"/>
+        <w:ind w:left="1428"/>
+        <w:rPr>
+          <w:rFonts w:ascii="Times New Roman" w:eastAsia="Times New Roman" w:hAnsi="Times New Roman" w:cs="Times New Roman"/>
+          <w:color w:val="2F5496" w:themeColor="accent1" w:themeShade="BF"/>
+          <w:kern w:val="0"/>
+          <w:sz w:val="24"/>
+          <w:szCs w:val="24"/>
+          <w:lang w:eastAsia="fr-FR"/>
+          <w14:ligatures w14:val="none"/>
+        </w:rPr>
+      </w:pPr>
+      <w:r>
+        <w:rPr>
+          <w:rFonts w:ascii="Times New Roman" w:eastAsia="Times New Roman" w:hAnsi="Times New Roman" w:cs="Times New Roman"/>
+          <w:color w:val="2F5496" w:themeColor="accent1" w:themeShade="BF"/>
+          <w:kern w:val="0"/>
+          <w:sz w:val="24"/>
+          <w:szCs w:val="24"/>
           <w:lang w:eastAsia="fr-FR"/>
           <w14:ligatures w14:val="none"/>
         </w:rPr>
@@ -7175,22 +7209,29 @@
           <w:ilvl w:val="0"/>
           <w:numId w:val="13"/>
         </w:numPr>
-        <w:spacing w:before="100" w:beforeAutospacing="1" w:after="100" w:afterAutospacing="1" w:line="240" w:lineRule="auto"/>
-        <w:rPr>
-          <w:rFonts w:ascii="Times New Roman" w:eastAsia="Times New Roman" w:hAnsi="Times New Roman" w:cs="Times New Roman"/>
-          <w:kern w:val="0"/>
-          <w:sz w:val="24"/>
-          <w:szCs w:val="24"/>
-          <w:lang w:eastAsia="fr-FR"/>
-          <w14:ligatures w14:val="none"/>
-        </w:rPr>
-      </w:pPr>
-      <w:r>
-        <w:rPr>
-          <w:rFonts w:ascii="Courier New" w:eastAsia="Times New Roman" w:hAnsi="Courier New" w:cs="Courier New"/>
-          <w:kern w:val="0"/>
-          <w:sz w:val="20"/>
-          <w:szCs w:val="20"/>
+        <w:tabs>
+          <w:tab w:val="clear" w:pos="720"/>
+          <w:tab w:val="num" w:pos="1428"/>
+        </w:tabs>
+        <w:spacing w:after="0" w:line="240" w:lineRule="auto"/>
+        <w:ind w:left="1428"/>
+        <w:rPr>
+          <w:rFonts w:ascii="Times New Roman" w:eastAsia="Times New Roman" w:hAnsi="Times New Roman" w:cs="Times New Roman"/>
+          <w:color w:val="2F5496" w:themeColor="accent1" w:themeShade="BF"/>
+          <w:kern w:val="0"/>
+          <w:sz w:val="24"/>
+          <w:szCs w:val="24"/>
+          <w:lang w:eastAsia="fr-FR"/>
+          <w14:ligatures w14:val="none"/>
+        </w:rPr>
+      </w:pPr>
+      <w:r>
+        <w:rPr>
+          <w:rFonts w:ascii="Times New Roman" w:eastAsia="Times New Roman" w:hAnsi="Times New Roman" w:cs="Times New Roman"/>
+          <w:color w:val="2F5496" w:themeColor="accent1" w:themeShade="BF"/>
+          <w:kern w:val="0"/>
+          <w:sz w:val="24"/>
+          <w:szCs w:val="24"/>
           <w:lang w:eastAsia="fr-FR"/>
           <w14:ligatures w14:val="none"/>
         </w:rPr>
@@ -7203,89 +7244,104 @@
           <w:ilvl w:val="0"/>
           <w:numId w:val="13"/>
         </w:numPr>
-        <w:spacing w:before="100" w:beforeAutospacing="1" w:after="100" w:afterAutospacing="1" w:line="240" w:lineRule="auto"/>
-        <w:rPr>
-          <w:rFonts w:ascii="Times New Roman" w:eastAsia="Times New Roman" w:hAnsi="Times New Roman" w:cs="Times New Roman"/>
-          <w:kern w:val="0"/>
-          <w:sz w:val="24"/>
-          <w:szCs w:val="24"/>
-          <w:lang w:eastAsia="fr-FR"/>
-          <w14:ligatures w14:val="none"/>
-        </w:rPr>
-      </w:pPr>
+        <w:tabs>
+          <w:tab w:val="clear" w:pos="720"/>
+          <w:tab w:val="num" w:pos="1428"/>
+        </w:tabs>
+        <w:spacing w:after="0" w:line="240" w:lineRule="auto"/>
+        <w:ind w:left="1428"/>
+        <w:rPr>
+          <w:rFonts w:ascii="Times New Roman" w:eastAsia="Times New Roman" w:hAnsi="Times New Roman" w:cs="Times New Roman"/>
+          <w:color w:val="2F5496" w:themeColor="accent1" w:themeShade="BF"/>
+          <w:kern w:val="0"/>
+          <w:sz w:val="24"/>
+          <w:szCs w:val="24"/>
+          <w:lang w:eastAsia="fr-FR"/>
+          <w14:ligatures w14:val="none"/>
+        </w:rPr>
+      </w:pPr>
+      <w:r>
+        <w:rPr>
+          <w:rFonts w:ascii="Times New Roman" w:eastAsia="Times New Roman" w:hAnsi="Times New Roman" w:cs="Times New Roman"/>
+          <w:color w:val="2F5496" w:themeColor="accent1" w:themeShade="BF"/>
+          <w:kern w:val="0"/>
+          <w:sz w:val="24"/>
+          <w:szCs w:val="24"/>
+          <w:lang w:eastAsia="fr-FR"/>
+          <w14:ligatures w14:val="none"/>
+        </w:rPr>
+        <w:t>montant_ttc</w:t>
+      </w:r>
+    </w:p>
+    <w:p>
+      <w:pPr>
+        <w:spacing w:after="0" w:line="240" w:lineRule="auto"/>
+        <w:ind w:left="708"/>
+        <w:rPr>
+          <w:rFonts w:ascii="Times New Roman" w:eastAsia="Times New Roman" w:hAnsi="Times New Roman" w:cs="Times New Roman"/>
+          <w:color w:val="2F5496" w:themeColor="accent1" w:themeShade="BF"/>
+          <w:kern w:val="0"/>
+          <w:sz w:val="24"/>
+          <w:szCs w:val="24"/>
+          <w:lang w:eastAsia="fr-FR"/>
+          <w14:ligatures w14:val="none"/>
+        </w:rPr>
+      </w:pPr>
+      <w:r>
+        <w:rPr>
+          <w:rFonts w:ascii="Times New Roman" w:eastAsia="Times New Roman" w:hAnsi="Times New Roman" w:cs="Times New Roman"/>
+          <w:color w:val="2F5496" w:themeColor="accent1" w:themeShade="BF"/>
+          <w:kern w:val="0"/>
+          <w:sz w:val="24"/>
+          <w:szCs w:val="24"/>
+          <w:lang w:eastAsia="fr-FR"/>
+          <w14:ligatures w14:val="none"/>
+        </w:rPr>
+        <w:t>Retourne uniquement un JSON valide avec ces six champs.</w:t>
+      </w:r>
+    </w:p>
+    <w:p>
+      <w:pPr>
+        <w:spacing w:after="0" w:line="240" w:lineRule="auto"/>
+        <w:ind w:left="708"/>
+        <w:rPr>
+          <w:rFonts w:ascii="Times New Roman" w:eastAsia="Times New Roman" w:hAnsi="Times New Roman" w:cs="Times New Roman"/>
+          <w:color w:val="2F5496" w:themeColor="accent1" w:themeShade="BF"/>
+          <w:kern w:val="0"/>
+          <w:sz w:val="24"/>
+          <w:szCs w:val="24"/>
+          <w:lang w:eastAsia="fr-FR"/>
+          <w14:ligatures w14:val="none"/>
+        </w:rPr>
+      </w:pPr>
+      <w:r>
+        <w:rPr>
+          <w:rFonts w:ascii="Times New Roman" w:eastAsia="Times New Roman" w:hAnsi="Times New Roman" w:cs="Times New Roman"/>
+          <w:color w:val="2F5496" w:themeColor="accent1" w:themeShade="BF"/>
+          <w:kern w:val="0"/>
+          <w:sz w:val="24"/>
+          <w:szCs w:val="24"/>
+          <w:lang w:eastAsia="fr-FR"/>
+          <w14:ligatures w14:val="none"/>
+        </w:rPr>
+        <w:t xml:space="preserve">Si une information est absente de la facture, utilise </w:t>
+      </w:r>
       <w:r>
         <w:rPr>
           <w:rFonts w:ascii="Courier New" w:eastAsia="Times New Roman" w:hAnsi="Courier New" w:cs="Courier New"/>
+          <w:color w:val="2F5496" w:themeColor="accent1" w:themeShade="BF"/>
           <w:kern w:val="0"/>
           <w:sz w:val="20"/>
           <w:szCs w:val="20"/>
           <w:lang w:eastAsia="fr-FR"/>
           <w14:ligatures w14:val="none"/>
         </w:rPr>
-        <w:t>montant_ttc</w:t>
-      </w:r>
-    </w:p>
-    <w:p>
-      <w:pPr>
-        <w:spacing w:before="100" w:beforeAutospacing="1" w:after="100" w:afterAutospacing="1" w:line="240" w:lineRule="auto"/>
-        <w:rPr>
-          <w:rFonts w:ascii="Times New Roman" w:eastAsia="Times New Roman" w:hAnsi="Times New Roman" w:cs="Times New Roman"/>
-          <w:kern w:val="0"/>
-          <w:sz w:val="24"/>
-          <w:szCs w:val="24"/>
-          <w:lang w:eastAsia="fr-FR"/>
-          <w14:ligatures w14:val="none"/>
-        </w:rPr>
-      </w:pPr>
-      <w:r>
-        <w:rPr>
-          <w:rFonts w:ascii="Times New Roman" w:eastAsia="Times New Roman" w:hAnsi="Times New Roman" w:cs="Times New Roman"/>
-          <w:kern w:val="0"/>
-          <w:sz w:val="24"/>
-          <w:szCs w:val="24"/>
-          <w:lang w:eastAsia="fr-FR"/>
-          <w14:ligatures w14:val="none"/>
-        </w:rPr>
-        <w:t>Retourne uniquement un JSON valide avec ces six champs.</w:t>
-      </w:r>
-    </w:p>
-    <w:p>
-      <w:pPr>
-        <w:spacing w:before="100" w:beforeAutospacing="1" w:after="100" w:afterAutospacing="1" w:line="240" w:lineRule="auto"/>
-        <w:rPr>
-          <w:rFonts w:ascii="Times New Roman" w:eastAsia="Times New Roman" w:hAnsi="Times New Roman" w:cs="Times New Roman"/>
-          <w:kern w:val="0"/>
-          <w:sz w:val="24"/>
-          <w:szCs w:val="24"/>
-          <w:lang w:eastAsia="fr-FR"/>
-          <w14:ligatures w14:val="none"/>
-        </w:rPr>
-      </w:pPr>
-      <w:r>
-        <w:rPr>
-          <w:rFonts w:ascii="Times New Roman" w:eastAsia="Times New Roman" w:hAnsi="Times New Roman" w:cs="Times New Roman"/>
-          <w:kern w:val="0"/>
-          <w:sz w:val="24"/>
-          <w:szCs w:val="24"/>
-          <w:lang w:eastAsia="fr-FR"/>
-          <w14:ligatures w14:val="none"/>
-        </w:rPr>
-        <w:t xml:space="preserve">Si une information est absente de la facture, utilise </w:t>
-      </w:r>
-      <w:r>
-        <w:rPr>
-          <w:rFonts w:ascii="Courier New" w:eastAsia="Times New Roman" w:hAnsi="Courier New" w:cs="Courier New"/>
-          <w:kern w:val="0"/>
-          <w:sz w:val="20"/>
-          <w:szCs w:val="20"/>
-          <w:lang w:eastAsia="fr-FR"/>
-          <w14:ligatures w14:val="none"/>
-        </w:rPr>
         <w:t>null</w:t>
       </w:r>
       <w:r>
         <w:rPr>
           <w:rFonts w:ascii="Times New Roman" w:eastAsia="Times New Roman" w:hAnsi="Times New Roman" w:cs="Times New Roman"/>
+          <w:color w:val="2F5496" w:themeColor="accent1" w:themeShade="BF"/>
           <w:kern w:val="0"/>
           <w:sz w:val="24"/>
           <w:szCs w:val="24"/>
@@ -7297,19 +7353,21 @@
     </w:p>
     <w:p>
       <w:pPr>
-        <w:spacing w:before="100" w:beforeAutospacing="1" w:after="100" w:afterAutospacing="1" w:line="240" w:lineRule="auto"/>
-        <w:rPr>
-          <w:rFonts w:ascii="Times New Roman" w:eastAsia="Times New Roman" w:hAnsi="Times New Roman" w:cs="Times New Roman"/>
-          <w:kern w:val="0"/>
-          <w:sz w:val="24"/>
-          <w:szCs w:val="24"/>
-          <w:lang w:eastAsia="fr-FR"/>
-          <w14:ligatures w14:val="none"/>
-        </w:rPr>
-      </w:pPr>
-      <w:r>
-        <w:rPr>
-          <w:rFonts w:ascii="Times New Roman" w:eastAsia="Times New Roman" w:hAnsi="Times New Roman" w:cs="Times New Roman"/>
+        <w:spacing w:after="0" w:line="240" w:lineRule="auto"/>
+        <w:ind w:left="708"/>
+        <w:rPr>
+          <w:rFonts w:ascii="Times New Roman" w:eastAsia="Times New Roman" w:hAnsi="Times New Roman" w:cs="Times New Roman"/>
+          <w:kern w:val="0"/>
+          <w:sz w:val="24"/>
+          <w:szCs w:val="24"/>
+          <w:lang w:eastAsia="fr-FR"/>
+          <w14:ligatures w14:val="none"/>
+        </w:rPr>
+      </w:pPr>
+      <w:r>
+        <w:rPr>
+          <w:rFonts w:ascii="Times New Roman" w:eastAsia="Times New Roman" w:hAnsi="Times New Roman" w:cs="Times New Roman"/>
+          <w:color w:val="2F5496" w:themeColor="accent1" w:themeShade="BF"/>
           <w:kern w:val="0"/>
           <w:sz w:val="24"/>
           <w:szCs w:val="24"/>
@@ -7691,7 +7749,6 @@
                 <w:lang w:eastAsia="fr-FR"/>
                 <w14:ligatures w14:val="none"/>
               </w:rPr>
-              <w:lastRenderedPageBreak/>
               <w:t>Développement d'une application web</w:t>
             </w:r>
           </w:p>
@@ -8017,8 +8074,9 @@
           <w:lang w:eastAsia="fr-FR"/>
           <w14:ligatures w14:val="none"/>
         </w:rPr>
+        <w:lastRenderedPageBreak/>
         <w:drawing>
-          <wp:inline distT="0" distB="0" distL="0" distR="0" wp14:anchorId="0D52ABB8" wp14:editId="79068BD7">
+          <wp:inline distT="0" distB="0" distL="0" distR="0" wp14:anchorId="0D52ABB8" wp14:editId="2B5424A4">
             <wp:extent cx="5760720" cy="1988820"/>
             <wp:effectExtent l="0" t="0" r="0" b="0"/>
             <wp:docPr id="22" name="Image 22"/>
@@ -8063,9 +8121,555 @@
         </w:rPr>
       </w:pPr>
     </w:p>
+    <w:p>
+      <w:pPr>
+        <w:autoSpaceDE w:val="0"/>
+        <w:autoSpaceDN w:val="0"/>
+        <w:adjustRightInd w:val="0"/>
+        <w:spacing w:after="0" w:line="240" w:lineRule="auto"/>
+        <w:rPr>
+          <w:rFonts w:ascii="CIDFont+F1" w:hAnsi="CIDFont+F1" w:cs="CIDFont+F1"/>
+          <w:kern w:val="0"/>
+          <w:sz w:val="21"/>
+          <w:szCs w:val="21"/>
+        </w:rPr>
+      </w:pPr>
+      <w:r>
+        <w:rPr>
+          <w:rFonts w:ascii="CIDFont+F1" w:hAnsi="CIDFont+F1" w:cs="CIDFont+F1"/>
+          <w:kern w:val="0"/>
+          <w:sz w:val="21"/>
+          <w:szCs w:val="21"/>
+        </w:rPr>
+        <w:t>5) Créer un prompt permettant de rédiger un email destiné à un client dont la livraison a pris</w:t>
+      </w:r>
+    </w:p>
+    <w:p>
+      <w:pPr>
+        <w:autoSpaceDE w:val="0"/>
+        <w:autoSpaceDN w:val="0"/>
+        <w:adjustRightInd w:val="0"/>
+        <w:spacing w:after="0" w:line="240" w:lineRule="auto"/>
+        <w:rPr>
+          <w:rFonts w:ascii="CIDFont+F1" w:hAnsi="CIDFont+F1" w:cs="CIDFont+F1"/>
+          <w:kern w:val="0"/>
+          <w:sz w:val="21"/>
+          <w:szCs w:val="21"/>
+        </w:rPr>
+      </w:pPr>
+      <w:r>
+        <w:rPr>
+          <w:rFonts w:ascii="CIDFont+F1" w:hAnsi="CIDFont+F1" w:cs="CIDFont+F1"/>
+          <w:kern w:val="0"/>
+          <w:sz w:val="21"/>
+          <w:szCs w:val="21"/>
+        </w:rPr>
+        <w:t>du retard avec les objectifs (reconnaître le retard, présenter des excuses, expliquer la</w:t>
+      </w:r>
+    </w:p>
+    <w:p>
+      <w:pPr>
+        <w:autoSpaceDE w:val="0"/>
+        <w:autoSpaceDN w:val="0"/>
+        <w:adjustRightInd w:val="0"/>
+        <w:spacing w:after="0" w:line="240" w:lineRule="auto"/>
+        <w:rPr>
+          <w:rFonts w:ascii="CIDFont+F1" w:hAnsi="CIDFont+F1" w:cs="CIDFont+F1"/>
+          <w:kern w:val="0"/>
+          <w:sz w:val="21"/>
+          <w:szCs w:val="21"/>
+        </w:rPr>
+      </w:pPr>
+      <w:r>
+        <w:rPr>
+          <w:rFonts w:ascii="CIDFont+F1" w:hAnsi="CIDFont+F1" w:cs="CIDFont+F1"/>
+          <w:kern w:val="0"/>
+          <w:sz w:val="21"/>
+          <w:szCs w:val="21"/>
+        </w:rPr>
+        <w:t>situation sans inventer de cause et proposer une solution), le ton (professionnel, courtois et</w:t>
+      </w:r>
+    </w:p>
+    <w:p>
+      <w:pPr>
+        <w:rPr>
+          <w:rFonts w:ascii="CIDFont+F1" w:hAnsi="CIDFont+F1" w:cs="CIDFont+F1"/>
+          <w:kern w:val="0"/>
+          <w:sz w:val="21"/>
+          <w:szCs w:val="21"/>
+        </w:rPr>
+      </w:pPr>
+      <w:r>
+        <w:rPr>
+          <w:rFonts w:ascii="CIDFont+F1" w:hAnsi="CIDFont+F1" w:cs="CIDFont+F1"/>
+          <w:kern w:val="0"/>
+          <w:sz w:val="21"/>
+          <w:szCs w:val="21"/>
+        </w:rPr>
+        <w:t>rassurant) et la longueur maximale (150 mots)</w:t>
+      </w:r>
+    </w:p>
+    <w:p>
+      <w:pPr>
+        <w:spacing w:after="0" w:line="240" w:lineRule="auto"/>
+        <w:ind w:left="708"/>
+        <w:rPr>
+          <w:rFonts w:ascii="Times New Roman" w:eastAsia="Times New Roman" w:hAnsi="Times New Roman" w:cs="Times New Roman"/>
+          <w:color w:val="2F5496" w:themeColor="accent1" w:themeShade="BF"/>
+          <w:kern w:val="0"/>
+          <w:sz w:val="24"/>
+          <w:szCs w:val="24"/>
+          <w:lang w:eastAsia="fr-FR"/>
+          <w14:ligatures w14:val="none"/>
+        </w:rPr>
+      </w:pPr>
+      <w:r>
+        <w:rPr>
+          <w:rFonts w:ascii="Times New Roman" w:eastAsia="Times New Roman" w:hAnsi="Times New Roman" w:cs="Times New Roman"/>
+          <w:color w:val="2F5496" w:themeColor="accent1" w:themeShade="BF"/>
+          <w:kern w:val="0"/>
+          <w:sz w:val="24"/>
+          <w:szCs w:val="24"/>
+          <w:lang w:eastAsia="fr-FR"/>
+          <w14:ligatures w14:val="none"/>
+        </w:rPr>
+        <w:t>Tu es un professionnel de la relation client.</w:t>
+      </w:r>
+    </w:p>
+    <w:p>
+      <w:pPr>
+        <w:spacing w:after="0" w:line="240" w:lineRule="auto"/>
+        <w:ind w:left="708"/>
+        <w:rPr>
+          <w:rFonts w:ascii="Times New Roman" w:eastAsia="Times New Roman" w:hAnsi="Times New Roman" w:cs="Times New Roman"/>
+          <w:color w:val="2F5496" w:themeColor="accent1" w:themeShade="BF"/>
+          <w:kern w:val="0"/>
+          <w:sz w:val="24"/>
+          <w:szCs w:val="24"/>
+          <w:lang w:eastAsia="fr-FR"/>
+          <w14:ligatures w14:val="none"/>
+        </w:rPr>
+      </w:pPr>
+      <w:r>
+        <w:rPr>
+          <w:rFonts w:ascii="Times New Roman" w:eastAsia="Times New Roman" w:hAnsi="Times New Roman" w:cs="Times New Roman"/>
+          <w:color w:val="2F5496" w:themeColor="accent1" w:themeShade="BF"/>
+          <w:kern w:val="0"/>
+          <w:sz w:val="24"/>
+          <w:szCs w:val="24"/>
+          <w:lang w:eastAsia="fr-FR"/>
+          <w14:ligatures w14:val="none"/>
+        </w:rPr>
+        <w:t>Rédige un email destiné à un client dont la livraison a pris du retard.</w:t>
+      </w:r>
+    </w:p>
+    <w:p>
+      <w:pPr>
+        <w:spacing w:after="0" w:line="240" w:lineRule="auto"/>
+        <w:ind w:left="708"/>
+        <w:rPr>
+          <w:rFonts w:ascii="Times New Roman" w:eastAsia="Times New Roman" w:hAnsi="Times New Roman" w:cs="Times New Roman"/>
+          <w:color w:val="2F5496" w:themeColor="accent1" w:themeShade="BF"/>
+          <w:kern w:val="0"/>
+          <w:sz w:val="24"/>
+          <w:szCs w:val="24"/>
+          <w:lang w:eastAsia="fr-FR"/>
+          <w14:ligatures w14:val="none"/>
+        </w:rPr>
+      </w:pPr>
+      <w:r>
+        <w:rPr>
+          <w:rFonts w:ascii="Times New Roman" w:eastAsia="Times New Roman" w:hAnsi="Times New Roman" w:cs="Times New Roman"/>
+          <w:color w:val="2F5496" w:themeColor="accent1" w:themeShade="BF"/>
+          <w:kern w:val="0"/>
+          <w:sz w:val="24"/>
+          <w:szCs w:val="24"/>
+          <w:lang w:eastAsia="fr-FR"/>
+          <w14:ligatures w14:val="none"/>
+        </w:rPr>
+        <w:t>L'email doit avoir pour objectifs de :</w:t>
+      </w:r>
+    </w:p>
+    <w:p>
+      <w:pPr>
+        <w:numPr>
+          <w:ilvl w:val="0"/>
+          <w:numId w:val="14"/>
+        </w:numPr>
+        <w:tabs>
+          <w:tab w:val="clear" w:pos="720"/>
+          <w:tab w:val="num" w:pos="1428"/>
+        </w:tabs>
+        <w:spacing w:after="0" w:line="240" w:lineRule="auto"/>
+        <w:ind w:left="1428"/>
+        <w:rPr>
+          <w:rFonts w:ascii="Times New Roman" w:eastAsia="Times New Roman" w:hAnsi="Times New Roman" w:cs="Times New Roman"/>
+          <w:color w:val="2F5496" w:themeColor="accent1" w:themeShade="BF"/>
+          <w:kern w:val="0"/>
+          <w:sz w:val="24"/>
+          <w:szCs w:val="24"/>
+          <w:lang w:eastAsia="fr-FR"/>
+          <w14:ligatures w14:val="none"/>
+        </w:rPr>
+      </w:pPr>
+      <w:r>
+        <w:rPr>
+          <w:rFonts w:ascii="Times New Roman" w:eastAsia="Times New Roman" w:hAnsi="Times New Roman" w:cs="Times New Roman"/>
+          <w:color w:val="2F5496" w:themeColor="accent1" w:themeShade="BF"/>
+          <w:kern w:val="0"/>
+          <w:sz w:val="24"/>
+          <w:szCs w:val="24"/>
+          <w:lang w:eastAsia="fr-FR"/>
+          <w14:ligatures w14:val="none"/>
+        </w:rPr>
+        <w:t>reconnaître le retard ;</w:t>
+      </w:r>
+    </w:p>
+    <w:p>
+      <w:pPr>
+        <w:numPr>
+          <w:ilvl w:val="0"/>
+          <w:numId w:val="14"/>
+        </w:numPr>
+        <w:tabs>
+          <w:tab w:val="clear" w:pos="720"/>
+          <w:tab w:val="num" w:pos="1428"/>
+        </w:tabs>
+        <w:spacing w:after="0" w:line="240" w:lineRule="auto"/>
+        <w:ind w:left="1428"/>
+        <w:rPr>
+          <w:rFonts w:ascii="Times New Roman" w:eastAsia="Times New Roman" w:hAnsi="Times New Roman" w:cs="Times New Roman"/>
+          <w:color w:val="2F5496" w:themeColor="accent1" w:themeShade="BF"/>
+          <w:kern w:val="0"/>
+          <w:sz w:val="24"/>
+          <w:szCs w:val="24"/>
+          <w:lang w:eastAsia="fr-FR"/>
+          <w14:ligatures w14:val="none"/>
+        </w:rPr>
+      </w:pPr>
+      <w:r>
+        <w:rPr>
+          <w:rFonts w:ascii="Times New Roman" w:eastAsia="Times New Roman" w:hAnsi="Times New Roman" w:cs="Times New Roman"/>
+          <w:color w:val="2F5496" w:themeColor="accent1" w:themeShade="BF"/>
+          <w:kern w:val="0"/>
+          <w:sz w:val="24"/>
+          <w:szCs w:val="24"/>
+          <w:lang w:eastAsia="fr-FR"/>
+          <w14:ligatures w14:val="none"/>
+        </w:rPr>
+        <w:t>présenter des excuses au client ;</w:t>
+      </w:r>
+    </w:p>
+    <w:p>
+      <w:pPr>
+        <w:numPr>
+          <w:ilvl w:val="0"/>
+          <w:numId w:val="14"/>
+        </w:numPr>
+        <w:tabs>
+          <w:tab w:val="clear" w:pos="720"/>
+          <w:tab w:val="num" w:pos="1428"/>
+        </w:tabs>
+        <w:spacing w:after="0" w:line="240" w:lineRule="auto"/>
+        <w:ind w:left="1428"/>
+        <w:rPr>
+          <w:rFonts w:ascii="Times New Roman" w:eastAsia="Times New Roman" w:hAnsi="Times New Roman" w:cs="Times New Roman"/>
+          <w:color w:val="2F5496" w:themeColor="accent1" w:themeShade="BF"/>
+          <w:kern w:val="0"/>
+          <w:sz w:val="24"/>
+          <w:szCs w:val="24"/>
+          <w:lang w:eastAsia="fr-FR"/>
+          <w14:ligatures w14:val="none"/>
+        </w:rPr>
+      </w:pPr>
+      <w:r>
+        <w:rPr>
+          <w:rFonts w:ascii="Times New Roman" w:eastAsia="Times New Roman" w:hAnsi="Times New Roman" w:cs="Times New Roman"/>
+          <w:color w:val="2F5496" w:themeColor="accent1" w:themeShade="BF"/>
+          <w:kern w:val="0"/>
+          <w:sz w:val="24"/>
+          <w:szCs w:val="24"/>
+          <w:lang w:eastAsia="fr-FR"/>
+          <w14:ligatures w14:val="none"/>
+        </w:rPr>
+        <w:t>expliquer la situation sans inventer de cause ;</w:t>
+      </w:r>
+    </w:p>
+    <w:p>
+      <w:pPr>
+        <w:numPr>
+          <w:ilvl w:val="0"/>
+          <w:numId w:val="14"/>
+        </w:numPr>
+        <w:tabs>
+          <w:tab w:val="clear" w:pos="720"/>
+          <w:tab w:val="num" w:pos="1428"/>
+        </w:tabs>
+        <w:spacing w:after="0" w:line="240" w:lineRule="auto"/>
+        <w:ind w:left="1428"/>
+        <w:rPr>
+          <w:rFonts w:ascii="Times New Roman" w:eastAsia="Times New Roman" w:hAnsi="Times New Roman" w:cs="Times New Roman"/>
+          <w:color w:val="2F5496" w:themeColor="accent1" w:themeShade="BF"/>
+          <w:kern w:val="0"/>
+          <w:sz w:val="24"/>
+          <w:szCs w:val="24"/>
+          <w:lang w:eastAsia="fr-FR"/>
+          <w14:ligatures w14:val="none"/>
+        </w:rPr>
+      </w:pPr>
+      <w:r>
+        <w:rPr>
+          <w:rFonts w:ascii="Times New Roman" w:eastAsia="Times New Roman" w:hAnsi="Times New Roman" w:cs="Times New Roman"/>
+          <w:color w:val="2F5496" w:themeColor="accent1" w:themeShade="BF"/>
+          <w:kern w:val="0"/>
+          <w:sz w:val="24"/>
+          <w:szCs w:val="24"/>
+          <w:lang w:eastAsia="fr-FR"/>
+          <w14:ligatures w14:val="none"/>
+        </w:rPr>
+        <w:t>proposer une solution.</w:t>
+      </w:r>
+    </w:p>
+    <w:p>
+      <w:pPr>
+        <w:spacing w:after="0" w:line="240" w:lineRule="auto"/>
+        <w:ind w:left="708"/>
+        <w:rPr>
+          <w:rFonts w:ascii="Times New Roman" w:eastAsia="Times New Roman" w:hAnsi="Times New Roman" w:cs="Times New Roman"/>
+          <w:color w:val="2F5496" w:themeColor="accent1" w:themeShade="BF"/>
+          <w:kern w:val="0"/>
+          <w:sz w:val="24"/>
+          <w:szCs w:val="24"/>
+          <w:lang w:eastAsia="fr-FR"/>
+          <w14:ligatures w14:val="none"/>
+        </w:rPr>
+      </w:pPr>
+      <w:r>
+        <w:rPr>
+          <w:rFonts w:ascii="Times New Roman" w:eastAsia="Times New Roman" w:hAnsi="Times New Roman" w:cs="Times New Roman"/>
+          <w:color w:val="2F5496" w:themeColor="accent1" w:themeShade="BF"/>
+          <w:kern w:val="0"/>
+          <w:sz w:val="24"/>
+          <w:szCs w:val="24"/>
+          <w:lang w:eastAsia="fr-FR"/>
+          <w14:ligatures w14:val="none"/>
+        </w:rPr>
+        <w:t>Respecte les contraintes suivantes :</w:t>
+      </w:r>
+    </w:p>
+    <w:p>
+      <w:pPr>
+        <w:numPr>
+          <w:ilvl w:val="0"/>
+          <w:numId w:val="15"/>
+        </w:numPr>
+        <w:tabs>
+          <w:tab w:val="clear" w:pos="720"/>
+          <w:tab w:val="num" w:pos="1428"/>
+        </w:tabs>
+        <w:spacing w:after="0" w:line="240" w:lineRule="auto"/>
+        <w:ind w:left="1428"/>
+        <w:rPr>
+          <w:rFonts w:ascii="Times New Roman" w:eastAsia="Times New Roman" w:hAnsi="Times New Roman" w:cs="Times New Roman"/>
+          <w:color w:val="2F5496" w:themeColor="accent1" w:themeShade="BF"/>
+          <w:kern w:val="0"/>
+          <w:sz w:val="24"/>
+          <w:szCs w:val="24"/>
+          <w:lang w:eastAsia="fr-FR"/>
+          <w14:ligatures w14:val="none"/>
+        </w:rPr>
+      </w:pPr>
+      <w:r>
+        <w:rPr>
+          <w:rFonts w:ascii="Times New Roman" w:eastAsia="Times New Roman" w:hAnsi="Times New Roman" w:cs="Times New Roman"/>
+          <w:color w:val="2F5496" w:themeColor="accent1" w:themeShade="BF"/>
+          <w:kern w:val="0"/>
+          <w:sz w:val="24"/>
+          <w:szCs w:val="24"/>
+          <w:lang w:eastAsia="fr-FR"/>
+          <w14:ligatures w14:val="none"/>
+        </w:rPr>
+        <w:t>ton professionnel, courtois et rassurant ;</w:t>
+      </w:r>
+    </w:p>
+    <w:p>
+      <w:pPr>
+        <w:numPr>
+          <w:ilvl w:val="0"/>
+          <w:numId w:val="15"/>
+        </w:numPr>
+        <w:tabs>
+          <w:tab w:val="clear" w:pos="720"/>
+          <w:tab w:val="num" w:pos="1428"/>
+        </w:tabs>
+        <w:spacing w:after="0" w:line="240" w:lineRule="auto"/>
+        <w:ind w:left="1428"/>
+        <w:rPr>
+          <w:rFonts w:ascii="Times New Roman" w:eastAsia="Times New Roman" w:hAnsi="Times New Roman" w:cs="Times New Roman"/>
+          <w:color w:val="2F5496" w:themeColor="accent1" w:themeShade="BF"/>
+          <w:kern w:val="0"/>
+          <w:sz w:val="24"/>
+          <w:szCs w:val="24"/>
+          <w:lang w:eastAsia="fr-FR"/>
+          <w14:ligatures w14:val="none"/>
+        </w:rPr>
+      </w:pPr>
+      <w:r>
+        <w:rPr>
+          <w:rFonts w:ascii="Times New Roman" w:eastAsia="Times New Roman" w:hAnsi="Times New Roman" w:cs="Times New Roman"/>
+          <w:color w:val="2F5496" w:themeColor="accent1" w:themeShade="BF"/>
+          <w:kern w:val="0"/>
+          <w:sz w:val="24"/>
+          <w:szCs w:val="24"/>
+          <w:lang w:eastAsia="fr-FR"/>
+          <w14:ligatures w14:val="none"/>
+        </w:rPr>
+        <w:t>maximum 150 mots ;</w:t>
+      </w:r>
+    </w:p>
+    <w:p>
+      <w:pPr>
+        <w:numPr>
+          <w:ilvl w:val="0"/>
+          <w:numId w:val="15"/>
+        </w:numPr>
+        <w:tabs>
+          <w:tab w:val="clear" w:pos="720"/>
+          <w:tab w:val="num" w:pos="1428"/>
+        </w:tabs>
+        <w:spacing w:after="0" w:line="240" w:lineRule="auto"/>
+        <w:ind w:left="1428"/>
+        <w:rPr>
+          <w:rFonts w:ascii="Times New Roman" w:eastAsia="Times New Roman" w:hAnsi="Times New Roman" w:cs="Times New Roman"/>
+          <w:color w:val="2F5496" w:themeColor="accent1" w:themeShade="BF"/>
+          <w:kern w:val="0"/>
+          <w:sz w:val="24"/>
+          <w:szCs w:val="24"/>
+          <w:lang w:eastAsia="fr-FR"/>
+          <w14:ligatures w14:val="none"/>
+        </w:rPr>
+      </w:pPr>
+      <w:r>
+        <w:rPr>
+          <w:rFonts w:ascii="Times New Roman" w:eastAsia="Times New Roman" w:hAnsi="Times New Roman" w:cs="Times New Roman"/>
+          <w:color w:val="2F5496" w:themeColor="accent1" w:themeShade="BF"/>
+          <w:kern w:val="0"/>
+          <w:sz w:val="24"/>
+          <w:szCs w:val="24"/>
+          <w:lang w:eastAsia="fr-FR"/>
+          <w14:ligatures w14:val="none"/>
+        </w:rPr>
+        <w:t>n'invente aucune information concernant la cause du retard ou la date de livraison ;</w:t>
+      </w:r>
+    </w:p>
+    <w:p>
+      <w:pPr>
+        <w:numPr>
+          <w:ilvl w:val="0"/>
+          <w:numId w:val="15"/>
+        </w:numPr>
+        <w:tabs>
+          <w:tab w:val="clear" w:pos="720"/>
+          <w:tab w:val="num" w:pos="1428"/>
+        </w:tabs>
+        <w:spacing w:after="0" w:line="240" w:lineRule="auto"/>
+        <w:ind w:left="1428"/>
+        <w:rPr>
+          <w:rFonts w:ascii="Times New Roman" w:eastAsia="Times New Roman" w:hAnsi="Times New Roman" w:cs="Times New Roman"/>
+          <w:color w:val="2F5496" w:themeColor="accent1" w:themeShade="BF"/>
+          <w:kern w:val="0"/>
+          <w:sz w:val="24"/>
+          <w:szCs w:val="24"/>
+          <w:lang w:eastAsia="fr-FR"/>
+          <w14:ligatures w14:val="none"/>
+        </w:rPr>
+      </w:pPr>
+      <w:r>
+        <w:rPr>
+          <w:rFonts w:ascii="Times New Roman" w:eastAsia="Times New Roman" w:hAnsi="Times New Roman" w:cs="Times New Roman"/>
+          <w:color w:val="2F5496" w:themeColor="accent1" w:themeShade="BF"/>
+          <w:kern w:val="0"/>
+          <w:sz w:val="24"/>
+          <w:szCs w:val="24"/>
+          <w:lang w:eastAsia="fr-FR"/>
+          <w14:ligatures w14:val="none"/>
+        </w:rPr>
+        <w:t>rédige uniquement l'email.</w:t>
+      </w:r>
+    </w:p>
+    <w:p>
+      <w:pPr>
+        <w:rPr>
+          <w:rFonts w:ascii="Times New Roman" w:hAnsi="Times New Roman" w:cs="Times New Roman"/>
+          <w:sz w:val="24"/>
+          <w:szCs w:val="24"/>
+        </w:rPr>
+      </w:pPr>
+    </w:p>
+    <w:p>
+      <w:pPr>
+        <w:rPr>
+          <w:rFonts w:ascii="Times New Roman" w:hAnsi="Times New Roman" w:cs="Times New Roman"/>
+          <w:sz w:val="24"/>
+          <w:szCs w:val="24"/>
+        </w:rPr>
+      </w:pPr>
+      <w:r>
+        <w:rPr>
+          <w:rFonts w:ascii="Times New Roman" w:hAnsi="Times New Roman" w:cs="Times New Roman"/>
+          <w:sz w:val="24"/>
+          <w:szCs w:val="24"/>
+        </w:rPr>
+        <w:lastRenderedPageBreak/>
+        <w:drawing>
+          <wp:inline distT="0" distB="0" distL="0" distR="0" wp14:anchorId="40E01E01" wp14:editId="75D9FA6E">
+            <wp:extent cx="5760720" cy="3922395"/>
+            <wp:effectExtent l="0" t="0" r="0" b="1905"/>
+            <wp:docPr id="23" name="Image 23"/>
+            <wp:cNvGraphicFramePr>
+              <a:graphicFrameLocks xmlns:a="http://schemas.openxmlformats.org/drawingml/2006/main" noChangeAspect="1"/>
+            </wp:cNvGraphicFramePr>
+            <a:graphic xmlns:a="http://schemas.openxmlformats.org/drawingml/2006/main">
+              <a:graphicData uri="http://schemas.openxmlformats.org/drawingml/2006/picture">
+                <pic:pic xmlns:pic="http://schemas.openxmlformats.org/drawingml/2006/picture">
+                  <pic:nvPicPr>
+                    <pic:cNvPr id="1" name=""/>
+                    <pic:cNvPicPr/>
+                  </pic:nvPicPr>
+                  <pic:blipFill>
+                    <a:blip r:embed="rId27"/>
+                    <a:stretch>
+                      <a:fillRect/>
+                    </a:stretch>
+                  </pic:blipFill>
+                  <pic:spPr>
+                    <a:xfrm>
+                      <a:off x="0" y="0"/>
+                      <a:ext cx="5760720" cy="3922395"/>
+                    </a:xfrm>
+                    <a:prstGeom prst="rect">
+                      <a:avLst/>
+                    </a:prstGeom>
+                  </pic:spPr>
+                </pic:pic>
+              </a:graphicData>
+            </a:graphic>
+          </wp:inline>
+        </w:drawing>
+      </w:r>
+    </w:p>
+    <w:p>
+      <w:pPr>
+        <w:rPr>
+          <w:rFonts w:ascii="Times New Roman" w:hAnsi="Times New Roman" w:cs="Times New Roman"/>
+          <w:sz w:val="24"/>
+          <w:szCs w:val="24"/>
+        </w:rPr>
+      </w:pPr>
+    </w:p>
     <w:sectPr>
-      <w:headerReference w:type="default" r:id="rId27"/>
-      <w:footerReference w:type="default" r:id="rId28"/>
+      <w:headerReference w:type="default" r:id="rId28"/>
+      <w:footerReference w:type="default" r:id="rId29"/>
       <w:pgSz w:w="11906" w:h="16838"/>
       <w:pgMar w:top="1417" w:right="1417" w:bottom="1417" w:left="1417" w:header="708" w:footer="708" w:gutter="0"/>
       <w:pgBorders w:offsetFrom="page">
@@ -8559,6 +9163,155 @@
     </w:lvl>
   </w:abstractNum>
   <w:abstractNum w:abstractNumId="1" w15:restartNumberingAfterBreak="0">
+    <w:nsid w:val="14C8000A"/>
+    <w:multiLevelType w:val="multilevel"/>
+    <w:tmpl w:val="42308B90"/>
+    <w:lvl w:ilvl="0">
+      <w:start w:val="1"/>
+      <w:numFmt w:val="bullet"/>
+      <w:lvlText w:val=""/>
+      <w:lvlJc w:val="left"/>
+      <w:pPr>
+        <w:tabs>
+          <w:tab w:val="num" w:pos="720"/>
+        </w:tabs>
+        <w:ind w:left="720" w:hanging="360"/>
+      </w:pPr>
+      <w:rPr>
+        <w:rFonts w:ascii="Symbol" w:hAnsi="Symbol" w:hint="default"/>
+        <w:sz w:val="20"/>
+      </w:rPr>
+    </w:lvl>
+    <w:lvl w:ilvl="1" w:tentative="1">
+      <w:start w:val="1"/>
+      <w:numFmt w:val="bullet"/>
+      <w:lvlText w:val="o"/>
+      <w:lvlJc w:val="left"/>
+      <w:pPr>
+        <w:tabs>
+          <w:tab w:val="num" w:pos="1440"/>
+        </w:tabs>
+        <w:ind w:left="1440" w:hanging="360"/>
+      </w:pPr>
+      <w:rPr>
+        <w:rFonts w:ascii="Courier New" w:hAnsi="Courier New" w:hint="default"/>
+        <w:sz w:val="20"/>
+      </w:rPr>
+    </w:lvl>
+    <w:lvl w:ilvl="2" w:tentative="1">
+      <w:start w:val="1"/>
+      <w:numFmt w:val="bullet"/>
+      <w:lvlText w:val=""/>
+      <w:lvlJc w:val="left"/>
+      <w:pPr>
+        <w:tabs>
+          <w:tab w:val="num" w:pos="2160"/>
+        </w:tabs>
+        <w:ind w:left="2160" w:hanging="360"/>
+      </w:pPr>
+      <w:rPr>
+        <w:rFonts w:ascii="Wingdings" w:hAnsi="Wingdings" w:hint="default"/>
+        <w:sz w:val="20"/>
+      </w:rPr>
+    </w:lvl>
+    <w:lvl w:ilvl="3" w:tentative="1">
+      <w:start w:val="1"/>
+      <w:numFmt w:val="bullet"/>
+      <w:lvlText w:val=""/>
+      <w:lvlJc w:val="left"/>
+      <w:pPr>
+        <w:tabs>
+          <w:tab w:val="num" w:pos="2880"/>
+        </w:tabs>
+        <w:ind w:left="2880" w:hanging="360"/>
+      </w:pPr>
+      <w:rPr>
+        <w:rFonts w:ascii="Wingdings" w:hAnsi="Wingdings" w:hint="default"/>
+        <w:sz w:val="20"/>
+      </w:rPr>
+    </w:lvl>
+    <w:lvl w:ilvl="4" w:tentative="1">
+      <w:start w:val="1"/>
+      <w:numFmt w:val="bullet"/>
+      <w:lvlText w:val=""/>
+      <w:lvlJc w:val="left"/>
+      <w:pPr>
+        <w:tabs>
+          <w:tab w:val="num" w:pos="3600"/>
+        </w:tabs>
+        <w:ind w:left="3600" w:hanging="360"/>
+      </w:pPr>
+      <w:rPr>
+        <w:rFonts w:ascii="Wingdings" w:hAnsi="Wingdings" w:hint="default"/>
+        <w:sz w:val="20"/>
+      </w:rPr>
+    </w:lvl>
+    <w:lvl w:ilvl="5" w:tentative="1">
+      <w:start w:val="1"/>
+      <w:numFmt w:val="bullet"/>
+      <w:lvlText w:val=""/>
+      <w:lvlJc w:val="left"/>
+      <w:pPr>
+        <w:tabs>
+          <w:tab w:val="num" w:pos="4320"/>
+        </w:tabs>
+        <w:ind w:left="4320" w:hanging="360"/>
+      </w:pPr>
+      <w:rPr>
+        <w:rFonts w:ascii="Wingdings" w:hAnsi="Wingdings" w:hint="default"/>
+        <w:sz w:val="20"/>
+      </w:rPr>
+    </w:lvl>
+    <w:lvl w:ilvl="6" w:tentative="1">
+      <w:start w:val="1"/>
+      <w:numFmt w:val="bullet"/>
+      <w:lvlText w:val=""/>
+      <w:lvlJc w:val="left"/>
+      <w:pPr>
+        <w:tabs>
+          <w:tab w:val="num" w:pos="5040"/>
+        </w:tabs>
+        <w:ind w:left="5040" w:hanging="360"/>
+      </w:pPr>
+      <w:rPr>
+        <w:rFonts w:ascii="Wingdings" w:hAnsi="Wingdings" w:hint="default"/>
+        <w:sz w:val="20"/>
+      </w:rPr>
+    </w:lvl>
+    <w:lvl w:ilvl="7" w:tentative="1">
+      <w:start w:val="1"/>
+      <w:numFmt w:val="bullet"/>
+      <w:lvlText w:val=""/>
+      <w:lvlJc w:val="left"/>
+      <w:pPr>
+        <w:tabs>
+          <w:tab w:val="num" w:pos="5760"/>
+        </w:tabs>
+        <w:ind w:left="5760" w:hanging="360"/>
+      </w:pPr>
+      <w:rPr>
+        <w:rFonts w:ascii="Wingdings" w:hAnsi="Wingdings" w:hint="default"/>
+        <w:sz w:val="20"/>
+      </w:rPr>
+    </w:lvl>
+    <w:lvl w:ilvl="8" w:tentative="1">
+      <w:start w:val="1"/>
+      <w:numFmt w:val="bullet"/>
+      <w:lvlText w:val=""/>
+      <w:lvlJc w:val="left"/>
+      <w:pPr>
+        <w:tabs>
+          <w:tab w:val="num" w:pos="6480"/>
+        </w:tabs>
+        <w:ind w:left="6480" w:hanging="360"/>
+      </w:pPr>
+      <w:rPr>
+        <w:rFonts w:ascii="Wingdings" w:hAnsi="Wingdings" w:hint="default"/>
+        <w:sz w:val="20"/>
+      </w:rPr>
+    </w:lvl>
+  </w:abstractNum>
+  <w:abstractNum w:abstractNumId="2" w15:restartNumberingAfterBreak="0">
     <w:nsid w:val="16B42315"/>
     <w:multiLevelType w:val="multilevel"/>
     <w:tmpl w:val="3CF28954"/>
@@ -8707,7 +9460,7 @@
       </w:rPr>
     </w:lvl>
   </w:abstractNum>
-  <w:abstractNum w:abstractNumId="2" w15:restartNumberingAfterBreak="0">
+  <w:abstractNum w:abstractNumId="3" w15:restartNumberingAfterBreak="0">
     <w:nsid w:val="1A8F2050"/>
     <w:multiLevelType w:val="multilevel"/>
     <w:tmpl w:val="CCB8542C"/>
@@ -8856,7 +9609,7 @@
       </w:rPr>
     </w:lvl>
   </w:abstractNum>
-  <w:abstractNum w:abstractNumId="3" w15:restartNumberingAfterBreak="0">
+  <w:abstractNum w:abstractNumId="4" w15:restartNumberingAfterBreak="0">
     <w:nsid w:val="23FA75D2"/>
     <w:multiLevelType w:val="multilevel"/>
     <w:tmpl w:val="7B086CF2"/>
@@ -8969,7 +9722,7 @@
       </w:pPr>
     </w:lvl>
   </w:abstractNum>
-  <w:abstractNum w:abstractNumId="4" w15:restartNumberingAfterBreak="0">
+  <w:abstractNum w:abstractNumId="5" w15:restartNumberingAfterBreak="0">
     <w:nsid w:val="30817C99"/>
     <w:multiLevelType w:val="hybridMultilevel"/>
     <w:tmpl w:val="B28054F4"/>
@@ -9055,7 +9808,7 @@
       </w:pPr>
     </w:lvl>
   </w:abstractNum>
-  <w:abstractNum w:abstractNumId="5" w15:restartNumberingAfterBreak="0">
+  <w:abstractNum w:abstractNumId="6" w15:restartNumberingAfterBreak="0">
     <w:nsid w:val="32024712"/>
     <w:multiLevelType w:val="multilevel"/>
     <w:tmpl w:val="7716EFCE"/>
@@ -9204,7 +9957,156 @@
       </w:rPr>
     </w:lvl>
   </w:abstractNum>
-  <w:abstractNum w:abstractNumId="6" w15:restartNumberingAfterBreak="0">
+  <w:abstractNum w:abstractNumId="7" w15:restartNumberingAfterBreak="0">
+    <w:nsid w:val="3A273CBD"/>
+    <w:multiLevelType w:val="multilevel"/>
+    <w:tmpl w:val="A5564738"/>
+    <w:lvl w:ilvl="0">
+      <w:start w:val="1"/>
+      <w:numFmt w:val="bullet"/>
+      <w:lvlText w:val=""/>
+      <w:lvlJc w:val="left"/>
+      <w:pPr>
+        <w:tabs>
+          <w:tab w:val="num" w:pos="720"/>
+        </w:tabs>
+        <w:ind w:left="720" w:hanging="360"/>
+      </w:pPr>
+      <w:rPr>
+        <w:rFonts w:ascii="Symbol" w:hAnsi="Symbol" w:hint="default"/>
+        <w:sz w:val="20"/>
+      </w:rPr>
+    </w:lvl>
+    <w:lvl w:ilvl="1" w:tentative="1">
+      <w:start w:val="1"/>
+      <w:numFmt w:val="bullet"/>
+      <w:lvlText w:val="o"/>
+      <w:lvlJc w:val="left"/>
+      <w:pPr>
+        <w:tabs>
+          <w:tab w:val="num" w:pos="1440"/>
+        </w:tabs>
+        <w:ind w:left="1440" w:hanging="360"/>
+      </w:pPr>
+      <w:rPr>
+        <w:rFonts w:ascii="Courier New" w:hAnsi="Courier New" w:hint="default"/>
+        <w:sz w:val="20"/>
+      </w:rPr>
+    </w:lvl>
+    <w:lvl w:ilvl="2" w:tentative="1">
+      <w:start w:val="1"/>
+      <w:numFmt w:val="bullet"/>
+      <w:lvlText w:val=""/>
+      <w:lvlJc w:val="left"/>
+      <w:pPr>
+        <w:tabs>
+          <w:tab w:val="num" w:pos="2160"/>
+        </w:tabs>
+        <w:ind w:left="2160" w:hanging="360"/>
+      </w:pPr>
+      <w:rPr>
+        <w:rFonts w:ascii="Wingdings" w:hAnsi="Wingdings" w:hint="default"/>
+        <w:sz w:val="20"/>
+      </w:rPr>
+    </w:lvl>
+    <w:lvl w:ilvl="3" w:tentative="1">
+      <w:start w:val="1"/>
+      <w:numFmt w:val="bullet"/>
+      <w:lvlText w:val=""/>
+      <w:lvlJc w:val="left"/>
+      <w:pPr>
+        <w:tabs>
+          <w:tab w:val="num" w:pos="2880"/>
+        </w:tabs>
+        <w:ind w:left="2880" w:hanging="360"/>
+      </w:pPr>
+      <w:rPr>
+        <w:rFonts w:ascii="Wingdings" w:hAnsi="Wingdings" w:hint="default"/>
+        <w:sz w:val="20"/>
+      </w:rPr>
+    </w:lvl>
+    <w:lvl w:ilvl="4" w:tentative="1">
+      <w:start w:val="1"/>
+      <w:numFmt w:val="bullet"/>
+      <w:lvlText w:val=""/>
+      <w:lvlJc w:val="left"/>
+      <w:pPr>
+        <w:tabs>
+          <w:tab w:val="num" w:pos="3600"/>
+        </w:tabs>
+        <w:ind w:left="3600" w:hanging="360"/>
+      </w:pPr>
+      <w:rPr>
+        <w:rFonts w:ascii="Wingdings" w:hAnsi="Wingdings" w:hint="default"/>
+        <w:sz w:val="20"/>
+      </w:rPr>
+    </w:lvl>
+    <w:lvl w:ilvl="5" w:tentative="1">
+      <w:start w:val="1"/>
+      <w:numFmt w:val="bullet"/>
+      <w:lvlText w:val=""/>
+      <w:lvlJc w:val="left"/>
+      <w:pPr>
+        <w:tabs>
+          <w:tab w:val="num" w:pos="4320"/>
+        </w:tabs>
+        <w:ind w:left="4320" w:hanging="360"/>
+      </w:pPr>
+      <w:rPr>
+        <w:rFonts w:ascii="Wingdings" w:hAnsi="Wingdings" w:hint="default"/>
+        <w:sz w:val="20"/>
+      </w:rPr>
+    </w:lvl>
+    <w:lvl w:ilvl="6" w:tentative="1">
+      <w:start w:val="1"/>
+      <w:numFmt w:val="bullet"/>
+      <w:lvlText w:val=""/>
+      <w:lvlJc w:val="left"/>
+      <w:pPr>
+        <w:tabs>
+          <w:tab w:val="num" w:pos="5040"/>
+        </w:tabs>
+        <w:ind w:left="5040" w:hanging="360"/>
+      </w:pPr>
+      <w:rPr>
+        <w:rFonts w:ascii="Wingdings" w:hAnsi="Wingdings" w:hint="default"/>
+        <w:sz w:val="20"/>
+      </w:rPr>
+    </w:lvl>
+    <w:lvl w:ilvl="7" w:tentative="1">
+      <w:start w:val="1"/>
+      <w:numFmt w:val="bullet"/>
+      <w:lvlText w:val=""/>
+      <w:lvlJc w:val="left"/>
+      <w:pPr>
+        <w:tabs>
+          <w:tab w:val="num" w:pos="5760"/>
+        </w:tabs>
+        <w:ind w:left="5760" w:hanging="360"/>
+      </w:pPr>
+      <w:rPr>
+        <w:rFonts w:ascii="Wingdings" w:hAnsi="Wingdings" w:hint="default"/>
+        <w:sz w:val="20"/>
+      </w:rPr>
+    </w:lvl>
+    <w:lvl w:ilvl="8" w:tentative="1">
+      <w:start w:val="1"/>
+      <w:numFmt w:val="bullet"/>
+      <w:lvlText w:val=""/>
+      <w:lvlJc w:val="left"/>
+      <w:pPr>
+        <w:tabs>
+          <w:tab w:val="num" w:pos="6480"/>
+        </w:tabs>
+        <w:ind w:left="6480" w:hanging="360"/>
+      </w:pPr>
+      <w:rPr>
+        <w:rFonts w:ascii="Wingdings" w:hAnsi="Wingdings" w:hint="default"/>
+        <w:sz w:val="20"/>
+      </w:rPr>
+    </w:lvl>
+  </w:abstractNum>
+  <w:abstractNum w:abstractNumId="8" w15:restartNumberingAfterBreak="0">
     <w:nsid w:val="3CA24848"/>
     <w:multiLevelType w:val="hybridMultilevel"/>
     <w:tmpl w:val="76B802A4"/>
@@ -9317,7 +10219,7 @@
       </w:rPr>
     </w:lvl>
   </w:abstractNum>
-  <w:abstractNum w:abstractNumId="7" w15:restartNumberingAfterBreak="0">
+  <w:abstractNum w:abstractNumId="9" w15:restartNumberingAfterBreak="0">
     <w:nsid w:val="4996411C"/>
     <w:multiLevelType w:val="multilevel"/>
     <w:tmpl w:val="218091C0"/>
@@ -9434,7 +10336,7 @@
       </w:pPr>
     </w:lvl>
   </w:abstractNum>
-  <w:abstractNum w:abstractNumId="8" w15:restartNumberingAfterBreak="0">
+  <w:abstractNum w:abstractNumId="10" w15:restartNumberingAfterBreak="0">
     <w:nsid w:val="4F9D0AB4"/>
     <w:multiLevelType w:val="multilevel"/>
     <w:tmpl w:val="839C6E34"/>
@@ -9583,7 +10485,7 @@
       </w:rPr>
     </w:lvl>
   </w:abstractNum>
-  <w:abstractNum w:abstractNumId="9" w15:restartNumberingAfterBreak="0">
+  <w:abstractNum w:abstractNumId="11" w15:restartNumberingAfterBreak="0">
     <w:nsid w:val="56D568C8"/>
     <w:multiLevelType w:val="multilevel"/>
     <w:tmpl w:val="3392CAD2"/>
@@ -9732,7 +10634,7 @@
       </w:rPr>
     </w:lvl>
   </w:abstractNum>
-  <w:abstractNum w:abstractNumId="10" w15:restartNumberingAfterBreak="0">
+  <w:abstractNum w:abstractNumId="12" w15:restartNumberingAfterBreak="0">
     <w:nsid w:val="61053792"/>
     <w:multiLevelType w:val="multilevel"/>
     <w:tmpl w:val="49E43BFC"/>
@@ -9881,7 +10783,7 @@
       </w:rPr>
     </w:lvl>
   </w:abstractNum>
-  <w:abstractNum w:abstractNumId="11" w15:restartNumberingAfterBreak="0">
+  <w:abstractNum w:abstractNumId="13" w15:restartNumberingAfterBreak="0">
     <w:nsid w:val="6DA36487"/>
     <w:multiLevelType w:val="multilevel"/>
     <w:tmpl w:val="9C4C8532"/>
@@ -10030,7 +10932,7 @@
       </w:rPr>
     </w:lvl>
   </w:abstractNum>
-  <w:abstractNum w:abstractNumId="12" w15:restartNumberingAfterBreak="0">
+  <w:abstractNum w:abstractNumId="14" w15:restartNumberingAfterBreak="0">
     <w:nsid w:val="6EB85EAA"/>
     <w:multiLevelType w:val="hybridMultilevel"/>
     <w:tmpl w:val="DB76C824"/>
@@ -10144,43 +11046,49 @@
     </w:lvl>
   </w:abstractNum>
   <w:num w:numId="1">
+    <w:abstractNumId w:val="14"/>
+  </w:num>
+  <w:num w:numId="2">
+    <w:abstractNumId w:val="8"/>
+  </w:num>
+  <w:num w:numId="3">
+    <w:abstractNumId w:val="11"/>
+  </w:num>
+  <w:num w:numId="4">
+    <w:abstractNumId w:val="6"/>
+  </w:num>
+  <w:num w:numId="5">
+    <w:abstractNumId w:val="5"/>
+  </w:num>
+  <w:num w:numId="6">
     <w:abstractNumId w:val="12"/>
   </w:num>
-  <w:num w:numId="2">
-    <w:abstractNumId w:val="6"/>
+  <w:num w:numId="7">
+    <w:abstractNumId w:val="4"/>
   </w:num>
-  <w:num w:numId="3">
+  <w:num w:numId="8">
+    <w:abstractNumId w:val="13"/>
+  </w:num>
+  <w:num w:numId="9">
+    <w:abstractNumId w:val="2"/>
+  </w:num>
+  <w:num w:numId="10">
     <w:abstractNumId w:val="9"/>
   </w:num>
-  <w:num w:numId="4">
-    <w:abstractNumId w:val="5"/>
-  </w:num>
-  <w:num w:numId="5">
-    <w:abstractNumId w:val="4"/>
-  </w:num>
-  <w:num w:numId="6">
-    <w:abstractNumId w:val="10"/>
-  </w:num>
-  <w:num w:numId="7">
+  <w:num w:numId="11">
     <w:abstractNumId w:val="3"/>
-  </w:num>
-  <w:num w:numId="8">
-    <w:abstractNumId w:val="11"/>
-  </w:num>
-  <w:num w:numId="9">
-    <w:abstractNumId w:val="1"/>
-  </w:num>
-  <w:num w:numId="10">
-    <w:abstractNumId w:val="7"/>
-  </w:num>
-  <w:num w:numId="11">
-    <w:abstractNumId w:val="2"/>
   </w:num>
   <w:num w:numId="12">
     <w:abstractNumId w:val="0"/>
   </w:num>
   <w:num w:numId="13">
-    <w:abstractNumId w:val="8"/>
+    <w:abstractNumId w:val="10"/>
+  </w:num>
+  <w:num w:numId="14">
+    <w:abstractNumId w:val="1"/>
+  </w:num>
+  <w:num w:numId="15">
+    <w:abstractNumId w:val="7"/>
   </w:num>
 </w:numbering>
 </file>

</xml_diff>

<commit_message>
Créer un prompt permettant, à partir du dataset des capteurs, de proposer des stratégies
</commit_message>
<xml_diff>
--- a/Atelier Prompt.docx
+++ b/Atelier Prompt.docx
@@ -8667,9 +8667,955 @@
         </w:rPr>
       </w:pPr>
     </w:p>
+    <w:p>
+      <w:pPr>
+        <w:pBdr>
+          <w:left w:val="single" w:sz="24" w:space="4" w:color="323E4F" w:themeColor="text2" w:themeShade="BF"/>
+        </w:pBdr>
+        <w:autoSpaceDE w:val="0"/>
+        <w:autoSpaceDN w:val="0"/>
+        <w:adjustRightInd w:val="0"/>
+        <w:spacing w:after="0" w:line="240" w:lineRule="auto"/>
+        <w:rPr>
+          <w:rFonts w:ascii="Times New Roman" w:hAnsi="Times New Roman" w:cs="Times New Roman"/>
+          <w:b/>
+          <w:bCs/>
+          <w:color w:val="323E4F" w:themeColor="text2" w:themeShade="BF"/>
+          <w:kern w:val="0"/>
+          <w:sz w:val="32"/>
+          <w:szCs w:val="32"/>
+        </w:rPr>
+      </w:pPr>
+      <w:r>
+        <w:rPr>
+          <w:rFonts w:ascii="Times New Roman" w:hAnsi="Times New Roman" w:cs="Times New Roman"/>
+          <w:b/>
+          <w:bCs/>
+          <w:color w:val="323E4F" w:themeColor="text2" w:themeShade="BF"/>
+          <w:kern w:val="0"/>
+          <w:sz w:val="32"/>
+          <w:szCs w:val="32"/>
+        </w:rPr>
+        <w:t xml:space="preserve">Partie </w:t>
+      </w:r>
+      <w:r>
+        <w:rPr>
+          <w:rFonts w:ascii="Times New Roman" w:hAnsi="Times New Roman" w:cs="Times New Roman"/>
+          <w:b/>
+          <w:bCs/>
+          <w:color w:val="323E4F" w:themeColor="text2" w:themeShade="BF"/>
+          <w:kern w:val="0"/>
+          <w:sz w:val="32"/>
+          <w:szCs w:val="32"/>
+        </w:rPr>
+        <w:t>5</w:t>
+      </w:r>
+      <w:r>
+        <w:rPr>
+          <w:rFonts w:ascii="Times New Roman" w:hAnsi="Times New Roman" w:cs="Times New Roman"/>
+          <w:b/>
+          <w:bCs/>
+          <w:color w:val="323E4F" w:themeColor="text2" w:themeShade="BF"/>
+          <w:kern w:val="0"/>
+          <w:sz w:val="32"/>
+          <w:szCs w:val="32"/>
+        </w:rPr>
+        <w:t xml:space="preserve"> – </w:t>
+      </w:r>
+      <w:r>
+        <w:rPr>
+          <w:rFonts w:ascii="Times New Roman" w:hAnsi="Times New Roman" w:cs="Times New Roman"/>
+          <w:b/>
+          <w:bCs/>
+          <w:color w:val="323E4F" w:themeColor="text2" w:themeShade="BF"/>
+          <w:kern w:val="0"/>
+          <w:sz w:val="32"/>
+          <w:szCs w:val="32"/>
+        </w:rPr>
+        <w:t>Prompts pour les applications métier</w:t>
+      </w:r>
+    </w:p>
+    <w:p>
+      <w:pPr>
+        <w:autoSpaceDE w:val="0"/>
+        <w:autoSpaceDN w:val="0"/>
+        <w:adjustRightInd w:val="0"/>
+        <w:spacing w:after="0" w:line="240" w:lineRule="auto"/>
+        <w:rPr>
+          <w:rFonts w:ascii="CIDFont+F1" w:hAnsi="CIDFont+F1" w:cs="CIDFont+F1"/>
+          <w:color w:val="000000"/>
+          <w:kern w:val="0"/>
+          <w:sz w:val="21"/>
+          <w:szCs w:val="21"/>
+        </w:rPr>
+      </w:pPr>
+      <w:r>
+        <w:rPr>
+          <w:rFonts w:ascii="CIDFont+F1" w:hAnsi="CIDFont+F1" w:cs="CIDFont+F1"/>
+          <w:color w:val="000000"/>
+          <w:kern w:val="0"/>
+          <w:sz w:val="21"/>
+          <w:szCs w:val="21"/>
+        </w:rPr>
+        <w:t>1) Créer un prompt permettant, à partir du dataset des capteurs, de proposer des stratégies</w:t>
+      </w:r>
+    </w:p>
+    <w:p>
+      <w:pPr>
+        <w:autoSpaceDE w:val="0"/>
+        <w:autoSpaceDN w:val="0"/>
+        <w:adjustRightInd w:val="0"/>
+        <w:spacing w:after="0" w:line="240" w:lineRule="auto"/>
+        <w:rPr>
+          <w:rFonts w:ascii="CIDFont+F1" w:hAnsi="CIDFont+F1" w:cs="CIDFont+F1"/>
+          <w:color w:val="000000"/>
+          <w:kern w:val="0"/>
+          <w:sz w:val="21"/>
+          <w:szCs w:val="21"/>
+        </w:rPr>
+      </w:pPr>
+      <w:r>
+        <w:rPr>
+          <w:rFonts w:ascii="CIDFont+F1" w:hAnsi="CIDFont+F1" w:cs="CIDFont+F1"/>
+          <w:color w:val="000000"/>
+          <w:kern w:val="0"/>
+          <w:sz w:val="21"/>
+          <w:szCs w:val="21"/>
+        </w:rPr>
+        <w:t>(détection, traitement, risques associés) de traitement des valeurs manquantes, des</w:t>
+      </w:r>
+    </w:p>
+    <w:p>
+      <w:pPr>
+        <w:autoSpaceDE w:val="0"/>
+        <w:autoSpaceDN w:val="0"/>
+        <w:adjustRightInd w:val="0"/>
+        <w:spacing w:after="0" w:line="240" w:lineRule="auto"/>
+        <w:rPr>
+          <w:rFonts w:ascii="CIDFont+F1" w:hAnsi="CIDFont+F1" w:cs="CIDFont+F1"/>
+          <w:color w:val="000000"/>
+          <w:kern w:val="0"/>
+          <w:sz w:val="21"/>
+          <w:szCs w:val="21"/>
+        </w:rPr>
+      </w:pPr>
+      <w:r>
+        <w:rPr>
+          <w:rFonts w:ascii="CIDFont+F1" w:hAnsi="CIDFont+F1" w:cs="CIDFont+F1"/>
+          <w:color w:val="000000"/>
+          <w:kern w:val="0"/>
+          <w:sz w:val="21"/>
+          <w:szCs w:val="21"/>
+        </w:rPr>
+        <w:t>doublons, des valeurs aberrantes, des variables catégorielles</w:t>
+      </w:r>
+    </w:p>
+    <w:p>
+      <w:pPr>
+        <w:rPr>
+          <w:rFonts w:ascii="Times New Roman" w:hAnsi="Times New Roman" w:cs="Times New Roman"/>
+          <w:sz w:val="24"/>
+          <w:szCs w:val="24"/>
+        </w:rPr>
+      </w:pPr>
+    </w:p>
+    <w:p>
+      <w:pPr>
+        <w:spacing w:after="0" w:line="240" w:lineRule="auto"/>
+        <w:ind w:left="708"/>
+        <w:rPr>
+          <w:rFonts w:ascii="Times New Roman" w:eastAsia="Times New Roman" w:hAnsi="Times New Roman" w:cs="Times New Roman"/>
+          <w:color w:val="2F5496" w:themeColor="accent1" w:themeShade="BF"/>
+          <w:kern w:val="0"/>
+          <w:sz w:val="24"/>
+          <w:szCs w:val="24"/>
+          <w:lang w:eastAsia="fr-FR"/>
+          <w14:ligatures w14:val="none"/>
+        </w:rPr>
+      </w:pPr>
+      <w:r>
+        <w:rPr>
+          <w:rFonts w:ascii="Times New Roman" w:eastAsia="Times New Roman" w:hAnsi="Times New Roman" w:cs="Times New Roman"/>
+          <w:color w:val="2F5496" w:themeColor="accent1" w:themeShade="BF"/>
+          <w:kern w:val="0"/>
+          <w:sz w:val="24"/>
+          <w:szCs w:val="24"/>
+          <w:lang w:eastAsia="fr-FR"/>
+          <w14:ligatures w14:val="none"/>
+        </w:rPr>
+        <w:t>Tu es un expert en Data Science et en traitement des données.</w:t>
+      </w:r>
+    </w:p>
+    <w:p>
+      <w:pPr>
+        <w:spacing w:after="0" w:line="240" w:lineRule="auto"/>
+        <w:ind w:left="708"/>
+        <w:rPr>
+          <w:rFonts w:ascii="Times New Roman" w:eastAsia="Times New Roman" w:hAnsi="Times New Roman" w:cs="Times New Roman"/>
+          <w:color w:val="2F5496" w:themeColor="accent1" w:themeShade="BF"/>
+          <w:kern w:val="0"/>
+          <w:sz w:val="24"/>
+          <w:szCs w:val="24"/>
+          <w:lang w:eastAsia="fr-FR"/>
+          <w14:ligatures w14:val="none"/>
+        </w:rPr>
+      </w:pPr>
+      <w:r>
+        <w:rPr>
+          <w:rFonts w:ascii="Times New Roman" w:eastAsia="Times New Roman" w:hAnsi="Times New Roman" w:cs="Times New Roman"/>
+          <w:color w:val="2F5496" w:themeColor="accent1" w:themeShade="BF"/>
+          <w:kern w:val="0"/>
+          <w:sz w:val="24"/>
+          <w:szCs w:val="24"/>
+          <w:lang w:eastAsia="fr-FR"/>
+          <w14:ligatures w14:val="none"/>
+        </w:rPr>
+        <w:t>À partir du dataset des capteurs, analyse les problèmes liés à la qualité des données et propose des stratégies de traitement pour :</w:t>
+      </w:r>
+    </w:p>
+    <w:p>
+      <w:pPr>
+        <w:numPr>
+          <w:ilvl w:val="0"/>
+          <w:numId w:val="16"/>
+        </w:numPr>
+        <w:tabs>
+          <w:tab w:val="clear" w:pos="720"/>
+          <w:tab w:val="num" w:pos="1428"/>
+        </w:tabs>
+        <w:spacing w:after="0" w:line="240" w:lineRule="auto"/>
+        <w:ind w:left="1428"/>
+        <w:rPr>
+          <w:rFonts w:ascii="Times New Roman" w:eastAsia="Times New Roman" w:hAnsi="Times New Roman" w:cs="Times New Roman"/>
+          <w:color w:val="2F5496" w:themeColor="accent1" w:themeShade="BF"/>
+          <w:kern w:val="0"/>
+          <w:sz w:val="24"/>
+          <w:szCs w:val="24"/>
+          <w:lang w:eastAsia="fr-FR"/>
+          <w14:ligatures w14:val="none"/>
+        </w:rPr>
+      </w:pPr>
+      <w:r>
+        <w:rPr>
+          <w:rFonts w:ascii="Times New Roman" w:eastAsia="Times New Roman" w:hAnsi="Times New Roman" w:cs="Times New Roman"/>
+          <w:color w:val="2F5496" w:themeColor="accent1" w:themeShade="BF"/>
+          <w:kern w:val="0"/>
+          <w:sz w:val="24"/>
+          <w:szCs w:val="24"/>
+          <w:lang w:eastAsia="fr-FR"/>
+          <w14:ligatures w14:val="none"/>
+        </w:rPr>
+        <w:t>les valeurs manquantes ;</w:t>
+      </w:r>
+    </w:p>
+    <w:p>
+      <w:pPr>
+        <w:numPr>
+          <w:ilvl w:val="0"/>
+          <w:numId w:val="16"/>
+        </w:numPr>
+        <w:tabs>
+          <w:tab w:val="clear" w:pos="720"/>
+          <w:tab w:val="num" w:pos="1428"/>
+        </w:tabs>
+        <w:spacing w:after="0" w:line="240" w:lineRule="auto"/>
+        <w:ind w:left="1428"/>
+        <w:rPr>
+          <w:rFonts w:ascii="Times New Roman" w:eastAsia="Times New Roman" w:hAnsi="Times New Roman" w:cs="Times New Roman"/>
+          <w:color w:val="2F5496" w:themeColor="accent1" w:themeShade="BF"/>
+          <w:kern w:val="0"/>
+          <w:sz w:val="24"/>
+          <w:szCs w:val="24"/>
+          <w:lang w:eastAsia="fr-FR"/>
+          <w14:ligatures w14:val="none"/>
+        </w:rPr>
+      </w:pPr>
+      <w:r>
+        <w:rPr>
+          <w:rFonts w:ascii="Times New Roman" w:eastAsia="Times New Roman" w:hAnsi="Times New Roman" w:cs="Times New Roman"/>
+          <w:color w:val="2F5496" w:themeColor="accent1" w:themeShade="BF"/>
+          <w:kern w:val="0"/>
+          <w:sz w:val="24"/>
+          <w:szCs w:val="24"/>
+          <w:lang w:eastAsia="fr-FR"/>
+          <w14:ligatures w14:val="none"/>
+        </w:rPr>
+        <w:t>les doublons ;</w:t>
+      </w:r>
+    </w:p>
+    <w:p>
+      <w:pPr>
+        <w:numPr>
+          <w:ilvl w:val="0"/>
+          <w:numId w:val="16"/>
+        </w:numPr>
+        <w:tabs>
+          <w:tab w:val="clear" w:pos="720"/>
+          <w:tab w:val="num" w:pos="1428"/>
+        </w:tabs>
+        <w:spacing w:after="0" w:line="240" w:lineRule="auto"/>
+        <w:ind w:left="1428"/>
+        <w:rPr>
+          <w:rFonts w:ascii="Times New Roman" w:eastAsia="Times New Roman" w:hAnsi="Times New Roman" w:cs="Times New Roman"/>
+          <w:color w:val="2F5496" w:themeColor="accent1" w:themeShade="BF"/>
+          <w:kern w:val="0"/>
+          <w:sz w:val="24"/>
+          <w:szCs w:val="24"/>
+          <w:lang w:eastAsia="fr-FR"/>
+          <w14:ligatures w14:val="none"/>
+        </w:rPr>
+      </w:pPr>
+      <w:r>
+        <w:rPr>
+          <w:rFonts w:ascii="Times New Roman" w:eastAsia="Times New Roman" w:hAnsi="Times New Roman" w:cs="Times New Roman"/>
+          <w:color w:val="2F5496" w:themeColor="accent1" w:themeShade="BF"/>
+          <w:kern w:val="0"/>
+          <w:sz w:val="24"/>
+          <w:szCs w:val="24"/>
+          <w:lang w:eastAsia="fr-FR"/>
+          <w14:ligatures w14:val="none"/>
+        </w:rPr>
+        <w:t>les valeurs aberrantes ;</w:t>
+      </w:r>
+    </w:p>
+    <w:p>
+      <w:pPr>
+        <w:numPr>
+          <w:ilvl w:val="0"/>
+          <w:numId w:val="16"/>
+        </w:numPr>
+        <w:tabs>
+          <w:tab w:val="clear" w:pos="720"/>
+          <w:tab w:val="num" w:pos="1428"/>
+        </w:tabs>
+        <w:spacing w:after="0" w:line="240" w:lineRule="auto"/>
+        <w:ind w:left="1428"/>
+        <w:rPr>
+          <w:rFonts w:ascii="Times New Roman" w:eastAsia="Times New Roman" w:hAnsi="Times New Roman" w:cs="Times New Roman"/>
+          <w:color w:val="2F5496" w:themeColor="accent1" w:themeShade="BF"/>
+          <w:kern w:val="0"/>
+          <w:sz w:val="24"/>
+          <w:szCs w:val="24"/>
+          <w:lang w:eastAsia="fr-FR"/>
+          <w14:ligatures w14:val="none"/>
+        </w:rPr>
+      </w:pPr>
+      <w:r>
+        <w:rPr>
+          <w:rFonts w:ascii="Times New Roman" w:eastAsia="Times New Roman" w:hAnsi="Times New Roman" w:cs="Times New Roman"/>
+          <w:color w:val="2F5496" w:themeColor="accent1" w:themeShade="BF"/>
+          <w:kern w:val="0"/>
+          <w:sz w:val="24"/>
+          <w:szCs w:val="24"/>
+          <w:lang w:eastAsia="fr-FR"/>
+          <w14:ligatures w14:val="none"/>
+        </w:rPr>
+        <w:t>les variables catégorielles.</w:t>
+      </w:r>
+    </w:p>
+    <w:p>
+      <w:pPr>
+        <w:spacing w:after="0" w:line="240" w:lineRule="auto"/>
+        <w:ind w:left="708"/>
+        <w:rPr>
+          <w:rFonts w:ascii="Times New Roman" w:eastAsia="Times New Roman" w:hAnsi="Times New Roman" w:cs="Times New Roman"/>
+          <w:color w:val="2F5496" w:themeColor="accent1" w:themeShade="BF"/>
+          <w:kern w:val="0"/>
+          <w:sz w:val="24"/>
+          <w:szCs w:val="24"/>
+          <w:lang w:eastAsia="fr-FR"/>
+          <w14:ligatures w14:val="none"/>
+        </w:rPr>
+      </w:pPr>
+      <w:r>
+        <w:rPr>
+          <w:rFonts w:ascii="Times New Roman" w:eastAsia="Times New Roman" w:hAnsi="Times New Roman" w:cs="Times New Roman"/>
+          <w:color w:val="2F5496" w:themeColor="accent1" w:themeShade="BF"/>
+          <w:kern w:val="0"/>
+          <w:sz w:val="24"/>
+          <w:szCs w:val="24"/>
+          <w:lang w:eastAsia="fr-FR"/>
+          <w14:ligatures w14:val="none"/>
+        </w:rPr>
+        <w:t>Pour chaque problème, indique :</w:t>
+      </w:r>
+    </w:p>
+    <w:p>
+      <w:pPr>
+        <w:numPr>
+          <w:ilvl w:val="0"/>
+          <w:numId w:val="17"/>
+        </w:numPr>
+        <w:tabs>
+          <w:tab w:val="clear" w:pos="720"/>
+          <w:tab w:val="num" w:pos="1428"/>
+        </w:tabs>
+        <w:spacing w:after="0" w:line="240" w:lineRule="auto"/>
+        <w:ind w:left="1428"/>
+        <w:rPr>
+          <w:rFonts w:ascii="Times New Roman" w:eastAsia="Times New Roman" w:hAnsi="Times New Roman" w:cs="Times New Roman"/>
+          <w:color w:val="2F5496" w:themeColor="accent1" w:themeShade="BF"/>
+          <w:kern w:val="0"/>
+          <w:sz w:val="24"/>
+          <w:szCs w:val="24"/>
+          <w:lang w:eastAsia="fr-FR"/>
+          <w14:ligatures w14:val="none"/>
+        </w:rPr>
+      </w:pPr>
+      <w:r>
+        <w:rPr>
+          <w:rFonts w:ascii="Times New Roman" w:eastAsia="Times New Roman" w:hAnsi="Times New Roman" w:cs="Times New Roman"/>
+          <w:color w:val="2F5496" w:themeColor="accent1" w:themeShade="BF"/>
+          <w:kern w:val="0"/>
+          <w:sz w:val="24"/>
+          <w:szCs w:val="24"/>
+          <w:lang w:eastAsia="fr-FR"/>
+          <w14:ligatures w14:val="none"/>
+        </w:rPr>
+        <w:t>la méthode de détection ;</w:t>
+      </w:r>
+    </w:p>
+    <w:p>
+      <w:pPr>
+        <w:numPr>
+          <w:ilvl w:val="0"/>
+          <w:numId w:val="17"/>
+        </w:numPr>
+        <w:tabs>
+          <w:tab w:val="clear" w:pos="720"/>
+          <w:tab w:val="num" w:pos="1428"/>
+        </w:tabs>
+        <w:spacing w:after="0" w:line="240" w:lineRule="auto"/>
+        <w:ind w:left="1428"/>
+        <w:rPr>
+          <w:rFonts w:ascii="Times New Roman" w:eastAsia="Times New Roman" w:hAnsi="Times New Roman" w:cs="Times New Roman"/>
+          <w:color w:val="2F5496" w:themeColor="accent1" w:themeShade="BF"/>
+          <w:kern w:val="0"/>
+          <w:sz w:val="24"/>
+          <w:szCs w:val="24"/>
+          <w:lang w:eastAsia="fr-FR"/>
+          <w14:ligatures w14:val="none"/>
+        </w:rPr>
+      </w:pPr>
+      <w:r>
+        <w:rPr>
+          <w:rFonts w:ascii="Times New Roman" w:eastAsia="Times New Roman" w:hAnsi="Times New Roman" w:cs="Times New Roman"/>
+          <w:color w:val="2F5496" w:themeColor="accent1" w:themeShade="BF"/>
+          <w:kern w:val="0"/>
+          <w:sz w:val="24"/>
+          <w:szCs w:val="24"/>
+          <w:lang w:eastAsia="fr-FR"/>
+          <w14:ligatures w14:val="none"/>
+        </w:rPr>
+        <w:t>la stratégie de traitement recommandée ;</w:t>
+      </w:r>
+    </w:p>
+    <w:p>
+      <w:pPr>
+        <w:numPr>
+          <w:ilvl w:val="0"/>
+          <w:numId w:val="17"/>
+        </w:numPr>
+        <w:tabs>
+          <w:tab w:val="clear" w:pos="720"/>
+          <w:tab w:val="num" w:pos="1428"/>
+        </w:tabs>
+        <w:spacing w:after="0" w:line="240" w:lineRule="auto"/>
+        <w:ind w:left="1428"/>
+        <w:rPr>
+          <w:rFonts w:ascii="Times New Roman" w:eastAsia="Times New Roman" w:hAnsi="Times New Roman" w:cs="Times New Roman"/>
+          <w:color w:val="2F5496" w:themeColor="accent1" w:themeShade="BF"/>
+          <w:kern w:val="0"/>
+          <w:sz w:val="24"/>
+          <w:szCs w:val="24"/>
+          <w:lang w:eastAsia="fr-FR"/>
+          <w14:ligatures w14:val="none"/>
+        </w:rPr>
+      </w:pPr>
+      <w:r>
+        <w:rPr>
+          <w:rFonts w:ascii="Times New Roman" w:eastAsia="Times New Roman" w:hAnsi="Times New Roman" w:cs="Times New Roman"/>
+          <w:color w:val="2F5496" w:themeColor="accent1" w:themeShade="BF"/>
+          <w:kern w:val="0"/>
+          <w:sz w:val="24"/>
+          <w:szCs w:val="24"/>
+          <w:lang w:eastAsia="fr-FR"/>
+          <w14:ligatures w14:val="none"/>
+        </w:rPr>
+        <w:t>les risques associés au traitement.</w:t>
+      </w:r>
+    </w:p>
+    <w:p>
+      <w:pPr>
+        <w:spacing w:after="0" w:line="240" w:lineRule="auto"/>
+        <w:ind w:left="708"/>
+        <w:rPr>
+          <w:rFonts w:ascii="Times New Roman" w:eastAsia="Times New Roman" w:hAnsi="Times New Roman" w:cs="Times New Roman"/>
+          <w:color w:val="2F5496" w:themeColor="accent1" w:themeShade="BF"/>
+          <w:kern w:val="0"/>
+          <w:sz w:val="24"/>
+          <w:szCs w:val="24"/>
+          <w:lang w:eastAsia="fr-FR"/>
+          <w14:ligatures w14:val="none"/>
+        </w:rPr>
+      </w:pPr>
+      <w:r>
+        <w:rPr>
+          <w:rFonts w:ascii="Times New Roman" w:eastAsia="Times New Roman" w:hAnsi="Times New Roman" w:cs="Times New Roman"/>
+          <w:color w:val="2F5496" w:themeColor="accent1" w:themeShade="BF"/>
+          <w:kern w:val="0"/>
+          <w:sz w:val="24"/>
+          <w:szCs w:val="24"/>
+          <w:lang w:eastAsia="fr-FR"/>
+          <w14:ligatures w14:val="none"/>
+        </w:rPr>
+        <w:t>Base-toi uniquement sur les informations présentes dans le dataset et n'invente aucune information.</w:t>
+      </w:r>
+    </w:p>
+    <w:p>
+      <w:pPr>
+        <w:spacing w:after="0" w:line="240" w:lineRule="auto"/>
+        <w:ind w:left="708"/>
+        <w:rPr>
+          <w:rFonts w:ascii="Times New Roman" w:eastAsia="Times New Roman" w:hAnsi="Times New Roman" w:cs="Times New Roman"/>
+          <w:color w:val="2F5496" w:themeColor="accent1" w:themeShade="BF"/>
+          <w:kern w:val="0"/>
+          <w:sz w:val="24"/>
+          <w:szCs w:val="24"/>
+          <w:lang w:eastAsia="fr-FR"/>
+          <w14:ligatures w14:val="none"/>
+        </w:rPr>
+      </w:pPr>
+      <w:r>
+        <w:rPr>
+          <w:rFonts w:ascii="Times New Roman" w:eastAsia="Times New Roman" w:hAnsi="Times New Roman" w:cs="Times New Roman"/>
+          <w:color w:val="2F5496" w:themeColor="accent1" w:themeShade="BF"/>
+          <w:kern w:val="0"/>
+          <w:sz w:val="24"/>
+          <w:szCs w:val="24"/>
+          <w:lang w:eastAsia="fr-FR"/>
+          <w14:ligatures w14:val="none"/>
+        </w:rPr>
+        <w:t>Présente les résultats sous forme de tableau avec les colonnes :Problème</w:t>
+      </w:r>
+      <w:r>
+        <w:rPr>
+          <w:rFonts w:ascii="Times New Roman" w:eastAsia="Times New Roman" w:hAnsi="Times New Roman" w:cs="Times New Roman"/>
+          <w:color w:val="2F5496" w:themeColor="accent1" w:themeShade="BF"/>
+          <w:kern w:val="0"/>
+          <w:sz w:val="24"/>
+          <w:szCs w:val="24"/>
+          <w:lang w:eastAsia="fr-FR"/>
+          <w14:ligatures w14:val="none"/>
+        </w:rPr>
+        <w:t>,</w:t>
+      </w:r>
+      <w:r>
+        <w:rPr>
+          <w:rFonts w:ascii="Times New Roman" w:eastAsia="Times New Roman" w:hAnsi="Times New Roman" w:cs="Times New Roman"/>
+          <w:color w:val="2F5496" w:themeColor="accent1" w:themeShade="BF"/>
+          <w:kern w:val="0"/>
+          <w:sz w:val="24"/>
+          <w:szCs w:val="24"/>
+          <w:lang w:eastAsia="fr-FR"/>
+          <w14:ligatures w14:val="none"/>
+        </w:rPr>
+        <w:t xml:space="preserve"> Détection </w:t>
+      </w:r>
+      <w:r>
+        <w:rPr>
+          <w:rFonts w:ascii="Times New Roman" w:eastAsia="Times New Roman" w:hAnsi="Times New Roman" w:cs="Times New Roman"/>
+          <w:color w:val="2F5496" w:themeColor="accent1" w:themeShade="BF"/>
+          <w:kern w:val="0"/>
+          <w:sz w:val="24"/>
+          <w:szCs w:val="24"/>
+          <w:lang w:eastAsia="fr-FR"/>
+          <w14:ligatures w14:val="none"/>
+        </w:rPr>
+        <w:t>,</w:t>
+      </w:r>
+      <w:r>
+        <w:rPr>
+          <w:rFonts w:ascii="Times New Roman" w:eastAsia="Times New Roman" w:hAnsi="Times New Roman" w:cs="Times New Roman"/>
+          <w:color w:val="2F5496" w:themeColor="accent1" w:themeShade="BF"/>
+          <w:kern w:val="0"/>
+          <w:sz w:val="24"/>
+          <w:szCs w:val="24"/>
+          <w:lang w:eastAsia="fr-FR"/>
+          <w14:ligatures w14:val="none"/>
+        </w:rPr>
+        <w:t xml:space="preserve">Traitement recommandé </w:t>
+      </w:r>
+      <w:r>
+        <w:rPr>
+          <w:rFonts w:ascii="Times New Roman" w:eastAsia="Times New Roman" w:hAnsi="Times New Roman" w:cs="Times New Roman"/>
+          <w:color w:val="2F5496" w:themeColor="accent1" w:themeShade="BF"/>
+          <w:kern w:val="0"/>
+          <w:sz w:val="24"/>
+          <w:szCs w:val="24"/>
+          <w:lang w:eastAsia="fr-FR"/>
+          <w14:ligatures w14:val="none"/>
+        </w:rPr>
+        <w:t xml:space="preserve">, </w:t>
+      </w:r>
+      <w:r>
+        <w:rPr>
+          <w:rFonts w:ascii="Times New Roman" w:eastAsia="Times New Roman" w:hAnsi="Times New Roman" w:cs="Times New Roman"/>
+          <w:color w:val="2F5496" w:themeColor="accent1" w:themeShade="BF"/>
+          <w:kern w:val="0"/>
+          <w:sz w:val="24"/>
+          <w:szCs w:val="24"/>
+          <w:lang w:eastAsia="fr-FR"/>
+          <w14:ligatures w14:val="none"/>
+        </w:rPr>
+        <w:t xml:space="preserve">Risques associés </w:t>
+      </w:r>
+    </w:p>
+    <w:p>
+      <w:pPr>
+        <w:spacing w:after="0" w:line="240" w:lineRule="auto"/>
+        <w:ind w:left="708"/>
+        <w:rPr>
+          <w:rFonts w:ascii="Times New Roman" w:eastAsia="Times New Roman" w:hAnsi="Times New Roman" w:cs="Times New Roman"/>
+          <w:color w:val="2F5496" w:themeColor="accent1" w:themeShade="BF"/>
+          <w:kern w:val="0"/>
+          <w:sz w:val="24"/>
+          <w:szCs w:val="24"/>
+          <w:lang w:eastAsia="fr-FR"/>
+          <w14:ligatures w14:val="none"/>
+        </w:rPr>
+      </w:pPr>
+    </w:p>
+    <w:p>
+      <w:pPr>
+        <w:spacing w:after="0" w:line="240" w:lineRule="auto"/>
+        <w:ind w:left="708"/>
+        <w:rPr>
+          <w:rFonts w:ascii="Times New Roman" w:eastAsia="Times New Roman" w:hAnsi="Times New Roman" w:cs="Times New Roman"/>
+          <w:color w:val="2F5496" w:themeColor="accent1" w:themeShade="BF"/>
+          <w:kern w:val="0"/>
+          <w:sz w:val="24"/>
+          <w:szCs w:val="24"/>
+          <w:lang w:eastAsia="fr-FR"/>
+          <w14:ligatures w14:val="none"/>
+        </w:rPr>
+      </w:pPr>
+    </w:p>
+    <w:p>
+      <w:pPr>
+        <w:spacing w:after="0" w:line="240" w:lineRule="auto"/>
+        <w:ind w:left="708"/>
+        <w:rPr>
+          <w:rFonts w:ascii="Times New Roman" w:eastAsia="Times New Roman" w:hAnsi="Times New Roman" w:cs="Times New Roman"/>
+          <w:color w:val="2F5496" w:themeColor="accent1" w:themeShade="BF"/>
+          <w:kern w:val="0"/>
+          <w:sz w:val="24"/>
+          <w:szCs w:val="24"/>
+          <w:lang w:eastAsia="fr-FR"/>
+          <w14:ligatures w14:val="none"/>
+        </w:rPr>
+      </w:pPr>
+    </w:p>
+    <w:p>
+      <w:pPr>
+        <w:spacing w:after="0" w:line="240" w:lineRule="auto"/>
+        <w:ind w:left="708"/>
+        <w:rPr>
+          <w:rFonts w:ascii="Times New Roman" w:eastAsia="Times New Roman" w:hAnsi="Times New Roman" w:cs="Times New Roman"/>
+          <w:color w:val="2F5496" w:themeColor="accent1" w:themeShade="BF"/>
+          <w:kern w:val="0"/>
+          <w:sz w:val="24"/>
+          <w:szCs w:val="24"/>
+          <w:lang w:eastAsia="fr-FR"/>
+          <w14:ligatures w14:val="none"/>
+        </w:rPr>
+      </w:pPr>
+    </w:p>
+    <w:p>
+      <w:pPr>
+        <w:spacing w:after="0" w:line="240" w:lineRule="auto"/>
+        <w:ind w:left="708"/>
+        <w:rPr>
+          <w:rFonts w:ascii="Times New Roman" w:eastAsia="Times New Roman" w:hAnsi="Times New Roman" w:cs="Times New Roman"/>
+          <w:color w:val="2F5496" w:themeColor="accent1" w:themeShade="BF"/>
+          <w:kern w:val="0"/>
+          <w:sz w:val="24"/>
+          <w:szCs w:val="24"/>
+          <w:lang w:eastAsia="fr-FR"/>
+          <w14:ligatures w14:val="none"/>
+        </w:rPr>
+      </w:pPr>
+    </w:p>
+    <w:p>
+      <w:pPr>
+        <w:spacing w:after="0" w:line="240" w:lineRule="auto"/>
+        <w:ind w:left="708"/>
+        <w:rPr>
+          <w:rFonts w:ascii="Times New Roman" w:eastAsia="Times New Roman" w:hAnsi="Times New Roman" w:cs="Times New Roman"/>
+          <w:color w:val="2F5496" w:themeColor="accent1" w:themeShade="BF"/>
+          <w:kern w:val="0"/>
+          <w:sz w:val="24"/>
+          <w:szCs w:val="24"/>
+          <w:lang w:eastAsia="fr-FR"/>
+          <w14:ligatures w14:val="none"/>
+        </w:rPr>
+      </w:pPr>
+      <w:r>
+        <w:rPr>
+          <w:rFonts w:ascii="Times New Roman" w:eastAsia="Times New Roman" w:hAnsi="Times New Roman" w:cs="Times New Roman"/>
+          <w:color w:val="2F5496" w:themeColor="accent1" w:themeShade="BF"/>
+          <w:kern w:val="0"/>
+          <w:sz w:val="24"/>
+          <w:szCs w:val="24"/>
+          <w:lang w:eastAsia="fr-FR"/>
+          <w14:ligatures w14:val="none"/>
+        </w:rPr>
+        <w:drawing>
+          <wp:inline distT="0" distB="0" distL="0" distR="0" wp14:anchorId="060C2914" wp14:editId="11F1ADB5">
+            <wp:extent cx="5760720" cy="3763645"/>
+            <wp:effectExtent l="0" t="0" r="0" b="8255"/>
+            <wp:docPr id="24" name="Image 24"/>
+            <wp:cNvGraphicFramePr>
+              <a:graphicFrameLocks xmlns:a="http://schemas.openxmlformats.org/drawingml/2006/main" noChangeAspect="1"/>
+            </wp:cNvGraphicFramePr>
+            <a:graphic xmlns:a="http://schemas.openxmlformats.org/drawingml/2006/main">
+              <a:graphicData uri="http://schemas.openxmlformats.org/drawingml/2006/picture">
+                <pic:pic xmlns:pic="http://schemas.openxmlformats.org/drawingml/2006/picture">
+                  <pic:nvPicPr>
+                    <pic:cNvPr id="1" name=""/>
+                    <pic:cNvPicPr/>
+                  </pic:nvPicPr>
+                  <pic:blipFill>
+                    <a:blip r:embed="rId28"/>
+                    <a:stretch>
+                      <a:fillRect/>
+                    </a:stretch>
+                  </pic:blipFill>
+                  <pic:spPr>
+                    <a:xfrm>
+                      <a:off x="0" y="0"/>
+                      <a:ext cx="5760720" cy="3763645"/>
+                    </a:xfrm>
+                    <a:prstGeom prst="rect">
+                      <a:avLst/>
+                    </a:prstGeom>
+                  </pic:spPr>
+                </pic:pic>
+              </a:graphicData>
+            </a:graphic>
+          </wp:inline>
+        </w:drawing>
+      </w:r>
+    </w:p>
+    <w:p>
+      <w:pPr>
+        <w:spacing w:after="0"/>
+        <w:rPr>
+          <w:rFonts w:ascii="Times New Roman" w:hAnsi="Times New Roman" w:cs="Times New Roman"/>
+          <w:color w:val="2F5496" w:themeColor="accent1" w:themeShade="BF"/>
+          <w:sz w:val="24"/>
+          <w:szCs w:val="24"/>
+        </w:rPr>
+      </w:pPr>
+      <w:r>
+        <w:rPr>
+          <w:rFonts w:ascii="Times New Roman" w:hAnsi="Times New Roman" w:cs="Times New Roman"/>
+          <w:color w:val="2F5496" w:themeColor="accent1" w:themeShade="BF"/>
+          <w:sz w:val="24"/>
+          <w:szCs w:val="24"/>
+        </w:rPr>
+        <w:drawing>
+          <wp:inline distT="0" distB="0" distL="0" distR="0" wp14:anchorId="001F595D" wp14:editId="4073BBD2">
+            <wp:extent cx="5760720" cy="3794760"/>
+            <wp:effectExtent l="0" t="0" r="0" b="0"/>
+            <wp:docPr id="25" name="Image 25"/>
+            <wp:cNvGraphicFramePr>
+              <a:graphicFrameLocks xmlns:a="http://schemas.openxmlformats.org/drawingml/2006/main" noChangeAspect="1"/>
+            </wp:cNvGraphicFramePr>
+            <a:graphic xmlns:a="http://schemas.openxmlformats.org/drawingml/2006/main">
+              <a:graphicData uri="http://schemas.openxmlformats.org/drawingml/2006/picture">
+                <pic:pic xmlns:pic="http://schemas.openxmlformats.org/drawingml/2006/picture">
+                  <pic:nvPicPr>
+                    <pic:cNvPr id="1" name=""/>
+                    <pic:cNvPicPr/>
+                  </pic:nvPicPr>
+                  <pic:blipFill>
+                    <a:blip r:embed="rId29"/>
+                    <a:stretch>
+                      <a:fillRect/>
+                    </a:stretch>
+                  </pic:blipFill>
+                  <pic:spPr>
+                    <a:xfrm>
+                      <a:off x="0" y="0"/>
+                      <a:ext cx="5760720" cy="3794760"/>
+                    </a:xfrm>
+                    <a:prstGeom prst="rect">
+                      <a:avLst/>
+                    </a:prstGeom>
+                  </pic:spPr>
+                </pic:pic>
+              </a:graphicData>
+            </a:graphic>
+          </wp:inline>
+        </w:drawing>
+      </w:r>
+    </w:p>
+    <w:p>
+      <w:pPr>
+        <w:spacing w:after="0"/>
+        <w:rPr>
+          <w:rFonts w:ascii="Times New Roman" w:hAnsi="Times New Roman" w:cs="Times New Roman"/>
+          <w:color w:val="2F5496" w:themeColor="accent1" w:themeShade="BF"/>
+          <w:sz w:val="24"/>
+          <w:szCs w:val="24"/>
+        </w:rPr>
+      </w:pPr>
+    </w:p>
+    <w:p>
+      <w:pPr>
+        <w:spacing w:after="0"/>
+        <w:rPr>
+          <w:rFonts w:ascii="Times New Roman" w:hAnsi="Times New Roman" w:cs="Times New Roman"/>
+          <w:color w:val="2F5496" w:themeColor="accent1" w:themeShade="BF"/>
+          <w:sz w:val="24"/>
+          <w:szCs w:val="24"/>
+        </w:rPr>
+      </w:pPr>
+    </w:p>
+    <w:p>
+      <w:pPr>
+        <w:spacing w:after="0"/>
+        <w:rPr>
+          <w:rFonts w:ascii="Times New Roman" w:hAnsi="Times New Roman" w:cs="Times New Roman"/>
+          <w:color w:val="2F5496" w:themeColor="accent1" w:themeShade="BF"/>
+          <w:sz w:val="24"/>
+          <w:szCs w:val="24"/>
+        </w:rPr>
+      </w:pPr>
+    </w:p>
+    <w:p>
+      <w:pPr>
+        <w:spacing w:after="0"/>
+        <w:rPr>
+          <w:rFonts w:ascii="Times New Roman" w:hAnsi="Times New Roman" w:cs="Times New Roman"/>
+          <w:color w:val="2F5496" w:themeColor="accent1" w:themeShade="BF"/>
+          <w:sz w:val="24"/>
+          <w:szCs w:val="24"/>
+        </w:rPr>
+      </w:pPr>
+    </w:p>
+    <w:p>
+      <w:pPr>
+        <w:spacing w:after="0"/>
+        <w:rPr>
+          <w:rFonts w:ascii="Times New Roman" w:hAnsi="Times New Roman" w:cs="Times New Roman"/>
+          <w:color w:val="2F5496" w:themeColor="accent1" w:themeShade="BF"/>
+          <w:sz w:val="24"/>
+          <w:szCs w:val="24"/>
+        </w:rPr>
+      </w:pPr>
+      <w:r>
+        <w:rPr>
+          <w:rFonts w:ascii="Times New Roman" w:hAnsi="Times New Roman" w:cs="Times New Roman"/>
+          <w:color w:val="2F5496" w:themeColor="accent1" w:themeShade="BF"/>
+          <w:sz w:val="24"/>
+          <w:szCs w:val="24"/>
+        </w:rPr>
+        <w:drawing>
+          <wp:inline distT="0" distB="0" distL="0" distR="0" wp14:anchorId="5DD22F01" wp14:editId="718C76D7">
+            <wp:extent cx="5760720" cy="4031615"/>
+            <wp:effectExtent l="0" t="0" r="0" b="6985"/>
+            <wp:docPr id="26" name="Image 26"/>
+            <wp:cNvGraphicFramePr>
+              <a:graphicFrameLocks xmlns:a="http://schemas.openxmlformats.org/drawingml/2006/main" noChangeAspect="1"/>
+            </wp:cNvGraphicFramePr>
+            <a:graphic xmlns:a="http://schemas.openxmlformats.org/drawingml/2006/main">
+              <a:graphicData uri="http://schemas.openxmlformats.org/drawingml/2006/picture">
+                <pic:pic xmlns:pic="http://schemas.openxmlformats.org/drawingml/2006/picture">
+                  <pic:nvPicPr>
+                    <pic:cNvPr id="1" name=""/>
+                    <pic:cNvPicPr/>
+                  </pic:nvPicPr>
+                  <pic:blipFill>
+                    <a:blip r:embed="rId30"/>
+                    <a:stretch>
+                      <a:fillRect/>
+                    </a:stretch>
+                  </pic:blipFill>
+                  <pic:spPr>
+                    <a:xfrm>
+                      <a:off x="0" y="0"/>
+                      <a:ext cx="5760720" cy="4031615"/>
+                    </a:xfrm>
+                    <a:prstGeom prst="rect">
+                      <a:avLst/>
+                    </a:prstGeom>
+                  </pic:spPr>
+                </pic:pic>
+              </a:graphicData>
+            </a:graphic>
+          </wp:inline>
+        </w:drawing>
+      </w:r>
+    </w:p>
+    <w:p>
+      <w:pPr>
+        <w:spacing w:after="0"/>
+        <w:rPr>
+          <w:rFonts w:ascii="Times New Roman" w:hAnsi="Times New Roman" w:cs="Times New Roman"/>
+          <w:color w:val="2F5496" w:themeColor="accent1" w:themeShade="BF"/>
+          <w:sz w:val="24"/>
+          <w:szCs w:val="24"/>
+        </w:rPr>
+      </w:pPr>
+      <w:r>
+        <w:rPr>
+          <w:rFonts w:ascii="Times New Roman" w:hAnsi="Times New Roman" w:cs="Times New Roman"/>
+          <w:color w:val="2F5496" w:themeColor="accent1" w:themeShade="BF"/>
+          <w:sz w:val="24"/>
+          <w:szCs w:val="24"/>
+        </w:rPr>
+        <w:drawing>
+          <wp:inline distT="0" distB="0" distL="0" distR="0" wp14:anchorId="3E2658B7" wp14:editId="3AA911CD">
+            <wp:extent cx="5760720" cy="2908300"/>
+            <wp:effectExtent l="0" t="0" r="0" b="6350"/>
+            <wp:docPr id="27" name="Image 27"/>
+            <wp:cNvGraphicFramePr>
+              <a:graphicFrameLocks xmlns:a="http://schemas.openxmlformats.org/drawingml/2006/main" noChangeAspect="1"/>
+            </wp:cNvGraphicFramePr>
+            <a:graphic xmlns:a="http://schemas.openxmlformats.org/drawingml/2006/main">
+              <a:graphicData uri="http://schemas.openxmlformats.org/drawingml/2006/picture">
+                <pic:pic xmlns:pic="http://schemas.openxmlformats.org/drawingml/2006/picture">
+                  <pic:nvPicPr>
+                    <pic:cNvPr id="1" name=""/>
+                    <pic:cNvPicPr/>
+                  </pic:nvPicPr>
+                  <pic:blipFill>
+                    <a:blip r:embed="rId31"/>
+                    <a:stretch>
+                      <a:fillRect/>
+                    </a:stretch>
+                  </pic:blipFill>
+                  <pic:spPr>
+                    <a:xfrm>
+                      <a:off x="0" y="0"/>
+                      <a:ext cx="5760720" cy="2908300"/>
+                    </a:xfrm>
+                    <a:prstGeom prst="rect">
+                      <a:avLst/>
+                    </a:prstGeom>
+                  </pic:spPr>
+                </pic:pic>
+              </a:graphicData>
+            </a:graphic>
+          </wp:inline>
+        </w:drawing>
+      </w:r>
+    </w:p>
     <w:sectPr>
-      <w:headerReference w:type="default" r:id="rId28"/>
-      <w:footerReference w:type="default" r:id="rId29"/>
+      <w:headerReference w:type="default" r:id="rId32"/>
+      <w:footerReference w:type="default" r:id="rId33"/>
       <w:pgSz w:w="11906" w:h="16838"/>
       <w:pgMar w:top="1417" w:right="1417" w:bottom="1417" w:left="1417" w:header="708" w:footer="708" w:gutter="0"/>
       <w:pgBorders w:offsetFrom="page">
@@ -9610,6 +10556,155 @@
     </w:lvl>
   </w:abstractNum>
   <w:abstractNum w:abstractNumId="4" w15:restartNumberingAfterBreak="0">
+    <w:nsid w:val="1B070D50"/>
+    <w:multiLevelType w:val="multilevel"/>
+    <w:tmpl w:val="AC640DF8"/>
+    <w:lvl w:ilvl="0">
+      <w:start w:val="1"/>
+      <w:numFmt w:val="bullet"/>
+      <w:lvlText w:val=""/>
+      <w:lvlJc w:val="left"/>
+      <w:pPr>
+        <w:tabs>
+          <w:tab w:val="num" w:pos="720"/>
+        </w:tabs>
+        <w:ind w:left="720" w:hanging="360"/>
+      </w:pPr>
+      <w:rPr>
+        <w:rFonts w:ascii="Symbol" w:hAnsi="Symbol" w:hint="default"/>
+        <w:sz w:val="20"/>
+      </w:rPr>
+    </w:lvl>
+    <w:lvl w:ilvl="1" w:tentative="1">
+      <w:start w:val="1"/>
+      <w:numFmt w:val="bullet"/>
+      <w:lvlText w:val="o"/>
+      <w:lvlJc w:val="left"/>
+      <w:pPr>
+        <w:tabs>
+          <w:tab w:val="num" w:pos="1440"/>
+        </w:tabs>
+        <w:ind w:left="1440" w:hanging="360"/>
+      </w:pPr>
+      <w:rPr>
+        <w:rFonts w:ascii="Courier New" w:hAnsi="Courier New" w:hint="default"/>
+        <w:sz w:val="20"/>
+      </w:rPr>
+    </w:lvl>
+    <w:lvl w:ilvl="2" w:tentative="1">
+      <w:start w:val="1"/>
+      <w:numFmt w:val="bullet"/>
+      <w:lvlText w:val=""/>
+      <w:lvlJc w:val="left"/>
+      <w:pPr>
+        <w:tabs>
+          <w:tab w:val="num" w:pos="2160"/>
+        </w:tabs>
+        <w:ind w:left="2160" w:hanging="360"/>
+      </w:pPr>
+      <w:rPr>
+        <w:rFonts w:ascii="Wingdings" w:hAnsi="Wingdings" w:hint="default"/>
+        <w:sz w:val="20"/>
+      </w:rPr>
+    </w:lvl>
+    <w:lvl w:ilvl="3" w:tentative="1">
+      <w:start w:val="1"/>
+      <w:numFmt w:val="bullet"/>
+      <w:lvlText w:val=""/>
+      <w:lvlJc w:val="left"/>
+      <w:pPr>
+        <w:tabs>
+          <w:tab w:val="num" w:pos="2880"/>
+        </w:tabs>
+        <w:ind w:left="2880" w:hanging="360"/>
+      </w:pPr>
+      <w:rPr>
+        <w:rFonts w:ascii="Wingdings" w:hAnsi="Wingdings" w:hint="default"/>
+        <w:sz w:val="20"/>
+      </w:rPr>
+    </w:lvl>
+    <w:lvl w:ilvl="4" w:tentative="1">
+      <w:start w:val="1"/>
+      <w:numFmt w:val="bullet"/>
+      <w:lvlText w:val=""/>
+      <w:lvlJc w:val="left"/>
+      <w:pPr>
+        <w:tabs>
+          <w:tab w:val="num" w:pos="3600"/>
+        </w:tabs>
+        <w:ind w:left="3600" w:hanging="360"/>
+      </w:pPr>
+      <w:rPr>
+        <w:rFonts w:ascii="Wingdings" w:hAnsi="Wingdings" w:hint="default"/>
+        <w:sz w:val="20"/>
+      </w:rPr>
+    </w:lvl>
+    <w:lvl w:ilvl="5" w:tentative="1">
+      <w:start w:val="1"/>
+      <w:numFmt w:val="bullet"/>
+      <w:lvlText w:val=""/>
+      <w:lvlJc w:val="left"/>
+      <w:pPr>
+        <w:tabs>
+          <w:tab w:val="num" w:pos="4320"/>
+        </w:tabs>
+        <w:ind w:left="4320" w:hanging="360"/>
+      </w:pPr>
+      <w:rPr>
+        <w:rFonts w:ascii="Wingdings" w:hAnsi="Wingdings" w:hint="default"/>
+        <w:sz w:val="20"/>
+      </w:rPr>
+    </w:lvl>
+    <w:lvl w:ilvl="6" w:tentative="1">
+      <w:start w:val="1"/>
+      <w:numFmt w:val="bullet"/>
+      <w:lvlText w:val=""/>
+      <w:lvlJc w:val="left"/>
+      <w:pPr>
+        <w:tabs>
+          <w:tab w:val="num" w:pos="5040"/>
+        </w:tabs>
+        <w:ind w:left="5040" w:hanging="360"/>
+      </w:pPr>
+      <w:rPr>
+        <w:rFonts w:ascii="Wingdings" w:hAnsi="Wingdings" w:hint="default"/>
+        <w:sz w:val="20"/>
+      </w:rPr>
+    </w:lvl>
+    <w:lvl w:ilvl="7" w:tentative="1">
+      <w:start w:val="1"/>
+      <w:numFmt w:val="bullet"/>
+      <w:lvlText w:val=""/>
+      <w:lvlJc w:val="left"/>
+      <w:pPr>
+        <w:tabs>
+          <w:tab w:val="num" w:pos="5760"/>
+        </w:tabs>
+        <w:ind w:left="5760" w:hanging="360"/>
+      </w:pPr>
+      <w:rPr>
+        <w:rFonts w:ascii="Wingdings" w:hAnsi="Wingdings" w:hint="default"/>
+        <w:sz w:val="20"/>
+      </w:rPr>
+    </w:lvl>
+    <w:lvl w:ilvl="8" w:tentative="1">
+      <w:start w:val="1"/>
+      <w:numFmt w:val="bullet"/>
+      <w:lvlText w:val=""/>
+      <w:lvlJc w:val="left"/>
+      <w:pPr>
+        <w:tabs>
+          <w:tab w:val="num" w:pos="6480"/>
+        </w:tabs>
+        <w:ind w:left="6480" w:hanging="360"/>
+      </w:pPr>
+      <w:rPr>
+        <w:rFonts w:ascii="Wingdings" w:hAnsi="Wingdings" w:hint="default"/>
+        <w:sz w:val="20"/>
+      </w:rPr>
+    </w:lvl>
+  </w:abstractNum>
+  <w:abstractNum w:abstractNumId="5" w15:restartNumberingAfterBreak="0">
     <w:nsid w:val="23FA75D2"/>
     <w:multiLevelType w:val="multilevel"/>
     <w:tmpl w:val="7B086CF2"/>
@@ -9722,7 +10817,156 @@
       </w:pPr>
     </w:lvl>
   </w:abstractNum>
-  <w:abstractNum w:abstractNumId="5" w15:restartNumberingAfterBreak="0">
+  <w:abstractNum w:abstractNumId="6" w15:restartNumberingAfterBreak="0">
+    <w:nsid w:val="2C003D88"/>
+    <w:multiLevelType w:val="multilevel"/>
+    <w:tmpl w:val="A948D544"/>
+    <w:lvl w:ilvl="0">
+      <w:start w:val="1"/>
+      <w:numFmt w:val="bullet"/>
+      <w:lvlText w:val=""/>
+      <w:lvlJc w:val="left"/>
+      <w:pPr>
+        <w:tabs>
+          <w:tab w:val="num" w:pos="720"/>
+        </w:tabs>
+        <w:ind w:left="720" w:hanging="360"/>
+      </w:pPr>
+      <w:rPr>
+        <w:rFonts w:ascii="Symbol" w:hAnsi="Symbol" w:hint="default"/>
+        <w:sz w:val="20"/>
+      </w:rPr>
+    </w:lvl>
+    <w:lvl w:ilvl="1" w:tentative="1">
+      <w:start w:val="1"/>
+      <w:numFmt w:val="bullet"/>
+      <w:lvlText w:val="o"/>
+      <w:lvlJc w:val="left"/>
+      <w:pPr>
+        <w:tabs>
+          <w:tab w:val="num" w:pos="1440"/>
+        </w:tabs>
+        <w:ind w:left="1440" w:hanging="360"/>
+      </w:pPr>
+      <w:rPr>
+        <w:rFonts w:ascii="Courier New" w:hAnsi="Courier New" w:hint="default"/>
+        <w:sz w:val="20"/>
+      </w:rPr>
+    </w:lvl>
+    <w:lvl w:ilvl="2" w:tentative="1">
+      <w:start w:val="1"/>
+      <w:numFmt w:val="bullet"/>
+      <w:lvlText w:val=""/>
+      <w:lvlJc w:val="left"/>
+      <w:pPr>
+        <w:tabs>
+          <w:tab w:val="num" w:pos="2160"/>
+        </w:tabs>
+        <w:ind w:left="2160" w:hanging="360"/>
+      </w:pPr>
+      <w:rPr>
+        <w:rFonts w:ascii="Wingdings" w:hAnsi="Wingdings" w:hint="default"/>
+        <w:sz w:val="20"/>
+      </w:rPr>
+    </w:lvl>
+    <w:lvl w:ilvl="3" w:tentative="1">
+      <w:start w:val="1"/>
+      <w:numFmt w:val="bullet"/>
+      <w:lvlText w:val=""/>
+      <w:lvlJc w:val="left"/>
+      <w:pPr>
+        <w:tabs>
+          <w:tab w:val="num" w:pos="2880"/>
+        </w:tabs>
+        <w:ind w:left="2880" w:hanging="360"/>
+      </w:pPr>
+      <w:rPr>
+        <w:rFonts w:ascii="Wingdings" w:hAnsi="Wingdings" w:hint="default"/>
+        <w:sz w:val="20"/>
+      </w:rPr>
+    </w:lvl>
+    <w:lvl w:ilvl="4" w:tentative="1">
+      <w:start w:val="1"/>
+      <w:numFmt w:val="bullet"/>
+      <w:lvlText w:val=""/>
+      <w:lvlJc w:val="left"/>
+      <w:pPr>
+        <w:tabs>
+          <w:tab w:val="num" w:pos="3600"/>
+        </w:tabs>
+        <w:ind w:left="3600" w:hanging="360"/>
+      </w:pPr>
+      <w:rPr>
+        <w:rFonts w:ascii="Wingdings" w:hAnsi="Wingdings" w:hint="default"/>
+        <w:sz w:val="20"/>
+      </w:rPr>
+    </w:lvl>
+    <w:lvl w:ilvl="5" w:tentative="1">
+      <w:start w:val="1"/>
+      <w:numFmt w:val="bullet"/>
+      <w:lvlText w:val=""/>
+      <w:lvlJc w:val="left"/>
+      <w:pPr>
+        <w:tabs>
+          <w:tab w:val="num" w:pos="4320"/>
+        </w:tabs>
+        <w:ind w:left="4320" w:hanging="360"/>
+      </w:pPr>
+      <w:rPr>
+        <w:rFonts w:ascii="Wingdings" w:hAnsi="Wingdings" w:hint="default"/>
+        <w:sz w:val="20"/>
+      </w:rPr>
+    </w:lvl>
+    <w:lvl w:ilvl="6" w:tentative="1">
+      <w:start w:val="1"/>
+      <w:numFmt w:val="bullet"/>
+      <w:lvlText w:val=""/>
+      <w:lvlJc w:val="left"/>
+      <w:pPr>
+        <w:tabs>
+          <w:tab w:val="num" w:pos="5040"/>
+        </w:tabs>
+        <w:ind w:left="5040" w:hanging="360"/>
+      </w:pPr>
+      <w:rPr>
+        <w:rFonts w:ascii="Wingdings" w:hAnsi="Wingdings" w:hint="default"/>
+        <w:sz w:val="20"/>
+      </w:rPr>
+    </w:lvl>
+    <w:lvl w:ilvl="7" w:tentative="1">
+      <w:start w:val="1"/>
+      <w:numFmt w:val="bullet"/>
+      <w:lvlText w:val=""/>
+      <w:lvlJc w:val="left"/>
+      <w:pPr>
+        <w:tabs>
+          <w:tab w:val="num" w:pos="5760"/>
+        </w:tabs>
+        <w:ind w:left="5760" w:hanging="360"/>
+      </w:pPr>
+      <w:rPr>
+        <w:rFonts w:ascii="Wingdings" w:hAnsi="Wingdings" w:hint="default"/>
+        <w:sz w:val="20"/>
+      </w:rPr>
+    </w:lvl>
+    <w:lvl w:ilvl="8" w:tentative="1">
+      <w:start w:val="1"/>
+      <w:numFmt w:val="bullet"/>
+      <w:lvlText w:val=""/>
+      <w:lvlJc w:val="left"/>
+      <w:pPr>
+        <w:tabs>
+          <w:tab w:val="num" w:pos="6480"/>
+        </w:tabs>
+        <w:ind w:left="6480" w:hanging="360"/>
+      </w:pPr>
+      <w:rPr>
+        <w:rFonts w:ascii="Wingdings" w:hAnsi="Wingdings" w:hint="default"/>
+        <w:sz w:val="20"/>
+      </w:rPr>
+    </w:lvl>
+  </w:abstractNum>
+  <w:abstractNum w:abstractNumId="7" w15:restartNumberingAfterBreak="0">
     <w:nsid w:val="30817C99"/>
     <w:multiLevelType w:val="hybridMultilevel"/>
     <w:tmpl w:val="B28054F4"/>
@@ -9808,7 +11052,7 @@
       </w:pPr>
     </w:lvl>
   </w:abstractNum>
-  <w:abstractNum w:abstractNumId="6" w15:restartNumberingAfterBreak="0">
+  <w:abstractNum w:abstractNumId="8" w15:restartNumberingAfterBreak="0">
     <w:nsid w:val="32024712"/>
     <w:multiLevelType w:val="multilevel"/>
     <w:tmpl w:val="7716EFCE"/>
@@ -9957,7 +11201,7 @@
       </w:rPr>
     </w:lvl>
   </w:abstractNum>
-  <w:abstractNum w:abstractNumId="7" w15:restartNumberingAfterBreak="0">
+  <w:abstractNum w:abstractNumId="9" w15:restartNumberingAfterBreak="0">
     <w:nsid w:val="3A273CBD"/>
     <w:multiLevelType w:val="multilevel"/>
     <w:tmpl w:val="A5564738"/>
@@ -10106,7 +11350,7 @@
       </w:rPr>
     </w:lvl>
   </w:abstractNum>
-  <w:abstractNum w:abstractNumId="8" w15:restartNumberingAfterBreak="0">
+  <w:abstractNum w:abstractNumId="10" w15:restartNumberingAfterBreak="0">
     <w:nsid w:val="3CA24848"/>
     <w:multiLevelType w:val="hybridMultilevel"/>
     <w:tmpl w:val="76B802A4"/>
@@ -10219,7 +11463,7 @@
       </w:rPr>
     </w:lvl>
   </w:abstractNum>
-  <w:abstractNum w:abstractNumId="9" w15:restartNumberingAfterBreak="0">
+  <w:abstractNum w:abstractNumId="11" w15:restartNumberingAfterBreak="0">
     <w:nsid w:val="4996411C"/>
     <w:multiLevelType w:val="multilevel"/>
     <w:tmpl w:val="218091C0"/>
@@ -10336,7 +11580,7 @@
       </w:pPr>
     </w:lvl>
   </w:abstractNum>
-  <w:abstractNum w:abstractNumId="10" w15:restartNumberingAfterBreak="0">
+  <w:abstractNum w:abstractNumId="12" w15:restartNumberingAfterBreak="0">
     <w:nsid w:val="4F9D0AB4"/>
     <w:multiLevelType w:val="multilevel"/>
     <w:tmpl w:val="839C6E34"/>
@@ -10485,7 +11729,7 @@
       </w:rPr>
     </w:lvl>
   </w:abstractNum>
-  <w:abstractNum w:abstractNumId="11" w15:restartNumberingAfterBreak="0">
+  <w:abstractNum w:abstractNumId="13" w15:restartNumberingAfterBreak="0">
     <w:nsid w:val="56D568C8"/>
     <w:multiLevelType w:val="multilevel"/>
     <w:tmpl w:val="3392CAD2"/>
@@ -10634,7 +11878,7 @@
       </w:rPr>
     </w:lvl>
   </w:abstractNum>
-  <w:abstractNum w:abstractNumId="12" w15:restartNumberingAfterBreak="0">
+  <w:abstractNum w:abstractNumId="14" w15:restartNumberingAfterBreak="0">
     <w:nsid w:val="61053792"/>
     <w:multiLevelType w:val="multilevel"/>
     <w:tmpl w:val="49E43BFC"/>
@@ -10783,7 +12027,7 @@
       </w:rPr>
     </w:lvl>
   </w:abstractNum>
-  <w:abstractNum w:abstractNumId="13" w15:restartNumberingAfterBreak="0">
+  <w:abstractNum w:abstractNumId="15" w15:restartNumberingAfterBreak="0">
     <w:nsid w:val="6DA36487"/>
     <w:multiLevelType w:val="multilevel"/>
     <w:tmpl w:val="9C4C8532"/>
@@ -10932,7 +12176,7 @@
       </w:rPr>
     </w:lvl>
   </w:abstractNum>
-  <w:abstractNum w:abstractNumId="14" w15:restartNumberingAfterBreak="0">
+  <w:abstractNum w:abstractNumId="16" w15:restartNumberingAfterBreak="0">
     <w:nsid w:val="6EB85EAA"/>
     <w:multiLevelType w:val="hybridMultilevel"/>
     <w:tmpl w:val="DB76C824"/>
@@ -11046,34 +12290,34 @@
     </w:lvl>
   </w:abstractNum>
   <w:num w:numId="1">
+    <w:abstractNumId w:val="16"/>
+  </w:num>
+  <w:num w:numId="2">
+    <w:abstractNumId w:val="10"/>
+  </w:num>
+  <w:num w:numId="3">
+    <w:abstractNumId w:val="13"/>
+  </w:num>
+  <w:num w:numId="4">
+    <w:abstractNumId w:val="8"/>
+  </w:num>
+  <w:num w:numId="5">
+    <w:abstractNumId w:val="7"/>
+  </w:num>
+  <w:num w:numId="6">
     <w:abstractNumId w:val="14"/>
   </w:num>
-  <w:num w:numId="2">
-    <w:abstractNumId w:val="8"/>
-  </w:num>
-  <w:num w:numId="3">
-    <w:abstractNumId w:val="11"/>
-  </w:num>
-  <w:num w:numId="4">
-    <w:abstractNumId w:val="6"/>
-  </w:num>
-  <w:num w:numId="5">
+  <w:num w:numId="7">
     <w:abstractNumId w:val="5"/>
   </w:num>
-  <w:num w:numId="6">
-    <w:abstractNumId w:val="12"/>
-  </w:num>
-  <w:num w:numId="7">
-    <w:abstractNumId w:val="4"/>
-  </w:num>
   <w:num w:numId="8">
-    <w:abstractNumId w:val="13"/>
+    <w:abstractNumId w:val="15"/>
   </w:num>
   <w:num w:numId="9">
     <w:abstractNumId w:val="2"/>
   </w:num>
   <w:num w:numId="10">
-    <w:abstractNumId w:val="9"/>
+    <w:abstractNumId w:val="11"/>
   </w:num>
   <w:num w:numId="11">
     <w:abstractNumId w:val="3"/>
@@ -11082,13 +12326,19 @@
     <w:abstractNumId w:val="0"/>
   </w:num>
   <w:num w:numId="13">
-    <w:abstractNumId w:val="10"/>
+    <w:abstractNumId w:val="12"/>
   </w:num>
   <w:num w:numId="14">
     <w:abstractNumId w:val="1"/>
   </w:num>
   <w:num w:numId="15">
-    <w:abstractNumId w:val="7"/>
+    <w:abstractNumId w:val="9"/>
+  </w:num>
+  <w:num w:numId="16">
+    <w:abstractNumId w:val="4"/>
+  </w:num>
+  <w:num w:numId="17">
+    <w:abstractNumId w:val="6"/>
   </w:num>
 </w:numbering>
 </file>
@@ -11493,6 +12743,7 @@
   <w:style w:type="paragraph" w:default="1" w:styleId="Normal">
     <w:name w:val="Normal"/>
     <w:qFormat/>
+    <w:rsid w:val="00834DA1"/>
   </w:style>
   <w:style w:type="paragraph" w:styleId="Titre3">
     <w:name w:val="heading 3"/>

</xml_diff>

<commit_message>
Créer un prompt permettant, à partir du dataset des capteurs, de proposer les visualisations
les plus pertinentes pour comprendre la consommation énergétique d'un bâtiment

Et pour
chaque visualisation indiquer le type de graphique, les variables utilisées,

 l’objectif et l’interprétation attendue.
</commit_message>
<xml_diff>
--- a/Atelier Prompt.docx
+++ b/Atelier Prompt.docx
@@ -9613,9 +9613,786 @@
         </w:drawing>
       </w:r>
     </w:p>
+    <w:p>
+      <w:pPr>
+        <w:spacing w:after="0"/>
+        <w:rPr>
+          <w:rFonts w:ascii="Times New Roman" w:hAnsi="Times New Roman" w:cs="Times New Roman"/>
+          <w:color w:val="2F5496" w:themeColor="accent1" w:themeShade="BF"/>
+          <w:sz w:val="24"/>
+          <w:szCs w:val="24"/>
+        </w:rPr>
+      </w:pPr>
+    </w:p>
+    <w:p>
+      <w:pPr>
+        <w:autoSpaceDE w:val="0"/>
+        <w:autoSpaceDN w:val="0"/>
+        <w:adjustRightInd w:val="0"/>
+        <w:spacing w:after="0" w:line="240" w:lineRule="auto"/>
+        <w:rPr>
+          <w:rFonts w:ascii="CIDFont+F1" w:hAnsi="CIDFont+F1" w:cs="CIDFont+F1"/>
+          <w:kern w:val="0"/>
+          <w:sz w:val="21"/>
+          <w:szCs w:val="21"/>
+        </w:rPr>
+      </w:pPr>
+      <w:r>
+        <w:rPr>
+          <w:rFonts w:ascii="CIDFont+F1" w:hAnsi="CIDFont+F1" w:cs="CIDFont+F1"/>
+          <w:kern w:val="0"/>
+          <w:sz w:val="21"/>
+          <w:szCs w:val="21"/>
+        </w:rPr>
+        <w:t>2) Créer un prompt permettant, à partir du dataset des capteurs, de proposer les visualisations</w:t>
+      </w:r>
+    </w:p>
+    <w:p>
+      <w:pPr>
+        <w:autoSpaceDE w:val="0"/>
+        <w:autoSpaceDN w:val="0"/>
+        <w:adjustRightInd w:val="0"/>
+        <w:spacing w:after="0" w:line="240" w:lineRule="auto"/>
+        <w:rPr>
+          <w:rFonts w:ascii="CIDFont+F1" w:hAnsi="CIDFont+F1" w:cs="CIDFont+F1"/>
+          <w:kern w:val="0"/>
+          <w:sz w:val="21"/>
+          <w:szCs w:val="21"/>
+        </w:rPr>
+      </w:pPr>
+      <w:r>
+        <w:rPr>
+          <w:rFonts w:ascii="CIDFont+F1" w:hAnsi="CIDFont+F1" w:cs="CIDFont+F1"/>
+          <w:kern w:val="0"/>
+          <w:sz w:val="21"/>
+          <w:szCs w:val="21"/>
+        </w:rPr>
+        <w:t>les plus pertinentes pour comprendre la consommation énergétique d'un bâtiment. Et pour</w:t>
+      </w:r>
+    </w:p>
+    <w:p>
+      <w:pPr>
+        <w:autoSpaceDE w:val="0"/>
+        <w:autoSpaceDN w:val="0"/>
+        <w:adjustRightInd w:val="0"/>
+        <w:spacing w:after="0" w:line="240" w:lineRule="auto"/>
+        <w:rPr>
+          <w:rFonts w:ascii="CIDFont+F1" w:hAnsi="CIDFont+F1" w:cs="CIDFont+F1"/>
+          <w:kern w:val="0"/>
+          <w:sz w:val="21"/>
+          <w:szCs w:val="21"/>
+        </w:rPr>
+      </w:pPr>
+      <w:r>
+        <w:rPr>
+          <w:rFonts w:ascii="CIDFont+F1" w:hAnsi="CIDFont+F1" w:cs="CIDFont+F1"/>
+          <w:kern w:val="0"/>
+          <w:sz w:val="21"/>
+          <w:szCs w:val="21"/>
+        </w:rPr>
+        <w:t>chaque visualisation indiquer le type de graphique, les variables utilisées, l’objectif et</w:t>
+      </w:r>
+    </w:p>
+    <w:p>
+      <w:pPr>
+        <w:spacing w:after="0"/>
+        <w:rPr>
+          <w:rFonts w:ascii="CIDFont+F1" w:hAnsi="CIDFont+F1" w:cs="CIDFont+F1"/>
+          <w:kern w:val="0"/>
+          <w:sz w:val="21"/>
+          <w:szCs w:val="21"/>
+        </w:rPr>
+      </w:pPr>
+      <w:r>
+        <w:rPr>
+          <w:rFonts w:ascii="CIDFont+F1" w:hAnsi="CIDFont+F1" w:cs="CIDFont+F1"/>
+          <w:kern w:val="0"/>
+          <w:sz w:val="21"/>
+          <w:szCs w:val="21"/>
+        </w:rPr>
+        <w:t>l’interprétation attendue.</w:t>
+      </w:r>
+    </w:p>
+    <w:p>
+      <w:pPr>
+        <w:spacing w:after="0"/>
+        <w:rPr>
+          <w:rFonts w:ascii="CIDFont+F1" w:hAnsi="CIDFont+F1" w:cs="CIDFont+F1"/>
+          <w:kern w:val="0"/>
+          <w:sz w:val="21"/>
+          <w:szCs w:val="21"/>
+        </w:rPr>
+      </w:pPr>
+    </w:p>
+    <w:p>
+      <w:pPr>
+        <w:spacing w:after="0" w:line="240" w:lineRule="auto"/>
+        <w:ind w:left="1416"/>
+        <w:rPr>
+          <w:rFonts w:ascii="Times New Roman" w:eastAsia="Times New Roman" w:hAnsi="Times New Roman" w:cs="Times New Roman"/>
+          <w:color w:val="2F5496" w:themeColor="accent1" w:themeShade="BF"/>
+          <w:kern w:val="0"/>
+          <w:sz w:val="24"/>
+          <w:szCs w:val="24"/>
+          <w:lang w:eastAsia="fr-FR"/>
+          <w14:ligatures w14:val="none"/>
+        </w:rPr>
+      </w:pPr>
+      <w:r>
+        <w:rPr>
+          <w:rFonts w:ascii="Times New Roman" w:eastAsia="Times New Roman" w:hAnsi="Times New Roman" w:cs="Times New Roman"/>
+          <w:color w:val="2F5496" w:themeColor="accent1" w:themeShade="BF"/>
+          <w:kern w:val="0"/>
+          <w:sz w:val="24"/>
+          <w:szCs w:val="24"/>
+          <w:lang w:eastAsia="fr-FR"/>
+          <w14:ligatures w14:val="none"/>
+        </w:rPr>
+        <w:t>Tu es un expert en Data Science et en visualisation de données.</w:t>
+      </w:r>
+    </w:p>
+    <w:p>
+      <w:pPr>
+        <w:spacing w:after="0" w:line="240" w:lineRule="auto"/>
+        <w:ind w:left="1416"/>
+        <w:rPr>
+          <w:rFonts w:ascii="Times New Roman" w:eastAsia="Times New Roman" w:hAnsi="Times New Roman" w:cs="Times New Roman"/>
+          <w:color w:val="2F5496" w:themeColor="accent1" w:themeShade="BF"/>
+          <w:kern w:val="0"/>
+          <w:sz w:val="24"/>
+          <w:szCs w:val="24"/>
+          <w:lang w:eastAsia="fr-FR"/>
+          <w14:ligatures w14:val="none"/>
+        </w:rPr>
+      </w:pPr>
+      <w:r>
+        <w:rPr>
+          <w:rFonts w:ascii="Times New Roman" w:eastAsia="Times New Roman" w:hAnsi="Times New Roman" w:cs="Times New Roman"/>
+          <w:color w:val="2F5496" w:themeColor="accent1" w:themeShade="BF"/>
+          <w:kern w:val="0"/>
+          <w:sz w:val="24"/>
+          <w:szCs w:val="24"/>
+          <w:lang w:eastAsia="fr-FR"/>
+          <w14:ligatures w14:val="none"/>
+        </w:rPr>
+        <w:lastRenderedPageBreak/>
+        <w:t>À partir du dataset des capteurs, propose les visualisations les plus pertinentes pour comprendre la consommation énergétique du bâtiment.</w:t>
+      </w:r>
+    </w:p>
+    <w:p>
+      <w:pPr>
+        <w:spacing w:after="0" w:line="240" w:lineRule="auto"/>
+        <w:ind w:left="1416"/>
+        <w:rPr>
+          <w:rFonts w:ascii="Times New Roman" w:eastAsia="Times New Roman" w:hAnsi="Times New Roman" w:cs="Times New Roman"/>
+          <w:color w:val="2F5496" w:themeColor="accent1" w:themeShade="BF"/>
+          <w:kern w:val="0"/>
+          <w:sz w:val="24"/>
+          <w:szCs w:val="24"/>
+          <w:lang w:eastAsia="fr-FR"/>
+          <w14:ligatures w14:val="none"/>
+        </w:rPr>
+      </w:pPr>
+      <w:r>
+        <w:rPr>
+          <w:rFonts w:ascii="Times New Roman" w:eastAsia="Times New Roman" w:hAnsi="Times New Roman" w:cs="Times New Roman"/>
+          <w:color w:val="2F5496" w:themeColor="accent1" w:themeShade="BF"/>
+          <w:kern w:val="0"/>
+          <w:sz w:val="24"/>
+          <w:szCs w:val="24"/>
+          <w:lang w:eastAsia="fr-FR"/>
+          <w14:ligatures w14:val="none"/>
+        </w:rPr>
+        <w:t>Pour chaque visualisation, indique :</w:t>
+      </w:r>
+    </w:p>
+    <w:p>
+      <w:pPr>
+        <w:numPr>
+          <w:ilvl w:val="0"/>
+          <w:numId w:val="18"/>
+        </w:numPr>
+        <w:tabs>
+          <w:tab w:val="clear" w:pos="720"/>
+          <w:tab w:val="num" w:pos="2136"/>
+        </w:tabs>
+        <w:spacing w:after="0" w:line="240" w:lineRule="auto"/>
+        <w:ind w:left="2136"/>
+        <w:rPr>
+          <w:rFonts w:ascii="Times New Roman" w:eastAsia="Times New Roman" w:hAnsi="Times New Roman" w:cs="Times New Roman"/>
+          <w:color w:val="2F5496" w:themeColor="accent1" w:themeShade="BF"/>
+          <w:kern w:val="0"/>
+          <w:sz w:val="24"/>
+          <w:szCs w:val="24"/>
+          <w:lang w:eastAsia="fr-FR"/>
+          <w14:ligatures w14:val="none"/>
+        </w:rPr>
+      </w:pPr>
+      <w:r>
+        <w:rPr>
+          <w:rFonts w:ascii="Times New Roman" w:eastAsia="Times New Roman" w:hAnsi="Times New Roman" w:cs="Times New Roman"/>
+          <w:color w:val="2F5496" w:themeColor="accent1" w:themeShade="BF"/>
+          <w:kern w:val="0"/>
+          <w:sz w:val="24"/>
+          <w:szCs w:val="24"/>
+          <w:lang w:eastAsia="fr-FR"/>
+          <w14:ligatures w14:val="none"/>
+        </w:rPr>
+        <w:t>le type de graphique ;</w:t>
+      </w:r>
+    </w:p>
+    <w:p>
+      <w:pPr>
+        <w:numPr>
+          <w:ilvl w:val="0"/>
+          <w:numId w:val="18"/>
+        </w:numPr>
+        <w:tabs>
+          <w:tab w:val="clear" w:pos="720"/>
+          <w:tab w:val="num" w:pos="2136"/>
+        </w:tabs>
+        <w:spacing w:after="0" w:line="240" w:lineRule="auto"/>
+        <w:ind w:left="2136"/>
+        <w:rPr>
+          <w:rFonts w:ascii="Times New Roman" w:eastAsia="Times New Roman" w:hAnsi="Times New Roman" w:cs="Times New Roman"/>
+          <w:color w:val="2F5496" w:themeColor="accent1" w:themeShade="BF"/>
+          <w:kern w:val="0"/>
+          <w:sz w:val="24"/>
+          <w:szCs w:val="24"/>
+          <w:lang w:eastAsia="fr-FR"/>
+          <w14:ligatures w14:val="none"/>
+        </w:rPr>
+      </w:pPr>
+      <w:r>
+        <w:rPr>
+          <w:rFonts w:ascii="Times New Roman" w:eastAsia="Times New Roman" w:hAnsi="Times New Roman" w:cs="Times New Roman"/>
+          <w:color w:val="2F5496" w:themeColor="accent1" w:themeShade="BF"/>
+          <w:kern w:val="0"/>
+          <w:sz w:val="24"/>
+          <w:szCs w:val="24"/>
+          <w:lang w:eastAsia="fr-FR"/>
+          <w14:ligatures w14:val="none"/>
+        </w:rPr>
+        <w:t>les variables utilisées ;</w:t>
+      </w:r>
+    </w:p>
+    <w:p>
+      <w:pPr>
+        <w:numPr>
+          <w:ilvl w:val="0"/>
+          <w:numId w:val="18"/>
+        </w:numPr>
+        <w:tabs>
+          <w:tab w:val="clear" w:pos="720"/>
+          <w:tab w:val="num" w:pos="2136"/>
+        </w:tabs>
+        <w:spacing w:after="0" w:line="240" w:lineRule="auto"/>
+        <w:ind w:left="2136"/>
+        <w:rPr>
+          <w:rFonts w:ascii="Times New Roman" w:eastAsia="Times New Roman" w:hAnsi="Times New Roman" w:cs="Times New Roman"/>
+          <w:color w:val="2F5496" w:themeColor="accent1" w:themeShade="BF"/>
+          <w:kern w:val="0"/>
+          <w:sz w:val="24"/>
+          <w:szCs w:val="24"/>
+          <w:lang w:eastAsia="fr-FR"/>
+          <w14:ligatures w14:val="none"/>
+        </w:rPr>
+      </w:pPr>
+      <w:r>
+        <w:rPr>
+          <w:rFonts w:ascii="Times New Roman" w:eastAsia="Times New Roman" w:hAnsi="Times New Roman" w:cs="Times New Roman"/>
+          <w:color w:val="2F5496" w:themeColor="accent1" w:themeShade="BF"/>
+          <w:kern w:val="0"/>
+          <w:sz w:val="24"/>
+          <w:szCs w:val="24"/>
+          <w:lang w:eastAsia="fr-FR"/>
+          <w14:ligatures w14:val="none"/>
+        </w:rPr>
+        <w:t>l'objectif de la visualisation ;</w:t>
+      </w:r>
+    </w:p>
+    <w:p>
+      <w:pPr>
+        <w:numPr>
+          <w:ilvl w:val="0"/>
+          <w:numId w:val="18"/>
+        </w:numPr>
+        <w:tabs>
+          <w:tab w:val="clear" w:pos="720"/>
+          <w:tab w:val="num" w:pos="2136"/>
+        </w:tabs>
+        <w:spacing w:after="0" w:line="240" w:lineRule="auto"/>
+        <w:ind w:left="2136"/>
+        <w:rPr>
+          <w:rFonts w:ascii="Times New Roman" w:eastAsia="Times New Roman" w:hAnsi="Times New Roman" w:cs="Times New Roman"/>
+          <w:color w:val="2F5496" w:themeColor="accent1" w:themeShade="BF"/>
+          <w:kern w:val="0"/>
+          <w:sz w:val="24"/>
+          <w:szCs w:val="24"/>
+          <w:lang w:eastAsia="fr-FR"/>
+          <w14:ligatures w14:val="none"/>
+        </w:rPr>
+      </w:pPr>
+      <w:r>
+        <w:rPr>
+          <w:rFonts w:ascii="Times New Roman" w:eastAsia="Times New Roman" w:hAnsi="Times New Roman" w:cs="Times New Roman"/>
+          <w:color w:val="2F5496" w:themeColor="accent1" w:themeShade="BF"/>
+          <w:kern w:val="0"/>
+          <w:sz w:val="24"/>
+          <w:szCs w:val="24"/>
+          <w:lang w:eastAsia="fr-FR"/>
+          <w14:ligatures w14:val="none"/>
+        </w:rPr>
+        <w:t>l'interprétation attendue.</w:t>
+      </w:r>
+    </w:p>
+    <w:p>
+      <w:pPr>
+        <w:spacing w:after="0" w:line="240" w:lineRule="auto"/>
+        <w:ind w:left="1416"/>
+        <w:rPr>
+          <w:rFonts w:ascii="Times New Roman" w:eastAsia="Times New Roman" w:hAnsi="Times New Roman" w:cs="Times New Roman"/>
+          <w:color w:val="2F5496" w:themeColor="accent1" w:themeShade="BF"/>
+          <w:kern w:val="0"/>
+          <w:sz w:val="24"/>
+          <w:szCs w:val="24"/>
+          <w:lang w:eastAsia="fr-FR"/>
+          <w14:ligatures w14:val="none"/>
+        </w:rPr>
+      </w:pPr>
+      <w:r>
+        <w:rPr>
+          <w:rFonts w:ascii="Times New Roman" w:eastAsia="Times New Roman" w:hAnsi="Times New Roman" w:cs="Times New Roman"/>
+          <w:color w:val="2F5496" w:themeColor="accent1" w:themeShade="BF"/>
+          <w:kern w:val="0"/>
+          <w:sz w:val="24"/>
+          <w:szCs w:val="24"/>
+          <w:lang w:eastAsia="fr-FR"/>
+          <w14:ligatures w14:val="none"/>
+        </w:rPr>
+        <w:t>Choisis uniquement les visualisations réellement utiles pour analyser et comprendre la consommation énergétique.</w:t>
+      </w:r>
+    </w:p>
+    <w:p>
+      <w:pPr>
+        <w:spacing w:after="0" w:line="240" w:lineRule="auto"/>
+        <w:ind w:left="1416"/>
+        <w:rPr>
+          <w:rFonts w:ascii="Times New Roman" w:eastAsia="Times New Roman" w:hAnsi="Times New Roman" w:cs="Times New Roman"/>
+          <w:color w:val="2F5496" w:themeColor="accent1" w:themeShade="BF"/>
+          <w:kern w:val="0"/>
+          <w:sz w:val="24"/>
+          <w:szCs w:val="24"/>
+          <w:lang w:eastAsia="fr-FR"/>
+          <w14:ligatures w14:val="none"/>
+        </w:rPr>
+      </w:pPr>
+      <w:r>
+        <w:rPr>
+          <w:rFonts w:ascii="Times New Roman" w:eastAsia="Times New Roman" w:hAnsi="Times New Roman" w:cs="Times New Roman"/>
+          <w:color w:val="2F5496" w:themeColor="accent1" w:themeShade="BF"/>
+          <w:kern w:val="0"/>
+          <w:sz w:val="24"/>
+          <w:szCs w:val="24"/>
+          <w:lang w:eastAsia="fr-FR"/>
+          <w14:ligatures w14:val="none"/>
+        </w:rPr>
+        <w:t>Présente les résultats sous forme de tableau avec les colonnes suivantes :</w:t>
+      </w:r>
+      <w:r>
+        <w:rPr>
+          <w:rFonts w:ascii="Times New Roman" w:eastAsia="Times New Roman" w:hAnsi="Times New Roman" w:cs="Times New Roman"/>
+          <w:color w:val="2F5496" w:themeColor="accent1" w:themeShade="BF"/>
+          <w:kern w:val="0"/>
+          <w:sz w:val="24"/>
+          <w:szCs w:val="24"/>
+          <w:lang w:eastAsia="fr-FR"/>
+          <w14:ligatures w14:val="none"/>
+        </w:rPr>
+        <w:t xml:space="preserve"> </w:t>
+      </w:r>
+      <w:r>
+        <w:rPr>
+          <w:rFonts w:ascii="Times New Roman" w:eastAsia="Times New Roman" w:hAnsi="Times New Roman" w:cs="Times New Roman"/>
+          <w:color w:val="2F5496" w:themeColor="accent1" w:themeShade="BF"/>
+          <w:kern w:val="0"/>
+          <w:sz w:val="24"/>
+          <w:szCs w:val="24"/>
+          <w:lang w:eastAsia="fr-FR"/>
+          <w14:ligatures w14:val="none"/>
+        </w:rPr>
+        <w:t>Type de graphique</w:t>
+      </w:r>
+      <w:r>
+        <w:rPr>
+          <w:rFonts w:ascii="Times New Roman" w:eastAsia="Times New Roman" w:hAnsi="Times New Roman" w:cs="Times New Roman"/>
+          <w:color w:val="2F5496" w:themeColor="accent1" w:themeShade="BF"/>
+          <w:kern w:val="0"/>
+          <w:sz w:val="24"/>
+          <w:szCs w:val="24"/>
+          <w:lang w:eastAsia="fr-FR"/>
+          <w14:ligatures w14:val="none"/>
+        </w:rPr>
+        <w:t>,</w:t>
+      </w:r>
+      <w:r>
+        <w:rPr>
+          <w:rFonts w:ascii="Times New Roman" w:eastAsia="Times New Roman" w:hAnsi="Times New Roman" w:cs="Times New Roman"/>
+          <w:color w:val="2F5496" w:themeColor="accent1" w:themeShade="BF"/>
+          <w:kern w:val="0"/>
+          <w:sz w:val="24"/>
+          <w:szCs w:val="24"/>
+          <w:lang w:eastAsia="fr-FR"/>
+          <w14:ligatures w14:val="none"/>
+        </w:rPr>
+        <w:t xml:space="preserve"> Variables utilisées</w:t>
+      </w:r>
+      <w:r>
+        <w:rPr>
+          <w:rFonts w:ascii="Times New Roman" w:eastAsia="Times New Roman" w:hAnsi="Times New Roman" w:cs="Times New Roman"/>
+          <w:color w:val="2F5496" w:themeColor="accent1" w:themeShade="BF"/>
+          <w:kern w:val="0"/>
+          <w:sz w:val="24"/>
+          <w:szCs w:val="24"/>
+          <w:lang w:eastAsia="fr-FR"/>
+          <w14:ligatures w14:val="none"/>
+        </w:rPr>
+        <w:t>,</w:t>
+      </w:r>
+      <w:r>
+        <w:rPr>
+          <w:rFonts w:ascii="Times New Roman" w:eastAsia="Times New Roman" w:hAnsi="Times New Roman" w:cs="Times New Roman"/>
+          <w:color w:val="2F5496" w:themeColor="accent1" w:themeShade="BF"/>
+          <w:kern w:val="0"/>
+          <w:sz w:val="24"/>
+          <w:szCs w:val="24"/>
+          <w:lang w:eastAsia="fr-FR"/>
+          <w14:ligatures w14:val="none"/>
+        </w:rPr>
+        <w:t xml:space="preserve"> Objectif </w:t>
+      </w:r>
+      <w:r>
+        <w:rPr>
+          <w:rFonts w:ascii="Times New Roman" w:eastAsia="Times New Roman" w:hAnsi="Times New Roman" w:cs="Times New Roman"/>
+          <w:color w:val="2F5496" w:themeColor="accent1" w:themeShade="BF"/>
+          <w:kern w:val="0"/>
+          <w:sz w:val="24"/>
+          <w:szCs w:val="24"/>
+          <w:lang w:eastAsia="fr-FR"/>
+          <w14:ligatures w14:val="none"/>
+        </w:rPr>
+        <w:t xml:space="preserve">, </w:t>
+      </w:r>
+      <w:r>
+        <w:rPr>
+          <w:rFonts w:ascii="Times New Roman" w:eastAsia="Times New Roman" w:hAnsi="Times New Roman" w:cs="Times New Roman"/>
+          <w:color w:val="2F5496" w:themeColor="accent1" w:themeShade="BF"/>
+          <w:kern w:val="0"/>
+          <w:sz w:val="24"/>
+          <w:szCs w:val="24"/>
+          <w:lang w:eastAsia="fr-FR"/>
+          <w14:ligatures w14:val="none"/>
+        </w:rPr>
+        <w:t xml:space="preserve">Interprétation attendue </w:t>
+      </w:r>
+    </w:p>
+    <w:p>
+      <w:pPr>
+        <w:spacing w:after="0"/>
+        <w:rPr>
+          <w:rFonts w:ascii="Times New Roman" w:hAnsi="Times New Roman" w:cs="Times New Roman"/>
+          <w:color w:val="2F5496" w:themeColor="accent1" w:themeShade="BF"/>
+          <w:sz w:val="24"/>
+          <w:szCs w:val="24"/>
+        </w:rPr>
+      </w:pPr>
+    </w:p>
+    <w:p>
+      <w:pPr>
+        <w:spacing w:after="0"/>
+        <w:rPr>
+          <w:rFonts w:ascii="Times New Roman" w:hAnsi="Times New Roman" w:cs="Times New Roman"/>
+          <w:color w:val="2F5496" w:themeColor="accent1" w:themeShade="BF"/>
+          <w:sz w:val="24"/>
+          <w:szCs w:val="24"/>
+        </w:rPr>
+      </w:pPr>
+      <w:r>
+        <w:rPr>
+          <w:rFonts w:ascii="Times New Roman" w:hAnsi="Times New Roman" w:cs="Times New Roman"/>
+          <w:color w:val="2F5496" w:themeColor="accent1" w:themeShade="BF"/>
+          <w:sz w:val="24"/>
+          <w:szCs w:val="24"/>
+        </w:rPr>
+        <w:drawing>
+          <wp:inline distT="0" distB="0" distL="0" distR="0" wp14:anchorId="6DEEDB43" wp14:editId="25CACC0C">
+            <wp:extent cx="5760720" cy="3384550"/>
+            <wp:effectExtent l="0" t="0" r="0" b="6350"/>
+            <wp:docPr id="28" name="Image 28"/>
+            <wp:cNvGraphicFramePr>
+              <a:graphicFrameLocks xmlns:a="http://schemas.openxmlformats.org/drawingml/2006/main" noChangeAspect="1"/>
+            </wp:cNvGraphicFramePr>
+            <a:graphic xmlns:a="http://schemas.openxmlformats.org/drawingml/2006/main">
+              <a:graphicData uri="http://schemas.openxmlformats.org/drawingml/2006/picture">
+                <pic:pic xmlns:pic="http://schemas.openxmlformats.org/drawingml/2006/picture">
+                  <pic:nvPicPr>
+                    <pic:cNvPr id="1" name=""/>
+                    <pic:cNvPicPr/>
+                  </pic:nvPicPr>
+                  <pic:blipFill>
+                    <a:blip r:embed="rId32"/>
+                    <a:stretch>
+                      <a:fillRect/>
+                    </a:stretch>
+                  </pic:blipFill>
+                  <pic:spPr>
+                    <a:xfrm>
+                      <a:off x="0" y="0"/>
+                      <a:ext cx="5760720" cy="3384550"/>
+                    </a:xfrm>
+                    <a:prstGeom prst="rect">
+                      <a:avLst/>
+                    </a:prstGeom>
+                  </pic:spPr>
+                </pic:pic>
+              </a:graphicData>
+            </a:graphic>
+          </wp:inline>
+        </w:drawing>
+      </w:r>
+    </w:p>
+    <w:p>
+      <w:pPr>
+        <w:spacing w:after="0"/>
+        <w:rPr>
+          <w:rFonts w:ascii="Times New Roman" w:hAnsi="Times New Roman" w:cs="Times New Roman"/>
+          <w:color w:val="2F5496" w:themeColor="accent1" w:themeShade="BF"/>
+          <w:sz w:val="24"/>
+          <w:szCs w:val="24"/>
+        </w:rPr>
+      </w:pPr>
+      <w:r>
+        <w:rPr>
+          <w:rFonts w:ascii="Times New Roman" w:hAnsi="Times New Roman" w:cs="Times New Roman"/>
+          <w:color w:val="2F5496" w:themeColor="accent1" w:themeShade="BF"/>
+          <w:sz w:val="24"/>
+          <w:szCs w:val="24"/>
+        </w:rPr>
+        <w:lastRenderedPageBreak/>
+        <w:drawing>
+          <wp:inline distT="0" distB="0" distL="0" distR="0" wp14:anchorId="66DEACD6" wp14:editId="7A8BC51F">
+            <wp:extent cx="5760720" cy="3788410"/>
+            <wp:effectExtent l="0" t="0" r="0" b="2540"/>
+            <wp:docPr id="29" name="Image 29"/>
+            <wp:cNvGraphicFramePr>
+              <a:graphicFrameLocks xmlns:a="http://schemas.openxmlformats.org/drawingml/2006/main" noChangeAspect="1"/>
+            </wp:cNvGraphicFramePr>
+            <a:graphic xmlns:a="http://schemas.openxmlformats.org/drawingml/2006/main">
+              <a:graphicData uri="http://schemas.openxmlformats.org/drawingml/2006/picture">
+                <pic:pic xmlns:pic="http://schemas.openxmlformats.org/drawingml/2006/picture">
+                  <pic:nvPicPr>
+                    <pic:cNvPr id="1" name=""/>
+                    <pic:cNvPicPr/>
+                  </pic:nvPicPr>
+                  <pic:blipFill>
+                    <a:blip r:embed="rId33"/>
+                    <a:stretch>
+                      <a:fillRect/>
+                    </a:stretch>
+                  </pic:blipFill>
+                  <pic:spPr>
+                    <a:xfrm>
+                      <a:off x="0" y="0"/>
+                      <a:ext cx="5760720" cy="3788410"/>
+                    </a:xfrm>
+                    <a:prstGeom prst="rect">
+                      <a:avLst/>
+                    </a:prstGeom>
+                  </pic:spPr>
+                </pic:pic>
+              </a:graphicData>
+            </a:graphic>
+          </wp:inline>
+        </w:drawing>
+      </w:r>
+    </w:p>
+    <w:p>
+      <w:pPr>
+        <w:spacing w:after="0"/>
+        <w:rPr>
+          <w:rFonts w:ascii="Times New Roman" w:hAnsi="Times New Roman" w:cs="Times New Roman"/>
+          <w:color w:val="2F5496" w:themeColor="accent1" w:themeShade="BF"/>
+          <w:sz w:val="24"/>
+          <w:szCs w:val="24"/>
+        </w:rPr>
+      </w:pPr>
+    </w:p>
+    <w:p>
+      <w:pPr>
+        <w:spacing w:after="0"/>
+        <w:rPr>
+          <w:rFonts w:ascii="Times New Roman" w:hAnsi="Times New Roman" w:cs="Times New Roman"/>
+          <w:color w:val="2F5496" w:themeColor="accent1" w:themeShade="BF"/>
+          <w:sz w:val="24"/>
+          <w:szCs w:val="24"/>
+        </w:rPr>
+      </w:pPr>
+      <w:r>
+        <w:rPr>
+          <w:rFonts w:ascii="Times New Roman" w:hAnsi="Times New Roman" w:cs="Times New Roman"/>
+          <w:color w:val="2F5496" w:themeColor="accent1" w:themeShade="BF"/>
+          <w:sz w:val="24"/>
+          <w:szCs w:val="24"/>
+        </w:rPr>
+        <w:drawing>
+          <wp:inline distT="0" distB="0" distL="0" distR="0" wp14:anchorId="1F3BE82E" wp14:editId="5ED879CA">
+            <wp:extent cx="5760720" cy="3907155"/>
+            <wp:effectExtent l="0" t="0" r="0" b="0"/>
+            <wp:docPr id="30" name="Image 30"/>
+            <wp:cNvGraphicFramePr>
+              <a:graphicFrameLocks xmlns:a="http://schemas.openxmlformats.org/drawingml/2006/main" noChangeAspect="1"/>
+            </wp:cNvGraphicFramePr>
+            <a:graphic xmlns:a="http://schemas.openxmlformats.org/drawingml/2006/main">
+              <a:graphicData uri="http://schemas.openxmlformats.org/drawingml/2006/picture">
+                <pic:pic xmlns:pic="http://schemas.openxmlformats.org/drawingml/2006/picture">
+                  <pic:nvPicPr>
+                    <pic:cNvPr id="1" name=""/>
+                    <pic:cNvPicPr/>
+                  </pic:nvPicPr>
+                  <pic:blipFill>
+                    <a:blip r:embed="rId34"/>
+                    <a:stretch>
+                      <a:fillRect/>
+                    </a:stretch>
+                  </pic:blipFill>
+                  <pic:spPr>
+                    <a:xfrm>
+                      <a:off x="0" y="0"/>
+                      <a:ext cx="5760720" cy="3907155"/>
+                    </a:xfrm>
+                    <a:prstGeom prst="rect">
+                      <a:avLst/>
+                    </a:prstGeom>
+                  </pic:spPr>
+                </pic:pic>
+              </a:graphicData>
+            </a:graphic>
+          </wp:inline>
+        </w:drawing>
+      </w:r>
+    </w:p>
+    <w:p>
+      <w:pPr>
+        <w:spacing w:after="0"/>
+        <w:rPr>
+          <w:rFonts w:ascii="Times New Roman" w:hAnsi="Times New Roman" w:cs="Times New Roman"/>
+          <w:color w:val="2F5496" w:themeColor="accent1" w:themeShade="BF"/>
+          <w:sz w:val="24"/>
+          <w:szCs w:val="24"/>
+        </w:rPr>
+      </w:pPr>
+    </w:p>
+    <w:p>
+      <w:pPr>
+        <w:spacing w:after="0"/>
+        <w:rPr>
+          <w:rFonts w:ascii="Times New Roman" w:hAnsi="Times New Roman" w:cs="Times New Roman"/>
+          <w:color w:val="2F5496" w:themeColor="accent1" w:themeShade="BF"/>
+          <w:sz w:val="24"/>
+          <w:szCs w:val="24"/>
+        </w:rPr>
+      </w:pPr>
+    </w:p>
+    <w:p>
+      <w:pPr>
+        <w:spacing w:after="0"/>
+        <w:rPr>
+          <w:rFonts w:ascii="Times New Roman" w:hAnsi="Times New Roman" w:cs="Times New Roman"/>
+          <w:color w:val="2F5496" w:themeColor="accent1" w:themeShade="BF"/>
+          <w:sz w:val="24"/>
+          <w:szCs w:val="24"/>
+        </w:rPr>
+      </w:pPr>
+    </w:p>
+    <w:p>
+      <w:pPr>
+        <w:spacing w:after="0"/>
+        <w:rPr>
+          <w:rFonts w:ascii="Times New Roman" w:hAnsi="Times New Roman" w:cs="Times New Roman"/>
+          <w:color w:val="2F5496" w:themeColor="accent1" w:themeShade="BF"/>
+          <w:sz w:val="24"/>
+          <w:szCs w:val="24"/>
+        </w:rPr>
+      </w:pPr>
+    </w:p>
+    <w:p>
+      <w:pPr>
+        <w:spacing w:after="0"/>
+        <w:rPr>
+          <w:rFonts w:ascii="Times New Roman" w:hAnsi="Times New Roman" w:cs="Times New Roman"/>
+          <w:color w:val="2F5496" w:themeColor="accent1" w:themeShade="BF"/>
+          <w:sz w:val="24"/>
+          <w:szCs w:val="24"/>
+        </w:rPr>
+      </w:pPr>
+      <w:r>
+        <w:rPr>
+          <w:rFonts w:ascii="Times New Roman" w:hAnsi="Times New Roman" w:cs="Times New Roman"/>
+          <w:color w:val="2F5496" w:themeColor="accent1" w:themeShade="BF"/>
+          <w:sz w:val="24"/>
+          <w:szCs w:val="24"/>
+        </w:rPr>
+        <w:drawing>
+          <wp:inline distT="0" distB="0" distL="0" distR="0" wp14:anchorId="02D83FC6" wp14:editId="03F7DDD9">
+            <wp:extent cx="5760720" cy="3410585"/>
+            <wp:effectExtent l="0" t="0" r="0" b="0"/>
+            <wp:docPr id="32" name="Image 32"/>
+            <wp:cNvGraphicFramePr>
+              <a:graphicFrameLocks xmlns:a="http://schemas.openxmlformats.org/drawingml/2006/main" noChangeAspect="1"/>
+            </wp:cNvGraphicFramePr>
+            <a:graphic xmlns:a="http://schemas.openxmlformats.org/drawingml/2006/main">
+              <a:graphicData uri="http://schemas.openxmlformats.org/drawingml/2006/picture">
+                <pic:pic xmlns:pic="http://schemas.openxmlformats.org/drawingml/2006/picture">
+                  <pic:nvPicPr>
+                    <pic:cNvPr id="1" name=""/>
+                    <pic:cNvPicPr/>
+                  </pic:nvPicPr>
+                  <pic:blipFill>
+                    <a:blip r:embed="rId35"/>
+                    <a:stretch>
+                      <a:fillRect/>
+                    </a:stretch>
+                  </pic:blipFill>
+                  <pic:spPr>
+                    <a:xfrm>
+                      <a:off x="0" y="0"/>
+                      <a:ext cx="5760720" cy="3410585"/>
+                    </a:xfrm>
+                    <a:prstGeom prst="rect">
+                      <a:avLst/>
+                    </a:prstGeom>
+                  </pic:spPr>
+                </pic:pic>
+              </a:graphicData>
+            </a:graphic>
+          </wp:inline>
+        </w:drawing>
+      </w:r>
+    </w:p>
+    <w:p>
+      <w:pPr>
+        <w:spacing w:after="0"/>
+        <w:rPr>
+          <w:rFonts w:ascii="Times New Roman" w:hAnsi="Times New Roman" w:cs="Times New Roman"/>
+          <w:color w:val="2F5496" w:themeColor="accent1" w:themeShade="BF"/>
+          <w:sz w:val="24"/>
+          <w:szCs w:val="24"/>
+        </w:rPr>
+      </w:pPr>
+    </w:p>
     <w:sectPr>
-      <w:headerReference w:type="default" r:id="rId32"/>
-      <w:footerReference w:type="default" r:id="rId33"/>
+      <w:headerReference w:type="default" r:id="rId36"/>
+      <w:footerReference w:type="default" r:id="rId37"/>
       <w:pgSz w:w="11906" w:h="16838"/>
       <w:pgMar w:top="1417" w:right="1417" w:bottom="1417" w:left="1417" w:header="708" w:footer="708" w:gutter="0"/>
       <w:pgBorders w:offsetFrom="page">
@@ -10818,6 +11595,155 @@
     </w:lvl>
   </w:abstractNum>
   <w:abstractNum w:abstractNumId="6" w15:restartNumberingAfterBreak="0">
+    <w:nsid w:val="29B3028B"/>
+    <w:multiLevelType w:val="multilevel"/>
+    <w:tmpl w:val="83C0BEE6"/>
+    <w:lvl w:ilvl="0">
+      <w:start w:val="1"/>
+      <w:numFmt w:val="bullet"/>
+      <w:lvlText w:val=""/>
+      <w:lvlJc w:val="left"/>
+      <w:pPr>
+        <w:tabs>
+          <w:tab w:val="num" w:pos="720"/>
+        </w:tabs>
+        <w:ind w:left="720" w:hanging="360"/>
+      </w:pPr>
+      <w:rPr>
+        <w:rFonts w:ascii="Symbol" w:hAnsi="Symbol" w:hint="default"/>
+        <w:sz w:val="20"/>
+      </w:rPr>
+    </w:lvl>
+    <w:lvl w:ilvl="1" w:tentative="1">
+      <w:start w:val="1"/>
+      <w:numFmt w:val="bullet"/>
+      <w:lvlText w:val="o"/>
+      <w:lvlJc w:val="left"/>
+      <w:pPr>
+        <w:tabs>
+          <w:tab w:val="num" w:pos="1440"/>
+        </w:tabs>
+        <w:ind w:left="1440" w:hanging="360"/>
+      </w:pPr>
+      <w:rPr>
+        <w:rFonts w:ascii="Courier New" w:hAnsi="Courier New" w:hint="default"/>
+        <w:sz w:val="20"/>
+      </w:rPr>
+    </w:lvl>
+    <w:lvl w:ilvl="2" w:tentative="1">
+      <w:start w:val="1"/>
+      <w:numFmt w:val="bullet"/>
+      <w:lvlText w:val=""/>
+      <w:lvlJc w:val="left"/>
+      <w:pPr>
+        <w:tabs>
+          <w:tab w:val="num" w:pos="2160"/>
+        </w:tabs>
+        <w:ind w:left="2160" w:hanging="360"/>
+      </w:pPr>
+      <w:rPr>
+        <w:rFonts w:ascii="Wingdings" w:hAnsi="Wingdings" w:hint="default"/>
+        <w:sz w:val="20"/>
+      </w:rPr>
+    </w:lvl>
+    <w:lvl w:ilvl="3" w:tentative="1">
+      <w:start w:val="1"/>
+      <w:numFmt w:val="bullet"/>
+      <w:lvlText w:val=""/>
+      <w:lvlJc w:val="left"/>
+      <w:pPr>
+        <w:tabs>
+          <w:tab w:val="num" w:pos="2880"/>
+        </w:tabs>
+        <w:ind w:left="2880" w:hanging="360"/>
+      </w:pPr>
+      <w:rPr>
+        <w:rFonts w:ascii="Wingdings" w:hAnsi="Wingdings" w:hint="default"/>
+        <w:sz w:val="20"/>
+      </w:rPr>
+    </w:lvl>
+    <w:lvl w:ilvl="4" w:tentative="1">
+      <w:start w:val="1"/>
+      <w:numFmt w:val="bullet"/>
+      <w:lvlText w:val=""/>
+      <w:lvlJc w:val="left"/>
+      <w:pPr>
+        <w:tabs>
+          <w:tab w:val="num" w:pos="3600"/>
+        </w:tabs>
+        <w:ind w:left="3600" w:hanging="360"/>
+      </w:pPr>
+      <w:rPr>
+        <w:rFonts w:ascii="Wingdings" w:hAnsi="Wingdings" w:hint="default"/>
+        <w:sz w:val="20"/>
+      </w:rPr>
+    </w:lvl>
+    <w:lvl w:ilvl="5" w:tentative="1">
+      <w:start w:val="1"/>
+      <w:numFmt w:val="bullet"/>
+      <w:lvlText w:val=""/>
+      <w:lvlJc w:val="left"/>
+      <w:pPr>
+        <w:tabs>
+          <w:tab w:val="num" w:pos="4320"/>
+        </w:tabs>
+        <w:ind w:left="4320" w:hanging="360"/>
+      </w:pPr>
+      <w:rPr>
+        <w:rFonts w:ascii="Wingdings" w:hAnsi="Wingdings" w:hint="default"/>
+        <w:sz w:val="20"/>
+      </w:rPr>
+    </w:lvl>
+    <w:lvl w:ilvl="6" w:tentative="1">
+      <w:start w:val="1"/>
+      <w:numFmt w:val="bullet"/>
+      <w:lvlText w:val=""/>
+      <w:lvlJc w:val="left"/>
+      <w:pPr>
+        <w:tabs>
+          <w:tab w:val="num" w:pos="5040"/>
+        </w:tabs>
+        <w:ind w:left="5040" w:hanging="360"/>
+      </w:pPr>
+      <w:rPr>
+        <w:rFonts w:ascii="Wingdings" w:hAnsi="Wingdings" w:hint="default"/>
+        <w:sz w:val="20"/>
+      </w:rPr>
+    </w:lvl>
+    <w:lvl w:ilvl="7" w:tentative="1">
+      <w:start w:val="1"/>
+      <w:numFmt w:val="bullet"/>
+      <w:lvlText w:val=""/>
+      <w:lvlJc w:val="left"/>
+      <w:pPr>
+        <w:tabs>
+          <w:tab w:val="num" w:pos="5760"/>
+        </w:tabs>
+        <w:ind w:left="5760" w:hanging="360"/>
+      </w:pPr>
+      <w:rPr>
+        <w:rFonts w:ascii="Wingdings" w:hAnsi="Wingdings" w:hint="default"/>
+        <w:sz w:val="20"/>
+      </w:rPr>
+    </w:lvl>
+    <w:lvl w:ilvl="8" w:tentative="1">
+      <w:start w:val="1"/>
+      <w:numFmt w:val="bullet"/>
+      <w:lvlText w:val=""/>
+      <w:lvlJc w:val="left"/>
+      <w:pPr>
+        <w:tabs>
+          <w:tab w:val="num" w:pos="6480"/>
+        </w:tabs>
+        <w:ind w:left="6480" w:hanging="360"/>
+      </w:pPr>
+      <w:rPr>
+        <w:rFonts w:ascii="Wingdings" w:hAnsi="Wingdings" w:hint="default"/>
+        <w:sz w:val="20"/>
+      </w:rPr>
+    </w:lvl>
+  </w:abstractNum>
+  <w:abstractNum w:abstractNumId="7" w15:restartNumberingAfterBreak="0">
     <w:nsid w:val="2C003D88"/>
     <w:multiLevelType w:val="multilevel"/>
     <w:tmpl w:val="A948D544"/>
@@ -10966,7 +11892,7 @@
       </w:rPr>
     </w:lvl>
   </w:abstractNum>
-  <w:abstractNum w:abstractNumId="7" w15:restartNumberingAfterBreak="0">
+  <w:abstractNum w:abstractNumId="8" w15:restartNumberingAfterBreak="0">
     <w:nsid w:val="30817C99"/>
     <w:multiLevelType w:val="hybridMultilevel"/>
     <w:tmpl w:val="B28054F4"/>
@@ -11052,7 +11978,7 @@
       </w:pPr>
     </w:lvl>
   </w:abstractNum>
-  <w:abstractNum w:abstractNumId="8" w15:restartNumberingAfterBreak="0">
+  <w:abstractNum w:abstractNumId="9" w15:restartNumberingAfterBreak="0">
     <w:nsid w:val="32024712"/>
     <w:multiLevelType w:val="multilevel"/>
     <w:tmpl w:val="7716EFCE"/>
@@ -11201,7 +12127,7 @@
       </w:rPr>
     </w:lvl>
   </w:abstractNum>
-  <w:abstractNum w:abstractNumId="9" w15:restartNumberingAfterBreak="0">
+  <w:abstractNum w:abstractNumId="10" w15:restartNumberingAfterBreak="0">
     <w:nsid w:val="3A273CBD"/>
     <w:multiLevelType w:val="multilevel"/>
     <w:tmpl w:val="A5564738"/>
@@ -11350,7 +12276,7 @@
       </w:rPr>
     </w:lvl>
   </w:abstractNum>
-  <w:abstractNum w:abstractNumId="10" w15:restartNumberingAfterBreak="0">
+  <w:abstractNum w:abstractNumId="11" w15:restartNumberingAfterBreak="0">
     <w:nsid w:val="3CA24848"/>
     <w:multiLevelType w:val="hybridMultilevel"/>
     <w:tmpl w:val="76B802A4"/>
@@ -11463,7 +12389,7 @@
       </w:rPr>
     </w:lvl>
   </w:abstractNum>
-  <w:abstractNum w:abstractNumId="11" w15:restartNumberingAfterBreak="0">
+  <w:abstractNum w:abstractNumId="12" w15:restartNumberingAfterBreak="0">
     <w:nsid w:val="4996411C"/>
     <w:multiLevelType w:val="multilevel"/>
     <w:tmpl w:val="218091C0"/>
@@ -11580,7 +12506,7 @@
       </w:pPr>
     </w:lvl>
   </w:abstractNum>
-  <w:abstractNum w:abstractNumId="12" w15:restartNumberingAfterBreak="0">
+  <w:abstractNum w:abstractNumId="13" w15:restartNumberingAfterBreak="0">
     <w:nsid w:val="4F9D0AB4"/>
     <w:multiLevelType w:val="multilevel"/>
     <w:tmpl w:val="839C6E34"/>
@@ -11729,7 +12655,7 @@
       </w:rPr>
     </w:lvl>
   </w:abstractNum>
-  <w:abstractNum w:abstractNumId="13" w15:restartNumberingAfterBreak="0">
+  <w:abstractNum w:abstractNumId="14" w15:restartNumberingAfterBreak="0">
     <w:nsid w:val="56D568C8"/>
     <w:multiLevelType w:val="multilevel"/>
     <w:tmpl w:val="3392CAD2"/>
@@ -11878,7 +12804,7 @@
       </w:rPr>
     </w:lvl>
   </w:abstractNum>
-  <w:abstractNum w:abstractNumId="14" w15:restartNumberingAfterBreak="0">
+  <w:abstractNum w:abstractNumId="15" w15:restartNumberingAfterBreak="0">
     <w:nsid w:val="61053792"/>
     <w:multiLevelType w:val="multilevel"/>
     <w:tmpl w:val="49E43BFC"/>
@@ -12027,7 +12953,7 @@
       </w:rPr>
     </w:lvl>
   </w:abstractNum>
-  <w:abstractNum w:abstractNumId="15" w15:restartNumberingAfterBreak="0">
+  <w:abstractNum w:abstractNumId="16" w15:restartNumberingAfterBreak="0">
     <w:nsid w:val="6DA36487"/>
     <w:multiLevelType w:val="multilevel"/>
     <w:tmpl w:val="9C4C8532"/>
@@ -12176,7 +13102,7 @@
       </w:rPr>
     </w:lvl>
   </w:abstractNum>
-  <w:abstractNum w:abstractNumId="16" w15:restartNumberingAfterBreak="0">
+  <w:abstractNum w:abstractNumId="17" w15:restartNumberingAfterBreak="0">
     <w:nsid w:val="6EB85EAA"/>
     <w:multiLevelType w:val="hybridMultilevel"/>
     <w:tmpl w:val="DB76C824"/>
@@ -12290,34 +13216,34 @@
     </w:lvl>
   </w:abstractNum>
   <w:num w:numId="1">
-    <w:abstractNumId w:val="16"/>
+    <w:abstractNumId w:val="17"/>
   </w:num>
   <w:num w:numId="2">
-    <w:abstractNumId w:val="10"/>
+    <w:abstractNumId w:val="11"/>
   </w:num>
   <w:num w:numId="3">
-    <w:abstractNumId w:val="13"/>
+    <w:abstractNumId w:val="14"/>
   </w:num>
   <w:num w:numId="4">
+    <w:abstractNumId w:val="9"/>
+  </w:num>
+  <w:num w:numId="5">
     <w:abstractNumId w:val="8"/>
   </w:num>
-  <w:num w:numId="5">
-    <w:abstractNumId w:val="7"/>
-  </w:num>
   <w:num w:numId="6">
-    <w:abstractNumId w:val="14"/>
+    <w:abstractNumId w:val="15"/>
   </w:num>
   <w:num w:numId="7">
     <w:abstractNumId w:val="5"/>
   </w:num>
   <w:num w:numId="8">
-    <w:abstractNumId w:val="15"/>
+    <w:abstractNumId w:val="16"/>
   </w:num>
   <w:num w:numId="9">
     <w:abstractNumId w:val="2"/>
   </w:num>
   <w:num w:numId="10">
-    <w:abstractNumId w:val="11"/>
+    <w:abstractNumId w:val="12"/>
   </w:num>
   <w:num w:numId="11">
     <w:abstractNumId w:val="3"/>
@@ -12326,18 +13252,21 @@
     <w:abstractNumId w:val="0"/>
   </w:num>
   <w:num w:numId="13">
-    <w:abstractNumId w:val="12"/>
+    <w:abstractNumId w:val="13"/>
   </w:num>
   <w:num w:numId="14">
     <w:abstractNumId w:val="1"/>
   </w:num>
   <w:num w:numId="15">
-    <w:abstractNumId w:val="9"/>
+    <w:abstractNumId w:val="10"/>
   </w:num>
   <w:num w:numId="16">
     <w:abstractNumId w:val="4"/>
   </w:num>
   <w:num w:numId="17">
+    <w:abstractNumId w:val="7"/>
+  </w:num>
+  <w:num w:numId="18">
     <w:abstractNumId w:val="6"/>
   </w:num>
 </w:numbering>

</xml_diff>

<commit_message>
Créer un prompt permettant, à partir du dataset des capteurs, de proposer plusieurs modèles adaptés à la prédiction de la consommation énergétique d'un bâtiment.
</commit_message>
<xml_diff>
--- a/Atelier Prompt.docx
+++ b/Atelier Prompt.docx
@@ -10390,9 +10390,922 @@
         </w:rPr>
       </w:pPr>
     </w:p>
+    <w:p>
+      <w:pPr>
+        <w:spacing w:after="0"/>
+        <w:rPr>
+          <w:rFonts w:ascii="Times New Roman" w:hAnsi="Times New Roman" w:cs="Times New Roman"/>
+          <w:color w:val="2F5496" w:themeColor="accent1" w:themeShade="BF"/>
+          <w:sz w:val="24"/>
+          <w:szCs w:val="24"/>
+        </w:rPr>
+      </w:pPr>
+    </w:p>
+    <w:p>
+      <w:pPr>
+        <w:spacing w:after="0"/>
+        <w:rPr>
+          <w:rFonts w:ascii="Times New Roman" w:hAnsi="Times New Roman" w:cs="Times New Roman"/>
+          <w:color w:val="2F5496" w:themeColor="accent1" w:themeShade="BF"/>
+          <w:sz w:val="24"/>
+          <w:szCs w:val="24"/>
+        </w:rPr>
+      </w:pPr>
+    </w:p>
+    <w:p>
+      <w:pPr>
+        <w:autoSpaceDE w:val="0"/>
+        <w:autoSpaceDN w:val="0"/>
+        <w:adjustRightInd w:val="0"/>
+        <w:spacing w:after="0" w:line="240" w:lineRule="auto"/>
+        <w:rPr>
+          <w:rFonts w:ascii="CIDFont+F1" w:hAnsi="CIDFont+F1" w:cs="CIDFont+F1"/>
+          <w:kern w:val="0"/>
+          <w:sz w:val="21"/>
+          <w:szCs w:val="21"/>
+        </w:rPr>
+      </w:pPr>
+      <w:r>
+        <w:rPr>
+          <w:rFonts w:ascii="CIDFont+F1" w:hAnsi="CIDFont+F1" w:cs="CIDFont+F1"/>
+          <w:kern w:val="0"/>
+          <w:sz w:val="21"/>
+          <w:szCs w:val="21"/>
+        </w:rPr>
+        <w:t>3) Créer un prompt permettant, à partir du dataset des capteurs, de proposer plusieurs</w:t>
+      </w:r>
+    </w:p>
+    <w:p>
+      <w:pPr>
+        <w:autoSpaceDE w:val="0"/>
+        <w:autoSpaceDN w:val="0"/>
+        <w:adjustRightInd w:val="0"/>
+        <w:spacing w:after="0" w:line="240" w:lineRule="auto"/>
+        <w:rPr>
+          <w:rFonts w:ascii="CIDFont+F1" w:hAnsi="CIDFont+F1" w:cs="CIDFont+F1"/>
+          <w:kern w:val="0"/>
+          <w:sz w:val="21"/>
+          <w:szCs w:val="21"/>
+        </w:rPr>
+      </w:pPr>
+      <w:r>
+        <w:rPr>
+          <w:rFonts w:ascii="CIDFont+F1" w:hAnsi="CIDFont+F1" w:cs="CIDFont+F1"/>
+          <w:kern w:val="0"/>
+          <w:sz w:val="21"/>
+          <w:szCs w:val="21"/>
+        </w:rPr>
+        <w:t>modèles adaptés à la prédiction de la consommation énergétique d'un bâtiment. Pour</w:t>
+      </w:r>
+    </w:p>
+    <w:p>
+      <w:pPr>
+        <w:autoSpaceDE w:val="0"/>
+        <w:autoSpaceDN w:val="0"/>
+        <w:adjustRightInd w:val="0"/>
+        <w:spacing w:after="0" w:line="240" w:lineRule="auto"/>
+        <w:rPr>
+          <w:rFonts w:ascii="CIDFont+F1" w:hAnsi="CIDFont+F1" w:cs="CIDFont+F1"/>
+          <w:kern w:val="0"/>
+          <w:sz w:val="21"/>
+          <w:szCs w:val="21"/>
+        </w:rPr>
+      </w:pPr>
+      <w:r>
+        <w:rPr>
+          <w:rFonts w:ascii="CIDFont+F1" w:hAnsi="CIDFont+F1" w:cs="CIDFont+F1"/>
+          <w:kern w:val="0"/>
+          <w:sz w:val="21"/>
+          <w:szCs w:val="21"/>
+        </w:rPr>
+        <w:t>chaque modèle, le LLM doit indiquer le principe, les avantages, les limites, le type de</w:t>
+      </w:r>
+    </w:p>
+    <w:p>
+      <w:pPr>
+        <w:spacing w:after="0"/>
+        <w:rPr>
+          <w:rFonts w:ascii="CIDFont+F1" w:hAnsi="CIDFont+F1" w:cs="CIDFont+F1"/>
+          <w:kern w:val="0"/>
+          <w:sz w:val="21"/>
+          <w:szCs w:val="21"/>
+        </w:rPr>
+      </w:pPr>
+      <w:r>
+        <w:rPr>
+          <w:rFonts w:ascii="CIDFont+F1" w:hAnsi="CIDFont+F1" w:cs="CIDFont+F1"/>
+          <w:kern w:val="0"/>
+          <w:sz w:val="21"/>
+          <w:szCs w:val="21"/>
+        </w:rPr>
+        <w:t>problème et les métriques pertinentes.</w:t>
+      </w:r>
+    </w:p>
+    <w:p>
+      <w:pPr>
+        <w:spacing w:after="0"/>
+        <w:rPr>
+          <w:rFonts w:ascii="Times New Roman" w:hAnsi="Times New Roman" w:cs="Times New Roman"/>
+          <w:color w:val="2F5496" w:themeColor="accent1" w:themeShade="BF"/>
+          <w:sz w:val="24"/>
+          <w:szCs w:val="24"/>
+        </w:rPr>
+      </w:pPr>
+    </w:p>
+    <w:p>
+      <w:pPr>
+        <w:spacing w:after="0" w:line="240" w:lineRule="auto"/>
+        <w:ind w:left="708"/>
+        <w:rPr>
+          <w:rFonts w:ascii="Times New Roman" w:eastAsia="Times New Roman" w:hAnsi="Times New Roman" w:cs="Times New Roman"/>
+          <w:color w:val="2F5496" w:themeColor="accent1" w:themeShade="BF"/>
+          <w:kern w:val="0"/>
+          <w:sz w:val="24"/>
+          <w:szCs w:val="24"/>
+          <w:lang w:eastAsia="fr-FR"/>
+          <w14:ligatures w14:val="none"/>
+        </w:rPr>
+      </w:pPr>
+      <w:r>
+        <w:rPr>
+          <w:rFonts w:ascii="Times New Roman" w:eastAsia="Times New Roman" w:hAnsi="Times New Roman" w:cs="Times New Roman"/>
+          <w:color w:val="2F5496" w:themeColor="accent1" w:themeShade="BF"/>
+          <w:kern w:val="0"/>
+          <w:sz w:val="24"/>
+          <w:szCs w:val="24"/>
+          <w:lang w:eastAsia="fr-FR"/>
+          <w14:ligatures w14:val="none"/>
+        </w:rPr>
+        <w:t>Tu es un expert en Data Science et en Machine Learning.</w:t>
+      </w:r>
+    </w:p>
+    <w:p>
+      <w:pPr>
+        <w:spacing w:after="0" w:line="240" w:lineRule="auto"/>
+        <w:ind w:left="708"/>
+        <w:rPr>
+          <w:rFonts w:ascii="Times New Roman" w:eastAsia="Times New Roman" w:hAnsi="Times New Roman" w:cs="Times New Roman"/>
+          <w:color w:val="2F5496" w:themeColor="accent1" w:themeShade="BF"/>
+          <w:kern w:val="0"/>
+          <w:sz w:val="24"/>
+          <w:szCs w:val="24"/>
+          <w:lang w:eastAsia="fr-FR"/>
+          <w14:ligatures w14:val="none"/>
+        </w:rPr>
+      </w:pPr>
+      <w:r>
+        <w:rPr>
+          <w:rFonts w:ascii="Times New Roman" w:eastAsia="Times New Roman" w:hAnsi="Times New Roman" w:cs="Times New Roman"/>
+          <w:color w:val="2F5496" w:themeColor="accent1" w:themeShade="BF"/>
+          <w:kern w:val="0"/>
+          <w:sz w:val="24"/>
+          <w:szCs w:val="24"/>
+          <w:lang w:eastAsia="fr-FR"/>
+          <w14:ligatures w14:val="none"/>
+        </w:rPr>
+        <w:t>À partir du dataset des capteurs, propose plusieurs modèles de Machine Learning adaptés à la prédiction de la consommation énergétique d'un bâtiment.</w:t>
+      </w:r>
+    </w:p>
+    <w:p>
+      <w:pPr>
+        <w:spacing w:after="0" w:line="240" w:lineRule="auto"/>
+        <w:ind w:left="708"/>
+        <w:rPr>
+          <w:rFonts w:ascii="Times New Roman" w:eastAsia="Times New Roman" w:hAnsi="Times New Roman" w:cs="Times New Roman"/>
+          <w:color w:val="2F5496" w:themeColor="accent1" w:themeShade="BF"/>
+          <w:kern w:val="0"/>
+          <w:sz w:val="24"/>
+          <w:szCs w:val="24"/>
+          <w:lang w:eastAsia="fr-FR"/>
+          <w14:ligatures w14:val="none"/>
+        </w:rPr>
+      </w:pPr>
+      <w:r>
+        <w:rPr>
+          <w:rFonts w:ascii="Times New Roman" w:eastAsia="Times New Roman" w:hAnsi="Times New Roman" w:cs="Times New Roman"/>
+          <w:color w:val="2F5496" w:themeColor="accent1" w:themeShade="BF"/>
+          <w:kern w:val="0"/>
+          <w:sz w:val="24"/>
+          <w:szCs w:val="24"/>
+          <w:lang w:eastAsia="fr-FR"/>
+          <w14:ligatures w14:val="none"/>
+        </w:rPr>
+        <w:t>Pour chaque modèle, indique :</w:t>
+      </w:r>
+    </w:p>
+    <w:p>
+      <w:pPr>
+        <w:numPr>
+          <w:ilvl w:val="0"/>
+          <w:numId w:val="19"/>
+        </w:numPr>
+        <w:tabs>
+          <w:tab w:val="clear" w:pos="720"/>
+          <w:tab w:val="num" w:pos="1428"/>
+        </w:tabs>
+        <w:spacing w:after="0" w:line="240" w:lineRule="auto"/>
+        <w:ind w:left="1428"/>
+        <w:rPr>
+          <w:rFonts w:ascii="Times New Roman" w:eastAsia="Times New Roman" w:hAnsi="Times New Roman" w:cs="Times New Roman"/>
+          <w:color w:val="2F5496" w:themeColor="accent1" w:themeShade="BF"/>
+          <w:kern w:val="0"/>
+          <w:sz w:val="24"/>
+          <w:szCs w:val="24"/>
+          <w:lang w:eastAsia="fr-FR"/>
+          <w14:ligatures w14:val="none"/>
+        </w:rPr>
+      </w:pPr>
+      <w:r>
+        <w:rPr>
+          <w:rFonts w:ascii="Times New Roman" w:eastAsia="Times New Roman" w:hAnsi="Times New Roman" w:cs="Times New Roman"/>
+          <w:color w:val="2F5496" w:themeColor="accent1" w:themeShade="BF"/>
+          <w:kern w:val="0"/>
+          <w:sz w:val="24"/>
+          <w:szCs w:val="24"/>
+          <w:lang w:eastAsia="fr-FR"/>
+          <w14:ligatures w14:val="none"/>
+        </w:rPr>
+        <w:t>le principe de fonctionnement ;</w:t>
+      </w:r>
+    </w:p>
+    <w:p>
+      <w:pPr>
+        <w:numPr>
+          <w:ilvl w:val="0"/>
+          <w:numId w:val="19"/>
+        </w:numPr>
+        <w:tabs>
+          <w:tab w:val="clear" w:pos="720"/>
+          <w:tab w:val="num" w:pos="1428"/>
+        </w:tabs>
+        <w:spacing w:after="0" w:line="240" w:lineRule="auto"/>
+        <w:ind w:left="1428"/>
+        <w:rPr>
+          <w:rFonts w:ascii="Times New Roman" w:eastAsia="Times New Roman" w:hAnsi="Times New Roman" w:cs="Times New Roman"/>
+          <w:color w:val="2F5496" w:themeColor="accent1" w:themeShade="BF"/>
+          <w:kern w:val="0"/>
+          <w:sz w:val="24"/>
+          <w:szCs w:val="24"/>
+          <w:lang w:eastAsia="fr-FR"/>
+          <w14:ligatures w14:val="none"/>
+        </w:rPr>
+      </w:pPr>
+      <w:r>
+        <w:rPr>
+          <w:rFonts w:ascii="Times New Roman" w:eastAsia="Times New Roman" w:hAnsi="Times New Roman" w:cs="Times New Roman"/>
+          <w:color w:val="2F5496" w:themeColor="accent1" w:themeShade="BF"/>
+          <w:kern w:val="0"/>
+          <w:sz w:val="24"/>
+          <w:szCs w:val="24"/>
+          <w:lang w:eastAsia="fr-FR"/>
+          <w14:ligatures w14:val="none"/>
+        </w:rPr>
+        <w:t>les avantages ;</w:t>
+      </w:r>
+    </w:p>
+    <w:p>
+      <w:pPr>
+        <w:numPr>
+          <w:ilvl w:val="0"/>
+          <w:numId w:val="19"/>
+        </w:numPr>
+        <w:tabs>
+          <w:tab w:val="clear" w:pos="720"/>
+          <w:tab w:val="num" w:pos="1428"/>
+        </w:tabs>
+        <w:spacing w:after="0" w:line="240" w:lineRule="auto"/>
+        <w:ind w:left="1428"/>
+        <w:rPr>
+          <w:rFonts w:ascii="Times New Roman" w:eastAsia="Times New Roman" w:hAnsi="Times New Roman" w:cs="Times New Roman"/>
+          <w:color w:val="2F5496" w:themeColor="accent1" w:themeShade="BF"/>
+          <w:kern w:val="0"/>
+          <w:sz w:val="24"/>
+          <w:szCs w:val="24"/>
+          <w:lang w:eastAsia="fr-FR"/>
+          <w14:ligatures w14:val="none"/>
+        </w:rPr>
+      </w:pPr>
+      <w:r>
+        <w:rPr>
+          <w:rFonts w:ascii="Times New Roman" w:eastAsia="Times New Roman" w:hAnsi="Times New Roman" w:cs="Times New Roman"/>
+          <w:color w:val="2F5496" w:themeColor="accent1" w:themeShade="BF"/>
+          <w:kern w:val="0"/>
+          <w:sz w:val="24"/>
+          <w:szCs w:val="24"/>
+          <w:lang w:eastAsia="fr-FR"/>
+          <w14:ligatures w14:val="none"/>
+        </w:rPr>
+        <w:t>les limites ;</w:t>
+      </w:r>
+    </w:p>
+    <w:p>
+      <w:pPr>
+        <w:numPr>
+          <w:ilvl w:val="0"/>
+          <w:numId w:val="19"/>
+        </w:numPr>
+        <w:tabs>
+          <w:tab w:val="clear" w:pos="720"/>
+          <w:tab w:val="num" w:pos="1428"/>
+        </w:tabs>
+        <w:spacing w:after="0" w:line="240" w:lineRule="auto"/>
+        <w:ind w:left="1428"/>
+        <w:rPr>
+          <w:rFonts w:ascii="Times New Roman" w:eastAsia="Times New Roman" w:hAnsi="Times New Roman" w:cs="Times New Roman"/>
+          <w:color w:val="2F5496" w:themeColor="accent1" w:themeShade="BF"/>
+          <w:kern w:val="0"/>
+          <w:sz w:val="24"/>
+          <w:szCs w:val="24"/>
+          <w:lang w:eastAsia="fr-FR"/>
+          <w14:ligatures w14:val="none"/>
+        </w:rPr>
+      </w:pPr>
+      <w:r>
+        <w:rPr>
+          <w:rFonts w:ascii="Times New Roman" w:eastAsia="Times New Roman" w:hAnsi="Times New Roman" w:cs="Times New Roman"/>
+          <w:color w:val="2F5496" w:themeColor="accent1" w:themeShade="BF"/>
+          <w:kern w:val="0"/>
+          <w:sz w:val="24"/>
+          <w:szCs w:val="24"/>
+          <w:lang w:eastAsia="fr-FR"/>
+          <w14:ligatures w14:val="none"/>
+        </w:rPr>
+        <w:t>le type de problème traité ;</w:t>
+      </w:r>
+    </w:p>
+    <w:p>
+      <w:pPr>
+        <w:numPr>
+          <w:ilvl w:val="0"/>
+          <w:numId w:val="19"/>
+        </w:numPr>
+        <w:tabs>
+          <w:tab w:val="clear" w:pos="720"/>
+          <w:tab w:val="num" w:pos="1428"/>
+        </w:tabs>
+        <w:spacing w:after="0" w:line="240" w:lineRule="auto"/>
+        <w:ind w:left="1428"/>
+        <w:rPr>
+          <w:rFonts w:ascii="Times New Roman" w:eastAsia="Times New Roman" w:hAnsi="Times New Roman" w:cs="Times New Roman"/>
+          <w:color w:val="2F5496" w:themeColor="accent1" w:themeShade="BF"/>
+          <w:kern w:val="0"/>
+          <w:sz w:val="24"/>
+          <w:szCs w:val="24"/>
+          <w:lang w:eastAsia="fr-FR"/>
+          <w14:ligatures w14:val="none"/>
+        </w:rPr>
+      </w:pPr>
+      <w:r>
+        <w:rPr>
+          <w:rFonts w:ascii="Times New Roman" w:eastAsia="Times New Roman" w:hAnsi="Times New Roman" w:cs="Times New Roman"/>
+          <w:color w:val="2F5496" w:themeColor="accent1" w:themeShade="BF"/>
+          <w:kern w:val="0"/>
+          <w:sz w:val="24"/>
+          <w:szCs w:val="24"/>
+          <w:lang w:eastAsia="fr-FR"/>
+          <w14:ligatures w14:val="none"/>
+        </w:rPr>
+        <w:t>les métriques pertinentes pour évaluer le modèle.</w:t>
+      </w:r>
+    </w:p>
+    <w:p>
+      <w:pPr>
+        <w:spacing w:after="0" w:line="240" w:lineRule="auto"/>
+        <w:ind w:left="708"/>
+        <w:rPr>
+          <w:rFonts w:ascii="Times New Roman" w:eastAsia="Times New Roman" w:hAnsi="Times New Roman" w:cs="Times New Roman"/>
+          <w:color w:val="2F5496" w:themeColor="accent1" w:themeShade="BF"/>
+          <w:kern w:val="0"/>
+          <w:sz w:val="24"/>
+          <w:szCs w:val="24"/>
+          <w:lang w:eastAsia="fr-FR"/>
+          <w14:ligatures w14:val="none"/>
+        </w:rPr>
+      </w:pPr>
+      <w:r>
+        <w:rPr>
+          <w:rFonts w:ascii="Times New Roman" w:eastAsia="Times New Roman" w:hAnsi="Times New Roman" w:cs="Times New Roman"/>
+          <w:color w:val="2F5496" w:themeColor="accent1" w:themeShade="BF"/>
+          <w:kern w:val="0"/>
+          <w:sz w:val="24"/>
+          <w:szCs w:val="24"/>
+          <w:lang w:eastAsia="fr-FR"/>
+          <w14:ligatures w14:val="none"/>
+        </w:rPr>
+        <w:t>Base-toi uniquement sur les variables présentes dans le dataset et n'invente aucune variable.</w:t>
+      </w:r>
+    </w:p>
+    <w:p>
+      <w:pPr>
+        <w:spacing w:after="0" w:line="240" w:lineRule="auto"/>
+        <w:ind w:left="708"/>
+        <w:rPr>
+          <w:rFonts w:ascii="Times New Roman" w:eastAsia="Times New Roman" w:hAnsi="Times New Roman" w:cs="Times New Roman"/>
+          <w:color w:val="2F5496" w:themeColor="accent1" w:themeShade="BF"/>
+          <w:kern w:val="0"/>
+          <w:sz w:val="24"/>
+          <w:szCs w:val="24"/>
+          <w:lang w:eastAsia="fr-FR"/>
+          <w14:ligatures w14:val="none"/>
+        </w:rPr>
+      </w:pPr>
+      <w:r>
+        <w:rPr>
+          <w:rFonts w:ascii="Times New Roman" w:eastAsia="Times New Roman" w:hAnsi="Times New Roman" w:cs="Times New Roman"/>
+          <w:color w:val="2F5496" w:themeColor="accent1" w:themeShade="BF"/>
+          <w:kern w:val="0"/>
+          <w:sz w:val="24"/>
+          <w:szCs w:val="24"/>
+          <w:lang w:eastAsia="fr-FR"/>
+          <w14:ligatures w14:val="none"/>
+        </w:rPr>
+        <w:t>Présente les résultats sous forme de tableau avec les colonnes suivantes :</w:t>
+      </w:r>
+      <w:r>
+        <w:rPr>
+          <w:rFonts w:ascii="Times New Roman" w:eastAsia="Times New Roman" w:hAnsi="Times New Roman" w:cs="Times New Roman"/>
+          <w:color w:val="2F5496" w:themeColor="accent1" w:themeShade="BF"/>
+          <w:kern w:val="0"/>
+          <w:sz w:val="24"/>
+          <w:szCs w:val="24"/>
+          <w:lang w:eastAsia="fr-FR"/>
+          <w14:ligatures w14:val="none"/>
+        </w:rPr>
+        <w:t xml:space="preserve"> </w:t>
+      </w:r>
+      <w:r>
+        <w:rPr>
+          <w:rFonts w:ascii="Times New Roman" w:eastAsia="Times New Roman" w:hAnsi="Times New Roman" w:cs="Times New Roman"/>
+          <w:color w:val="2F5496" w:themeColor="accent1" w:themeShade="BF"/>
+          <w:kern w:val="0"/>
+          <w:sz w:val="24"/>
+          <w:szCs w:val="24"/>
+          <w:lang w:eastAsia="fr-FR"/>
+          <w14:ligatures w14:val="none"/>
+        </w:rPr>
+        <w:t>Modèl</w:t>
+      </w:r>
+      <w:r>
+        <w:rPr>
+          <w:rFonts w:ascii="Times New Roman" w:eastAsia="Times New Roman" w:hAnsi="Times New Roman" w:cs="Times New Roman"/>
+          <w:color w:val="2F5496" w:themeColor="accent1" w:themeShade="BF"/>
+          <w:kern w:val="0"/>
+          <w:sz w:val="24"/>
+          <w:szCs w:val="24"/>
+          <w:lang w:eastAsia="fr-FR"/>
+          <w14:ligatures w14:val="none"/>
+        </w:rPr>
+        <w:t>e,</w:t>
+      </w:r>
+      <w:r>
+        <w:rPr>
+          <w:rFonts w:ascii="Times New Roman" w:eastAsia="Times New Roman" w:hAnsi="Times New Roman" w:cs="Times New Roman"/>
+          <w:color w:val="2F5496" w:themeColor="accent1" w:themeShade="BF"/>
+          <w:kern w:val="0"/>
+          <w:sz w:val="24"/>
+          <w:szCs w:val="24"/>
+          <w:lang w:eastAsia="fr-FR"/>
+          <w14:ligatures w14:val="none"/>
+        </w:rPr>
+        <w:t xml:space="preserve"> Principe</w:t>
+      </w:r>
+      <w:r>
+        <w:rPr>
+          <w:rFonts w:ascii="Times New Roman" w:eastAsia="Times New Roman" w:hAnsi="Times New Roman" w:cs="Times New Roman"/>
+          <w:color w:val="2F5496" w:themeColor="accent1" w:themeShade="BF"/>
+          <w:kern w:val="0"/>
+          <w:sz w:val="24"/>
+          <w:szCs w:val="24"/>
+          <w:lang w:eastAsia="fr-FR"/>
+          <w14:ligatures w14:val="none"/>
+        </w:rPr>
+        <w:t>,</w:t>
+      </w:r>
+      <w:r>
+        <w:rPr>
+          <w:rFonts w:ascii="Times New Roman" w:eastAsia="Times New Roman" w:hAnsi="Times New Roman" w:cs="Times New Roman"/>
+          <w:color w:val="2F5496" w:themeColor="accent1" w:themeShade="BF"/>
+          <w:kern w:val="0"/>
+          <w:sz w:val="24"/>
+          <w:szCs w:val="24"/>
+          <w:lang w:eastAsia="fr-FR"/>
+          <w14:ligatures w14:val="none"/>
+        </w:rPr>
+        <w:t xml:space="preserve"> Avantage</w:t>
+      </w:r>
+      <w:r>
+        <w:rPr>
+          <w:rFonts w:ascii="Times New Roman" w:eastAsia="Times New Roman" w:hAnsi="Times New Roman" w:cs="Times New Roman"/>
+          <w:color w:val="2F5496" w:themeColor="accent1" w:themeShade="BF"/>
+          <w:kern w:val="0"/>
+          <w:sz w:val="24"/>
+          <w:szCs w:val="24"/>
+          <w:lang w:eastAsia="fr-FR"/>
+          <w14:ligatures w14:val="none"/>
+        </w:rPr>
+        <w:t>s,</w:t>
+      </w:r>
+      <w:r>
+        <w:rPr>
+          <w:rFonts w:ascii="Times New Roman" w:eastAsia="Times New Roman" w:hAnsi="Times New Roman" w:cs="Times New Roman"/>
+          <w:color w:val="2F5496" w:themeColor="accent1" w:themeShade="BF"/>
+          <w:kern w:val="0"/>
+          <w:sz w:val="24"/>
+          <w:szCs w:val="24"/>
+          <w:lang w:eastAsia="fr-FR"/>
+          <w14:ligatures w14:val="none"/>
+        </w:rPr>
+        <w:t xml:space="preserve"> Limites</w:t>
+      </w:r>
+      <w:r>
+        <w:rPr>
+          <w:rFonts w:ascii="Times New Roman" w:eastAsia="Times New Roman" w:hAnsi="Times New Roman" w:cs="Times New Roman"/>
+          <w:color w:val="2F5496" w:themeColor="accent1" w:themeShade="BF"/>
+          <w:kern w:val="0"/>
+          <w:sz w:val="24"/>
+          <w:szCs w:val="24"/>
+          <w:lang w:eastAsia="fr-FR"/>
+          <w14:ligatures w14:val="none"/>
+        </w:rPr>
+        <w:t>,</w:t>
+      </w:r>
+      <w:r>
+        <w:rPr>
+          <w:rFonts w:ascii="Times New Roman" w:eastAsia="Times New Roman" w:hAnsi="Times New Roman" w:cs="Times New Roman"/>
+          <w:color w:val="2F5496" w:themeColor="accent1" w:themeShade="BF"/>
+          <w:kern w:val="0"/>
+          <w:sz w:val="24"/>
+          <w:szCs w:val="24"/>
+          <w:lang w:eastAsia="fr-FR"/>
+          <w14:ligatures w14:val="none"/>
+        </w:rPr>
+        <w:t xml:space="preserve"> Type de problème</w:t>
+      </w:r>
+      <w:r>
+        <w:rPr>
+          <w:rFonts w:ascii="Times New Roman" w:eastAsia="Times New Roman" w:hAnsi="Times New Roman" w:cs="Times New Roman"/>
+          <w:color w:val="2F5496" w:themeColor="accent1" w:themeShade="BF"/>
+          <w:kern w:val="0"/>
+          <w:sz w:val="24"/>
+          <w:szCs w:val="24"/>
+          <w:lang w:eastAsia="fr-FR"/>
+          <w14:ligatures w14:val="none"/>
+        </w:rPr>
+        <w:t xml:space="preserve">, </w:t>
+      </w:r>
+      <w:r>
+        <w:rPr>
+          <w:rFonts w:ascii="Times New Roman" w:eastAsia="Times New Roman" w:hAnsi="Times New Roman" w:cs="Times New Roman"/>
+          <w:color w:val="2F5496" w:themeColor="accent1" w:themeShade="BF"/>
+          <w:kern w:val="0"/>
+          <w:sz w:val="24"/>
+          <w:szCs w:val="24"/>
+          <w:lang w:eastAsia="fr-FR"/>
+          <w14:ligatures w14:val="none"/>
+        </w:rPr>
+        <w:t>Métriques pertinentes</w:t>
+      </w:r>
+    </w:p>
+    <w:p>
+      <w:pPr>
+        <w:spacing w:after="0"/>
+        <w:rPr>
+          <w:rFonts w:ascii="Times New Roman" w:hAnsi="Times New Roman" w:cs="Times New Roman"/>
+          <w:color w:val="2F5496" w:themeColor="accent1" w:themeShade="BF"/>
+          <w:sz w:val="24"/>
+          <w:szCs w:val="24"/>
+        </w:rPr>
+      </w:pPr>
+      <w:r>
+        <w:rPr>
+          <w:rFonts w:ascii="Times New Roman" w:hAnsi="Times New Roman" w:cs="Times New Roman"/>
+          <w:color w:val="2F5496" w:themeColor="accent1" w:themeShade="BF"/>
+          <w:sz w:val="24"/>
+          <w:szCs w:val="24"/>
+        </w:rPr>
+        <w:lastRenderedPageBreak/>
+        <w:drawing>
+          <wp:inline distT="0" distB="0" distL="0" distR="0" wp14:anchorId="0744A870" wp14:editId="34CA5F18">
+            <wp:extent cx="5760720" cy="3389630"/>
+            <wp:effectExtent l="0" t="0" r="0" b="1270"/>
+            <wp:docPr id="33" name="Image 33"/>
+            <wp:cNvGraphicFramePr>
+              <a:graphicFrameLocks xmlns:a="http://schemas.openxmlformats.org/drawingml/2006/main" noChangeAspect="1"/>
+            </wp:cNvGraphicFramePr>
+            <a:graphic xmlns:a="http://schemas.openxmlformats.org/drawingml/2006/main">
+              <a:graphicData uri="http://schemas.openxmlformats.org/drawingml/2006/picture">
+                <pic:pic xmlns:pic="http://schemas.openxmlformats.org/drawingml/2006/picture">
+                  <pic:nvPicPr>
+                    <pic:cNvPr id="1" name=""/>
+                    <pic:cNvPicPr/>
+                  </pic:nvPicPr>
+                  <pic:blipFill>
+                    <a:blip r:embed="rId36"/>
+                    <a:stretch>
+                      <a:fillRect/>
+                    </a:stretch>
+                  </pic:blipFill>
+                  <pic:spPr>
+                    <a:xfrm>
+                      <a:off x="0" y="0"/>
+                      <a:ext cx="5760720" cy="3389630"/>
+                    </a:xfrm>
+                    <a:prstGeom prst="rect">
+                      <a:avLst/>
+                    </a:prstGeom>
+                  </pic:spPr>
+                </pic:pic>
+              </a:graphicData>
+            </a:graphic>
+          </wp:inline>
+        </w:drawing>
+      </w:r>
+    </w:p>
+    <w:p>
+      <w:pPr>
+        <w:spacing w:after="0"/>
+        <w:rPr>
+          <w:rFonts w:ascii="Times New Roman" w:hAnsi="Times New Roman" w:cs="Times New Roman"/>
+          <w:color w:val="2F5496" w:themeColor="accent1" w:themeShade="BF"/>
+          <w:sz w:val="24"/>
+          <w:szCs w:val="24"/>
+        </w:rPr>
+      </w:pPr>
+      <w:r>
+        <w:rPr>
+          <w:rFonts w:ascii="Times New Roman" w:hAnsi="Times New Roman" w:cs="Times New Roman"/>
+          <w:color w:val="2F5496" w:themeColor="accent1" w:themeShade="BF"/>
+          <w:sz w:val="24"/>
+          <w:szCs w:val="24"/>
+        </w:rPr>
+        <w:drawing>
+          <wp:inline distT="0" distB="0" distL="0" distR="0" wp14:anchorId="4FBCCAAF" wp14:editId="36657F43">
+            <wp:extent cx="5760720" cy="2145665"/>
+            <wp:effectExtent l="0" t="0" r="0" b="6985"/>
+            <wp:docPr id="34" name="Image 34"/>
+            <wp:cNvGraphicFramePr>
+              <a:graphicFrameLocks xmlns:a="http://schemas.openxmlformats.org/drawingml/2006/main" noChangeAspect="1"/>
+            </wp:cNvGraphicFramePr>
+            <a:graphic xmlns:a="http://schemas.openxmlformats.org/drawingml/2006/main">
+              <a:graphicData uri="http://schemas.openxmlformats.org/drawingml/2006/picture">
+                <pic:pic xmlns:pic="http://schemas.openxmlformats.org/drawingml/2006/picture">
+                  <pic:nvPicPr>
+                    <pic:cNvPr id="1" name=""/>
+                    <pic:cNvPicPr/>
+                  </pic:nvPicPr>
+                  <pic:blipFill>
+                    <a:blip r:embed="rId37"/>
+                    <a:stretch>
+                      <a:fillRect/>
+                    </a:stretch>
+                  </pic:blipFill>
+                  <pic:spPr>
+                    <a:xfrm>
+                      <a:off x="0" y="0"/>
+                      <a:ext cx="5760720" cy="2145665"/>
+                    </a:xfrm>
+                    <a:prstGeom prst="rect">
+                      <a:avLst/>
+                    </a:prstGeom>
+                  </pic:spPr>
+                </pic:pic>
+              </a:graphicData>
+            </a:graphic>
+          </wp:inline>
+        </w:drawing>
+      </w:r>
+    </w:p>
+    <w:p>
+      <w:pPr>
+        <w:spacing w:after="0"/>
+        <w:rPr>
+          <w:rFonts w:ascii="Times New Roman" w:hAnsi="Times New Roman" w:cs="Times New Roman"/>
+          <w:color w:val="2F5496" w:themeColor="accent1" w:themeShade="BF"/>
+          <w:sz w:val="24"/>
+          <w:szCs w:val="24"/>
+        </w:rPr>
+      </w:pPr>
+      <w:r>
+        <w:rPr>
+          <w:rFonts w:ascii="Times New Roman" w:hAnsi="Times New Roman" w:cs="Times New Roman"/>
+          <w:color w:val="2F5496" w:themeColor="accent1" w:themeShade="BF"/>
+          <w:sz w:val="24"/>
+          <w:szCs w:val="24"/>
+        </w:rPr>
+        <w:drawing>
+          <wp:inline distT="0" distB="0" distL="0" distR="0" wp14:anchorId="05E8ED17" wp14:editId="1AF830D5">
+            <wp:extent cx="5760720" cy="2506345"/>
+            <wp:effectExtent l="0" t="0" r="0" b="8255"/>
+            <wp:docPr id="35" name="Image 35"/>
+            <wp:cNvGraphicFramePr>
+              <a:graphicFrameLocks xmlns:a="http://schemas.openxmlformats.org/drawingml/2006/main" noChangeAspect="1"/>
+            </wp:cNvGraphicFramePr>
+            <a:graphic xmlns:a="http://schemas.openxmlformats.org/drawingml/2006/main">
+              <a:graphicData uri="http://schemas.openxmlformats.org/drawingml/2006/picture">
+                <pic:pic xmlns:pic="http://schemas.openxmlformats.org/drawingml/2006/picture">
+                  <pic:nvPicPr>
+                    <pic:cNvPr id="1" name=""/>
+                    <pic:cNvPicPr/>
+                  </pic:nvPicPr>
+                  <pic:blipFill>
+                    <a:blip r:embed="rId38"/>
+                    <a:stretch>
+                      <a:fillRect/>
+                    </a:stretch>
+                  </pic:blipFill>
+                  <pic:spPr>
+                    <a:xfrm>
+                      <a:off x="0" y="0"/>
+                      <a:ext cx="5760720" cy="2506345"/>
+                    </a:xfrm>
+                    <a:prstGeom prst="rect">
+                      <a:avLst/>
+                    </a:prstGeom>
+                  </pic:spPr>
+                </pic:pic>
+              </a:graphicData>
+            </a:graphic>
+          </wp:inline>
+        </w:drawing>
+      </w:r>
+    </w:p>
+    <w:p>
+      <w:pPr>
+        <w:spacing w:after="0"/>
+        <w:rPr>
+          <w:rFonts w:ascii="Times New Roman" w:hAnsi="Times New Roman" w:cs="Times New Roman"/>
+          <w:color w:val="2F5496" w:themeColor="accent1" w:themeShade="BF"/>
+          <w:sz w:val="24"/>
+          <w:szCs w:val="24"/>
+        </w:rPr>
+      </w:pPr>
+      <w:r>
+        <w:rPr>
+          <w:rFonts w:ascii="Times New Roman" w:hAnsi="Times New Roman" w:cs="Times New Roman"/>
+          <w:color w:val="2F5496" w:themeColor="accent1" w:themeShade="BF"/>
+          <w:sz w:val="24"/>
+          <w:szCs w:val="24"/>
+        </w:rPr>
+        <w:lastRenderedPageBreak/>
+        <w:drawing>
+          <wp:inline distT="0" distB="0" distL="0" distR="0" wp14:anchorId="11E94274" wp14:editId="3E294FB3">
+            <wp:extent cx="5760720" cy="2446655"/>
+            <wp:effectExtent l="0" t="0" r="0" b="0"/>
+            <wp:docPr id="36" name="Image 36"/>
+            <wp:cNvGraphicFramePr>
+              <a:graphicFrameLocks xmlns:a="http://schemas.openxmlformats.org/drawingml/2006/main" noChangeAspect="1"/>
+            </wp:cNvGraphicFramePr>
+            <a:graphic xmlns:a="http://schemas.openxmlformats.org/drawingml/2006/main">
+              <a:graphicData uri="http://schemas.openxmlformats.org/drawingml/2006/picture">
+                <pic:pic xmlns:pic="http://schemas.openxmlformats.org/drawingml/2006/picture">
+                  <pic:nvPicPr>
+                    <pic:cNvPr id="1" name=""/>
+                    <pic:cNvPicPr/>
+                  </pic:nvPicPr>
+                  <pic:blipFill>
+                    <a:blip r:embed="rId39"/>
+                    <a:stretch>
+                      <a:fillRect/>
+                    </a:stretch>
+                  </pic:blipFill>
+                  <pic:spPr>
+                    <a:xfrm>
+                      <a:off x="0" y="0"/>
+                      <a:ext cx="5760720" cy="2446655"/>
+                    </a:xfrm>
+                    <a:prstGeom prst="rect">
+                      <a:avLst/>
+                    </a:prstGeom>
+                  </pic:spPr>
+                </pic:pic>
+              </a:graphicData>
+            </a:graphic>
+          </wp:inline>
+        </w:drawing>
+      </w:r>
+    </w:p>
+    <w:p>
+      <w:pPr>
+        <w:spacing w:after="0"/>
+        <w:rPr>
+          <w:rFonts w:ascii="Times New Roman" w:hAnsi="Times New Roman" w:cs="Times New Roman"/>
+          <w:color w:val="2F5496" w:themeColor="accent1" w:themeShade="BF"/>
+          <w:sz w:val="24"/>
+          <w:szCs w:val="24"/>
+        </w:rPr>
+      </w:pPr>
+      <w:r>
+        <w:rPr>
+          <w:rFonts w:ascii="Times New Roman" w:hAnsi="Times New Roman" w:cs="Times New Roman"/>
+          <w:color w:val="2F5496" w:themeColor="accent1" w:themeShade="BF"/>
+          <w:sz w:val="24"/>
+          <w:szCs w:val="24"/>
+        </w:rPr>
+        <w:drawing>
+          <wp:inline distT="0" distB="0" distL="0" distR="0" wp14:anchorId="42646E6C" wp14:editId="7F5A632C">
+            <wp:extent cx="5760720" cy="2376805"/>
+            <wp:effectExtent l="0" t="0" r="0" b="4445"/>
+            <wp:docPr id="37" name="Image 37"/>
+            <wp:cNvGraphicFramePr>
+              <a:graphicFrameLocks xmlns:a="http://schemas.openxmlformats.org/drawingml/2006/main" noChangeAspect="1"/>
+            </wp:cNvGraphicFramePr>
+            <a:graphic xmlns:a="http://schemas.openxmlformats.org/drawingml/2006/main">
+              <a:graphicData uri="http://schemas.openxmlformats.org/drawingml/2006/picture">
+                <pic:pic xmlns:pic="http://schemas.openxmlformats.org/drawingml/2006/picture">
+                  <pic:nvPicPr>
+                    <pic:cNvPr id="1" name=""/>
+                    <pic:cNvPicPr/>
+                  </pic:nvPicPr>
+                  <pic:blipFill>
+                    <a:blip r:embed="rId40"/>
+                    <a:stretch>
+                      <a:fillRect/>
+                    </a:stretch>
+                  </pic:blipFill>
+                  <pic:spPr>
+                    <a:xfrm>
+                      <a:off x="0" y="0"/>
+                      <a:ext cx="5760720" cy="2376805"/>
+                    </a:xfrm>
+                    <a:prstGeom prst="rect">
+                      <a:avLst/>
+                    </a:prstGeom>
+                  </pic:spPr>
+                </pic:pic>
+              </a:graphicData>
+            </a:graphic>
+          </wp:inline>
+        </w:drawing>
+      </w:r>
+    </w:p>
+    <w:p>
+      <w:pPr>
+        <w:spacing w:after="0"/>
+        <w:rPr>
+          <w:rFonts w:ascii="Times New Roman" w:hAnsi="Times New Roman" w:cs="Times New Roman"/>
+          <w:color w:val="2F5496" w:themeColor="accent1" w:themeShade="BF"/>
+          <w:sz w:val="24"/>
+          <w:szCs w:val="24"/>
+        </w:rPr>
+      </w:pPr>
+      <w:r>
+        <w:rPr>
+          <w:rFonts w:ascii="Times New Roman" w:hAnsi="Times New Roman" w:cs="Times New Roman"/>
+          <w:color w:val="2F5496" w:themeColor="accent1" w:themeShade="BF"/>
+          <w:sz w:val="24"/>
+          <w:szCs w:val="24"/>
+        </w:rPr>
+        <w:drawing>
+          <wp:inline distT="0" distB="0" distL="0" distR="0" wp14:anchorId="63C2F905" wp14:editId="7E810B6C">
+            <wp:extent cx="5760720" cy="2102485"/>
+            <wp:effectExtent l="0" t="0" r="0" b="0"/>
+            <wp:docPr id="38" name="Image 38"/>
+            <wp:cNvGraphicFramePr>
+              <a:graphicFrameLocks xmlns:a="http://schemas.openxmlformats.org/drawingml/2006/main" noChangeAspect="1"/>
+            </wp:cNvGraphicFramePr>
+            <a:graphic xmlns:a="http://schemas.openxmlformats.org/drawingml/2006/main">
+              <a:graphicData uri="http://schemas.openxmlformats.org/drawingml/2006/picture">
+                <pic:pic xmlns:pic="http://schemas.openxmlformats.org/drawingml/2006/picture">
+                  <pic:nvPicPr>
+                    <pic:cNvPr id="1" name=""/>
+                    <pic:cNvPicPr/>
+                  </pic:nvPicPr>
+                  <pic:blipFill>
+                    <a:blip r:embed="rId41"/>
+                    <a:stretch>
+                      <a:fillRect/>
+                    </a:stretch>
+                  </pic:blipFill>
+                  <pic:spPr>
+                    <a:xfrm>
+                      <a:off x="0" y="0"/>
+                      <a:ext cx="5760720" cy="2102485"/>
+                    </a:xfrm>
+                    <a:prstGeom prst="rect">
+                      <a:avLst/>
+                    </a:prstGeom>
+                  </pic:spPr>
+                </pic:pic>
+              </a:graphicData>
+            </a:graphic>
+          </wp:inline>
+        </w:drawing>
+      </w:r>
+    </w:p>
+    <w:p>
+      <w:pPr>
+        <w:spacing w:after="0"/>
+        <w:rPr>
+          <w:rFonts w:ascii="Times New Roman" w:hAnsi="Times New Roman" w:cs="Times New Roman"/>
+          <w:color w:val="2F5496" w:themeColor="accent1" w:themeShade="BF"/>
+          <w:sz w:val="24"/>
+          <w:szCs w:val="24"/>
+        </w:rPr>
+      </w:pPr>
+    </w:p>
     <w:sectPr>
-      <w:headerReference w:type="default" r:id="rId36"/>
-      <w:footerReference w:type="default" r:id="rId37"/>
+      <w:headerReference w:type="default" r:id="rId42"/>
+      <w:footerReference w:type="default" r:id="rId43"/>
       <w:pgSz w:w="11906" w:h="16838"/>
       <w:pgMar w:top="1417" w:right="1417" w:bottom="1417" w:left="1417" w:header="708" w:footer="708" w:gutter="0"/>
       <w:pgBorders w:offsetFrom="page">
@@ -12390,6 +13303,155 @@
     </w:lvl>
   </w:abstractNum>
   <w:abstractNum w:abstractNumId="12" w15:restartNumberingAfterBreak="0">
+    <w:nsid w:val="4150496C"/>
+    <w:multiLevelType w:val="multilevel"/>
+    <w:tmpl w:val="F974763E"/>
+    <w:lvl w:ilvl="0">
+      <w:start w:val="1"/>
+      <w:numFmt w:val="bullet"/>
+      <w:lvlText w:val=""/>
+      <w:lvlJc w:val="left"/>
+      <w:pPr>
+        <w:tabs>
+          <w:tab w:val="num" w:pos="720"/>
+        </w:tabs>
+        <w:ind w:left="720" w:hanging="360"/>
+      </w:pPr>
+      <w:rPr>
+        <w:rFonts w:ascii="Symbol" w:hAnsi="Symbol" w:hint="default"/>
+        <w:sz w:val="20"/>
+      </w:rPr>
+    </w:lvl>
+    <w:lvl w:ilvl="1" w:tentative="1">
+      <w:start w:val="1"/>
+      <w:numFmt w:val="bullet"/>
+      <w:lvlText w:val="o"/>
+      <w:lvlJc w:val="left"/>
+      <w:pPr>
+        <w:tabs>
+          <w:tab w:val="num" w:pos="1440"/>
+        </w:tabs>
+        <w:ind w:left="1440" w:hanging="360"/>
+      </w:pPr>
+      <w:rPr>
+        <w:rFonts w:ascii="Courier New" w:hAnsi="Courier New" w:hint="default"/>
+        <w:sz w:val="20"/>
+      </w:rPr>
+    </w:lvl>
+    <w:lvl w:ilvl="2" w:tentative="1">
+      <w:start w:val="1"/>
+      <w:numFmt w:val="bullet"/>
+      <w:lvlText w:val=""/>
+      <w:lvlJc w:val="left"/>
+      <w:pPr>
+        <w:tabs>
+          <w:tab w:val="num" w:pos="2160"/>
+        </w:tabs>
+        <w:ind w:left="2160" w:hanging="360"/>
+      </w:pPr>
+      <w:rPr>
+        <w:rFonts w:ascii="Wingdings" w:hAnsi="Wingdings" w:hint="default"/>
+        <w:sz w:val="20"/>
+      </w:rPr>
+    </w:lvl>
+    <w:lvl w:ilvl="3" w:tentative="1">
+      <w:start w:val="1"/>
+      <w:numFmt w:val="bullet"/>
+      <w:lvlText w:val=""/>
+      <w:lvlJc w:val="left"/>
+      <w:pPr>
+        <w:tabs>
+          <w:tab w:val="num" w:pos="2880"/>
+        </w:tabs>
+        <w:ind w:left="2880" w:hanging="360"/>
+      </w:pPr>
+      <w:rPr>
+        <w:rFonts w:ascii="Wingdings" w:hAnsi="Wingdings" w:hint="default"/>
+        <w:sz w:val="20"/>
+      </w:rPr>
+    </w:lvl>
+    <w:lvl w:ilvl="4" w:tentative="1">
+      <w:start w:val="1"/>
+      <w:numFmt w:val="bullet"/>
+      <w:lvlText w:val=""/>
+      <w:lvlJc w:val="left"/>
+      <w:pPr>
+        <w:tabs>
+          <w:tab w:val="num" w:pos="3600"/>
+        </w:tabs>
+        <w:ind w:left="3600" w:hanging="360"/>
+      </w:pPr>
+      <w:rPr>
+        <w:rFonts w:ascii="Wingdings" w:hAnsi="Wingdings" w:hint="default"/>
+        <w:sz w:val="20"/>
+      </w:rPr>
+    </w:lvl>
+    <w:lvl w:ilvl="5" w:tentative="1">
+      <w:start w:val="1"/>
+      <w:numFmt w:val="bullet"/>
+      <w:lvlText w:val=""/>
+      <w:lvlJc w:val="left"/>
+      <w:pPr>
+        <w:tabs>
+          <w:tab w:val="num" w:pos="4320"/>
+        </w:tabs>
+        <w:ind w:left="4320" w:hanging="360"/>
+      </w:pPr>
+      <w:rPr>
+        <w:rFonts w:ascii="Wingdings" w:hAnsi="Wingdings" w:hint="default"/>
+        <w:sz w:val="20"/>
+      </w:rPr>
+    </w:lvl>
+    <w:lvl w:ilvl="6" w:tentative="1">
+      <w:start w:val="1"/>
+      <w:numFmt w:val="bullet"/>
+      <w:lvlText w:val=""/>
+      <w:lvlJc w:val="left"/>
+      <w:pPr>
+        <w:tabs>
+          <w:tab w:val="num" w:pos="5040"/>
+        </w:tabs>
+        <w:ind w:left="5040" w:hanging="360"/>
+      </w:pPr>
+      <w:rPr>
+        <w:rFonts w:ascii="Wingdings" w:hAnsi="Wingdings" w:hint="default"/>
+        <w:sz w:val="20"/>
+      </w:rPr>
+    </w:lvl>
+    <w:lvl w:ilvl="7" w:tentative="1">
+      <w:start w:val="1"/>
+      <w:numFmt w:val="bullet"/>
+      <w:lvlText w:val=""/>
+      <w:lvlJc w:val="left"/>
+      <w:pPr>
+        <w:tabs>
+          <w:tab w:val="num" w:pos="5760"/>
+        </w:tabs>
+        <w:ind w:left="5760" w:hanging="360"/>
+      </w:pPr>
+      <w:rPr>
+        <w:rFonts w:ascii="Wingdings" w:hAnsi="Wingdings" w:hint="default"/>
+        <w:sz w:val="20"/>
+      </w:rPr>
+    </w:lvl>
+    <w:lvl w:ilvl="8" w:tentative="1">
+      <w:start w:val="1"/>
+      <w:numFmt w:val="bullet"/>
+      <w:lvlText w:val=""/>
+      <w:lvlJc w:val="left"/>
+      <w:pPr>
+        <w:tabs>
+          <w:tab w:val="num" w:pos="6480"/>
+        </w:tabs>
+        <w:ind w:left="6480" w:hanging="360"/>
+      </w:pPr>
+      <w:rPr>
+        <w:rFonts w:ascii="Wingdings" w:hAnsi="Wingdings" w:hint="default"/>
+        <w:sz w:val="20"/>
+      </w:rPr>
+    </w:lvl>
+  </w:abstractNum>
+  <w:abstractNum w:abstractNumId="13" w15:restartNumberingAfterBreak="0">
     <w:nsid w:val="4996411C"/>
     <w:multiLevelType w:val="multilevel"/>
     <w:tmpl w:val="218091C0"/>
@@ -12506,7 +13568,7 @@
       </w:pPr>
     </w:lvl>
   </w:abstractNum>
-  <w:abstractNum w:abstractNumId="13" w15:restartNumberingAfterBreak="0">
+  <w:abstractNum w:abstractNumId="14" w15:restartNumberingAfterBreak="0">
     <w:nsid w:val="4F9D0AB4"/>
     <w:multiLevelType w:val="multilevel"/>
     <w:tmpl w:val="839C6E34"/>
@@ -12655,7 +13717,7 @@
       </w:rPr>
     </w:lvl>
   </w:abstractNum>
-  <w:abstractNum w:abstractNumId="14" w15:restartNumberingAfterBreak="0">
+  <w:abstractNum w:abstractNumId="15" w15:restartNumberingAfterBreak="0">
     <w:nsid w:val="56D568C8"/>
     <w:multiLevelType w:val="multilevel"/>
     <w:tmpl w:val="3392CAD2"/>
@@ -12804,7 +13866,7 @@
       </w:rPr>
     </w:lvl>
   </w:abstractNum>
-  <w:abstractNum w:abstractNumId="15" w15:restartNumberingAfterBreak="0">
+  <w:abstractNum w:abstractNumId="16" w15:restartNumberingAfterBreak="0">
     <w:nsid w:val="61053792"/>
     <w:multiLevelType w:val="multilevel"/>
     <w:tmpl w:val="49E43BFC"/>
@@ -12953,7 +14015,7 @@
       </w:rPr>
     </w:lvl>
   </w:abstractNum>
-  <w:abstractNum w:abstractNumId="16" w15:restartNumberingAfterBreak="0">
+  <w:abstractNum w:abstractNumId="17" w15:restartNumberingAfterBreak="0">
     <w:nsid w:val="6DA36487"/>
     <w:multiLevelType w:val="multilevel"/>
     <w:tmpl w:val="9C4C8532"/>
@@ -13102,7 +14164,7 @@
       </w:rPr>
     </w:lvl>
   </w:abstractNum>
-  <w:abstractNum w:abstractNumId="17" w15:restartNumberingAfterBreak="0">
+  <w:abstractNum w:abstractNumId="18" w15:restartNumberingAfterBreak="0">
     <w:nsid w:val="6EB85EAA"/>
     <w:multiLevelType w:val="hybridMultilevel"/>
     <w:tmpl w:val="DB76C824"/>
@@ -13216,13 +14278,13 @@
     </w:lvl>
   </w:abstractNum>
   <w:num w:numId="1">
-    <w:abstractNumId w:val="17"/>
+    <w:abstractNumId w:val="18"/>
   </w:num>
   <w:num w:numId="2">
     <w:abstractNumId w:val="11"/>
   </w:num>
   <w:num w:numId="3">
-    <w:abstractNumId w:val="14"/>
+    <w:abstractNumId w:val="15"/>
   </w:num>
   <w:num w:numId="4">
     <w:abstractNumId w:val="9"/>
@@ -13231,19 +14293,19 @@
     <w:abstractNumId w:val="8"/>
   </w:num>
   <w:num w:numId="6">
-    <w:abstractNumId w:val="15"/>
+    <w:abstractNumId w:val="16"/>
   </w:num>
   <w:num w:numId="7">
     <w:abstractNumId w:val="5"/>
   </w:num>
   <w:num w:numId="8">
-    <w:abstractNumId w:val="16"/>
+    <w:abstractNumId w:val="17"/>
   </w:num>
   <w:num w:numId="9">
     <w:abstractNumId w:val="2"/>
   </w:num>
   <w:num w:numId="10">
-    <w:abstractNumId w:val="12"/>
+    <w:abstractNumId w:val="13"/>
   </w:num>
   <w:num w:numId="11">
     <w:abstractNumId w:val="3"/>
@@ -13252,7 +14314,7 @@
     <w:abstractNumId w:val="0"/>
   </w:num>
   <w:num w:numId="13">
-    <w:abstractNumId w:val="13"/>
+    <w:abstractNumId w:val="14"/>
   </w:num>
   <w:num w:numId="14">
     <w:abstractNumId w:val="1"/>
@@ -13268,6 +14330,9 @@
   </w:num>
   <w:num w:numId="18">
     <w:abstractNumId w:val="6"/>
+  </w:num>
+  <w:num w:numId="19">
+    <w:abstractNumId w:val="12"/>
   </w:num>
 </w:numbering>
 </file>

</xml_diff>

<commit_message>
Créer un prompt permettant d’expliquer les métriques de classification
</commit_message>
<xml_diff>
--- a/Atelier Prompt.docx
+++ b/Atelier Prompt.docx
@@ -11303,9 +11303,876 @@
         </w:rPr>
       </w:pPr>
     </w:p>
+    <w:p>
+      <w:pPr>
+        <w:spacing w:after="0"/>
+        <w:rPr>
+          <w:rFonts w:ascii="Times New Roman" w:hAnsi="Times New Roman" w:cs="Times New Roman"/>
+          <w:color w:val="2F5496" w:themeColor="accent1" w:themeShade="BF"/>
+          <w:sz w:val="24"/>
+          <w:szCs w:val="24"/>
+        </w:rPr>
+      </w:pPr>
+    </w:p>
+    <w:p>
+      <w:pPr>
+        <w:autoSpaceDE w:val="0"/>
+        <w:autoSpaceDN w:val="0"/>
+        <w:adjustRightInd w:val="0"/>
+        <w:spacing w:after="0" w:line="240" w:lineRule="auto"/>
+        <w:rPr>
+          <w:rFonts w:ascii="CIDFont+F1" w:hAnsi="CIDFont+F1" w:cs="CIDFont+F1"/>
+          <w:kern w:val="0"/>
+          <w:sz w:val="21"/>
+          <w:szCs w:val="21"/>
+        </w:rPr>
+      </w:pPr>
+      <w:r>
+        <w:rPr>
+          <w:rFonts w:ascii="CIDFont+F1" w:hAnsi="CIDFont+F1" w:cs="CIDFont+F1"/>
+          <w:kern w:val="0"/>
+          <w:sz w:val="21"/>
+          <w:szCs w:val="21"/>
+        </w:rPr>
+        <w:t>4) Créer un prompt permettant d’expliquer les métriques de classification (Accuracy, Precision,</w:t>
+      </w:r>
+    </w:p>
+    <w:p>
+      <w:pPr>
+        <w:autoSpaceDE w:val="0"/>
+        <w:autoSpaceDN w:val="0"/>
+        <w:adjustRightInd w:val="0"/>
+        <w:spacing w:after="0" w:line="240" w:lineRule="auto"/>
+        <w:rPr>
+          <w:rFonts w:ascii="CIDFont+F1" w:hAnsi="CIDFont+F1" w:cs="CIDFont+F1"/>
+          <w:kern w:val="0"/>
+          <w:sz w:val="21"/>
+          <w:szCs w:val="21"/>
+        </w:rPr>
+      </w:pPr>
+      <w:r>
+        <w:rPr>
+          <w:rFonts w:ascii="CIDFont+F1" w:hAnsi="CIDFont+F1" w:cs="CIDFont+F1"/>
+          <w:kern w:val="0"/>
+          <w:sz w:val="21"/>
+          <w:szCs w:val="21"/>
+          <w:lang w:val="en-US"/>
+        </w:rPr>
+        <w:t xml:space="preserve">Recall, F1-score, ROC-AUC). </w:t>
+      </w:r>
+      <w:r>
+        <w:rPr>
+          <w:rFonts w:ascii="CIDFont+F1" w:hAnsi="CIDFont+F1" w:cs="CIDFont+F1"/>
+          <w:kern w:val="0"/>
+          <w:sz w:val="21"/>
+          <w:szCs w:val="21"/>
+        </w:rPr>
+        <w:t>Pour chacune, le LLM doit donner la définition, expliquer son</w:t>
+      </w:r>
+    </w:p>
+    <w:p>
+      <w:pPr>
+        <w:autoSpaceDE w:val="0"/>
+        <w:autoSpaceDN w:val="0"/>
+        <w:adjustRightInd w:val="0"/>
+        <w:spacing w:after="0" w:line="240" w:lineRule="auto"/>
+        <w:rPr>
+          <w:rFonts w:ascii="CIDFont+F1" w:hAnsi="CIDFont+F1" w:cs="CIDFont+F1"/>
+          <w:kern w:val="0"/>
+          <w:sz w:val="21"/>
+          <w:szCs w:val="21"/>
+        </w:rPr>
+      </w:pPr>
+      <w:r>
+        <w:rPr>
+          <w:rFonts w:ascii="CIDFont+F1" w:hAnsi="CIDFont+F1" w:cs="CIDFont+F1"/>
+          <w:kern w:val="0"/>
+          <w:sz w:val="21"/>
+          <w:szCs w:val="21"/>
+        </w:rPr>
+        <w:t>interprétation, donner un exemple concret et indiquer dans quel contexte elle est</w:t>
+      </w:r>
+    </w:p>
+    <w:p>
+      <w:pPr>
+        <w:spacing w:after="0"/>
+        <w:rPr>
+          <w:rFonts w:ascii="CIDFont+F1" w:hAnsi="CIDFont+F1" w:cs="CIDFont+F1"/>
+          <w:kern w:val="0"/>
+          <w:sz w:val="21"/>
+          <w:szCs w:val="21"/>
+        </w:rPr>
+      </w:pPr>
+      <w:r>
+        <w:rPr>
+          <w:rFonts w:ascii="CIDFont+F1" w:hAnsi="CIDFont+F1" w:cs="CIDFont+F1"/>
+          <w:kern w:val="0"/>
+          <w:sz w:val="21"/>
+          <w:szCs w:val="21"/>
+        </w:rPr>
+        <w:t>particulièrement utile.</w:t>
+      </w:r>
+    </w:p>
+    <w:p>
+      <w:pPr>
+        <w:spacing w:after="0"/>
+        <w:rPr>
+          <w:rFonts w:ascii="Times New Roman" w:hAnsi="Times New Roman" w:cs="Times New Roman"/>
+          <w:color w:val="2F5496" w:themeColor="accent1" w:themeShade="BF"/>
+          <w:sz w:val="24"/>
+          <w:szCs w:val="24"/>
+        </w:rPr>
+      </w:pPr>
+    </w:p>
+    <w:p>
+      <w:pPr>
+        <w:pStyle w:val="NormalWeb"/>
+        <w:spacing w:before="0" w:beforeAutospacing="0" w:after="0" w:afterAutospacing="0"/>
+        <w:ind w:left="1416"/>
+        <w:rPr>
+          <w:color w:val="2F5496" w:themeColor="accent1" w:themeShade="BF"/>
+        </w:rPr>
+      </w:pPr>
+      <w:r>
+        <w:rPr>
+          <w:color w:val="2F5496" w:themeColor="accent1" w:themeShade="BF"/>
+        </w:rPr>
+        <w:t>Tu es un expert en Machine Learning.</w:t>
+      </w:r>
+    </w:p>
+    <w:p>
+      <w:pPr>
+        <w:pStyle w:val="NormalWeb"/>
+        <w:spacing w:before="0" w:beforeAutospacing="0" w:after="0" w:afterAutospacing="0"/>
+        <w:ind w:left="1416"/>
+        <w:rPr>
+          <w:color w:val="2F5496" w:themeColor="accent1" w:themeShade="BF"/>
+        </w:rPr>
+      </w:pPr>
+      <w:r>
+        <w:rPr>
+          <w:color w:val="2F5496" w:themeColor="accent1" w:themeShade="BF"/>
+        </w:rPr>
+        <w:lastRenderedPageBreak/>
+        <w:t>Les métriques de classification permettent d'évaluer les performances d'un modèle de classification.</w:t>
+      </w:r>
+    </w:p>
+    <w:p>
+      <w:pPr>
+        <w:pStyle w:val="NormalWeb"/>
+        <w:spacing w:before="0" w:beforeAutospacing="0" w:after="0" w:afterAutospacing="0"/>
+        <w:ind w:left="1416"/>
+        <w:rPr>
+          <w:color w:val="2F5496" w:themeColor="accent1" w:themeShade="BF"/>
+        </w:rPr>
+      </w:pPr>
+      <w:r>
+        <w:rPr>
+          <w:color w:val="2F5496" w:themeColor="accent1" w:themeShade="BF"/>
+        </w:rPr>
+        <w:t>Explique les métriques suivantes :</w:t>
+      </w:r>
+    </w:p>
+    <w:p>
+      <w:pPr>
+        <w:pStyle w:val="NormalWeb"/>
+        <w:numPr>
+          <w:ilvl w:val="0"/>
+          <w:numId w:val="20"/>
+        </w:numPr>
+        <w:tabs>
+          <w:tab w:val="clear" w:pos="720"/>
+          <w:tab w:val="num" w:pos="2136"/>
+        </w:tabs>
+        <w:spacing w:before="0" w:beforeAutospacing="0" w:after="0" w:afterAutospacing="0"/>
+        <w:ind w:left="2136"/>
+        <w:rPr>
+          <w:color w:val="2F5496" w:themeColor="accent1" w:themeShade="BF"/>
+        </w:rPr>
+      </w:pPr>
+      <w:r>
+        <w:rPr>
+          <w:color w:val="2F5496" w:themeColor="accent1" w:themeShade="BF"/>
+        </w:rPr>
+        <w:t>Accuracy</w:t>
+      </w:r>
+    </w:p>
+    <w:p>
+      <w:pPr>
+        <w:pStyle w:val="NormalWeb"/>
+        <w:numPr>
+          <w:ilvl w:val="0"/>
+          <w:numId w:val="20"/>
+        </w:numPr>
+        <w:tabs>
+          <w:tab w:val="clear" w:pos="720"/>
+          <w:tab w:val="num" w:pos="2136"/>
+        </w:tabs>
+        <w:spacing w:before="0" w:beforeAutospacing="0" w:after="0" w:afterAutospacing="0"/>
+        <w:ind w:left="2136"/>
+        <w:rPr>
+          <w:color w:val="2F5496" w:themeColor="accent1" w:themeShade="BF"/>
+        </w:rPr>
+      </w:pPr>
+      <w:r>
+        <w:rPr>
+          <w:color w:val="2F5496" w:themeColor="accent1" w:themeShade="BF"/>
+        </w:rPr>
+        <w:t>Precision</w:t>
+      </w:r>
+    </w:p>
+    <w:p>
+      <w:pPr>
+        <w:pStyle w:val="NormalWeb"/>
+        <w:numPr>
+          <w:ilvl w:val="0"/>
+          <w:numId w:val="20"/>
+        </w:numPr>
+        <w:tabs>
+          <w:tab w:val="clear" w:pos="720"/>
+          <w:tab w:val="num" w:pos="2136"/>
+        </w:tabs>
+        <w:spacing w:before="0" w:beforeAutospacing="0" w:after="0" w:afterAutospacing="0"/>
+        <w:ind w:left="2136"/>
+        <w:rPr>
+          <w:color w:val="2F5496" w:themeColor="accent1" w:themeShade="BF"/>
+        </w:rPr>
+      </w:pPr>
+      <w:r>
+        <w:rPr>
+          <w:color w:val="2F5496" w:themeColor="accent1" w:themeShade="BF"/>
+        </w:rPr>
+        <w:t>Recall</w:t>
+      </w:r>
+    </w:p>
+    <w:p>
+      <w:pPr>
+        <w:pStyle w:val="NormalWeb"/>
+        <w:numPr>
+          <w:ilvl w:val="0"/>
+          <w:numId w:val="20"/>
+        </w:numPr>
+        <w:tabs>
+          <w:tab w:val="clear" w:pos="720"/>
+          <w:tab w:val="num" w:pos="2136"/>
+        </w:tabs>
+        <w:spacing w:before="0" w:beforeAutospacing="0" w:after="0" w:afterAutospacing="0"/>
+        <w:ind w:left="2136"/>
+        <w:rPr>
+          <w:color w:val="2F5496" w:themeColor="accent1" w:themeShade="BF"/>
+        </w:rPr>
+      </w:pPr>
+      <w:r>
+        <w:rPr>
+          <w:color w:val="2F5496" w:themeColor="accent1" w:themeShade="BF"/>
+        </w:rPr>
+        <w:t>F1-score</w:t>
+      </w:r>
+    </w:p>
+    <w:p>
+      <w:pPr>
+        <w:pStyle w:val="NormalWeb"/>
+        <w:numPr>
+          <w:ilvl w:val="0"/>
+          <w:numId w:val="20"/>
+        </w:numPr>
+        <w:tabs>
+          <w:tab w:val="clear" w:pos="720"/>
+          <w:tab w:val="num" w:pos="2136"/>
+        </w:tabs>
+        <w:spacing w:before="0" w:beforeAutospacing="0" w:after="0" w:afterAutospacing="0"/>
+        <w:ind w:left="2136"/>
+        <w:rPr>
+          <w:color w:val="2F5496" w:themeColor="accent1" w:themeShade="BF"/>
+        </w:rPr>
+      </w:pPr>
+      <w:r>
+        <w:rPr>
+          <w:color w:val="2F5496" w:themeColor="accent1" w:themeShade="BF"/>
+        </w:rPr>
+        <w:t>ROC-AUC</w:t>
+      </w:r>
+    </w:p>
+    <w:p>
+      <w:pPr>
+        <w:pStyle w:val="NormalWeb"/>
+        <w:spacing w:before="0" w:beforeAutospacing="0" w:after="0" w:afterAutospacing="0"/>
+        <w:ind w:left="1416"/>
+        <w:rPr>
+          <w:color w:val="2F5496" w:themeColor="accent1" w:themeShade="BF"/>
+        </w:rPr>
+      </w:pPr>
+      <w:r>
+        <w:rPr>
+          <w:color w:val="2F5496" w:themeColor="accent1" w:themeShade="BF"/>
+        </w:rPr>
+        <w:t>Pour chaque métrique, explique :</w:t>
+      </w:r>
+    </w:p>
+    <w:p>
+      <w:pPr>
+        <w:pStyle w:val="NormalWeb"/>
+        <w:numPr>
+          <w:ilvl w:val="0"/>
+          <w:numId w:val="21"/>
+        </w:numPr>
+        <w:tabs>
+          <w:tab w:val="clear" w:pos="720"/>
+          <w:tab w:val="num" w:pos="2136"/>
+        </w:tabs>
+        <w:spacing w:before="0" w:beforeAutospacing="0" w:after="0" w:afterAutospacing="0"/>
+        <w:ind w:left="2136"/>
+        <w:rPr>
+          <w:color w:val="2F5496" w:themeColor="accent1" w:themeShade="BF"/>
+        </w:rPr>
+      </w:pPr>
+      <w:r>
+        <w:rPr>
+          <w:color w:val="2F5496" w:themeColor="accent1" w:themeShade="BF"/>
+        </w:rPr>
+        <w:t>sa définition ;</w:t>
+      </w:r>
+    </w:p>
+    <w:p>
+      <w:pPr>
+        <w:pStyle w:val="NormalWeb"/>
+        <w:numPr>
+          <w:ilvl w:val="0"/>
+          <w:numId w:val="21"/>
+        </w:numPr>
+        <w:tabs>
+          <w:tab w:val="clear" w:pos="720"/>
+          <w:tab w:val="num" w:pos="2136"/>
+        </w:tabs>
+        <w:spacing w:before="0" w:beforeAutospacing="0" w:after="0" w:afterAutospacing="0"/>
+        <w:ind w:left="2136"/>
+        <w:rPr>
+          <w:color w:val="2F5496" w:themeColor="accent1" w:themeShade="BF"/>
+        </w:rPr>
+      </w:pPr>
+      <w:r>
+        <w:rPr>
+          <w:color w:val="2F5496" w:themeColor="accent1" w:themeShade="BF"/>
+        </w:rPr>
+        <w:t>son interprétation ;</w:t>
+      </w:r>
+    </w:p>
+    <w:p>
+      <w:pPr>
+        <w:pStyle w:val="NormalWeb"/>
+        <w:numPr>
+          <w:ilvl w:val="0"/>
+          <w:numId w:val="21"/>
+        </w:numPr>
+        <w:tabs>
+          <w:tab w:val="clear" w:pos="720"/>
+          <w:tab w:val="num" w:pos="2136"/>
+        </w:tabs>
+        <w:spacing w:before="0" w:beforeAutospacing="0" w:after="0" w:afterAutospacing="0"/>
+        <w:ind w:left="2136"/>
+        <w:rPr>
+          <w:color w:val="2F5496" w:themeColor="accent1" w:themeShade="BF"/>
+        </w:rPr>
+      </w:pPr>
+      <w:r>
+        <w:rPr>
+          <w:color w:val="2F5496" w:themeColor="accent1" w:themeShade="BF"/>
+        </w:rPr>
+        <w:t>un exemple concret ;</w:t>
+      </w:r>
+    </w:p>
+    <w:p>
+      <w:pPr>
+        <w:pStyle w:val="NormalWeb"/>
+        <w:numPr>
+          <w:ilvl w:val="0"/>
+          <w:numId w:val="21"/>
+        </w:numPr>
+        <w:tabs>
+          <w:tab w:val="clear" w:pos="720"/>
+          <w:tab w:val="num" w:pos="2136"/>
+        </w:tabs>
+        <w:spacing w:before="0" w:beforeAutospacing="0" w:after="0" w:afterAutospacing="0"/>
+        <w:ind w:left="2136"/>
+        <w:rPr>
+          <w:color w:val="2F5496" w:themeColor="accent1" w:themeShade="BF"/>
+        </w:rPr>
+      </w:pPr>
+      <w:r>
+        <w:rPr>
+          <w:color w:val="2F5496" w:themeColor="accent1" w:themeShade="BF"/>
+        </w:rPr>
+        <w:t>le contexte dans lequel elle est particulièrement utile.</w:t>
+      </w:r>
+    </w:p>
+    <w:p>
+      <w:pPr>
+        <w:pStyle w:val="NormalWeb"/>
+        <w:spacing w:before="0" w:beforeAutospacing="0" w:after="0" w:afterAutospacing="0"/>
+        <w:ind w:left="1776"/>
+        <w:rPr>
+          <w:color w:val="2F5496" w:themeColor="accent1" w:themeShade="BF"/>
+        </w:rPr>
+      </w:pPr>
+      <w:r>
+        <w:rPr>
+          <w:color w:val="2F5496" w:themeColor="accent1" w:themeShade="BF"/>
+        </w:rPr>
+        <w:t>Utilise un langage simple et compréhensible</w:t>
+      </w:r>
+      <w:r>
+        <w:rPr>
+          <w:color w:val="2F5496" w:themeColor="accent1" w:themeShade="BF"/>
+        </w:rPr>
+        <w:t>, n</w:t>
+      </w:r>
+      <w:r>
+        <w:rPr>
+          <w:color w:val="2F5496" w:themeColor="accent1" w:themeShade="BF"/>
+        </w:rPr>
+        <w:t>e donne aucune information hors sujet.</w:t>
+      </w:r>
+      <w:r>
+        <w:rPr>
+          <w:color w:val="2F5496" w:themeColor="accent1" w:themeShade="BF"/>
+        </w:rPr>
+        <w:t xml:space="preserve"> d</w:t>
+      </w:r>
+      <w:r>
+        <w:rPr>
+          <w:color w:val="2F5496" w:themeColor="accent1" w:themeShade="BF"/>
+        </w:rPr>
+        <w:t>onne un exemple concret pour chaque métrique.</w:t>
+      </w:r>
+      <w:r>
+        <w:rPr>
+          <w:color w:val="2F5496" w:themeColor="accent1" w:themeShade="BF"/>
+        </w:rPr>
+        <w:t xml:space="preserve"> e</w:t>
+      </w:r>
+      <w:r>
+        <w:rPr>
+          <w:color w:val="2F5496" w:themeColor="accent1" w:themeShade="BF"/>
+        </w:rPr>
+        <w:t>xplique clairement la différence entre les métriques.</w:t>
+      </w:r>
+    </w:p>
+    <w:p>
+      <w:pPr>
+        <w:pStyle w:val="NormalWeb"/>
+        <w:spacing w:before="0" w:beforeAutospacing="0" w:after="0" w:afterAutospacing="0"/>
+        <w:ind w:left="1416"/>
+        <w:rPr>
+          <w:color w:val="2F5496" w:themeColor="accent1" w:themeShade="BF"/>
+        </w:rPr>
+      </w:pPr>
+      <w:r>
+        <w:rPr>
+          <w:color w:val="2F5496" w:themeColor="accent1" w:themeShade="BF"/>
+        </w:rPr>
+        <w:t>Présente les résultats sous forme de tableau avec les colonnes suivantes :Métrique</w:t>
+      </w:r>
+      <w:r>
+        <w:rPr>
+          <w:color w:val="2F5496" w:themeColor="accent1" w:themeShade="BF"/>
+        </w:rPr>
+        <w:t>,</w:t>
+      </w:r>
+      <w:r>
+        <w:rPr>
+          <w:color w:val="2F5496" w:themeColor="accent1" w:themeShade="BF"/>
+        </w:rPr>
+        <w:t xml:space="preserve"> Définition </w:t>
+      </w:r>
+      <w:r>
+        <w:rPr>
+          <w:color w:val="2F5496" w:themeColor="accent1" w:themeShade="BF"/>
+        </w:rPr>
+        <w:t>,</w:t>
+      </w:r>
+      <w:r>
+        <w:rPr>
+          <w:color w:val="2F5496" w:themeColor="accent1" w:themeShade="BF"/>
+        </w:rPr>
+        <w:t xml:space="preserve"> Interprétation</w:t>
+      </w:r>
+      <w:r>
+        <w:rPr>
+          <w:color w:val="2F5496" w:themeColor="accent1" w:themeShade="BF"/>
+        </w:rPr>
+        <w:t>,</w:t>
+      </w:r>
+      <w:r>
+        <w:rPr>
+          <w:color w:val="2F5496" w:themeColor="accent1" w:themeShade="BF"/>
+        </w:rPr>
+        <w:t xml:space="preserve"> Exemple concret</w:t>
+      </w:r>
+      <w:r>
+        <w:rPr>
+          <w:color w:val="2F5496" w:themeColor="accent1" w:themeShade="BF"/>
+        </w:rPr>
+        <w:t>,</w:t>
+      </w:r>
+      <w:r>
+        <w:rPr>
+          <w:color w:val="2F5496" w:themeColor="accent1" w:themeShade="BF"/>
+        </w:rPr>
+        <w:t xml:space="preserve"> Contexte d'utilisation </w:t>
+      </w:r>
+    </w:p>
+    <w:p>
+      <w:pPr>
+        <w:spacing w:after="0"/>
+        <w:rPr>
+          <w:rFonts w:ascii="Times New Roman" w:hAnsi="Times New Roman" w:cs="Times New Roman"/>
+          <w:color w:val="2F5496" w:themeColor="accent1" w:themeShade="BF"/>
+          <w:sz w:val="24"/>
+          <w:szCs w:val="24"/>
+        </w:rPr>
+      </w:pPr>
+    </w:p>
+    <w:p>
+      <w:pPr>
+        <w:spacing w:after="0"/>
+        <w:rPr>
+          <w:rFonts w:ascii="Times New Roman" w:hAnsi="Times New Roman" w:cs="Times New Roman"/>
+          <w:color w:val="2F5496" w:themeColor="accent1" w:themeShade="BF"/>
+          <w:sz w:val="24"/>
+          <w:szCs w:val="24"/>
+        </w:rPr>
+      </w:pPr>
+      <w:r>
+        <w:rPr>
+          <w:rFonts w:ascii="Times New Roman" w:hAnsi="Times New Roman" w:cs="Times New Roman"/>
+          <w:color w:val="2F5496" w:themeColor="accent1" w:themeShade="BF"/>
+          <w:sz w:val="24"/>
+          <w:szCs w:val="24"/>
+        </w:rPr>
+        <w:drawing>
+          <wp:inline distT="0" distB="0" distL="0" distR="0" wp14:anchorId="758218C6" wp14:editId="2CDDBC31">
+            <wp:extent cx="5760720" cy="3826510"/>
+            <wp:effectExtent l="0" t="0" r="0" b="2540"/>
+            <wp:docPr id="39" name="Image 39"/>
+            <wp:cNvGraphicFramePr>
+              <a:graphicFrameLocks xmlns:a="http://schemas.openxmlformats.org/drawingml/2006/main" noChangeAspect="1"/>
+            </wp:cNvGraphicFramePr>
+            <a:graphic xmlns:a="http://schemas.openxmlformats.org/drawingml/2006/main">
+              <a:graphicData uri="http://schemas.openxmlformats.org/drawingml/2006/picture">
+                <pic:pic xmlns:pic="http://schemas.openxmlformats.org/drawingml/2006/picture">
+                  <pic:nvPicPr>
+                    <pic:cNvPr id="1" name=""/>
+                    <pic:cNvPicPr/>
+                  </pic:nvPicPr>
+                  <pic:blipFill>
+                    <a:blip r:embed="rId42"/>
+                    <a:stretch>
+                      <a:fillRect/>
+                    </a:stretch>
+                  </pic:blipFill>
+                  <pic:spPr>
+                    <a:xfrm>
+                      <a:off x="0" y="0"/>
+                      <a:ext cx="5760720" cy="3826510"/>
+                    </a:xfrm>
+                    <a:prstGeom prst="rect">
+                      <a:avLst/>
+                    </a:prstGeom>
+                  </pic:spPr>
+                </pic:pic>
+              </a:graphicData>
+            </a:graphic>
+          </wp:inline>
+        </w:drawing>
+      </w:r>
+    </w:p>
+    <w:p>
+      <w:pPr>
+        <w:spacing w:after="0"/>
+        <w:rPr>
+          <w:rFonts w:ascii="Times New Roman" w:hAnsi="Times New Roman" w:cs="Times New Roman"/>
+          <w:color w:val="2F5496" w:themeColor="accent1" w:themeShade="BF"/>
+          <w:sz w:val="24"/>
+          <w:szCs w:val="24"/>
+        </w:rPr>
+      </w:pPr>
+    </w:p>
+    <w:p>
+      <w:pPr>
+        <w:spacing w:after="0"/>
+        <w:rPr>
+          <w:rFonts w:ascii="Times New Roman" w:hAnsi="Times New Roman" w:cs="Times New Roman"/>
+          <w:color w:val="2F5496" w:themeColor="accent1" w:themeShade="BF"/>
+          <w:sz w:val="24"/>
+          <w:szCs w:val="24"/>
+        </w:rPr>
+      </w:pPr>
+      <w:r>
+        <w:rPr>
+          <w:rFonts w:ascii="Times New Roman" w:hAnsi="Times New Roman" w:cs="Times New Roman"/>
+          <w:color w:val="2F5496" w:themeColor="accent1" w:themeShade="BF"/>
+          <w:sz w:val="24"/>
+          <w:szCs w:val="24"/>
+        </w:rPr>
+        <w:lastRenderedPageBreak/>
+        <w:drawing>
+          <wp:inline distT="0" distB="0" distL="0" distR="0" wp14:anchorId="65C33DC5" wp14:editId="5FE2B6B8">
+            <wp:extent cx="5760720" cy="3894455"/>
+            <wp:effectExtent l="0" t="0" r="0" b="0"/>
+            <wp:docPr id="40" name="Image 40"/>
+            <wp:cNvGraphicFramePr>
+              <a:graphicFrameLocks xmlns:a="http://schemas.openxmlformats.org/drawingml/2006/main" noChangeAspect="1"/>
+            </wp:cNvGraphicFramePr>
+            <a:graphic xmlns:a="http://schemas.openxmlformats.org/drawingml/2006/main">
+              <a:graphicData uri="http://schemas.openxmlformats.org/drawingml/2006/picture">
+                <pic:pic xmlns:pic="http://schemas.openxmlformats.org/drawingml/2006/picture">
+                  <pic:nvPicPr>
+                    <pic:cNvPr id="1" name=""/>
+                    <pic:cNvPicPr/>
+                  </pic:nvPicPr>
+                  <pic:blipFill>
+                    <a:blip r:embed="rId43"/>
+                    <a:stretch>
+                      <a:fillRect/>
+                    </a:stretch>
+                  </pic:blipFill>
+                  <pic:spPr>
+                    <a:xfrm>
+                      <a:off x="0" y="0"/>
+                      <a:ext cx="5760720" cy="3894455"/>
+                    </a:xfrm>
+                    <a:prstGeom prst="rect">
+                      <a:avLst/>
+                    </a:prstGeom>
+                  </pic:spPr>
+                </pic:pic>
+              </a:graphicData>
+            </a:graphic>
+          </wp:inline>
+        </w:drawing>
+      </w:r>
+    </w:p>
+    <w:p>
+      <w:pPr>
+        <w:spacing w:after="0"/>
+        <w:rPr>
+          <w:rFonts w:ascii="Times New Roman" w:hAnsi="Times New Roman" w:cs="Times New Roman"/>
+          <w:color w:val="2F5496" w:themeColor="accent1" w:themeShade="BF"/>
+          <w:sz w:val="24"/>
+          <w:szCs w:val="24"/>
+        </w:rPr>
+      </w:pPr>
+    </w:p>
+    <w:p>
+      <w:pPr>
+        <w:spacing w:after="0"/>
+        <w:rPr>
+          <w:rFonts w:ascii="Times New Roman" w:hAnsi="Times New Roman" w:cs="Times New Roman"/>
+          <w:color w:val="2F5496" w:themeColor="accent1" w:themeShade="BF"/>
+          <w:sz w:val="24"/>
+          <w:szCs w:val="24"/>
+        </w:rPr>
+      </w:pPr>
+      <w:r>
+        <w:rPr>
+          <w:rFonts w:ascii="Times New Roman" w:hAnsi="Times New Roman" w:cs="Times New Roman"/>
+          <w:color w:val="2F5496" w:themeColor="accent1" w:themeShade="BF"/>
+          <w:sz w:val="24"/>
+          <w:szCs w:val="24"/>
+        </w:rPr>
+        <w:drawing>
+          <wp:inline distT="0" distB="0" distL="0" distR="0" wp14:anchorId="00DF4F36" wp14:editId="67C50C27">
+            <wp:extent cx="5760720" cy="3716020"/>
+            <wp:effectExtent l="0" t="0" r="0" b="0"/>
+            <wp:docPr id="41" name="Image 41"/>
+            <wp:cNvGraphicFramePr>
+              <a:graphicFrameLocks xmlns:a="http://schemas.openxmlformats.org/drawingml/2006/main" noChangeAspect="1"/>
+            </wp:cNvGraphicFramePr>
+            <a:graphic xmlns:a="http://schemas.openxmlformats.org/drawingml/2006/main">
+              <a:graphicData uri="http://schemas.openxmlformats.org/drawingml/2006/picture">
+                <pic:pic xmlns:pic="http://schemas.openxmlformats.org/drawingml/2006/picture">
+                  <pic:nvPicPr>
+                    <pic:cNvPr id="1" name=""/>
+                    <pic:cNvPicPr/>
+                  </pic:nvPicPr>
+                  <pic:blipFill>
+                    <a:blip r:embed="rId44"/>
+                    <a:stretch>
+                      <a:fillRect/>
+                    </a:stretch>
+                  </pic:blipFill>
+                  <pic:spPr>
+                    <a:xfrm>
+                      <a:off x="0" y="0"/>
+                      <a:ext cx="5760720" cy="3716020"/>
+                    </a:xfrm>
+                    <a:prstGeom prst="rect">
+                      <a:avLst/>
+                    </a:prstGeom>
+                  </pic:spPr>
+                </pic:pic>
+              </a:graphicData>
+            </a:graphic>
+          </wp:inline>
+        </w:drawing>
+      </w:r>
+    </w:p>
+    <w:p>
+      <w:pPr>
+        <w:spacing w:after="0"/>
+        <w:rPr>
+          <w:rFonts w:ascii="Times New Roman" w:hAnsi="Times New Roman" w:cs="Times New Roman"/>
+          <w:color w:val="2F5496" w:themeColor="accent1" w:themeShade="BF"/>
+          <w:sz w:val="24"/>
+          <w:szCs w:val="24"/>
+        </w:rPr>
+      </w:pPr>
+    </w:p>
+    <w:p>
+      <w:pPr>
+        <w:spacing w:after="0"/>
+        <w:rPr>
+          <w:rFonts w:ascii="Times New Roman" w:hAnsi="Times New Roman" w:cs="Times New Roman"/>
+          <w:color w:val="2F5496" w:themeColor="accent1" w:themeShade="BF"/>
+          <w:sz w:val="24"/>
+          <w:szCs w:val="24"/>
+        </w:rPr>
+      </w:pPr>
+      <w:r>
+        <w:rPr>
+          <w:rFonts w:ascii="Times New Roman" w:hAnsi="Times New Roman" w:cs="Times New Roman"/>
+          <w:color w:val="2F5496" w:themeColor="accent1" w:themeShade="BF"/>
+          <w:sz w:val="24"/>
+          <w:szCs w:val="24"/>
+        </w:rPr>
+        <w:lastRenderedPageBreak/>
+        <w:drawing>
+          <wp:inline distT="0" distB="0" distL="0" distR="0" wp14:anchorId="5966657E" wp14:editId="4874D7BC">
+            <wp:extent cx="5760720" cy="4185285"/>
+            <wp:effectExtent l="0" t="0" r="0" b="5715"/>
+            <wp:docPr id="42" name="Image 42"/>
+            <wp:cNvGraphicFramePr>
+              <a:graphicFrameLocks xmlns:a="http://schemas.openxmlformats.org/drawingml/2006/main" noChangeAspect="1"/>
+            </wp:cNvGraphicFramePr>
+            <a:graphic xmlns:a="http://schemas.openxmlformats.org/drawingml/2006/main">
+              <a:graphicData uri="http://schemas.openxmlformats.org/drawingml/2006/picture">
+                <pic:pic xmlns:pic="http://schemas.openxmlformats.org/drawingml/2006/picture">
+                  <pic:nvPicPr>
+                    <pic:cNvPr id="1" name=""/>
+                    <pic:cNvPicPr/>
+                  </pic:nvPicPr>
+                  <pic:blipFill>
+                    <a:blip r:embed="rId45"/>
+                    <a:stretch>
+                      <a:fillRect/>
+                    </a:stretch>
+                  </pic:blipFill>
+                  <pic:spPr>
+                    <a:xfrm>
+                      <a:off x="0" y="0"/>
+                      <a:ext cx="5760720" cy="4185285"/>
+                    </a:xfrm>
+                    <a:prstGeom prst="rect">
+                      <a:avLst/>
+                    </a:prstGeom>
+                  </pic:spPr>
+                </pic:pic>
+              </a:graphicData>
+            </a:graphic>
+          </wp:inline>
+        </w:drawing>
+      </w:r>
+    </w:p>
+    <w:p>
+      <w:pPr>
+        <w:spacing w:after="0"/>
+        <w:rPr>
+          <w:rFonts w:ascii="Times New Roman" w:hAnsi="Times New Roman" w:cs="Times New Roman"/>
+          <w:color w:val="2F5496" w:themeColor="accent1" w:themeShade="BF"/>
+          <w:sz w:val="24"/>
+          <w:szCs w:val="24"/>
+        </w:rPr>
+      </w:pPr>
+      <w:r>
+        <w:rPr>
+          <w:rFonts w:ascii="Times New Roman" w:hAnsi="Times New Roman" w:cs="Times New Roman"/>
+          <w:color w:val="2F5496" w:themeColor="accent1" w:themeShade="BF"/>
+          <w:sz w:val="24"/>
+          <w:szCs w:val="24"/>
+        </w:rPr>
+        <w:drawing>
+          <wp:inline distT="0" distB="0" distL="0" distR="0" wp14:anchorId="1BD5F193" wp14:editId="341C8D19">
+            <wp:extent cx="5760720" cy="3289935"/>
+            <wp:effectExtent l="0" t="0" r="0" b="5715"/>
+            <wp:docPr id="43" name="Image 43"/>
+            <wp:cNvGraphicFramePr>
+              <a:graphicFrameLocks xmlns:a="http://schemas.openxmlformats.org/drawingml/2006/main" noChangeAspect="1"/>
+            </wp:cNvGraphicFramePr>
+            <a:graphic xmlns:a="http://schemas.openxmlformats.org/drawingml/2006/main">
+              <a:graphicData uri="http://schemas.openxmlformats.org/drawingml/2006/picture">
+                <pic:pic xmlns:pic="http://schemas.openxmlformats.org/drawingml/2006/picture">
+                  <pic:nvPicPr>
+                    <pic:cNvPr id="1" name=""/>
+                    <pic:cNvPicPr/>
+                  </pic:nvPicPr>
+                  <pic:blipFill>
+                    <a:blip r:embed="rId46"/>
+                    <a:stretch>
+                      <a:fillRect/>
+                    </a:stretch>
+                  </pic:blipFill>
+                  <pic:spPr>
+                    <a:xfrm>
+                      <a:off x="0" y="0"/>
+                      <a:ext cx="5760720" cy="3289935"/>
+                    </a:xfrm>
+                    <a:prstGeom prst="rect">
+                      <a:avLst/>
+                    </a:prstGeom>
+                  </pic:spPr>
+                </pic:pic>
+              </a:graphicData>
+            </a:graphic>
+          </wp:inline>
+        </w:drawing>
+      </w:r>
+    </w:p>
+    <w:p>
+      <w:pPr>
+        <w:spacing w:after="0"/>
+        <w:rPr>
+          <w:rFonts w:ascii="Times New Roman" w:hAnsi="Times New Roman" w:cs="Times New Roman"/>
+          <w:color w:val="2F5496" w:themeColor="accent1" w:themeShade="BF"/>
+          <w:sz w:val="24"/>
+          <w:szCs w:val="24"/>
+        </w:rPr>
+      </w:pPr>
+    </w:p>
+    <w:p>
+      <w:pPr>
+        <w:spacing w:after="0"/>
+        <w:rPr>
+          <w:rFonts w:ascii="Times New Roman" w:hAnsi="Times New Roman" w:cs="Times New Roman"/>
+          <w:color w:val="2F5496" w:themeColor="accent1" w:themeShade="BF"/>
+          <w:sz w:val="24"/>
+          <w:szCs w:val="24"/>
+        </w:rPr>
+      </w:pPr>
+    </w:p>
+    <w:p>
+      <w:pPr>
+        <w:spacing w:after="0"/>
+        <w:rPr>
+          <w:rFonts w:ascii="Times New Roman" w:hAnsi="Times New Roman" w:cs="Times New Roman"/>
+          <w:color w:val="2F5496" w:themeColor="accent1" w:themeShade="BF"/>
+          <w:sz w:val="24"/>
+          <w:szCs w:val="24"/>
+        </w:rPr>
+      </w:pPr>
+    </w:p>
     <w:sectPr>
-      <w:headerReference w:type="default" r:id="rId42"/>
-      <w:footerReference w:type="default" r:id="rId43"/>
+      <w:headerReference w:type="default" r:id="rId47"/>
+      <w:footerReference w:type="default" r:id="rId48"/>
       <w:pgSz w:w="11906" w:h="16838"/>
       <w:pgMar w:top="1417" w:right="1417" w:bottom="1417" w:left="1417" w:header="708" w:footer="708" w:gutter="0"/>
       <w:pgBorders w:offsetFrom="page">
@@ -12246,6 +13113,155 @@
     </w:lvl>
   </w:abstractNum>
   <w:abstractNum w:abstractNumId="4" w15:restartNumberingAfterBreak="0">
+    <w:nsid w:val="1B0136B9"/>
+    <w:multiLevelType w:val="multilevel"/>
+    <w:tmpl w:val="4E209CD8"/>
+    <w:lvl w:ilvl="0">
+      <w:start w:val="1"/>
+      <w:numFmt w:val="bullet"/>
+      <w:lvlText w:val=""/>
+      <w:lvlJc w:val="left"/>
+      <w:pPr>
+        <w:tabs>
+          <w:tab w:val="num" w:pos="720"/>
+        </w:tabs>
+        <w:ind w:left="720" w:hanging="360"/>
+      </w:pPr>
+      <w:rPr>
+        <w:rFonts w:ascii="Symbol" w:hAnsi="Symbol" w:hint="default"/>
+        <w:sz w:val="20"/>
+      </w:rPr>
+    </w:lvl>
+    <w:lvl w:ilvl="1" w:tentative="1">
+      <w:start w:val="1"/>
+      <w:numFmt w:val="bullet"/>
+      <w:lvlText w:val="o"/>
+      <w:lvlJc w:val="left"/>
+      <w:pPr>
+        <w:tabs>
+          <w:tab w:val="num" w:pos="1440"/>
+        </w:tabs>
+        <w:ind w:left="1440" w:hanging="360"/>
+      </w:pPr>
+      <w:rPr>
+        <w:rFonts w:ascii="Courier New" w:hAnsi="Courier New" w:hint="default"/>
+        <w:sz w:val="20"/>
+      </w:rPr>
+    </w:lvl>
+    <w:lvl w:ilvl="2" w:tentative="1">
+      <w:start w:val="1"/>
+      <w:numFmt w:val="bullet"/>
+      <w:lvlText w:val=""/>
+      <w:lvlJc w:val="left"/>
+      <w:pPr>
+        <w:tabs>
+          <w:tab w:val="num" w:pos="2160"/>
+        </w:tabs>
+        <w:ind w:left="2160" w:hanging="360"/>
+      </w:pPr>
+      <w:rPr>
+        <w:rFonts w:ascii="Wingdings" w:hAnsi="Wingdings" w:hint="default"/>
+        <w:sz w:val="20"/>
+      </w:rPr>
+    </w:lvl>
+    <w:lvl w:ilvl="3" w:tentative="1">
+      <w:start w:val="1"/>
+      <w:numFmt w:val="bullet"/>
+      <w:lvlText w:val=""/>
+      <w:lvlJc w:val="left"/>
+      <w:pPr>
+        <w:tabs>
+          <w:tab w:val="num" w:pos="2880"/>
+        </w:tabs>
+        <w:ind w:left="2880" w:hanging="360"/>
+      </w:pPr>
+      <w:rPr>
+        <w:rFonts w:ascii="Wingdings" w:hAnsi="Wingdings" w:hint="default"/>
+        <w:sz w:val="20"/>
+      </w:rPr>
+    </w:lvl>
+    <w:lvl w:ilvl="4" w:tentative="1">
+      <w:start w:val="1"/>
+      <w:numFmt w:val="bullet"/>
+      <w:lvlText w:val=""/>
+      <w:lvlJc w:val="left"/>
+      <w:pPr>
+        <w:tabs>
+          <w:tab w:val="num" w:pos="3600"/>
+        </w:tabs>
+        <w:ind w:left="3600" w:hanging="360"/>
+      </w:pPr>
+      <w:rPr>
+        <w:rFonts w:ascii="Wingdings" w:hAnsi="Wingdings" w:hint="default"/>
+        <w:sz w:val="20"/>
+      </w:rPr>
+    </w:lvl>
+    <w:lvl w:ilvl="5" w:tentative="1">
+      <w:start w:val="1"/>
+      <w:numFmt w:val="bullet"/>
+      <w:lvlText w:val=""/>
+      <w:lvlJc w:val="left"/>
+      <w:pPr>
+        <w:tabs>
+          <w:tab w:val="num" w:pos="4320"/>
+        </w:tabs>
+        <w:ind w:left="4320" w:hanging="360"/>
+      </w:pPr>
+      <w:rPr>
+        <w:rFonts w:ascii="Wingdings" w:hAnsi="Wingdings" w:hint="default"/>
+        <w:sz w:val="20"/>
+      </w:rPr>
+    </w:lvl>
+    <w:lvl w:ilvl="6" w:tentative="1">
+      <w:start w:val="1"/>
+      <w:numFmt w:val="bullet"/>
+      <w:lvlText w:val=""/>
+      <w:lvlJc w:val="left"/>
+      <w:pPr>
+        <w:tabs>
+          <w:tab w:val="num" w:pos="5040"/>
+        </w:tabs>
+        <w:ind w:left="5040" w:hanging="360"/>
+      </w:pPr>
+      <w:rPr>
+        <w:rFonts w:ascii="Wingdings" w:hAnsi="Wingdings" w:hint="default"/>
+        <w:sz w:val="20"/>
+      </w:rPr>
+    </w:lvl>
+    <w:lvl w:ilvl="7" w:tentative="1">
+      <w:start w:val="1"/>
+      <w:numFmt w:val="bullet"/>
+      <w:lvlText w:val=""/>
+      <w:lvlJc w:val="left"/>
+      <w:pPr>
+        <w:tabs>
+          <w:tab w:val="num" w:pos="5760"/>
+        </w:tabs>
+        <w:ind w:left="5760" w:hanging="360"/>
+      </w:pPr>
+      <w:rPr>
+        <w:rFonts w:ascii="Wingdings" w:hAnsi="Wingdings" w:hint="default"/>
+        <w:sz w:val="20"/>
+      </w:rPr>
+    </w:lvl>
+    <w:lvl w:ilvl="8" w:tentative="1">
+      <w:start w:val="1"/>
+      <w:numFmt w:val="bullet"/>
+      <w:lvlText w:val=""/>
+      <w:lvlJc w:val="left"/>
+      <w:pPr>
+        <w:tabs>
+          <w:tab w:val="num" w:pos="6480"/>
+        </w:tabs>
+        <w:ind w:left="6480" w:hanging="360"/>
+      </w:pPr>
+      <w:rPr>
+        <w:rFonts w:ascii="Wingdings" w:hAnsi="Wingdings" w:hint="default"/>
+        <w:sz w:val="20"/>
+      </w:rPr>
+    </w:lvl>
+  </w:abstractNum>
+  <w:abstractNum w:abstractNumId="5" w15:restartNumberingAfterBreak="0">
     <w:nsid w:val="1B070D50"/>
     <w:multiLevelType w:val="multilevel"/>
     <w:tmpl w:val="AC640DF8"/>
@@ -12394,7 +13410,7 @@
       </w:rPr>
     </w:lvl>
   </w:abstractNum>
-  <w:abstractNum w:abstractNumId="5" w15:restartNumberingAfterBreak="0">
+  <w:abstractNum w:abstractNumId="6" w15:restartNumberingAfterBreak="0">
     <w:nsid w:val="23FA75D2"/>
     <w:multiLevelType w:val="multilevel"/>
     <w:tmpl w:val="7B086CF2"/>
@@ -12507,7 +13523,7 @@
       </w:pPr>
     </w:lvl>
   </w:abstractNum>
-  <w:abstractNum w:abstractNumId="6" w15:restartNumberingAfterBreak="0">
+  <w:abstractNum w:abstractNumId="7" w15:restartNumberingAfterBreak="0">
     <w:nsid w:val="29B3028B"/>
     <w:multiLevelType w:val="multilevel"/>
     <w:tmpl w:val="83C0BEE6"/>
@@ -12656,7 +13672,156 @@
       </w:rPr>
     </w:lvl>
   </w:abstractNum>
-  <w:abstractNum w:abstractNumId="7" w15:restartNumberingAfterBreak="0">
+  <w:abstractNum w:abstractNumId="8" w15:restartNumberingAfterBreak="0">
+    <w:nsid w:val="29C101CC"/>
+    <w:multiLevelType w:val="multilevel"/>
+    <w:tmpl w:val="29C275F4"/>
+    <w:lvl w:ilvl="0">
+      <w:start w:val="1"/>
+      <w:numFmt w:val="bullet"/>
+      <w:lvlText w:val=""/>
+      <w:lvlJc w:val="left"/>
+      <w:pPr>
+        <w:tabs>
+          <w:tab w:val="num" w:pos="720"/>
+        </w:tabs>
+        <w:ind w:left="720" w:hanging="360"/>
+      </w:pPr>
+      <w:rPr>
+        <w:rFonts w:ascii="Symbol" w:hAnsi="Symbol" w:hint="default"/>
+        <w:sz w:val="20"/>
+      </w:rPr>
+    </w:lvl>
+    <w:lvl w:ilvl="1" w:tentative="1">
+      <w:start w:val="1"/>
+      <w:numFmt w:val="bullet"/>
+      <w:lvlText w:val="o"/>
+      <w:lvlJc w:val="left"/>
+      <w:pPr>
+        <w:tabs>
+          <w:tab w:val="num" w:pos="1440"/>
+        </w:tabs>
+        <w:ind w:left="1440" w:hanging="360"/>
+      </w:pPr>
+      <w:rPr>
+        <w:rFonts w:ascii="Courier New" w:hAnsi="Courier New" w:hint="default"/>
+        <w:sz w:val="20"/>
+      </w:rPr>
+    </w:lvl>
+    <w:lvl w:ilvl="2" w:tentative="1">
+      <w:start w:val="1"/>
+      <w:numFmt w:val="bullet"/>
+      <w:lvlText w:val=""/>
+      <w:lvlJc w:val="left"/>
+      <w:pPr>
+        <w:tabs>
+          <w:tab w:val="num" w:pos="2160"/>
+        </w:tabs>
+        <w:ind w:left="2160" w:hanging="360"/>
+      </w:pPr>
+      <w:rPr>
+        <w:rFonts w:ascii="Wingdings" w:hAnsi="Wingdings" w:hint="default"/>
+        <w:sz w:val="20"/>
+      </w:rPr>
+    </w:lvl>
+    <w:lvl w:ilvl="3" w:tentative="1">
+      <w:start w:val="1"/>
+      <w:numFmt w:val="bullet"/>
+      <w:lvlText w:val=""/>
+      <w:lvlJc w:val="left"/>
+      <w:pPr>
+        <w:tabs>
+          <w:tab w:val="num" w:pos="2880"/>
+        </w:tabs>
+        <w:ind w:left="2880" w:hanging="360"/>
+      </w:pPr>
+      <w:rPr>
+        <w:rFonts w:ascii="Wingdings" w:hAnsi="Wingdings" w:hint="default"/>
+        <w:sz w:val="20"/>
+      </w:rPr>
+    </w:lvl>
+    <w:lvl w:ilvl="4" w:tentative="1">
+      <w:start w:val="1"/>
+      <w:numFmt w:val="bullet"/>
+      <w:lvlText w:val=""/>
+      <w:lvlJc w:val="left"/>
+      <w:pPr>
+        <w:tabs>
+          <w:tab w:val="num" w:pos="3600"/>
+        </w:tabs>
+        <w:ind w:left="3600" w:hanging="360"/>
+      </w:pPr>
+      <w:rPr>
+        <w:rFonts w:ascii="Wingdings" w:hAnsi="Wingdings" w:hint="default"/>
+        <w:sz w:val="20"/>
+      </w:rPr>
+    </w:lvl>
+    <w:lvl w:ilvl="5" w:tentative="1">
+      <w:start w:val="1"/>
+      <w:numFmt w:val="bullet"/>
+      <w:lvlText w:val=""/>
+      <w:lvlJc w:val="left"/>
+      <w:pPr>
+        <w:tabs>
+          <w:tab w:val="num" w:pos="4320"/>
+        </w:tabs>
+        <w:ind w:left="4320" w:hanging="360"/>
+      </w:pPr>
+      <w:rPr>
+        <w:rFonts w:ascii="Wingdings" w:hAnsi="Wingdings" w:hint="default"/>
+        <w:sz w:val="20"/>
+      </w:rPr>
+    </w:lvl>
+    <w:lvl w:ilvl="6" w:tentative="1">
+      <w:start w:val="1"/>
+      <w:numFmt w:val="bullet"/>
+      <w:lvlText w:val=""/>
+      <w:lvlJc w:val="left"/>
+      <w:pPr>
+        <w:tabs>
+          <w:tab w:val="num" w:pos="5040"/>
+        </w:tabs>
+        <w:ind w:left="5040" w:hanging="360"/>
+      </w:pPr>
+      <w:rPr>
+        <w:rFonts w:ascii="Wingdings" w:hAnsi="Wingdings" w:hint="default"/>
+        <w:sz w:val="20"/>
+      </w:rPr>
+    </w:lvl>
+    <w:lvl w:ilvl="7" w:tentative="1">
+      <w:start w:val="1"/>
+      <w:numFmt w:val="bullet"/>
+      <w:lvlText w:val=""/>
+      <w:lvlJc w:val="left"/>
+      <w:pPr>
+        <w:tabs>
+          <w:tab w:val="num" w:pos="5760"/>
+        </w:tabs>
+        <w:ind w:left="5760" w:hanging="360"/>
+      </w:pPr>
+      <w:rPr>
+        <w:rFonts w:ascii="Wingdings" w:hAnsi="Wingdings" w:hint="default"/>
+        <w:sz w:val="20"/>
+      </w:rPr>
+    </w:lvl>
+    <w:lvl w:ilvl="8" w:tentative="1">
+      <w:start w:val="1"/>
+      <w:numFmt w:val="bullet"/>
+      <w:lvlText w:val=""/>
+      <w:lvlJc w:val="left"/>
+      <w:pPr>
+        <w:tabs>
+          <w:tab w:val="num" w:pos="6480"/>
+        </w:tabs>
+        <w:ind w:left="6480" w:hanging="360"/>
+      </w:pPr>
+      <w:rPr>
+        <w:rFonts w:ascii="Wingdings" w:hAnsi="Wingdings" w:hint="default"/>
+        <w:sz w:val="20"/>
+      </w:rPr>
+    </w:lvl>
+  </w:abstractNum>
+  <w:abstractNum w:abstractNumId="9" w15:restartNumberingAfterBreak="0">
     <w:nsid w:val="2C003D88"/>
     <w:multiLevelType w:val="multilevel"/>
     <w:tmpl w:val="A948D544"/>
@@ -12805,7 +13970,7 @@
       </w:rPr>
     </w:lvl>
   </w:abstractNum>
-  <w:abstractNum w:abstractNumId="8" w15:restartNumberingAfterBreak="0">
+  <w:abstractNum w:abstractNumId="10" w15:restartNumberingAfterBreak="0">
     <w:nsid w:val="30817C99"/>
     <w:multiLevelType w:val="hybridMultilevel"/>
     <w:tmpl w:val="B28054F4"/>
@@ -12891,7 +14056,7 @@
       </w:pPr>
     </w:lvl>
   </w:abstractNum>
-  <w:abstractNum w:abstractNumId="9" w15:restartNumberingAfterBreak="0">
+  <w:abstractNum w:abstractNumId="11" w15:restartNumberingAfterBreak="0">
     <w:nsid w:val="32024712"/>
     <w:multiLevelType w:val="multilevel"/>
     <w:tmpl w:val="7716EFCE"/>
@@ -13040,7 +14205,7 @@
       </w:rPr>
     </w:lvl>
   </w:abstractNum>
-  <w:abstractNum w:abstractNumId="10" w15:restartNumberingAfterBreak="0">
+  <w:abstractNum w:abstractNumId="12" w15:restartNumberingAfterBreak="0">
     <w:nsid w:val="3A273CBD"/>
     <w:multiLevelType w:val="multilevel"/>
     <w:tmpl w:val="A5564738"/>
@@ -13189,7 +14354,7 @@
       </w:rPr>
     </w:lvl>
   </w:abstractNum>
-  <w:abstractNum w:abstractNumId="11" w15:restartNumberingAfterBreak="0">
+  <w:abstractNum w:abstractNumId="13" w15:restartNumberingAfterBreak="0">
     <w:nsid w:val="3CA24848"/>
     <w:multiLevelType w:val="hybridMultilevel"/>
     <w:tmpl w:val="76B802A4"/>
@@ -13302,7 +14467,7 @@
       </w:rPr>
     </w:lvl>
   </w:abstractNum>
-  <w:abstractNum w:abstractNumId="12" w15:restartNumberingAfterBreak="0">
+  <w:abstractNum w:abstractNumId="14" w15:restartNumberingAfterBreak="0">
     <w:nsid w:val="4150496C"/>
     <w:multiLevelType w:val="multilevel"/>
     <w:tmpl w:val="F974763E"/>
@@ -13451,7 +14616,7 @@
       </w:rPr>
     </w:lvl>
   </w:abstractNum>
-  <w:abstractNum w:abstractNumId="13" w15:restartNumberingAfterBreak="0">
+  <w:abstractNum w:abstractNumId="15" w15:restartNumberingAfterBreak="0">
     <w:nsid w:val="4996411C"/>
     <w:multiLevelType w:val="multilevel"/>
     <w:tmpl w:val="218091C0"/>
@@ -13568,7 +14733,7 @@
       </w:pPr>
     </w:lvl>
   </w:abstractNum>
-  <w:abstractNum w:abstractNumId="14" w15:restartNumberingAfterBreak="0">
+  <w:abstractNum w:abstractNumId="16" w15:restartNumberingAfterBreak="0">
     <w:nsid w:val="4F9D0AB4"/>
     <w:multiLevelType w:val="multilevel"/>
     <w:tmpl w:val="839C6E34"/>
@@ -13717,7 +14882,7 @@
       </w:rPr>
     </w:lvl>
   </w:abstractNum>
-  <w:abstractNum w:abstractNumId="15" w15:restartNumberingAfterBreak="0">
+  <w:abstractNum w:abstractNumId="17" w15:restartNumberingAfterBreak="0">
     <w:nsid w:val="56D568C8"/>
     <w:multiLevelType w:val="multilevel"/>
     <w:tmpl w:val="3392CAD2"/>
@@ -13866,7 +15031,120 @@
       </w:rPr>
     </w:lvl>
   </w:abstractNum>
-  <w:abstractNum w:abstractNumId="16" w15:restartNumberingAfterBreak="0">
+  <w:abstractNum w:abstractNumId="18" w15:restartNumberingAfterBreak="0">
+    <w:nsid w:val="57CA1CDA"/>
+    <w:multiLevelType w:val="multilevel"/>
+    <w:tmpl w:val="206055CE"/>
+    <w:lvl w:ilvl="0">
+      <w:start w:val="1"/>
+      <w:numFmt w:val="decimal"/>
+      <w:lvlText w:val="%1."/>
+      <w:lvlJc w:val="left"/>
+      <w:pPr>
+        <w:tabs>
+          <w:tab w:val="num" w:pos="720"/>
+        </w:tabs>
+        <w:ind w:left="720" w:hanging="360"/>
+      </w:pPr>
+    </w:lvl>
+    <w:lvl w:ilvl="1" w:tentative="1">
+      <w:start w:val="1"/>
+      <w:numFmt w:val="decimal"/>
+      <w:lvlText w:val="%2."/>
+      <w:lvlJc w:val="left"/>
+      <w:pPr>
+        <w:tabs>
+          <w:tab w:val="num" w:pos="1440"/>
+        </w:tabs>
+        <w:ind w:left="1440" w:hanging="360"/>
+      </w:pPr>
+    </w:lvl>
+    <w:lvl w:ilvl="2" w:tentative="1">
+      <w:start w:val="1"/>
+      <w:numFmt w:val="decimal"/>
+      <w:lvlText w:val="%3."/>
+      <w:lvlJc w:val="left"/>
+      <w:pPr>
+        <w:tabs>
+          <w:tab w:val="num" w:pos="2160"/>
+        </w:tabs>
+        <w:ind w:left="2160" w:hanging="360"/>
+      </w:pPr>
+    </w:lvl>
+    <w:lvl w:ilvl="3" w:tentative="1">
+      <w:start w:val="1"/>
+      <w:numFmt w:val="decimal"/>
+      <w:lvlText w:val="%4."/>
+      <w:lvlJc w:val="left"/>
+      <w:pPr>
+        <w:tabs>
+          <w:tab w:val="num" w:pos="2880"/>
+        </w:tabs>
+        <w:ind w:left="2880" w:hanging="360"/>
+      </w:pPr>
+    </w:lvl>
+    <w:lvl w:ilvl="4" w:tentative="1">
+      <w:start w:val="1"/>
+      <w:numFmt w:val="decimal"/>
+      <w:lvlText w:val="%5."/>
+      <w:lvlJc w:val="left"/>
+      <w:pPr>
+        <w:tabs>
+          <w:tab w:val="num" w:pos="3600"/>
+        </w:tabs>
+        <w:ind w:left="3600" w:hanging="360"/>
+      </w:pPr>
+    </w:lvl>
+    <w:lvl w:ilvl="5" w:tentative="1">
+      <w:start w:val="1"/>
+      <w:numFmt w:val="decimal"/>
+      <w:lvlText w:val="%6."/>
+      <w:lvlJc w:val="left"/>
+      <w:pPr>
+        <w:tabs>
+          <w:tab w:val="num" w:pos="4320"/>
+        </w:tabs>
+        <w:ind w:left="4320" w:hanging="360"/>
+      </w:pPr>
+    </w:lvl>
+    <w:lvl w:ilvl="6" w:tentative="1">
+      <w:start w:val="1"/>
+      <w:numFmt w:val="decimal"/>
+      <w:lvlText w:val="%7."/>
+      <w:lvlJc w:val="left"/>
+      <w:pPr>
+        <w:tabs>
+          <w:tab w:val="num" w:pos="5040"/>
+        </w:tabs>
+        <w:ind w:left="5040" w:hanging="360"/>
+      </w:pPr>
+    </w:lvl>
+    <w:lvl w:ilvl="7" w:tentative="1">
+      <w:start w:val="1"/>
+      <w:numFmt w:val="decimal"/>
+      <w:lvlText w:val="%8."/>
+      <w:lvlJc w:val="left"/>
+      <w:pPr>
+        <w:tabs>
+          <w:tab w:val="num" w:pos="5760"/>
+        </w:tabs>
+        <w:ind w:left="5760" w:hanging="360"/>
+      </w:pPr>
+    </w:lvl>
+    <w:lvl w:ilvl="8" w:tentative="1">
+      <w:start w:val="1"/>
+      <w:numFmt w:val="decimal"/>
+      <w:lvlText w:val="%9."/>
+      <w:lvlJc w:val="left"/>
+      <w:pPr>
+        <w:tabs>
+          <w:tab w:val="num" w:pos="6480"/>
+        </w:tabs>
+        <w:ind w:left="6480" w:hanging="360"/>
+      </w:pPr>
+    </w:lvl>
+  </w:abstractNum>
+  <w:abstractNum w:abstractNumId="19" w15:restartNumberingAfterBreak="0">
     <w:nsid w:val="61053792"/>
     <w:multiLevelType w:val="multilevel"/>
     <w:tmpl w:val="49E43BFC"/>
@@ -14015,7 +15293,7 @@
       </w:rPr>
     </w:lvl>
   </w:abstractNum>
-  <w:abstractNum w:abstractNumId="17" w15:restartNumberingAfterBreak="0">
+  <w:abstractNum w:abstractNumId="20" w15:restartNumberingAfterBreak="0">
     <w:nsid w:val="6DA36487"/>
     <w:multiLevelType w:val="multilevel"/>
     <w:tmpl w:val="9C4C8532"/>
@@ -14164,7 +15442,7 @@
       </w:rPr>
     </w:lvl>
   </w:abstractNum>
-  <w:abstractNum w:abstractNumId="18" w15:restartNumberingAfterBreak="0">
+  <w:abstractNum w:abstractNumId="21" w15:restartNumberingAfterBreak="0">
     <w:nsid w:val="6EB85EAA"/>
     <w:multiLevelType w:val="hybridMultilevel"/>
     <w:tmpl w:val="DB76C824"/>
@@ -14278,34 +15556,34 @@
     </w:lvl>
   </w:abstractNum>
   <w:num w:numId="1">
-    <w:abstractNumId w:val="18"/>
+    <w:abstractNumId w:val="21"/>
   </w:num>
   <w:num w:numId="2">
+    <w:abstractNumId w:val="13"/>
+  </w:num>
+  <w:num w:numId="3">
+    <w:abstractNumId w:val="17"/>
+  </w:num>
+  <w:num w:numId="4">
     <w:abstractNumId w:val="11"/>
   </w:num>
-  <w:num w:numId="3">
-    <w:abstractNumId w:val="15"/>
-  </w:num>
-  <w:num w:numId="4">
-    <w:abstractNumId w:val="9"/>
-  </w:num>
   <w:num w:numId="5">
-    <w:abstractNumId w:val="8"/>
+    <w:abstractNumId w:val="10"/>
   </w:num>
   <w:num w:numId="6">
-    <w:abstractNumId w:val="16"/>
+    <w:abstractNumId w:val="19"/>
   </w:num>
   <w:num w:numId="7">
-    <w:abstractNumId w:val="5"/>
+    <w:abstractNumId w:val="6"/>
   </w:num>
   <w:num w:numId="8">
-    <w:abstractNumId w:val="17"/>
+    <w:abstractNumId w:val="20"/>
   </w:num>
   <w:num w:numId="9">
     <w:abstractNumId w:val="2"/>
   </w:num>
   <w:num w:numId="10">
-    <w:abstractNumId w:val="13"/>
+    <w:abstractNumId w:val="15"/>
   </w:num>
   <w:num w:numId="11">
     <w:abstractNumId w:val="3"/>
@@ -14314,25 +15592,34 @@
     <w:abstractNumId w:val="0"/>
   </w:num>
   <w:num w:numId="13">
-    <w:abstractNumId w:val="14"/>
+    <w:abstractNumId w:val="16"/>
   </w:num>
   <w:num w:numId="14">
     <w:abstractNumId w:val="1"/>
   </w:num>
   <w:num w:numId="15">
-    <w:abstractNumId w:val="10"/>
+    <w:abstractNumId w:val="12"/>
   </w:num>
   <w:num w:numId="16">
-    <w:abstractNumId w:val="4"/>
+    <w:abstractNumId w:val="5"/>
   </w:num>
   <w:num w:numId="17">
+    <w:abstractNumId w:val="9"/>
+  </w:num>
+  <w:num w:numId="18">
     <w:abstractNumId w:val="7"/>
   </w:num>
-  <w:num w:numId="18">
-    <w:abstractNumId w:val="6"/>
+  <w:num w:numId="19">
+    <w:abstractNumId w:val="14"/>
   </w:num>
-  <w:num w:numId="19">
-    <w:abstractNumId w:val="12"/>
+  <w:num w:numId="20">
+    <w:abstractNumId w:val="8"/>
+  </w:num>
+  <w:num w:numId="21">
+    <w:abstractNumId w:val="18"/>
+  </w:num>
+  <w:num w:numId="22">
+    <w:abstractNumId w:val="4"/>
   </w:num>
 </w:numbering>
 </file>

</xml_diff>

<commit_message>
Créer un prompt permettant d’expliquer les métriques de Régression
</commit_message>
<xml_diff>
--- a/Atelier Prompt.docx
+++ b/Atelier Prompt.docx
@@ -12161,18 +12161,684 @@
     </w:p>
     <w:p>
       <w:pPr>
+        <w:autoSpaceDE w:val="0"/>
+        <w:autoSpaceDN w:val="0"/>
+        <w:adjustRightInd w:val="0"/>
+        <w:spacing w:after="0" w:line="240" w:lineRule="auto"/>
+        <w:rPr>
+          <w:rFonts w:ascii="CIDFont+F1" w:hAnsi="CIDFont+F1" w:cs="CIDFont+F1"/>
+          <w:kern w:val="0"/>
+          <w:sz w:val="21"/>
+          <w:szCs w:val="21"/>
+        </w:rPr>
+      </w:pPr>
+      <w:r>
+        <w:rPr>
+          <w:rFonts w:ascii="CIDFont+F1" w:hAnsi="CIDFont+F1" w:cs="CIDFont+F1"/>
+          <w:kern w:val="0"/>
+          <w:sz w:val="21"/>
+          <w:szCs w:val="21"/>
+        </w:rPr>
+        <w:t>5) Créer un prompt permettant d’expliquer les métriques de Régression (MAE, MSE, RMSE).</w:t>
+      </w:r>
+    </w:p>
+    <w:p>
+      <w:pPr>
+        <w:autoSpaceDE w:val="0"/>
+        <w:autoSpaceDN w:val="0"/>
+        <w:adjustRightInd w:val="0"/>
+        <w:spacing w:after="0" w:line="240" w:lineRule="auto"/>
+        <w:rPr>
+          <w:rFonts w:ascii="CIDFont+F1" w:hAnsi="CIDFont+F1" w:cs="CIDFont+F1"/>
+          <w:kern w:val="0"/>
+          <w:sz w:val="21"/>
+          <w:szCs w:val="21"/>
+        </w:rPr>
+      </w:pPr>
+      <w:r>
+        <w:rPr>
+          <w:rFonts w:ascii="CIDFont+F1" w:hAnsi="CIDFont+F1" w:cs="CIDFont+F1"/>
+          <w:kern w:val="0"/>
+          <w:sz w:val="21"/>
+          <w:szCs w:val="21"/>
+        </w:rPr>
+        <w:t>Pour chacune, le LLM doit donner la définition, expliquer son interprétation, donner un</w:t>
+      </w:r>
+    </w:p>
+    <w:p>
+      <w:pPr>
         <w:spacing w:after="0"/>
         <w:rPr>
-          <w:rFonts w:ascii="Times New Roman" w:hAnsi="Times New Roman" w:cs="Times New Roman"/>
-          <w:color w:val="2F5496" w:themeColor="accent1" w:themeShade="BF"/>
-          <w:sz w:val="24"/>
-          <w:szCs w:val="24"/>
-        </w:rPr>
-      </w:pPr>
+          <w:rFonts w:ascii="CIDFont+F1" w:hAnsi="CIDFont+F1" w:cs="CIDFont+F1"/>
+          <w:kern w:val="0"/>
+          <w:sz w:val="21"/>
+          <w:szCs w:val="21"/>
+        </w:rPr>
+      </w:pPr>
+      <w:r>
+        <w:rPr>
+          <w:rFonts w:ascii="CIDFont+F1" w:hAnsi="CIDFont+F1" w:cs="CIDFont+F1"/>
+          <w:kern w:val="0"/>
+          <w:sz w:val="21"/>
+          <w:szCs w:val="21"/>
+        </w:rPr>
+        <w:t>exemple concret et indiquer dans quel contexte elle est particulièrement utile.</w:t>
+      </w:r>
+    </w:p>
+    <w:p>
+      <w:pPr>
+        <w:spacing w:after="0"/>
+        <w:rPr>
+          <w:rFonts w:ascii="CIDFont+F1" w:hAnsi="CIDFont+F1" w:cs="CIDFont+F1"/>
+          <w:kern w:val="0"/>
+          <w:sz w:val="21"/>
+          <w:szCs w:val="21"/>
+        </w:rPr>
+      </w:pPr>
+    </w:p>
+    <w:p>
+      <w:pPr>
+        <w:spacing w:after="0"/>
+        <w:rPr>
+          <w:rFonts w:ascii="CIDFont+F1" w:hAnsi="CIDFont+F1" w:cs="CIDFont+F1"/>
+          <w:kern w:val="0"/>
+          <w:sz w:val="21"/>
+          <w:szCs w:val="21"/>
+        </w:rPr>
+      </w:pPr>
+    </w:p>
+    <w:p>
+      <w:pPr>
+        <w:pStyle w:val="NormalWeb"/>
+        <w:spacing w:before="0" w:beforeAutospacing="0" w:after="0" w:afterAutospacing="0"/>
+        <w:ind w:left="708"/>
+        <w:rPr>
+          <w:color w:val="2F5496" w:themeColor="accent1" w:themeShade="BF"/>
+        </w:rPr>
+      </w:pPr>
+      <w:r>
+        <w:rPr>
+          <w:color w:val="2F5496" w:themeColor="accent1" w:themeShade="BF"/>
+        </w:rPr>
+        <w:t>Tu es un expert en Machine Learning.</w:t>
+      </w:r>
+    </w:p>
+    <w:p>
+      <w:pPr>
+        <w:pStyle w:val="NormalWeb"/>
+        <w:spacing w:before="0" w:beforeAutospacing="0" w:after="0" w:afterAutospacing="0"/>
+        <w:ind w:left="708"/>
+        <w:rPr>
+          <w:color w:val="2F5496" w:themeColor="accent1" w:themeShade="BF"/>
+        </w:rPr>
+      </w:pPr>
+      <w:r>
+        <w:rPr>
+          <w:color w:val="2F5496" w:themeColor="accent1" w:themeShade="BF"/>
+        </w:rPr>
+        <w:t>Les métriques de régression permettent d'évaluer les performances d'un modèle qui prédit des valeurs numériques.</w:t>
+      </w:r>
+    </w:p>
+    <w:p>
+      <w:pPr>
+        <w:pStyle w:val="NormalWeb"/>
+        <w:spacing w:before="0" w:beforeAutospacing="0" w:after="0" w:afterAutospacing="0"/>
+        <w:ind w:left="708"/>
+        <w:rPr>
+          <w:color w:val="2F5496" w:themeColor="accent1" w:themeShade="BF"/>
+        </w:rPr>
+      </w:pPr>
+      <w:r>
+        <w:rPr>
+          <w:color w:val="2F5496" w:themeColor="accent1" w:themeShade="BF"/>
+        </w:rPr>
+        <w:t>Explique les métriques de régression suivantes :</w:t>
+      </w:r>
+    </w:p>
+    <w:p>
+      <w:pPr>
+        <w:pStyle w:val="NormalWeb"/>
+        <w:numPr>
+          <w:ilvl w:val="0"/>
+          <w:numId w:val="23"/>
+        </w:numPr>
+        <w:tabs>
+          <w:tab w:val="clear" w:pos="720"/>
+          <w:tab w:val="num" w:pos="1428"/>
+        </w:tabs>
+        <w:spacing w:before="0" w:beforeAutospacing="0" w:after="0" w:afterAutospacing="0"/>
+        <w:ind w:left="1428"/>
+        <w:rPr>
+          <w:color w:val="2F5496" w:themeColor="accent1" w:themeShade="BF"/>
+        </w:rPr>
+      </w:pPr>
+      <w:r>
+        <w:rPr>
+          <w:color w:val="2F5496" w:themeColor="accent1" w:themeShade="BF"/>
+        </w:rPr>
+        <w:t>MAE (Mean Absolute Error)</w:t>
+      </w:r>
+    </w:p>
+    <w:p>
+      <w:pPr>
+        <w:pStyle w:val="NormalWeb"/>
+        <w:numPr>
+          <w:ilvl w:val="0"/>
+          <w:numId w:val="23"/>
+        </w:numPr>
+        <w:tabs>
+          <w:tab w:val="clear" w:pos="720"/>
+          <w:tab w:val="num" w:pos="1428"/>
+        </w:tabs>
+        <w:spacing w:before="0" w:beforeAutospacing="0" w:after="0" w:afterAutospacing="0"/>
+        <w:ind w:left="1428"/>
+        <w:rPr>
+          <w:color w:val="2F5496" w:themeColor="accent1" w:themeShade="BF"/>
+        </w:rPr>
+      </w:pPr>
+      <w:r>
+        <w:rPr>
+          <w:color w:val="2F5496" w:themeColor="accent1" w:themeShade="BF"/>
+        </w:rPr>
+        <w:t>MSE (Mean Squared Error)</w:t>
+      </w:r>
+    </w:p>
+    <w:p>
+      <w:pPr>
+        <w:pStyle w:val="NormalWeb"/>
+        <w:numPr>
+          <w:ilvl w:val="0"/>
+          <w:numId w:val="23"/>
+        </w:numPr>
+        <w:tabs>
+          <w:tab w:val="clear" w:pos="720"/>
+          <w:tab w:val="num" w:pos="1428"/>
+        </w:tabs>
+        <w:spacing w:before="0" w:beforeAutospacing="0" w:after="0" w:afterAutospacing="0"/>
+        <w:ind w:left="1428"/>
+        <w:rPr>
+          <w:color w:val="2F5496" w:themeColor="accent1" w:themeShade="BF"/>
+          <w:lang w:val="en-US"/>
+        </w:rPr>
+      </w:pPr>
+      <w:r>
+        <w:rPr>
+          <w:color w:val="2F5496" w:themeColor="accent1" w:themeShade="BF"/>
+          <w:lang w:val="en-US"/>
+        </w:rPr>
+        <w:t>RMSE (Root Mean Squared Error)</w:t>
+      </w:r>
+    </w:p>
+    <w:p>
+      <w:pPr>
+        <w:pStyle w:val="NormalWeb"/>
+        <w:spacing w:before="0" w:beforeAutospacing="0" w:after="0" w:afterAutospacing="0"/>
+        <w:ind w:left="708"/>
+        <w:rPr>
+          <w:color w:val="2F5496" w:themeColor="accent1" w:themeShade="BF"/>
+        </w:rPr>
+      </w:pPr>
+      <w:r>
+        <w:rPr>
+          <w:color w:val="2F5496" w:themeColor="accent1" w:themeShade="BF"/>
+        </w:rPr>
+        <w:t>Pour chaque métrique, explique :</w:t>
+      </w:r>
+    </w:p>
+    <w:p>
+      <w:pPr>
+        <w:pStyle w:val="NormalWeb"/>
+        <w:numPr>
+          <w:ilvl w:val="0"/>
+          <w:numId w:val="24"/>
+        </w:numPr>
+        <w:tabs>
+          <w:tab w:val="clear" w:pos="720"/>
+          <w:tab w:val="num" w:pos="1428"/>
+        </w:tabs>
+        <w:spacing w:before="0" w:beforeAutospacing="0" w:after="0" w:afterAutospacing="0"/>
+        <w:ind w:left="1428"/>
+        <w:rPr>
+          <w:color w:val="2F5496" w:themeColor="accent1" w:themeShade="BF"/>
+        </w:rPr>
+      </w:pPr>
+      <w:r>
+        <w:rPr>
+          <w:color w:val="2F5496" w:themeColor="accent1" w:themeShade="BF"/>
+        </w:rPr>
+        <w:t>sa définition ;</w:t>
+      </w:r>
+    </w:p>
+    <w:p>
+      <w:pPr>
+        <w:pStyle w:val="NormalWeb"/>
+        <w:numPr>
+          <w:ilvl w:val="0"/>
+          <w:numId w:val="24"/>
+        </w:numPr>
+        <w:tabs>
+          <w:tab w:val="clear" w:pos="720"/>
+          <w:tab w:val="num" w:pos="1428"/>
+        </w:tabs>
+        <w:spacing w:before="0" w:beforeAutospacing="0" w:after="0" w:afterAutospacing="0"/>
+        <w:ind w:left="1428"/>
+        <w:rPr>
+          <w:color w:val="2F5496" w:themeColor="accent1" w:themeShade="BF"/>
+        </w:rPr>
+      </w:pPr>
+      <w:r>
+        <w:rPr>
+          <w:color w:val="2F5496" w:themeColor="accent1" w:themeShade="BF"/>
+        </w:rPr>
+        <w:t>son interprétation ;</w:t>
+      </w:r>
+    </w:p>
+    <w:p>
+      <w:pPr>
+        <w:pStyle w:val="NormalWeb"/>
+        <w:numPr>
+          <w:ilvl w:val="0"/>
+          <w:numId w:val="24"/>
+        </w:numPr>
+        <w:tabs>
+          <w:tab w:val="clear" w:pos="720"/>
+          <w:tab w:val="num" w:pos="1428"/>
+        </w:tabs>
+        <w:spacing w:before="0" w:beforeAutospacing="0" w:after="0" w:afterAutospacing="0"/>
+        <w:ind w:left="1428"/>
+        <w:rPr>
+          <w:color w:val="2F5496" w:themeColor="accent1" w:themeShade="BF"/>
+        </w:rPr>
+      </w:pPr>
+      <w:r>
+        <w:rPr>
+          <w:color w:val="2F5496" w:themeColor="accent1" w:themeShade="BF"/>
+        </w:rPr>
+        <w:t>un exemple concret ;</w:t>
+      </w:r>
+    </w:p>
+    <w:p>
+      <w:pPr>
+        <w:pStyle w:val="NormalWeb"/>
+        <w:numPr>
+          <w:ilvl w:val="0"/>
+          <w:numId w:val="24"/>
+        </w:numPr>
+        <w:tabs>
+          <w:tab w:val="clear" w:pos="720"/>
+          <w:tab w:val="num" w:pos="1428"/>
+        </w:tabs>
+        <w:spacing w:before="0" w:beforeAutospacing="0" w:after="0" w:afterAutospacing="0"/>
+        <w:ind w:left="1428"/>
+        <w:rPr>
+          <w:color w:val="2F5496" w:themeColor="accent1" w:themeShade="BF"/>
+        </w:rPr>
+      </w:pPr>
+      <w:r>
+        <w:rPr>
+          <w:color w:val="2F5496" w:themeColor="accent1" w:themeShade="BF"/>
+        </w:rPr>
+        <w:t>le contexte dans lequel elle est particulièrement utile.</w:t>
+      </w:r>
+    </w:p>
+    <w:p>
+      <w:pPr>
+        <w:pStyle w:val="NormalWeb"/>
+        <w:spacing w:before="0" w:beforeAutospacing="0" w:after="0" w:afterAutospacing="0"/>
+        <w:ind w:left="708"/>
+        <w:rPr>
+          <w:color w:val="2F5496" w:themeColor="accent1" w:themeShade="BF"/>
+        </w:rPr>
+      </w:pPr>
+      <w:r>
+        <w:rPr>
+          <w:color w:val="2F5496" w:themeColor="accent1" w:themeShade="BF"/>
+        </w:rPr>
+        <w:t>u</w:t>
+      </w:r>
+      <w:r>
+        <w:rPr>
+          <w:color w:val="2F5496" w:themeColor="accent1" w:themeShade="BF"/>
+        </w:rPr>
+        <w:t>tilise un langage simple et compréhensible.</w:t>
+      </w:r>
+      <w:r>
+        <w:rPr>
+          <w:color w:val="2F5496" w:themeColor="accent1" w:themeShade="BF"/>
+        </w:rPr>
+        <w:t>n</w:t>
+      </w:r>
+      <w:r>
+        <w:rPr>
+          <w:color w:val="2F5496" w:themeColor="accent1" w:themeShade="BF"/>
+        </w:rPr>
+        <w:t>'invente aucune information.Donne un exemple concret pour chaque métrique.</w:t>
+      </w:r>
+      <w:r>
+        <w:rPr>
+          <w:color w:val="2F5496" w:themeColor="accent1" w:themeShade="BF"/>
+        </w:rPr>
+        <w:t xml:space="preserve"> e</w:t>
+      </w:r>
+      <w:r>
+        <w:rPr>
+          <w:color w:val="2F5496" w:themeColor="accent1" w:themeShade="BF"/>
+        </w:rPr>
+        <w:t>xplique clairement les différences entre MAE, MSE et RMSE.</w:t>
+      </w:r>
+    </w:p>
+    <w:p>
+      <w:pPr>
+        <w:pStyle w:val="NormalWeb"/>
+        <w:spacing w:before="0" w:beforeAutospacing="0" w:after="0" w:afterAutospacing="0"/>
+        <w:ind w:left="708"/>
+        <w:rPr>
+          <w:color w:val="2F5496" w:themeColor="accent1" w:themeShade="BF"/>
+        </w:rPr>
+      </w:pPr>
+      <w:r>
+        <w:rPr>
+          <w:color w:val="2F5496" w:themeColor="accent1" w:themeShade="BF"/>
+        </w:rPr>
+        <w:t>Présente les résultats sous forme de tableau avec les colonnes suivantes :</w:t>
+      </w:r>
+    </w:p>
+    <w:p>
+      <w:pPr>
+        <w:pStyle w:val="NormalWeb"/>
+        <w:spacing w:before="0" w:beforeAutospacing="0" w:after="0" w:afterAutospacing="0"/>
+        <w:ind w:left="708"/>
+        <w:rPr>
+          <w:color w:val="2F5496" w:themeColor="accent1" w:themeShade="BF"/>
+        </w:rPr>
+      </w:pPr>
+      <w:r>
+        <w:rPr>
+          <w:color w:val="2F5496" w:themeColor="accent1" w:themeShade="BF"/>
+        </w:rPr>
+        <w:t xml:space="preserve"> Métrique </w:t>
+      </w:r>
+      <w:r>
+        <w:rPr>
+          <w:color w:val="2F5496" w:themeColor="accent1" w:themeShade="BF"/>
+        </w:rPr>
+        <w:t>,</w:t>
+      </w:r>
+      <w:r>
+        <w:rPr>
+          <w:color w:val="2F5496" w:themeColor="accent1" w:themeShade="BF"/>
+        </w:rPr>
+        <w:t>Définition</w:t>
+      </w:r>
+      <w:r>
+        <w:rPr>
+          <w:color w:val="2F5496" w:themeColor="accent1" w:themeShade="BF"/>
+        </w:rPr>
+        <w:t>,</w:t>
+      </w:r>
+      <w:r>
+        <w:rPr>
+          <w:color w:val="2F5496" w:themeColor="accent1" w:themeShade="BF"/>
+        </w:rPr>
+        <w:t xml:space="preserve"> Interprétation</w:t>
+      </w:r>
+      <w:r>
+        <w:rPr>
+          <w:color w:val="2F5496" w:themeColor="accent1" w:themeShade="BF"/>
+        </w:rPr>
+        <w:t>,</w:t>
+      </w:r>
+      <w:r>
+        <w:rPr>
+          <w:color w:val="2F5496" w:themeColor="accent1" w:themeShade="BF"/>
+        </w:rPr>
+        <w:t xml:space="preserve"> Exemple concret</w:t>
+      </w:r>
+      <w:r>
+        <w:rPr>
+          <w:color w:val="2F5496" w:themeColor="accent1" w:themeShade="BF"/>
+        </w:rPr>
+        <w:t>,</w:t>
+      </w:r>
+      <w:r>
+        <w:rPr>
+          <w:color w:val="2F5496" w:themeColor="accent1" w:themeShade="BF"/>
+        </w:rPr>
+        <w:t xml:space="preserve"> Contexte d'utilisation </w:t>
+      </w:r>
+    </w:p>
+    <w:p>
+      <w:pPr>
+        <w:spacing w:after="0"/>
+        <w:rPr>
+          <w:rFonts w:ascii="Times New Roman" w:hAnsi="Times New Roman" w:cs="Times New Roman"/>
+          <w:color w:val="2F5496" w:themeColor="accent1" w:themeShade="BF"/>
+          <w:sz w:val="24"/>
+          <w:szCs w:val="24"/>
+        </w:rPr>
+      </w:pPr>
+    </w:p>
+    <w:p>
+      <w:pPr>
+        <w:spacing w:after="0"/>
+        <w:rPr>
+          <w:rFonts w:ascii="Times New Roman" w:hAnsi="Times New Roman" w:cs="Times New Roman"/>
+          <w:color w:val="2F5496" w:themeColor="accent1" w:themeShade="BF"/>
+          <w:sz w:val="24"/>
+          <w:szCs w:val="24"/>
+        </w:rPr>
+      </w:pPr>
+      <w:r>
+        <w:rPr>
+          <w:rFonts w:ascii="Times New Roman" w:hAnsi="Times New Roman" w:cs="Times New Roman"/>
+          <w:color w:val="2F5496" w:themeColor="accent1" w:themeShade="BF"/>
+          <w:sz w:val="24"/>
+          <w:szCs w:val="24"/>
+        </w:rPr>
+        <w:drawing>
+          <wp:inline distT="0" distB="0" distL="0" distR="0" wp14:anchorId="702B5D78" wp14:editId="5D20E8B8">
+            <wp:extent cx="5760720" cy="4005580"/>
+            <wp:effectExtent l="0" t="0" r="0" b="0"/>
+            <wp:docPr id="44" name="Image 44"/>
+            <wp:cNvGraphicFramePr>
+              <a:graphicFrameLocks xmlns:a="http://schemas.openxmlformats.org/drawingml/2006/main" noChangeAspect="1"/>
+            </wp:cNvGraphicFramePr>
+            <a:graphic xmlns:a="http://schemas.openxmlformats.org/drawingml/2006/main">
+              <a:graphicData uri="http://schemas.openxmlformats.org/drawingml/2006/picture">
+                <pic:pic xmlns:pic="http://schemas.openxmlformats.org/drawingml/2006/picture">
+                  <pic:nvPicPr>
+                    <pic:cNvPr id="1" name=""/>
+                    <pic:cNvPicPr/>
+                  </pic:nvPicPr>
+                  <pic:blipFill>
+                    <a:blip r:embed="rId47"/>
+                    <a:stretch>
+                      <a:fillRect/>
+                    </a:stretch>
+                  </pic:blipFill>
+                  <pic:spPr>
+                    <a:xfrm>
+                      <a:off x="0" y="0"/>
+                      <a:ext cx="5760720" cy="4005580"/>
+                    </a:xfrm>
+                    <a:prstGeom prst="rect">
+                      <a:avLst/>
+                    </a:prstGeom>
+                  </pic:spPr>
+                </pic:pic>
+              </a:graphicData>
+            </a:graphic>
+          </wp:inline>
+        </w:drawing>
+      </w:r>
+    </w:p>
+    <w:p>
+      <w:pPr>
+        <w:spacing w:after="0"/>
+        <w:rPr>
+          <w:rFonts w:ascii="Times New Roman" w:hAnsi="Times New Roman" w:cs="Times New Roman"/>
+          <w:color w:val="2F5496" w:themeColor="accent1" w:themeShade="BF"/>
+          <w:sz w:val="24"/>
+          <w:szCs w:val="24"/>
+        </w:rPr>
+      </w:pPr>
+      <w:r>
+        <w:rPr>
+          <w:rFonts w:ascii="Times New Roman" w:hAnsi="Times New Roman" w:cs="Times New Roman"/>
+          <w:color w:val="2F5496" w:themeColor="accent1" w:themeShade="BF"/>
+          <w:sz w:val="24"/>
+          <w:szCs w:val="24"/>
+        </w:rPr>
+        <w:lastRenderedPageBreak/>
+        <w:drawing>
+          <wp:inline distT="0" distB="0" distL="0" distR="0" wp14:anchorId="465A9F07" wp14:editId="7CAD2F81">
+            <wp:extent cx="5760720" cy="3756660"/>
+            <wp:effectExtent l="0" t="0" r="0" b="0"/>
+            <wp:docPr id="45" name="Image 45"/>
+            <wp:cNvGraphicFramePr>
+              <a:graphicFrameLocks xmlns:a="http://schemas.openxmlformats.org/drawingml/2006/main" noChangeAspect="1"/>
+            </wp:cNvGraphicFramePr>
+            <a:graphic xmlns:a="http://schemas.openxmlformats.org/drawingml/2006/main">
+              <a:graphicData uri="http://schemas.openxmlformats.org/drawingml/2006/picture">
+                <pic:pic xmlns:pic="http://schemas.openxmlformats.org/drawingml/2006/picture">
+                  <pic:nvPicPr>
+                    <pic:cNvPr id="1" name=""/>
+                    <pic:cNvPicPr/>
+                  </pic:nvPicPr>
+                  <pic:blipFill>
+                    <a:blip r:embed="rId48"/>
+                    <a:stretch>
+                      <a:fillRect/>
+                    </a:stretch>
+                  </pic:blipFill>
+                  <pic:spPr>
+                    <a:xfrm>
+                      <a:off x="0" y="0"/>
+                      <a:ext cx="5760720" cy="3756660"/>
+                    </a:xfrm>
+                    <a:prstGeom prst="rect">
+                      <a:avLst/>
+                    </a:prstGeom>
+                  </pic:spPr>
+                </pic:pic>
+              </a:graphicData>
+            </a:graphic>
+          </wp:inline>
+        </w:drawing>
+      </w:r>
+    </w:p>
+    <w:p>
+      <w:pPr>
+        <w:spacing w:after="0"/>
+        <w:rPr>
+          <w:rFonts w:ascii="Times New Roman" w:hAnsi="Times New Roman" w:cs="Times New Roman"/>
+          <w:color w:val="2F5496" w:themeColor="accent1" w:themeShade="BF"/>
+          <w:sz w:val="24"/>
+          <w:szCs w:val="24"/>
+        </w:rPr>
+      </w:pPr>
+      <w:r>
+        <w:rPr>
+          <w:rFonts w:ascii="Times New Roman" w:hAnsi="Times New Roman" w:cs="Times New Roman"/>
+          <w:color w:val="2F5496" w:themeColor="accent1" w:themeShade="BF"/>
+          <w:sz w:val="24"/>
+          <w:szCs w:val="24"/>
+        </w:rPr>
+        <w:drawing>
+          <wp:inline distT="0" distB="0" distL="0" distR="0" wp14:anchorId="0760AC96" wp14:editId="4EE7EDD9">
+            <wp:extent cx="5760720" cy="3867150"/>
+            <wp:effectExtent l="0" t="0" r="0" b="0"/>
+            <wp:docPr id="46" name="Image 46"/>
+            <wp:cNvGraphicFramePr>
+              <a:graphicFrameLocks xmlns:a="http://schemas.openxmlformats.org/drawingml/2006/main" noChangeAspect="1"/>
+            </wp:cNvGraphicFramePr>
+            <a:graphic xmlns:a="http://schemas.openxmlformats.org/drawingml/2006/main">
+              <a:graphicData uri="http://schemas.openxmlformats.org/drawingml/2006/picture">
+                <pic:pic xmlns:pic="http://schemas.openxmlformats.org/drawingml/2006/picture">
+                  <pic:nvPicPr>
+                    <pic:cNvPr id="1" name=""/>
+                    <pic:cNvPicPr/>
+                  </pic:nvPicPr>
+                  <pic:blipFill>
+                    <a:blip r:embed="rId49"/>
+                    <a:stretch>
+                      <a:fillRect/>
+                    </a:stretch>
+                  </pic:blipFill>
+                  <pic:spPr>
+                    <a:xfrm>
+                      <a:off x="0" y="0"/>
+                      <a:ext cx="5760720" cy="3867150"/>
+                    </a:xfrm>
+                    <a:prstGeom prst="rect">
+                      <a:avLst/>
+                    </a:prstGeom>
+                  </pic:spPr>
+                </pic:pic>
+              </a:graphicData>
+            </a:graphic>
+          </wp:inline>
+        </w:drawing>
+      </w:r>
+    </w:p>
+    <w:p>
+      <w:pPr>
+        <w:spacing w:after="0"/>
+        <w:rPr>
+          <w:rFonts w:ascii="Times New Roman" w:hAnsi="Times New Roman" w:cs="Times New Roman"/>
+          <w:color w:val="2F5496" w:themeColor="accent1" w:themeShade="BF"/>
+          <w:sz w:val="24"/>
+          <w:szCs w:val="24"/>
+        </w:rPr>
+      </w:pPr>
+      <w:r>
+        <w:rPr>
+          <w:rFonts w:ascii="Times New Roman" w:hAnsi="Times New Roman" w:cs="Times New Roman"/>
+          <w:color w:val="2F5496" w:themeColor="accent1" w:themeShade="BF"/>
+          <w:sz w:val="24"/>
+          <w:szCs w:val="24"/>
+        </w:rPr>
+        <w:lastRenderedPageBreak/>
+        <w:drawing>
+          <wp:inline distT="0" distB="0" distL="0" distR="0" wp14:anchorId="736A129F" wp14:editId="2508E358">
+            <wp:extent cx="5760720" cy="3579495"/>
+            <wp:effectExtent l="0" t="0" r="0" b="1905"/>
+            <wp:docPr id="47" name="Image 47"/>
+            <wp:cNvGraphicFramePr>
+              <a:graphicFrameLocks xmlns:a="http://schemas.openxmlformats.org/drawingml/2006/main" noChangeAspect="1"/>
+            </wp:cNvGraphicFramePr>
+            <a:graphic xmlns:a="http://schemas.openxmlformats.org/drawingml/2006/main">
+              <a:graphicData uri="http://schemas.openxmlformats.org/drawingml/2006/picture">
+                <pic:pic xmlns:pic="http://schemas.openxmlformats.org/drawingml/2006/picture">
+                  <pic:nvPicPr>
+                    <pic:cNvPr id="1" name=""/>
+                    <pic:cNvPicPr/>
+                  </pic:nvPicPr>
+                  <pic:blipFill>
+                    <a:blip r:embed="rId50"/>
+                    <a:stretch>
+                      <a:fillRect/>
+                    </a:stretch>
+                  </pic:blipFill>
+                  <pic:spPr>
+                    <a:xfrm>
+                      <a:off x="0" y="0"/>
+                      <a:ext cx="5760720" cy="3579495"/>
+                    </a:xfrm>
+                    <a:prstGeom prst="rect">
+                      <a:avLst/>
+                    </a:prstGeom>
+                  </pic:spPr>
+                </pic:pic>
+              </a:graphicData>
+            </a:graphic>
+          </wp:inline>
+        </w:drawing>
+      </w:r>
     </w:p>
     <w:sectPr>
-      <w:headerReference w:type="default" r:id="rId47"/>
-      <w:footerReference w:type="default" r:id="rId48"/>
+      <w:headerReference w:type="default" r:id="rId51"/>
+      <w:footerReference w:type="default" r:id="rId52"/>
       <w:pgSz w:w="11906" w:h="16838"/>
       <w:pgMar w:top="1417" w:right="1417" w:bottom="1417" w:left="1417" w:header="708" w:footer="708" w:gutter="0"/>
       <w:pgBorders w:offsetFrom="page">
@@ -12666,6 +13332,155 @@
     </w:lvl>
   </w:abstractNum>
   <w:abstractNum w:abstractNumId="1" w15:restartNumberingAfterBreak="0">
+    <w:nsid w:val="0B270E36"/>
+    <w:multiLevelType w:val="multilevel"/>
+    <w:tmpl w:val="A60C969C"/>
+    <w:lvl w:ilvl="0">
+      <w:start w:val="1"/>
+      <w:numFmt w:val="bullet"/>
+      <w:lvlText w:val=""/>
+      <w:lvlJc w:val="left"/>
+      <w:pPr>
+        <w:tabs>
+          <w:tab w:val="num" w:pos="720"/>
+        </w:tabs>
+        <w:ind w:left="720" w:hanging="360"/>
+      </w:pPr>
+      <w:rPr>
+        <w:rFonts w:ascii="Symbol" w:hAnsi="Symbol" w:hint="default"/>
+        <w:sz w:val="20"/>
+      </w:rPr>
+    </w:lvl>
+    <w:lvl w:ilvl="1" w:tentative="1">
+      <w:start w:val="1"/>
+      <w:numFmt w:val="bullet"/>
+      <w:lvlText w:val="o"/>
+      <w:lvlJc w:val="left"/>
+      <w:pPr>
+        <w:tabs>
+          <w:tab w:val="num" w:pos="1440"/>
+        </w:tabs>
+        <w:ind w:left="1440" w:hanging="360"/>
+      </w:pPr>
+      <w:rPr>
+        <w:rFonts w:ascii="Courier New" w:hAnsi="Courier New" w:hint="default"/>
+        <w:sz w:val="20"/>
+      </w:rPr>
+    </w:lvl>
+    <w:lvl w:ilvl="2" w:tentative="1">
+      <w:start w:val="1"/>
+      <w:numFmt w:val="bullet"/>
+      <w:lvlText w:val=""/>
+      <w:lvlJc w:val="left"/>
+      <w:pPr>
+        <w:tabs>
+          <w:tab w:val="num" w:pos="2160"/>
+        </w:tabs>
+        <w:ind w:left="2160" w:hanging="360"/>
+      </w:pPr>
+      <w:rPr>
+        <w:rFonts w:ascii="Wingdings" w:hAnsi="Wingdings" w:hint="default"/>
+        <w:sz w:val="20"/>
+      </w:rPr>
+    </w:lvl>
+    <w:lvl w:ilvl="3" w:tentative="1">
+      <w:start w:val="1"/>
+      <w:numFmt w:val="bullet"/>
+      <w:lvlText w:val=""/>
+      <w:lvlJc w:val="left"/>
+      <w:pPr>
+        <w:tabs>
+          <w:tab w:val="num" w:pos="2880"/>
+        </w:tabs>
+        <w:ind w:left="2880" w:hanging="360"/>
+      </w:pPr>
+      <w:rPr>
+        <w:rFonts w:ascii="Wingdings" w:hAnsi="Wingdings" w:hint="default"/>
+        <w:sz w:val="20"/>
+      </w:rPr>
+    </w:lvl>
+    <w:lvl w:ilvl="4" w:tentative="1">
+      <w:start w:val="1"/>
+      <w:numFmt w:val="bullet"/>
+      <w:lvlText w:val=""/>
+      <w:lvlJc w:val="left"/>
+      <w:pPr>
+        <w:tabs>
+          <w:tab w:val="num" w:pos="3600"/>
+        </w:tabs>
+        <w:ind w:left="3600" w:hanging="360"/>
+      </w:pPr>
+      <w:rPr>
+        <w:rFonts w:ascii="Wingdings" w:hAnsi="Wingdings" w:hint="default"/>
+        <w:sz w:val="20"/>
+      </w:rPr>
+    </w:lvl>
+    <w:lvl w:ilvl="5" w:tentative="1">
+      <w:start w:val="1"/>
+      <w:numFmt w:val="bullet"/>
+      <w:lvlText w:val=""/>
+      <w:lvlJc w:val="left"/>
+      <w:pPr>
+        <w:tabs>
+          <w:tab w:val="num" w:pos="4320"/>
+        </w:tabs>
+        <w:ind w:left="4320" w:hanging="360"/>
+      </w:pPr>
+      <w:rPr>
+        <w:rFonts w:ascii="Wingdings" w:hAnsi="Wingdings" w:hint="default"/>
+        <w:sz w:val="20"/>
+      </w:rPr>
+    </w:lvl>
+    <w:lvl w:ilvl="6" w:tentative="1">
+      <w:start w:val="1"/>
+      <w:numFmt w:val="bullet"/>
+      <w:lvlText w:val=""/>
+      <w:lvlJc w:val="left"/>
+      <w:pPr>
+        <w:tabs>
+          <w:tab w:val="num" w:pos="5040"/>
+        </w:tabs>
+        <w:ind w:left="5040" w:hanging="360"/>
+      </w:pPr>
+      <w:rPr>
+        <w:rFonts w:ascii="Wingdings" w:hAnsi="Wingdings" w:hint="default"/>
+        <w:sz w:val="20"/>
+      </w:rPr>
+    </w:lvl>
+    <w:lvl w:ilvl="7" w:tentative="1">
+      <w:start w:val="1"/>
+      <w:numFmt w:val="bullet"/>
+      <w:lvlText w:val=""/>
+      <w:lvlJc w:val="left"/>
+      <w:pPr>
+        <w:tabs>
+          <w:tab w:val="num" w:pos="5760"/>
+        </w:tabs>
+        <w:ind w:left="5760" w:hanging="360"/>
+      </w:pPr>
+      <w:rPr>
+        <w:rFonts w:ascii="Wingdings" w:hAnsi="Wingdings" w:hint="default"/>
+        <w:sz w:val="20"/>
+      </w:rPr>
+    </w:lvl>
+    <w:lvl w:ilvl="8" w:tentative="1">
+      <w:start w:val="1"/>
+      <w:numFmt w:val="bullet"/>
+      <w:lvlText w:val=""/>
+      <w:lvlJc w:val="left"/>
+      <w:pPr>
+        <w:tabs>
+          <w:tab w:val="num" w:pos="6480"/>
+        </w:tabs>
+        <w:ind w:left="6480" w:hanging="360"/>
+      </w:pPr>
+      <w:rPr>
+        <w:rFonts w:ascii="Wingdings" w:hAnsi="Wingdings" w:hint="default"/>
+        <w:sz w:val="20"/>
+      </w:rPr>
+    </w:lvl>
+  </w:abstractNum>
+  <w:abstractNum w:abstractNumId="2" w15:restartNumberingAfterBreak="0">
     <w:nsid w:val="14C8000A"/>
     <w:multiLevelType w:val="multilevel"/>
     <w:tmpl w:val="42308B90"/>
@@ -12814,7 +13629,7 @@
       </w:rPr>
     </w:lvl>
   </w:abstractNum>
-  <w:abstractNum w:abstractNumId="2" w15:restartNumberingAfterBreak="0">
+  <w:abstractNum w:abstractNumId="3" w15:restartNumberingAfterBreak="0">
     <w:nsid w:val="16B42315"/>
     <w:multiLevelType w:val="multilevel"/>
     <w:tmpl w:val="3CF28954"/>
@@ -12963,7 +13778,7 @@
       </w:rPr>
     </w:lvl>
   </w:abstractNum>
-  <w:abstractNum w:abstractNumId="3" w15:restartNumberingAfterBreak="0">
+  <w:abstractNum w:abstractNumId="4" w15:restartNumberingAfterBreak="0">
     <w:nsid w:val="1A8F2050"/>
     <w:multiLevelType w:val="multilevel"/>
     <w:tmpl w:val="CCB8542C"/>
@@ -13112,7 +13927,7 @@
       </w:rPr>
     </w:lvl>
   </w:abstractNum>
-  <w:abstractNum w:abstractNumId="4" w15:restartNumberingAfterBreak="0">
+  <w:abstractNum w:abstractNumId="5" w15:restartNumberingAfterBreak="0">
     <w:nsid w:val="1B0136B9"/>
     <w:multiLevelType w:val="multilevel"/>
     <w:tmpl w:val="4E209CD8"/>
@@ -13261,7 +14076,7 @@
       </w:rPr>
     </w:lvl>
   </w:abstractNum>
-  <w:abstractNum w:abstractNumId="5" w15:restartNumberingAfterBreak="0">
+  <w:abstractNum w:abstractNumId="6" w15:restartNumberingAfterBreak="0">
     <w:nsid w:val="1B070D50"/>
     <w:multiLevelType w:val="multilevel"/>
     <w:tmpl w:val="AC640DF8"/>
@@ -13410,7 +14225,7 @@
       </w:rPr>
     </w:lvl>
   </w:abstractNum>
-  <w:abstractNum w:abstractNumId="6" w15:restartNumberingAfterBreak="0">
+  <w:abstractNum w:abstractNumId="7" w15:restartNumberingAfterBreak="0">
     <w:nsid w:val="23FA75D2"/>
     <w:multiLevelType w:val="multilevel"/>
     <w:tmpl w:val="7B086CF2"/>
@@ -13523,7 +14338,7 @@
       </w:pPr>
     </w:lvl>
   </w:abstractNum>
-  <w:abstractNum w:abstractNumId="7" w15:restartNumberingAfterBreak="0">
+  <w:abstractNum w:abstractNumId="8" w15:restartNumberingAfterBreak="0">
     <w:nsid w:val="29B3028B"/>
     <w:multiLevelType w:val="multilevel"/>
     <w:tmpl w:val="83C0BEE6"/>
@@ -13672,7 +14487,7 @@
       </w:rPr>
     </w:lvl>
   </w:abstractNum>
-  <w:abstractNum w:abstractNumId="8" w15:restartNumberingAfterBreak="0">
+  <w:abstractNum w:abstractNumId="9" w15:restartNumberingAfterBreak="0">
     <w:nsid w:val="29C101CC"/>
     <w:multiLevelType w:val="multilevel"/>
     <w:tmpl w:val="29C275F4"/>
@@ -13821,7 +14636,7 @@
       </w:rPr>
     </w:lvl>
   </w:abstractNum>
-  <w:abstractNum w:abstractNumId="9" w15:restartNumberingAfterBreak="0">
+  <w:abstractNum w:abstractNumId="10" w15:restartNumberingAfterBreak="0">
     <w:nsid w:val="2C003D88"/>
     <w:multiLevelType w:val="multilevel"/>
     <w:tmpl w:val="A948D544"/>
@@ -13970,7 +14785,7 @@
       </w:rPr>
     </w:lvl>
   </w:abstractNum>
-  <w:abstractNum w:abstractNumId="10" w15:restartNumberingAfterBreak="0">
+  <w:abstractNum w:abstractNumId="11" w15:restartNumberingAfterBreak="0">
     <w:nsid w:val="30817C99"/>
     <w:multiLevelType w:val="hybridMultilevel"/>
     <w:tmpl w:val="B28054F4"/>
@@ -14056,7 +14871,7 @@
       </w:pPr>
     </w:lvl>
   </w:abstractNum>
-  <w:abstractNum w:abstractNumId="11" w15:restartNumberingAfterBreak="0">
+  <w:abstractNum w:abstractNumId="12" w15:restartNumberingAfterBreak="0">
     <w:nsid w:val="32024712"/>
     <w:multiLevelType w:val="multilevel"/>
     <w:tmpl w:val="7716EFCE"/>
@@ -14205,7 +15020,7 @@
       </w:rPr>
     </w:lvl>
   </w:abstractNum>
-  <w:abstractNum w:abstractNumId="12" w15:restartNumberingAfterBreak="0">
+  <w:abstractNum w:abstractNumId="13" w15:restartNumberingAfterBreak="0">
     <w:nsid w:val="3A273CBD"/>
     <w:multiLevelType w:val="multilevel"/>
     <w:tmpl w:val="A5564738"/>
@@ -14354,7 +15169,7 @@
       </w:rPr>
     </w:lvl>
   </w:abstractNum>
-  <w:abstractNum w:abstractNumId="13" w15:restartNumberingAfterBreak="0">
+  <w:abstractNum w:abstractNumId="14" w15:restartNumberingAfterBreak="0">
     <w:nsid w:val="3CA24848"/>
     <w:multiLevelType w:val="hybridMultilevel"/>
     <w:tmpl w:val="76B802A4"/>
@@ -14467,7 +15282,156 @@
       </w:rPr>
     </w:lvl>
   </w:abstractNum>
-  <w:abstractNum w:abstractNumId="14" w15:restartNumberingAfterBreak="0">
+  <w:abstractNum w:abstractNumId="15" w15:restartNumberingAfterBreak="0">
+    <w:nsid w:val="3DF765F8"/>
+    <w:multiLevelType w:val="multilevel"/>
+    <w:tmpl w:val="62861B58"/>
+    <w:lvl w:ilvl="0">
+      <w:start w:val="1"/>
+      <w:numFmt w:val="bullet"/>
+      <w:lvlText w:val=""/>
+      <w:lvlJc w:val="left"/>
+      <w:pPr>
+        <w:tabs>
+          <w:tab w:val="num" w:pos="720"/>
+        </w:tabs>
+        <w:ind w:left="720" w:hanging="360"/>
+      </w:pPr>
+      <w:rPr>
+        <w:rFonts w:ascii="Symbol" w:hAnsi="Symbol" w:hint="default"/>
+        <w:sz w:val="20"/>
+      </w:rPr>
+    </w:lvl>
+    <w:lvl w:ilvl="1" w:tentative="1">
+      <w:start w:val="1"/>
+      <w:numFmt w:val="bullet"/>
+      <w:lvlText w:val="o"/>
+      <w:lvlJc w:val="left"/>
+      <w:pPr>
+        <w:tabs>
+          <w:tab w:val="num" w:pos="1440"/>
+        </w:tabs>
+        <w:ind w:left="1440" w:hanging="360"/>
+      </w:pPr>
+      <w:rPr>
+        <w:rFonts w:ascii="Courier New" w:hAnsi="Courier New" w:hint="default"/>
+        <w:sz w:val="20"/>
+      </w:rPr>
+    </w:lvl>
+    <w:lvl w:ilvl="2" w:tentative="1">
+      <w:start w:val="1"/>
+      <w:numFmt w:val="bullet"/>
+      <w:lvlText w:val=""/>
+      <w:lvlJc w:val="left"/>
+      <w:pPr>
+        <w:tabs>
+          <w:tab w:val="num" w:pos="2160"/>
+        </w:tabs>
+        <w:ind w:left="2160" w:hanging="360"/>
+      </w:pPr>
+      <w:rPr>
+        <w:rFonts w:ascii="Wingdings" w:hAnsi="Wingdings" w:hint="default"/>
+        <w:sz w:val="20"/>
+      </w:rPr>
+    </w:lvl>
+    <w:lvl w:ilvl="3" w:tentative="1">
+      <w:start w:val="1"/>
+      <w:numFmt w:val="bullet"/>
+      <w:lvlText w:val=""/>
+      <w:lvlJc w:val="left"/>
+      <w:pPr>
+        <w:tabs>
+          <w:tab w:val="num" w:pos="2880"/>
+        </w:tabs>
+        <w:ind w:left="2880" w:hanging="360"/>
+      </w:pPr>
+      <w:rPr>
+        <w:rFonts w:ascii="Wingdings" w:hAnsi="Wingdings" w:hint="default"/>
+        <w:sz w:val="20"/>
+      </w:rPr>
+    </w:lvl>
+    <w:lvl w:ilvl="4" w:tentative="1">
+      <w:start w:val="1"/>
+      <w:numFmt w:val="bullet"/>
+      <w:lvlText w:val=""/>
+      <w:lvlJc w:val="left"/>
+      <w:pPr>
+        <w:tabs>
+          <w:tab w:val="num" w:pos="3600"/>
+        </w:tabs>
+        <w:ind w:left="3600" w:hanging="360"/>
+      </w:pPr>
+      <w:rPr>
+        <w:rFonts w:ascii="Wingdings" w:hAnsi="Wingdings" w:hint="default"/>
+        <w:sz w:val="20"/>
+      </w:rPr>
+    </w:lvl>
+    <w:lvl w:ilvl="5" w:tentative="1">
+      <w:start w:val="1"/>
+      <w:numFmt w:val="bullet"/>
+      <w:lvlText w:val=""/>
+      <w:lvlJc w:val="left"/>
+      <w:pPr>
+        <w:tabs>
+          <w:tab w:val="num" w:pos="4320"/>
+        </w:tabs>
+        <w:ind w:left="4320" w:hanging="360"/>
+      </w:pPr>
+      <w:rPr>
+        <w:rFonts w:ascii="Wingdings" w:hAnsi="Wingdings" w:hint="default"/>
+        <w:sz w:val="20"/>
+      </w:rPr>
+    </w:lvl>
+    <w:lvl w:ilvl="6" w:tentative="1">
+      <w:start w:val="1"/>
+      <w:numFmt w:val="bullet"/>
+      <w:lvlText w:val=""/>
+      <w:lvlJc w:val="left"/>
+      <w:pPr>
+        <w:tabs>
+          <w:tab w:val="num" w:pos="5040"/>
+        </w:tabs>
+        <w:ind w:left="5040" w:hanging="360"/>
+      </w:pPr>
+      <w:rPr>
+        <w:rFonts w:ascii="Wingdings" w:hAnsi="Wingdings" w:hint="default"/>
+        <w:sz w:val="20"/>
+      </w:rPr>
+    </w:lvl>
+    <w:lvl w:ilvl="7" w:tentative="1">
+      <w:start w:val="1"/>
+      <w:numFmt w:val="bullet"/>
+      <w:lvlText w:val=""/>
+      <w:lvlJc w:val="left"/>
+      <w:pPr>
+        <w:tabs>
+          <w:tab w:val="num" w:pos="5760"/>
+        </w:tabs>
+        <w:ind w:left="5760" w:hanging="360"/>
+      </w:pPr>
+      <w:rPr>
+        <w:rFonts w:ascii="Wingdings" w:hAnsi="Wingdings" w:hint="default"/>
+        <w:sz w:val="20"/>
+      </w:rPr>
+    </w:lvl>
+    <w:lvl w:ilvl="8" w:tentative="1">
+      <w:start w:val="1"/>
+      <w:numFmt w:val="bullet"/>
+      <w:lvlText w:val=""/>
+      <w:lvlJc w:val="left"/>
+      <w:pPr>
+        <w:tabs>
+          <w:tab w:val="num" w:pos="6480"/>
+        </w:tabs>
+        <w:ind w:left="6480" w:hanging="360"/>
+      </w:pPr>
+      <w:rPr>
+        <w:rFonts w:ascii="Wingdings" w:hAnsi="Wingdings" w:hint="default"/>
+        <w:sz w:val="20"/>
+      </w:rPr>
+    </w:lvl>
+  </w:abstractNum>
+  <w:abstractNum w:abstractNumId="16" w15:restartNumberingAfterBreak="0">
     <w:nsid w:val="4150496C"/>
     <w:multiLevelType w:val="multilevel"/>
     <w:tmpl w:val="F974763E"/>
@@ -14616,7 +15580,120 @@
       </w:rPr>
     </w:lvl>
   </w:abstractNum>
-  <w:abstractNum w:abstractNumId="15" w15:restartNumberingAfterBreak="0">
+  <w:abstractNum w:abstractNumId="17" w15:restartNumberingAfterBreak="0">
+    <w:nsid w:val="42B44639"/>
+    <w:multiLevelType w:val="multilevel"/>
+    <w:tmpl w:val="8CA63582"/>
+    <w:lvl w:ilvl="0">
+      <w:start w:val="1"/>
+      <w:numFmt w:val="decimal"/>
+      <w:lvlText w:val="%1."/>
+      <w:lvlJc w:val="left"/>
+      <w:pPr>
+        <w:tabs>
+          <w:tab w:val="num" w:pos="720"/>
+        </w:tabs>
+        <w:ind w:left="720" w:hanging="360"/>
+      </w:pPr>
+    </w:lvl>
+    <w:lvl w:ilvl="1" w:tentative="1">
+      <w:start w:val="1"/>
+      <w:numFmt w:val="decimal"/>
+      <w:lvlText w:val="%2."/>
+      <w:lvlJc w:val="left"/>
+      <w:pPr>
+        <w:tabs>
+          <w:tab w:val="num" w:pos="1440"/>
+        </w:tabs>
+        <w:ind w:left="1440" w:hanging="360"/>
+      </w:pPr>
+    </w:lvl>
+    <w:lvl w:ilvl="2" w:tentative="1">
+      <w:start w:val="1"/>
+      <w:numFmt w:val="decimal"/>
+      <w:lvlText w:val="%3."/>
+      <w:lvlJc w:val="left"/>
+      <w:pPr>
+        <w:tabs>
+          <w:tab w:val="num" w:pos="2160"/>
+        </w:tabs>
+        <w:ind w:left="2160" w:hanging="360"/>
+      </w:pPr>
+    </w:lvl>
+    <w:lvl w:ilvl="3" w:tentative="1">
+      <w:start w:val="1"/>
+      <w:numFmt w:val="decimal"/>
+      <w:lvlText w:val="%4."/>
+      <w:lvlJc w:val="left"/>
+      <w:pPr>
+        <w:tabs>
+          <w:tab w:val="num" w:pos="2880"/>
+        </w:tabs>
+        <w:ind w:left="2880" w:hanging="360"/>
+      </w:pPr>
+    </w:lvl>
+    <w:lvl w:ilvl="4" w:tentative="1">
+      <w:start w:val="1"/>
+      <w:numFmt w:val="decimal"/>
+      <w:lvlText w:val="%5."/>
+      <w:lvlJc w:val="left"/>
+      <w:pPr>
+        <w:tabs>
+          <w:tab w:val="num" w:pos="3600"/>
+        </w:tabs>
+        <w:ind w:left="3600" w:hanging="360"/>
+      </w:pPr>
+    </w:lvl>
+    <w:lvl w:ilvl="5" w:tentative="1">
+      <w:start w:val="1"/>
+      <w:numFmt w:val="decimal"/>
+      <w:lvlText w:val="%6."/>
+      <w:lvlJc w:val="left"/>
+      <w:pPr>
+        <w:tabs>
+          <w:tab w:val="num" w:pos="4320"/>
+        </w:tabs>
+        <w:ind w:left="4320" w:hanging="360"/>
+      </w:pPr>
+    </w:lvl>
+    <w:lvl w:ilvl="6" w:tentative="1">
+      <w:start w:val="1"/>
+      <w:numFmt w:val="decimal"/>
+      <w:lvlText w:val="%7."/>
+      <w:lvlJc w:val="left"/>
+      <w:pPr>
+        <w:tabs>
+          <w:tab w:val="num" w:pos="5040"/>
+        </w:tabs>
+        <w:ind w:left="5040" w:hanging="360"/>
+      </w:pPr>
+    </w:lvl>
+    <w:lvl w:ilvl="7" w:tentative="1">
+      <w:start w:val="1"/>
+      <w:numFmt w:val="decimal"/>
+      <w:lvlText w:val="%8."/>
+      <w:lvlJc w:val="left"/>
+      <w:pPr>
+        <w:tabs>
+          <w:tab w:val="num" w:pos="5760"/>
+        </w:tabs>
+        <w:ind w:left="5760" w:hanging="360"/>
+      </w:pPr>
+    </w:lvl>
+    <w:lvl w:ilvl="8" w:tentative="1">
+      <w:start w:val="1"/>
+      <w:numFmt w:val="decimal"/>
+      <w:lvlText w:val="%9."/>
+      <w:lvlJc w:val="left"/>
+      <w:pPr>
+        <w:tabs>
+          <w:tab w:val="num" w:pos="6480"/>
+        </w:tabs>
+        <w:ind w:left="6480" w:hanging="360"/>
+      </w:pPr>
+    </w:lvl>
+  </w:abstractNum>
+  <w:abstractNum w:abstractNumId="18" w15:restartNumberingAfterBreak="0">
     <w:nsid w:val="4996411C"/>
     <w:multiLevelType w:val="multilevel"/>
     <w:tmpl w:val="218091C0"/>
@@ -14733,7 +15810,7 @@
       </w:pPr>
     </w:lvl>
   </w:abstractNum>
-  <w:abstractNum w:abstractNumId="16" w15:restartNumberingAfterBreak="0">
+  <w:abstractNum w:abstractNumId="19" w15:restartNumberingAfterBreak="0">
     <w:nsid w:val="4F9D0AB4"/>
     <w:multiLevelType w:val="multilevel"/>
     <w:tmpl w:val="839C6E34"/>
@@ -14882,7 +15959,7 @@
       </w:rPr>
     </w:lvl>
   </w:abstractNum>
-  <w:abstractNum w:abstractNumId="17" w15:restartNumberingAfterBreak="0">
+  <w:abstractNum w:abstractNumId="20" w15:restartNumberingAfterBreak="0">
     <w:nsid w:val="56D568C8"/>
     <w:multiLevelType w:val="multilevel"/>
     <w:tmpl w:val="3392CAD2"/>
@@ -15031,7 +16108,7 @@
       </w:rPr>
     </w:lvl>
   </w:abstractNum>
-  <w:abstractNum w:abstractNumId="18" w15:restartNumberingAfterBreak="0">
+  <w:abstractNum w:abstractNumId="21" w15:restartNumberingAfterBreak="0">
     <w:nsid w:val="57CA1CDA"/>
     <w:multiLevelType w:val="multilevel"/>
     <w:tmpl w:val="206055CE"/>
@@ -15144,7 +16221,7 @@
       </w:pPr>
     </w:lvl>
   </w:abstractNum>
-  <w:abstractNum w:abstractNumId="19" w15:restartNumberingAfterBreak="0">
+  <w:abstractNum w:abstractNumId="22" w15:restartNumberingAfterBreak="0">
     <w:nsid w:val="61053792"/>
     <w:multiLevelType w:val="multilevel"/>
     <w:tmpl w:val="49E43BFC"/>
@@ -15293,7 +16370,7 @@
       </w:rPr>
     </w:lvl>
   </w:abstractNum>
-  <w:abstractNum w:abstractNumId="20" w15:restartNumberingAfterBreak="0">
+  <w:abstractNum w:abstractNumId="23" w15:restartNumberingAfterBreak="0">
     <w:nsid w:val="6DA36487"/>
     <w:multiLevelType w:val="multilevel"/>
     <w:tmpl w:val="9C4C8532"/>
@@ -15442,7 +16519,7 @@
       </w:rPr>
     </w:lvl>
   </w:abstractNum>
-  <w:abstractNum w:abstractNumId="21" w15:restartNumberingAfterBreak="0">
+  <w:abstractNum w:abstractNumId="24" w15:restartNumberingAfterBreak="0">
     <w:nsid w:val="6EB85EAA"/>
     <w:multiLevelType w:val="hybridMultilevel"/>
     <w:tmpl w:val="DB76C824"/>
@@ -15556,70 +16633,79 @@
     </w:lvl>
   </w:abstractNum>
   <w:num w:numId="1">
-    <w:abstractNumId w:val="21"/>
+    <w:abstractNumId w:val="24"/>
   </w:num>
   <w:num w:numId="2">
-    <w:abstractNumId w:val="13"/>
+    <w:abstractNumId w:val="14"/>
   </w:num>
   <w:num w:numId="3">
-    <w:abstractNumId w:val="17"/>
+    <w:abstractNumId w:val="20"/>
   </w:num>
   <w:num w:numId="4">
+    <w:abstractNumId w:val="12"/>
+  </w:num>
+  <w:num w:numId="5">
     <w:abstractNumId w:val="11"/>
   </w:num>
-  <w:num w:numId="5">
-    <w:abstractNumId w:val="10"/>
-  </w:num>
   <w:num w:numId="6">
-    <w:abstractNumId w:val="19"/>
+    <w:abstractNumId w:val="22"/>
   </w:num>
   <w:num w:numId="7">
-    <w:abstractNumId w:val="6"/>
+    <w:abstractNumId w:val="7"/>
   </w:num>
   <w:num w:numId="8">
-    <w:abstractNumId w:val="20"/>
+    <w:abstractNumId w:val="23"/>
   </w:num>
   <w:num w:numId="9">
-    <w:abstractNumId w:val="2"/>
+    <w:abstractNumId w:val="3"/>
   </w:num>
   <w:num w:numId="10">
-    <w:abstractNumId w:val="15"/>
+    <w:abstractNumId w:val="18"/>
   </w:num>
   <w:num w:numId="11">
-    <w:abstractNumId w:val="3"/>
+    <w:abstractNumId w:val="4"/>
   </w:num>
   <w:num w:numId="12">
     <w:abstractNumId w:val="0"/>
   </w:num>
   <w:num w:numId="13">
+    <w:abstractNumId w:val="19"/>
+  </w:num>
+  <w:num w:numId="14">
+    <w:abstractNumId w:val="2"/>
+  </w:num>
+  <w:num w:numId="15">
+    <w:abstractNumId w:val="13"/>
+  </w:num>
+  <w:num w:numId="16">
+    <w:abstractNumId w:val="6"/>
+  </w:num>
+  <w:num w:numId="17">
+    <w:abstractNumId w:val="10"/>
+  </w:num>
+  <w:num w:numId="18">
+    <w:abstractNumId w:val="8"/>
+  </w:num>
+  <w:num w:numId="19">
     <w:abstractNumId w:val="16"/>
   </w:num>
-  <w:num w:numId="14">
-    <w:abstractNumId w:val="1"/>
+  <w:num w:numId="20">
+    <w:abstractNumId w:val="9"/>
   </w:num>
-  <w:num w:numId="15">
-    <w:abstractNumId w:val="12"/>
+  <w:num w:numId="21">
+    <w:abstractNumId w:val="21"/>
   </w:num>
-  <w:num w:numId="16">
+  <w:num w:numId="22">
     <w:abstractNumId w:val="5"/>
   </w:num>
-  <w:num w:numId="17">
-    <w:abstractNumId w:val="9"/>
+  <w:num w:numId="23">
+    <w:abstractNumId w:val="15"/>
   </w:num>
-  <w:num w:numId="18">
-    <w:abstractNumId w:val="7"/>
+  <w:num w:numId="24">
+    <w:abstractNumId w:val="17"/>
   </w:num>
-  <w:num w:numId="19">
-    <w:abstractNumId w:val="14"/>
-  </w:num>
-  <w:num w:numId="20">
-    <w:abstractNumId w:val="8"/>
-  </w:num>
-  <w:num w:numId="21">
-    <w:abstractNumId w:val="18"/>
-  </w:num>
-  <w:num w:numId="22">
-    <w:abstractNumId w:val="4"/>
+  <w:num w:numId="25">
+    <w:abstractNumId w:val="1"/>
   </w:num>
 </w:numbering>
 </file>

</xml_diff>

<commit_message>
poser la question sans fournir le document au LLM
</commit_message>
<xml_diff>
--- a/Atelier Prompt.docx
+++ b/Atelier Prompt.docx
@@ -8678,14 +8678,26 @@
         <w:spacing w:after="0" w:line="240" w:lineRule="auto"/>
         <w:rPr>
           <w:rFonts w:ascii="Times New Roman" w:hAnsi="Times New Roman" w:cs="Times New Roman"/>
+          <w:color w:val="2E74B6"/>
+          <w:kern w:val="0"/>
+          <w:sz w:val="32"/>
+          <w:szCs w:val="32"/>
+          <w:lang w:val="en-US"/>
+        </w:rPr>
+      </w:pPr>
+      <w:r>
+        <w:rPr>
+          <w:rFonts w:ascii="Times New Roman" w:hAnsi="Times New Roman" w:cs="Times New Roman"/>
           <w:b/>
           <w:bCs/>
           <w:color w:val="323E4F" w:themeColor="text2" w:themeShade="BF"/>
           <w:kern w:val="0"/>
           <w:sz w:val="32"/>
           <w:szCs w:val="32"/>
-        </w:rPr>
-      </w:pPr>
+          <w:lang w:val="en-US"/>
+        </w:rPr>
+        <w:t xml:space="preserve">Partie </w:t>
+      </w:r>
       <w:r>
         <w:rPr>
           <w:rFonts w:ascii="Times New Roman" w:hAnsi="Times New Roman" w:cs="Times New Roman"/>
@@ -8695,8 +8707,9 @@
           <w:kern w:val="0"/>
           <w:sz w:val="32"/>
           <w:szCs w:val="32"/>
-        </w:rPr>
-        <w:t xml:space="preserve">Partie </w:t>
+          <w:lang w:val="en-US"/>
+        </w:rPr>
+        <w:t>6</w:t>
       </w:r>
       <w:r>
         <w:rPr>
@@ -8707,36 +8720,29 @@
           <w:kern w:val="0"/>
           <w:sz w:val="32"/>
           <w:szCs w:val="32"/>
-        </w:rPr>
-        <w:t>5</w:t>
+          <w:lang w:val="en-US"/>
+        </w:rPr>
+        <w:t xml:space="preserve"> – </w:t>
       </w:r>
       <w:r>
         <w:rPr>
           <w:rFonts w:ascii="Times New Roman" w:hAnsi="Times New Roman" w:cs="Times New Roman"/>
           <w:b/>
           <w:bCs/>
-          <w:color w:val="323E4F" w:themeColor="text2" w:themeShade="BF"/>
+          <w:color w:val="1F3864" w:themeColor="accent1" w:themeShade="80"/>
           <w:kern w:val="0"/>
           <w:sz w:val="32"/>
           <w:szCs w:val="32"/>
-        </w:rPr>
-        <w:t xml:space="preserve"> – </w:t>
-      </w:r>
-      <w:r>
-        <w:rPr>
-          <w:rFonts w:ascii="Times New Roman" w:hAnsi="Times New Roman" w:cs="Times New Roman"/>
-          <w:b/>
-          <w:bCs/>
-          <w:color w:val="323E4F" w:themeColor="text2" w:themeShade="BF"/>
-          <w:kern w:val="0"/>
-          <w:sz w:val="32"/>
-          <w:szCs w:val="32"/>
-        </w:rPr>
-        <w:t>Prompts pour les applications métier</w:t>
-      </w:r>
-    </w:p>
-    <w:p>
-      <w:pPr>
+          <w:lang w:val="en-US"/>
+        </w:rPr>
+        <w:t>Prompt Engineering pour le Machine Learning</w:t>
+      </w:r>
+    </w:p>
+    <w:p>
+      <w:pPr>
+        <w:pBdr>
+          <w:left w:val="single" w:sz="24" w:space="4" w:color="323E4F" w:themeColor="text2" w:themeShade="BF"/>
+        </w:pBdr>
         <w:autoSpaceDE w:val="0"/>
         <w:autoSpaceDN w:val="0"/>
         <w:adjustRightInd w:val="0"/>
@@ -12834,6 +12840,327 @@
             </a:graphic>
           </wp:inline>
         </w:drawing>
+      </w:r>
+    </w:p>
+    <w:p>
+      <w:pPr>
+        <w:spacing w:after="0"/>
+        <w:rPr>
+          <w:rFonts w:ascii="Times New Roman" w:hAnsi="Times New Roman" w:cs="Times New Roman"/>
+          <w:color w:val="2F5496" w:themeColor="accent1" w:themeShade="BF"/>
+          <w:sz w:val="24"/>
+          <w:szCs w:val="24"/>
+        </w:rPr>
+      </w:pPr>
+    </w:p>
+    <w:p>
+      <w:pPr>
+        <w:spacing w:after="0"/>
+        <w:rPr>
+          <w:rFonts w:ascii="Times New Roman" w:hAnsi="Times New Roman" w:cs="Times New Roman"/>
+          <w:color w:val="2F5496" w:themeColor="accent1" w:themeShade="BF"/>
+          <w:sz w:val="24"/>
+          <w:szCs w:val="24"/>
+        </w:rPr>
+      </w:pPr>
+    </w:p>
+    <w:p>
+      <w:pPr>
+        <w:pBdr>
+          <w:left w:val="single" w:sz="24" w:space="4" w:color="323E4F" w:themeColor="text2" w:themeShade="BF"/>
+        </w:pBdr>
+        <w:autoSpaceDE w:val="0"/>
+        <w:autoSpaceDN w:val="0"/>
+        <w:adjustRightInd w:val="0"/>
+        <w:spacing w:after="0" w:line="240" w:lineRule="auto"/>
+        <w:rPr>
+          <w:rFonts w:ascii="CIDFont+F3" w:hAnsi="CIDFont+F3" w:cs="CIDFont+F3"/>
+          <w:color w:val="2E74B6"/>
+          <w:kern w:val="0"/>
+          <w:sz w:val="24"/>
+          <w:szCs w:val="24"/>
+        </w:rPr>
+      </w:pPr>
+      <w:r>
+        <w:rPr>
+          <w:rFonts w:ascii="Times New Roman" w:hAnsi="Times New Roman" w:cs="Times New Roman"/>
+          <w:b/>
+          <w:bCs/>
+          <w:color w:val="323E4F" w:themeColor="text2" w:themeShade="BF"/>
+          <w:kern w:val="0"/>
+          <w:sz w:val="32"/>
+          <w:szCs w:val="32"/>
+        </w:rPr>
+        <w:t xml:space="preserve">Partie </w:t>
+      </w:r>
+      <w:r>
+        <w:rPr>
+          <w:rFonts w:ascii="Times New Roman" w:hAnsi="Times New Roman" w:cs="Times New Roman"/>
+          <w:b/>
+          <w:bCs/>
+          <w:color w:val="323E4F" w:themeColor="text2" w:themeShade="BF"/>
+          <w:kern w:val="0"/>
+          <w:sz w:val="32"/>
+          <w:szCs w:val="32"/>
+        </w:rPr>
+        <w:t>7</w:t>
+      </w:r>
+      <w:r>
+        <w:rPr>
+          <w:rFonts w:ascii="Times New Roman" w:hAnsi="Times New Roman" w:cs="Times New Roman"/>
+          <w:b/>
+          <w:bCs/>
+          <w:color w:val="323E4F" w:themeColor="text2" w:themeShade="BF"/>
+          <w:kern w:val="0"/>
+          <w:sz w:val="32"/>
+          <w:szCs w:val="32"/>
+        </w:rPr>
+        <w:t xml:space="preserve"> – </w:t>
+      </w:r>
+      <w:r>
+        <w:rPr>
+          <w:rFonts w:ascii="Times New Roman" w:hAnsi="Times New Roman" w:cs="Times New Roman"/>
+          <w:b/>
+          <w:bCs/>
+          <w:color w:val="1F3864" w:themeColor="accent1" w:themeShade="80"/>
+          <w:kern w:val="0"/>
+          <w:sz w:val="32"/>
+          <w:szCs w:val="32"/>
+        </w:rPr>
+        <w:t xml:space="preserve">Prompt Engineering </w:t>
+      </w:r>
+      <w:r>
+        <w:rPr>
+          <w:rFonts w:ascii="Times New Roman" w:hAnsi="Times New Roman" w:cs="Times New Roman"/>
+          <w:b/>
+          <w:bCs/>
+          <w:color w:val="1F3864" w:themeColor="accent1" w:themeShade="80"/>
+          <w:kern w:val="0"/>
+          <w:sz w:val="32"/>
+          <w:szCs w:val="32"/>
+        </w:rPr>
+        <w:t>et RAG</w:t>
+      </w:r>
+    </w:p>
+    <w:p>
+      <w:pPr>
+        <w:autoSpaceDE w:val="0"/>
+        <w:autoSpaceDN w:val="0"/>
+        <w:adjustRightInd w:val="0"/>
+        <w:spacing w:after="0" w:line="240" w:lineRule="auto"/>
+        <w:rPr>
+          <w:rFonts w:ascii="CIDFont+F1" w:hAnsi="CIDFont+F1" w:cs="CIDFont+F1"/>
+          <w:color w:val="000000"/>
+          <w:kern w:val="0"/>
+          <w:sz w:val="21"/>
+          <w:szCs w:val="21"/>
+        </w:rPr>
+      </w:pPr>
+      <w:r>
+        <w:rPr>
+          <w:rFonts w:ascii="CIDFont+F1" w:hAnsi="CIDFont+F1" w:cs="CIDFont+F1"/>
+          <w:color w:val="000000"/>
+          <w:kern w:val="0"/>
+          <w:sz w:val="21"/>
+          <w:szCs w:val="21"/>
+        </w:rPr>
+        <w:t>1) Se prémunir d’un document.</w:t>
+      </w:r>
+    </w:p>
+    <w:p>
+      <w:pPr>
+        <w:autoSpaceDE w:val="0"/>
+        <w:autoSpaceDN w:val="0"/>
+        <w:adjustRightInd w:val="0"/>
+        <w:spacing w:after="0" w:line="240" w:lineRule="auto"/>
+        <w:rPr>
+          <w:rFonts w:ascii="CIDFont+F1" w:hAnsi="CIDFont+F1" w:cs="CIDFont+F1"/>
+          <w:color w:val="000000"/>
+          <w:kern w:val="0"/>
+          <w:sz w:val="21"/>
+          <w:szCs w:val="21"/>
+        </w:rPr>
+      </w:pPr>
+      <w:r>
+        <w:rPr>
+          <w:rFonts w:ascii="CIDFont+F1" w:hAnsi="CIDFont+F1" w:cs="CIDFont+F1"/>
+          <w:color w:val="000000"/>
+          <w:kern w:val="0"/>
+          <w:sz w:val="21"/>
+          <w:szCs w:val="21"/>
+        </w:rPr>
+        <w:t>2) Tester trois prompts pour poser une question relative à un contenu du document.</w:t>
+      </w:r>
+    </w:p>
+    <w:p>
+      <w:pPr>
+        <w:autoSpaceDE w:val="0"/>
+        <w:autoSpaceDN w:val="0"/>
+        <w:adjustRightInd w:val="0"/>
+        <w:spacing w:after="0" w:line="240" w:lineRule="auto"/>
+        <w:rPr>
+          <w:rFonts w:ascii="CIDFont+F1" w:hAnsi="CIDFont+F1" w:cs="CIDFont+F1"/>
+          <w:color w:val="000000"/>
+          <w:kern w:val="0"/>
+          <w:sz w:val="21"/>
+          <w:szCs w:val="21"/>
+        </w:rPr>
+      </w:pPr>
+      <w:r>
+        <w:rPr>
+          <w:rFonts w:ascii="CIDFont+F1" w:hAnsi="CIDFont+F1" w:cs="CIDFont+F1"/>
+          <w:color w:val="000000"/>
+          <w:kern w:val="0"/>
+          <w:sz w:val="21"/>
+          <w:szCs w:val="21"/>
+        </w:rPr>
+        <w:t>Prompt A : poser la question sans fournir le document au LLM</w:t>
+      </w:r>
+    </w:p>
+    <w:p>
+      <w:pPr>
+        <w:autoSpaceDE w:val="0"/>
+        <w:autoSpaceDN w:val="0"/>
+        <w:adjustRightInd w:val="0"/>
+        <w:spacing w:after="0" w:line="240" w:lineRule="auto"/>
+        <w:rPr>
+          <w:rFonts w:ascii="CIDFont+F1" w:hAnsi="CIDFont+F1" w:cs="CIDFont+F1"/>
+          <w:color w:val="000000"/>
+          <w:kern w:val="0"/>
+          <w:sz w:val="21"/>
+          <w:szCs w:val="21"/>
+        </w:rPr>
+      </w:pPr>
+      <w:r>
+        <w:rPr>
+          <w:rFonts w:ascii="CIDFont+F1" w:hAnsi="CIDFont+F1" w:cs="CIDFont+F1"/>
+          <w:color w:val="000000"/>
+          <w:kern w:val="0"/>
+          <w:sz w:val="21"/>
+          <w:szCs w:val="21"/>
+        </w:rPr>
+        <w:t>Prompt B : poser la question en fournissant le document</w:t>
+      </w:r>
+    </w:p>
+    <w:p>
+      <w:pPr>
+        <w:autoSpaceDE w:val="0"/>
+        <w:autoSpaceDN w:val="0"/>
+        <w:adjustRightInd w:val="0"/>
+        <w:spacing w:after="0" w:line="240" w:lineRule="auto"/>
+        <w:rPr>
+          <w:rFonts w:ascii="CIDFont+F1" w:hAnsi="CIDFont+F1" w:cs="CIDFont+F1"/>
+          <w:color w:val="000000"/>
+          <w:kern w:val="0"/>
+          <w:sz w:val="21"/>
+          <w:szCs w:val="21"/>
+        </w:rPr>
+      </w:pPr>
+      <w:r>
+        <w:rPr>
+          <w:rFonts w:ascii="CIDFont+F1" w:hAnsi="CIDFont+F1" w:cs="CIDFont+F1"/>
+          <w:color w:val="000000"/>
+          <w:kern w:val="0"/>
+          <w:sz w:val="21"/>
+          <w:szCs w:val="21"/>
+        </w:rPr>
+        <w:t>Prompt C : poser la question en fournissant le document avec les contraintes : utiliser</w:t>
+      </w:r>
+    </w:p>
+    <w:p>
+      <w:pPr>
+        <w:autoSpaceDE w:val="0"/>
+        <w:autoSpaceDN w:val="0"/>
+        <w:adjustRightInd w:val="0"/>
+        <w:spacing w:after="0" w:line="240" w:lineRule="auto"/>
+        <w:rPr>
+          <w:rFonts w:ascii="CIDFont+F1" w:hAnsi="CIDFont+F1" w:cs="CIDFont+F1"/>
+          <w:color w:val="000000"/>
+          <w:kern w:val="0"/>
+          <w:sz w:val="21"/>
+          <w:szCs w:val="21"/>
+        </w:rPr>
+      </w:pPr>
+      <w:r>
+        <w:rPr>
+          <w:rFonts w:ascii="CIDFont+F1" w:hAnsi="CIDFont+F1" w:cs="CIDFont+F1"/>
+          <w:color w:val="000000"/>
+          <w:kern w:val="0"/>
+          <w:sz w:val="21"/>
+          <w:szCs w:val="21"/>
+        </w:rPr>
+        <w:t>uniquement le contexte fourni ; ne pas inventer une information absente ; signaler</w:t>
+      </w:r>
+    </w:p>
+    <w:p>
+      <w:pPr>
+        <w:autoSpaceDE w:val="0"/>
+        <w:autoSpaceDN w:val="0"/>
+        <w:adjustRightInd w:val="0"/>
+        <w:spacing w:after="0" w:line="240" w:lineRule="auto"/>
+        <w:rPr>
+          <w:rFonts w:ascii="CIDFont+F1" w:hAnsi="CIDFont+F1" w:cs="CIDFont+F1"/>
+          <w:color w:val="000000"/>
+          <w:kern w:val="0"/>
+          <w:sz w:val="21"/>
+          <w:szCs w:val="21"/>
+        </w:rPr>
+      </w:pPr>
+      <w:r>
+        <w:rPr>
+          <w:rFonts w:ascii="CIDFont+F1" w:hAnsi="CIDFont+F1" w:cs="CIDFont+F1"/>
+          <w:color w:val="000000"/>
+          <w:kern w:val="0"/>
+          <w:sz w:val="21"/>
+          <w:szCs w:val="21"/>
+        </w:rPr>
+        <w:t>lorsqu'une information n'est pas trouvée et éventuellement citer la source ou le passage</w:t>
+      </w:r>
+    </w:p>
+    <w:p>
+      <w:pPr>
+        <w:autoSpaceDE w:val="0"/>
+        <w:autoSpaceDN w:val="0"/>
+        <w:adjustRightInd w:val="0"/>
+        <w:spacing w:after="0" w:line="240" w:lineRule="auto"/>
+        <w:rPr>
+          <w:rFonts w:ascii="CIDFont+F1" w:hAnsi="CIDFont+F1" w:cs="CIDFont+F1"/>
+          <w:color w:val="000000"/>
+          <w:kern w:val="0"/>
+          <w:sz w:val="21"/>
+          <w:szCs w:val="21"/>
+        </w:rPr>
+      </w:pPr>
+      <w:r>
+        <w:rPr>
+          <w:rFonts w:ascii="CIDFont+F1" w:hAnsi="CIDFont+F1" w:cs="CIDFont+F1"/>
+          <w:color w:val="000000"/>
+          <w:kern w:val="0"/>
+          <w:sz w:val="21"/>
+          <w:szCs w:val="21"/>
+        </w:rPr>
+        <w:t>utilisé.</w:t>
+      </w:r>
+    </w:p>
+    <w:p>
+      <w:pPr>
+        <w:spacing w:after="0"/>
+        <w:rPr>
+          <w:rFonts w:ascii="Times New Roman" w:hAnsi="Times New Roman" w:cs="Times New Roman"/>
+          <w:color w:val="2F5496" w:themeColor="accent1" w:themeShade="BF"/>
+          <w:sz w:val="24"/>
+          <w:szCs w:val="24"/>
+        </w:rPr>
+      </w:pPr>
+      <w:r>
+        <w:rPr>
+          <w:rFonts w:ascii="CIDFont+F1" w:hAnsi="CIDFont+F1" w:cs="CIDFont+F1"/>
+          <w:color w:val="000000"/>
+          <w:kern w:val="0"/>
+          <w:sz w:val="21"/>
+          <w:szCs w:val="21"/>
+        </w:rPr>
+        <w:t>3) Comparer les résultats.</w:t>
       </w:r>
     </w:p>
     <w:sectPr>
@@ -17110,7 +17437,7 @@
   <w:style w:type="paragraph" w:default="1" w:styleId="Normal">
     <w:name w:val="Normal"/>
     <w:qFormat/>
-    <w:rsid w:val="00834DA1"/>
+    <w:rsid w:val="00405E39"/>
   </w:style>
   <w:style w:type="paragraph" w:styleId="Titre3">
     <w:name w:val="heading 3"/>

</xml_diff>